<commit_message>
feat(evaluation): implement academic benchmark suite, isolate fixtures, and calibrate parser
</commit_message>
<xml_diff>
--- a/golden_dataset/documents/TEST-001_normal.docx
+++ b/golden_dataset/documents/TEST-001_normal.docx
@@ -97,7 +97,7 @@
           <w:rFonts w:ascii="Times New Roman" w:hAnsi="Times New Roman"/>
           <w:sz w:val="24"/>
         </w:rPr>
-        <w:t>Analisis mendalam mengenai dinamika komunikasi menunjukkan adanya kesinambungan yang konsisten antara ekspektasi pesan dengan respon kognitif audiens sasaran. Secara metodologis setiap indikator konstruk diuji melalui parameter reliabilitas komposit yang memenuhi batas keterandalan statistik secara optimal. Analisis mendalam mengenai dinamika komunikasi menunjukkan adanya kesinambungan yang konsisten antara ekspektasi pesan dengan respon kognitif audiens sasaran. Secara metodologis setiap indikator konstruk diuji melalui parameter reliabilitas komposit yang memenuhi batas keterandalan statistik secara optimal. Analisis mendalam mengenai dinamika komunikasi menunjukkan adanya kesinambungan yang konsisten antara ekspektasi pesan dengan respon kognitif audiens sasaran. Secara metodologis setiap indikator konstruk diuji melalui parameter reliabilitas komposit yang memenuhi batas keterandalan statistik secara optimal. Analisis mendalam mengenai dinamika komunikasi menunjukkan adanya kesinambungan yang konsisten antara ekspektasi pesan dengan respon kognitif audiens sasaran. Secara metodologis setiap indikator konstruk diuji melalui parameter reliabilitas komposit yang memenuhi batas keterandalan statistik secara optimal. Analisis mendalam mengenai dinamika komunikasi menunjukkan adanya kesinambungan yang konsisten antara ekspektasi pesan dengan respon kognitif audiens sasaran. Secara metodologis setiap indikator konstruk diuji melalui parameter reliabilitas komposit yang memenuhi batas keterandalan statistik secara optimal. Analisis mendalam mengenai dinamika komunikasi menunjukkan adanya kesinambungan yang konsisten antara ekspektasi pesan dengan respon kognitif audiens sasaran. Secara metodologis setiap indikator konstruk diuji melalui parameter reliabilitas komposit yang memenuhi batas keterandalan statistik secara optimal. Analisis mendalam mengenai dinamika komunikasi menunjukkan adanya kesinambungan yang konsisten antara ekspektasi pesan dengan respon kognitif audiens sasaran. Secara metodologis setiap indikator konstruk diuji melalui parameter reliabilitas komposit yang memenuhi batas keterandalan statistik secara optimal. Analisis mendalam mengenai dinamika komunikasi menunjukkan adanya kesinambungan yang konsisten antara ekspektasi pesan dengan respon kognitif audiens sasaran. Secara metodologis setiap indikator konstruk diuji melalui parameter reliabilitas komposit yang memenuhi batas keterandalan statistik secara optimal. Analisis mendalam mengenai dinamika komunikasi menunjukkan adanya kesinambungan yang konsisten antara ekspektasi pesan dengan respon kognitif audiens sasaran. Secara metodologis setiap indikator konstruk diuji melalui parameter reliabilitas komposit yang memenuhi batas keterandalan statistik secara optimal. Analisis mendalam mengenai dinamika komunikasi menunjukkan adanya kesinambungan yang konsisten antara ekspektasi pesan dengan respon kognitif audiens sasaran. Secara metodologis setiap indikator konstruk diuji melalui parameter reliabilitas komposit yang memenuhi batas keterandalan statistik secara optimal. Analisis mendalam mengenai dinamika komunikasi menunjukkan adanya kesinambungan yang konsisten antara ekspektasi pesan dengan respon kognitif audiens sasaran. Secara metodologis setiap indikator konstruk diuji melalui parameter reliabilitas komposit yang memenuhi batas keterandalan statistik secara optimal. Analisis mendalam mengenai dinamika komunikasi menunjukkan adanya kesinambungan yang konsisten antara ekspektasi pesan dengan respon kognitif audiens sasaran. Secara metodologis setiap indikator konstruk diuji melalui parameter reliabilitas komposit yang memenuhi batas keterandalan statistik secara optimal. Analisis mendalam mengenai dinamika komunikasi menunjukkan adanya kesinambungan yang konsisten antara ekspektasi pesan dengan respon kognitif audiens sasaran. Secara metodologis setiap indikator konstruk diuji melalui parameter reliabilitas komposit yang memenuhi batas keterandalan statistik secara optimal. Analisis mendalam mengenai dinamika komunikasi menunjukkan adanya kesinambungan yang konsisten antara ekspektasi pesan dengan respon kognitif audiens sasaran. Secara metodologis setiap indikator konstruk diuji melalui parameter reliabilitas komposit yang memenuhi batas keterandalan statistik secara optimal. Analisis mendalam mengenai dinamika komunikasi menunjukkan adanya kesinambungan yang konsisten antara ekspektasi pesan dengan respon kognitif audiens sasaran. Secara metodologis setiap indikator konstruk diuji melalui parameter reliabilitas komposit yang memenuhi batas keterandalan statistik secara optimal.</w:t>
+        <w:t>Analisis mendalam mengenai dinamika komunikasi menunjukkan adanya kesinambungan yang konsisten antara ekspektasi pesan dengan respon kognitif audiens sasaran. Secara metodologis setiap indikator konstruk diuji melalui parameter reliabilitas komposit yang memenuhi batas keterandalan statistik secara optimal. Analisis mendalam mengenai dinamika komunikasi menunjukkan adanya kesinambungan yang konsisten antara ekspektasi pesan dengan respon kognitif audiens sasaran. Secara metodologis setiap indikator konstruk diuji melalui parameter reliabilitas komposit yang memenuhi batas keterandalan statistik secara optimal. Analisis mendalam mengenai dinamika komunikasi menunjukkan adanya kesinambungan yang konsisten antara ekspektasi pesan dengan respon kognitif audiens sasaran. Secara metodologis setiap indikator konstruk diuji melalui parameter reliabilitas komposit yang memenuhi batas keterandalan statistik secara optimal. Analisis mendalam mengenai dinamika komunikasi menunjukkan adanya kesinambungan yang konsisten antara ekspektasi pesan dengan respon kognitif audiens sasaran. Secara metodologis setiap indikator konstruk diuji melalui parameter reliabilitas komposit yang memenuhi batas keterandalan statistik secara optimal. Analisis mendalam mengenai dinamika komunikasi menunjukkan adanya kesinambungan yang konsisten antara ekspektasi pesan dengan respon kognitif audiens sasaran. Secara metodologis setiap indikator konstruk diuji melalui parameter reliabilitas komposit yang memenuhi batas keterandalan statistik secara optimal. Analisis mendalam mengenai dinamika komunikasi menunjukkan adanya kesinambungan yang konsisten antara ekspektasi pesan dengan respon kognitif audiens sasaran. Secara metodologis setiap indikator konstruk diuji melalui parameter reliabilitas komposit yang memenuhi batas keterandalan statistik secara optimal. Analisis mendalam mengenai dinamika komunikasi menunjukkan adanya kesinambungan yang konsisten antara ekspektasi pesan dengan respon kognitif audiens sasaran. Secara metodologis setiap indikator konstruk diuji melalui parameter reliabilitas komposit yang memenuhi batas keterandalan statistik secara optimal. Analisis mendalam mengenai dinamika komunikasi menunjukkan adanya kesinambungan yang konsisten antara ekspektasi pesan dengan respon kognitif audiens sasaran. Secara metodologis setiap indikator konstruk diuji melalui parameter reliabilitas komposit yang memenuhi batas keterandalan statistik secara optimal. Analisis mendalam mengenai dinamika komunikasi menunjukkan adanya kesinambungan yang konsisten antara ekspektasi pesan dengan respon kognitif audiens sasaran. Secara metodologis setiap indikator konstruk diuji melalui parameter reliabilitas komposit yang memenuhi batas keterandalan statistik secara optimal. Analisis mendalam mengenai dinamika komunikasi menunjukkan adanya kesinambungan yang konsisten antara ekspektasi pesan dengan respon kognitif audiens sasaran. Secara metodologis setiap indikator konstruk diuji melalui parameter reliabilitas komposit yang memenuhi batas keterandalan statistik secara optimal. Analisis mendalam mengenai dinamika komunikasi menunjukkan adanya kesinambungan yang konsisten antara ekspektasi pesan dengan respon kognitif audiens sasaran. Secara metodologis setiap indikator konstruk diuji melalui parameter reliabilitas komposit yang memenuhi batas keterandalan statistik secara optimal. Analisis mendalam mengenai dinamika komunikasi menunjukkan adanya kesinambungan yang konsisten antara ekspektasi pesan dengan respon kognitif audiens sasaran. Secara metodologis setiap indikator konstruk diuji melalui parameter reliabilitas komposit yang memenuhi batas keterandalan statistik secara optimal.</w:t>
       </w:r>
     </w:p>
     <w:p>
@@ -110,7 +110,7 @@
           <w:rFonts w:ascii="Times New Roman" w:hAnsi="Times New Roman"/>
           <w:sz w:val="24"/>
         </w:rPr>
-        <w:t>Analisis mendalam mengenai dinamika komunikasi menunjukkan adanya kesinambungan yang konsisten antara ekspektasi pesan dengan respon kognitif audiens sasaran. Secara metodologis setiap indikator konstruk diuji melalui parameter reliabilitas komposit yang memenuhi batas keterandalan statistik secara optimal. Analisis mendalam mengenai dinamika komunikasi menunjukkan adanya kesinambungan yang konsisten antara ekspektasi pesan dengan respon kognitif audiens sasaran. Secara metodologis setiap indikator konstruk diuji melalui parameter reliabilitas komposit yang memenuhi batas keterandalan statistik secara optimal. Analisis mendalam mengenai dinamika komunikasi menunjukkan adanya kesinambungan yang konsisten antara ekspektasi pesan dengan respon kognitif audiens sasaran. Secara metodologis setiap indikator konstruk diuji melalui parameter reliabilitas komposit yang memenuhi batas keterandalan statistik secara optimal. Analisis mendalam mengenai dinamika komunikasi menunjukkan adanya kesinambungan yang konsisten antara ekspektasi pesan dengan respon kognitif audiens sasaran. Secara metodologis setiap indikator konstruk diuji melalui parameter reliabilitas komposit yang memenuhi batas keterandalan statistik secara optimal. Analisis mendalam mengenai dinamika komunikasi menunjukkan adanya kesinambungan yang konsisten antara ekspektasi pesan dengan respon kognitif audiens sasaran. Secara metodologis setiap indikator konstruk diuji melalui parameter reliabilitas komposit yang memenuhi batas keterandalan statistik secara optimal. Analisis mendalam mengenai dinamika komunikasi menunjukkan adanya kesinambungan yang konsisten antara ekspektasi pesan dengan respon kognitif audiens sasaran. Secara metodologis setiap indikator konstruk diuji melalui parameter reliabilitas komposit yang memenuhi batas keterandalan statistik secara optimal. Analisis mendalam mengenai dinamika komunikasi menunjukkan adanya kesinambungan yang konsisten antara ekspektasi pesan dengan respon kognitif audiens sasaran. Secara metodologis setiap indikator konstruk diuji melalui parameter reliabilitas komposit yang memenuhi batas keterandalan statistik secara optimal. Analisis mendalam mengenai dinamika komunikasi menunjukkan adanya kesinambungan yang konsisten antara ekspektasi pesan dengan respon kognitif audiens sasaran. Secara metodologis setiap indikator konstruk diuji melalui parameter reliabilitas komposit yang memenuhi batas keterandalan statistik secara optimal. Analisis mendalam mengenai dinamika komunikasi menunjukkan adanya kesinambungan yang konsisten antara ekspektasi pesan dengan respon kognitif audiens sasaran. Secara metodologis setiap indikator konstruk diuji melalui parameter reliabilitas komposit yang memenuhi batas keterandalan statistik secara optimal. Analisis mendalam mengenai dinamika komunikasi menunjukkan adanya kesinambungan yang konsisten antara ekspektasi pesan dengan respon kognitif audiens sasaran. Secara metodologis setiap indikator konstruk diuji melalui parameter reliabilitas komposit yang memenuhi batas keterandalan statistik secara optimal. Analisis mendalam mengenai dinamika komunikasi menunjukkan adanya kesinambungan yang konsisten antara ekspektasi pesan dengan respon kognitif audiens sasaran. Secara metodologis setiap indikator konstruk diuji melalui parameter reliabilitas komposit yang memenuhi batas keterandalan statistik secara optimal. Analisis mendalam mengenai dinamika komunikasi menunjukkan adanya kesinambungan yang konsisten antara ekspektasi pesan dengan respon kognitif audiens sasaran. Secara metodologis setiap indikator konstruk diuji melalui parameter reliabilitas komposit yang memenuhi batas keterandalan statistik secara optimal. Analisis mendalam mengenai dinamika komunikasi menunjukkan adanya kesinambungan yang konsisten antara ekspektasi pesan dengan respon kognitif audiens sasaran. Secara metodologis setiap indikator konstruk diuji melalui parameter reliabilitas komposit yang memenuhi batas keterandalan statistik secara optimal. Analisis mendalam mengenai dinamika komunikasi menunjukkan adanya kesinambungan yang konsisten antara ekspektasi pesan dengan respon kognitif audiens sasaran. Secara metodologis setiap indikator konstruk diuji melalui parameter reliabilitas komposit yang memenuhi batas keterandalan statistik secara optimal. Analisis mendalam mengenai dinamika komunikasi menunjukkan adanya kesinambungan yang konsisten antara ekspektasi pesan dengan respon kognitif audiens sasaran. Secara metodologis setiap indikator konstruk diuji melalui parameter reliabilitas komposit yang memenuhi batas keterandalan statistik secara optimal.</w:t>
+        <w:t>Analisis mendalam mengenai dinamika komunikasi menunjukkan adanya kesinambungan yang konsisten antara ekspektasi pesan dengan respon kognitif audiens sasaran. Secara metodologis setiap indikator konstruk diuji melalui parameter reliabilitas komposit yang memenuhi batas keterandalan statistik secara optimal. Analisis mendalam mengenai dinamika komunikasi menunjukkan adanya kesinambungan yang konsisten antara ekspektasi pesan dengan respon kognitif audiens sasaran. Secara metodologis setiap indikator konstruk diuji melalui parameter reliabilitas komposit yang memenuhi batas keterandalan statistik secara optimal. Analisis mendalam mengenai dinamika komunikasi menunjukkan adanya kesinambungan yang konsisten antara ekspektasi pesan dengan respon kognitif audiens sasaran. Secara metodologis setiap indikator konstruk diuji melalui parameter reliabilitas komposit yang memenuhi batas keterandalan statistik secara optimal. Analisis mendalam mengenai dinamika komunikasi menunjukkan adanya kesinambungan yang konsisten antara ekspektasi pesan dengan respon kognitif audiens sasaran. Secara metodologis setiap indikator konstruk diuji melalui parameter reliabilitas komposit yang memenuhi batas keterandalan statistik secara optimal. Analisis mendalam mengenai dinamika komunikasi menunjukkan adanya kesinambungan yang konsisten antara ekspektasi pesan dengan respon kognitif audiens sasaran. Secara metodologis setiap indikator konstruk diuji melalui parameter reliabilitas komposit yang memenuhi batas keterandalan statistik secara optimal. Analisis mendalam mengenai dinamika komunikasi menunjukkan adanya kesinambungan yang konsisten antara ekspektasi pesan dengan respon kognitif audiens sasaran. Secara metodologis setiap indikator konstruk diuji melalui parameter reliabilitas komposit yang memenuhi batas keterandalan statistik secara optimal. Analisis mendalam mengenai dinamika komunikasi menunjukkan adanya kesinambungan yang konsisten antara ekspektasi pesan dengan respon kognitif audiens sasaran. Secara metodologis setiap indikator konstruk diuji melalui parameter reliabilitas komposit yang memenuhi batas keterandalan statistik secara optimal. Analisis mendalam mengenai dinamika komunikasi menunjukkan adanya kesinambungan yang konsisten antara ekspektasi pesan dengan respon kognitif audiens sasaran. Secara metodologis setiap indikator konstruk diuji melalui parameter reliabilitas komposit yang memenuhi batas keterandalan statistik secara optimal. Analisis mendalam mengenai dinamika komunikasi menunjukkan adanya kesinambungan yang konsisten antara ekspektasi pesan dengan respon kognitif audiens sasaran. Secara metodologis setiap indikator konstruk diuji melalui parameter reliabilitas komposit yang memenuhi batas keterandalan statistik secara optimal. Analisis mendalam mengenai dinamika komunikasi menunjukkan adanya kesinambungan yang konsisten antara ekspektasi pesan dengan respon kognitif audiens sasaran. Secara metodologis setiap indikator konstruk diuji melalui parameter reliabilitas komposit yang memenuhi batas keterandalan statistik secara optimal. Analisis mendalam mengenai dinamika komunikasi menunjukkan adanya kesinambungan yang konsisten antara ekspektasi pesan dengan respon kognitif audiens sasaran. Secara metodologis setiap indikator konstruk diuji melalui parameter reliabilitas komposit yang memenuhi batas keterandalan statistik secara optimal. Analisis mendalam mengenai dinamika komunikasi menunjukkan adanya kesinambungan yang konsisten antara ekspektasi pesan dengan respon kognitif audiens sasaran. Secara metodologis setiap indikator konstruk diuji melalui parameter reliabilitas komposit yang memenuhi batas keterandalan statistik secara optimal.</w:t>
       </w:r>
     </w:p>
     <w:p>
@@ -123,7 +123,7 @@
           <w:rFonts w:ascii="Times New Roman" w:hAnsi="Times New Roman"/>
           <w:sz w:val="24"/>
         </w:rPr>
-        <w:t>Analisis mendalam mengenai dinamika komunikasi menunjukkan adanya kesinambungan yang konsisten antara ekspektasi pesan dengan respon kognitif audiens sasaran. Secara metodologis setiap indikator konstruk diuji melalui parameter reliabilitas komposit yang memenuhi batas keterandalan statistik secara optimal. Analisis mendalam mengenai dinamika komunikasi menunjukkan adanya kesinambungan yang konsisten antara ekspektasi pesan dengan respon kognitif audiens sasaran. Secara metodologis setiap indikator konstruk diuji melalui parameter reliabilitas komposit yang memenuhi batas keterandalan statistik secara optimal. Analisis mendalam mengenai dinamika komunikasi menunjukkan adanya kesinambungan yang konsisten antara ekspektasi pesan dengan respon kognitif audiens sasaran. Secara metodologis setiap indikator konstruk diuji melalui parameter reliabilitas komposit yang memenuhi batas keterandalan statistik secara optimal. Analisis mendalam mengenai dinamika komunikasi menunjukkan adanya kesinambungan yang konsisten antara ekspektasi pesan dengan respon kognitif audiens sasaran. Secara metodologis setiap indikator konstruk diuji melalui parameter reliabilitas komposit yang memenuhi batas keterandalan statistik secara optimal. Analisis mendalam mengenai dinamika komunikasi menunjukkan adanya kesinambungan yang konsisten antara ekspektasi pesan dengan respon kognitif audiens sasaran. Secara metodologis setiap indikator konstruk diuji melalui parameter reliabilitas komposit yang memenuhi batas keterandalan statistik secara optimal. Analisis mendalam mengenai dinamika komunikasi menunjukkan adanya kesinambungan yang konsisten antara ekspektasi pesan dengan respon kognitif audiens sasaran. Secara metodologis setiap indikator konstruk diuji melalui parameter reliabilitas komposit yang memenuhi batas keterandalan statistik secara optimal. Analisis mendalam mengenai dinamika komunikasi menunjukkan adanya kesinambungan yang konsisten antara ekspektasi pesan dengan respon kognitif audiens sasaran. Secara metodologis setiap indikator konstruk diuji melalui parameter reliabilitas komposit yang memenuhi batas keterandalan statistik secara optimal. Analisis mendalam mengenai dinamika komunikasi menunjukkan adanya kesinambungan yang konsisten antara ekspektasi pesan dengan respon kognitif audiens sasaran. Secara metodologis setiap indikator konstruk diuji melalui parameter reliabilitas komposit yang memenuhi batas keterandalan statistik secara optimal. Analisis mendalam mengenai dinamika komunikasi menunjukkan adanya kesinambungan yang konsisten antara ekspektasi pesan dengan respon kognitif audiens sasaran. Secara metodologis setiap indikator konstruk diuji melalui parameter reliabilitas komposit yang memenuhi batas keterandalan statistik secara optimal. Analisis mendalam mengenai dinamika komunikasi menunjukkan adanya kesinambungan yang konsisten antara ekspektasi pesan dengan respon kognitif audiens sasaran. Secara metodologis setiap indikator konstruk diuji melalui parameter reliabilitas komposit yang memenuhi batas keterandalan statistik secara optimal. Analisis mendalam mengenai dinamika komunikasi menunjukkan adanya kesinambungan yang konsisten antara ekspektasi pesan dengan respon kognitif audiens sasaran. Secara metodologis setiap indikator konstruk diuji melalui parameter reliabilitas komposit yang memenuhi batas keterandalan statistik secara optimal. Analisis mendalam mengenai dinamika komunikasi menunjukkan adanya kesinambungan yang konsisten antara ekspektasi pesan dengan respon kognitif audiens sasaran. Secara metodologis setiap indikator konstruk diuji melalui parameter reliabilitas komposit yang memenuhi batas keterandalan statistik secara optimal. Analisis mendalam mengenai dinamika komunikasi menunjukkan adanya kesinambungan yang konsisten antara ekspektasi pesan dengan respon kognitif audiens sasaran. Secara metodologis setiap indikator konstruk diuji melalui parameter reliabilitas komposit yang memenuhi batas keterandalan statistik secara optimal. Analisis mendalam mengenai dinamika komunikasi menunjukkan adanya kesinambungan yang konsisten antara ekspektasi pesan dengan respon kognitif audiens sasaran. Secara metodologis setiap indikator konstruk diuji melalui parameter reliabilitas komposit yang memenuhi batas keterandalan statistik secara optimal. Analisis mendalam mengenai dinamika komunikasi menunjukkan adanya kesinambungan yang konsisten antara ekspektasi pesan dengan respon kognitif audiens sasaran. Secara metodologis setiap indikator konstruk diuji melalui parameter reliabilitas komposit yang memenuhi batas keterandalan statistik secara optimal.</w:t>
+        <w:t>Analisis mendalam mengenai dinamika komunikasi menunjukkan adanya kesinambungan yang konsisten antara ekspektasi pesan dengan respon kognitif audiens sasaran. Secara metodologis setiap indikator konstruk diuji melalui parameter reliabilitas komposit yang memenuhi batas keterandalan statistik secara optimal. Analisis mendalam mengenai dinamika komunikasi menunjukkan adanya kesinambungan yang konsisten antara ekspektasi pesan dengan respon kognitif audiens sasaran. Secara metodologis setiap indikator konstruk diuji melalui parameter reliabilitas komposit yang memenuhi batas keterandalan statistik secara optimal. Analisis mendalam mengenai dinamika komunikasi menunjukkan adanya kesinambungan yang konsisten antara ekspektasi pesan dengan respon kognitif audiens sasaran. Secara metodologis setiap indikator konstruk diuji melalui parameter reliabilitas komposit yang memenuhi batas keterandalan statistik secara optimal. Analisis mendalam mengenai dinamika komunikasi menunjukkan adanya kesinambungan yang konsisten antara ekspektasi pesan dengan respon kognitif audiens sasaran. Secara metodologis setiap indikator konstruk diuji melalui parameter reliabilitas komposit yang memenuhi batas keterandalan statistik secara optimal. Analisis mendalam mengenai dinamika komunikasi menunjukkan adanya kesinambungan yang konsisten antara ekspektasi pesan dengan respon kognitif audiens sasaran. Secara metodologis setiap indikator konstruk diuji melalui parameter reliabilitas komposit yang memenuhi batas keterandalan statistik secara optimal. Analisis mendalam mengenai dinamika komunikasi menunjukkan adanya kesinambungan yang konsisten antara ekspektasi pesan dengan respon kognitif audiens sasaran. Secara metodologis setiap indikator konstruk diuji melalui parameter reliabilitas komposit yang memenuhi batas keterandalan statistik secara optimal. Analisis mendalam mengenai dinamika komunikasi menunjukkan adanya kesinambungan yang konsisten antara ekspektasi pesan dengan respon kognitif audiens sasaran. Secara metodologis setiap indikator konstruk diuji melalui parameter reliabilitas komposit yang memenuhi batas keterandalan statistik secara optimal. Analisis mendalam mengenai dinamika komunikasi menunjukkan adanya kesinambungan yang konsisten antara ekspektasi pesan dengan respon kognitif audiens sasaran. Secara metodologis setiap indikator konstruk diuji melalui parameter reliabilitas komposit yang memenuhi batas keterandalan statistik secara optimal. Analisis mendalam mengenai dinamika komunikasi menunjukkan adanya kesinambungan yang konsisten antara ekspektasi pesan dengan respon kognitif audiens sasaran. Secara metodologis setiap indikator konstruk diuji melalui parameter reliabilitas komposit yang memenuhi batas keterandalan statistik secara optimal. Analisis mendalam mengenai dinamika komunikasi menunjukkan adanya kesinambungan yang konsisten antara ekspektasi pesan dengan respon kognitif audiens sasaran. Secara metodologis setiap indikator konstruk diuji melalui parameter reliabilitas komposit yang memenuhi batas keterandalan statistik secara optimal. Analisis mendalam mengenai dinamika komunikasi menunjukkan adanya kesinambungan yang konsisten antara ekspektasi pesan dengan respon kognitif audiens sasaran. Secara metodologis setiap indikator konstruk diuji melalui parameter reliabilitas komposit yang memenuhi batas keterandalan statistik secara optimal. Analisis mendalam mengenai dinamika komunikasi menunjukkan adanya kesinambungan yang konsisten antara ekspektasi pesan dengan respon kognitif audiens sasaran. Secara metodologis setiap indikator konstruk diuji melalui parameter reliabilitas komposit yang memenuhi batas keterandalan statistik secara optimal.</w:t>
       </w:r>
     </w:p>
     <w:p>
@@ -136,7 +136,7 @@
           <w:rFonts w:ascii="Times New Roman" w:hAnsi="Times New Roman"/>
           <w:sz w:val="24"/>
         </w:rPr>
-        <w:t>Analisis mendalam mengenai dinamika komunikasi menunjukkan adanya kesinambungan yang konsisten antara ekspektasi pesan dengan respon kognitif audiens sasaran. Secara metodologis setiap indikator konstruk diuji melalui parameter reliabilitas komposit yang memenuhi batas keterandalan statistik secara optimal. Analisis mendalam mengenai dinamika komunikasi menunjukkan adanya kesinambungan yang konsisten antara ekspektasi pesan dengan respon kognitif audiens sasaran. Secara metodologis setiap indikator konstruk diuji melalui parameter reliabilitas komposit yang memenuhi batas keterandalan statistik secara optimal. Analisis mendalam mengenai dinamika komunikasi menunjukkan adanya kesinambungan yang konsisten antara ekspektasi pesan dengan respon kognitif audiens sasaran. Secara metodologis setiap indikator konstruk diuji melalui parameter reliabilitas komposit yang memenuhi batas keterandalan statistik secara optimal. Analisis mendalam mengenai dinamika komunikasi menunjukkan adanya kesinambungan yang konsisten antara ekspektasi pesan dengan respon kognitif audiens sasaran. Secara metodologis setiap indikator konstruk diuji melalui parameter reliabilitas komposit yang memenuhi batas keterandalan statistik secara optimal. Analisis mendalam mengenai dinamika komunikasi menunjukkan adanya kesinambungan yang konsisten antara ekspektasi pesan dengan respon kognitif audiens sasaran. Secara metodologis setiap indikator konstruk diuji melalui parameter reliabilitas komposit yang memenuhi batas keterandalan statistik secara optimal. Analisis mendalam mengenai dinamika komunikasi menunjukkan adanya kesinambungan yang konsisten antara ekspektasi pesan dengan respon kognitif audiens sasaran. Secara metodologis setiap indikator konstruk diuji melalui parameter reliabilitas komposit yang memenuhi batas keterandalan statistik secara optimal. Analisis mendalam mengenai dinamika komunikasi menunjukkan adanya kesinambungan yang konsisten antara ekspektasi pesan dengan respon kognitif audiens sasaran. Secara metodologis setiap indikator konstruk diuji melalui parameter reliabilitas komposit yang memenuhi batas keterandalan statistik secara optimal. Analisis mendalam mengenai dinamika komunikasi menunjukkan adanya kesinambungan yang konsisten antara ekspektasi pesan dengan respon kognitif audiens sasaran. Secara metodologis setiap indikator konstruk diuji melalui parameter reliabilitas komposit yang memenuhi batas keterandalan statistik secara optimal. Analisis mendalam mengenai dinamika komunikasi menunjukkan adanya kesinambungan yang konsisten antara ekspektasi pesan dengan respon kognitif audiens sasaran. Secara metodologis setiap indikator konstruk diuji melalui parameter reliabilitas komposit yang memenuhi batas keterandalan statistik secara optimal. Analisis mendalam mengenai dinamika komunikasi menunjukkan adanya kesinambungan yang konsisten antara ekspektasi pesan dengan respon kognitif audiens sasaran. Secara metodologis setiap indikator konstruk diuji melalui parameter reliabilitas komposit yang memenuhi batas keterandalan statistik secara optimal. Analisis mendalam mengenai dinamika komunikasi menunjukkan adanya kesinambungan yang konsisten antara ekspektasi pesan dengan respon kognitif audiens sasaran. Secara metodologis setiap indikator konstruk diuji melalui parameter reliabilitas komposit yang memenuhi batas keterandalan statistik secara optimal. Analisis mendalam mengenai dinamika komunikasi menunjukkan adanya kesinambungan yang konsisten antara ekspektasi pesan dengan respon kognitif audiens sasaran. Secara metodologis setiap indikator konstruk diuji melalui parameter reliabilitas komposit yang memenuhi batas keterandalan statistik secara optimal. Analisis mendalam mengenai dinamika komunikasi menunjukkan adanya kesinambungan yang konsisten antara ekspektasi pesan dengan respon kognitif audiens sasaran. Secara metodologis setiap indikator konstruk diuji melalui parameter reliabilitas komposit yang memenuhi batas keterandalan statistik secara optimal. Analisis mendalam mengenai dinamika komunikasi menunjukkan adanya kesinambungan yang konsisten antara ekspektasi pesan dengan respon kognitif audiens sasaran. Secara metodologis setiap indikator konstruk diuji melalui parameter reliabilitas komposit yang memenuhi batas keterandalan statistik secara optimal. Analisis mendalam mengenai dinamika komunikasi menunjukkan adanya kesinambungan yang konsisten antara ekspektasi pesan dengan respon kognitif audiens sasaran. Secara metodologis setiap indikator konstruk diuji melalui parameter reliabilitas komposit yang memenuhi batas keterandalan statistik secara optimal.</w:t>
+        <w:t>Analisis mendalam mengenai dinamika komunikasi menunjukkan adanya kesinambungan yang konsisten antara ekspektasi pesan dengan respon kognitif audiens sasaran. Secara metodologis setiap indikator konstruk diuji melalui parameter reliabilitas komposit yang memenuhi batas keterandalan statistik secara optimal. Analisis mendalam mengenai dinamika komunikasi menunjukkan adanya kesinambungan yang konsisten antara ekspektasi pesan dengan respon kognitif audiens sasaran. Secara metodologis setiap indikator konstruk diuji melalui parameter reliabilitas komposit yang memenuhi batas keterandalan statistik secara optimal. Analisis mendalam mengenai dinamika komunikasi menunjukkan adanya kesinambungan yang konsisten antara ekspektasi pesan dengan respon kognitif audiens sasaran. Secara metodologis setiap indikator konstruk diuji melalui parameter reliabilitas komposit yang memenuhi batas keterandalan statistik secara optimal. Analisis mendalam mengenai dinamika komunikasi menunjukkan adanya kesinambungan yang konsisten antara ekspektasi pesan dengan respon kognitif audiens sasaran. Secara metodologis setiap indikator konstruk diuji melalui parameter reliabilitas komposit yang memenuhi batas keterandalan statistik secara optimal. Analisis mendalam mengenai dinamika komunikasi menunjukkan adanya kesinambungan yang konsisten antara ekspektasi pesan dengan respon kognitif audiens sasaran. Secara metodologis setiap indikator konstruk diuji melalui parameter reliabilitas komposit yang memenuhi batas keterandalan statistik secara optimal. Analisis mendalam mengenai dinamika komunikasi menunjukkan adanya kesinambungan yang konsisten antara ekspektasi pesan dengan respon kognitif audiens sasaran. Secara metodologis setiap indikator konstruk diuji melalui parameter reliabilitas komposit yang memenuhi batas keterandalan statistik secara optimal. Analisis mendalam mengenai dinamika komunikasi menunjukkan adanya kesinambungan yang konsisten antara ekspektasi pesan dengan respon kognitif audiens sasaran. Secara metodologis setiap indikator konstruk diuji melalui parameter reliabilitas komposit yang memenuhi batas keterandalan statistik secara optimal. Analisis mendalam mengenai dinamika komunikasi menunjukkan adanya kesinambungan yang konsisten antara ekspektasi pesan dengan respon kognitif audiens sasaran. Secara metodologis setiap indikator konstruk diuji melalui parameter reliabilitas komposit yang memenuhi batas keterandalan statistik secara optimal. Analisis mendalam mengenai dinamika komunikasi menunjukkan adanya kesinambungan yang konsisten antara ekspektasi pesan dengan respon kognitif audiens sasaran. Secara metodologis setiap indikator konstruk diuji melalui parameter reliabilitas komposit yang memenuhi batas keterandalan statistik secara optimal. Analisis mendalam mengenai dinamika komunikasi menunjukkan adanya kesinambungan yang konsisten antara ekspektasi pesan dengan respon kognitif audiens sasaran. Secara metodologis setiap indikator konstruk diuji melalui parameter reliabilitas komposit yang memenuhi batas keterandalan statistik secara optimal. Analisis mendalam mengenai dinamika komunikasi menunjukkan adanya kesinambungan yang konsisten antara ekspektasi pesan dengan respon kognitif audiens sasaran. Secara metodologis setiap indikator konstruk diuji melalui parameter reliabilitas komposit yang memenuhi batas keterandalan statistik secara optimal. Analisis mendalam mengenai dinamika komunikasi menunjukkan adanya kesinambungan yang konsisten antara ekspektasi pesan dengan respon kognitif audiens sasaran. Secara metodologis setiap indikator konstruk diuji melalui parameter reliabilitas komposit yang memenuhi batas keterandalan statistik secara optimal.</w:t>
       </w:r>
     </w:p>
     <w:p>
@@ -149,7 +149,7 @@
           <w:rFonts w:ascii="Times New Roman" w:hAnsi="Times New Roman"/>
           <w:sz w:val="24"/>
         </w:rPr>
-        <w:t>Analisis mendalam mengenai dinamika komunikasi menunjukkan adanya kesinambungan yang konsisten antara ekspektasi pesan dengan respon kognitif audiens sasaran. Secara metodologis setiap indikator konstruk diuji melalui parameter reliabilitas komposit yang memenuhi batas keterandalan statistik secara optimal. Analisis mendalam mengenai dinamika komunikasi menunjukkan adanya kesinambungan yang konsisten antara ekspektasi pesan dengan respon kognitif audiens sasaran. Secara metodologis setiap indikator konstruk diuji melalui parameter reliabilitas komposit yang memenuhi batas keterandalan statistik secara optimal. Analisis mendalam mengenai dinamika komunikasi menunjukkan adanya kesinambungan yang konsisten antara ekspektasi pesan dengan respon kognitif audiens sasaran. Secara metodologis setiap indikator konstruk diuji melalui parameter reliabilitas komposit yang memenuhi batas keterandalan statistik secara optimal. Analisis mendalam mengenai dinamika komunikasi menunjukkan adanya kesinambungan yang konsisten antara ekspektasi pesan dengan respon kognitif audiens sasaran. Secara metodologis setiap indikator konstruk diuji melalui parameter reliabilitas komposit yang memenuhi batas keterandalan statistik secara optimal. Analisis mendalam mengenai dinamika komunikasi menunjukkan adanya kesinambungan yang konsisten antara ekspektasi pesan dengan respon kognitif audiens sasaran. Secara metodologis setiap indikator konstruk diuji melalui parameter reliabilitas komposit yang memenuhi batas keterandalan statistik secara optimal. Analisis mendalam mengenai dinamika komunikasi menunjukkan adanya kesinambungan yang konsisten antara ekspektasi pesan dengan respon kognitif audiens sasaran. Secara metodologis setiap indikator konstruk diuji melalui parameter reliabilitas komposit yang memenuhi batas keterandalan statistik secara optimal. Analisis mendalam mengenai dinamika komunikasi menunjukkan adanya kesinambungan yang konsisten antara ekspektasi pesan dengan respon kognitif audiens sasaran. Secara metodologis setiap indikator konstruk diuji melalui parameter reliabilitas komposit yang memenuhi batas keterandalan statistik secara optimal. Analisis mendalam mengenai dinamika komunikasi menunjukkan adanya kesinambungan yang konsisten antara ekspektasi pesan dengan respon kognitif audiens sasaran. Secara metodologis setiap indikator konstruk diuji melalui parameter reliabilitas komposit yang memenuhi batas keterandalan statistik secara optimal. Analisis mendalam mengenai dinamika komunikasi menunjukkan adanya kesinambungan yang konsisten antara ekspektasi pesan dengan respon kognitif audiens sasaran. Secara metodologis setiap indikator konstruk diuji melalui parameter reliabilitas komposit yang memenuhi batas keterandalan statistik secara optimal. Analisis mendalam mengenai dinamika komunikasi menunjukkan adanya kesinambungan yang konsisten antara ekspektasi pesan dengan respon kognitif audiens sasaran. Secara metodologis setiap indikator konstruk diuji melalui parameter reliabilitas komposit yang memenuhi batas keterandalan statistik secara optimal. Analisis mendalam mengenai dinamika komunikasi menunjukkan adanya kesinambungan yang konsisten antara ekspektasi pesan dengan respon kognitif audiens sasaran. Secara metodologis setiap indikator konstruk diuji melalui parameter reliabilitas komposit yang memenuhi batas keterandalan statistik secara optimal. Analisis mendalam mengenai dinamika komunikasi menunjukkan adanya kesinambungan yang konsisten antara ekspektasi pesan dengan respon kognitif audiens sasaran. Secara metodologis setiap indikator konstruk diuji melalui parameter reliabilitas komposit yang memenuhi batas keterandalan statistik secara optimal. Analisis mendalam mengenai dinamika komunikasi menunjukkan adanya kesinambungan yang konsisten antara ekspektasi pesan dengan respon kognitif audiens sasaran. Secara metodologis setiap indikator konstruk diuji melalui parameter reliabilitas komposit yang memenuhi batas keterandalan statistik secara optimal. Analisis mendalam mengenai dinamika komunikasi menunjukkan adanya kesinambungan yang konsisten antara ekspektasi pesan dengan respon kognitif audiens sasaran. Secara metodologis setiap indikator konstruk diuji melalui parameter reliabilitas komposit yang memenuhi batas keterandalan statistik secara optimal. Analisis mendalam mengenai dinamika komunikasi menunjukkan adanya kesinambungan yang konsisten antara ekspektasi pesan dengan respon kognitif audiens sasaran. Secara metodologis setiap indikator konstruk diuji melalui parameter reliabilitas komposit yang memenuhi batas keterandalan statistik secara optimal.</w:t>
+        <w:t>Analisis mendalam mengenai dinamika komunikasi menunjukkan adanya kesinambungan yang konsisten antara ekspektasi pesan dengan respon kognitif audiens sasaran. Secara metodologis setiap indikator konstruk diuji melalui parameter reliabilitas komposit yang memenuhi batas keterandalan statistik secara optimal. Analisis mendalam mengenai dinamika komunikasi menunjukkan adanya kesinambungan yang konsisten antara ekspektasi pesan dengan respon kognitif audiens sasaran. Secara metodologis setiap indikator konstruk diuji melalui parameter reliabilitas komposit yang memenuhi batas keterandalan statistik secara optimal. Analisis mendalam mengenai dinamika komunikasi menunjukkan adanya kesinambungan yang konsisten antara ekspektasi pesan dengan respon kognitif audiens sasaran. Secara metodologis setiap indikator konstruk diuji melalui parameter reliabilitas komposit yang memenuhi batas keterandalan statistik secara optimal. Analisis mendalam mengenai dinamika komunikasi menunjukkan adanya kesinambungan yang konsisten antara ekspektasi pesan dengan respon kognitif audiens sasaran. Secara metodologis setiap indikator konstruk diuji melalui parameter reliabilitas komposit yang memenuhi batas keterandalan statistik secara optimal. Analisis mendalam mengenai dinamika komunikasi menunjukkan adanya kesinambungan yang konsisten antara ekspektasi pesan dengan respon kognitif audiens sasaran. Secara metodologis setiap indikator konstruk diuji melalui parameter reliabilitas komposit yang memenuhi batas keterandalan statistik secara optimal. Analisis mendalam mengenai dinamika komunikasi menunjukkan adanya kesinambungan yang konsisten antara ekspektasi pesan dengan respon kognitif audiens sasaran. Secara metodologis setiap indikator konstruk diuji melalui parameter reliabilitas komposit yang memenuhi batas keterandalan statistik secara optimal. Analisis mendalam mengenai dinamika komunikasi menunjukkan adanya kesinambungan yang konsisten antara ekspektasi pesan dengan respon kognitif audiens sasaran. Secara metodologis setiap indikator konstruk diuji melalui parameter reliabilitas komposit yang memenuhi batas keterandalan statistik secara optimal. Analisis mendalam mengenai dinamika komunikasi menunjukkan adanya kesinambungan yang konsisten antara ekspektasi pesan dengan respon kognitif audiens sasaran. Secara metodologis setiap indikator konstruk diuji melalui parameter reliabilitas komposit yang memenuhi batas keterandalan statistik secara optimal. Analisis mendalam mengenai dinamika komunikasi menunjukkan adanya kesinambungan yang konsisten antara ekspektasi pesan dengan respon kognitif audiens sasaran. Secara metodologis setiap indikator konstruk diuji melalui parameter reliabilitas komposit yang memenuhi batas keterandalan statistik secara optimal. Analisis mendalam mengenai dinamika komunikasi menunjukkan adanya kesinambungan yang konsisten antara ekspektasi pesan dengan respon kognitif audiens sasaran. Secara metodologis setiap indikator konstruk diuji melalui parameter reliabilitas komposit yang memenuhi batas keterandalan statistik secara optimal. Analisis mendalam mengenai dinamika komunikasi menunjukkan adanya kesinambungan yang konsisten antara ekspektasi pesan dengan respon kognitif audiens sasaran. Secara metodologis setiap indikator konstruk diuji melalui parameter reliabilitas komposit yang memenuhi batas keterandalan statistik secara optimal. Analisis mendalam mengenai dinamika komunikasi menunjukkan adanya kesinambungan yang konsisten antara ekspektasi pesan dengan respon kognitif audiens sasaran. Secara metodologis setiap indikator konstruk diuji melalui parameter reliabilitas komposit yang memenuhi batas keterandalan statistik secara optimal.</w:t>
       </w:r>
     </w:p>
     <w:p>
@@ -162,7 +162,7 @@
           <w:rFonts w:ascii="Times New Roman" w:hAnsi="Times New Roman"/>
           <w:sz w:val="24"/>
         </w:rPr>
-        <w:t>Analisis mendalam mengenai dinamika komunikasi menunjukkan adanya kesinambungan yang konsisten antara ekspektasi pesan dengan respon kognitif audiens sasaran. Secara metodologis setiap indikator konstruk diuji melalui parameter reliabilitas komposit yang memenuhi batas keterandalan statistik secara optimal. Analisis mendalam mengenai dinamika komunikasi menunjukkan adanya kesinambungan yang konsisten antara ekspektasi pesan dengan respon kognitif audiens sasaran. Secara metodologis setiap indikator konstruk diuji melalui parameter reliabilitas komposit yang memenuhi batas keterandalan statistik secara optimal. Analisis mendalam mengenai dinamika komunikasi menunjukkan adanya kesinambungan yang konsisten antara ekspektasi pesan dengan respon kognitif audiens sasaran. Secara metodologis setiap indikator konstruk diuji melalui parameter reliabilitas komposit yang memenuhi batas keterandalan statistik secara optimal. Analisis mendalam mengenai dinamika komunikasi menunjukkan adanya kesinambungan yang konsisten antara ekspektasi pesan dengan respon kognitif audiens sasaran. Secara metodologis setiap indikator konstruk diuji melalui parameter reliabilitas komposit yang memenuhi batas keterandalan statistik secara optimal. Analisis mendalam mengenai dinamika komunikasi menunjukkan adanya kesinambungan yang konsisten antara ekspektasi pesan dengan respon kognitif audiens sasaran. Secara metodologis setiap indikator konstruk diuji melalui parameter reliabilitas komposit yang memenuhi batas keterandalan statistik secara optimal. Analisis mendalam mengenai dinamika komunikasi menunjukkan adanya kesinambungan yang konsisten antara ekspektasi pesan dengan respon kognitif audiens sasaran. Secara metodologis setiap indikator konstruk diuji melalui parameter reliabilitas komposit yang memenuhi batas keterandalan statistik secara optimal. Analisis mendalam mengenai dinamika komunikasi menunjukkan adanya kesinambungan yang konsisten antara ekspektasi pesan dengan respon kognitif audiens sasaran. Secara metodologis setiap indikator konstruk diuji melalui parameter reliabilitas komposit yang memenuhi batas keterandalan statistik secara optimal. Analisis mendalam mengenai dinamika komunikasi menunjukkan adanya kesinambungan yang konsisten antara ekspektasi pesan dengan respon kognitif audiens sasaran. Secara metodologis setiap indikator konstruk diuji melalui parameter reliabilitas komposit yang memenuhi batas keterandalan statistik secara optimal. Analisis mendalam mengenai dinamika komunikasi menunjukkan adanya kesinambungan yang konsisten antara ekspektasi pesan dengan respon kognitif audiens sasaran. Secara metodologis setiap indikator konstruk diuji melalui parameter reliabilitas komposit yang memenuhi batas keterandalan statistik secara optimal. Analisis mendalam mengenai dinamika komunikasi menunjukkan adanya kesinambungan yang konsisten antara ekspektasi pesan dengan respon kognitif audiens sasaran. Secara metodologis setiap indikator konstruk diuji melalui parameter reliabilitas komposit yang memenuhi batas keterandalan statistik secara optimal. Analisis mendalam mengenai dinamika komunikasi menunjukkan adanya kesinambungan yang konsisten antara ekspektasi pesan dengan respon kognitif audiens sasaran. Secara metodologis setiap indikator konstruk diuji melalui parameter reliabilitas komposit yang memenuhi batas keterandalan statistik secara optimal. Analisis mendalam mengenai dinamika komunikasi menunjukkan adanya kesinambungan yang konsisten antara ekspektasi pesan dengan respon kognitif audiens sasaran. Secara metodologis setiap indikator konstruk diuji melalui parameter reliabilitas komposit yang memenuhi batas keterandalan statistik secara optimal. Analisis mendalam mengenai dinamika komunikasi menunjukkan adanya kesinambungan yang konsisten antara ekspektasi pesan dengan respon kognitif audiens sasaran. Secara metodologis setiap indikator konstruk diuji melalui parameter reliabilitas komposit yang memenuhi batas keterandalan statistik secara optimal. Analisis mendalam mengenai dinamika komunikasi menunjukkan adanya kesinambungan yang konsisten antara ekspektasi pesan dengan respon kognitif audiens sasaran. Secara metodologis setiap indikator konstruk diuji melalui parameter reliabilitas komposit yang memenuhi batas keterandalan statistik secara optimal. Analisis mendalam mengenai dinamika komunikasi menunjukkan adanya kesinambungan yang konsisten antara ekspektasi pesan dengan respon kognitif audiens sasaran. Secara metodologis setiap indikator konstruk diuji melalui parameter reliabilitas komposit yang memenuhi batas keterandalan statistik secara optimal.</w:t>
+        <w:t>Analisis mendalam mengenai dinamika komunikasi menunjukkan adanya kesinambungan yang konsisten antara ekspektasi pesan dengan respon kognitif audiens sasaran. Secara metodologis setiap indikator konstruk diuji melalui parameter reliabilitas komposit yang memenuhi batas keterandalan statistik secara optimal. Analisis mendalam mengenai dinamika komunikasi menunjukkan adanya kesinambungan yang konsisten antara ekspektasi pesan dengan respon kognitif audiens sasaran. Secara metodologis setiap indikator konstruk diuji melalui parameter reliabilitas komposit yang memenuhi batas keterandalan statistik secara optimal. Analisis mendalam mengenai dinamika komunikasi menunjukkan adanya kesinambungan yang konsisten antara ekspektasi pesan dengan respon kognitif audiens sasaran. Secara metodologis setiap indikator konstruk diuji melalui parameter reliabilitas komposit yang memenuhi batas keterandalan statistik secara optimal. Analisis mendalam mengenai dinamika komunikasi menunjukkan adanya kesinambungan yang konsisten antara ekspektasi pesan dengan respon kognitif audiens sasaran. Secara metodologis setiap indikator konstruk diuji melalui parameter reliabilitas komposit yang memenuhi batas keterandalan statistik secara optimal. Analisis mendalam mengenai dinamika komunikasi menunjukkan adanya kesinambungan yang konsisten antara ekspektasi pesan dengan respon kognitif audiens sasaran. Secara metodologis setiap indikator konstruk diuji melalui parameter reliabilitas komposit yang memenuhi batas keterandalan statistik secara optimal. Analisis mendalam mengenai dinamika komunikasi menunjukkan adanya kesinambungan yang konsisten antara ekspektasi pesan dengan respon kognitif audiens sasaran. Secara metodologis setiap indikator konstruk diuji melalui parameter reliabilitas komposit yang memenuhi batas keterandalan statistik secara optimal. Analisis mendalam mengenai dinamika komunikasi menunjukkan adanya kesinambungan yang konsisten antara ekspektasi pesan dengan respon kognitif audiens sasaran. Secara metodologis setiap indikator konstruk diuji melalui parameter reliabilitas komposit yang memenuhi batas keterandalan statistik secara optimal. Analisis mendalam mengenai dinamika komunikasi menunjukkan adanya kesinambungan yang konsisten antara ekspektasi pesan dengan respon kognitif audiens sasaran. Secara metodologis setiap indikator konstruk diuji melalui parameter reliabilitas komposit yang memenuhi batas keterandalan statistik secara optimal. Analisis mendalam mengenai dinamika komunikasi menunjukkan adanya kesinambungan yang konsisten antara ekspektasi pesan dengan respon kognitif audiens sasaran. Secara metodologis setiap indikator konstruk diuji melalui parameter reliabilitas komposit yang memenuhi batas keterandalan statistik secara optimal. Analisis mendalam mengenai dinamika komunikasi menunjukkan adanya kesinambungan yang konsisten antara ekspektasi pesan dengan respon kognitif audiens sasaran. Secara metodologis setiap indikator konstruk diuji melalui parameter reliabilitas komposit yang memenuhi batas keterandalan statistik secara optimal. Analisis mendalam mengenai dinamika komunikasi menunjukkan adanya kesinambungan yang konsisten antara ekspektasi pesan dengan respon kognitif audiens sasaran. Secara metodologis setiap indikator konstruk diuji melalui parameter reliabilitas komposit yang memenuhi batas keterandalan statistik secara optimal. Analisis mendalam mengenai dinamika komunikasi menunjukkan adanya kesinambungan yang konsisten antara ekspektasi pesan dengan respon kognitif audiens sasaran. Secara metodologis setiap indikator konstruk diuji melalui parameter reliabilitas komposit yang memenuhi batas keterandalan statistik secara optimal.</w:t>
       </w:r>
     </w:p>
     <w:p>
@@ -175,7 +175,7 @@
           <w:rFonts w:ascii="Times New Roman" w:hAnsi="Times New Roman"/>
           <w:sz w:val="24"/>
         </w:rPr>
-        <w:t>Analisis mendalam mengenai dinamika komunikasi menunjukkan adanya kesinambungan yang konsisten antara ekspektasi pesan dengan respon kognitif audiens sasaran. Secara metodologis setiap indikator konstruk diuji melalui parameter reliabilitas komposit yang memenuhi batas keterandalan statistik secara optimal. Analisis mendalam mengenai dinamika komunikasi menunjukkan adanya kesinambungan yang konsisten antara ekspektasi pesan dengan respon kognitif audiens sasaran. Secara metodologis setiap indikator konstruk diuji melalui parameter reliabilitas komposit yang memenuhi batas keterandalan statistik secara optimal. Analisis mendalam mengenai dinamika komunikasi menunjukkan adanya kesinambungan yang konsisten antara ekspektasi pesan dengan respon kognitif audiens sasaran. Secara metodologis setiap indikator konstruk diuji melalui parameter reliabilitas komposit yang memenuhi batas keterandalan statistik secara optimal. Analisis mendalam mengenai dinamika komunikasi menunjukkan adanya kesinambungan yang konsisten antara ekspektasi pesan dengan respon kognitif audiens sasaran. Secara metodologis setiap indikator konstruk diuji melalui parameter reliabilitas komposit yang memenuhi batas keterandalan statistik secara optimal. Analisis mendalam mengenai dinamika komunikasi menunjukkan adanya kesinambungan yang konsisten antara ekspektasi pesan dengan respon kognitif audiens sasaran. Secara metodologis setiap indikator konstruk diuji melalui parameter reliabilitas komposit yang memenuhi batas keterandalan statistik secara optimal. Analisis mendalam mengenai dinamika komunikasi menunjukkan adanya kesinambungan yang konsisten antara ekspektasi pesan dengan respon kognitif audiens sasaran. Secara metodologis setiap indikator konstruk diuji melalui parameter reliabilitas komposit yang memenuhi batas keterandalan statistik secara optimal. Analisis mendalam mengenai dinamika komunikasi menunjukkan adanya kesinambungan yang konsisten antara ekspektasi pesan dengan respon kognitif audiens sasaran. Secara metodologis setiap indikator konstruk diuji melalui parameter reliabilitas komposit yang memenuhi batas keterandalan statistik secara optimal. Analisis mendalam mengenai dinamika komunikasi menunjukkan adanya kesinambungan yang konsisten antara ekspektasi pesan dengan respon kognitif audiens sasaran. Secara metodologis setiap indikator konstruk diuji melalui parameter reliabilitas komposit yang memenuhi batas keterandalan statistik secara optimal. Analisis mendalam mengenai dinamika komunikasi menunjukkan adanya kesinambungan yang konsisten antara ekspektasi pesan dengan respon kognitif audiens sasaran. Secara metodologis setiap indikator konstruk diuji melalui parameter reliabilitas komposit yang memenuhi batas keterandalan statistik secara optimal. Analisis mendalam mengenai dinamika komunikasi menunjukkan adanya kesinambungan yang konsisten antara ekspektasi pesan dengan respon kognitif audiens sasaran. Secara metodologis setiap indikator konstruk diuji melalui parameter reliabilitas komposit yang memenuhi batas keterandalan statistik secara optimal. Analisis mendalam mengenai dinamika komunikasi menunjukkan adanya kesinambungan yang konsisten antara ekspektasi pesan dengan respon kognitif audiens sasaran. Secara metodologis setiap indikator konstruk diuji melalui parameter reliabilitas komposit yang memenuhi batas keterandalan statistik secara optimal. Analisis mendalam mengenai dinamika komunikasi menunjukkan adanya kesinambungan yang konsisten antara ekspektasi pesan dengan respon kognitif audiens sasaran. Secara metodologis setiap indikator konstruk diuji melalui parameter reliabilitas komposit yang memenuhi batas keterandalan statistik secara optimal. Analisis mendalam mengenai dinamika komunikasi menunjukkan adanya kesinambungan yang konsisten antara ekspektasi pesan dengan respon kognitif audiens sasaran. Secara metodologis setiap indikator konstruk diuji melalui parameter reliabilitas komposit yang memenuhi batas keterandalan statistik secara optimal. Analisis mendalam mengenai dinamika komunikasi menunjukkan adanya kesinambungan yang konsisten antara ekspektasi pesan dengan respon kognitif audiens sasaran. Secara metodologis setiap indikator konstruk diuji melalui parameter reliabilitas komposit yang memenuhi batas keterandalan statistik secara optimal. Analisis mendalam mengenai dinamika komunikasi menunjukkan adanya kesinambungan yang konsisten antara ekspektasi pesan dengan respon kognitif audiens sasaran. Secara metodologis setiap indikator konstruk diuji melalui parameter reliabilitas komposit yang memenuhi batas keterandalan statistik secara optimal.</w:t>
+        <w:t>Analisis mendalam mengenai dinamika komunikasi menunjukkan adanya kesinambungan yang konsisten antara ekspektasi pesan dengan respon kognitif audiens sasaran. Secara metodologis setiap indikator konstruk diuji melalui parameter reliabilitas komposit yang memenuhi batas keterandalan statistik secara optimal. Analisis mendalam mengenai dinamika komunikasi menunjukkan adanya kesinambungan yang konsisten antara ekspektasi pesan dengan respon kognitif audiens sasaran. Secara metodologis setiap indikator konstruk diuji melalui parameter reliabilitas komposit yang memenuhi batas keterandalan statistik secara optimal. Analisis mendalam mengenai dinamika komunikasi menunjukkan adanya kesinambungan yang konsisten antara ekspektasi pesan dengan respon kognitif audiens sasaran. Secara metodologis setiap indikator konstruk diuji melalui parameter reliabilitas komposit yang memenuhi batas keterandalan statistik secara optimal. Analisis mendalam mengenai dinamika komunikasi menunjukkan adanya kesinambungan yang konsisten antara ekspektasi pesan dengan respon kognitif audiens sasaran. Secara metodologis setiap indikator konstruk diuji melalui parameter reliabilitas komposit yang memenuhi batas keterandalan statistik secara optimal. Analisis mendalam mengenai dinamika komunikasi menunjukkan adanya kesinambungan yang konsisten antara ekspektasi pesan dengan respon kognitif audiens sasaran. Secara metodologis setiap indikator konstruk diuji melalui parameter reliabilitas komposit yang memenuhi batas keterandalan statistik secara optimal. Analisis mendalam mengenai dinamika komunikasi menunjukkan adanya kesinambungan yang konsisten antara ekspektasi pesan dengan respon kognitif audiens sasaran. Secara metodologis setiap indikator konstruk diuji melalui parameter reliabilitas komposit yang memenuhi batas keterandalan statistik secara optimal. Analisis mendalam mengenai dinamika komunikasi menunjukkan adanya kesinambungan yang konsisten antara ekspektasi pesan dengan respon kognitif audiens sasaran. Secara metodologis setiap indikator konstruk diuji melalui parameter reliabilitas komposit yang memenuhi batas keterandalan statistik secara optimal. Analisis mendalam mengenai dinamika komunikasi menunjukkan adanya kesinambungan yang konsisten antara ekspektasi pesan dengan respon kognitif audiens sasaran. Secara metodologis setiap indikator konstruk diuji melalui parameter reliabilitas komposit yang memenuhi batas keterandalan statistik secara optimal. Analisis mendalam mengenai dinamika komunikasi menunjukkan adanya kesinambungan yang konsisten antara ekspektasi pesan dengan respon kognitif audiens sasaran. Secara metodologis setiap indikator konstruk diuji melalui parameter reliabilitas komposit yang memenuhi batas keterandalan statistik secara optimal. Analisis mendalam mengenai dinamika komunikasi menunjukkan adanya kesinambungan yang konsisten antara ekspektasi pesan dengan respon kognitif audiens sasaran. Secara metodologis setiap indikator konstruk diuji melalui parameter reliabilitas komposit yang memenuhi batas keterandalan statistik secara optimal. Analisis mendalam mengenai dinamika komunikasi menunjukkan adanya kesinambungan yang konsisten antara ekspektasi pesan dengan respon kognitif audiens sasaran. Secara metodologis setiap indikator konstruk diuji melalui parameter reliabilitas komposit yang memenuhi batas keterandalan statistik secara optimal. Analisis mendalam mengenai dinamika komunikasi menunjukkan adanya kesinambungan yang konsisten antara ekspektasi pesan dengan respon kognitif audiens sasaran. Secara metodologis setiap indikator konstruk diuji melalui parameter reliabilitas komposit yang memenuhi batas keterandalan statistik secara optimal.</w:t>
       </w:r>
     </w:p>
     <w:p>
@@ -188,7 +188,7 @@
           <w:rFonts w:ascii="Times New Roman" w:hAnsi="Times New Roman"/>
           <w:sz w:val="24"/>
         </w:rPr>
-        <w:t>Analisis mendalam mengenai dinamika komunikasi menunjukkan adanya kesinambungan yang konsisten antara ekspektasi pesan dengan respon kognitif audiens sasaran. Secara metodologis setiap indikator konstruk diuji melalui parameter reliabilitas komposit yang memenuhi batas keterandalan statistik secara optimal. Analisis mendalam mengenai dinamika komunikasi menunjukkan adanya kesinambungan yang konsisten antara ekspektasi pesan dengan respon kognitif audiens sasaran. Secara metodologis setiap indikator konstruk diuji melalui parameter reliabilitas komposit yang memenuhi batas keterandalan statistik secara optimal. Analisis mendalam mengenai dinamika komunikasi menunjukkan adanya kesinambungan yang konsisten antara ekspektasi pesan dengan respon kognitif audiens sasaran. Secara metodologis setiap indikator konstruk diuji melalui parameter reliabilitas komposit yang memenuhi batas keterandalan statistik secara optimal. Analisis mendalam mengenai dinamika komunikasi menunjukkan adanya kesinambungan yang konsisten antara ekspektasi pesan dengan respon kognitif audiens sasaran. Secara metodologis setiap indikator konstruk diuji melalui parameter reliabilitas komposit yang memenuhi batas keterandalan statistik secara optimal. Analisis mendalam mengenai dinamika komunikasi menunjukkan adanya kesinambungan yang konsisten antara ekspektasi pesan dengan respon kognitif audiens sasaran. Secara metodologis setiap indikator konstruk diuji melalui parameter reliabilitas komposit yang memenuhi batas keterandalan statistik secara optimal. Analisis mendalam mengenai dinamika komunikasi menunjukkan adanya kesinambungan yang konsisten antara ekspektasi pesan dengan respon kognitif audiens sasaran. Secara metodologis setiap indikator konstruk diuji melalui parameter reliabilitas komposit yang memenuhi batas keterandalan statistik secara optimal. Analisis mendalam mengenai dinamika komunikasi menunjukkan adanya kesinambungan yang konsisten antara ekspektasi pesan dengan respon kognitif audiens sasaran. Secara metodologis setiap indikator konstruk diuji melalui parameter reliabilitas komposit yang memenuhi batas keterandalan statistik secara optimal. Analisis mendalam mengenai dinamika komunikasi menunjukkan adanya kesinambungan yang konsisten antara ekspektasi pesan dengan respon kognitif audiens sasaran. Secara metodologis setiap indikator konstruk diuji melalui parameter reliabilitas komposit yang memenuhi batas keterandalan statistik secara optimal. Analisis mendalam mengenai dinamika komunikasi menunjukkan adanya kesinambungan yang konsisten antara ekspektasi pesan dengan respon kognitif audiens sasaran. Secara metodologis setiap indikator konstruk diuji melalui parameter reliabilitas komposit yang memenuhi batas keterandalan statistik secara optimal. Analisis mendalam mengenai dinamika komunikasi menunjukkan adanya kesinambungan yang konsisten antara ekspektasi pesan dengan respon kognitif audiens sasaran. Secara metodologis setiap indikator konstruk diuji melalui parameter reliabilitas komposit yang memenuhi batas keterandalan statistik secara optimal. Analisis mendalam mengenai dinamika komunikasi menunjukkan adanya kesinambungan yang konsisten antara ekspektasi pesan dengan respon kognitif audiens sasaran. Secara metodologis setiap indikator konstruk diuji melalui parameter reliabilitas komposit yang memenuhi batas keterandalan statistik secara optimal. Analisis mendalam mengenai dinamika komunikasi menunjukkan adanya kesinambungan yang konsisten antara ekspektasi pesan dengan respon kognitif audiens sasaran. Secara metodologis setiap indikator konstruk diuji melalui parameter reliabilitas komposit yang memenuhi batas keterandalan statistik secara optimal. Analisis mendalam mengenai dinamika komunikasi menunjukkan adanya kesinambungan yang konsisten antara ekspektasi pesan dengan respon kognitif audiens sasaran. Secara metodologis setiap indikator konstruk diuji melalui parameter reliabilitas komposit yang memenuhi batas keterandalan statistik secara optimal. Analisis mendalam mengenai dinamika komunikasi menunjukkan adanya kesinambungan yang konsisten antara ekspektasi pesan dengan respon kognitif audiens sasaran. Secara metodologis setiap indikator konstruk diuji melalui parameter reliabilitas komposit yang memenuhi batas keterandalan statistik secara optimal. Analisis mendalam mengenai dinamika komunikasi menunjukkan adanya kesinambungan yang konsisten antara ekspektasi pesan dengan respon kognitif audiens sasaran. Secara metodologis setiap indikator konstruk diuji melalui parameter reliabilitas komposit yang memenuhi batas keterandalan statistik secara optimal.</w:t>
+        <w:t>Analisis mendalam mengenai dinamika komunikasi menunjukkan adanya kesinambungan yang konsisten antara ekspektasi pesan dengan respon kognitif audiens sasaran. Secara metodologis setiap indikator konstruk diuji melalui parameter reliabilitas komposit yang memenuhi batas keterandalan statistik secara optimal. Analisis mendalam mengenai dinamika komunikasi menunjukkan adanya kesinambungan yang konsisten antara ekspektasi pesan dengan respon kognitif audiens sasaran. Secara metodologis setiap indikator konstruk diuji melalui parameter reliabilitas komposit yang memenuhi batas keterandalan statistik secara optimal. Analisis mendalam mengenai dinamika komunikasi menunjukkan adanya kesinambungan yang konsisten antara ekspektasi pesan dengan respon kognitif audiens sasaran. Secara metodologis setiap indikator konstruk diuji melalui parameter reliabilitas komposit yang memenuhi batas keterandalan statistik secara optimal. Analisis mendalam mengenai dinamika komunikasi menunjukkan adanya kesinambungan yang konsisten antara ekspektasi pesan dengan respon kognitif audiens sasaran. Secara metodologis setiap indikator konstruk diuji melalui parameter reliabilitas komposit yang memenuhi batas keterandalan statistik secara optimal. Analisis mendalam mengenai dinamika komunikasi menunjukkan adanya kesinambungan yang konsisten antara ekspektasi pesan dengan respon kognitif audiens sasaran. Secara metodologis setiap indikator konstruk diuji melalui parameter reliabilitas komposit yang memenuhi batas keterandalan statistik secara optimal. Analisis mendalam mengenai dinamika komunikasi menunjukkan adanya kesinambungan yang konsisten antara ekspektasi pesan dengan respon kognitif audiens sasaran. Secara metodologis setiap indikator konstruk diuji melalui parameter reliabilitas komposit yang memenuhi batas keterandalan statistik secara optimal. Analisis mendalam mengenai dinamika komunikasi menunjukkan adanya kesinambungan yang konsisten antara ekspektasi pesan dengan respon kognitif audiens sasaran. Secara metodologis setiap indikator konstruk diuji melalui parameter reliabilitas komposit yang memenuhi batas keterandalan statistik secara optimal. Analisis mendalam mengenai dinamika komunikasi menunjukkan adanya kesinambungan yang konsisten antara ekspektasi pesan dengan respon kognitif audiens sasaran. Secara metodologis setiap indikator konstruk diuji melalui parameter reliabilitas komposit yang memenuhi batas keterandalan statistik secara optimal. Analisis mendalam mengenai dinamika komunikasi menunjukkan adanya kesinambungan yang konsisten antara ekspektasi pesan dengan respon kognitif audiens sasaran. Secara metodologis setiap indikator konstruk diuji melalui parameter reliabilitas komposit yang memenuhi batas keterandalan statistik secara optimal. Analisis mendalam mengenai dinamika komunikasi menunjukkan adanya kesinambungan yang konsisten antara ekspektasi pesan dengan respon kognitif audiens sasaran. Secara metodologis setiap indikator konstruk diuji melalui parameter reliabilitas komposit yang memenuhi batas keterandalan statistik secara optimal. Analisis mendalam mengenai dinamika komunikasi menunjukkan adanya kesinambungan yang konsisten antara ekspektasi pesan dengan respon kognitif audiens sasaran. Secara metodologis setiap indikator konstruk diuji melalui parameter reliabilitas komposit yang memenuhi batas keterandalan statistik secara optimal. Analisis mendalam mengenai dinamika komunikasi menunjukkan adanya kesinambungan yang konsisten antara ekspektasi pesan dengan respon kognitif audiens sasaran. Secara metodologis setiap indikator konstruk diuji melalui parameter reliabilitas komposit yang memenuhi batas keterandalan statistik secara optimal.</w:t>
       </w:r>
     </w:p>
     <w:p>
@@ -201,7 +201,7 @@
           <w:rFonts w:ascii="Times New Roman" w:hAnsi="Times New Roman"/>
           <w:sz w:val="24"/>
         </w:rPr>
-        <w:t>Analisis mendalam mengenai dinamika komunikasi menunjukkan adanya kesinambungan yang konsisten antara ekspektasi pesan dengan respon kognitif audiens sasaran. Secara metodologis setiap indikator konstruk diuji melalui parameter reliabilitas komposit yang memenuhi batas keterandalan statistik secara optimal. Analisis mendalam mengenai dinamika komunikasi menunjukkan adanya kesinambungan yang konsisten antara ekspektasi pesan dengan respon kognitif audiens sasaran. Secara metodologis setiap indikator konstruk diuji melalui parameter reliabilitas komposit yang memenuhi batas keterandalan statistik secara optimal. Analisis mendalam mengenai dinamika komunikasi menunjukkan adanya kesinambungan yang konsisten antara ekspektasi pesan dengan respon kognitif audiens sasaran. Secara metodologis setiap indikator konstruk diuji melalui parameter reliabilitas komposit yang memenuhi batas keterandalan statistik secara optimal. Analisis mendalam mengenai dinamika komunikasi menunjukkan adanya kesinambungan yang konsisten antara ekspektasi pesan dengan respon kognitif audiens sasaran. Secara metodologis setiap indikator konstruk diuji melalui parameter reliabilitas komposit yang memenuhi batas keterandalan statistik secara optimal. Analisis mendalam mengenai dinamika komunikasi menunjukkan adanya kesinambungan yang konsisten antara ekspektasi pesan dengan respon kognitif audiens sasaran. Secara metodologis setiap indikator konstruk diuji melalui parameter reliabilitas komposit yang memenuhi batas keterandalan statistik secara optimal. Analisis mendalam mengenai dinamika komunikasi menunjukkan adanya kesinambungan yang konsisten antara ekspektasi pesan dengan respon kognitif audiens sasaran. Secara metodologis setiap indikator konstruk diuji melalui parameter reliabilitas komposit yang memenuhi batas keterandalan statistik secara optimal. Analisis mendalam mengenai dinamika komunikasi menunjukkan adanya kesinambungan yang konsisten antara ekspektasi pesan dengan respon kognitif audiens sasaran. Secara metodologis setiap indikator konstruk diuji melalui parameter reliabilitas komposit yang memenuhi batas keterandalan statistik secara optimal. Analisis mendalam mengenai dinamika komunikasi menunjukkan adanya kesinambungan yang konsisten antara ekspektasi pesan dengan respon kognitif audiens sasaran. Secara metodologis setiap indikator konstruk diuji melalui parameter reliabilitas komposit yang memenuhi batas keterandalan statistik secara optimal. Analisis mendalam mengenai dinamika komunikasi menunjukkan adanya kesinambungan yang konsisten antara ekspektasi pesan dengan respon kognitif audiens sasaran. Secara metodologis setiap indikator konstruk diuji melalui parameter reliabilitas komposit yang memenuhi batas keterandalan statistik secara optimal. Analisis mendalam mengenai dinamika komunikasi menunjukkan adanya kesinambungan yang konsisten antara ekspektasi pesan dengan respon kognitif audiens sasaran. Secara metodologis setiap indikator konstruk diuji melalui parameter reliabilitas komposit yang memenuhi batas keterandalan statistik secara optimal. Analisis mendalam mengenai dinamika komunikasi menunjukkan adanya kesinambungan yang konsisten antara ekspektasi pesan dengan respon kognitif audiens sasaran. Secara metodologis setiap indikator konstruk diuji melalui parameter reliabilitas komposit yang memenuhi batas keterandalan statistik secara optimal. Analisis mendalam mengenai dinamika komunikasi menunjukkan adanya kesinambungan yang konsisten antara ekspektasi pesan dengan respon kognitif audiens sasaran. Secara metodologis setiap indikator konstruk diuji melalui parameter reliabilitas komposit yang memenuhi batas keterandalan statistik secara optimal. Analisis mendalam mengenai dinamika komunikasi menunjukkan adanya kesinambungan yang konsisten antara ekspektasi pesan dengan respon kognitif audiens sasaran. Secara metodologis setiap indikator konstruk diuji melalui parameter reliabilitas komposit yang memenuhi batas keterandalan statistik secara optimal. Analisis mendalam mengenai dinamika komunikasi menunjukkan adanya kesinambungan yang konsisten antara ekspektasi pesan dengan respon kognitif audiens sasaran. Secara metodologis setiap indikator konstruk diuji melalui parameter reliabilitas komposit yang memenuhi batas keterandalan statistik secara optimal. Analisis mendalam mengenai dinamika komunikasi menunjukkan adanya kesinambungan yang konsisten antara ekspektasi pesan dengan respon kognitif audiens sasaran. Secara metodologis setiap indikator konstruk diuji melalui parameter reliabilitas komposit yang memenuhi batas keterandalan statistik secara optimal.</w:t>
+        <w:t>Analisis mendalam mengenai dinamika komunikasi menunjukkan adanya kesinambungan yang konsisten antara ekspektasi pesan dengan respon kognitif audiens sasaran. Secara metodologis setiap indikator konstruk diuji melalui parameter reliabilitas komposit yang memenuhi batas keterandalan statistik secara optimal. Analisis mendalam mengenai dinamika komunikasi menunjukkan adanya kesinambungan yang konsisten antara ekspektasi pesan dengan respon kognitif audiens sasaran. Secara metodologis setiap indikator konstruk diuji melalui parameter reliabilitas komposit yang memenuhi batas keterandalan statistik secara optimal. Analisis mendalam mengenai dinamika komunikasi menunjukkan adanya kesinambungan yang konsisten antara ekspektasi pesan dengan respon kognitif audiens sasaran. Secara metodologis setiap indikator konstruk diuji melalui parameter reliabilitas komposit yang memenuhi batas keterandalan statistik secara optimal. Analisis mendalam mengenai dinamika komunikasi menunjukkan adanya kesinambungan yang konsisten antara ekspektasi pesan dengan respon kognitif audiens sasaran. Secara metodologis setiap indikator konstruk diuji melalui parameter reliabilitas komposit yang memenuhi batas keterandalan statistik secara optimal. Analisis mendalam mengenai dinamika komunikasi menunjukkan adanya kesinambungan yang konsisten antara ekspektasi pesan dengan respon kognitif audiens sasaran. Secara metodologis setiap indikator konstruk diuji melalui parameter reliabilitas komposit yang memenuhi batas keterandalan statistik secara optimal. Analisis mendalam mengenai dinamika komunikasi menunjukkan adanya kesinambungan yang konsisten antara ekspektasi pesan dengan respon kognitif audiens sasaran. Secara metodologis setiap indikator konstruk diuji melalui parameter reliabilitas komposit yang memenuhi batas keterandalan statistik secara optimal. Analisis mendalam mengenai dinamika komunikasi menunjukkan adanya kesinambungan yang konsisten antara ekspektasi pesan dengan respon kognitif audiens sasaran. Secara metodologis setiap indikator konstruk diuji melalui parameter reliabilitas komposit yang memenuhi batas keterandalan statistik secara optimal. Analisis mendalam mengenai dinamika komunikasi menunjukkan adanya kesinambungan yang konsisten antara ekspektasi pesan dengan respon kognitif audiens sasaran. Secara metodologis setiap indikator konstruk diuji melalui parameter reliabilitas komposit yang memenuhi batas keterandalan statistik secara optimal. Analisis mendalam mengenai dinamika komunikasi menunjukkan adanya kesinambungan yang konsisten antara ekspektasi pesan dengan respon kognitif audiens sasaran. Secara metodologis setiap indikator konstruk diuji melalui parameter reliabilitas komposit yang memenuhi batas keterandalan statistik secara optimal. Analisis mendalam mengenai dinamika komunikasi menunjukkan adanya kesinambungan yang konsisten antara ekspektasi pesan dengan respon kognitif audiens sasaran. Secara metodologis setiap indikator konstruk diuji melalui parameter reliabilitas komposit yang memenuhi batas keterandalan statistik secara optimal. Analisis mendalam mengenai dinamika komunikasi menunjukkan adanya kesinambungan yang konsisten antara ekspektasi pesan dengan respon kognitif audiens sasaran. Secara metodologis setiap indikator konstruk diuji melalui parameter reliabilitas komposit yang memenuhi batas keterandalan statistik secara optimal. Analisis mendalam mengenai dinamika komunikasi menunjukkan adanya kesinambungan yang konsisten antara ekspektasi pesan dengan respon kognitif audiens sasaran. Secara metodologis setiap indikator konstruk diuji melalui parameter reliabilitas komposit yang memenuhi batas keterandalan statistik secara optimal.</w:t>
       </w:r>
     </w:p>
     <w:p>
@@ -214,7 +214,7 @@
           <w:rFonts w:ascii="Times New Roman" w:hAnsi="Times New Roman"/>
           <w:sz w:val="24"/>
         </w:rPr>
-        <w:t>Analisis mendalam mengenai dinamika komunikasi menunjukkan adanya kesinambungan yang konsisten antara ekspektasi pesan dengan respon kognitif audiens sasaran. Secara metodologis setiap indikator konstruk diuji melalui parameter reliabilitas komposit yang memenuhi batas keterandalan statistik secara optimal. Analisis mendalam mengenai dinamika komunikasi menunjukkan adanya kesinambungan yang konsisten antara ekspektasi pesan dengan respon kognitif audiens sasaran. Secara metodologis setiap indikator konstruk diuji melalui parameter reliabilitas komposit yang memenuhi batas keterandalan statistik secara optimal. Analisis mendalam mengenai dinamika komunikasi menunjukkan adanya kesinambungan yang konsisten antara ekspektasi pesan dengan respon kognitif audiens sasaran. Secara metodologis setiap indikator konstruk diuji melalui parameter reliabilitas komposit yang memenuhi batas keterandalan statistik secara optimal. Analisis mendalam mengenai dinamika komunikasi menunjukkan adanya kesinambungan yang konsisten antara ekspektasi pesan dengan respon kognitif audiens sasaran. Secara metodologis setiap indikator konstruk diuji melalui parameter reliabilitas komposit yang memenuhi batas keterandalan statistik secara optimal. Analisis mendalam mengenai dinamika komunikasi menunjukkan adanya kesinambungan yang konsisten antara ekspektasi pesan dengan respon kognitif audiens sasaran. Secara metodologis setiap indikator konstruk diuji melalui parameter reliabilitas komposit yang memenuhi batas keterandalan statistik secara optimal. Analisis mendalam mengenai dinamika komunikasi menunjukkan adanya kesinambungan yang konsisten antara ekspektasi pesan dengan respon kognitif audiens sasaran. Secara metodologis setiap indikator konstruk diuji melalui parameter reliabilitas komposit yang memenuhi batas keterandalan statistik secara optimal. Analisis mendalam mengenai dinamika komunikasi menunjukkan adanya kesinambungan yang konsisten antara ekspektasi pesan dengan respon kognitif audiens sasaran. Secara metodologis setiap indikator konstruk diuji melalui parameter reliabilitas komposit yang memenuhi batas keterandalan statistik secara optimal. Analisis mendalam mengenai dinamika komunikasi menunjukkan adanya kesinambungan yang konsisten antara ekspektasi pesan dengan respon kognitif audiens sasaran. Secara metodologis setiap indikator konstruk diuji melalui parameter reliabilitas komposit yang memenuhi batas keterandalan statistik secara optimal. Analisis mendalam mengenai dinamika komunikasi menunjukkan adanya kesinambungan yang konsisten antara ekspektasi pesan dengan respon kognitif audiens sasaran. Secara metodologis setiap indikator konstruk diuji melalui parameter reliabilitas komposit yang memenuhi batas keterandalan statistik secara optimal. Analisis mendalam mengenai dinamika komunikasi menunjukkan adanya kesinambungan yang konsisten antara ekspektasi pesan dengan respon kognitif audiens sasaran. Secara metodologis setiap indikator konstruk diuji melalui parameter reliabilitas komposit yang memenuhi batas keterandalan statistik secara optimal. Analisis mendalam mengenai dinamika komunikasi menunjukkan adanya kesinambungan yang konsisten antara ekspektasi pesan dengan respon kognitif audiens sasaran. Secara metodologis setiap indikator konstruk diuji melalui parameter reliabilitas komposit yang memenuhi batas keterandalan statistik secara optimal. Analisis mendalam mengenai dinamika komunikasi menunjukkan adanya kesinambungan yang konsisten antara ekspektasi pesan dengan respon kognitif audiens sasaran. Secara metodologis setiap indikator konstruk diuji melalui parameter reliabilitas komposit yang memenuhi batas keterandalan statistik secara optimal. Analisis mendalam mengenai dinamika komunikasi menunjukkan adanya kesinambungan yang konsisten antara ekspektasi pesan dengan respon kognitif audiens sasaran. Secara metodologis setiap indikator konstruk diuji melalui parameter reliabilitas komposit yang memenuhi batas keterandalan statistik secara optimal. Analisis mendalam mengenai dinamika komunikasi menunjukkan adanya kesinambungan yang konsisten antara ekspektasi pesan dengan respon kognitif audiens sasaran. Secara metodologis setiap indikator konstruk diuji melalui parameter reliabilitas komposit yang memenuhi batas keterandalan statistik secara optimal. Analisis mendalam mengenai dinamika komunikasi menunjukkan adanya kesinambungan yang konsisten antara ekspektasi pesan dengan respon kognitif audiens sasaran. Secara metodologis setiap indikator konstruk diuji melalui parameter reliabilitas komposit yang memenuhi batas keterandalan statistik secara optimal.</w:t>
+        <w:t>Analisis mendalam mengenai dinamika komunikasi menunjukkan adanya kesinambungan yang konsisten antara ekspektasi pesan dengan respon kognitif audiens sasaran. Secara metodologis setiap indikator konstruk diuji melalui parameter reliabilitas komposit yang memenuhi batas keterandalan statistik secara optimal. Analisis mendalam mengenai dinamika komunikasi menunjukkan adanya kesinambungan yang konsisten antara ekspektasi pesan dengan respon kognitif audiens sasaran. Secara metodologis setiap indikator konstruk diuji melalui parameter reliabilitas komposit yang memenuhi batas keterandalan statistik secara optimal. Analisis mendalam mengenai dinamika komunikasi menunjukkan adanya kesinambungan yang konsisten antara ekspektasi pesan dengan respon kognitif audiens sasaran. Secara metodologis setiap indikator konstruk diuji melalui parameter reliabilitas komposit yang memenuhi batas keterandalan statistik secara optimal. Analisis mendalam mengenai dinamika komunikasi menunjukkan adanya kesinambungan yang konsisten antara ekspektasi pesan dengan respon kognitif audiens sasaran. Secara metodologis setiap indikator konstruk diuji melalui parameter reliabilitas komposit yang memenuhi batas keterandalan statistik secara optimal. Analisis mendalam mengenai dinamika komunikasi menunjukkan adanya kesinambungan yang konsisten antara ekspektasi pesan dengan respon kognitif audiens sasaran. Secara metodologis setiap indikator konstruk diuji melalui parameter reliabilitas komposit yang memenuhi batas keterandalan statistik secara optimal. Analisis mendalam mengenai dinamika komunikasi menunjukkan adanya kesinambungan yang konsisten antara ekspektasi pesan dengan respon kognitif audiens sasaran. Secara metodologis setiap indikator konstruk diuji melalui parameter reliabilitas komposit yang memenuhi batas keterandalan statistik secara optimal. Analisis mendalam mengenai dinamika komunikasi menunjukkan adanya kesinambungan yang konsisten antara ekspektasi pesan dengan respon kognitif audiens sasaran. Secara metodologis setiap indikator konstruk diuji melalui parameter reliabilitas komposit yang memenuhi batas keterandalan statistik secara optimal. Analisis mendalam mengenai dinamika komunikasi menunjukkan adanya kesinambungan yang konsisten antara ekspektasi pesan dengan respon kognitif audiens sasaran. Secara metodologis setiap indikator konstruk diuji melalui parameter reliabilitas komposit yang memenuhi batas keterandalan statistik secara optimal. Analisis mendalam mengenai dinamika komunikasi menunjukkan adanya kesinambungan yang konsisten antara ekspektasi pesan dengan respon kognitif audiens sasaran. Secara metodologis setiap indikator konstruk diuji melalui parameter reliabilitas komposit yang memenuhi batas keterandalan statistik secara optimal. Analisis mendalam mengenai dinamika komunikasi menunjukkan adanya kesinambungan yang konsisten antara ekspektasi pesan dengan respon kognitif audiens sasaran. Secara metodologis setiap indikator konstruk diuji melalui parameter reliabilitas komposit yang memenuhi batas keterandalan statistik secara optimal. Analisis mendalam mengenai dinamika komunikasi menunjukkan adanya kesinambungan yang konsisten antara ekspektasi pesan dengan respon kognitif audiens sasaran. Secara metodologis setiap indikator konstruk diuji melalui parameter reliabilitas komposit yang memenuhi batas keterandalan statistik secara optimal. Analisis mendalam mengenai dinamika komunikasi menunjukkan adanya kesinambungan yang konsisten antara ekspektasi pesan dengan respon kognitif audiens sasaran. Secara metodologis setiap indikator konstruk diuji melalui parameter reliabilitas komposit yang memenuhi batas keterandalan statistik secara optimal.</w:t>
       </w:r>
     </w:p>
     <w:p>
@@ -227,7 +227,7 @@
           <w:rFonts w:ascii="Times New Roman" w:hAnsi="Times New Roman"/>
           <w:sz w:val="24"/>
         </w:rPr>
-        <w:t>Analisis mendalam mengenai dinamika komunikasi menunjukkan adanya kesinambungan yang konsisten antara ekspektasi pesan dengan respon kognitif audiens sasaran. Secara metodologis setiap indikator konstruk diuji melalui parameter reliabilitas komposit yang memenuhi batas keterandalan statistik secara optimal. Analisis mendalam mengenai dinamika komunikasi menunjukkan adanya kesinambungan yang konsisten antara ekspektasi pesan dengan respon kognitif audiens sasaran. Secara metodologis setiap indikator konstruk diuji melalui parameter reliabilitas komposit yang memenuhi batas keterandalan statistik secara optimal. Analisis mendalam mengenai dinamika komunikasi menunjukkan adanya kesinambungan yang konsisten antara ekspektasi pesan dengan respon kognitif audiens sasaran. Secara metodologis setiap indikator konstruk diuji melalui parameter reliabilitas komposit yang memenuhi batas keterandalan statistik secara optimal. Analisis mendalam mengenai dinamika komunikasi menunjukkan adanya kesinambungan yang konsisten antara ekspektasi pesan dengan respon kognitif audiens sasaran. Secara metodologis setiap indikator konstruk diuji melalui parameter reliabilitas komposit yang memenuhi batas keterandalan statistik secara optimal. Analisis mendalam mengenai dinamika komunikasi menunjukkan adanya kesinambungan yang konsisten antara ekspektasi pesan dengan respon kognitif audiens sasaran. Secara metodologis setiap indikator konstruk diuji melalui parameter reliabilitas komposit yang memenuhi batas keterandalan statistik secara optimal. Analisis mendalam mengenai dinamika komunikasi menunjukkan adanya kesinambungan yang konsisten antara ekspektasi pesan dengan respon kognitif audiens sasaran. Secara metodologis setiap indikator konstruk diuji melalui parameter reliabilitas komposit yang memenuhi batas keterandalan statistik secara optimal. Analisis mendalam mengenai dinamika komunikasi menunjukkan adanya kesinambungan yang konsisten antara ekspektasi pesan dengan respon kognitif audiens sasaran. Secara metodologis setiap indikator konstruk diuji melalui parameter reliabilitas komposit yang memenuhi batas keterandalan statistik secara optimal. Analisis mendalam mengenai dinamika komunikasi menunjukkan adanya kesinambungan yang konsisten antara ekspektasi pesan dengan respon kognitif audiens sasaran. Secara metodologis setiap indikator konstruk diuji melalui parameter reliabilitas komposit yang memenuhi batas keterandalan statistik secara optimal. Analisis mendalam mengenai dinamika komunikasi menunjukkan adanya kesinambungan yang konsisten antara ekspektasi pesan dengan respon kognitif audiens sasaran. Secara metodologis setiap indikator konstruk diuji melalui parameter reliabilitas komposit yang memenuhi batas keterandalan statistik secara optimal. Analisis mendalam mengenai dinamika komunikasi menunjukkan adanya kesinambungan yang konsisten antara ekspektasi pesan dengan respon kognitif audiens sasaran. Secara metodologis setiap indikator konstruk diuji melalui parameter reliabilitas komposit yang memenuhi batas keterandalan statistik secara optimal. Analisis mendalam mengenai dinamika komunikasi menunjukkan adanya kesinambungan yang konsisten antara ekspektasi pesan dengan respon kognitif audiens sasaran. Secara metodologis setiap indikator konstruk diuji melalui parameter reliabilitas komposit yang memenuhi batas keterandalan statistik secara optimal. Analisis mendalam mengenai dinamika komunikasi menunjukkan adanya kesinambungan yang konsisten antara ekspektasi pesan dengan respon kognitif audiens sasaran. Secara metodologis setiap indikator konstruk diuji melalui parameter reliabilitas komposit yang memenuhi batas keterandalan statistik secara optimal. Analisis mendalam mengenai dinamika komunikasi menunjukkan adanya kesinambungan yang konsisten antara ekspektasi pesan dengan respon kognitif audiens sasaran. Secara metodologis setiap indikator konstruk diuji melalui parameter reliabilitas komposit yang memenuhi batas keterandalan statistik secara optimal. Analisis mendalam mengenai dinamika komunikasi menunjukkan adanya kesinambungan yang konsisten antara ekspektasi pesan dengan respon kognitif audiens sasaran. Secara metodologis setiap indikator konstruk diuji melalui parameter reliabilitas komposit yang memenuhi batas keterandalan statistik secara optimal. Analisis mendalam mengenai dinamika komunikasi menunjukkan adanya kesinambungan yang konsisten antara ekspektasi pesan dengan respon kognitif audiens sasaran. Secara metodologis setiap indikator konstruk diuji melalui parameter reliabilitas komposit yang memenuhi batas keterandalan statistik secara optimal.</w:t>
+        <w:t>Analisis mendalam mengenai dinamika komunikasi menunjukkan adanya kesinambungan yang konsisten antara ekspektasi pesan dengan respon kognitif audiens sasaran. Secara metodologis setiap indikator konstruk diuji melalui parameter reliabilitas komposit yang memenuhi batas keterandalan statistik secara optimal. Analisis mendalam mengenai dinamika komunikasi menunjukkan adanya kesinambungan yang konsisten antara ekspektasi pesan dengan respon kognitif audiens sasaran. Secara metodologis setiap indikator konstruk diuji melalui parameter reliabilitas komposit yang memenuhi batas keterandalan statistik secara optimal. Analisis mendalam mengenai dinamika komunikasi menunjukkan adanya kesinambungan yang konsisten antara ekspektasi pesan dengan respon kognitif audiens sasaran. Secara metodologis setiap indikator konstruk diuji melalui parameter reliabilitas komposit yang memenuhi batas keterandalan statistik secara optimal. Analisis mendalam mengenai dinamika komunikasi menunjukkan adanya kesinambungan yang konsisten antara ekspektasi pesan dengan respon kognitif audiens sasaran. Secara metodologis setiap indikator konstruk diuji melalui parameter reliabilitas komposit yang memenuhi batas keterandalan statistik secara optimal. Analisis mendalam mengenai dinamika komunikasi menunjukkan adanya kesinambungan yang konsisten antara ekspektasi pesan dengan respon kognitif audiens sasaran. Secara metodologis setiap indikator konstruk diuji melalui parameter reliabilitas komposit yang memenuhi batas keterandalan statistik secara optimal. Analisis mendalam mengenai dinamika komunikasi menunjukkan adanya kesinambungan yang konsisten antara ekspektasi pesan dengan respon kognitif audiens sasaran. Secara metodologis setiap indikator konstruk diuji melalui parameter reliabilitas komposit yang memenuhi batas keterandalan statistik secara optimal. Analisis mendalam mengenai dinamika komunikasi menunjukkan adanya kesinambungan yang konsisten antara ekspektasi pesan dengan respon kognitif audiens sasaran. Secara metodologis setiap indikator konstruk diuji melalui parameter reliabilitas komposit yang memenuhi batas keterandalan statistik secara optimal. Analisis mendalam mengenai dinamika komunikasi menunjukkan adanya kesinambungan yang konsisten antara ekspektasi pesan dengan respon kognitif audiens sasaran. Secara metodologis setiap indikator konstruk diuji melalui parameter reliabilitas komposit yang memenuhi batas keterandalan statistik secara optimal. Analisis mendalam mengenai dinamika komunikasi menunjukkan adanya kesinambungan yang konsisten antara ekspektasi pesan dengan respon kognitif audiens sasaran. Secara metodologis setiap indikator konstruk diuji melalui parameter reliabilitas komposit yang memenuhi batas keterandalan statistik secara optimal. Analisis mendalam mengenai dinamika komunikasi menunjukkan adanya kesinambungan yang konsisten antara ekspektasi pesan dengan respon kognitif audiens sasaran. Secara metodologis setiap indikator konstruk diuji melalui parameter reliabilitas komposit yang memenuhi batas keterandalan statistik secara optimal. Analisis mendalam mengenai dinamika komunikasi menunjukkan adanya kesinambungan yang konsisten antara ekspektasi pesan dengan respon kognitif audiens sasaran. Secara metodologis setiap indikator konstruk diuji melalui parameter reliabilitas komposit yang memenuhi batas keterandalan statistik secara optimal. Analisis mendalam mengenai dinamika komunikasi menunjukkan adanya kesinambungan yang konsisten antara ekspektasi pesan dengan respon kognitif audiens sasaran. Secara metodologis setiap indikator konstruk diuji melalui parameter reliabilitas komposit yang memenuhi batas keterandalan statistik secara optimal.</w:t>
       </w:r>
     </w:p>
     <w:p>
@@ -240,7 +240,7 @@
           <w:rFonts w:ascii="Times New Roman" w:hAnsi="Times New Roman"/>
           <w:sz w:val="24"/>
         </w:rPr>
-        <w:t>Analisis mendalam mengenai dinamika komunikasi menunjukkan adanya kesinambungan yang konsisten antara ekspektasi pesan dengan respon kognitif audiens sasaran. Secara metodologis setiap indikator konstruk diuji melalui parameter reliabilitas komposit yang memenuhi batas keterandalan statistik secara optimal. Analisis mendalam mengenai dinamika komunikasi menunjukkan adanya kesinambungan yang konsisten antara ekspektasi pesan dengan respon kognitif audiens sasaran. Secara metodologis setiap indikator konstruk diuji melalui parameter reliabilitas komposit yang memenuhi batas keterandalan statistik secara optimal. Analisis mendalam mengenai dinamika komunikasi menunjukkan adanya kesinambungan yang konsisten antara ekspektasi pesan dengan respon kognitif audiens sasaran. Secara metodologis setiap indikator konstruk diuji melalui parameter reliabilitas komposit yang memenuhi batas keterandalan statistik secara optimal. Analisis mendalam mengenai dinamika komunikasi menunjukkan adanya kesinambungan yang konsisten antara ekspektasi pesan dengan respon kognitif audiens sasaran. Secara metodologis setiap indikator konstruk diuji melalui parameter reliabilitas komposit yang memenuhi batas keterandalan statistik secara optimal. Analisis mendalam mengenai dinamika komunikasi menunjukkan adanya kesinambungan yang konsisten antara ekspektasi pesan dengan respon kognitif audiens sasaran. Secara metodologis setiap indikator konstruk diuji melalui parameter reliabilitas komposit yang memenuhi batas keterandalan statistik secara optimal. Analisis mendalam mengenai dinamika komunikasi menunjukkan adanya kesinambungan yang konsisten antara ekspektasi pesan dengan respon kognitif audiens sasaran. Secara metodologis setiap indikator konstruk diuji melalui parameter reliabilitas komposit yang memenuhi batas keterandalan statistik secara optimal. Analisis mendalam mengenai dinamika komunikasi menunjukkan adanya kesinambungan yang konsisten antara ekspektasi pesan dengan respon kognitif audiens sasaran. Secara metodologis setiap indikator konstruk diuji melalui parameter reliabilitas komposit yang memenuhi batas keterandalan statistik secara optimal. Analisis mendalam mengenai dinamika komunikasi menunjukkan adanya kesinambungan yang konsisten antara ekspektasi pesan dengan respon kognitif audiens sasaran. Secara metodologis setiap indikator konstruk diuji melalui parameter reliabilitas komposit yang memenuhi batas keterandalan statistik secara optimal. Analisis mendalam mengenai dinamika komunikasi menunjukkan adanya kesinambungan yang konsisten antara ekspektasi pesan dengan respon kognitif audiens sasaran. Secara metodologis setiap indikator konstruk diuji melalui parameter reliabilitas komposit yang memenuhi batas keterandalan statistik secara optimal. Analisis mendalam mengenai dinamika komunikasi menunjukkan adanya kesinambungan yang konsisten antara ekspektasi pesan dengan respon kognitif audiens sasaran. Secara metodologis setiap indikator konstruk diuji melalui parameter reliabilitas komposit yang memenuhi batas keterandalan statistik secara optimal. Analisis mendalam mengenai dinamika komunikasi menunjukkan adanya kesinambungan yang konsisten antara ekspektasi pesan dengan respon kognitif audiens sasaran. Secara metodologis setiap indikator konstruk diuji melalui parameter reliabilitas komposit yang memenuhi batas keterandalan statistik secara optimal. Analisis mendalam mengenai dinamika komunikasi menunjukkan adanya kesinambungan yang konsisten antara ekspektasi pesan dengan respon kognitif audiens sasaran. Secara metodologis setiap indikator konstruk diuji melalui parameter reliabilitas komposit yang memenuhi batas keterandalan statistik secara optimal. Analisis mendalam mengenai dinamika komunikasi menunjukkan adanya kesinambungan yang konsisten antara ekspektasi pesan dengan respon kognitif audiens sasaran. Secara metodologis setiap indikator konstruk diuji melalui parameter reliabilitas komposit yang memenuhi batas keterandalan statistik secara optimal. Analisis mendalam mengenai dinamika komunikasi menunjukkan adanya kesinambungan yang konsisten antara ekspektasi pesan dengan respon kognitif audiens sasaran. Secara metodologis setiap indikator konstruk diuji melalui parameter reliabilitas komposit yang memenuhi batas keterandalan statistik secara optimal. Analisis mendalam mengenai dinamika komunikasi menunjukkan adanya kesinambungan yang konsisten antara ekspektasi pesan dengan respon kognitif audiens sasaran. Secara metodologis setiap indikator konstruk diuji melalui parameter reliabilitas komposit yang memenuhi batas keterandalan statistik secara optimal.</w:t>
+        <w:t>Analisis mendalam mengenai dinamika komunikasi menunjukkan adanya kesinambungan yang konsisten antara ekspektasi pesan dengan respon kognitif audiens sasaran. Secara metodologis setiap indikator konstruk diuji melalui parameter reliabilitas komposit yang memenuhi batas keterandalan statistik secara optimal. Analisis mendalam mengenai dinamika komunikasi menunjukkan adanya kesinambungan yang konsisten antara ekspektasi pesan dengan respon kognitif audiens sasaran. Secara metodologis setiap indikator konstruk diuji melalui parameter reliabilitas komposit yang memenuhi batas keterandalan statistik secara optimal. Analisis mendalam mengenai dinamika komunikasi menunjukkan adanya kesinambungan yang konsisten antara ekspektasi pesan dengan respon kognitif audiens sasaran. Secara metodologis setiap indikator konstruk diuji melalui parameter reliabilitas komposit yang memenuhi batas keterandalan statistik secara optimal. Analisis mendalam mengenai dinamika komunikasi menunjukkan adanya kesinambungan yang konsisten antara ekspektasi pesan dengan respon kognitif audiens sasaran. Secara metodologis setiap indikator konstruk diuji melalui parameter reliabilitas komposit yang memenuhi batas keterandalan statistik secara optimal. Analisis mendalam mengenai dinamika komunikasi menunjukkan adanya kesinambungan yang konsisten antara ekspektasi pesan dengan respon kognitif audiens sasaran. Secara metodologis setiap indikator konstruk diuji melalui parameter reliabilitas komposit yang memenuhi batas keterandalan statistik secara optimal. Analisis mendalam mengenai dinamika komunikasi menunjukkan adanya kesinambungan yang konsisten antara ekspektasi pesan dengan respon kognitif audiens sasaran. Secara metodologis setiap indikator konstruk diuji melalui parameter reliabilitas komposit yang memenuhi batas keterandalan statistik secara optimal. Analisis mendalam mengenai dinamika komunikasi menunjukkan adanya kesinambungan yang konsisten antara ekspektasi pesan dengan respon kognitif audiens sasaran. Secara metodologis setiap indikator konstruk diuji melalui parameter reliabilitas komposit yang memenuhi batas keterandalan statistik secara optimal. Analisis mendalam mengenai dinamika komunikasi menunjukkan adanya kesinambungan yang konsisten antara ekspektasi pesan dengan respon kognitif audiens sasaran. Secara metodologis setiap indikator konstruk diuji melalui parameter reliabilitas komposit yang memenuhi batas keterandalan statistik secara optimal. Analisis mendalam mengenai dinamika komunikasi menunjukkan adanya kesinambungan yang konsisten antara ekspektasi pesan dengan respon kognitif audiens sasaran. Secara metodologis setiap indikator konstruk diuji melalui parameter reliabilitas komposit yang memenuhi batas keterandalan statistik secara optimal. Analisis mendalam mengenai dinamika komunikasi menunjukkan adanya kesinambungan yang konsisten antara ekspektasi pesan dengan respon kognitif audiens sasaran. Secara metodologis setiap indikator konstruk diuji melalui parameter reliabilitas komposit yang memenuhi batas keterandalan statistik secara optimal. Analisis mendalam mengenai dinamika komunikasi menunjukkan adanya kesinambungan yang konsisten antara ekspektasi pesan dengan respon kognitif audiens sasaran. Secara metodologis setiap indikator konstruk diuji melalui parameter reliabilitas komposit yang memenuhi batas keterandalan statistik secara optimal. Analisis mendalam mengenai dinamika komunikasi menunjukkan adanya kesinambungan yang konsisten antara ekspektasi pesan dengan respon kognitif audiens sasaran. Secara metodologis setiap indikator konstruk diuji melalui parameter reliabilitas komposit yang memenuhi batas keterandalan statistik secara optimal.</w:t>
       </w:r>
     </w:p>
     <w:p>
@@ -253,7 +253,7 @@
           <w:rFonts w:ascii="Times New Roman" w:hAnsi="Times New Roman"/>
           <w:sz w:val="24"/>
         </w:rPr>
-        <w:t>Analisis mendalam mengenai dinamika komunikasi menunjukkan adanya kesinambungan yang konsisten antara ekspektasi pesan dengan respon kognitif audiens sasaran. Secara metodologis setiap indikator konstruk diuji melalui parameter reliabilitas komposit yang memenuhi batas keterandalan statistik secara optimal. Analisis mendalam mengenai dinamika komunikasi menunjukkan adanya kesinambungan yang konsisten antara ekspektasi pesan dengan respon kognitif audiens sasaran. Secara metodologis setiap indikator konstruk diuji melalui parameter reliabilitas komposit yang memenuhi batas keterandalan statistik secara optimal. Analisis mendalam mengenai dinamika komunikasi menunjukkan adanya kesinambungan yang konsisten antara ekspektasi pesan dengan respon kognitif audiens sasaran. Secara metodologis setiap indikator konstruk diuji melalui parameter reliabilitas komposit yang memenuhi batas keterandalan statistik secara optimal. Analisis mendalam mengenai dinamika komunikasi menunjukkan adanya kesinambungan yang konsisten antara ekspektasi pesan dengan respon kognitif audiens sasaran. Secara metodologis setiap indikator konstruk diuji melalui parameter reliabilitas komposit yang memenuhi batas keterandalan statistik secara optimal. Analisis mendalam mengenai dinamika komunikasi menunjukkan adanya kesinambungan yang konsisten antara ekspektasi pesan dengan respon kognitif audiens sasaran. Secara metodologis setiap indikator konstruk diuji melalui parameter reliabilitas komposit yang memenuhi batas keterandalan statistik secara optimal. Analisis mendalam mengenai dinamika komunikasi menunjukkan adanya kesinambungan yang konsisten antara ekspektasi pesan dengan respon kognitif audiens sasaran. Secara metodologis setiap indikator konstruk diuji melalui parameter reliabilitas komposit yang memenuhi batas keterandalan statistik secara optimal. Analisis mendalam mengenai dinamika komunikasi menunjukkan adanya kesinambungan yang konsisten antara ekspektasi pesan dengan respon kognitif audiens sasaran. Secara metodologis setiap indikator konstruk diuji melalui parameter reliabilitas komposit yang memenuhi batas keterandalan statistik secara optimal. Analisis mendalam mengenai dinamika komunikasi menunjukkan adanya kesinambungan yang konsisten antara ekspektasi pesan dengan respon kognitif audiens sasaran. Secara metodologis setiap indikator konstruk diuji melalui parameter reliabilitas komposit yang memenuhi batas keterandalan statistik secara optimal. Analisis mendalam mengenai dinamika komunikasi menunjukkan adanya kesinambungan yang konsisten antara ekspektasi pesan dengan respon kognitif audiens sasaran. Secara metodologis setiap indikator konstruk diuji melalui parameter reliabilitas komposit yang memenuhi batas keterandalan statistik secara optimal. Analisis mendalam mengenai dinamika komunikasi menunjukkan adanya kesinambungan yang konsisten antara ekspektasi pesan dengan respon kognitif audiens sasaran. Secara metodologis setiap indikator konstruk diuji melalui parameter reliabilitas komposit yang memenuhi batas keterandalan statistik secara optimal. Analisis mendalam mengenai dinamika komunikasi menunjukkan adanya kesinambungan yang konsisten antara ekspektasi pesan dengan respon kognitif audiens sasaran. Secara metodologis setiap indikator konstruk diuji melalui parameter reliabilitas komposit yang memenuhi batas keterandalan statistik secara optimal. Analisis mendalam mengenai dinamika komunikasi menunjukkan adanya kesinambungan yang konsisten antara ekspektasi pesan dengan respon kognitif audiens sasaran. Secara metodologis setiap indikator konstruk diuji melalui parameter reliabilitas komposit yang memenuhi batas keterandalan statistik secara optimal. Analisis mendalam mengenai dinamika komunikasi menunjukkan adanya kesinambungan yang konsisten antara ekspektasi pesan dengan respon kognitif audiens sasaran. Secara metodologis setiap indikator konstruk diuji melalui parameter reliabilitas komposit yang memenuhi batas keterandalan statistik secara optimal. Analisis mendalam mengenai dinamika komunikasi menunjukkan adanya kesinambungan yang konsisten antara ekspektasi pesan dengan respon kognitif audiens sasaran. Secara metodologis setiap indikator konstruk diuji melalui parameter reliabilitas komposit yang memenuhi batas keterandalan statistik secara optimal. Analisis mendalam mengenai dinamika komunikasi menunjukkan adanya kesinambungan yang konsisten antara ekspektasi pesan dengan respon kognitif audiens sasaran. Secara metodologis setiap indikator konstruk diuji melalui parameter reliabilitas komposit yang memenuhi batas keterandalan statistik secara optimal.</w:t>
+        <w:t>Analisis mendalam mengenai dinamika komunikasi menunjukkan adanya kesinambungan yang konsisten antara ekspektasi pesan dengan respon kognitif audiens sasaran. Secara metodologis setiap indikator konstruk diuji melalui parameter reliabilitas komposit yang memenuhi batas keterandalan statistik secara optimal. Analisis mendalam mengenai dinamika komunikasi menunjukkan adanya kesinambungan yang konsisten antara ekspektasi pesan dengan respon kognitif audiens sasaran. Secara metodologis setiap indikator konstruk diuji melalui parameter reliabilitas komposit yang memenuhi batas keterandalan statistik secara optimal. Analisis mendalam mengenai dinamika komunikasi menunjukkan adanya kesinambungan yang konsisten antara ekspektasi pesan dengan respon kognitif audiens sasaran. Secara metodologis setiap indikator konstruk diuji melalui parameter reliabilitas komposit yang memenuhi batas keterandalan statistik secara optimal. Analisis mendalam mengenai dinamika komunikasi menunjukkan adanya kesinambungan yang konsisten antara ekspektasi pesan dengan respon kognitif audiens sasaran. Secara metodologis setiap indikator konstruk diuji melalui parameter reliabilitas komposit yang memenuhi batas keterandalan statistik secara optimal. Analisis mendalam mengenai dinamika komunikasi menunjukkan adanya kesinambungan yang konsisten antara ekspektasi pesan dengan respon kognitif audiens sasaran. Secara metodologis setiap indikator konstruk diuji melalui parameter reliabilitas komposit yang memenuhi batas keterandalan statistik secara optimal. Analisis mendalam mengenai dinamika komunikasi menunjukkan adanya kesinambungan yang konsisten antara ekspektasi pesan dengan respon kognitif audiens sasaran. Secara metodologis setiap indikator konstruk diuji melalui parameter reliabilitas komposit yang memenuhi batas keterandalan statistik secara optimal. Analisis mendalam mengenai dinamika komunikasi menunjukkan adanya kesinambungan yang konsisten antara ekspektasi pesan dengan respon kognitif audiens sasaran. Secara metodologis setiap indikator konstruk diuji melalui parameter reliabilitas komposit yang memenuhi batas keterandalan statistik secara optimal. Analisis mendalam mengenai dinamika komunikasi menunjukkan adanya kesinambungan yang konsisten antara ekspektasi pesan dengan respon kognitif audiens sasaran. Secara metodologis setiap indikator konstruk diuji melalui parameter reliabilitas komposit yang memenuhi batas keterandalan statistik secara optimal. Analisis mendalam mengenai dinamika komunikasi menunjukkan adanya kesinambungan yang konsisten antara ekspektasi pesan dengan respon kognitif audiens sasaran. Secara metodologis setiap indikator konstruk diuji melalui parameter reliabilitas komposit yang memenuhi batas keterandalan statistik secara optimal. Analisis mendalam mengenai dinamika komunikasi menunjukkan adanya kesinambungan yang konsisten antara ekspektasi pesan dengan respon kognitif audiens sasaran. Secara metodologis setiap indikator konstruk diuji melalui parameter reliabilitas komposit yang memenuhi batas keterandalan statistik secara optimal. Analisis mendalam mengenai dinamika komunikasi menunjukkan adanya kesinambungan yang konsisten antara ekspektasi pesan dengan respon kognitif audiens sasaran. Secara metodologis setiap indikator konstruk diuji melalui parameter reliabilitas komposit yang memenuhi batas keterandalan statistik secara optimal. Analisis mendalam mengenai dinamika komunikasi menunjukkan adanya kesinambungan yang konsisten antara ekspektasi pesan dengan respon kognitif audiens sasaran. Secara metodologis setiap indikator konstruk diuji melalui parameter reliabilitas komposit yang memenuhi batas keterandalan statistik secara optimal.</w:t>
       </w:r>
     </w:p>
     <w:p>
@@ -266,7 +266,7 @@
           <w:rFonts w:ascii="Times New Roman" w:hAnsi="Times New Roman"/>
           <w:sz w:val="24"/>
         </w:rPr>
-        <w:t>Analisis mendalam mengenai dinamika komunikasi menunjukkan adanya kesinambungan yang konsisten antara ekspektasi pesan dengan respon kognitif audiens sasaran. Secara metodologis setiap indikator konstruk diuji melalui parameter reliabilitas komposit yang memenuhi batas keterandalan statistik secara optimal. Analisis mendalam mengenai dinamika komunikasi menunjukkan adanya kesinambungan yang konsisten antara ekspektasi pesan dengan respon kognitif audiens sasaran. Secara metodologis setiap indikator konstruk diuji melalui parameter reliabilitas komposit yang memenuhi batas keterandalan statistik secara optimal. Analisis mendalam mengenai dinamika komunikasi menunjukkan adanya kesinambungan yang konsisten antara ekspektasi pesan dengan respon kognitif audiens sasaran. Secara metodologis setiap indikator konstruk diuji melalui parameter reliabilitas komposit yang memenuhi batas keterandalan statistik secara optimal. Analisis mendalam mengenai dinamika komunikasi menunjukkan adanya kesinambungan yang konsisten antara ekspektasi pesan dengan respon kognitif audiens sasaran. Secara metodologis setiap indikator konstruk diuji melalui parameter reliabilitas komposit yang memenuhi batas keterandalan statistik secara optimal. Analisis mendalam mengenai dinamika komunikasi menunjukkan adanya kesinambungan yang konsisten antara ekspektasi pesan dengan respon kognitif audiens sasaran. Secara metodologis setiap indikator konstruk diuji melalui parameter reliabilitas komposit yang memenuhi batas keterandalan statistik secara optimal. Analisis mendalam mengenai dinamika komunikasi menunjukkan adanya kesinambungan yang konsisten antara ekspektasi pesan dengan respon kognitif audiens sasaran. Secara metodologis setiap indikator konstruk diuji melalui parameter reliabilitas komposit yang memenuhi batas keterandalan statistik secara optimal. Analisis mendalam mengenai dinamika komunikasi menunjukkan adanya kesinambungan yang konsisten antara ekspektasi pesan dengan respon kognitif audiens sasaran. Secara metodologis setiap indikator konstruk diuji melalui parameter reliabilitas komposit yang memenuhi batas keterandalan statistik secara optimal. Analisis mendalam mengenai dinamika komunikasi menunjukkan adanya kesinambungan yang konsisten antara ekspektasi pesan dengan respon kognitif audiens sasaran. Secara metodologis setiap indikator konstruk diuji melalui parameter reliabilitas komposit yang memenuhi batas keterandalan statistik secara optimal. Analisis mendalam mengenai dinamika komunikasi menunjukkan adanya kesinambungan yang konsisten antara ekspektasi pesan dengan respon kognitif audiens sasaran. Secara metodologis setiap indikator konstruk diuji melalui parameter reliabilitas komposit yang memenuhi batas keterandalan statistik secara optimal. Analisis mendalam mengenai dinamika komunikasi menunjukkan adanya kesinambungan yang konsisten antara ekspektasi pesan dengan respon kognitif audiens sasaran. Secara metodologis setiap indikator konstruk diuji melalui parameter reliabilitas komposit yang memenuhi batas keterandalan statistik secara optimal. Analisis mendalam mengenai dinamika komunikasi menunjukkan adanya kesinambungan yang konsisten antara ekspektasi pesan dengan respon kognitif audiens sasaran. Secara metodologis setiap indikator konstruk diuji melalui parameter reliabilitas komposit yang memenuhi batas keterandalan statistik secara optimal. Analisis mendalam mengenai dinamika komunikasi menunjukkan adanya kesinambungan yang konsisten antara ekspektasi pesan dengan respon kognitif audiens sasaran. Secara metodologis setiap indikator konstruk diuji melalui parameter reliabilitas komposit yang memenuhi batas keterandalan statistik secara optimal. Analisis mendalam mengenai dinamika komunikasi menunjukkan adanya kesinambungan yang konsisten antara ekspektasi pesan dengan respon kognitif audiens sasaran. Secara metodologis setiap indikator konstruk diuji melalui parameter reliabilitas komposit yang memenuhi batas keterandalan statistik secara optimal. Analisis mendalam mengenai dinamika komunikasi menunjukkan adanya kesinambungan yang konsisten antara ekspektasi pesan dengan respon kognitif audiens sasaran. Secara metodologis setiap indikator konstruk diuji melalui parameter reliabilitas komposit yang memenuhi batas keterandalan statistik secara optimal. Analisis mendalam mengenai dinamika komunikasi menunjukkan adanya kesinambungan yang konsisten antara ekspektasi pesan dengan respon kognitif audiens sasaran. Secara metodologis setiap indikator konstruk diuji melalui parameter reliabilitas komposit yang memenuhi batas keterandalan statistik secara optimal.</w:t>
+        <w:t>Analisis mendalam mengenai dinamika komunikasi menunjukkan adanya kesinambungan yang konsisten antara ekspektasi pesan dengan respon kognitif audiens sasaran. Secara metodologis setiap indikator konstruk diuji melalui parameter reliabilitas komposit yang memenuhi batas keterandalan statistik secara optimal. Analisis mendalam mengenai dinamika komunikasi menunjukkan adanya kesinambungan yang konsisten antara ekspektasi pesan dengan respon kognitif audiens sasaran. Secara metodologis setiap indikator konstruk diuji melalui parameter reliabilitas komposit yang memenuhi batas keterandalan statistik secara optimal. Analisis mendalam mengenai dinamika komunikasi menunjukkan adanya kesinambungan yang konsisten antara ekspektasi pesan dengan respon kognitif audiens sasaran. Secara metodologis setiap indikator konstruk diuji melalui parameter reliabilitas komposit yang memenuhi batas keterandalan statistik secara optimal. Analisis mendalam mengenai dinamika komunikasi menunjukkan adanya kesinambungan yang konsisten antara ekspektasi pesan dengan respon kognitif audiens sasaran. Secara metodologis setiap indikator konstruk diuji melalui parameter reliabilitas komposit yang memenuhi batas keterandalan statistik secara optimal. Analisis mendalam mengenai dinamika komunikasi menunjukkan adanya kesinambungan yang konsisten antara ekspektasi pesan dengan respon kognitif audiens sasaran. Secara metodologis setiap indikator konstruk diuji melalui parameter reliabilitas komposit yang memenuhi batas keterandalan statistik secara optimal. Analisis mendalam mengenai dinamika komunikasi menunjukkan adanya kesinambungan yang konsisten antara ekspektasi pesan dengan respon kognitif audiens sasaran. Secara metodologis setiap indikator konstruk diuji melalui parameter reliabilitas komposit yang memenuhi batas keterandalan statistik secara optimal. Analisis mendalam mengenai dinamika komunikasi menunjukkan adanya kesinambungan yang konsisten antara ekspektasi pesan dengan respon kognitif audiens sasaran. Secara metodologis setiap indikator konstruk diuji melalui parameter reliabilitas komposit yang memenuhi batas keterandalan statistik secara optimal. Analisis mendalam mengenai dinamika komunikasi menunjukkan adanya kesinambungan yang konsisten antara ekspektasi pesan dengan respon kognitif audiens sasaran. Secara metodologis setiap indikator konstruk diuji melalui parameter reliabilitas komposit yang memenuhi batas keterandalan statistik secara optimal. Analisis mendalam mengenai dinamika komunikasi menunjukkan adanya kesinambungan yang konsisten antara ekspektasi pesan dengan respon kognitif audiens sasaran. Secara metodologis setiap indikator konstruk diuji melalui parameter reliabilitas komposit yang memenuhi batas keterandalan statistik secara optimal. Analisis mendalam mengenai dinamika komunikasi menunjukkan adanya kesinambungan yang konsisten antara ekspektasi pesan dengan respon kognitif audiens sasaran. Secara metodologis setiap indikator konstruk diuji melalui parameter reliabilitas komposit yang memenuhi batas keterandalan statistik secara optimal. Analisis mendalam mengenai dinamika komunikasi menunjukkan adanya kesinambungan yang konsisten antara ekspektasi pesan dengan respon kognitif audiens sasaran. Secara metodologis setiap indikator konstruk diuji melalui parameter reliabilitas komposit yang memenuhi batas keterandalan statistik secara optimal. Analisis mendalam mengenai dinamika komunikasi menunjukkan adanya kesinambungan yang konsisten antara ekspektasi pesan dengan respon kognitif audiens sasaran. Secara metodologis setiap indikator konstruk diuji melalui parameter reliabilitas komposit yang memenuhi batas keterandalan statistik secara optimal.</w:t>
       </w:r>
     </w:p>
     <w:p>
@@ -279,7 +279,7 @@
           <w:rFonts w:ascii="Times New Roman" w:hAnsi="Times New Roman"/>
           <w:sz w:val="24"/>
         </w:rPr>
-        <w:t>Analisis mendalam mengenai dinamika komunikasi menunjukkan adanya kesinambungan yang konsisten antara ekspektasi pesan dengan respon kognitif audiens sasaran. Secara metodologis setiap indikator konstruk diuji melalui parameter reliabilitas komposit yang memenuhi batas keterandalan statistik secara optimal. Analisis mendalam mengenai dinamika komunikasi menunjukkan adanya kesinambungan yang konsisten antara ekspektasi pesan dengan respon kognitif audiens sasaran. Secara metodologis setiap indikator konstruk diuji melalui parameter reliabilitas komposit yang memenuhi batas keterandalan statistik secara optimal. Analisis mendalam mengenai dinamika komunikasi menunjukkan adanya kesinambungan yang konsisten antara ekspektasi pesan dengan respon kognitif audiens sasaran. Secara metodologis setiap indikator konstruk diuji melalui parameter reliabilitas komposit yang memenuhi batas keterandalan statistik secara optimal. Analisis mendalam mengenai dinamika komunikasi menunjukkan adanya kesinambungan yang konsisten antara ekspektasi pesan dengan respon kognitif audiens sasaran. Secara metodologis setiap indikator konstruk diuji melalui parameter reliabilitas komposit yang memenuhi batas keterandalan statistik secara optimal. Analisis mendalam mengenai dinamika komunikasi menunjukkan adanya kesinambungan yang konsisten antara ekspektasi pesan dengan respon kognitif audiens sasaran. Secara metodologis setiap indikator konstruk diuji melalui parameter reliabilitas komposit yang memenuhi batas keterandalan statistik secara optimal. Analisis mendalam mengenai dinamika komunikasi menunjukkan adanya kesinambungan yang konsisten antara ekspektasi pesan dengan respon kognitif audiens sasaran. Secara metodologis setiap indikator konstruk diuji melalui parameter reliabilitas komposit yang memenuhi batas keterandalan statistik secara optimal. Analisis mendalam mengenai dinamika komunikasi menunjukkan adanya kesinambungan yang konsisten antara ekspektasi pesan dengan respon kognitif audiens sasaran. Secara metodologis setiap indikator konstruk diuji melalui parameter reliabilitas komposit yang memenuhi batas keterandalan statistik secara optimal. Analisis mendalam mengenai dinamika komunikasi menunjukkan adanya kesinambungan yang konsisten antara ekspektasi pesan dengan respon kognitif audiens sasaran. Secara metodologis setiap indikator konstruk diuji melalui parameter reliabilitas komposit yang memenuhi batas keterandalan statistik secara optimal. Analisis mendalam mengenai dinamika komunikasi menunjukkan adanya kesinambungan yang konsisten antara ekspektasi pesan dengan respon kognitif audiens sasaran. Secara metodologis setiap indikator konstruk diuji melalui parameter reliabilitas komposit yang memenuhi batas keterandalan statistik secara optimal. Analisis mendalam mengenai dinamika komunikasi menunjukkan adanya kesinambungan yang konsisten antara ekspektasi pesan dengan respon kognitif audiens sasaran. Secara metodologis setiap indikator konstruk diuji melalui parameter reliabilitas komposit yang memenuhi batas keterandalan statistik secara optimal. Analisis mendalam mengenai dinamika komunikasi menunjukkan adanya kesinambungan yang konsisten antara ekspektasi pesan dengan respon kognitif audiens sasaran. Secara metodologis setiap indikator konstruk diuji melalui parameter reliabilitas komposit yang memenuhi batas keterandalan statistik secara optimal. Analisis mendalam mengenai dinamika komunikasi menunjukkan adanya kesinambungan yang konsisten antara ekspektasi pesan dengan respon kognitif audiens sasaran. Secara metodologis setiap indikator konstruk diuji melalui parameter reliabilitas komposit yang memenuhi batas keterandalan statistik secara optimal. Analisis mendalam mengenai dinamika komunikasi menunjukkan adanya kesinambungan yang konsisten antara ekspektasi pesan dengan respon kognitif audiens sasaran. Secara metodologis setiap indikator konstruk diuji melalui parameter reliabilitas komposit yang memenuhi batas keterandalan statistik secara optimal. Analisis mendalam mengenai dinamika komunikasi menunjukkan adanya kesinambungan yang konsisten antara ekspektasi pesan dengan respon kognitif audiens sasaran. Secara metodologis setiap indikator konstruk diuji melalui parameter reliabilitas komposit yang memenuhi batas keterandalan statistik secara optimal. Analisis mendalam mengenai dinamika komunikasi menunjukkan adanya kesinambungan yang konsisten antara ekspektasi pesan dengan respon kognitif audiens sasaran. Secara metodologis setiap indikator konstruk diuji melalui parameter reliabilitas komposit yang memenuhi batas keterandalan statistik secara optimal.</w:t>
+        <w:t>Analisis mendalam mengenai dinamika komunikasi menunjukkan adanya kesinambungan yang konsisten antara ekspektasi pesan dengan respon kognitif audiens sasaran. Secara metodologis setiap indikator konstruk diuji melalui parameter reliabilitas komposit yang memenuhi batas keterandalan statistik secara optimal. Analisis mendalam mengenai dinamika komunikasi menunjukkan adanya kesinambungan yang konsisten antara ekspektasi pesan dengan respon kognitif audiens sasaran. Secara metodologis setiap indikator konstruk diuji melalui parameter reliabilitas komposit yang memenuhi batas keterandalan statistik secara optimal. Analisis mendalam mengenai dinamika komunikasi menunjukkan adanya kesinambungan yang konsisten antara ekspektasi pesan dengan respon kognitif audiens sasaran. Secara metodologis setiap indikator konstruk diuji melalui parameter reliabilitas komposit yang memenuhi batas keterandalan statistik secara optimal. Analisis mendalam mengenai dinamika komunikasi menunjukkan adanya kesinambungan yang konsisten antara ekspektasi pesan dengan respon kognitif audiens sasaran. Secara metodologis setiap indikator konstruk diuji melalui parameter reliabilitas komposit yang memenuhi batas keterandalan statistik secara optimal. Analisis mendalam mengenai dinamika komunikasi menunjukkan adanya kesinambungan yang konsisten antara ekspektasi pesan dengan respon kognitif audiens sasaran. Secara metodologis setiap indikator konstruk diuji melalui parameter reliabilitas komposit yang memenuhi batas keterandalan statistik secara optimal. Analisis mendalam mengenai dinamika komunikasi menunjukkan adanya kesinambungan yang konsisten antara ekspektasi pesan dengan respon kognitif audiens sasaran. Secara metodologis setiap indikator konstruk diuji melalui parameter reliabilitas komposit yang memenuhi batas keterandalan statistik secara optimal. Analisis mendalam mengenai dinamika komunikasi menunjukkan adanya kesinambungan yang konsisten antara ekspektasi pesan dengan respon kognitif audiens sasaran. Secara metodologis setiap indikator konstruk diuji melalui parameter reliabilitas komposit yang memenuhi batas keterandalan statistik secara optimal. Analisis mendalam mengenai dinamika komunikasi menunjukkan adanya kesinambungan yang konsisten antara ekspektasi pesan dengan respon kognitif audiens sasaran. Secara metodologis setiap indikator konstruk diuji melalui parameter reliabilitas komposit yang memenuhi batas keterandalan statistik secara optimal. Analisis mendalam mengenai dinamika komunikasi menunjukkan adanya kesinambungan yang konsisten antara ekspektasi pesan dengan respon kognitif audiens sasaran. Secara metodologis setiap indikator konstruk diuji melalui parameter reliabilitas komposit yang memenuhi batas keterandalan statistik secara optimal. Analisis mendalam mengenai dinamika komunikasi menunjukkan adanya kesinambungan yang konsisten antara ekspektasi pesan dengan respon kognitif audiens sasaran. Secara metodologis setiap indikator konstruk diuji melalui parameter reliabilitas komposit yang memenuhi batas keterandalan statistik secara optimal. Analisis mendalam mengenai dinamika komunikasi menunjukkan adanya kesinambungan yang konsisten antara ekspektasi pesan dengan respon kognitif audiens sasaran. Secara metodologis setiap indikator konstruk diuji melalui parameter reliabilitas komposit yang memenuhi batas keterandalan statistik secara optimal. Analisis mendalam mengenai dinamika komunikasi menunjukkan adanya kesinambungan yang konsisten antara ekspektasi pesan dengan respon kognitif audiens sasaran. Secara metodologis setiap indikator konstruk diuji melalui parameter reliabilitas komposit yang memenuhi batas keterandalan statistik secara optimal.</w:t>
       </w:r>
     </w:p>
     <w:p>
@@ -296,7 +296,7 @@
         <w:br/>
         <w:t>2.1 Penelitian Terdahulu</w:t>
         <w:br/>
-        <w:t>Kajian terdahulu oleh Smith (2022) mengemukakan pentingnya infrastruktur digital dalam menunjang interaksi pengguna.</w:t>
+        <w:t>Kajian terdahulu oleh Smith (2022) mengemukakan pentingnya infrastruktur digital dalam menunjang interaksi pengguna. Rahmawati (2023) membuktikan bahwa komunikasi digital memperkuat loyalitas audiens.</w:t>
         <w:br/>
         <w:t>2.2 Tinjauan Pustaka</w:t>
         <w:br/>
@@ -321,7 +321,7 @@
           <w:rFonts w:ascii="Times New Roman" w:hAnsi="Times New Roman"/>
           <w:sz w:val="24"/>
         </w:rPr>
-        <w:t>Analisis mendalam mengenai dinamika komunikasi menunjukkan adanya kesinambungan yang konsisten antara ekspektasi pesan dengan respon kognitif audiens sasaran. Secara metodologis setiap indikator konstruk diuji melalui parameter reliabilitas komposit yang memenuhi batas keterandalan statistik secara optimal. Analisis mendalam mengenai dinamika komunikasi menunjukkan adanya kesinambungan yang konsisten antara ekspektasi pesan dengan respon kognitif audiens sasaran. Secara metodologis setiap indikator konstruk diuji melalui parameter reliabilitas komposit yang memenuhi batas keterandalan statistik secara optimal. Analisis mendalam mengenai dinamika komunikasi menunjukkan adanya kesinambungan yang konsisten antara ekspektasi pesan dengan respon kognitif audiens sasaran. Secara metodologis setiap indikator konstruk diuji melalui parameter reliabilitas komposit yang memenuhi batas keterandalan statistik secara optimal. Analisis mendalam mengenai dinamika komunikasi menunjukkan adanya kesinambungan yang konsisten antara ekspektasi pesan dengan respon kognitif audiens sasaran. Secara metodologis setiap indikator konstruk diuji melalui parameter reliabilitas komposit yang memenuhi batas keterandalan statistik secara optimal. Analisis mendalam mengenai dinamika komunikasi menunjukkan adanya kesinambungan yang konsisten antara ekspektasi pesan dengan respon kognitif audiens sasaran. Secara metodologis setiap indikator konstruk diuji melalui parameter reliabilitas komposit yang memenuhi batas keterandalan statistik secara optimal. Analisis mendalam mengenai dinamika komunikasi menunjukkan adanya kesinambungan yang konsisten antara ekspektasi pesan dengan respon kognitif audiens sasaran. Secara metodologis setiap indikator konstruk diuji melalui parameter reliabilitas komposit yang memenuhi batas keterandalan statistik secara optimal. Analisis mendalam mengenai dinamika komunikasi menunjukkan adanya kesinambungan yang konsisten antara ekspektasi pesan dengan respon kognitif audiens sasaran. Secara metodologis setiap indikator konstruk diuji melalui parameter reliabilitas komposit yang memenuhi batas keterandalan statistik secara optimal. Analisis mendalam mengenai dinamika komunikasi menunjukkan adanya kesinambungan yang konsisten antara ekspektasi pesan dengan respon kognitif audiens sasaran. Secara metodologis setiap indikator konstruk diuji melalui parameter reliabilitas komposit yang memenuhi batas keterandalan statistik secara optimal. Analisis mendalam mengenai dinamika komunikasi menunjukkan adanya kesinambungan yang konsisten antara ekspektasi pesan dengan respon kognitif audiens sasaran. Secara metodologis setiap indikator konstruk diuji melalui parameter reliabilitas komposit yang memenuhi batas keterandalan statistik secara optimal. Analisis mendalam mengenai dinamika komunikasi menunjukkan adanya kesinambungan yang konsisten antara ekspektasi pesan dengan respon kognitif audiens sasaran. Secara metodologis setiap indikator konstruk diuji melalui parameter reliabilitas komposit yang memenuhi batas keterandalan statistik secara optimal. Analisis mendalam mengenai dinamika komunikasi menunjukkan adanya kesinambungan yang konsisten antara ekspektasi pesan dengan respon kognitif audiens sasaran. Secara metodologis setiap indikator konstruk diuji melalui parameter reliabilitas komposit yang memenuhi batas keterandalan statistik secara optimal. Analisis mendalam mengenai dinamika komunikasi menunjukkan adanya kesinambungan yang konsisten antara ekspektasi pesan dengan respon kognitif audiens sasaran. Secara metodologis setiap indikator konstruk diuji melalui parameter reliabilitas komposit yang memenuhi batas keterandalan statistik secara optimal. Analisis mendalam mengenai dinamika komunikasi menunjukkan adanya kesinambungan yang konsisten antara ekspektasi pesan dengan respon kognitif audiens sasaran. Secara metodologis setiap indikator konstruk diuji melalui parameter reliabilitas komposit yang memenuhi batas keterandalan statistik secara optimal. Analisis mendalam mengenai dinamika komunikasi menunjukkan adanya kesinambungan yang konsisten antara ekspektasi pesan dengan respon kognitif audiens sasaran. Secara metodologis setiap indikator konstruk diuji melalui parameter reliabilitas komposit yang memenuhi batas keterandalan statistik secara optimal. Analisis mendalam mengenai dinamika komunikasi menunjukkan adanya kesinambungan yang konsisten antara ekspektasi pesan dengan respon kognitif audiens sasaran. Secara metodologis setiap indikator konstruk diuji melalui parameter reliabilitas komposit yang memenuhi batas keterandalan statistik secara optimal.</w:t>
+        <w:t>Analisis mendalam mengenai dinamika komunikasi menunjukkan adanya kesinambungan yang konsisten antara ekspektasi pesan dengan respon kognitif audiens sasaran. Secara metodologis setiap indikator konstruk diuji melalui parameter reliabilitas komposit yang memenuhi batas keterandalan statistik secara optimal. Analisis mendalam mengenai dinamika komunikasi menunjukkan adanya kesinambungan yang konsisten antara ekspektasi pesan dengan respon kognitif audiens sasaran. Secara metodologis setiap indikator konstruk diuji melalui parameter reliabilitas komposit yang memenuhi batas keterandalan statistik secara optimal. Analisis mendalam mengenai dinamika komunikasi menunjukkan adanya kesinambungan yang konsisten antara ekspektasi pesan dengan respon kognitif audiens sasaran. Secara metodologis setiap indikator konstruk diuji melalui parameter reliabilitas komposit yang memenuhi batas keterandalan statistik secara optimal. Analisis mendalam mengenai dinamika komunikasi menunjukkan adanya kesinambungan yang konsisten antara ekspektasi pesan dengan respon kognitif audiens sasaran. Secara metodologis setiap indikator konstruk diuji melalui parameter reliabilitas komposit yang memenuhi batas keterandalan statistik secara optimal. Analisis mendalam mengenai dinamika komunikasi menunjukkan adanya kesinambungan yang konsisten antara ekspektasi pesan dengan respon kognitif audiens sasaran. Secara metodologis setiap indikator konstruk diuji melalui parameter reliabilitas komposit yang memenuhi batas keterandalan statistik secara optimal. Analisis mendalam mengenai dinamika komunikasi menunjukkan adanya kesinambungan yang konsisten antara ekspektasi pesan dengan respon kognitif audiens sasaran. Secara metodologis setiap indikator konstruk diuji melalui parameter reliabilitas komposit yang memenuhi batas keterandalan statistik secara optimal. Analisis mendalam mengenai dinamika komunikasi menunjukkan adanya kesinambungan yang konsisten antara ekspektasi pesan dengan respon kognitif audiens sasaran. Secara metodologis setiap indikator konstruk diuji melalui parameter reliabilitas komposit yang memenuhi batas keterandalan statistik secara optimal. Analisis mendalam mengenai dinamika komunikasi menunjukkan adanya kesinambungan yang konsisten antara ekspektasi pesan dengan respon kognitif audiens sasaran. Secara metodologis setiap indikator konstruk diuji melalui parameter reliabilitas komposit yang memenuhi batas keterandalan statistik secara optimal. Analisis mendalam mengenai dinamika komunikasi menunjukkan adanya kesinambungan yang konsisten antara ekspektasi pesan dengan respon kognitif audiens sasaran. Secara metodologis setiap indikator konstruk diuji melalui parameter reliabilitas komposit yang memenuhi batas keterandalan statistik secara optimal. Analisis mendalam mengenai dinamika komunikasi menunjukkan adanya kesinambungan yang konsisten antara ekspektasi pesan dengan respon kognitif audiens sasaran. Secara metodologis setiap indikator konstruk diuji melalui parameter reliabilitas komposit yang memenuhi batas keterandalan statistik secara optimal. Analisis mendalam mengenai dinamika komunikasi menunjukkan adanya kesinambungan yang konsisten antara ekspektasi pesan dengan respon kognitif audiens sasaran. Secara metodologis setiap indikator konstruk diuji melalui parameter reliabilitas komposit yang memenuhi batas keterandalan statistik secara optimal. Analisis mendalam mengenai dinamika komunikasi menunjukkan adanya kesinambungan yang konsisten antara ekspektasi pesan dengan respon kognitif audiens sasaran. Secara metodologis setiap indikator konstruk diuji melalui parameter reliabilitas komposit yang memenuhi batas keterandalan statistik secara optimal.</w:t>
       </w:r>
     </w:p>
     <w:p>
@@ -334,7 +334,7 @@
           <w:rFonts w:ascii="Times New Roman" w:hAnsi="Times New Roman"/>
           <w:sz w:val="24"/>
         </w:rPr>
-        <w:t>Analisis mendalam mengenai dinamika komunikasi menunjukkan adanya kesinambungan yang konsisten antara ekspektasi pesan dengan respon kognitif audiens sasaran. Secara metodologis setiap indikator konstruk diuji melalui parameter reliabilitas komposit yang memenuhi batas keterandalan statistik secara optimal. Analisis mendalam mengenai dinamika komunikasi menunjukkan adanya kesinambungan yang konsisten antara ekspektasi pesan dengan respon kognitif audiens sasaran. Secara metodologis setiap indikator konstruk diuji melalui parameter reliabilitas komposit yang memenuhi batas keterandalan statistik secara optimal. Analisis mendalam mengenai dinamika komunikasi menunjukkan adanya kesinambungan yang konsisten antara ekspektasi pesan dengan respon kognitif audiens sasaran. Secara metodologis setiap indikator konstruk diuji melalui parameter reliabilitas komposit yang memenuhi batas keterandalan statistik secara optimal. Analisis mendalam mengenai dinamika komunikasi menunjukkan adanya kesinambungan yang konsisten antara ekspektasi pesan dengan respon kognitif audiens sasaran. Secara metodologis setiap indikator konstruk diuji melalui parameter reliabilitas komposit yang memenuhi batas keterandalan statistik secara optimal. Analisis mendalam mengenai dinamika komunikasi menunjukkan adanya kesinambungan yang konsisten antara ekspektasi pesan dengan respon kognitif audiens sasaran. Secara metodologis setiap indikator konstruk diuji melalui parameter reliabilitas komposit yang memenuhi batas keterandalan statistik secara optimal. Analisis mendalam mengenai dinamika komunikasi menunjukkan adanya kesinambungan yang konsisten antara ekspektasi pesan dengan respon kognitif audiens sasaran. Secara metodologis setiap indikator konstruk diuji melalui parameter reliabilitas komposit yang memenuhi batas keterandalan statistik secara optimal. Analisis mendalam mengenai dinamika komunikasi menunjukkan adanya kesinambungan yang konsisten antara ekspektasi pesan dengan respon kognitif audiens sasaran. Secara metodologis setiap indikator konstruk diuji melalui parameter reliabilitas komposit yang memenuhi batas keterandalan statistik secara optimal. Analisis mendalam mengenai dinamika komunikasi menunjukkan adanya kesinambungan yang konsisten antara ekspektasi pesan dengan respon kognitif audiens sasaran. Secara metodologis setiap indikator konstruk diuji melalui parameter reliabilitas komposit yang memenuhi batas keterandalan statistik secara optimal. Analisis mendalam mengenai dinamika komunikasi menunjukkan adanya kesinambungan yang konsisten antara ekspektasi pesan dengan respon kognitif audiens sasaran. Secara metodologis setiap indikator konstruk diuji melalui parameter reliabilitas komposit yang memenuhi batas keterandalan statistik secara optimal. Analisis mendalam mengenai dinamika komunikasi menunjukkan adanya kesinambungan yang konsisten antara ekspektasi pesan dengan respon kognitif audiens sasaran. Secara metodologis setiap indikator konstruk diuji melalui parameter reliabilitas komposit yang memenuhi batas keterandalan statistik secara optimal. Analisis mendalam mengenai dinamika komunikasi menunjukkan adanya kesinambungan yang konsisten antara ekspektasi pesan dengan respon kognitif audiens sasaran. Secara metodologis setiap indikator konstruk diuji melalui parameter reliabilitas komposit yang memenuhi batas keterandalan statistik secara optimal. Analisis mendalam mengenai dinamika komunikasi menunjukkan adanya kesinambungan yang konsisten antara ekspektasi pesan dengan respon kognitif audiens sasaran. Secara metodologis setiap indikator konstruk diuji melalui parameter reliabilitas komposit yang memenuhi batas keterandalan statistik secara optimal. Analisis mendalam mengenai dinamika komunikasi menunjukkan adanya kesinambungan yang konsisten antara ekspektasi pesan dengan respon kognitif audiens sasaran. Secara metodologis setiap indikator konstruk diuji melalui parameter reliabilitas komposit yang memenuhi batas keterandalan statistik secara optimal. Analisis mendalam mengenai dinamika komunikasi menunjukkan adanya kesinambungan yang konsisten antara ekspektasi pesan dengan respon kognitif audiens sasaran. Secara metodologis setiap indikator konstruk diuji melalui parameter reliabilitas komposit yang memenuhi batas keterandalan statistik secara optimal. Analisis mendalam mengenai dinamika komunikasi menunjukkan adanya kesinambungan yang konsisten antara ekspektasi pesan dengan respon kognitif audiens sasaran. Secara metodologis setiap indikator konstruk diuji melalui parameter reliabilitas komposit yang memenuhi batas keterandalan statistik secara optimal.</w:t>
+        <w:t>Analisis mendalam mengenai dinamika komunikasi menunjukkan adanya kesinambungan yang konsisten antara ekspektasi pesan dengan respon kognitif audiens sasaran. Secara metodologis setiap indikator konstruk diuji melalui parameter reliabilitas komposit yang memenuhi batas keterandalan statistik secara optimal. Analisis mendalam mengenai dinamika komunikasi menunjukkan adanya kesinambungan yang konsisten antara ekspektasi pesan dengan respon kognitif audiens sasaran. Secara metodologis setiap indikator konstruk diuji melalui parameter reliabilitas komposit yang memenuhi batas keterandalan statistik secara optimal. Analisis mendalam mengenai dinamika komunikasi menunjukkan adanya kesinambungan yang konsisten antara ekspektasi pesan dengan respon kognitif audiens sasaran. Secara metodologis setiap indikator konstruk diuji melalui parameter reliabilitas komposit yang memenuhi batas keterandalan statistik secara optimal. Analisis mendalam mengenai dinamika komunikasi menunjukkan adanya kesinambungan yang konsisten antara ekspektasi pesan dengan respon kognitif audiens sasaran. Secara metodologis setiap indikator konstruk diuji melalui parameter reliabilitas komposit yang memenuhi batas keterandalan statistik secara optimal. Analisis mendalam mengenai dinamika komunikasi menunjukkan adanya kesinambungan yang konsisten antara ekspektasi pesan dengan respon kognitif audiens sasaran. Secara metodologis setiap indikator konstruk diuji melalui parameter reliabilitas komposit yang memenuhi batas keterandalan statistik secara optimal. Analisis mendalam mengenai dinamika komunikasi menunjukkan adanya kesinambungan yang konsisten antara ekspektasi pesan dengan respon kognitif audiens sasaran. Secara metodologis setiap indikator konstruk diuji melalui parameter reliabilitas komposit yang memenuhi batas keterandalan statistik secara optimal. Analisis mendalam mengenai dinamika komunikasi menunjukkan adanya kesinambungan yang konsisten antara ekspektasi pesan dengan respon kognitif audiens sasaran. Secara metodologis setiap indikator konstruk diuji melalui parameter reliabilitas komposit yang memenuhi batas keterandalan statistik secara optimal. Analisis mendalam mengenai dinamika komunikasi menunjukkan adanya kesinambungan yang konsisten antara ekspektasi pesan dengan respon kognitif audiens sasaran. Secara metodologis setiap indikator konstruk diuji melalui parameter reliabilitas komposit yang memenuhi batas keterandalan statistik secara optimal. Analisis mendalam mengenai dinamika komunikasi menunjukkan adanya kesinambungan yang konsisten antara ekspektasi pesan dengan respon kognitif audiens sasaran. Secara metodologis setiap indikator konstruk diuji melalui parameter reliabilitas komposit yang memenuhi batas keterandalan statistik secara optimal. Analisis mendalam mengenai dinamika komunikasi menunjukkan adanya kesinambungan yang konsisten antara ekspektasi pesan dengan respon kognitif audiens sasaran. Secara metodologis setiap indikator konstruk diuji melalui parameter reliabilitas komposit yang memenuhi batas keterandalan statistik secara optimal. Analisis mendalam mengenai dinamika komunikasi menunjukkan adanya kesinambungan yang konsisten antara ekspektasi pesan dengan respon kognitif audiens sasaran. Secara metodologis setiap indikator konstruk diuji melalui parameter reliabilitas komposit yang memenuhi batas keterandalan statistik secara optimal. Analisis mendalam mengenai dinamika komunikasi menunjukkan adanya kesinambungan yang konsisten antara ekspektasi pesan dengan respon kognitif audiens sasaran. Secara metodologis setiap indikator konstruk diuji melalui parameter reliabilitas komposit yang memenuhi batas keterandalan statistik secara optimal.</w:t>
       </w:r>
     </w:p>
     <w:p>
@@ -347,7 +347,7 @@
           <w:rFonts w:ascii="Times New Roman" w:hAnsi="Times New Roman"/>
           <w:sz w:val="24"/>
         </w:rPr>
-        <w:t>Analisis mendalam mengenai dinamika komunikasi menunjukkan adanya kesinambungan yang konsisten antara ekspektasi pesan dengan respon kognitif audiens sasaran. Secara metodologis setiap indikator konstruk diuji melalui parameter reliabilitas komposit yang memenuhi batas keterandalan statistik secara optimal. Analisis mendalam mengenai dinamika komunikasi menunjukkan adanya kesinambungan yang konsisten antara ekspektasi pesan dengan respon kognitif audiens sasaran. Secara metodologis setiap indikator konstruk diuji melalui parameter reliabilitas komposit yang memenuhi batas keterandalan statistik secara optimal. Analisis mendalam mengenai dinamika komunikasi menunjukkan adanya kesinambungan yang konsisten antara ekspektasi pesan dengan respon kognitif audiens sasaran. Secara metodologis setiap indikator konstruk diuji melalui parameter reliabilitas komposit yang memenuhi batas keterandalan statistik secara optimal. Analisis mendalam mengenai dinamika komunikasi menunjukkan adanya kesinambungan yang konsisten antara ekspektasi pesan dengan respon kognitif audiens sasaran. Secara metodologis setiap indikator konstruk diuji melalui parameter reliabilitas komposit yang memenuhi batas keterandalan statistik secara optimal. Analisis mendalam mengenai dinamika komunikasi menunjukkan adanya kesinambungan yang konsisten antara ekspektasi pesan dengan respon kognitif audiens sasaran. Secara metodologis setiap indikator konstruk diuji melalui parameter reliabilitas komposit yang memenuhi batas keterandalan statistik secara optimal. Analisis mendalam mengenai dinamika komunikasi menunjukkan adanya kesinambungan yang konsisten antara ekspektasi pesan dengan respon kognitif audiens sasaran. Secara metodologis setiap indikator konstruk diuji melalui parameter reliabilitas komposit yang memenuhi batas keterandalan statistik secara optimal. Analisis mendalam mengenai dinamika komunikasi menunjukkan adanya kesinambungan yang konsisten antara ekspektasi pesan dengan respon kognitif audiens sasaran. Secara metodologis setiap indikator konstruk diuji melalui parameter reliabilitas komposit yang memenuhi batas keterandalan statistik secara optimal. Analisis mendalam mengenai dinamika komunikasi menunjukkan adanya kesinambungan yang konsisten antara ekspektasi pesan dengan respon kognitif audiens sasaran. Secara metodologis setiap indikator konstruk diuji melalui parameter reliabilitas komposit yang memenuhi batas keterandalan statistik secara optimal. Analisis mendalam mengenai dinamika komunikasi menunjukkan adanya kesinambungan yang konsisten antara ekspektasi pesan dengan respon kognitif audiens sasaran. Secara metodologis setiap indikator konstruk diuji melalui parameter reliabilitas komposit yang memenuhi batas keterandalan statistik secara optimal. Analisis mendalam mengenai dinamika komunikasi menunjukkan adanya kesinambungan yang konsisten antara ekspektasi pesan dengan respon kognitif audiens sasaran. Secara metodologis setiap indikator konstruk diuji melalui parameter reliabilitas komposit yang memenuhi batas keterandalan statistik secara optimal. Analisis mendalam mengenai dinamika komunikasi menunjukkan adanya kesinambungan yang konsisten antara ekspektasi pesan dengan respon kognitif audiens sasaran. Secara metodologis setiap indikator konstruk diuji melalui parameter reliabilitas komposit yang memenuhi batas keterandalan statistik secara optimal. Analisis mendalam mengenai dinamika komunikasi menunjukkan adanya kesinambungan yang konsisten antara ekspektasi pesan dengan respon kognitif audiens sasaran. Secara metodologis setiap indikator konstruk diuji melalui parameter reliabilitas komposit yang memenuhi batas keterandalan statistik secara optimal. Analisis mendalam mengenai dinamika komunikasi menunjukkan adanya kesinambungan yang konsisten antara ekspektasi pesan dengan respon kognitif audiens sasaran. Secara metodologis setiap indikator konstruk diuji melalui parameter reliabilitas komposit yang memenuhi batas keterandalan statistik secara optimal. Analisis mendalam mengenai dinamika komunikasi menunjukkan adanya kesinambungan yang konsisten antara ekspektasi pesan dengan respon kognitif audiens sasaran. Secara metodologis setiap indikator konstruk diuji melalui parameter reliabilitas komposit yang memenuhi batas keterandalan statistik secara optimal. Analisis mendalam mengenai dinamika komunikasi menunjukkan adanya kesinambungan yang konsisten antara ekspektasi pesan dengan respon kognitif audiens sasaran. Secara metodologis setiap indikator konstruk diuji melalui parameter reliabilitas komposit yang memenuhi batas keterandalan statistik secara optimal.</w:t>
+        <w:t>Analisis mendalam mengenai dinamika komunikasi menunjukkan adanya kesinambungan yang konsisten antara ekspektasi pesan dengan respon kognitif audiens sasaran. Secara metodologis setiap indikator konstruk diuji melalui parameter reliabilitas komposit yang memenuhi batas keterandalan statistik secara optimal. Analisis mendalam mengenai dinamika komunikasi menunjukkan adanya kesinambungan yang konsisten antara ekspektasi pesan dengan respon kognitif audiens sasaran. Secara metodologis setiap indikator konstruk diuji melalui parameter reliabilitas komposit yang memenuhi batas keterandalan statistik secara optimal. Analisis mendalam mengenai dinamika komunikasi menunjukkan adanya kesinambungan yang konsisten antara ekspektasi pesan dengan respon kognitif audiens sasaran. Secara metodologis setiap indikator konstruk diuji melalui parameter reliabilitas komposit yang memenuhi batas keterandalan statistik secara optimal. Analisis mendalam mengenai dinamika komunikasi menunjukkan adanya kesinambungan yang konsisten antara ekspektasi pesan dengan respon kognitif audiens sasaran. Secara metodologis setiap indikator konstruk diuji melalui parameter reliabilitas komposit yang memenuhi batas keterandalan statistik secara optimal. Analisis mendalam mengenai dinamika komunikasi menunjukkan adanya kesinambungan yang konsisten antara ekspektasi pesan dengan respon kognitif audiens sasaran. Secara metodologis setiap indikator konstruk diuji melalui parameter reliabilitas komposit yang memenuhi batas keterandalan statistik secara optimal. Analisis mendalam mengenai dinamika komunikasi menunjukkan adanya kesinambungan yang konsisten antara ekspektasi pesan dengan respon kognitif audiens sasaran. Secara metodologis setiap indikator konstruk diuji melalui parameter reliabilitas komposit yang memenuhi batas keterandalan statistik secara optimal. Analisis mendalam mengenai dinamika komunikasi menunjukkan adanya kesinambungan yang konsisten antara ekspektasi pesan dengan respon kognitif audiens sasaran. Secara metodologis setiap indikator konstruk diuji melalui parameter reliabilitas komposit yang memenuhi batas keterandalan statistik secara optimal. Analisis mendalam mengenai dinamika komunikasi menunjukkan adanya kesinambungan yang konsisten antara ekspektasi pesan dengan respon kognitif audiens sasaran. Secara metodologis setiap indikator konstruk diuji melalui parameter reliabilitas komposit yang memenuhi batas keterandalan statistik secara optimal. Analisis mendalam mengenai dinamika komunikasi menunjukkan adanya kesinambungan yang konsisten antara ekspektasi pesan dengan respon kognitif audiens sasaran. Secara metodologis setiap indikator konstruk diuji melalui parameter reliabilitas komposit yang memenuhi batas keterandalan statistik secara optimal. Analisis mendalam mengenai dinamika komunikasi menunjukkan adanya kesinambungan yang konsisten antara ekspektasi pesan dengan respon kognitif audiens sasaran. Secara metodologis setiap indikator konstruk diuji melalui parameter reliabilitas komposit yang memenuhi batas keterandalan statistik secara optimal. Analisis mendalam mengenai dinamika komunikasi menunjukkan adanya kesinambungan yang konsisten antara ekspektasi pesan dengan respon kognitif audiens sasaran. Secara metodologis setiap indikator konstruk diuji melalui parameter reliabilitas komposit yang memenuhi batas keterandalan statistik secara optimal. Analisis mendalam mengenai dinamika komunikasi menunjukkan adanya kesinambungan yang konsisten antara ekspektasi pesan dengan respon kognitif audiens sasaran. Secara metodologis setiap indikator konstruk diuji melalui parameter reliabilitas komposit yang memenuhi batas keterandalan statistik secara optimal.</w:t>
       </w:r>
     </w:p>
     <w:p>
@@ -360,7 +360,7 @@
           <w:rFonts w:ascii="Times New Roman" w:hAnsi="Times New Roman"/>
           <w:sz w:val="24"/>
         </w:rPr>
-        <w:t>Analisis mendalam mengenai dinamika komunikasi menunjukkan adanya kesinambungan yang konsisten antara ekspektasi pesan dengan respon kognitif audiens sasaran. Secara metodologis setiap indikator konstruk diuji melalui parameter reliabilitas komposit yang memenuhi batas keterandalan statistik secara optimal. Analisis mendalam mengenai dinamika komunikasi menunjukkan adanya kesinambungan yang konsisten antara ekspektasi pesan dengan respon kognitif audiens sasaran. Secara metodologis setiap indikator konstruk diuji melalui parameter reliabilitas komposit yang memenuhi batas keterandalan statistik secara optimal. Analisis mendalam mengenai dinamika komunikasi menunjukkan adanya kesinambungan yang konsisten antara ekspektasi pesan dengan respon kognitif audiens sasaran. Secara metodologis setiap indikator konstruk diuji melalui parameter reliabilitas komposit yang memenuhi batas keterandalan statistik secara optimal. Analisis mendalam mengenai dinamika komunikasi menunjukkan adanya kesinambungan yang konsisten antara ekspektasi pesan dengan respon kognitif audiens sasaran. Secara metodologis setiap indikator konstruk diuji melalui parameter reliabilitas komposit yang memenuhi batas keterandalan statistik secara optimal. Analisis mendalam mengenai dinamika komunikasi menunjukkan adanya kesinambungan yang konsisten antara ekspektasi pesan dengan respon kognitif audiens sasaran. Secara metodologis setiap indikator konstruk diuji melalui parameter reliabilitas komposit yang memenuhi batas keterandalan statistik secara optimal. Analisis mendalam mengenai dinamika komunikasi menunjukkan adanya kesinambungan yang konsisten antara ekspektasi pesan dengan respon kognitif audiens sasaran. Secara metodologis setiap indikator konstruk diuji melalui parameter reliabilitas komposit yang memenuhi batas keterandalan statistik secara optimal. Analisis mendalam mengenai dinamika komunikasi menunjukkan adanya kesinambungan yang konsisten antara ekspektasi pesan dengan respon kognitif audiens sasaran. Secara metodologis setiap indikator konstruk diuji melalui parameter reliabilitas komposit yang memenuhi batas keterandalan statistik secara optimal. Analisis mendalam mengenai dinamika komunikasi menunjukkan adanya kesinambungan yang konsisten antara ekspektasi pesan dengan respon kognitif audiens sasaran. Secara metodologis setiap indikator konstruk diuji melalui parameter reliabilitas komposit yang memenuhi batas keterandalan statistik secara optimal. Analisis mendalam mengenai dinamika komunikasi menunjukkan adanya kesinambungan yang konsisten antara ekspektasi pesan dengan respon kognitif audiens sasaran. Secara metodologis setiap indikator konstruk diuji melalui parameter reliabilitas komposit yang memenuhi batas keterandalan statistik secara optimal. Analisis mendalam mengenai dinamika komunikasi menunjukkan adanya kesinambungan yang konsisten antara ekspektasi pesan dengan respon kognitif audiens sasaran. Secara metodologis setiap indikator konstruk diuji melalui parameter reliabilitas komposit yang memenuhi batas keterandalan statistik secara optimal. Analisis mendalam mengenai dinamika komunikasi menunjukkan adanya kesinambungan yang konsisten antara ekspektasi pesan dengan respon kognitif audiens sasaran. Secara metodologis setiap indikator konstruk diuji melalui parameter reliabilitas komposit yang memenuhi batas keterandalan statistik secara optimal. Analisis mendalam mengenai dinamika komunikasi menunjukkan adanya kesinambungan yang konsisten antara ekspektasi pesan dengan respon kognitif audiens sasaran. Secara metodologis setiap indikator konstruk diuji melalui parameter reliabilitas komposit yang memenuhi batas keterandalan statistik secara optimal. Analisis mendalam mengenai dinamika komunikasi menunjukkan adanya kesinambungan yang konsisten antara ekspektasi pesan dengan respon kognitif audiens sasaran. Secara metodologis setiap indikator konstruk diuji melalui parameter reliabilitas komposit yang memenuhi batas keterandalan statistik secara optimal. Analisis mendalam mengenai dinamika komunikasi menunjukkan adanya kesinambungan yang konsisten antara ekspektasi pesan dengan respon kognitif audiens sasaran. Secara metodologis setiap indikator konstruk diuji melalui parameter reliabilitas komposit yang memenuhi batas keterandalan statistik secara optimal. Analisis mendalam mengenai dinamika komunikasi menunjukkan adanya kesinambungan yang konsisten antara ekspektasi pesan dengan respon kognitif audiens sasaran. Secara metodologis setiap indikator konstruk diuji melalui parameter reliabilitas komposit yang memenuhi batas keterandalan statistik secara optimal.</w:t>
+        <w:t>Analisis mendalam mengenai dinamika komunikasi menunjukkan adanya kesinambungan yang konsisten antara ekspektasi pesan dengan respon kognitif audiens sasaran. Secara metodologis setiap indikator konstruk diuji melalui parameter reliabilitas komposit yang memenuhi batas keterandalan statistik secara optimal. Analisis mendalam mengenai dinamika komunikasi menunjukkan adanya kesinambungan yang konsisten antara ekspektasi pesan dengan respon kognitif audiens sasaran. Secara metodologis setiap indikator konstruk diuji melalui parameter reliabilitas komposit yang memenuhi batas keterandalan statistik secara optimal. Analisis mendalam mengenai dinamika komunikasi menunjukkan adanya kesinambungan yang konsisten antara ekspektasi pesan dengan respon kognitif audiens sasaran. Secara metodologis setiap indikator konstruk diuji melalui parameter reliabilitas komposit yang memenuhi batas keterandalan statistik secara optimal. Analisis mendalam mengenai dinamika komunikasi menunjukkan adanya kesinambungan yang konsisten antara ekspektasi pesan dengan respon kognitif audiens sasaran. Secara metodologis setiap indikator konstruk diuji melalui parameter reliabilitas komposit yang memenuhi batas keterandalan statistik secara optimal. Analisis mendalam mengenai dinamika komunikasi menunjukkan adanya kesinambungan yang konsisten antara ekspektasi pesan dengan respon kognitif audiens sasaran. Secara metodologis setiap indikator konstruk diuji melalui parameter reliabilitas komposit yang memenuhi batas keterandalan statistik secara optimal. Analisis mendalam mengenai dinamika komunikasi menunjukkan adanya kesinambungan yang konsisten antara ekspektasi pesan dengan respon kognitif audiens sasaran. Secara metodologis setiap indikator konstruk diuji melalui parameter reliabilitas komposit yang memenuhi batas keterandalan statistik secara optimal. Analisis mendalam mengenai dinamika komunikasi menunjukkan adanya kesinambungan yang konsisten antara ekspektasi pesan dengan respon kognitif audiens sasaran. Secara metodologis setiap indikator konstruk diuji melalui parameter reliabilitas komposit yang memenuhi batas keterandalan statistik secara optimal. Analisis mendalam mengenai dinamika komunikasi menunjukkan adanya kesinambungan yang konsisten antara ekspektasi pesan dengan respon kognitif audiens sasaran. Secara metodologis setiap indikator konstruk diuji melalui parameter reliabilitas komposit yang memenuhi batas keterandalan statistik secara optimal. Analisis mendalam mengenai dinamika komunikasi menunjukkan adanya kesinambungan yang konsisten antara ekspektasi pesan dengan respon kognitif audiens sasaran. Secara metodologis setiap indikator konstruk diuji melalui parameter reliabilitas komposit yang memenuhi batas keterandalan statistik secara optimal. Analisis mendalam mengenai dinamika komunikasi menunjukkan adanya kesinambungan yang konsisten antara ekspektasi pesan dengan respon kognitif audiens sasaran. Secara metodologis setiap indikator konstruk diuji melalui parameter reliabilitas komposit yang memenuhi batas keterandalan statistik secara optimal. Analisis mendalam mengenai dinamika komunikasi menunjukkan adanya kesinambungan yang konsisten antara ekspektasi pesan dengan respon kognitif audiens sasaran. Secara metodologis setiap indikator konstruk diuji melalui parameter reliabilitas komposit yang memenuhi batas keterandalan statistik secara optimal. Analisis mendalam mengenai dinamika komunikasi menunjukkan adanya kesinambungan yang konsisten antara ekspektasi pesan dengan respon kognitif audiens sasaran. Secara metodologis setiap indikator konstruk diuji melalui parameter reliabilitas komposit yang memenuhi batas keterandalan statistik secara optimal.</w:t>
       </w:r>
     </w:p>
     <w:p>
@@ -373,7 +373,7 @@
           <w:rFonts w:ascii="Times New Roman" w:hAnsi="Times New Roman"/>
           <w:sz w:val="24"/>
         </w:rPr>
-        <w:t>Analisis mendalam mengenai dinamika komunikasi menunjukkan adanya kesinambungan yang konsisten antara ekspektasi pesan dengan respon kognitif audiens sasaran. Secara metodologis setiap indikator konstruk diuji melalui parameter reliabilitas komposit yang memenuhi batas keterandalan statistik secara optimal. Analisis mendalam mengenai dinamika komunikasi menunjukkan adanya kesinambungan yang konsisten antara ekspektasi pesan dengan respon kognitif audiens sasaran. Secara metodologis setiap indikator konstruk diuji melalui parameter reliabilitas komposit yang memenuhi batas keterandalan statistik secara optimal. Analisis mendalam mengenai dinamika komunikasi menunjukkan adanya kesinambungan yang konsisten antara ekspektasi pesan dengan respon kognitif audiens sasaran. Secara metodologis setiap indikator konstruk diuji melalui parameter reliabilitas komposit yang memenuhi batas keterandalan statistik secara optimal. Analisis mendalam mengenai dinamika komunikasi menunjukkan adanya kesinambungan yang konsisten antara ekspektasi pesan dengan respon kognitif audiens sasaran. Secara metodologis setiap indikator konstruk diuji melalui parameter reliabilitas komposit yang memenuhi batas keterandalan statistik secara optimal. Analisis mendalam mengenai dinamika komunikasi menunjukkan adanya kesinambungan yang konsisten antara ekspektasi pesan dengan respon kognitif audiens sasaran. Secara metodologis setiap indikator konstruk diuji melalui parameter reliabilitas komposit yang memenuhi batas keterandalan statistik secara optimal. Analisis mendalam mengenai dinamika komunikasi menunjukkan adanya kesinambungan yang konsisten antara ekspektasi pesan dengan respon kognitif audiens sasaran. Secara metodologis setiap indikator konstruk diuji melalui parameter reliabilitas komposit yang memenuhi batas keterandalan statistik secara optimal. Analisis mendalam mengenai dinamika komunikasi menunjukkan adanya kesinambungan yang konsisten antara ekspektasi pesan dengan respon kognitif audiens sasaran. Secara metodologis setiap indikator konstruk diuji melalui parameter reliabilitas komposit yang memenuhi batas keterandalan statistik secara optimal. Analisis mendalam mengenai dinamika komunikasi menunjukkan adanya kesinambungan yang konsisten antara ekspektasi pesan dengan respon kognitif audiens sasaran. Secara metodologis setiap indikator konstruk diuji melalui parameter reliabilitas komposit yang memenuhi batas keterandalan statistik secara optimal. Analisis mendalam mengenai dinamika komunikasi menunjukkan adanya kesinambungan yang konsisten antara ekspektasi pesan dengan respon kognitif audiens sasaran. Secara metodologis setiap indikator konstruk diuji melalui parameter reliabilitas komposit yang memenuhi batas keterandalan statistik secara optimal. Analisis mendalam mengenai dinamika komunikasi menunjukkan adanya kesinambungan yang konsisten antara ekspektasi pesan dengan respon kognitif audiens sasaran. Secara metodologis setiap indikator konstruk diuji melalui parameter reliabilitas komposit yang memenuhi batas keterandalan statistik secara optimal. Analisis mendalam mengenai dinamika komunikasi menunjukkan adanya kesinambungan yang konsisten antara ekspektasi pesan dengan respon kognitif audiens sasaran. Secara metodologis setiap indikator konstruk diuji melalui parameter reliabilitas komposit yang memenuhi batas keterandalan statistik secara optimal. Analisis mendalam mengenai dinamika komunikasi menunjukkan adanya kesinambungan yang konsisten antara ekspektasi pesan dengan respon kognitif audiens sasaran. Secara metodologis setiap indikator konstruk diuji melalui parameter reliabilitas komposit yang memenuhi batas keterandalan statistik secara optimal. Analisis mendalam mengenai dinamika komunikasi menunjukkan adanya kesinambungan yang konsisten antara ekspektasi pesan dengan respon kognitif audiens sasaran. Secara metodologis setiap indikator konstruk diuji melalui parameter reliabilitas komposit yang memenuhi batas keterandalan statistik secara optimal. Analisis mendalam mengenai dinamika komunikasi menunjukkan adanya kesinambungan yang konsisten antara ekspektasi pesan dengan respon kognitif audiens sasaran. Secara metodologis setiap indikator konstruk diuji melalui parameter reliabilitas komposit yang memenuhi batas keterandalan statistik secara optimal. Analisis mendalam mengenai dinamika komunikasi menunjukkan adanya kesinambungan yang konsisten antara ekspektasi pesan dengan respon kognitif audiens sasaran. Secara metodologis setiap indikator konstruk diuji melalui parameter reliabilitas komposit yang memenuhi batas keterandalan statistik secara optimal.</w:t>
+        <w:t>Analisis mendalam mengenai dinamika komunikasi menunjukkan adanya kesinambungan yang konsisten antara ekspektasi pesan dengan respon kognitif audiens sasaran. Secara metodologis setiap indikator konstruk diuji melalui parameter reliabilitas komposit yang memenuhi batas keterandalan statistik secara optimal. Analisis mendalam mengenai dinamika komunikasi menunjukkan adanya kesinambungan yang konsisten antara ekspektasi pesan dengan respon kognitif audiens sasaran. Secara metodologis setiap indikator konstruk diuji melalui parameter reliabilitas komposit yang memenuhi batas keterandalan statistik secara optimal. Analisis mendalam mengenai dinamika komunikasi menunjukkan adanya kesinambungan yang konsisten antara ekspektasi pesan dengan respon kognitif audiens sasaran. Secara metodologis setiap indikator konstruk diuji melalui parameter reliabilitas komposit yang memenuhi batas keterandalan statistik secara optimal. Analisis mendalam mengenai dinamika komunikasi menunjukkan adanya kesinambungan yang konsisten antara ekspektasi pesan dengan respon kognitif audiens sasaran. Secara metodologis setiap indikator konstruk diuji melalui parameter reliabilitas komposit yang memenuhi batas keterandalan statistik secara optimal. Analisis mendalam mengenai dinamika komunikasi menunjukkan adanya kesinambungan yang konsisten antara ekspektasi pesan dengan respon kognitif audiens sasaran. Secara metodologis setiap indikator konstruk diuji melalui parameter reliabilitas komposit yang memenuhi batas keterandalan statistik secara optimal. Analisis mendalam mengenai dinamika komunikasi menunjukkan adanya kesinambungan yang konsisten antara ekspektasi pesan dengan respon kognitif audiens sasaran. Secara metodologis setiap indikator konstruk diuji melalui parameter reliabilitas komposit yang memenuhi batas keterandalan statistik secara optimal. Analisis mendalam mengenai dinamika komunikasi menunjukkan adanya kesinambungan yang konsisten antara ekspektasi pesan dengan respon kognitif audiens sasaran. Secara metodologis setiap indikator konstruk diuji melalui parameter reliabilitas komposit yang memenuhi batas keterandalan statistik secara optimal. Analisis mendalam mengenai dinamika komunikasi menunjukkan adanya kesinambungan yang konsisten antara ekspektasi pesan dengan respon kognitif audiens sasaran. Secara metodologis setiap indikator konstruk diuji melalui parameter reliabilitas komposit yang memenuhi batas keterandalan statistik secara optimal. Analisis mendalam mengenai dinamika komunikasi menunjukkan adanya kesinambungan yang konsisten antara ekspektasi pesan dengan respon kognitif audiens sasaran. Secara metodologis setiap indikator konstruk diuji melalui parameter reliabilitas komposit yang memenuhi batas keterandalan statistik secara optimal. Analisis mendalam mengenai dinamika komunikasi menunjukkan adanya kesinambungan yang konsisten antara ekspektasi pesan dengan respon kognitif audiens sasaran. Secara metodologis setiap indikator konstruk diuji melalui parameter reliabilitas komposit yang memenuhi batas keterandalan statistik secara optimal. Analisis mendalam mengenai dinamika komunikasi menunjukkan adanya kesinambungan yang konsisten antara ekspektasi pesan dengan respon kognitif audiens sasaran. Secara metodologis setiap indikator konstruk diuji melalui parameter reliabilitas komposit yang memenuhi batas keterandalan statistik secara optimal. Analisis mendalam mengenai dinamika komunikasi menunjukkan adanya kesinambungan yang konsisten antara ekspektasi pesan dengan respon kognitif audiens sasaran. Secara metodologis setiap indikator konstruk diuji melalui parameter reliabilitas komposit yang memenuhi batas keterandalan statistik secara optimal.</w:t>
       </w:r>
     </w:p>
     <w:p>
@@ -386,7 +386,7 @@
           <w:rFonts w:ascii="Times New Roman" w:hAnsi="Times New Roman"/>
           <w:sz w:val="24"/>
         </w:rPr>
-        <w:t>Analisis mendalam mengenai dinamika komunikasi menunjukkan adanya kesinambungan yang konsisten antara ekspektasi pesan dengan respon kognitif audiens sasaran. Secara metodologis setiap indikator konstruk diuji melalui parameter reliabilitas komposit yang memenuhi batas keterandalan statistik secara optimal. Analisis mendalam mengenai dinamika komunikasi menunjukkan adanya kesinambungan yang konsisten antara ekspektasi pesan dengan respon kognitif audiens sasaran. Secara metodologis setiap indikator konstruk diuji melalui parameter reliabilitas komposit yang memenuhi batas keterandalan statistik secara optimal. Analisis mendalam mengenai dinamika komunikasi menunjukkan adanya kesinambungan yang konsisten antara ekspektasi pesan dengan respon kognitif audiens sasaran. Secara metodologis setiap indikator konstruk diuji melalui parameter reliabilitas komposit yang memenuhi batas keterandalan statistik secara optimal. Analisis mendalam mengenai dinamika komunikasi menunjukkan adanya kesinambungan yang konsisten antara ekspektasi pesan dengan respon kognitif audiens sasaran. Secara metodologis setiap indikator konstruk diuji melalui parameter reliabilitas komposit yang memenuhi batas keterandalan statistik secara optimal. Analisis mendalam mengenai dinamika komunikasi menunjukkan adanya kesinambungan yang konsisten antara ekspektasi pesan dengan respon kognitif audiens sasaran. Secara metodologis setiap indikator konstruk diuji melalui parameter reliabilitas komposit yang memenuhi batas keterandalan statistik secara optimal. Analisis mendalam mengenai dinamika komunikasi menunjukkan adanya kesinambungan yang konsisten antara ekspektasi pesan dengan respon kognitif audiens sasaran. Secara metodologis setiap indikator konstruk diuji melalui parameter reliabilitas komposit yang memenuhi batas keterandalan statistik secara optimal. Analisis mendalam mengenai dinamika komunikasi menunjukkan adanya kesinambungan yang konsisten antara ekspektasi pesan dengan respon kognitif audiens sasaran. Secara metodologis setiap indikator konstruk diuji melalui parameter reliabilitas komposit yang memenuhi batas keterandalan statistik secara optimal. Analisis mendalam mengenai dinamika komunikasi menunjukkan adanya kesinambungan yang konsisten antara ekspektasi pesan dengan respon kognitif audiens sasaran. Secara metodologis setiap indikator konstruk diuji melalui parameter reliabilitas komposit yang memenuhi batas keterandalan statistik secara optimal. Analisis mendalam mengenai dinamika komunikasi menunjukkan adanya kesinambungan yang konsisten antara ekspektasi pesan dengan respon kognitif audiens sasaran. Secara metodologis setiap indikator konstruk diuji melalui parameter reliabilitas komposit yang memenuhi batas keterandalan statistik secara optimal. Analisis mendalam mengenai dinamika komunikasi menunjukkan adanya kesinambungan yang konsisten antara ekspektasi pesan dengan respon kognitif audiens sasaran. Secara metodologis setiap indikator konstruk diuji melalui parameter reliabilitas komposit yang memenuhi batas keterandalan statistik secara optimal. Analisis mendalam mengenai dinamika komunikasi menunjukkan adanya kesinambungan yang konsisten antara ekspektasi pesan dengan respon kognitif audiens sasaran. Secara metodologis setiap indikator konstruk diuji melalui parameter reliabilitas komposit yang memenuhi batas keterandalan statistik secara optimal. Analisis mendalam mengenai dinamika komunikasi menunjukkan adanya kesinambungan yang konsisten antara ekspektasi pesan dengan respon kognitif audiens sasaran. Secara metodologis setiap indikator konstruk diuji melalui parameter reliabilitas komposit yang memenuhi batas keterandalan statistik secara optimal. Analisis mendalam mengenai dinamika komunikasi menunjukkan adanya kesinambungan yang konsisten antara ekspektasi pesan dengan respon kognitif audiens sasaran. Secara metodologis setiap indikator konstruk diuji melalui parameter reliabilitas komposit yang memenuhi batas keterandalan statistik secara optimal. Analisis mendalam mengenai dinamika komunikasi menunjukkan adanya kesinambungan yang konsisten antara ekspektasi pesan dengan respon kognitif audiens sasaran. Secara metodologis setiap indikator konstruk diuji melalui parameter reliabilitas komposit yang memenuhi batas keterandalan statistik secara optimal. Analisis mendalam mengenai dinamika komunikasi menunjukkan adanya kesinambungan yang konsisten antara ekspektasi pesan dengan respon kognitif audiens sasaran. Secara metodologis setiap indikator konstruk diuji melalui parameter reliabilitas komposit yang memenuhi batas keterandalan statistik secara optimal.</w:t>
+        <w:t>Analisis mendalam mengenai dinamika komunikasi menunjukkan adanya kesinambungan yang konsisten antara ekspektasi pesan dengan respon kognitif audiens sasaran. Secara metodologis setiap indikator konstruk diuji melalui parameter reliabilitas komposit yang memenuhi batas keterandalan statistik secara optimal. Analisis mendalam mengenai dinamika komunikasi menunjukkan adanya kesinambungan yang konsisten antara ekspektasi pesan dengan respon kognitif audiens sasaran. Secara metodologis setiap indikator konstruk diuji melalui parameter reliabilitas komposit yang memenuhi batas keterandalan statistik secara optimal. Analisis mendalam mengenai dinamika komunikasi menunjukkan adanya kesinambungan yang konsisten antara ekspektasi pesan dengan respon kognitif audiens sasaran. Secara metodologis setiap indikator konstruk diuji melalui parameter reliabilitas komposit yang memenuhi batas keterandalan statistik secara optimal. Analisis mendalam mengenai dinamika komunikasi menunjukkan adanya kesinambungan yang konsisten antara ekspektasi pesan dengan respon kognitif audiens sasaran. Secara metodologis setiap indikator konstruk diuji melalui parameter reliabilitas komposit yang memenuhi batas keterandalan statistik secara optimal. Analisis mendalam mengenai dinamika komunikasi menunjukkan adanya kesinambungan yang konsisten antara ekspektasi pesan dengan respon kognitif audiens sasaran. Secara metodologis setiap indikator konstruk diuji melalui parameter reliabilitas komposit yang memenuhi batas keterandalan statistik secara optimal. Analisis mendalam mengenai dinamika komunikasi menunjukkan adanya kesinambungan yang konsisten antara ekspektasi pesan dengan respon kognitif audiens sasaran. Secara metodologis setiap indikator konstruk diuji melalui parameter reliabilitas komposit yang memenuhi batas keterandalan statistik secara optimal. Analisis mendalam mengenai dinamika komunikasi menunjukkan adanya kesinambungan yang konsisten antara ekspektasi pesan dengan respon kognitif audiens sasaran. Secara metodologis setiap indikator konstruk diuji melalui parameter reliabilitas komposit yang memenuhi batas keterandalan statistik secara optimal. Analisis mendalam mengenai dinamika komunikasi menunjukkan adanya kesinambungan yang konsisten antara ekspektasi pesan dengan respon kognitif audiens sasaran. Secara metodologis setiap indikator konstruk diuji melalui parameter reliabilitas komposit yang memenuhi batas keterandalan statistik secara optimal. Analisis mendalam mengenai dinamika komunikasi menunjukkan adanya kesinambungan yang konsisten antara ekspektasi pesan dengan respon kognitif audiens sasaran. Secara metodologis setiap indikator konstruk diuji melalui parameter reliabilitas komposit yang memenuhi batas keterandalan statistik secara optimal. Analisis mendalam mengenai dinamika komunikasi menunjukkan adanya kesinambungan yang konsisten antara ekspektasi pesan dengan respon kognitif audiens sasaran. Secara metodologis setiap indikator konstruk diuji melalui parameter reliabilitas komposit yang memenuhi batas keterandalan statistik secara optimal. Analisis mendalam mengenai dinamika komunikasi menunjukkan adanya kesinambungan yang konsisten antara ekspektasi pesan dengan respon kognitif audiens sasaran. Secara metodologis setiap indikator konstruk diuji melalui parameter reliabilitas komposit yang memenuhi batas keterandalan statistik secara optimal. Analisis mendalam mengenai dinamika komunikasi menunjukkan adanya kesinambungan yang konsisten antara ekspektasi pesan dengan respon kognitif audiens sasaran. Secara metodologis setiap indikator konstruk diuji melalui parameter reliabilitas komposit yang memenuhi batas keterandalan statistik secara optimal.</w:t>
       </w:r>
     </w:p>
     <w:p>
@@ -399,7 +399,7 @@
           <w:rFonts w:ascii="Times New Roman" w:hAnsi="Times New Roman"/>
           <w:sz w:val="24"/>
         </w:rPr>
-        <w:t>Analisis mendalam mengenai dinamika komunikasi menunjukkan adanya kesinambungan yang konsisten antara ekspektasi pesan dengan respon kognitif audiens sasaran. Secara metodologis setiap indikator konstruk diuji melalui parameter reliabilitas komposit yang memenuhi batas keterandalan statistik secara optimal. Analisis mendalam mengenai dinamika komunikasi menunjukkan adanya kesinambungan yang konsisten antara ekspektasi pesan dengan respon kognitif audiens sasaran. Secara metodologis setiap indikator konstruk diuji melalui parameter reliabilitas komposit yang memenuhi batas keterandalan statistik secara optimal. Analisis mendalam mengenai dinamika komunikasi menunjukkan adanya kesinambungan yang konsisten antara ekspektasi pesan dengan respon kognitif audiens sasaran. Secara metodologis setiap indikator konstruk diuji melalui parameter reliabilitas komposit yang memenuhi batas keterandalan statistik secara optimal. Analisis mendalam mengenai dinamika komunikasi menunjukkan adanya kesinambungan yang konsisten antara ekspektasi pesan dengan respon kognitif audiens sasaran. Secara metodologis setiap indikator konstruk diuji melalui parameter reliabilitas komposit yang memenuhi batas keterandalan statistik secara optimal. Analisis mendalam mengenai dinamika komunikasi menunjukkan adanya kesinambungan yang konsisten antara ekspektasi pesan dengan respon kognitif audiens sasaran. Secara metodologis setiap indikator konstruk diuji melalui parameter reliabilitas komposit yang memenuhi batas keterandalan statistik secara optimal. Analisis mendalam mengenai dinamika komunikasi menunjukkan adanya kesinambungan yang konsisten antara ekspektasi pesan dengan respon kognitif audiens sasaran. Secara metodologis setiap indikator konstruk diuji melalui parameter reliabilitas komposit yang memenuhi batas keterandalan statistik secara optimal. Analisis mendalam mengenai dinamika komunikasi menunjukkan adanya kesinambungan yang konsisten antara ekspektasi pesan dengan respon kognitif audiens sasaran. Secara metodologis setiap indikator konstruk diuji melalui parameter reliabilitas komposit yang memenuhi batas keterandalan statistik secara optimal. Analisis mendalam mengenai dinamika komunikasi menunjukkan adanya kesinambungan yang konsisten antara ekspektasi pesan dengan respon kognitif audiens sasaran. Secara metodologis setiap indikator konstruk diuji melalui parameter reliabilitas komposit yang memenuhi batas keterandalan statistik secara optimal. Analisis mendalam mengenai dinamika komunikasi menunjukkan adanya kesinambungan yang konsisten antara ekspektasi pesan dengan respon kognitif audiens sasaran. Secara metodologis setiap indikator konstruk diuji melalui parameter reliabilitas komposit yang memenuhi batas keterandalan statistik secara optimal. Analisis mendalam mengenai dinamika komunikasi menunjukkan adanya kesinambungan yang konsisten antara ekspektasi pesan dengan respon kognitif audiens sasaran. Secara metodologis setiap indikator konstruk diuji melalui parameter reliabilitas komposit yang memenuhi batas keterandalan statistik secara optimal. Analisis mendalam mengenai dinamika komunikasi menunjukkan adanya kesinambungan yang konsisten antara ekspektasi pesan dengan respon kognitif audiens sasaran. Secara metodologis setiap indikator konstruk diuji melalui parameter reliabilitas komposit yang memenuhi batas keterandalan statistik secara optimal. Analisis mendalam mengenai dinamika komunikasi menunjukkan adanya kesinambungan yang konsisten antara ekspektasi pesan dengan respon kognitif audiens sasaran. Secara metodologis setiap indikator konstruk diuji melalui parameter reliabilitas komposit yang memenuhi batas keterandalan statistik secara optimal. Analisis mendalam mengenai dinamika komunikasi menunjukkan adanya kesinambungan yang konsisten antara ekspektasi pesan dengan respon kognitif audiens sasaran. Secara metodologis setiap indikator konstruk diuji melalui parameter reliabilitas komposit yang memenuhi batas keterandalan statistik secara optimal. Analisis mendalam mengenai dinamika komunikasi menunjukkan adanya kesinambungan yang konsisten antara ekspektasi pesan dengan respon kognitif audiens sasaran. Secara metodologis setiap indikator konstruk diuji melalui parameter reliabilitas komposit yang memenuhi batas keterandalan statistik secara optimal. Analisis mendalam mengenai dinamika komunikasi menunjukkan adanya kesinambungan yang konsisten antara ekspektasi pesan dengan respon kognitif audiens sasaran. Secara metodologis setiap indikator konstruk diuji melalui parameter reliabilitas komposit yang memenuhi batas keterandalan statistik secara optimal.</w:t>
+        <w:t>Analisis mendalam mengenai dinamika komunikasi menunjukkan adanya kesinambungan yang konsisten antara ekspektasi pesan dengan respon kognitif audiens sasaran. Secara metodologis setiap indikator konstruk diuji melalui parameter reliabilitas komposit yang memenuhi batas keterandalan statistik secara optimal. Analisis mendalam mengenai dinamika komunikasi menunjukkan adanya kesinambungan yang konsisten antara ekspektasi pesan dengan respon kognitif audiens sasaran. Secara metodologis setiap indikator konstruk diuji melalui parameter reliabilitas komposit yang memenuhi batas keterandalan statistik secara optimal. Analisis mendalam mengenai dinamika komunikasi menunjukkan adanya kesinambungan yang konsisten antara ekspektasi pesan dengan respon kognitif audiens sasaran. Secara metodologis setiap indikator konstruk diuji melalui parameter reliabilitas komposit yang memenuhi batas keterandalan statistik secara optimal. Analisis mendalam mengenai dinamika komunikasi menunjukkan adanya kesinambungan yang konsisten antara ekspektasi pesan dengan respon kognitif audiens sasaran. Secara metodologis setiap indikator konstruk diuji melalui parameter reliabilitas komposit yang memenuhi batas keterandalan statistik secara optimal. Analisis mendalam mengenai dinamika komunikasi menunjukkan adanya kesinambungan yang konsisten antara ekspektasi pesan dengan respon kognitif audiens sasaran. Secara metodologis setiap indikator konstruk diuji melalui parameter reliabilitas komposit yang memenuhi batas keterandalan statistik secara optimal. Analisis mendalam mengenai dinamika komunikasi menunjukkan adanya kesinambungan yang konsisten antara ekspektasi pesan dengan respon kognitif audiens sasaran. Secara metodologis setiap indikator konstruk diuji melalui parameter reliabilitas komposit yang memenuhi batas keterandalan statistik secara optimal. Analisis mendalam mengenai dinamika komunikasi menunjukkan adanya kesinambungan yang konsisten antara ekspektasi pesan dengan respon kognitif audiens sasaran. Secara metodologis setiap indikator konstruk diuji melalui parameter reliabilitas komposit yang memenuhi batas keterandalan statistik secara optimal. Analisis mendalam mengenai dinamika komunikasi menunjukkan adanya kesinambungan yang konsisten antara ekspektasi pesan dengan respon kognitif audiens sasaran. Secara metodologis setiap indikator konstruk diuji melalui parameter reliabilitas komposit yang memenuhi batas keterandalan statistik secara optimal. Analisis mendalam mengenai dinamika komunikasi menunjukkan adanya kesinambungan yang konsisten antara ekspektasi pesan dengan respon kognitif audiens sasaran. Secara metodologis setiap indikator konstruk diuji melalui parameter reliabilitas komposit yang memenuhi batas keterandalan statistik secara optimal. Analisis mendalam mengenai dinamika komunikasi menunjukkan adanya kesinambungan yang konsisten antara ekspektasi pesan dengan respon kognitif audiens sasaran. Secara metodologis setiap indikator konstruk diuji melalui parameter reliabilitas komposit yang memenuhi batas keterandalan statistik secara optimal. Analisis mendalam mengenai dinamika komunikasi menunjukkan adanya kesinambungan yang konsisten antara ekspektasi pesan dengan respon kognitif audiens sasaran. Secara metodologis setiap indikator konstruk diuji melalui parameter reliabilitas komposit yang memenuhi batas keterandalan statistik secara optimal. Analisis mendalam mengenai dinamika komunikasi menunjukkan adanya kesinambungan yang konsisten antara ekspektasi pesan dengan respon kognitif audiens sasaran. Secara metodologis setiap indikator konstruk diuji melalui parameter reliabilitas komposit yang memenuhi batas keterandalan statistik secara optimal.</w:t>
       </w:r>
     </w:p>
     <w:p>
@@ -412,7 +412,7 @@
           <w:rFonts w:ascii="Times New Roman" w:hAnsi="Times New Roman"/>
           <w:sz w:val="24"/>
         </w:rPr>
-        <w:t>Analisis mendalam mengenai dinamika komunikasi menunjukkan adanya kesinambungan yang konsisten antara ekspektasi pesan dengan respon kognitif audiens sasaran. Secara metodologis setiap indikator konstruk diuji melalui parameter reliabilitas komposit yang memenuhi batas keterandalan statistik secara optimal. Analisis mendalam mengenai dinamika komunikasi menunjukkan adanya kesinambungan yang konsisten antara ekspektasi pesan dengan respon kognitif audiens sasaran. Secara metodologis setiap indikator konstruk diuji melalui parameter reliabilitas komposit yang memenuhi batas keterandalan statistik secara optimal. Analisis mendalam mengenai dinamika komunikasi menunjukkan adanya kesinambungan yang konsisten antara ekspektasi pesan dengan respon kognitif audiens sasaran. Secara metodologis setiap indikator konstruk diuji melalui parameter reliabilitas komposit yang memenuhi batas keterandalan statistik secara optimal. Analisis mendalam mengenai dinamika komunikasi menunjukkan adanya kesinambungan yang konsisten antara ekspektasi pesan dengan respon kognitif audiens sasaran. Secara metodologis setiap indikator konstruk diuji melalui parameter reliabilitas komposit yang memenuhi batas keterandalan statistik secara optimal. Analisis mendalam mengenai dinamika komunikasi menunjukkan adanya kesinambungan yang konsisten antara ekspektasi pesan dengan respon kognitif audiens sasaran. Secara metodologis setiap indikator konstruk diuji melalui parameter reliabilitas komposit yang memenuhi batas keterandalan statistik secara optimal. Analisis mendalam mengenai dinamika komunikasi menunjukkan adanya kesinambungan yang konsisten antara ekspektasi pesan dengan respon kognitif audiens sasaran. Secara metodologis setiap indikator konstruk diuji melalui parameter reliabilitas komposit yang memenuhi batas keterandalan statistik secara optimal. Analisis mendalam mengenai dinamika komunikasi menunjukkan adanya kesinambungan yang konsisten antara ekspektasi pesan dengan respon kognitif audiens sasaran. Secara metodologis setiap indikator konstruk diuji melalui parameter reliabilitas komposit yang memenuhi batas keterandalan statistik secara optimal. Analisis mendalam mengenai dinamika komunikasi menunjukkan adanya kesinambungan yang konsisten antara ekspektasi pesan dengan respon kognitif audiens sasaran. Secara metodologis setiap indikator konstruk diuji melalui parameter reliabilitas komposit yang memenuhi batas keterandalan statistik secara optimal. Analisis mendalam mengenai dinamika komunikasi menunjukkan adanya kesinambungan yang konsisten antara ekspektasi pesan dengan respon kognitif audiens sasaran. Secara metodologis setiap indikator konstruk diuji melalui parameter reliabilitas komposit yang memenuhi batas keterandalan statistik secara optimal. Analisis mendalam mengenai dinamika komunikasi menunjukkan adanya kesinambungan yang konsisten antara ekspektasi pesan dengan respon kognitif audiens sasaran. Secara metodologis setiap indikator konstruk diuji melalui parameter reliabilitas komposit yang memenuhi batas keterandalan statistik secara optimal. Analisis mendalam mengenai dinamika komunikasi menunjukkan adanya kesinambungan yang konsisten antara ekspektasi pesan dengan respon kognitif audiens sasaran. Secara metodologis setiap indikator konstruk diuji melalui parameter reliabilitas komposit yang memenuhi batas keterandalan statistik secara optimal. Analisis mendalam mengenai dinamika komunikasi menunjukkan adanya kesinambungan yang konsisten antara ekspektasi pesan dengan respon kognitif audiens sasaran. Secara metodologis setiap indikator konstruk diuji melalui parameter reliabilitas komposit yang memenuhi batas keterandalan statistik secara optimal. Analisis mendalam mengenai dinamika komunikasi menunjukkan adanya kesinambungan yang konsisten antara ekspektasi pesan dengan respon kognitif audiens sasaran. Secara metodologis setiap indikator konstruk diuji melalui parameter reliabilitas komposit yang memenuhi batas keterandalan statistik secara optimal. Analisis mendalam mengenai dinamika komunikasi menunjukkan adanya kesinambungan yang konsisten antara ekspektasi pesan dengan respon kognitif audiens sasaran. Secara metodologis setiap indikator konstruk diuji melalui parameter reliabilitas komposit yang memenuhi batas keterandalan statistik secara optimal. Analisis mendalam mengenai dinamika komunikasi menunjukkan adanya kesinambungan yang konsisten antara ekspektasi pesan dengan respon kognitif audiens sasaran. Secara metodologis setiap indikator konstruk diuji melalui parameter reliabilitas komposit yang memenuhi batas keterandalan statistik secara optimal.</w:t>
+        <w:t>Analisis mendalam mengenai dinamika komunikasi menunjukkan adanya kesinambungan yang konsisten antara ekspektasi pesan dengan respon kognitif audiens sasaran. Secara metodologis setiap indikator konstruk diuji melalui parameter reliabilitas komposit yang memenuhi batas keterandalan statistik secara optimal. Analisis mendalam mengenai dinamika komunikasi menunjukkan adanya kesinambungan yang konsisten antara ekspektasi pesan dengan respon kognitif audiens sasaran. Secara metodologis setiap indikator konstruk diuji melalui parameter reliabilitas komposit yang memenuhi batas keterandalan statistik secara optimal. Analisis mendalam mengenai dinamika komunikasi menunjukkan adanya kesinambungan yang konsisten antara ekspektasi pesan dengan respon kognitif audiens sasaran. Secara metodologis setiap indikator konstruk diuji melalui parameter reliabilitas komposit yang memenuhi batas keterandalan statistik secara optimal. Analisis mendalam mengenai dinamika komunikasi menunjukkan adanya kesinambungan yang konsisten antara ekspektasi pesan dengan respon kognitif audiens sasaran. Secara metodologis setiap indikator konstruk diuji melalui parameter reliabilitas komposit yang memenuhi batas keterandalan statistik secara optimal. Analisis mendalam mengenai dinamika komunikasi menunjukkan adanya kesinambungan yang konsisten antara ekspektasi pesan dengan respon kognitif audiens sasaran. Secara metodologis setiap indikator konstruk diuji melalui parameter reliabilitas komposit yang memenuhi batas keterandalan statistik secara optimal. Analisis mendalam mengenai dinamika komunikasi menunjukkan adanya kesinambungan yang konsisten antara ekspektasi pesan dengan respon kognitif audiens sasaran. Secara metodologis setiap indikator konstruk diuji melalui parameter reliabilitas komposit yang memenuhi batas keterandalan statistik secara optimal. Analisis mendalam mengenai dinamika komunikasi menunjukkan adanya kesinambungan yang konsisten antara ekspektasi pesan dengan respon kognitif audiens sasaran. Secara metodologis setiap indikator konstruk diuji melalui parameter reliabilitas komposit yang memenuhi batas keterandalan statistik secara optimal. Analisis mendalam mengenai dinamika komunikasi menunjukkan adanya kesinambungan yang konsisten antara ekspektasi pesan dengan respon kognitif audiens sasaran. Secara metodologis setiap indikator konstruk diuji melalui parameter reliabilitas komposit yang memenuhi batas keterandalan statistik secara optimal. Analisis mendalam mengenai dinamika komunikasi menunjukkan adanya kesinambungan yang konsisten antara ekspektasi pesan dengan respon kognitif audiens sasaran. Secara metodologis setiap indikator konstruk diuji melalui parameter reliabilitas komposit yang memenuhi batas keterandalan statistik secara optimal. Analisis mendalam mengenai dinamika komunikasi menunjukkan adanya kesinambungan yang konsisten antara ekspektasi pesan dengan respon kognitif audiens sasaran. Secara metodologis setiap indikator konstruk diuji melalui parameter reliabilitas komposit yang memenuhi batas keterandalan statistik secara optimal. Analisis mendalam mengenai dinamika komunikasi menunjukkan adanya kesinambungan yang konsisten antara ekspektasi pesan dengan respon kognitif audiens sasaran. Secara metodologis setiap indikator konstruk diuji melalui parameter reliabilitas komposit yang memenuhi batas keterandalan statistik secara optimal. Analisis mendalam mengenai dinamika komunikasi menunjukkan adanya kesinambungan yang konsisten antara ekspektasi pesan dengan respon kognitif audiens sasaran. Secara metodologis setiap indikator konstruk diuji melalui parameter reliabilitas komposit yang memenuhi batas keterandalan statistik secara optimal.</w:t>
       </w:r>
     </w:p>
     <w:p>
@@ -425,7 +425,7 @@
           <w:rFonts w:ascii="Times New Roman" w:hAnsi="Times New Roman"/>
           <w:sz w:val="24"/>
         </w:rPr>
-        <w:t>Analisis mendalam mengenai dinamika komunikasi menunjukkan adanya kesinambungan yang konsisten antara ekspektasi pesan dengan respon kognitif audiens sasaran. Secara metodologis setiap indikator konstruk diuji melalui parameter reliabilitas komposit yang memenuhi batas keterandalan statistik secara optimal. Analisis mendalam mengenai dinamika komunikasi menunjukkan adanya kesinambungan yang konsisten antara ekspektasi pesan dengan respon kognitif audiens sasaran. Secara metodologis setiap indikator konstruk diuji melalui parameter reliabilitas komposit yang memenuhi batas keterandalan statistik secara optimal. Analisis mendalam mengenai dinamika komunikasi menunjukkan adanya kesinambungan yang konsisten antara ekspektasi pesan dengan respon kognitif audiens sasaran. Secara metodologis setiap indikator konstruk diuji melalui parameter reliabilitas komposit yang memenuhi batas keterandalan statistik secara optimal. Analisis mendalam mengenai dinamika komunikasi menunjukkan adanya kesinambungan yang konsisten antara ekspektasi pesan dengan respon kognitif audiens sasaran. Secara metodologis setiap indikator konstruk diuji melalui parameter reliabilitas komposit yang memenuhi batas keterandalan statistik secara optimal. Analisis mendalam mengenai dinamika komunikasi menunjukkan adanya kesinambungan yang konsisten antara ekspektasi pesan dengan respon kognitif audiens sasaran. Secara metodologis setiap indikator konstruk diuji melalui parameter reliabilitas komposit yang memenuhi batas keterandalan statistik secara optimal. Analisis mendalam mengenai dinamika komunikasi menunjukkan adanya kesinambungan yang konsisten antara ekspektasi pesan dengan respon kognitif audiens sasaran. Secara metodologis setiap indikator konstruk diuji melalui parameter reliabilitas komposit yang memenuhi batas keterandalan statistik secara optimal. Analisis mendalam mengenai dinamika komunikasi menunjukkan adanya kesinambungan yang konsisten antara ekspektasi pesan dengan respon kognitif audiens sasaran. Secara metodologis setiap indikator konstruk diuji melalui parameter reliabilitas komposit yang memenuhi batas keterandalan statistik secara optimal. Analisis mendalam mengenai dinamika komunikasi menunjukkan adanya kesinambungan yang konsisten antara ekspektasi pesan dengan respon kognitif audiens sasaran. Secara metodologis setiap indikator konstruk diuji melalui parameter reliabilitas komposit yang memenuhi batas keterandalan statistik secara optimal. Analisis mendalam mengenai dinamika komunikasi menunjukkan adanya kesinambungan yang konsisten antara ekspektasi pesan dengan respon kognitif audiens sasaran. Secara metodologis setiap indikator konstruk diuji melalui parameter reliabilitas komposit yang memenuhi batas keterandalan statistik secara optimal. Analisis mendalam mengenai dinamika komunikasi menunjukkan adanya kesinambungan yang konsisten antara ekspektasi pesan dengan respon kognitif audiens sasaran. Secara metodologis setiap indikator konstruk diuji melalui parameter reliabilitas komposit yang memenuhi batas keterandalan statistik secara optimal. Analisis mendalam mengenai dinamika komunikasi menunjukkan adanya kesinambungan yang konsisten antara ekspektasi pesan dengan respon kognitif audiens sasaran. Secara metodologis setiap indikator konstruk diuji melalui parameter reliabilitas komposit yang memenuhi batas keterandalan statistik secara optimal. Analisis mendalam mengenai dinamika komunikasi menunjukkan adanya kesinambungan yang konsisten antara ekspektasi pesan dengan respon kognitif audiens sasaran. Secara metodologis setiap indikator konstruk diuji melalui parameter reliabilitas komposit yang memenuhi batas keterandalan statistik secara optimal. Analisis mendalam mengenai dinamika komunikasi menunjukkan adanya kesinambungan yang konsisten antara ekspektasi pesan dengan respon kognitif audiens sasaran. Secara metodologis setiap indikator konstruk diuji melalui parameter reliabilitas komposit yang memenuhi batas keterandalan statistik secara optimal. Analisis mendalam mengenai dinamika komunikasi menunjukkan adanya kesinambungan yang konsisten antara ekspektasi pesan dengan respon kognitif audiens sasaran. Secara metodologis setiap indikator konstruk diuji melalui parameter reliabilitas komposit yang memenuhi batas keterandalan statistik secara optimal. Analisis mendalam mengenai dinamika komunikasi menunjukkan adanya kesinambungan yang konsisten antara ekspektasi pesan dengan respon kognitif audiens sasaran. Secara metodologis setiap indikator konstruk diuji melalui parameter reliabilitas komposit yang memenuhi batas keterandalan statistik secara optimal.</w:t>
+        <w:t>Analisis mendalam mengenai dinamika komunikasi menunjukkan adanya kesinambungan yang konsisten antara ekspektasi pesan dengan respon kognitif audiens sasaran. Secara metodologis setiap indikator konstruk diuji melalui parameter reliabilitas komposit yang memenuhi batas keterandalan statistik secara optimal. Analisis mendalam mengenai dinamika komunikasi menunjukkan adanya kesinambungan yang konsisten antara ekspektasi pesan dengan respon kognitif audiens sasaran. Secara metodologis setiap indikator konstruk diuji melalui parameter reliabilitas komposit yang memenuhi batas keterandalan statistik secara optimal. Analisis mendalam mengenai dinamika komunikasi menunjukkan adanya kesinambungan yang konsisten antara ekspektasi pesan dengan respon kognitif audiens sasaran. Secara metodologis setiap indikator konstruk diuji melalui parameter reliabilitas komposit yang memenuhi batas keterandalan statistik secara optimal. Analisis mendalam mengenai dinamika komunikasi menunjukkan adanya kesinambungan yang konsisten antara ekspektasi pesan dengan respon kognitif audiens sasaran. Secara metodologis setiap indikator konstruk diuji melalui parameter reliabilitas komposit yang memenuhi batas keterandalan statistik secara optimal. Analisis mendalam mengenai dinamika komunikasi menunjukkan adanya kesinambungan yang konsisten antara ekspektasi pesan dengan respon kognitif audiens sasaran. Secara metodologis setiap indikator konstruk diuji melalui parameter reliabilitas komposit yang memenuhi batas keterandalan statistik secara optimal. Analisis mendalam mengenai dinamika komunikasi menunjukkan adanya kesinambungan yang konsisten antara ekspektasi pesan dengan respon kognitif audiens sasaran. Secara metodologis setiap indikator konstruk diuji melalui parameter reliabilitas komposit yang memenuhi batas keterandalan statistik secara optimal. Analisis mendalam mengenai dinamika komunikasi menunjukkan adanya kesinambungan yang konsisten antara ekspektasi pesan dengan respon kognitif audiens sasaran. Secara metodologis setiap indikator konstruk diuji melalui parameter reliabilitas komposit yang memenuhi batas keterandalan statistik secara optimal. Analisis mendalam mengenai dinamika komunikasi menunjukkan adanya kesinambungan yang konsisten antara ekspektasi pesan dengan respon kognitif audiens sasaran. Secara metodologis setiap indikator konstruk diuji melalui parameter reliabilitas komposit yang memenuhi batas keterandalan statistik secara optimal. Analisis mendalam mengenai dinamika komunikasi menunjukkan adanya kesinambungan yang konsisten antara ekspektasi pesan dengan respon kognitif audiens sasaran. Secara metodologis setiap indikator konstruk diuji melalui parameter reliabilitas komposit yang memenuhi batas keterandalan statistik secara optimal. Analisis mendalam mengenai dinamika komunikasi menunjukkan adanya kesinambungan yang konsisten antara ekspektasi pesan dengan respon kognitif audiens sasaran. Secara metodologis setiap indikator konstruk diuji melalui parameter reliabilitas komposit yang memenuhi batas keterandalan statistik secara optimal. Analisis mendalam mengenai dinamika komunikasi menunjukkan adanya kesinambungan yang konsisten antara ekspektasi pesan dengan respon kognitif audiens sasaran. Secara metodologis setiap indikator konstruk diuji melalui parameter reliabilitas komposit yang memenuhi batas keterandalan statistik secara optimal. Analisis mendalam mengenai dinamika komunikasi menunjukkan adanya kesinambungan yang konsisten antara ekspektasi pesan dengan respon kognitif audiens sasaran. Secara metodologis setiap indikator konstruk diuji melalui parameter reliabilitas komposit yang memenuhi batas keterandalan statistik secara optimal.</w:t>
       </w:r>
     </w:p>
     <w:p>
@@ -438,7 +438,7 @@
           <w:rFonts w:ascii="Times New Roman" w:hAnsi="Times New Roman"/>
           <w:sz w:val="24"/>
         </w:rPr>
-        <w:t>Analisis mendalam mengenai dinamika komunikasi menunjukkan adanya kesinambungan yang konsisten antara ekspektasi pesan dengan respon kognitif audiens sasaran. Secara metodologis setiap indikator konstruk diuji melalui parameter reliabilitas komposit yang memenuhi batas keterandalan statistik secara optimal. Analisis mendalam mengenai dinamika komunikasi menunjukkan adanya kesinambungan yang konsisten antara ekspektasi pesan dengan respon kognitif audiens sasaran. Secara metodologis setiap indikator konstruk diuji melalui parameter reliabilitas komposit yang memenuhi batas keterandalan statistik secara optimal. Analisis mendalam mengenai dinamika komunikasi menunjukkan adanya kesinambungan yang konsisten antara ekspektasi pesan dengan respon kognitif audiens sasaran. Secara metodologis setiap indikator konstruk diuji melalui parameter reliabilitas komposit yang memenuhi batas keterandalan statistik secara optimal. Analisis mendalam mengenai dinamika komunikasi menunjukkan adanya kesinambungan yang konsisten antara ekspektasi pesan dengan respon kognitif audiens sasaran. Secara metodologis setiap indikator konstruk diuji melalui parameter reliabilitas komposit yang memenuhi batas keterandalan statistik secara optimal. Analisis mendalam mengenai dinamika komunikasi menunjukkan adanya kesinambungan yang konsisten antara ekspektasi pesan dengan respon kognitif audiens sasaran. Secara metodologis setiap indikator konstruk diuji melalui parameter reliabilitas komposit yang memenuhi batas keterandalan statistik secara optimal. Analisis mendalam mengenai dinamika komunikasi menunjukkan adanya kesinambungan yang konsisten antara ekspektasi pesan dengan respon kognitif audiens sasaran. Secara metodologis setiap indikator konstruk diuji melalui parameter reliabilitas komposit yang memenuhi batas keterandalan statistik secara optimal. Analisis mendalam mengenai dinamika komunikasi menunjukkan adanya kesinambungan yang konsisten antara ekspektasi pesan dengan respon kognitif audiens sasaran. Secara metodologis setiap indikator konstruk diuji melalui parameter reliabilitas komposit yang memenuhi batas keterandalan statistik secara optimal. Analisis mendalam mengenai dinamika komunikasi menunjukkan adanya kesinambungan yang konsisten antara ekspektasi pesan dengan respon kognitif audiens sasaran. Secara metodologis setiap indikator konstruk diuji melalui parameter reliabilitas komposit yang memenuhi batas keterandalan statistik secara optimal. Analisis mendalam mengenai dinamika komunikasi menunjukkan adanya kesinambungan yang konsisten antara ekspektasi pesan dengan respon kognitif audiens sasaran. Secara metodologis setiap indikator konstruk diuji melalui parameter reliabilitas komposit yang memenuhi batas keterandalan statistik secara optimal. Analisis mendalam mengenai dinamika komunikasi menunjukkan adanya kesinambungan yang konsisten antara ekspektasi pesan dengan respon kognitif audiens sasaran. Secara metodologis setiap indikator konstruk diuji melalui parameter reliabilitas komposit yang memenuhi batas keterandalan statistik secara optimal. Analisis mendalam mengenai dinamika komunikasi menunjukkan adanya kesinambungan yang konsisten antara ekspektasi pesan dengan respon kognitif audiens sasaran. Secara metodologis setiap indikator konstruk diuji melalui parameter reliabilitas komposit yang memenuhi batas keterandalan statistik secara optimal. Analisis mendalam mengenai dinamika komunikasi menunjukkan adanya kesinambungan yang konsisten antara ekspektasi pesan dengan respon kognitif audiens sasaran. Secara metodologis setiap indikator konstruk diuji melalui parameter reliabilitas komposit yang memenuhi batas keterandalan statistik secara optimal. Analisis mendalam mengenai dinamika komunikasi menunjukkan adanya kesinambungan yang konsisten antara ekspektasi pesan dengan respon kognitif audiens sasaran. Secara metodologis setiap indikator konstruk diuji melalui parameter reliabilitas komposit yang memenuhi batas keterandalan statistik secara optimal. Analisis mendalam mengenai dinamika komunikasi menunjukkan adanya kesinambungan yang konsisten antara ekspektasi pesan dengan respon kognitif audiens sasaran. Secara metodologis setiap indikator konstruk diuji melalui parameter reliabilitas komposit yang memenuhi batas keterandalan statistik secara optimal. Analisis mendalam mengenai dinamika komunikasi menunjukkan adanya kesinambungan yang konsisten antara ekspektasi pesan dengan respon kognitif audiens sasaran. Secara metodologis setiap indikator konstruk diuji melalui parameter reliabilitas komposit yang memenuhi batas keterandalan statistik secara optimal.</w:t>
+        <w:t>Analisis mendalam mengenai dinamika komunikasi menunjukkan adanya kesinambungan yang konsisten antara ekspektasi pesan dengan respon kognitif audiens sasaran. Secara metodologis setiap indikator konstruk diuji melalui parameter reliabilitas komposit yang memenuhi batas keterandalan statistik secara optimal. Analisis mendalam mengenai dinamika komunikasi menunjukkan adanya kesinambungan yang konsisten antara ekspektasi pesan dengan respon kognitif audiens sasaran. Secara metodologis setiap indikator konstruk diuji melalui parameter reliabilitas komposit yang memenuhi batas keterandalan statistik secara optimal. Analisis mendalam mengenai dinamika komunikasi menunjukkan adanya kesinambungan yang konsisten antara ekspektasi pesan dengan respon kognitif audiens sasaran. Secara metodologis setiap indikator konstruk diuji melalui parameter reliabilitas komposit yang memenuhi batas keterandalan statistik secara optimal. Analisis mendalam mengenai dinamika komunikasi menunjukkan adanya kesinambungan yang konsisten antara ekspektasi pesan dengan respon kognitif audiens sasaran. Secara metodologis setiap indikator konstruk diuji melalui parameter reliabilitas komposit yang memenuhi batas keterandalan statistik secara optimal. Analisis mendalam mengenai dinamika komunikasi menunjukkan adanya kesinambungan yang konsisten antara ekspektasi pesan dengan respon kognitif audiens sasaran. Secara metodologis setiap indikator konstruk diuji melalui parameter reliabilitas komposit yang memenuhi batas keterandalan statistik secara optimal. Analisis mendalam mengenai dinamika komunikasi menunjukkan adanya kesinambungan yang konsisten antara ekspektasi pesan dengan respon kognitif audiens sasaran. Secara metodologis setiap indikator konstruk diuji melalui parameter reliabilitas komposit yang memenuhi batas keterandalan statistik secara optimal. Analisis mendalam mengenai dinamika komunikasi menunjukkan adanya kesinambungan yang konsisten antara ekspektasi pesan dengan respon kognitif audiens sasaran. Secara metodologis setiap indikator konstruk diuji melalui parameter reliabilitas komposit yang memenuhi batas keterandalan statistik secara optimal. Analisis mendalam mengenai dinamika komunikasi menunjukkan adanya kesinambungan yang konsisten antara ekspektasi pesan dengan respon kognitif audiens sasaran. Secara metodologis setiap indikator konstruk diuji melalui parameter reliabilitas komposit yang memenuhi batas keterandalan statistik secara optimal. Analisis mendalam mengenai dinamika komunikasi menunjukkan adanya kesinambungan yang konsisten antara ekspektasi pesan dengan respon kognitif audiens sasaran. Secara metodologis setiap indikator konstruk diuji melalui parameter reliabilitas komposit yang memenuhi batas keterandalan statistik secara optimal. Analisis mendalam mengenai dinamika komunikasi menunjukkan adanya kesinambungan yang konsisten antara ekspektasi pesan dengan respon kognitif audiens sasaran. Secara metodologis setiap indikator konstruk diuji melalui parameter reliabilitas komposit yang memenuhi batas keterandalan statistik secara optimal. Analisis mendalam mengenai dinamika komunikasi menunjukkan adanya kesinambungan yang konsisten antara ekspektasi pesan dengan respon kognitif audiens sasaran. Secara metodologis setiap indikator konstruk diuji melalui parameter reliabilitas komposit yang memenuhi batas keterandalan statistik secara optimal. Analisis mendalam mengenai dinamika komunikasi menunjukkan adanya kesinambungan yang konsisten antara ekspektasi pesan dengan respon kognitif audiens sasaran. Secara metodologis setiap indikator konstruk diuji melalui parameter reliabilitas komposit yang memenuhi batas keterandalan statistik secara optimal.</w:t>
       </w:r>
     </w:p>
     <w:p>
@@ -451,7 +451,7 @@
           <w:rFonts w:ascii="Times New Roman" w:hAnsi="Times New Roman"/>
           <w:sz w:val="24"/>
         </w:rPr>
-        <w:t>Analisis mendalam mengenai dinamika komunikasi menunjukkan adanya kesinambungan yang konsisten antara ekspektasi pesan dengan respon kognitif audiens sasaran. Secara metodologis setiap indikator konstruk diuji melalui parameter reliabilitas komposit yang memenuhi batas keterandalan statistik secara optimal. Analisis mendalam mengenai dinamika komunikasi menunjukkan adanya kesinambungan yang konsisten antara ekspektasi pesan dengan respon kognitif audiens sasaran. Secara metodologis setiap indikator konstruk diuji melalui parameter reliabilitas komposit yang memenuhi batas keterandalan statistik secara optimal. Analisis mendalam mengenai dinamika komunikasi menunjukkan adanya kesinambungan yang konsisten antara ekspektasi pesan dengan respon kognitif audiens sasaran. Secara metodologis setiap indikator konstruk diuji melalui parameter reliabilitas komposit yang memenuhi batas keterandalan statistik secara optimal. Analisis mendalam mengenai dinamika komunikasi menunjukkan adanya kesinambungan yang konsisten antara ekspektasi pesan dengan respon kognitif audiens sasaran. Secara metodologis setiap indikator konstruk diuji melalui parameter reliabilitas komposit yang memenuhi batas keterandalan statistik secara optimal. Analisis mendalam mengenai dinamika komunikasi menunjukkan adanya kesinambungan yang konsisten antara ekspektasi pesan dengan respon kognitif audiens sasaran. Secara metodologis setiap indikator konstruk diuji melalui parameter reliabilitas komposit yang memenuhi batas keterandalan statistik secara optimal. Analisis mendalam mengenai dinamika komunikasi menunjukkan adanya kesinambungan yang konsisten antara ekspektasi pesan dengan respon kognitif audiens sasaran. Secara metodologis setiap indikator konstruk diuji melalui parameter reliabilitas komposit yang memenuhi batas keterandalan statistik secara optimal. Analisis mendalam mengenai dinamika komunikasi menunjukkan adanya kesinambungan yang konsisten antara ekspektasi pesan dengan respon kognitif audiens sasaran. Secara metodologis setiap indikator konstruk diuji melalui parameter reliabilitas komposit yang memenuhi batas keterandalan statistik secara optimal. Analisis mendalam mengenai dinamika komunikasi menunjukkan adanya kesinambungan yang konsisten antara ekspektasi pesan dengan respon kognitif audiens sasaran. Secara metodologis setiap indikator konstruk diuji melalui parameter reliabilitas komposit yang memenuhi batas keterandalan statistik secara optimal. Analisis mendalam mengenai dinamika komunikasi menunjukkan adanya kesinambungan yang konsisten antara ekspektasi pesan dengan respon kognitif audiens sasaran. Secara metodologis setiap indikator konstruk diuji melalui parameter reliabilitas komposit yang memenuhi batas keterandalan statistik secara optimal. Analisis mendalam mengenai dinamika komunikasi menunjukkan adanya kesinambungan yang konsisten antara ekspektasi pesan dengan respon kognitif audiens sasaran. Secara metodologis setiap indikator konstruk diuji melalui parameter reliabilitas komposit yang memenuhi batas keterandalan statistik secara optimal. Analisis mendalam mengenai dinamika komunikasi menunjukkan adanya kesinambungan yang konsisten antara ekspektasi pesan dengan respon kognitif audiens sasaran. Secara metodologis setiap indikator konstruk diuji melalui parameter reliabilitas komposit yang memenuhi batas keterandalan statistik secara optimal. Analisis mendalam mengenai dinamika komunikasi menunjukkan adanya kesinambungan yang konsisten antara ekspektasi pesan dengan respon kognitif audiens sasaran. Secara metodologis setiap indikator konstruk diuji melalui parameter reliabilitas komposit yang memenuhi batas keterandalan statistik secara optimal. Analisis mendalam mengenai dinamika komunikasi menunjukkan adanya kesinambungan yang konsisten antara ekspektasi pesan dengan respon kognitif audiens sasaran. Secara metodologis setiap indikator konstruk diuji melalui parameter reliabilitas komposit yang memenuhi batas keterandalan statistik secara optimal. Analisis mendalam mengenai dinamika komunikasi menunjukkan adanya kesinambungan yang konsisten antara ekspektasi pesan dengan respon kognitif audiens sasaran. Secara metodologis setiap indikator konstruk diuji melalui parameter reliabilitas komposit yang memenuhi batas keterandalan statistik secara optimal. Analisis mendalam mengenai dinamika komunikasi menunjukkan adanya kesinambungan yang konsisten antara ekspektasi pesan dengan respon kognitif audiens sasaran. Secara metodologis setiap indikator konstruk diuji melalui parameter reliabilitas komposit yang memenuhi batas keterandalan statistik secara optimal.</w:t>
+        <w:t>Analisis mendalam mengenai dinamika komunikasi menunjukkan adanya kesinambungan yang konsisten antara ekspektasi pesan dengan respon kognitif audiens sasaran. Secara metodologis setiap indikator konstruk diuji melalui parameter reliabilitas komposit yang memenuhi batas keterandalan statistik secara optimal. Analisis mendalam mengenai dinamika komunikasi menunjukkan adanya kesinambungan yang konsisten antara ekspektasi pesan dengan respon kognitif audiens sasaran. Secara metodologis setiap indikator konstruk diuji melalui parameter reliabilitas komposit yang memenuhi batas keterandalan statistik secara optimal. Analisis mendalam mengenai dinamika komunikasi menunjukkan adanya kesinambungan yang konsisten antara ekspektasi pesan dengan respon kognitif audiens sasaran. Secara metodologis setiap indikator konstruk diuji melalui parameter reliabilitas komposit yang memenuhi batas keterandalan statistik secara optimal. Analisis mendalam mengenai dinamika komunikasi menunjukkan adanya kesinambungan yang konsisten antara ekspektasi pesan dengan respon kognitif audiens sasaran. Secara metodologis setiap indikator konstruk diuji melalui parameter reliabilitas komposit yang memenuhi batas keterandalan statistik secara optimal. Analisis mendalam mengenai dinamika komunikasi menunjukkan adanya kesinambungan yang konsisten antara ekspektasi pesan dengan respon kognitif audiens sasaran. Secara metodologis setiap indikator konstruk diuji melalui parameter reliabilitas komposit yang memenuhi batas keterandalan statistik secara optimal. Analisis mendalam mengenai dinamika komunikasi menunjukkan adanya kesinambungan yang konsisten antara ekspektasi pesan dengan respon kognitif audiens sasaran. Secara metodologis setiap indikator konstruk diuji melalui parameter reliabilitas komposit yang memenuhi batas keterandalan statistik secara optimal. Analisis mendalam mengenai dinamika komunikasi menunjukkan adanya kesinambungan yang konsisten antara ekspektasi pesan dengan respon kognitif audiens sasaran. Secara metodologis setiap indikator konstruk diuji melalui parameter reliabilitas komposit yang memenuhi batas keterandalan statistik secara optimal. Analisis mendalam mengenai dinamika komunikasi menunjukkan adanya kesinambungan yang konsisten antara ekspektasi pesan dengan respon kognitif audiens sasaran. Secara metodologis setiap indikator konstruk diuji melalui parameter reliabilitas komposit yang memenuhi batas keterandalan statistik secara optimal. Analisis mendalam mengenai dinamika komunikasi menunjukkan adanya kesinambungan yang konsisten antara ekspektasi pesan dengan respon kognitif audiens sasaran. Secara metodologis setiap indikator konstruk diuji melalui parameter reliabilitas komposit yang memenuhi batas keterandalan statistik secara optimal. Analisis mendalam mengenai dinamika komunikasi menunjukkan adanya kesinambungan yang konsisten antara ekspektasi pesan dengan respon kognitif audiens sasaran. Secara metodologis setiap indikator konstruk diuji melalui parameter reliabilitas komposit yang memenuhi batas keterandalan statistik secara optimal. Analisis mendalam mengenai dinamika komunikasi menunjukkan adanya kesinambungan yang konsisten antara ekspektasi pesan dengan respon kognitif audiens sasaran. Secara metodologis setiap indikator konstruk diuji melalui parameter reliabilitas komposit yang memenuhi batas keterandalan statistik secara optimal. Analisis mendalam mengenai dinamika komunikasi menunjukkan adanya kesinambungan yang konsisten antara ekspektasi pesan dengan respon kognitif audiens sasaran. Secara metodologis setiap indikator konstruk diuji melalui parameter reliabilitas komposit yang memenuhi batas keterandalan statistik secara optimal.</w:t>
       </w:r>
     </w:p>
     <w:p>
@@ -464,7 +464,7 @@
           <w:rFonts w:ascii="Times New Roman" w:hAnsi="Times New Roman"/>
           <w:sz w:val="24"/>
         </w:rPr>
-        <w:t>Analisis mendalam mengenai dinamika komunikasi menunjukkan adanya kesinambungan yang konsisten antara ekspektasi pesan dengan respon kognitif audiens sasaran. Secara metodologis setiap indikator konstruk diuji melalui parameter reliabilitas komposit yang memenuhi batas keterandalan statistik secara optimal. Analisis mendalam mengenai dinamika komunikasi menunjukkan adanya kesinambungan yang konsisten antara ekspektasi pesan dengan respon kognitif audiens sasaran. Secara metodologis setiap indikator konstruk diuji melalui parameter reliabilitas komposit yang memenuhi batas keterandalan statistik secara optimal. Analisis mendalam mengenai dinamika komunikasi menunjukkan adanya kesinambungan yang konsisten antara ekspektasi pesan dengan respon kognitif audiens sasaran. Secara metodologis setiap indikator konstruk diuji melalui parameter reliabilitas komposit yang memenuhi batas keterandalan statistik secara optimal. Analisis mendalam mengenai dinamika komunikasi menunjukkan adanya kesinambungan yang konsisten antara ekspektasi pesan dengan respon kognitif audiens sasaran. Secara metodologis setiap indikator konstruk diuji melalui parameter reliabilitas komposit yang memenuhi batas keterandalan statistik secara optimal. Analisis mendalam mengenai dinamika komunikasi menunjukkan adanya kesinambungan yang konsisten antara ekspektasi pesan dengan respon kognitif audiens sasaran. Secara metodologis setiap indikator konstruk diuji melalui parameter reliabilitas komposit yang memenuhi batas keterandalan statistik secara optimal. Analisis mendalam mengenai dinamika komunikasi menunjukkan adanya kesinambungan yang konsisten antara ekspektasi pesan dengan respon kognitif audiens sasaran. Secara metodologis setiap indikator konstruk diuji melalui parameter reliabilitas komposit yang memenuhi batas keterandalan statistik secara optimal. Analisis mendalam mengenai dinamika komunikasi menunjukkan adanya kesinambungan yang konsisten antara ekspektasi pesan dengan respon kognitif audiens sasaran. Secara metodologis setiap indikator konstruk diuji melalui parameter reliabilitas komposit yang memenuhi batas keterandalan statistik secara optimal. Analisis mendalam mengenai dinamika komunikasi menunjukkan adanya kesinambungan yang konsisten antara ekspektasi pesan dengan respon kognitif audiens sasaran. Secara metodologis setiap indikator konstruk diuji melalui parameter reliabilitas komposit yang memenuhi batas keterandalan statistik secara optimal. Analisis mendalam mengenai dinamika komunikasi menunjukkan adanya kesinambungan yang konsisten antara ekspektasi pesan dengan respon kognitif audiens sasaran. Secara metodologis setiap indikator konstruk diuji melalui parameter reliabilitas komposit yang memenuhi batas keterandalan statistik secara optimal. Analisis mendalam mengenai dinamika komunikasi menunjukkan adanya kesinambungan yang konsisten antara ekspektasi pesan dengan respon kognitif audiens sasaran. Secara metodologis setiap indikator konstruk diuji melalui parameter reliabilitas komposit yang memenuhi batas keterandalan statistik secara optimal. Analisis mendalam mengenai dinamika komunikasi menunjukkan adanya kesinambungan yang konsisten antara ekspektasi pesan dengan respon kognitif audiens sasaran. Secara metodologis setiap indikator konstruk diuji melalui parameter reliabilitas komposit yang memenuhi batas keterandalan statistik secara optimal. Analisis mendalam mengenai dinamika komunikasi menunjukkan adanya kesinambungan yang konsisten antara ekspektasi pesan dengan respon kognitif audiens sasaran. Secara metodologis setiap indikator konstruk diuji melalui parameter reliabilitas komposit yang memenuhi batas keterandalan statistik secara optimal. Analisis mendalam mengenai dinamika komunikasi menunjukkan adanya kesinambungan yang konsisten antara ekspektasi pesan dengan respon kognitif audiens sasaran. Secara metodologis setiap indikator konstruk diuji melalui parameter reliabilitas komposit yang memenuhi batas keterandalan statistik secara optimal. Analisis mendalam mengenai dinamika komunikasi menunjukkan adanya kesinambungan yang konsisten antara ekspektasi pesan dengan respon kognitif audiens sasaran. Secara metodologis setiap indikator konstruk diuji melalui parameter reliabilitas komposit yang memenuhi batas keterandalan statistik secara optimal. Analisis mendalam mengenai dinamika komunikasi menunjukkan adanya kesinambungan yang konsisten antara ekspektasi pesan dengan respon kognitif audiens sasaran. Secara metodologis setiap indikator konstruk diuji melalui parameter reliabilitas komposit yang memenuhi batas keterandalan statistik secara optimal.</w:t>
+        <w:t>Analisis mendalam mengenai dinamika komunikasi menunjukkan adanya kesinambungan yang konsisten antara ekspektasi pesan dengan respon kognitif audiens sasaran. Secara metodologis setiap indikator konstruk diuji melalui parameter reliabilitas komposit yang memenuhi batas keterandalan statistik secara optimal. Analisis mendalam mengenai dinamika komunikasi menunjukkan adanya kesinambungan yang konsisten antara ekspektasi pesan dengan respon kognitif audiens sasaran. Secara metodologis setiap indikator konstruk diuji melalui parameter reliabilitas komposit yang memenuhi batas keterandalan statistik secara optimal. Analisis mendalam mengenai dinamika komunikasi menunjukkan adanya kesinambungan yang konsisten antara ekspektasi pesan dengan respon kognitif audiens sasaran. Secara metodologis setiap indikator konstruk diuji melalui parameter reliabilitas komposit yang memenuhi batas keterandalan statistik secara optimal. Analisis mendalam mengenai dinamika komunikasi menunjukkan adanya kesinambungan yang konsisten antara ekspektasi pesan dengan respon kognitif audiens sasaran. Secara metodologis setiap indikator konstruk diuji melalui parameter reliabilitas komposit yang memenuhi batas keterandalan statistik secara optimal. Analisis mendalam mengenai dinamika komunikasi menunjukkan adanya kesinambungan yang konsisten antara ekspektasi pesan dengan respon kognitif audiens sasaran. Secara metodologis setiap indikator konstruk diuji melalui parameter reliabilitas komposit yang memenuhi batas keterandalan statistik secara optimal. Analisis mendalam mengenai dinamika komunikasi menunjukkan adanya kesinambungan yang konsisten antara ekspektasi pesan dengan respon kognitif audiens sasaran. Secara metodologis setiap indikator konstruk diuji melalui parameter reliabilitas komposit yang memenuhi batas keterandalan statistik secara optimal. Analisis mendalam mengenai dinamika komunikasi menunjukkan adanya kesinambungan yang konsisten antara ekspektasi pesan dengan respon kognitif audiens sasaran. Secara metodologis setiap indikator konstruk diuji melalui parameter reliabilitas komposit yang memenuhi batas keterandalan statistik secara optimal. Analisis mendalam mengenai dinamika komunikasi menunjukkan adanya kesinambungan yang konsisten antara ekspektasi pesan dengan respon kognitif audiens sasaran. Secara metodologis setiap indikator konstruk diuji melalui parameter reliabilitas komposit yang memenuhi batas keterandalan statistik secara optimal. Analisis mendalam mengenai dinamika komunikasi menunjukkan adanya kesinambungan yang konsisten antara ekspektasi pesan dengan respon kognitif audiens sasaran. Secara metodologis setiap indikator konstruk diuji melalui parameter reliabilitas komposit yang memenuhi batas keterandalan statistik secara optimal. Analisis mendalam mengenai dinamika komunikasi menunjukkan adanya kesinambungan yang konsisten antara ekspektasi pesan dengan respon kognitif audiens sasaran. Secara metodologis setiap indikator konstruk diuji melalui parameter reliabilitas komposit yang memenuhi batas keterandalan statistik secara optimal. Analisis mendalam mengenai dinamika komunikasi menunjukkan adanya kesinambungan yang konsisten antara ekspektasi pesan dengan respon kognitif audiens sasaran. Secara metodologis setiap indikator konstruk diuji melalui parameter reliabilitas komposit yang memenuhi batas keterandalan statistik secara optimal. Analisis mendalam mengenai dinamika komunikasi menunjukkan adanya kesinambungan yang konsisten antara ekspektasi pesan dengan respon kognitif audiens sasaran. Secara metodologis setiap indikator konstruk diuji melalui parameter reliabilitas komposit yang memenuhi batas keterandalan statistik secara optimal.</w:t>
       </w:r>
     </w:p>
     <w:p>
@@ -477,7 +477,7 @@
           <w:rFonts w:ascii="Times New Roman" w:hAnsi="Times New Roman"/>
           <w:sz w:val="24"/>
         </w:rPr>
-        <w:t>Analisis mendalam mengenai dinamika komunikasi menunjukkan adanya kesinambungan yang konsisten antara ekspektasi pesan dengan respon kognitif audiens sasaran. Secara metodologis setiap indikator konstruk diuji melalui parameter reliabilitas komposit yang memenuhi batas keterandalan statistik secara optimal. Analisis mendalam mengenai dinamika komunikasi menunjukkan adanya kesinambungan yang konsisten antara ekspektasi pesan dengan respon kognitif audiens sasaran. Secara metodologis setiap indikator konstruk diuji melalui parameter reliabilitas komposit yang memenuhi batas keterandalan statistik secara optimal. Analisis mendalam mengenai dinamika komunikasi menunjukkan adanya kesinambungan yang konsisten antara ekspektasi pesan dengan respon kognitif audiens sasaran. Secara metodologis setiap indikator konstruk diuji melalui parameter reliabilitas komposit yang memenuhi batas keterandalan statistik secara optimal. Analisis mendalam mengenai dinamika komunikasi menunjukkan adanya kesinambungan yang konsisten antara ekspektasi pesan dengan respon kognitif audiens sasaran. Secara metodologis setiap indikator konstruk diuji melalui parameter reliabilitas komposit yang memenuhi batas keterandalan statistik secara optimal. Analisis mendalam mengenai dinamika komunikasi menunjukkan adanya kesinambungan yang konsisten antara ekspektasi pesan dengan respon kognitif audiens sasaran. Secara metodologis setiap indikator konstruk diuji melalui parameter reliabilitas komposit yang memenuhi batas keterandalan statistik secara optimal. Analisis mendalam mengenai dinamika komunikasi menunjukkan adanya kesinambungan yang konsisten antara ekspektasi pesan dengan respon kognitif audiens sasaran. Secara metodologis setiap indikator konstruk diuji melalui parameter reliabilitas komposit yang memenuhi batas keterandalan statistik secara optimal. Analisis mendalam mengenai dinamika komunikasi menunjukkan adanya kesinambungan yang konsisten antara ekspektasi pesan dengan respon kognitif audiens sasaran. Secara metodologis setiap indikator konstruk diuji melalui parameter reliabilitas komposit yang memenuhi batas keterandalan statistik secara optimal. Analisis mendalam mengenai dinamika komunikasi menunjukkan adanya kesinambungan yang konsisten antara ekspektasi pesan dengan respon kognitif audiens sasaran. Secara metodologis setiap indikator konstruk diuji melalui parameter reliabilitas komposit yang memenuhi batas keterandalan statistik secara optimal. Analisis mendalam mengenai dinamika komunikasi menunjukkan adanya kesinambungan yang konsisten antara ekspektasi pesan dengan respon kognitif audiens sasaran. Secara metodologis setiap indikator konstruk diuji melalui parameter reliabilitas komposit yang memenuhi batas keterandalan statistik secara optimal. Analisis mendalam mengenai dinamika komunikasi menunjukkan adanya kesinambungan yang konsisten antara ekspektasi pesan dengan respon kognitif audiens sasaran. Secara metodologis setiap indikator konstruk diuji melalui parameter reliabilitas komposit yang memenuhi batas keterandalan statistik secara optimal. Analisis mendalam mengenai dinamika komunikasi menunjukkan adanya kesinambungan yang konsisten antara ekspektasi pesan dengan respon kognitif audiens sasaran. Secara metodologis setiap indikator konstruk diuji melalui parameter reliabilitas komposit yang memenuhi batas keterandalan statistik secara optimal. Analisis mendalam mengenai dinamika komunikasi menunjukkan adanya kesinambungan yang konsisten antara ekspektasi pesan dengan respon kognitif audiens sasaran. Secara metodologis setiap indikator konstruk diuji melalui parameter reliabilitas komposit yang memenuhi batas keterandalan statistik secara optimal. Analisis mendalam mengenai dinamika komunikasi menunjukkan adanya kesinambungan yang konsisten antara ekspektasi pesan dengan respon kognitif audiens sasaran. Secara metodologis setiap indikator konstruk diuji melalui parameter reliabilitas komposit yang memenuhi batas keterandalan statistik secara optimal. Analisis mendalam mengenai dinamika komunikasi menunjukkan adanya kesinambungan yang konsisten antara ekspektasi pesan dengan respon kognitif audiens sasaran. Secara metodologis setiap indikator konstruk diuji melalui parameter reliabilitas komposit yang memenuhi batas keterandalan statistik secara optimal. Analisis mendalam mengenai dinamika komunikasi menunjukkan adanya kesinambungan yang konsisten antara ekspektasi pesan dengan respon kognitif audiens sasaran. Secara metodologis setiap indikator konstruk diuji melalui parameter reliabilitas komposit yang memenuhi batas keterandalan statistik secara optimal.</w:t>
+        <w:t>Analisis mendalam mengenai dinamika komunikasi menunjukkan adanya kesinambungan yang konsisten antara ekspektasi pesan dengan respon kognitif audiens sasaran. Secara metodologis setiap indikator konstruk diuji melalui parameter reliabilitas komposit yang memenuhi batas keterandalan statistik secara optimal. Analisis mendalam mengenai dinamika komunikasi menunjukkan adanya kesinambungan yang konsisten antara ekspektasi pesan dengan respon kognitif audiens sasaran. Secara metodologis setiap indikator konstruk diuji melalui parameter reliabilitas komposit yang memenuhi batas keterandalan statistik secara optimal. Analisis mendalam mengenai dinamika komunikasi menunjukkan adanya kesinambungan yang konsisten antara ekspektasi pesan dengan respon kognitif audiens sasaran. Secara metodologis setiap indikator konstruk diuji melalui parameter reliabilitas komposit yang memenuhi batas keterandalan statistik secara optimal. Analisis mendalam mengenai dinamika komunikasi menunjukkan adanya kesinambungan yang konsisten antara ekspektasi pesan dengan respon kognitif audiens sasaran. Secara metodologis setiap indikator konstruk diuji melalui parameter reliabilitas komposit yang memenuhi batas keterandalan statistik secara optimal. Analisis mendalam mengenai dinamika komunikasi menunjukkan adanya kesinambungan yang konsisten antara ekspektasi pesan dengan respon kognitif audiens sasaran. Secara metodologis setiap indikator konstruk diuji melalui parameter reliabilitas komposit yang memenuhi batas keterandalan statistik secara optimal. Analisis mendalam mengenai dinamika komunikasi menunjukkan adanya kesinambungan yang konsisten antara ekspektasi pesan dengan respon kognitif audiens sasaran. Secara metodologis setiap indikator konstruk diuji melalui parameter reliabilitas komposit yang memenuhi batas keterandalan statistik secara optimal. Analisis mendalam mengenai dinamika komunikasi menunjukkan adanya kesinambungan yang konsisten antara ekspektasi pesan dengan respon kognitif audiens sasaran. Secara metodologis setiap indikator konstruk diuji melalui parameter reliabilitas komposit yang memenuhi batas keterandalan statistik secara optimal. Analisis mendalam mengenai dinamika komunikasi menunjukkan adanya kesinambungan yang konsisten antara ekspektasi pesan dengan respon kognitif audiens sasaran. Secara metodologis setiap indikator konstruk diuji melalui parameter reliabilitas komposit yang memenuhi batas keterandalan statistik secara optimal. Analisis mendalam mengenai dinamika komunikasi menunjukkan adanya kesinambungan yang konsisten antara ekspektasi pesan dengan respon kognitif audiens sasaran. Secara metodologis setiap indikator konstruk diuji melalui parameter reliabilitas komposit yang memenuhi batas keterandalan statistik secara optimal. Analisis mendalam mengenai dinamika komunikasi menunjukkan adanya kesinambungan yang konsisten antara ekspektasi pesan dengan respon kognitif audiens sasaran. Secara metodologis setiap indikator konstruk diuji melalui parameter reliabilitas komposit yang memenuhi batas keterandalan statistik secara optimal. Analisis mendalam mengenai dinamika komunikasi menunjukkan adanya kesinambungan yang konsisten antara ekspektasi pesan dengan respon kognitif audiens sasaran. Secara metodologis setiap indikator konstruk diuji melalui parameter reliabilitas komposit yang memenuhi batas keterandalan statistik secara optimal. Analisis mendalam mengenai dinamika komunikasi menunjukkan adanya kesinambungan yang konsisten antara ekspektasi pesan dengan respon kognitif audiens sasaran. Secara metodologis setiap indikator konstruk diuji melalui parameter reliabilitas komposit yang memenuhi batas keterandalan statistik secara optimal.</w:t>
       </w:r>
     </w:p>
     <w:p>
@@ -490,7 +490,7 @@
           <w:rFonts w:ascii="Times New Roman" w:hAnsi="Times New Roman"/>
           <w:sz w:val="24"/>
         </w:rPr>
-        <w:t>Analisis mendalam mengenai dinamika komunikasi menunjukkan adanya kesinambungan yang konsisten antara ekspektasi pesan dengan respon kognitif audiens sasaran. Secara metodologis setiap indikator konstruk diuji melalui parameter reliabilitas komposit yang memenuhi batas keterandalan statistik secara optimal. Analisis mendalam mengenai dinamika komunikasi menunjukkan adanya kesinambungan yang konsisten antara ekspektasi pesan dengan respon kognitif audiens sasaran. Secara metodologis setiap indikator konstruk diuji melalui parameter reliabilitas komposit yang memenuhi batas keterandalan statistik secara optimal. Analisis mendalam mengenai dinamika komunikasi menunjukkan adanya kesinambungan yang konsisten antara ekspektasi pesan dengan respon kognitif audiens sasaran. Secara metodologis setiap indikator konstruk diuji melalui parameter reliabilitas komposit yang memenuhi batas keterandalan statistik secara optimal. Analisis mendalam mengenai dinamika komunikasi menunjukkan adanya kesinambungan yang konsisten antara ekspektasi pesan dengan respon kognitif audiens sasaran. Secara metodologis setiap indikator konstruk diuji melalui parameter reliabilitas komposit yang memenuhi batas keterandalan statistik secara optimal. Analisis mendalam mengenai dinamika komunikasi menunjukkan adanya kesinambungan yang konsisten antara ekspektasi pesan dengan respon kognitif audiens sasaran. Secara metodologis setiap indikator konstruk diuji melalui parameter reliabilitas komposit yang memenuhi batas keterandalan statistik secara optimal. Analisis mendalam mengenai dinamika komunikasi menunjukkan adanya kesinambungan yang konsisten antara ekspektasi pesan dengan respon kognitif audiens sasaran. Secara metodologis setiap indikator konstruk diuji melalui parameter reliabilitas komposit yang memenuhi batas keterandalan statistik secara optimal. Analisis mendalam mengenai dinamika komunikasi menunjukkan adanya kesinambungan yang konsisten antara ekspektasi pesan dengan respon kognitif audiens sasaran. Secara metodologis setiap indikator konstruk diuji melalui parameter reliabilitas komposit yang memenuhi batas keterandalan statistik secara optimal. Analisis mendalam mengenai dinamika komunikasi menunjukkan adanya kesinambungan yang konsisten antara ekspektasi pesan dengan respon kognitif audiens sasaran. Secara metodologis setiap indikator konstruk diuji melalui parameter reliabilitas komposit yang memenuhi batas keterandalan statistik secara optimal. Analisis mendalam mengenai dinamika komunikasi menunjukkan adanya kesinambungan yang konsisten antara ekspektasi pesan dengan respon kognitif audiens sasaran. Secara metodologis setiap indikator konstruk diuji melalui parameter reliabilitas komposit yang memenuhi batas keterandalan statistik secara optimal. Analisis mendalam mengenai dinamika komunikasi menunjukkan adanya kesinambungan yang konsisten antara ekspektasi pesan dengan respon kognitif audiens sasaran. Secara metodologis setiap indikator konstruk diuji melalui parameter reliabilitas komposit yang memenuhi batas keterandalan statistik secara optimal. Analisis mendalam mengenai dinamika komunikasi menunjukkan adanya kesinambungan yang konsisten antara ekspektasi pesan dengan respon kognitif audiens sasaran. Secara metodologis setiap indikator konstruk diuji melalui parameter reliabilitas komposit yang memenuhi batas keterandalan statistik secara optimal. Analisis mendalam mengenai dinamika komunikasi menunjukkan adanya kesinambungan yang konsisten antara ekspektasi pesan dengan respon kognitif audiens sasaran. Secara metodologis setiap indikator konstruk diuji melalui parameter reliabilitas komposit yang memenuhi batas keterandalan statistik secara optimal. Analisis mendalam mengenai dinamika komunikasi menunjukkan adanya kesinambungan yang konsisten antara ekspektasi pesan dengan respon kognitif audiens sasaran. Secara metodologis setiap indikator konstruk diuji melalui parameter reliabilitas komposit yang memenuhi batas keterandalan statistik secara optimal. Analisis mendalam mengenai dinamika komunikasi menunjukkan adanya kesinambungan yang konsisten antara ekspektasi pesan dengan respon kognitif audiens sasaran. Secara metodologis setiap indikator konstruk diuji melalui parameter reliabilitas komposit yang memenuhi batas keterandalan statistik secara optimal. Analisis mendalam mengenai dinamika komunikasi menunjukkan adanya kesinambungan yang konsisten antara ekspektasi pesan dengan respon kognitif audiens sasaran. Secara metodologis setiap indikator konstruk diuji melalui parameter reliabilitas komposit yang memenuhi batas keterandalan statistik secara optimal.</w:t>
+        <w:t>Analisis mendalam mengenai dinamika komunikasi menunjukkan adanya kesinambungan yang konsisten antara ekspektasi pesan dengan respon kognitif audiens sasaran. Secara metodologis setiap indikator konstruk diuji melalui parameter reliabilitas komposit yang memenuhi batas keterandalan statistik secara optimal. Analisis mendalam mengenai dinamika komunikasi menunjukkan adanya kesinambungan yang konsisten antara ekspektasi pesan dengan respon kognitif audiens sasaran. Secara metodologis setiap indikator konstruk diuji melalui parameter reliabilitas komposit yang memenuhi batas keterandalan statistik secara optimal. Analisis mendalam mengenai dinamika komunikasi menunjukkan adanya kesinambungan yang konsisten antara ekspektasi pesan dengan respon kognitif audiens sasaran. Secara metodologis setiap indikator konstruk diuji melalui parameter reliabilitas komposit yang memenuhi batas keterandalan statistik secara optimal. Analisis mendalam mengenai dinamika komunikasi menunjukkan adanya kesinambungan yang konsisten antara ekspektasi pesan dengan respon kognitif audiens sasaran. Secara metodologis setiap indikator konstruk diuji melalui parameter reliabilitas komposit yang memenuhi batas keterandalan statistik secara optimal. Analisis mendalam mengenai dinamika komunikasi menunjukkan adanya kesinambungan yang konsisten antara ekspektasi pesan dengan respon kognitif audiens sasaran. Secara metodologis setiap indikator konstruk diuji melalui parameter reliabilitas komposit yang memenuhi batas keterandalan statistik secara optimal. Analisis mendalam mengenai dinamika komunikasi menunjukkan adanya kesinambungan yang konsisten antara ekspektasi pesan dengan respon kognitif audiens sasaran. Secara metodologis setiap indikator konstruk diuji melalui parameter reliabilitas komposit yang memenuhi batas keterandalan statistik secara optimal. Analisis mendalam mengenai dinamika komunikasi menunjukkan adanya kesinambungan yang konsisten antara ekspektasi pesan dengan respon kognitif audiens sasaran. Secara metodologis setiap indikator konstruk diuji melalui parameter reliabilitas komposit yang memenuhi batas keterandalan statistik secara optimal. Analisis mendalam mengenai dinamika komunikasi menunjukkan adanya kesinambungan yang konsisten antara ekspektasi pesan dengan respon kognitif audiens sasaran. Secara metodologis setiap indikator konstruk diuji melalui parameter reliabilitas komposit yang memenuhi batas keterandalan statistik secara optimal. Analisis mendalam mengenai dinamika komunikasi menunjukkan adanya kesinambungan yang konsisten antara ekspektasi pesan dengan respon kognitif audiens sasaran. Secara metodologis setiap indikator konstruk diuji melalui parameter reliabilitas komposit yang memenuhi batas keterandalan statistik secara optimal. Analisis mendalam mengenai dinamika komunikasi menunjukkan adanya kesinambungan yang konsisten antara ekspektasi pesan dengan respon kognitif audiens sasaran. Secara metodologis setiap indikator konstruk diuji melalui parameter reliabilitas komposit yang memenuhi batas keterandalan statistik secara optimal. Analisis mendalam mengenai dinamika komunikasi menunjukkan adanya kesinambungan yang konsisten antara ekspektasi pesan dengan respon kognitif audiens sasaran. Secara metodologis setiap indikator konstruk diuji melalui parameter reliabilitas komposit yang memenuhi batas keterandalan statistik secara optimal. Analisis mendalam mengenai dinamika komunikasi menunjukkan adanya kesinambungan yang konsisten antara ekspektasi pesan dengan respon kognitif audiens sasaran. Secara metodologis setiap indikator konstruk diuji melalui parameter reliabilitas komposit yang memenuhi batas keterandalan statistik secara optimal.</w:t>
       </w:r>
     </w:p>
     <w:p>
@@ -503,7 +503,7 @@
           <w:rFonts w:ascii="Times New Roman" w:hAnsi="Times New Roman"/>
           <w:sz w:val="24"/>
         </w:rPr>
-        <w:t>Analisis mendalam mengenai dinamika komunikasi menunjukkan adanya kesinambungan yang konsisten antara ekspektasi pesan dengan respon kognitif audiens sasaran. Secara metodologis setiap indikator konstruk diuji melalui parameter reliabilitas komposit yang memenuhi batas keterandalan statistik secara optimal. Analisis mendalam mengenai dinamika komunikasi menunjukkan adanya kesinambungan yang konsisten antara ekspektasi pesan dengan respon kognitif audiens sasaran. Secara metodologis setiap indikator konstruk diuji melalui parameter reliabilitas komposit yang memenuhi batas keterandalan statistik secara optimal. Analisis mendalam mengenai dinamika komunikasi menunjukkan adanya kesinambungan yang konsisten antara ekspektasi pesan dengan respon kognitif audiens sasaran. Secara metodologis setiap indikator konstruk diuji melalui parameter reliabilitas komposit yang memenuhi batas keterandalan statistik secara optimal. Analisis mendalam mengenai dinamika komunikasi menunjukkan adanya kesinambungan yang konsisten antara ekspektasi pesan dengan respon kognitif audiens sasaran. Secara metodologis setiap indikator konstruk diuji melalui parameter reliabilitas komposit yang memenuhi batas keterandalan statistik secara optimal. Analisis mendalam mengenai dinamika komunikasi menunjukkan adanya kesinambungan yang konsisten antara ekspektasi pesan dengan respon kognitif audiens sasaran. Secara metodologis setiap indikator konstruk diuji melalui parameter reliabilitas komposit yang memenuhi batas keterandalan statistik secara optimal. Analisis mendalam mengenai dinamika komunikasi menunjukkan adanya kesinambungan yang konsisten antara ekspektasi pesan dengan respon kognitif audiens sasaran. Secara metodologis setiap indikator konstruk diuji melalui parameter reliabilitas komposit yang memenuhi batas keterandalan statistik secara optimal. Analisis mendalam mengenai dinamika komunikasi menunjukkan adanya kesinambungan yang konsisten antara ekspektasi pesan dengan respon kognitif audiens sasaran. Secara metodologis setiap indikator konstruk diuji melalui parameter reliabilitas komposit yang memenuhi batas keterandalan statistik secara optimal. Analisis mendalam mengenai dinamika komunikasi menunjukkan adanya kesinambungan yang konsisten antara ekspektasi pesan dengan respon kognitif audiens sasaran. Secara metodologis setiap indikator konstruk diuji melalui parameter reliabilitas komposit yang memenuhi batas keterandalan statistik secara optimal. Analisis mendalam mengenai dinamika komunikasi menunjukkan adanya kesinambungan yang konsisten antara ekspektasi pesan dengan respon kognitif audiens sasaran. Secara metodologis setiap indikator konstruk diuji melalui parameter reliabilitas komposit yang memenuhi batas keterandalan statistik secara optimal. Analisis mendalam mengenai dinamika komunikasi menunjukkan adanya kesinambungan yang konsisten antara ekspektasi pesan dengan respon kognitif audiens sasaran. Secara metodologis setiap indikator konstruk diuji melalui parameter reliabilitas komposit yang memenuhi batas keterandalan statistik secara optimal. Analisis mendalam mengenai dinamika komunikasi menunjukkan adanya kesinambungan yang konsisten antara ekspektasi pesan dengan respon kognitif audiens sasaran. Secara metodologis setiap indikator konstruk diuji melalui parameter reliabilitas komposit yang memenuhi batas keterandalan statistik secara optimal. Analisis mendalam mengenai dinamika komunikasi menunjukkan adanya kesinambungan yang konsisten antara ekspektasi pesan dengan respon kognitif audiens sasaran. Secara metodologis setiap indikator konstruk diuji melalui parameter reliabilitas komposit yang memenuhi batas keterandalan statistik secara optimal. Analisis mendalam mengenai dinamika komunikasi menunjukkan adanya kesinambungan yang konsisten antara ekspektasi pesan dengan respon kognitif audiens sasaran. Secara metodologis setiap indikator konstruk diuji melalui parameter reliabilitas komposit yang memenuhi batas keterandalan statistik secara optimal. Analisis mendalam mengenai dinamika komunikasi menunjukkan adanya kesinambungan yang konsisten antara ekspektasi pesan dengan respon kognitif audiens sasaran. Secara metodologis setiap indikator konstruk diuji melalui parameter reliabilitas komposit yang memenuhi batas keterandalan statistik secara optimal. Analisis mendalam mengenai dinamika komunikasi menunjukkan adanya kesinambungan yang konsisten antara ekspektasi pesan dengan respon kognitif audiens sasaran. Secara metodologis setiap indikator konstruk diuji melalui parameter reliabilitas komposit yang memenuhi batas keterandalan statistik secara optimal.</w:t>
+        <w:t>Analisis mendalam mengenai dinamika komunikasi menunjukkan adanya kesinambungan yang konsisten antara ekspektasi pesan dengan respon kognitif audiens sasaran. Secara metodologis setiap indikator konstruk diuji melalui parameter reliabilitas komposit yang memenuhi batas keterandalan statistik secara optimal. Analisis mendalam mengenai dinamika komunikasi menunjukkan adanya kesinambungan yang konsisten antara ekspektasi pesan dengan respon kognitif audiens sasaran. Secara metodologis setiap indikator konstruk diuji melalui parameter reliabilitas komposit yang memenuhi batas keterandalan statistik secara optimal. Analisis mendalam mengenai dinamika komunikasi menunjukkan adanya kesinambungan yang konsisten antara ekspektasi pesan dengan respon kognitif audiens sasaran. Secara metodologis setiap indikator konstruk diuji melalui parameter reliabilitas komposit yang memenuhi batas keterandalan statistik secara optimal. Analisis mendalam mengenai dinamika komunikasi menunjukkan adanya kesinambungan yang konsisten antara ekspektasi pesan dengan respon kognitif audiens sasaran. Secara metodologis setiap indikator konstruk diuji melalui parameter reliabilitas komposit yang memenuhi batas keterandalan statistik secara optimal. Analisis mendalam mengenai dinamika komunikasi menunjukkan adanya kesinambungan yang konsisten antara ekspektasi pesan dengan respon kognitif audiens sasaran. Secara metodologis setiap indikator konstruk diuji melalui parameter reliabilitas komposit yang memenuhi batas keterandalan statistik secara optimal. Analisis mendalam mengenai dinamika komunikasi menunjukkan adanya kesinambungan yang konsisten antara ekspektasi pesan dengan respon kognitif audiens sasaran. Secara metodologis setiap indikator konstruk diuji melalui parameter reliabilitas komposit yang memenuhi batas keterandalan statistik secara optimal. Analisis mendalam mengenai dinamika komunikasi menunjukkan adanya kesinambungan yang konsisten antara ekspektasi pesan dengan respon kognitif audiens sasaran. Secara metodologis setiap indikator konstruk diuji melalui parameter reliabilitas komposit yang memenuhi batas keterandalan statistik secara optimal. Analisis mendalam mengenai dinamika komunikasi menunjukkan adanya kesinambungan yang konsisten antara ekspektasi pesan dengan respon kognitif audiens sasaran. Secara metodologis setiap indikator konstruk diuji melalui parameter reliabilitas komposit yang memenuhi batas keterandalan statistik secara optimal. Analisis mendalam mengenai dinamika komunikasi menunjukkan adanya kesinambungan yang konsisten antara ekspektasi pesan dengan respon kognitif audiens sasaran. Secara metodologis setiap indikator konstruk diuji melalui parameter reliabilitas komposit yang memenuhi batas keterandalan statistik secara optimal. Analisis mendalam mengenai dinamika komunikasi menunjukkan adanya kesinambungan yang konsisten antara ekspektasi pesan dengan respon kognitif audiens sasaran. Secara metodologis setiap indikator konstruk diuji melalui parameter reliabilitas komposit yang memenuhi batas keterandalan statistik secara optimal. Analisis mendalam mengenai dinamika komunikasi menunjukkan adanya kesinambungan yang konsisten antara ekspektasi pesan dengan respon kognitif audiens sasaran. Secara metodologis setiap indikator konstruk diuji melalui parameter reliabilitas komposit yang memenuhi batas keterandalan statistik secara optimal. Analisis mendalam mengenai dinamika komunikasi menunjukkan adanya kesinambungan yang konsisten antara ekspektasi pesan dengan respon kognitif audiens sasaran. Secara metodologis setiap indikator konstruk diuji melalui parameter reliabilitas komposit yang memenuhi batas keterandalan statistik secara optimal.</w:t>
       </w:r>
     </w:p>
     <w:p>
@@ -516,7 +516,7 @@
           <w:rFonts w:ascii="Times New Roman" w:hAnsi="Times New Roman"/>
           <w:sz w:val="24"/>
         </w:rPr>
-        <w:t>Analisis mendalam mengenai dinamika komunikasi menunjukkan adanya kesinambungan yang konsisten antara ekspektasi pesan dengan respon kognitif audiens sasaran. Secara metodologis setiap indikator konstruk diuji melalui parameter reliabilitas komposit yang memenuhi batas keterandalan statistik secara optimal. Analisis mendalam mengenai dinamika komunikasi menunjukkan adanya kesinambungan yang konsisten antara ekspektasi pesan dengan respon kognitif audiens sasaran. Secara metodologis setiap indikator konstruk diuji melalui parameter reliabilitas komposit yang memenuhi batas keterandalan statistik secara optimal. Analisis mendalam mengenai dinamika komunikasi menunjukkan adanya kesinambungan yang konsisten antara ekspektasi pesan dengan respon kognitif audiens sasaran. Secara metodologis setiap indikator konstruk diuji melalui parameter reliabilitas komposit yang memenuhi batas keterandalan statistik secara optimal. Analisis mendalam mengenai dinamika komunikasi menunjukkan adanya kesinambungan yang konsisten antara ekspektasi pesan dengan respon kognitif audiens sasaran. Secara metodologis setiap indikator konstruk diuji melalui parameter reliabilitas komposit yang memenuhi batas keterandalan statistik secara optimal. Analisis mendalam mengenai dinamika komunikasi menunjukkan adanya kesinambungan yang konsisten antara ekspektasi pesan dengan respon kognitif audiens sasaran. Secara metodologis setiap indikator konstruk diuji melalui parameter reliabilitas komposit yang memenuhi batas keterandalan statistik secara optimal. Analisis mendalam mengenai dinamika komunikasi menunjukkan adanya kesinambungan yang konsisten antara ekspektasi pesan dengan respon kognitif audiens sasaran. Secara metodologis setiap indikator konstruk diuji melalui parameter reliabilitas komposit yang memenuhi batas keterandalan statistik secara optimal. Analisis mendalam mengenai dinamika komunikasi menunjukkan adanya kesinambungan yang konsisten antara ekspektasi pesan dengan respon kognitif audiens sasaran. Secara metodologis setiap indikator konstruk diuji melalui parameter reliabilitas komposit yang memenuhi batas keterandalan statistik secara optimal. Analisis mendalam mengenai dinamika komunikasi menunjukkan adanya kesinambungan yang konsisten antara ekspektasi pesan dengan respon kognitif audiens sasaran. Secara metodologis setiap indikator konstruk diuji melalui parameter reliabilitas komposit yang memenuhi batas keterandalan statistik secara optimal. Analisis mendalam mengenai dinamika komunikasi menunjukkan adanya kesinambungan yang konsisten antara ekspektasi pesan dengan respon kognitif audiens sasaran. Secara metodologis setiap indikator konstruk diuji melalui parameter reliabilitas komposit yang memenuhi batas keterandalan statistik secara optimal. Analisis mendalam mengenai dinamika komunikasi menunjukkan adanya kesinambungan yang konsisten antara ekspektasi pesan dengan respon kognitif audiens sasaran. Secara metodologis setiap indikator konstruk diuji melalui parameter reliabilitas komposit yang memenuhi batas keterandalan statistik secara optimal. Analisis mendalam mengenai dinamika komunikasi menunjukkan adanya kesinambungan yang konsisten antara ekspektasi pesan dengan respon kognitif audiens sasaran. Secara metodologis setiap indikator konstruk diuji melalui parameter reliabilitas komposit yang memenuhi batas keterandalan statistik secara optimal. Analisis mendalam mengenai dinamika komunikasi menunjukkan adanya kesinambungan yang konsisten antara ekspektasi pesan dengan respon kognitif audiens sasaran. Secara metodologis setiap indikator konstruk diuji melalui parameter reliabilitas komposit yang memenuhi batas keterandalan statistik secara optimal. Analisis mendalam mengenai dinamika komunikasi menunjukkan adanya kesinambungan yang konsisten antara ekspektasi pesan dengan respon kognitif audiens sasaran. Secara metodologis setiap indikator konstruk diuji melalui parameter reliabilitas komposit yang memenuhi batas keterandalan statistik secara optimal. Analisis mendalam mengenai dinamika komunikasi menunjukkan adanya kesinambungan yang konsisten antara ekspektasi pesan dengan respon kognitif audiens sasaran. Secara metodologis setiap indikator konstruk diuji melalui parameter reliabilitas komposit yang memenuhi batas keterandalan statistik secara optimal. Analisis mendalam mengenai dinamika komunikasi menunjukkan adanya kesinambungan yang konsisten antara ekspektasi pesan dengan respon kognitif audiens sasaran. Secara metodologis setiap indikator konstruk diuji melalui parameter reliabilitas komposit yang memenuhi batas keterandalan statistik secara optimal.</w:t>
+        <w:t>Analisis mendalam mengenai dinamika komunikasi menunjukkan adanya kesinambungan yang konsisten antara ekspektasi pesan dengan respon kognitif audiens sasaran. Secara metodologis setiap indikator konstruk diuji melalui parameter reliabilitas komposit yang memenuhi batas keterandalan statistik secara optimal. Analisis mendalam mengenai dinamika komunikasi menunjukkan adanya kesinambungan yang konsisten antara ekspektasi pesan dengan respon kognitif audiens sasaran. Secara metodologis setiap indikator konstruk diuji melalui parameter reliabilitas komposit yang memenuhi batas keterandalan statistik secara optimal. Analisis mendalam mengenai dinamika komunikasi menunjukkan adanya kesinambungan yang konsisten antara ekspektasi pesan dengan respon kognitif audiens sasaran. Secara metodologis setiap indikator konstruk diuji melalui parameter reliabilitas komposit yang memenuhi batas keterandalan statistik secara optimal. Analisis mendalam mengenai dinamika komunikasi menunjukkan adanya kesinambungan yang konsisten antara ekspektasi pesan dengan respon kognitif audiens sasaran. Secara metodologis setiap indikator konstruk diuji melalui parameter reliabilitas komposit yang memenuhi batas keterandalan statistik secara optimal. Analisis mendalam mengenai dinamika komunikasi menunjukkan adanya kesinambungan yang konsisten antara ekspektasi pesan dengan respon kognitif audiens sasaran. Secara metodologis setiap indikator konstruk diuji melalui parameter reliabilitas komposit yang memenuhi batas keterandalan statistik secara optimal. Analisis mendalam mengenai dinamika komunikasi menunjukkan adanya kesinambungan yang konsisten antara ekspektasi pesan dengan respon kognitif audiens sasaran. Secara metodologis setiap indikator konstruk diuji melalui parameter reliabilitas komposit yang memenuhi batas keterandalan statistik secara optimal. Analisis mendalam mengenai dinamika komunikasi menunjukkan adanya kesinambungan yang konsisten antara ekspektasi pesan dengan respon kognitif audiens sasaran. Secara metodologis setiap indikator konstruk diuji melalui parameter reliabilitas komposit yang memenuhi batas keterandalan statistik secara optimal. Analisis mendalam mengenai dinamika komunikasi menunjukkan adanya kesinambungan yang konsisten antara ekspektasi pesan dengan respon kognitif audiens sasaran. Secara metodologis setiap indikator konstruk diuji melalui parameter reliabilitas komposit yang memenuhi batas keterandalan statistik secara optimal. Analisis mendalam mengenai dinamika komunikasi menunjukkan adanya kesinambungan yang konsisten antara ekspektasi pesan dengan respon kognitif audiens sasaran. Secara metodologis setiap indikator konstruk diuji melalui parameter reliabilitas komposit yang memenuhi batas keterandalan statistik secara optimal. Analisis mendalam mengenai dinamika komunikasi menunjukkan adanya kesinambungan yang konsisten antara ekspektasi pesan dengan respon kognitif audiens sasaran. Secara metodologis setiap indikator konstruk diuji melalui parameter reliabilitas komposit yang memenuhi batas keterandalan statistik secara optimal. Analisis mendalam mengenai dinamika komunikasi menunjukkan adanya kesinambungan yang konsisten antara ekspektasi pesan dengan respon kognitif audiens sasaran. Secara metodologis setiap indikator konstruk diuji melalui parameter reliabilitas komposit yang memenuhi batas keterandalan statistik secara optimal. Analisis mendalam mengenai dinamika komunikasi menunjukkan adanya kesinambungan yang konsisten antara ekspektasi pesan dengan respon kognitif audiens sasaran. Secara metodologis setiap indikator konstruk diuji melalui parameter reliabilitas komposit yang memenuhi batas keterandalan statistik secara optimal.</w:t>
       </w:r>
     </w:p>
     <w:p>
@@ -529,7 +529,7 @@
           <w:rFonts w:ascii="Times New Roman" w:hAnsi="Times New Roman"/>
           <w:sz w:val="24"/>
         </w:rPr>
-        <w:t>Analisis mendalam mengenai dinamika komunikasi menunjukkan adanya kesinambungan yang konsisten antara ekspektasi pesan dengan respon kognitif audiens sasaran. Secara metodologis setiap indikator konstruk diuji melalui parameter reliabilitas komposit yang memenuhi batas keterandalan statistik secara optimal. Analisis mendalam mengenai dinamika komunikasi menunjukkan adanya kesinambungan yang konsisten antara ekspektasi pesan dengan respon kognitif audiens sasaran. Secara metodologis setiap indikator konstruk diuji melalui parameter reliabilitas komposit yang memenuhi batas keterandalan statistik secara optimal. Analisis mendalam mengenai dinamika komunikasi menunjukkan adanya kesinambungan yang konsisten antara ekspektasi pesan dengan respon kognitif audiens sasaran. Secara metodologis setiap indikator konstruk diuji melalui parameter reliabilitas komposit yang memenuhi batas keterandalan statistik secara optimal. Analisis mendalam mengenai dinamika komunikasi menunjukkan adanya kesinambungan yang konsisten antara ekspektasi pesan dengan respon kognitif audiens sasaran. Secara metodologis setiap indikator konstruk diuji melalui parameter reliabilitas komposit yang memenuhi batas keterandalan statistik secara optimal. Analisis mendalam mengenai dinamika komunikasi menunjukkan adanya kesinambungan yang konsisten antara ekspektasi pesan dengan respon kognitif audiens sasaran. Secara metodologis setiap indikator konstruk diuji melalui parameter reliabilitas komposit yang memenuhi batas keterandalan statistik secara optimal. Analisis mendalam mengenai dinamika komunikasi menunjukkan adanya kesinambungan yang konsisten antara ekspektasi pesan dengan respon kognitif audiens sasaran. Secara metodologis setiap indikator konstruk diuji melalui parameter reliabilitas komposit yang memenuhi batas keterandalan statistik secara optimal. Analisis mendalam mengenai dinamika komunikasi menunjukkan adanya kesinambungan yang konsisten antara ekspektasi pesan dengan respon kognitif audiens sasaran. Secara metodologis setiap indikator konstruk diuji melalui parameter reliabilitas komposit yang memenuhi batas keterandalan statistik secara optimal. Analisis mendalam mengenai dinamika komunikasi menunjukkan adanya kesinambungan yang konsisten antara ekspektasi pesan dengan respon kognitif audiens sasaran. Secara metodologis setiap indikator konstruk diuji melalui parameter reliabilitas komposit yang memenuhi batas keterandalan statistik secara optimal. Analisis mendalam mengenai dinamika komunikasi menunjukkan adanya kesinambungan yang konsisten antara ekspektasi pesan dengan respon kognitif audiens sasaran. Secara metodologis setiap indikator konstruk diuji melalui parameter reliabilitas komposit yang memenuhi batas keterandalan statistik secara optimal. Analisis mendalam mengenai dinamika komunikasi menunjukkan adanya kesinambungan yang konsisten antara ekspektasi pesan dengan respon kognitif audiens sasaran. Secara metodologis setiap indikator konstruk diuji melalui parameter reliabilitas komposit yang memenuhi batas keterandalan statistik secara optimal. Analisis mendalam mengenai dinamika komunikasi menunjukkan adanya kesinambungan yang konsisten antara ekspektasi pesan dengan respon kognitif audiens sasaran. Secara metodologis setiap indikator konstruk diuji melalui parameter reliabilitas komposit yang memenuhi batas keterandalan statistik secara optimal. Analisis mendalam mengenai dinamika komunikasi menunjukkan adanya kesinambungan yang konsisten antara ekspektasi pesan dengan respon kognitif audiens sasaran. Secara metodologis setiap indikator konstruk diuji melalui parameter reliabilitas komposit yang memenuhi batas keterandalan statistik secara optimal. Analisis mendalam mengenai dinamika komunikasi menunjukkan adanya kesinambungan yang konsisten antara ekspektasi pesan dengan respon kognitif audiens sasaran. Secara metodologis setiap indikator konstruk diuji melalui parameter reliabilitas komposit yang memenuhi batas keterandalan statistik secara optimal. Analisis mendalam mengenai dinamika komunikasi menunjukkan adanya kesinambungan yang konsisten antara ekspektasi pesan dengan respon kognitif audiens sasaran. Secara metodologis setiap indikator konstruk diuji melalui parameter reliabilitas komposit yang memenuhi batas keterandalan statistik secara optimal. Analisis mendalam mengenai dinamika komunikasi menunjukkan adanya kesinambungan yang konsisten antara ekspektasi pesan dengan respon kognitif audiens sasaran. Secara metodologis setiap indikator konstruk diuji melalui parameter reliabilitas komposit yang memenuhi batas keterandalan statistik secara optimal.</w:t>
+        <w:t>Analisis mendalam mengenai dinamika komunikasi menunjukkan adanya kesinambungan yang konsisten antara ekspektasi pesan dengan respon kognitif audiens sasaran. Secara metodologis setiap indikator konstruk diuji melalui parameter reliabilitas komposit yang memenuhi batas keterandalan statistik secara optimal. Analisis mendalam mengenai dinamika komunikasi menunjukkan adanya kesinambungan yang konsisten antara ekspektasi pesan dengan respon kognitif audiens sasaran. Secara metodologis setiap indikator konstruk diuji melalui parameter reliabilitas komposit yang memenuhi batas keterandalan statistik secara optimal. Analisis mendalam mengenai dinamika komunikasi menunjukkan adanya kesinambungan yang konsisten antara ekspektasi pesan dengan respon kognitif audiens sasaran. Secara metodologis setiap indikator konstruk diuji melalui parameter reliabilitas komposit yang memenuhi batas keterandalan statistik secara optimal. Analisis mendalam mengenai dinamika komunikasi menunjukkan adanya kesinambungan yang konsisten antara ekspektasi pesan dengan respon kognitif audiens sasaran. Secara metodologis setiap indikator konstruk diuji melalui parameter reliabilitas komposit yang memenuhi batas keterandalan statistik secara optimal. Analisis mendalam mengenai dinamika komunikasi menunjukkan adanya kesinambungan yang konsisten antara ekspektasi pesan dengan respon kognitif audiens sasaran. Secara metodologis setiap indikator konstruk diuji melalui parameter reliabilitas komposit yang memenuhi batas keterandalan statistik secara optimal. Analisis mendalam mengenai dinamika komunikasi menunjukkan adanya kesinambungan yang konsisten antara ekspektasi pesan dengan respon kognitif audiens sasaran. Secara metodologis setiap indikator konstruk diuji melalui parameter reliabilitas komposit yang memenuhi batas keterandalan statistik secara optimal. Analisis mendalam mengenai dinamika komunikasi menunjukkan adanya kesinambungan yang konsisten antara ekspektasi pesan dengan respon kognitif audiens sasaran. Secara metodologis setiap indikator konstruk diuji melalui parameter reliabilitas komposit yang memenuhi batas keterandalan statistik secara optimal. Analisis mendalam mengenai dinamika komunikasi menunjukkan adanya kesinambungan yang konsisten antara ekspektasi pesan dengan respon kognitif audiens sasaran. Secara metodologis setiap indikator konstruk diuji melalui parameter reliabilitas komposit yang memenuhi batas keterandalan statistik secara optimal. Analisis mendalam mengenai dinamika komunikasi menunjukkan adanya kesinambungan yang konsisten antara ekspektasi pesan dengan respon kognitif audiens sasaran. Secara metodologis setiap indikator konstruk diuji melalui parameter reliabilitas komposit yang memenuhi batas keterandalan statistik secara optimal. Analisis mendalam mengenai dinamika komunikasi menunjukkan adanya kesinambungan yang konsisten antara ekspektasi pesan dengan respon kognitif audiens sasaran. Secara metodologis setiap indikator konstruk diuji melalui parameter reliabilitas komposit yang memenuhi batas keterandalan statistik secara optimal. Analisis mendalam mengenai dinamika komunikasi menunjukkan adanya kesinambungan yang konsisten antara ekspektasi pesan dengan respon kognitif audiens sasaran. Secara metodologis setiap indikator konstruk diuji melalui parameter reliabilitas komposit yang memenuhi batas keterandalan statistik secara optimal. Analisis mendalam mengenai dinamika komunikasi menunjukkan adanya kesinambungan yang konsisten antara ekspektasi pesan dengan respon kognitif audiens sasaran. Secara metodologis setiap indikator konstruk diuji melalui parameter reliabilitas komposit yang memenuhi batas keterandalan statistik secara optimal.</w:t>
       </w:r>
     </w:p>
     <w:p>
@@ -542,7 +542,7 @@
           <w:rFonts w:ascii="Times New Roman" w:hAnsi="Times New Roman"/>
           <w:sz w:val="24"/>
         </w:rPr>
-        <w:t>Analisis mendalam mengenai dinamika komunikasi menunjukkan adanya kesinambungan yang konsisten antara ekspektasi pesan dengan respon kognitif audiens sasaran. Secara metodologis setiap indikator konstruk diuji melalui parameter reliabilitas komposit yang memenuhi batas keterandalan statistik secara optimal. Analisis mendalam mengenai dinamika komunikasi menunjukkan adanya kesinambungan yang konsisten antara ekspektasi pesan dengan respon kognitif audiens sasaran. Secara metodologis setiap indikator konstruk diuji melalui parameter reliabilitas komposit yang memenuhi batas keterandalan statistik secara optimal. Analisis mendalam mengenai dinamika komunikasi menunjukkan adanya kesinambungan yang konsisten antara ekspektasi pesan dengan respon kognitif audiens sasaran. Secara metodologis setiap indikator konstruk diuji melalui parameter reliabilitas komposit yang memenuhi batas keterandalan statistik secara optimal. Analisis mendalam mengenai dinamika komunikasi menunjukkan adanya kesinambungan yang konsisten antara ekspektasi pesan dengan respon kognitif audiens sasaran. Secara metodologis setiap indikator konstruk diuji melalui parameter reliabilitas komposit yang memenuhi batas keterandalan statistik secara optimal. Analisis mendalam mengenai dinamika komunikasi menunjukkan adanya kesinambungan yang konsisten antara ekspektasi pesan dengan respon kognitif audiens sasaran. Secara metodologis setiap indikator konstruk diuji melalui parameter reliabilitas komposit yang memenuhi batas keterandalan statistik secara optimal. Analisis mendalam mengenai dinamika komunikasi menunjukkan adanya kesinambungan yang konsisten antara ekspektasi pesan dengan respon kognitif audiens sasaran. Secara metodologis setiap indikator konstruk diuji melalui parameter reliabilitas komposit yang memenuhi batas keterandalan statistik secara optimal. Analisis mendalam mengenai dinamika komunikasi menunjukkan adanya kesinambungan yang konsisten antara ekspektasi pesan dengan respon kognitif audiens sasaran. Secara metodologis setiap indikator konstruk diuji melalui parameter reliabilitas komposit yang memenuhi batas keterandalan statistik secara optimal. Analisis mendalam mengenai dinamika komunikasi menunjukkan adanya kesinambungan yang konsisten antara ekspektasi pesan dengan respon kognitif audiens sasaran. Secara metodologis setiap indikator konstruk diuji melalui parameter reliabilitas komposit yang memenuhi batas keterandalan statistik secara optimal. Analisis mendalam mengenai dinamika komunikasi menunjukkan adanya kesinambungan yang konsisten antara ekspektasi pesan dengan respon kognitif audiens sasaran. Secara metodologis setiap indikator konstruk diuji melalui parameter reliabilitas komposit yang memenuhi batas keterandalan statistik secara optimal. Analisis mendalam mengenai dinamika komunikasi menunjukkan adanya kesinambungan yang konsisten antara ekspektasi pesan dengan respon kognitif audiens sasaran. Secara metodologis setiap indikator konstruk diuji melalui parameter reliabilitas komposit yang memenuhi batas keterandalan statistik secara optimal. Analisis mendalam mengenai dinamika komunikasi menunjukkan adanya kesinambungan yang konsisten antara ekspektasi pesan dengan respon kognitif audiens sasaran. Secara metodologis setiap indikator konstruk diuji melalui parameter reliabilitas komposit yang memenuhi batas keterandalan statistik secara optimal. Analisis mendalam mengenai dinamika komunikasi menunjukkan adanya kesinambungan yang konsisten antara ekspektasi pesan dengan respon kognitif audiens sasaran. Secara metodologis setiap indikator konstruk diuji melalui parameter reliabilitas komposit yang memenuhi batas keterandalan statistik secara optimal. Analisis mendalam mengenai dinamika komunikasi menunjukkan adanya kesinambungan yang konsisten antara ekspektasi pesan dengan respon kognitif audiens sasaran. Secara metodologis setiap indikator konstruk diuji melalui parameter reliabilitas komposit yang memenuhi batas keterandalan statistik secara optimal. Analisis mendalam mengenai dinamika komunikasi menunjukkan adanya kesinambungan yang konsisten antara ekspektasi pesan dengan respon kognitif audiens sasaran. Secara metodologis setiap indikator konstruk diuji melalui parameter reliabilitas komposit yang memenuhi batas keterandalan statistik secara optimal. Analisis mendalam mengenai dinamika komunikasi menunjukkan adanya kesinambungan yang konsisten antara ekspektasi pesan dengan respon kognitif audiens sasaran. Secara metodologis setiap indikator konstruk diuji melalui parameter reliabilitas komposit yang memenuhi batas keterandalan statistik secara optimal.</w:t>
+        <w:t>Analisis mendalam mengenai dinamika komunikasi menunjukkan adanya kesinambungan yang konsisten antara ekspektasi pesan dengan respon kognitif audiens sasaran. Secara metodologis setiap indikator konstruk diuji melalui parameter reliabilitas komposit yang memenuhi batas keterandalan statistik secara optimal. Analisis mendalam mengenai dinamika komunikasi menunjukkan adanya kesinambungan yang konsisten antara ekspektasi pesan dengan respon kognitif audiens sasaran. Secara metodologis setiap indikator konstruk diuji melalui parameter reliabilitas komposit yang memenuhi batas keterandalan statistik secara optimal. Analisis mendalam mengenai dinamika komunikasi menunjukkan adanya kesinambungan yang konsisten antara ekspektasi pesan dengan respon kognitif audiens sasaran. Secara metodologis setiap indikator konstruk diuji melalui parameter reliabilitas komposit yang memenuhi batas keterandalan statistik secara optimal. Analisis mendalam mengenai dinamika komunikasi menunjukkan adanya kesinambungan yang konsisten antara ekspektasi pesan dengan respon kognitif audiens sasaran. Secara metodologis setiap indikator konstruk diuji melalui parameter reliabilitas komposit yang memenuhi batas keterandalan statistik secara optimal. Analisis mendalam mengenai dinamika komunikasi menunjukkan adanya kesinambungan yang konsisten antara ekspektasi pesan dengan respon kognitif audiens sasaran. Secara metodologis setiap indikator konstruk diuji melalui parameter reliabilitas komposit yang memenuhi batas keterandalan statistik secara optimal. Analisis mendalam mengenai dinamika komunikasi menunjukkan adanya kesinambungan yang konsisten antara ekspektasi pesan dengan respon kognitif audiens sasaran. Secara metodologis setiap indikator konstruk diuji melalui parameter reliabilitas komposit yang memenuhi batas keterandalan statistik secara optimal. Analisis mendalam mengenai dinamika komunikasi menunjukkan adanya kesinambungan yang konsisten antara ekspektasi pesan dengan respon kognitif audiens sasaran. Secara metodologis setiap indikator konstruk diuji melalui parameter reliabilitas komposit yang memenuhi batas keterandalan statistik secara optimal. Analisis mendalam mengenai dinamika komunikasi menunjukkan adanya kesinambungan yang konsisten antara ekspektasi pesan dengan respon kognitif audiens sasaran. Secara metodologis setiap indikator konstruk diuji melalui parameter reliabilitas komposit yang memenuhi batas keterandalan statistik secara optimal. Analisis mendalam mengenai dinamika komunikasi menunjukkan adanya kesinambungan yang konsisten antara ekspektasi pesan dengan respon kognitif audiens sasaran. Secara metodologis setiap indikator konstruk diuji melalui parameter reliabilitas komposit yang memenuhi batas keterandalan statistik secara optimal. Analisis mendalam mengenai dinamika komunikasi menunjukkan adanya kesinambungan yang konsisten antara ekspektasi pesan dengan respon kognitif audiens sasaran. Secara metodologis setiap indikator konstruk diuji melalui parameter reliabilitas komposit yang memenuhi batas keterandalan statistik secara optimal. Analisis mendalam mengenai dinamika komunikasi menunjukkan adanya kesinambungan yang konsisten antara ekspektasi pesan dengan respon kognitif audiens sasaran. Secara metodologis setiap indikator konstruk diuji melalui parameter reliabilitas komposit yang memenuhi batas keterandalan statistik secara optimal. Analisis mendalam mengenai dinamika komunikasi menunjukkan adanya kesinambungan yang konsisten antara ekspektasi pesan dengan respon kognitif audiens sasaran. Secara metodologis setiap indikator konstruk diuji melalui parameter reliabilitas komposit yang memenuhi batas keterandalan statistik secara optimal.</w:t>
       </w:r>
     </w:p>
     <w:p>
@@ -555,7 +555,7 @@
           <w:rFonts w:ascii="Times New Roman" w:hAnsi="Times New Roman"/>
           <w:sz w:val="24"/>
         </w:rPr>
-        <w:t>Analisis mendalam mengenai dinamika komunikasi menunjukkan adanya kesinambungan yang konsisten antara ekspektasi pesan dengan respon kognitif audiens sasaran. Secara metodologis setiap indikator konstruk diuji melalui parameter reliabilitas komposit yang memenuhi batas keterandalan statistik secara optimal. Analisis mendalam mengenai dinamika komunikasi menunjukkan adanya kesinambungan yang konsisten antara ekspektasi pesan dengan respon kognitif audiens sasaran. Secara metodologis setiap indikator konstruk diuji melalui parameter reliabilitas komposit yang memenuhi batas keterandalan statistik secara optimal. Analisis mendalam mengenai dinamika komunikasi menunjukkan adanya kesinambungan yang konsisten antara ekspektasi pesan dengan respon kognitif audiens sasaran. Secara metodologis setiap indikator konstruk diuji melalui parameter reliabilitas komposit yang memenuhi batas keterandalan statistik secara optimal. Analisis mendalam mengenai dinamika komunikasi menunjukkan adanya kesinambungan yang konsisten antara ekspektasi pesan dengan respon kognitif audiens sasaran. Secara metodologis setiap indikator konstruk diuji melalui parameter reliabilitas komposit yang memenuhi batas keterandalan statistik secara optimal. Analisis mendalam mengenai dinamika komunikasi menunjukkan adanya kesinambungan yang konsisten antara ekspektasi pesan dengan respon kognitif audiens sasaran. Secara metodologis setiap indikator konstruk diuji melalui parameter reliabilitas komposit yang memenuhi batas keterandalan statistik secara optimal. Analisis mendalam mengenai dinamika komunikasi menunjukkan adanya kesinambungan yang konsisten antara ekspektasi pesan dengan respon kognitif audiens sasaran. Secara metodologis setiap indikator konstruk diuji melalui parameter reliabilitas komposit yang memenuhi batas keterandalan statistik secara optimal. Analisis mendalam mengenai dinamika komunikasi menunjukkan adanya kesinambungan yang konsisten antara ekspektasi pesan dengan respon kognitif audiens sasaran. Secara metodologis setiap indikator konstruk diuji melalui parameter reliabilitas komposit yang memenuhi batas keterandalan statistik secara optimal. Analisis mendalam mengenai dinamika komunikasi menunjukkan adanya kesinambungan yang konsisten antara ekspektasi pesan dengan respon kognitif audiens sasaran. Secara metodologis setiap indikator konstruk diuji melalui parameter reliabilitas komposit yang memenuhi batas keterandalan statistik secara optimal. Analisis mendalam mengenai dinamika komunikasi menunjukkan adanya kesinambungan yang konsisten antara ekspektasi pesan dengan respon kognitif audiens sasaran. Secara metodologis setiap indikator konstruk diuji melalui parameter reliabilitas komposit yang memenuhi batas keterandalan statistik secara optimal. Analisis mendalam mengenai dinamika komunikasi menunjukkan adanya kesinambungan yang konsisten antara ekspektasi pesan dengan respon kognitif audiens sasaran. Secara metodologis setiap indikator konstruk diuji melalui parameter reliabilitas komposit yang memenuhi batas keterandalan statistik secara optimal. Analisis mendalam mengenai dinamika komunikasi menunjukkan adanya kesinambungan yang konsisten antara ekspektasi pesan dengan respon kognitif audiens sasaran. Secara metodologis setiap indikator konstruk diuji melalui parameter reliabilitas komposit yang memenuhi batas keterandalan statistik secara optimal. Analisis mendalam mengenai dinamika komunikasi menunjukkan adanya kesinambungan yang konsisten antara ekspektasi pesan dengan respon kognitif audiens sasaran. Secara metodologis setiap indikator konstruk diuji melalui parameter reliabilitas komposit yang memenuhi batas keterandalan statistik secara optimal. Analisis mendalam mengenai dinamika komunikasi menunjukkan adanya kesinambungan yang konsisten antara ekspektasi pesan dengan respon kognitif audiens sasaran. Secara metodologis setiap indikator konstruk diuji melalui parameter reliabilitas komposit yang memenuhi batas keterandalan statistik secara optimal. Analisis mendalam mengenai dinamika komunikasi menunjukkan adanya kesinambungan yang konsisten antara ekspektasi pesan dengan respon kognitif audiens sasaran. Secara metodologis setiap indikator konstruk diuji melalui parameter reliabilitas komposit yang memenuhi batas keterandalan statistik secara optimal. Analisis mendalam mengenai dinamika komunikasi menunjukkan adanya kesinambungan yang konsisten antara ekspektasi pesan dengan respon kognitif audiens sasaran. Secara metodologis setiap indikator konstruk diuji melalui parameter reliabilitas komposit yang memenuhi batas keterandalan statistik secara optimal.</w:t>
+        <w:t>Analisis mendalam mengenai dinamika komunikasi menunjukkan adanya kesinambungan yang konsisten antara ekspektasi pesan dengan respon kognitif audiens sasaran. Secara metodologis setiap indikator konstruk diuji melalui parameter reliabilitas komposit yang memenuhi batas keterandalan statistik secara optimal. Analisis mendalam mengenai dinamika komunikasi menunjukkan adanya kesinambungan yang konsisten antara ekspektasi pesan dengan respon kognitif audiens sasaran. Secara metodologis setiap indikator konstruk diuji melalui parameter reliabilitas komposit yang memenuhi batas keterandalan statistik secara optimal. Analisis mendalam mengenai dinamika komunikasi menunjukkan adanya kesinambungan yang konsisten antara ekspektasi pesan dengan respon kognitif audiens sasaran. Secara metodologis setiap indikator konstruk diuji melalui parameter reliabilitas komposit yang memenuhi batas keterandalan statistik secara optimal. Analisis mendalam mengenai dinamika komunikasi menunjukkan adanya kesinambungan yang konsisten antara ekspektasi pesan dengan respon kognitif audiens sasaran. Secara metodologis setiap indikator konstruk diuji melalui parameter reliabilitas komposit yang memenuhi batas keterandalan statistik secara optimal. Analisis mendalam mengenai dinamika komunikasi menunjukkan adanya kesinambungan yang konsisten antara ekspektasi pesan dengan respon kognitif audiens sasaran. Secara metodologis setiap indikator konstruk diuji melalui parameter reliabilitas komposit yang memenuhi batas keterandalan statistik secara optimal. Analisis mendalam mengenai dinamika komunikasi menunjukkan adanya kesinambungan yang konsisten antara ekspektasi pesan dengan respon kognitif audiens sasaran. Secara metodologis setiap indikator konstruk diuji melalui parameter reliabilitas komposit yang memenuhi batas keterandalan statistik secara optimal. Analisis mendalam mengenai dinamika komunikasi menunjukkan adanya kesinambungan yang konsisten antara ekspektasi pesan dengan respon kognitif audiens sasaran. Secara metodologis setiap indikator konstruk diuji melalui parameter reliabilitas komposit yang memenuhi batas keterandalan statistik secara optimal. Analisis mendalam mengenai dinamika komunikasi menunjukkan adanya kesinambungan yang konsisten antara ekspektasi pesan dengan respon kognitif audiens sasaran. Secara metodologis setiap indikator konstruk diuji melalui parameter reliabilitas komposit yang memenuhi batas keterandalan statistik secara optimal. Analisis mendalam mengenai dinamika komunikasi menunjukkan adanya kesinambungan yang konsisten antara ekspektasi pesan dengan respon kognitif audiens sasaran. Secara metodologis setiap indikator konstruk diuji melalui parameter reliabilitas komposit yang memenuhi batas keterandalan statistik secara optimal. Analisis mendalam mengenai dinamika komunikasi menunjukkan adanya kesinambungan yang konsisten antara ekspektasi pesan dengan respon kognitif audiens sasaran. Secara metodologis setiap indikator konstruk diuji melalui parameter reliabilitas komposit yang memenuhi batas keterandalan statistik secara optimal. Analisis mendalam mengenai dinamika komunikasi menunjukkan adanya kesinambungan yang konsisten antara ekspektasi pesan dengan respon kognitif audiens sasaran. Secara metodologis setiap indikator konstruk diuji melalui parameter reliabilitas komposit yang memenuhi batas keterandalan statistik secara optimal. Analisis mendalam mengenai dinamika komunikasi menunjukkan adanya kesinambungan yang konsisten antara ekspektasi pesan dengan respon kognitif audiens sasaran. Secara metodologis setiap indikator konstruk diuji melalui parameter reliabilitas komposit yang memenuhi batas keterandalan statistik secara optimal.</w:t>
       </w:r>
     </w:p>
     <w:p>
@@ -568,7 +568,7 @@
           <w:rFonts w:ascii="Times New Roman" w:hAnsi="Times New Roman"/>
           <w:sz w:val="24"/>
         </w:rPr>
-        <w:t>Analisis mendalam mengenai dinamika komunikasi menunjukkan adanya kesinambungan yang konsisten antara ekspektasi pesan dengan respon kognitif audiens sasaran. Secara metodologis setiap indikator konstruk diuji melalui parameter reliabilitas komposit yang memenuhi batas keterandalan statistik secara optimal. Analisis mendalam mengenai dinamika komunikasi menunjukkan adanya kesinambungan yang konsisten antara ekspektasi pesan dengan respon kognitif audiens sasaran. Secara metodologis setiap indikator konstruk diuji melalui parameter reliabilitas komposit yang memenuhi batas keterandalan statistik secara optimal. Analisis mendalam mengenai dinamika komunikasi menunjukkan adanya kesinambungan yang konsisten antara ekspektasi pesan dengan respon kognitif audiens sasaran. Secara metodologis setiap indikator konstruk diuji melalui parameter reliabilitas komposit yang memenuhi batas keterandalan statistik secara optimal. Analisis mendalam mengenai dinamika komunikasi menunjukkan adanya kesinambungan yang konsisten antara ekspektasi pesan dengan respon kognitif audiens sasaran. Secara metodologis setiap indikator konstruk diuji melalui parameter reliabilitas komposit yang memenuhi batas keterandalan statistik secara optimal. Analisis mendalam mengenai dinamika komunikasi menunjukkan adanya kesinambungan yang konsisten antara ekspektasi pesan dengan respon kognitif audiens sasaran. Secara metodologis setiap indikator konstruk diuji melalui parameter reliabilitas komposit yang memenuhi batas keterandalan statistik secara optimal. Analisis mendalam mengenai dinamika komunikasi menunjukkan adanya kesinambungan yang konsisten antara ekspektasi pesan dengan respon kognitif audiens sasaran. Secara metodologis setiap indikator konstruk diuji melalui parameter reliabilitas komposit yang memenuhi batas keterandalan statistik secara optimal. Analisis mendalam mengenai dinamika komunikasi menunjukkan adanya kesinambungan yang konsisten antara ekspektasi pesan dengan respon kognitif audiens sasaran. Secara metodologis setiap indikator konstruk diuji melalui parameter reliabilitas komposit yang memenuhi batas keterandalan statistik secara optimal. Analisis mendalam mengenai dinamika komunikasi menunjukkan adanya kesinambungan yang konsisten antara ekspektasi pesan dengan respon kognitif audiens sasaran. Secara metodologis setiap indikator konstruk diuji melalui parameter reliabilitas komposit yang memenuhi batas keterandalan statistik secara optimal. Analisis mendalam mengenai dinamika komunikasi menunjukkan adanya kesinambungan yang konsisten antara ekspektasi pesan dengan respon kognitif audiens sasaran. Secara metodologis setiap indikator konstruk diuji melalui parameter reliabilitas komposit yang memenuhi batas keterandalan statistik secara optimal. Analisis mendalam mengenai dinamika komunikasi menunjukkan adanya kesinambungan yang konsisten antara ekspektasi pesan dengan respon kognitif audiens sasaran. Secara metodologis setiap indikator konstruk diuji melalui parameter reliabilitas komposit yang memenuhi batas keterandalan statistik secara optimal. Analisis mendalam mengenai dinamika komunikasi menunjukkan adanya kesinambungan yang konsisten antara ekspektasi pesan dengan respon kognitif audiens sasaran. Secara metodologis setiap indikator konstruk diuji melalui parameter reliabilitas komposit yang memenuhi batas keterandalan statistik secara optimal. Analisis mendalam mengenai dinamika komunikasi menunjukkan adanya kesinambungan yang konsisten antara ekspektasi pesan dengan respon kognitif audiens sasaran. Secara metodologis setiap indikator konstruk diuji melalui parameter reliabilitas komposit yang memenuhi batas keterandalan statistik secara optimal. Analisis mendalam mengenai dinamika komunikasi menunjukkan adanya kesinambungan yang konsisten antara ekspektasi pesan dengan respon kognitif audiens sasaran. Secara metodologis setiap indikator konstruk diuji melalui parameter reliabilitas komposit yang memenuhi batas keterandalan statistik secara optimal. Analisis mendalam mengenai dinamika komunikasi menunjukkan adanya kesinambungan yang konsisten antara ekspektasi pesan dengan respon kognitif audiens sasaran. Secara metodologis setiap indikator konstruk diuji melalui parameter reliabilitas komposit yang memenuhi batas keterandalan statistik secara optimal. Analisis mendalam mengenai dinamika komunikasi menunjukkan adanya kesinambungan yang konsisten antara ekspektasi pesan dengan respon kognitif audiens sasaran. Secara metodologis setiap indikator konstruk diuji melalui parameter reliabilitas komposit yang memenuhi batas keterandalan statistik secara optimal.</w:t>
+        <w:t>Analisis mendalam mengenai dinamika komunikasi menunjukkan adanya kesinambungan yang konsisten antara ekspektasi pesan dengan respon kognitif audiens sasaran. Secara metodologis setiap indikator konstruk diuji melalui parameter reliabilitas komposit yang memenuhi batas keterandalan statistik secara optimal. Analisis mendalam mengenai dinamika komunikasi menunjukkan adanya kesinambungan yang konsisten antara ekspektasi pesan dengan respon kognitif audiens sasaran. Secara metodologis setiap indikator konstruk diuji melalui parameter reliabilitas komposit yang memenuhi batas keterandalan statistik secara optimal. Analisis mendalam mengenai dinamika komunikasi menunjukkan adanya kesinambungan yang konsisten antara ekspektasi pesan dengan respon kognitif audiens sasaran. Secara metodologis setiap indikator konstruk diuji melalui parameter reliabilitas komposit yang memenuhi batas keterandalan statistik secara optimal. Analisis mendalam mengenai dinamika komunikasi menunjukkan adanya kesinambungan yang konsisten antara ekspektasi pesan dengan respon kognitif audiens sasaran. Secara metodologis setiap indikator konstruk diuji melalui parameter reliabilitas komposit yang memenuhi batas keterandalan statistik secara optimal. Analisis mendalam mengenai dinamika komunikasi menunjukkan adanya kesinambungan yang konsisten antara ekspektasi pesan dengan respon kognitif audiens sasaran. Secara metodologis setiap indikator konstruk diuji melalui parameter reliabilitas komposit yang memenuhi batas keterandalan statistik secara optimal. Analisis mendalam mengenai dinamika komunikasi menunjukkan adanya kesinambungan yang konsisten antara ekspektasi pesan dengan respon kognitif audiens sasaran. Secara metodologis setiap indikator konstruk diuji melalui parameter reliabilitas komposit yang memenuhi batas keterandalan statistik secara optimal. Analisis mendalam mengenai dinamika komunikasi menunjukkan adanya kesinambungan yang konsisten antara ekspektasi pesan dengan respon kognitif audiens sasaran. Secara metodologis setiap indikator konstruk diuji melalui parameter reliabilitas komposit yang memenuhi batas keterandalan statistik secara optimal. Analisis mendalam mengenai dinamika komunikasi menunjukkan adanya kesinambungan yang konsisten antara ekspektasi pesan dengan respon kognitif audiens sasaran. Secara metodologis setiap indikator konstruk diuji melalui parameter reliabilitas komposit yang memenuhi batas keterandalan statistik secara optimal. Analisis mendalam mengenai dinamika komunikasi menunjukkan adanya kesinambungan yang konsisten antara ekspektasi pesan dengan respon kognitif audiens sasaran. Secara metodologis setiap indikator konstruk diuji melalui parameter reliabilitas komposit yang memenuhi batas keterandalan statistik secara optimal. Analisis mendalam mengenai dinamika komunikasi menunjukkan adanya kesinambungan yang konsisten antara ekspektasi pesan dengan respon kognitif audiens sasaran. Secara metodologis setiap indikator konstruk diuji melalui parameter reliabilitas komposit yang memenuhi batas keterandalan statistik secara optimal. Analisis mendalam mengenai dinamika komunikasi menunjukkan adanya kesinambungan yang konsisten antara ekspektasi pesan dengan respon kognitif audiens sasaran. Secara metodologis setiap indikator konstruk diuji melalui parameter reliabilitas komposit yang memenuhi batas keterandalan statistik secara optimal. Analisis mendalam mengenai dinamika komunikasi menunjukkan adanya kesinambungan yang konsisten antara ekspektasi pesan dengan respon kognitif audiens sasaran. Secara metodologis setiap indikator konstruk diuji melalui parameter reliabilitas komposit yang memenuhi batas keterandalan statistik secara optimal.</w:t>
       </w:r>
     </w:p>
     <w:p>
@@ -581,7 +581,7 @@
           <w:rFonts w:ascii="Times New Roman" w:hAnsi="Times New Roman"/>
           <w:sz w:val="24"/>
         </w:rPr>
-        <w:t>Analisis mendalam mengenai dinamika komunikasi menunjukkan adanya kesinambungan yang konsisten antara ekspektasi pesan dengan respon kognitif audiens sasaran. Secara metodologis setiap indikator konstruk diuji melalui parameter reliabilitas komposit yang memenuhi batas keterandalan statistik secara optimal. Analisis mendalam mengenai dinamika komunikasi menunjukkan adanya kesinambungan yang konsisten antara ekspektasi pesan dengan respon kognitif audiens sasaran. Secara metodologis setiap indikator konstruk diuji melalui parameter reliabilitas komposit yang memenuhi batas keterandalan statistik secara optimal. Analisis mendalam mengenai dinamika komunikasi menunjukkan adanya kesinambungan yang konsisten antara ekspektasi pesan dengan respon kognitif audiens sasaran. Secara metodologis setiap indikator konstruk diuji melalui parameter reliabilitas komposit yang memenuhi batas keterandalan statistik secara optimal. Analisis mendalam mengenai dinamika komunikasi menunjukkan adanya kesinambungan yang konsisten antara ekspektasi pesan dengan respon kognitif audiens sasaran. Secara metodologis setiap indikator konstruk diuji melalui parameter reliabilitas komposit yang memenuhi batas keterandalan statistik secara optimal. Analisis mendalam mengenai dinamika komunikasi menunjukkan adanya kesinambungan yang konsisten antara ekspektasi pesan dengan respon kognitif audiens sasaran. Secara metodologis setiap indikator konstruk diuji melalui parameter reliabilitas komposit yang memenuhi batas keterandalan statistik secara optimal. Analisis mendalam mengenai dinamika komunikasi menunjukkan adanya kesinambungan yang konsisten antara ekspektasi pesan dengan respon kognitif audiens sasaran. Secara metodologis setiap indikator konstruk diuji melalui parameter reliabilitas komposit yang memenuhi batas keterandalan statistik secara optimal. Analisis mendalam mengenai dinamika komunikasi menunjukkan adanya kesinambungan yang konsisten antara ekspektasi pesan dengan respon kognitif audiens sasaran. Secara metodologis setiap indikator konstruk diuji melalui parameter reliabilitas komposit yang memenuhi batas keterandalan statistik secara optimal. Analisis mendalam mengenai dinamika komunikasi menunjukkan adanya kesinambungan yang konsisten antara ekspektasi pesan dengan respon kognitif audiens sasaran. Secara metodologis setiap indikator konstruk diuji melalui parameter reliabilitas komposit yang memenuhi batas keterandalan statistik secara optimal. Analisis mendalam mengenai dinamika komunikasi menunjukkan adanya kesinambungan yang konsisten antara ekspektasi pesan dengan respon kognitif audiens sasaran. Secara metodologis setiap indikator konstruk diuji melalui parameter reliabilitas komposit yang memenuhi batas keterandalan statistik secara optimal. Analisis mendalam mengenai dinamika komunikasi menunjukkan adanya kesinambungan yang konsisten antara ekspektasi pesan dengan respon kognitif audiens sasaran. Secara metodologis setiap indikator konstruk diuji melalui parameter reliabilitas komposit yang memenuhi batas keterandalan statistik secara optimal. Analisis mendalam mengenai dinamika komunikasi menunjukkan adanya kesinambungan yang konsisten antara ekspektasi pesan dengan respon kognitif audiens sasaran. Secara metodologis setiap indikator konstruk diuji melalui parameter reliabilitas komposit yang memenuhi batas keterandalan statistik secara optimal. Analisis mendalam mengenai dinamika komunikasi menunjukkan adanya kesinambungan yang konsisten antara ekspektasi pesan dengan respon kognitif audiens sasaran. Secara metodologis setiap indikator konstruk diuji melalui parameter reliabilitas komposit yang memenuhi batas keterandalan statistik secara optimal. Analisis mendalam mengenai dinamika komunikasi menunjukkan adanya kesinambungan yang konsisten antara ekspektasi pesan dengan respon kognitif audiens sasaran. Secara metodologis setiap indikator konstruk diuji melalui parameter reliabilitas komposit yang memenuhi batas keterandalan statistik secara optimal. Analisis mendalam mengenai dinamika komunikasi menunjukkan adanya kesinambungan yang konsisten antara ekspektasi pesan dengan respon kognitif audiens sasaran. Secara metodologis setiap indikator konstruk diuji melalui parameter reliabilitas komposit yang memenuhi batas keterandalan statistik secara optimal. Analisis mendalam mengenai dinamika komunikasi menunjukkan adanya kesinambungan yang konsisten antara ekspektasi pesan dengan respon kognitif audiens sasaran. Secara metodologis setiap indikator konstruk diuji melalui parameter reliabilitas komposit yang memenuhi batas keterandalan statistik secara optimal.</w:t>
+        <w:t>Analisis mendalam mengenai dinamika komunikasi menunjukkan adanya kesinambungan yang konsisten antara ekspektasi pesan dengan respon kognitif audiens sasaran. Secara metodologis setiap indikator konstruk diuji melalui parameter reliabilitas komposit yang memenuhi batas keterandalan statistik secara optimal. Analisis mendalam mengenai dinamika komunikasi menunjukkan adanya kesinambungan yang konsisten antara ekspektasi pesan dengan respon kognitif audiens sasaran. Secara metodologis setiap indikator konstruk diuji melalui parameter reliabilitas komposit yang memenuhi batas keterandalan statistik secara optimal. Analisis mendalam mengenai dinamika komunikasi menunjukkan adanya kesinambungan yang konsisten antara ekspektasi pesan dengan respon kognitif audiens sasaran. Secara metodologis setiap indikator konstruk diuji melalui parameter reliabilitas komposit yang memenuhi batas keterandalan statistik secara optimal. Analisis mendalam mengenai dinamika komunikasi menunjukkan adanya kesinambungan yang konsisten antara ekspektasi pesan dengan respon kognitif audiens sasaran. Secara metodologis setiap indikator konstruk diuji melalui parameter reliabilitas komposit yang memenuhi batas keterandalan statistik secara optimal. Analisis mendalam mengenai dinamika komunikasi menunjukkan adanya kesinambungan yang konsisten antara ekspektasi pesan dengan respon kognitif audiens sasaran. Secara metodologis setiap indikator konstruk diuji melalui parameter reliabilitas komposit yang memenuhi batas keterandalan statistik secara optimal. Analisis mendalam mengenai dinamika komunikasi menunjukkan adanya kesinambungan yang konsisten antara ekspektasi pesan dengan respon kognitif audiens sasaran. Secara metodologis setiap indikator konstruk diuji melalui parameter reliabilitas komposit yang memenuhi batas keterandalan statistik secara optimal. Analisis mendalam mengenai dinamika komunikasi menunjukkan adanya kesinambungan yang konsisten antara ekspektasi pesan dengan respon kognitif audiens sasaran. Secara metodologis setiap indikator konstruk diuji melalui parameter reliabilitas komposit yang memenuhi batas keterandalan statistik secara optimal. Analisis mendalam mengenai dinamika komunikasi menunjukkan adanya kesinambungan yang konsisten antara ekspektasi pesan dengan respon kognitif audiens sasaran. Secara metodologis setiap indikator konstruk diuji melalui parameter reliabilitas komposit yang memenuhi batas keterandalan statistik secara optimal. Analisis mendalam mengenai dinamika komunikasi menunjukkan adanya kesinambungan yang konsisten antara ekspektasi pesan dengan respon kognitif audiens sasaran. Secara metodologis setiap indikator konstruk diuji melalui parameter reliabilitas komposit yang memenuhi batas keterandalan statistik secara optimal. Analisis mendalam mengenai dinamika komunikasi menunjukkan adanya kesinambungan yang konsisten antara ekspektasi pesan dengan respon kognitif audiens sasaran. Secara metodologis setiap indikator konstruk diuji melalui parameter reliabilitas komposit yang memenuhi batas keterandalan statistik secara optimal. Analisis mendalam mengenai dinamika komunikasi menunjukkan adanya kesinambungan yang konsisten antara ekspektasi pesan dengan respon kognitif audiens sasaran. Secara metodologis setiap indikator konstruk diuji melalui parameter reliabilitas komposit yang memenuhi batas keterandalan statistik secara optimal. Analisis mendalam mengenai dinamika komunikasi menunjukkan adanya kesinambungan yang konsisten antara ekspektasi pesan dengan respon kognitif audiens sasaran. Secara metodologis setiap indikator konstruk diuji melalui parameter reliabilitas komposit yang memenuhi batas keterandalan statistik secara optimal.</w:t>
       </w:r>
     </w:p>
     <w:p>
@@ -594,7 +594,7 @@
           <w:rFonts w:ascii="Times New Roman" w:hAnsi="Times New Roman"/>
           <w:sz w:val="24"/>
         </w:rPr>
-        <w:t>Analisis mendalam mengenai dinamika komunikasi menunjukkan adanya kesinambungan yang konsisten antara ekspektasi pesan dengan respon kognitif audiens sasaran. Secara metodologis setiap indikator konstruk diuji melalui parameter reliabilitas komposit yang memenuhi batas keterandalan statistik secara optimal. Analisis mendalam mengenai dinamika komunikasi menunjukkan adanya kesinambungan yang konsisten antara ekspektasi pesan dengan respon kognitif audiens sasaran. Secara metodologis setiap indikator konstruk diuji melalui parameter reliabilitas komposit yang memenuhi batas keterandalan statistik secara optimal. Analisis mendalam mengenai dinamika komunikasi menunjukkan adanya kesinambungan yang konsisten antara ekspektasi pesan dengan respon kognitif audiens sasaran. Secara metodologis setiap indikator konstruk diuji melalui parameter reliabilitas komposit yang memenuhi batas keterandalan statistik secara optimal. Analisis mendalam mengenai dinamika komunikasi menunjukkan adanya kesinambungan yang konsisten antara ekspektasi pesan dengan respon kognitif audiens sasaran. Secara metodologis setiap indikator konstruk diuji melalui parameter reliabilitas komposit yang memenuhi batas keterandalan statistik secara optimal. Analisis mendalam mengenai dinamika komunikasi menunjukkan adanya kesinambungan yang konsisten antara ekspektasi pesan dengan respon kognitif audiens sasaran. Secara metodologis setiap indikator konstruk diuji melalui parameter reliabilitas komposit yang memenuhi batas keterandalan statistik secara optimal. Analisis mendalam mengenai dinamika komunikasi menunjukkan adanya kesinambungan yang konsisten antara ekspektasi pesan dengan respon kognitif audiens sasaran. Secara metodologis setiap indikator konstruk diuji melalui parameter reliabilitas komposit yang memenuhi batas keterandalan statistik secara optimal. Analisis mendalam mengenai dinamika komunikasi menunjukkan adanya kesinambungan yang konsisten antara ekspektasi pesan dengan respon kognitif audiens sasaran. Secara metodologis setiap indikator konstruk diuji melalui parameter reliabilitas komposit yang memenuhi batas keterandalan statistik secara optimal. Analisis mendalam mengenai dinamika komunikasi menunjukkan adanya kesinambungan yang konsisten antara ekspektasi pesan dengan respon kognitif audiens sasaran. Secara metodologis setiap indikator konstruk diuji melalui parameter reliabilitas komposit yang memenuhi batas keterandalan statistik secara optimal. Analisis mendalam mengenai dinamika komunikasi menunjukkan adanya kesinambungan yang konsisten antara ekspektasi pesan dengan respon kognitif audiens sasaran. Secara metodologis setiap indikator konstruk diuji melalui parameter reliabilitas komposit yang memenuhi batas keterandalan statistik secara optimal. Analisis mendalam mengenai dinamika komunikasi menunjukkan adanya kesinambungan yang konsisten antara ekspektasi pesan dengan respon kognitif audiens sasaran. Secara metodologis setiap indikator konstruk diuji melalui parameter reliabilitas komposit yang memenuhi batas keterandalan statistik secara optimal. Analisis mendalam mengenai dinamika komunikasi menunjukkan adanya kesinambungan yang konsisten antara ekspektasi pesan dengan respon kognitif audiens sasaran. Secara metodologis setiap indikator konstruk diuji melalui parameter reliabilitas komposit yang memenuhi batas keterandalan statistik secara optimal. Analisis mendalam mengenai dinamika komunikasi menunjukkan adanya kesinambungan yang konsisten antara ekspektasi pesan dengan respon kognitif audiens sasaran. Secara metodologis setiap indikator konstruk diuji melalui parameter reliabilitas komposit yang memenuhi batas keterandalan statistik secara optimal. Analisis mendalam mengenai dinamika komunikasi menunjukkan adanya kesinambungan yang konsisten antara ekspektasi pesan dengan respon kognitif audiens sasaran. Secara metodologis setiap indikator konstruk diuji melalui parameter reliabilitas komposit yang memenuhi batas keterandalan statistik secara optimal. Analisis mendalam mengenai dinamika komunikasi menunjukkan adanya kesinambungan yang konsisten antara ekspektasi pesan dengan respon kognitif audiens sasaran. Secara metodologis setiap indikator konstruk diuji melalui parameter reliabilitas komposit yang memenuhi batas keterandalan statistik secara optimal. Analisis mendalam mengenai dinamika komunikasi menunjukkan adanya kesinambungan yang konsisten antara ekspektasi pesan dengan respon kognitif audiens sasaran. Secara metodologis setiap indikator konstruk diuji melalui parameter reliabilitas komposit yang memenuhi batas keterandalan statistik secara optimal.</w:t>
+        <w:t>Analisis mendalam mengenai dinamika komunikasi menunjukkan adanya kesinambungan yang konsisten antara ekspektasi pesan dengan respon kognitif audiens sasaran. Secara metodologis setiap indikator konstruk diuji melalui parameter reliabilitas komposit yang memenuhi batas keterandalan statistik secara optimal. Analisis mendalam mengenai dinamika komunikasi menunjukkan adanya kesinambungan yang konsisten antara ekspektasi pesan dengan respon kognitif audiens sasaran. Secara metodologis setiap indikator konstruk diuji melalui parameter reliabilitas komposit yang memenuhi batas keterandalan statistik secara optimal. Analisis mendalam mengenai dinamika komunikasi menunjukkan adanya kesinambungan yang konsisten antara ekspektasi pesan dengan respon kognitif audiens sasaran. Secara metodologis setiap indikator konstruk diuji melalui parameter reliabilitas komposit yang memenuhi batas keterandalan statistik secara optimal. Analisis mendalam mengenai dinamika komunikasi menunjukkan adanya kesinambungan yang konsisten antara ekspektasi pesan dengan respon kognitif audiens sasaran. Secara metodologis setiap indikator konstruk diuji melalui parameter reliabilitas komposit yang memenuhi batas keterandalan statistik secara optimal. Analisis mendalam mengenai dinamika komunikasi menunjukkan adanya kesinambungan yang konsisten antara ekspektasi pesan dengan respon kognitif audiens sasaran. Secara metodologis setiap indikator konstruk diuji melalui parameter reliabilitas komposit yang memenuhi batas keterandalan statistik secara optimal. Analisis mendalam mengenai dinamika komunikasi menunjukkan adanya kesinambungan yang konsisten antara ekspektasi pesan dengan respon kognitif audiens sasaran. Secara metodologis setiap indikator konstruk diuji melalui parameter reliabilitas komposit yang memenuhi batas keterandalan statistik secara optimal. Analisis mendalam mengenai dinamika komunikasi menunjukkan adanya kesinambungan yang konsisten antara ekspektasi pesan dengan respon kognitif audiens sasaran. Secara metodologis setiap indikator konstruk diuji melalui parameter reliabilitas komposit yang memenuhi batas keterandalan statistik secara optimal. Analisis mendalam mengenai dinamika komunikasi menunjukkan adanya kesinambungan yang konsisten antara ekspektasi pesan dengan respon kognitif audiens sasaran. Secara metodologis setiap indikator konstruk diuji melalui parameter reliabilitas komposit yang memenuhi batas keterandalan statistik secara optimal. Analisis mendalam mengenai dinamika komunikasi menunjukkan adanya kesinambungan yang konsisten antara ekspektasi pesan dengan respon kognitif audiens sasaran. Secara metodologis setiap indikator konstruk diuji melalui parameter reliabilitas komposit yang memenuhi batas keterandalan statistik secara optimal. Analisis mendalam mengenai dinamika komunikasi menunjukkan adanya kesinambungan yang konsisten antara ekspektasi pesan dengan respon kognitif audiens sasaran. Secara metodologis setiap indikator konstruk diuji melalui parameter reliabilitas komposit yang memenuhi batas keterandalan statistik secara optimal. Analisis mendalam mengenai dinamika komunikasi menunjukkan adanya kesinambungan yang konsisten antara ekspektasi pesan dengan respon kognitif audiens sasaran. Secara metodologis setiap indikator konstruk diuji melalui parameter reliabilitas komposit yang memenuhi batas keterandalan statistik secara optimal. Analisis mendalam mengenai dinamika komunikasi menunjukkan adanya kesinambungan yang konsisten antara ekspektasi pesan dengan respon kognitif audiens sasaran. Secara metodologis setiap indikator konstruk diuji melalui parameter reliabilitas komposit yang memenuhi batas keterandalan statistik secara optimal.</w:t>
       </w:r>
     </w:p>
     <w:p>
@@ -607,7 +607,7 @@
           <w:rFonts w:ascii="Times New Roman" w:hAnsi="Times New Roman"/>
           <w:sz w:val="24"/>
         </w:rPr>
-        <w:t>Analisis mendalam mengenai dinamika komunikasi menunjukkan adanya kesinambungan yang konsisten antara ekspektasi pesan dengan respon kognitif audiens sasaran. Secara metodologis setiap indikator konstruk diuji melalui parameter reliabilitas komposit yang memenuhi batas keterandalan statistik secara optimal. Analisis mendalam mengenai dinamika komunikasi menunjukkan adanya kesinambungan yang konsisten antara ekspektasi pesan dengan respon kognitif audiens sasaran. Secara metodologis setiap indikator konstruk diuji melalui parameter reliabilitas komposit yang memenuhi batas keterandalan statistik secara optimal. Analisis mendalam mengenai dinamika komunikasi menunjukkan adanya kesinambungan yang konsisten antara ekspektasi pesan dengan respon kognitif audiens sasaran. Secara metodologis setiap indikator konstruk diuji melalui parameter reliabilitas komposit yang memenuhi batas keterandalan statistik secara optimal. Analisis mendalam mengenai dinamika komunikasi menunjukkan adanya kesinambungan yang konsisten antara ekspektasi pesan dengan respon kognitif audiens sasaran. Secara metodologis setiap indikator konstruk diuji melalui parameter reliabilitas komposit yang memenuhi batas keterandalan statistik secara optimal. Analisis mendalam mengenai dinamika komunikasi menunjukkan adanya kesinambungan yang konsisten antara ekspektasi pesan dengan respon kognitif audiens sasaran. Secara metodologis setiap indikator konstruk diuji melalui parameter reliabilitas komposit yang memenuhi batas keterandalan statistik secara optimal. Analisis mendalam mengenai dinamika komunikasi menunjukkan adanya kesinambungan yang konsisten antara ekspektasi pesan dengan respon kognitif audiens sasaran. Secara metodologis setiap indikator konstruk diuji melalui parameter reliabilitas komposit yang memenuhi batas keterandalan statistik secara optimal. Analisis mendalam mengenai dinamika komunikasi menunjukkan adanya kesinambungan yang konsisten antara ekspektasi pesan dengan respon kognitif audiens sasaran. Secara metodologis setiap indikator konstruk diuji melalui parameter reliabilitas komposit yang memenuhi batas keterandalan statistik secara optimal. Analisis mendalam mengenai dinamika komunikasi menunjukkan adanya kesinambungan yang konsisten antara ekspektasi pesan dengan respon kognitif audiens sasaran. Secara metodologis setiap indikator konstruk diuji melalui parameter reliabilitas komposit yang memenuhi batas keterandalan statistik secara optimal. Analisis mendalam mengenai dinamika komunikasi menunjukkan adanya kesinambungan yang konsisten antara ekspektasi pesan dengan respon kognitif audiens sasaran. Secara metodologis setiap indikator konstruk diuji melalui parameter reliabilitas komposit yang memenuhi batas keterandalan statistik secara optimal. Analisis mendalam mengenai dinamika komunikasi menunjukkan adanya kesinambungan yang konsisten antara ekspektasi pesan dengan respon kognitif audiens sasaran. Secara metodologis setiap indikator konstruk diuji melalui parameter reliabilitas komposit yang memenuhi batas keterandalan statistik secara optimal. Analisis mendalam mengenai dinamika komunikasi menunjukkan adanya kesinambungan yang konsisten antara ekspektasi pesan dengan respon kognitif audiens sasaran. Secara metodologis setiap indikator konstruk diuji melalui parameter reliabilitas komposit yang memenuhi batas keterandalan statistik secara optimal. Analisis mendalam mengenai dinamika komunikasi menunjukkan adanya kesinambungan yang konsisten antara ekspektasi pesan dengan respon kognitif audiens sasaran. Secara metodologis setiap indikator konstruk diuji melalui parameter reliabilitas komposit yang memenuhi batas keterandalan statistik secara optimal. Analisis mendalam mengenai dinamika komunikasi menunjukkan adanya kesinambungan yang konsisten antara ekspektasi pesan dengan respon kognitif audiens sasaran. Secara metodologis setiap indikator konstruk diuji melalui parameter reliabilitas komposit yang memenuhi batas keterandalan statistik secara optimal. Analisis mendalam mengenai dinamika komunikasi menunjukkan adanya kesinambungan yang konsisten antara ekspektasi pesan dengan respon kognitif audiens sasaran. Secara metodologis setiap indikator konstruk diuji melalui parameter reliabilitas komposit yang memenuhi batas keterandalan statistik secara optimal. Analisis mendalam mengenai dinamika komunikasi menunjukkan adanya kesinambungan yang konsisten antara ekspektasi pesan dengan respon kognitif audiens sasaran. Secara metodologis setiap indikator konstruk diuji melalui parameter reliabilitas komposit yang memenuhi batas keterandalan statistik secara optimal.</w:t>
+        <w:t>Analisis mendalam mengenai dinamika komunikasi menunjukkan adanya kesinambungan yang konsisten antara ekspektasi pesan dengan respon kognitif audiens sasaran. Secara metodologis setiap indikator konstruk diuji melalui parameter reliabilitas komposit yang memenuhi batas keterandalan statistik secara optimal. Analisis mendalam mengenai dinamika komunikasi menunjukkan adanya kesinambungan yang konsisten antara ekspektasi pesan dengan respon kognitif audiens sasaran. Secara metodologis setiap indikator konstruk diuji melalui parameter reliabilitas komposit yang memenuhi batas keterandalan statistik secara optimal. Analisis mendalam mengenai dinamika komunikasi menunjukkan adanya kesinambungan yang konsisten antara ekspektasi pesan dengan respon kognitif audiens sasaran. Secara metodologis setiap indikator konstruk diuji melalui parameter reliabilitas komposit yang memenuhi batas keterandalan statistik secara optimal. Analisis mendalam mengenai dinamika komunikasi menunjukkan adanya kesinambungan yang konsisten antara ekspektasi pesan dengan respon kognitif audiens sasaran. Secara metodologis setiap indikator konstruk diuji melalui parameter reliabilitas komposit yang memenuhi batas keterandalan statistik secara optimal. Analisis mendalam mengenai dinamika komunikasi menunjukkan adanya kesinambungan yang konsisten antara ekspektasi pesan dengan respon kognitif audiens sasaran. Secara metodologis setiap indikator konstruk diuji melalui parameter reliabilitas komposit yang memenuhi batas keterandalan statistik secara optimal. Analisis mendalam mengenai dinamika komunikasi menunjukkan adanya kesinambungan yang konsisten antara ekspektasi pesan dengan respon kognitif audiens sasaran. Secara metodologis setiap indikator konstruk diuji melalui parameter reliabilitas komposit yang memenuhi batas keterandalan statistik secara optimal. Analisis mendalam mengenai dinamika komunikasi menunjukkan adanya kesinambungan yang konsisten antara ekspektasi pesan dengan respon kognitif audiens sasaran. Secara metodologis setiap indikator konstruk diuji melalui parameter reliabilitas komposit yang memenuhi batas keterandalan statistik secara optimal. Analisis mendalam mengenai dinamika komunikasi menunjukkan adanya kesinambungan yang konsisten antara ekspektasi pesan dengan respon kognitif audiens sasaran. Secara metodologis setiap indikator konstruk diuji melalui parameter reliabilitas komposit yang memenuhi batas keterandalan statistik secara optimal. Analisis mendalam mengenai dinamika komunikasi menunjukkan adanya kesinambungan yang konsisten antara ekspektasi pesan dengan respon kognitif audiens sasaran. Secara metodologis setiap indikator konstruk diuji melalui parameter reliabilitas komposit yang memenuhi batas keterandalan statistik secara optimal. Analisis mendalam mengenai dinamika komunikasi menunjukkan adanya kesinambungan yang konsisten antara ekspektasi pesan dengan respon kognitif audiens sasaran. Secara metodologis setiap indikator konstruk diuji melalui parameter reliabilitas komposit yang memenuhi batas keterandalan statistik secara optimal. Analisis mendalam mengenai dinamika komunikasi menunjukkan adanya kesinambungan yang konsisten antara ekspektasi pesan dengan respon kognitif audiens sasaran. Secara metodologis setiap indikator konstruk diuji melalui parameter reliabilitas komposit yang memenuhi batas keterandalan statistik secara optimal. Analisis mendalam mengenai dinamika komunikasi menunjukkan adanya kesinambungan yang konsisten antara ekspektasi pesan dengan respon kognitif audiens sasaran. Secara metodologis setiap indikator konstruk diuji melalui parameter reliabilitas komposit yang memenuhi batas keterandalan statistik secara optimal.</w:t>
       </w:r>
     </w:p>
     <w:p>
@@ -620,7 +620,7 @@
           <w:rFonts w:ascii="Times New Roman" w:hAnsi="Times New Roman"/>
           <w:sz w:val="24"/>
         </w:rPr>
-        <w:t>Analisis mendalam mengenai dinamika komunikasi menunjukkan adanya kesinambungan yang konsisten antara ekspektasi pesan dengan respon kognitif audiens sasaran. Secara metodologis setiap indikator konstruk diuji melalui parameter reliabilitas komposit yang memenuhi batas keterandalan statistik secara optimal. Analisis mendalam mengenai dinamika komunikasi menunjukkan adanya kesinambungan yang konsisten antara ekspektasi pesan dengan respon kognitif audiens sasaran. Secara metodologis setiap indikator konstruk diuji melalui parameter reliabilitas komposit yang memenuhi batas keterandalan statistik secara optimal. Analisis mendalam mengenai dinamika komunikasi menunjukkan adanya kesinambungan yang konsisten antara ekspektasi pesan dengan respon kognitif audiens sasaran. Secara metodologis setiap indikator konstruk diuji melalui parameter reliabilitas komposit yang memenuhi batas keterandalan statistik secara optimal. Analisis mendalam mengenai dinamika komunikasi menunjukkan adanya kesinambungan yang konsisten antara ekspektasi pesan dengan respon kognitif audiens sasaran. Secara metodologis setiap indikator konstruk diuji melalui parameter reliabilitas komposit yang memenuhi batas keterandalan statistik secara optimal. Analisis mendalam mengenai dinamika komunikasi menunjukkan adanya kesinambungan yang konsisten antara ekspektasi pesan dengan respon kognitif audiens sasaran. Secara metodologis setiap indikator konstruk diuji melalui parameter reliabilitas komposit yang memenuhi batas keterandalan statistik secara optimal. Analisis mendalam mengenai dinamika komunikasi menunjukkan adanya kesinambungan yang konsisten antara ekspektasi pesan dengan respon kognitif audiens sasaran. Secara metodologis setiap indikator konstruk diuji melalui parameter reliabilitas komposit yang memenuhi batas keterandalan statistik secara optimal. Analisis mendalam mengenai dinamika komunikasi menunjukkan adanya kesinambungan yang konsisten antara ekspektasi pesan dengan respon kognitif audiens sasaran. Secara metodologis setiap indikator konstruk diuji melalui parameter reliabilitas komposit yang memenuhi batas keterandalan statistik secara optimal. Analisis mendalam mengenai dinamika komunikasi menunjukkan adanya kesinambungan yang konsisten antara ekspektasi pesan dengan respon kognitif audiens sasaran. Secara metodologis setiap indikator konstruk diuji melalui parameter reliabilitas komposit yang memenuhi batas keterandalan statistik secara optimal. Analisis mendalam mengenai dinamika komunikasi menunjukkan adanya kesinambungan yang konsisten antara ekspektasi pesan dengan respon kognitif audiens sasaran. Secara metodologis setiap indikator konstruk diuji melalui parameter reliabilitas komposit yang memenuhi batas keterandalan statistik secara optimal. Analisis mendalam mengenai dinamika komunikasi menunjukkan adanya kesinambungan yang konsisten antara ekspektasi pesan dengan respon kognitif audiens sasaran. Secara metodologis setiap indikator konstruk diuji melalui parameter reliabilitas komposit yang memenuhi batas keterandalan statistik secara optimal. Analisis mendalam mengenai dinamika komunikasi menunjukkan adanya kesinambungan yang konsisten antara ekspektasi pesan dengan respon kognitif audiens sasaran. Secara metodologis setiap indikator konstruk diuji melalui parameter reliabilitas komposit yang memenuhi batas keterandalan statistik secara optimal. Analisis mendalam mengenai dinamika komunikasi menunjukkan adanya kesinambungan yang konsisten antara ekspektasi pesan dengan respon kognitif audiens sasaran. Secara metodologis setiap indikator konstruk diuji melalui parameter reliabilitas komposit yang memenuhi batas keterandalan statistik secara optimal. Analisis mendalam mengenai dinamika komunikasi menunjukkan adanya kesinambungan yang konsisten antara ekspektasi pesan dengan respon kognitif audiens sasaran. Secara metodologis setiap indikator konstruk diuji melalui parameter reliabilitas komposit yang memenuhi batas keterandalan statistik secara optimal. Analisis mendalam mengenai dinamika komunikasi menunjukkan adanya kesinambungan yang konsisten antara ekspektasi pesan dengan respon kognitif audiens sasaran. Secara metodologis setiap indikator konstruk diuji melalui parameter reliabilitas komposit yang memenuhi batas keterandalan statistik secara optimal. Analisis mendalam mengenai dinamika komunikasi menunjukkan adanya kesinambungan yang konsisten antara ekspektasi pesan dengan respon kognitif audiens sasaran. Secara metodologis setiap indikator konstruk diuji melalui parameter reliabilitas komposit yang memenuhi batas keterandalan statistik secara optimal.</w:t>
+        <w:t>Analisis mendalam mengenai dinamika komunikasi menunjukkan adanya kesinambungan yang konsisten antara ekspektasi pesan dengan respon kognitif audiens sasaran. Secara metodologis setiap indikator konstruk diuji melalui parameter reliabilitas komposit yang memenuhi batas keterandalan statistik secara optimal. Analisis mendalam mengenai dinamika komunikasi menunjukkan adanya kesinambungan yang konsisten antara ekspektasi pesan dengan respon kognitif audiens sasaran. Secara metodologis setiap indikator konstruk diuji melalui parameter reliabilitas komposit yang memenuhi batas keterandalan statistik secara optimal. Analisis mendalam mengenai dinamika komunikasi menunjukkan adanya kesinambungan yang konsisten antara ekspektasi pesan dengan respon kognitif audiens sasaran. Secara metodologis setiap indikator konstruk diuji melalui parameter reliabilitas komposit yang memenuhi batas keterandalan statistik secara optimal. Analisis mendalam mengenai dinamika komunikasi menunjukkan adanya kesinambungan yang konsisten antara ekspektasi pesan dengan respon kognitif audiens sasaran. Secara metodologis setiap indikator konstruk diuji melalui parameter reliabilitas komposit yang memenuhi batas keterandalan statistik secara optimal. Analisis mendalam mengenai dinamika komunikasi menunjukkan adanya kesinambungan yang konsisten antara ekspektasi pesan dengan respon kognitif audiens sasaran. Secara metodologis setiap indikator konstruk diuji melalui parameter reliabilitas komposit yang memenuhi batas keterandalan statistik secara optimal. Analisis mendalam mengenai dinamika komunikasi menunjukkan adanya kesinambungan yang konsisten antara ekspektasi pesan dengan respon kognitif audiens sasaran. Secara metodologis setiap indikator konstruk diuji melalui parameter reliabilitas komposit yang memenuhi batas keterandalan statistik secara optimal. Analisis mendalam mengenai dinamika komunikasi menunjukkan adanya kesinambungan yang konsisten antara ekspektasi pesan dengan respon kognitif audiens sasaran. Secara metodologis setiap indikator konstruk diuji melalui parameter reliabilitas komposit yang memenuhi batas keterandalan statistik secara optimal. Analisis mendalam mengenai dinamika komunikasi menunjukkan adanya kesinambungan yang konsisten antara ekspektasi pesan dengan respon kognitif audiens sasaran. Secara metodologis setiap indikator konstruk diuji melalui parameter reliabilitas komposit yang memenuhi batas keterandalan statistik secara optimal. Analisis mendalam mengenai dinamika komunikasi menunjukkan adanya kesinambungan yang konsisten antara ekspektasi pesan dengan respon kognitif audiens sasaran. Secara metodologis setiap indikator konstruk diuji melalui parameter reliabilitas komposit yang memenuhi batas keterandalan statistik secara optimal. Analisis mendalam mengenai dinamika komunikasi menunjukkan adanya kesinambungan yang konsisten antara ekspektasi pesan dengan respon kognitif audiens sasaran. Secara metodologis setiap indikator konstruk diuji melalui parameter reliabilitas komposit yang memenuhi batas keterandalan statistik secara optimal. Analisis mendalam mengenai dinamika komunikasi menunjukkan adanya kesinambungan yang konsisten antara ekspektasi pesan dengan respon kognitif audiens sasaran. Secara metodologis setiap indikator konstruk diuji melalui parameter reliabilitas komposit yang memenuhi batas keterandalan statistik secara optimal. Analisis mendalam mengenai dinamika komunikasi menunjukkan adanya kesinambungan yang konsisten antara ekspektasi pesan dengan respon kognitif audiens sasaran. Secara metodologis setiap indikator konstruk diuji melalui parameter reliabilitas komposit yang memenuhi batas keterandalan statistik secara optimal.</w:t>
       </w:r>
     </w:p>
     <w:p>
@@ -633,7 +633,7 @@
           <w:rFonts w:ascii="Times New Roman" w:hAnsi="Times New Roman"/>
           <w:sz w:val="24"/>
         </w:rPr>
-        <w:t>Analisis mendalam mengenai dinamika komunikasi menunjukkan adanya kesinambungan yang konsisten antara ekspektasi pesan dengan respon kognitif audiens sasaran. Secara metodologis setiap indikator konstruk diuji melalui parameter reliabilitas komposit yang memenuhi batas keterandalan statistik secara optimal. Analisis mendalam mengenai dinamika komunikasi menunjukkan adanya kesinambungan yang konsisten antara ekspektasi pesan dengan respon kognitif audiens sasaran. Secara metodologis setiap indikator konstruk diuji melalui parameter reliabilitas komposit yang memenuhi batas keterandalan statistik secara optimal. Analisis mendalam mengenai dinamika komunikasi menunjukkan adanya kesinambungan yang konsisten antara ekspektasi pesan dengan respon kognitif audiens sasaran. Secara metodologis setiap indikator konstruk diuji melalui parameter reliabilitas komposit yang memenuhi batas keterandalan statistik secara optimal. Analisis mendalam mengenai dinamika komunikasi menunjukkan adanya kesinambungan yang konsisten antara ekspektasi pesan dengan respon kognitif audiens sasaran. Secara metodologis setiap indikator konstruk diuji melalui parameter reliabilitas komposit yang memenuhi batas keterandalan statistik secara optimal. Analisis mendalam mengenai dinamika komunikasi menunjukkan adanya kesinambungan yang konsisten antara ekspektasi pesan dengan respon kognitif audiens sasaran. Secara metodologis setiap indikator konstruk diuji melalui parameter reliabilitas komposit yang memenuhi batas keterandalan statistik secara optimal. Analisis mendalam mengenai dinamika komunikasi menunjukkan adanya kesinambungan yang konsisten antara ekspektasi pesan dengan respon kognitif audiens sasaran. Secara metodologis setiap indikator konstruk diuji melalui parameter reliabilitas komposit yang memenuhi batas keterandalan statistik secara optimal. Analisis mendalam mengenai dinamika komunikasi menunjukkan adanya kesinambungan yang konsisten antara ekspektasi pesan dengan respon kognitif audiens sasaran. Secara metodologis setiap indikator konstruk diuji melalui parameter reliabilitas komposit yang memenuhi batas keterandalan statistik secara optimal. Analisis mendalam mengenai dinamika komunikasi menunjukkan adanya kesinambungan yang konsisten antara ekspektasi pesan dengan respon kognitif audiens sasaran. Secara metodologis setiap indikator konstruk diuji melalui parameter reliabilitas komposit yang memenuhi batas keterandalan statistik secara optimal. Analisis mendalam mengenai dinamika komunikasi menunjukkan adanya kesinambungan yang konsisten antara ekspektasi pesan dengan respon kognitif audiens sasaran. Secara metodologis setiap indikator konstruk diuji melalui parameter reliabilitas komposit yang memenuhi batas keterandalan statistik secara optimal. Analisis mendalam mengenai dinamika komunikasi menunjukkan adanya kesinambungan yang konsisten antara ekspektasi pesan dengan respon kognitif audiens sasaran. Secara metodologis setiap indikator konstruk diuji melalui parameter reliabilitas komposit yang memenuhi batas keterandalan statistik secara optimal. Analisis mendalam mengenai dinamika komunikasi menunjukkan adanya kesinambungan yang konsisten antara ekspektasi pesan dengan respon kognitif audiens sasaran. Secara metodologis setiap indikator konstruk diuji melalui parameter reliabilitas komposit yang memenuhi batas keterandalan statistik secara optimal. Analisis mendalam mengenai dinamika komunikasi menunjukkan adanya kesinambungan yang konsisten antara ekspektasi pesan dengan respon kognitif audiens sasaran. Secara metodologis setiap indikator konstruk diuji melalui parameter reliabilitas komposit yang memenuhi batas keterandalan statistik secara optimal. Analisis mendalam mengenai dinamika komunikasi menunjukkan adanya kesinambungan yang konsisten antara ekspektasi pesan dengan respon kognitif audiens sasaran. Secara metodologis setiap indikator konstruk diuji melalui parameter reliabilitas komposit yang memenuhi batas keterandalan statistik secara optimal. Analisis mendalam mengenai dinamika komunikasi menunjukkan adanya kesinambungan yang konsisten antara ekspektasi pesan dengan respon kognitif audiens sasaran. Secara metodologis setiap indikator konstruk diuji melalui parameter reliabilitas komposit yang memenuhi batas keterandalan statistik secara optimal. Analisis mendalam mengenai dinamika komunikasi menunjukkan adanya kesinambungan yang konsisten antara ekspektasi pesan dengan respon kognitif audiens sasaran. Secara metodologis setiap indikator konstruk diuji melalui parameter reliabilitas komposit yang memenuhi batas keterandalan statistik secara optimal.</w:t>
+        <w:t>Analisis mendalam mengenai dinamika komunikasi menunjukkan adanya kesinambungan yang konsisten antara ekspektasi pesan dengan respon kognitif audiens sasaran. Secara metodologis setiap indikator konstruk diuji melalui parameter reliabilitas komposit yang memenuhi batas keterandalan statistik secara optimal. Analisis mendalam mengenai dinamika komunikasi menunjukkan adanya kesinambungan yang konsisten antara ekspektasi pesan dengan respon kognitif audiens sasaran. Secara metodologis setiap indikator konstruk diuji melalui parameter reliabilitas komposit yang memenuhi batas keterandalan statistik secara optimal. Analisis mendalam mengenai dinamika komunikasi menunjukkan adanya kesinambungan yang konsisten antara ekspektasi pesan dengan respon kognitif audiens sasaran. Secara metodologis setiap indikator konstruk diuji melalui parameter reliabilitas komposit yang memenuhi batas keterandalan statistik secara optimal. Analisis mendalam mengenai dinamika komunikasi menunjukkan adanya kesinambungan yang konsisten antara ekspektasi pesan dengan respon kognitif audiens sasaran. Secara metodologis setiap indikator konstruk diuji melalui parameter reliabilitas komposit yang memenuhi batas keterandalan statistik secara optimal. Analisis mendalam mengenai dinamika komunikasi menunjukkan adanya kesinambungan yang konsisten antara ekspektasi pesan dengan respon kognitif audiens sasaran. Secara metodologis setiap indikator konstruk diuji melalui parameter reliabilitas komposit yang memenuhi batas keterandalan statistik secara optimal. Analisis mendalam mengenai dinamika komunikasi menunjukkan adanya kesinambungan yang konsisten antara ekspektasi pesan dengan respon kognitif audiens sasaran. Secara metodologis setiap indikator konstruk diuji melalui parameter reliabilitas komposit yang memenuhi batas keterandalan statistik secara optimal. Analisis mendalam mengenai dinamika komunikasi menunjukkan adanya kesinambungan yang konsisten antara ekspektasi pesan dengan respon kognitif audiens sasaran. Secara metodologis setiap indikator konstruk diuji melalui parameter reliabilitas komposit yang memenuhi batas keterandalan statistik secara optimal. Analisis mendalam mengenai dinamika komunikasi menunjukkan adanya kesinambungan yang konsisten antara ekspektasi pesan dengan respon kognitif audiens sasaran. Secara metodologis setiap indikator konstruk diuji melalui parameter reliabilitas komposit yang memenuhi batas keterandalan statistik secara optimal. Analisis mendalam mengenai dinamika komunikasi menunjukkan adanya kesinambungan yang konsisten antara ekspektasi pesan dengan respon kognitif audiens sasaran. Secara metodologis setiap indikator konstruk diuji melalui parameter reliabilitas komposit yang memenuhi batas keterandalan statistik secara optimal. Analisis mendalam mengenai dinamika komunikasi menunjukkan adanya kesinambungan yang konsisten antara ekspektasi pesan dengan respon kognitif audiens sasaran. Secara metodologis setiap indikator konstruk diuji melalui parameter reliabilitas komposit yang memenuhi batas keterandalan statistik secara optimal. Analisis mendalam mengenai dinamika komunikasi menunjukkan adanya kesinambungan yang konsisten antara ekspektasi pesan dengan respon kognitif audiens sasaran. Secara metodologis setiap indikator konstruk diuji melalui parameter reliabilitas komposit yang memenuhi batas keterandalan statistik secara optimal. Analisis mendalam mengenai dinamika komunikasi menunjukkan adanya kesinambungan yang konsisten antara ekspektasi pesan dengan respon kognitif audiens sasaran. Secara metodologis setiap indikator konstruk diuji melalui parameter reliabilitas komposit yang memenuhi batas keterandalan statistik secara optimal.</w:t>
       </w:r>
     </w:p>
     <w:p>
@@ -681,7 +681,7 @@
           <w:rFonts w:ascii="Times New Roman" w:hAnsi="Times New Roman"/>
           <w:sz w:val="24"/>
         </w:rPr>
-        <w:t>Analisis mendalam mengenai dinamika komunikasi menunjukkan adanya kesinambungan yang konsisten antara ekspektasi pesan dengan respon kognitif audiens sasaran. Secara metodologis setiap indikator konstruk diuji melalui parameter reliabilitas komposit yang memenuhi batas keterandalan statistik secara optimal. Analisis mendalam mengenai dinamika komunikasi menunjukkan adanya kesinambungan yang konsisten antara ekspektasi pesan dengan respon kognitif audiens sasaran. Secara metodologis setiap indikator konstruk diuji melalui parameter reliabilitas komposit yang memenuhi batas keterandalan statistik secara optimal. Analisis mendalam mengenai dinamika komunikasi menunjukkan adanya kesinambungan yang konsisten antara ekspektasi pesan dengan respon kognitif audiens sasaran. Secara metodologis setiap indikator konstruk diuji melalui parameter reliabilitas komposit yang memenuhi batas keterandalan statistik secara optimal. Analisis mendalam mengenai dinamika komunikasi menunjukkan adanya kesinambungan yang konsisten antara ekspektasi pesan dengan respon kognitif audiens sasaran. Secara metodologis setiap indikator konstruk diuji melalui parameter reliabilitas komposit yang memenuhi batas keterandalan statistik secara optimal. Analisis mendalam mengenai dinamika komunikasi menunjukkan adanya kesinambungan yang konsisten antara ekspektasi pesan dengan respon kognitif audiens sasaran. Secara metodologis setiap indikator konstruk diuji melalui parameter reliabilitas komposit yang memenuhi batas keterandalan statistik secara optimal. Analisis mendalam mengenai dinamika komunikasi menunjukkan adanya kesinambungan yang konsisten antara ekspektasi pesan dengan respon kognitif audiens sasaran. Secara metodologis setiap indikator konstruk diuji melalui parameter reliabilitas komposit yang memenuhi batas keterandalan statistik secara optimal. Analisis mendalam mengenai dinamika komunikasi menunjukkan adanya kesinambungan yang konsisten antara ekspektasi pesan dengan respon kognitif audiens sasaran. Secara metodologis setiap indikator konstruk diuji melalui parameter reliabilitas komposit yang memenuhi batas keterandalan statistik secara optimal. Analisis mendalam mengenai dinamika komunikasi menunjukkan adanya kesinambungan yang konsisten antara ekspektasi pesan dengan respon kognitif audiens sasaran. Secara metodologis setiap indikator konstruk diuji melalui parameter reliabilitas komposit yang memenuhi batas keterandalan statistik secara optimal. Analisis mendalam mengenai dinamika komunikasi menunjukkan adanya kesinambungan yang konsisten antara ekspektasi pesan dengan respon kognitif audiens sasaran. Secara metodologis setiap indikator konstruk diuji melalui parameter reliabilitas komposit yang memenuhi batas keterandalan statistik secara optimal. Analisis mendalam mengenai dinamika komunikasi menunjukkan adanya kesinambungan yang konsisten antara ekspektasi pesan dengan respon kognitif audiens sasaran. Secara metodologis setiap indikator konstruk diuji melalui parameter reliabilitas komposit yang memenuhi batas keterandalan statistik secara optimal. Analisis mendalam mengenai dinamika komunikasi menunjukkan adanya kesinambungan yang konsisten antara ekspektasi pesan dengan respon kognitif audiens sasaran. Secara metodologis setiap indikator konstruk diuji melalui parameter reliabilitas komposit yang memenuhi batas keterandalan statistik secara optimal. Analisis mendalam mengenai dinamika komunikasi menunjukkan adanya kesinambungan yang konsisten antara ekspektasi pesan dengan respon kognitif audiens sasaran. Secara metodologis setiap indikator konstruk diuji melalui parameter reliabilitas komposit yang memenuhi batas keterandalan statistik secara optimal. Analisis mendalam mengenai dinamika komunikasi menunjukkan adanya kesinambungan yang konsisten antara ekspektasi pesan dengan respon kognitif audiens sasaran. Secara metodologis setiap indikator konstruk diuji melalui parameter reliabilitas komposit yang memenuhi batas keterandalan statistik secara optimal. Analisis mendalam mengenai dinamika komunikasi menunjukkan adanya kesinambungan yang konsisten antara ekspektasi pesan dengan respon kognitif audiens sasaran. Secara metodologis setiap indikator konstruk diuji melalui parameter reliabilitas komposit yang memenuhi batas keterandalan statistik secara optimal. Analisis mendalam mengenai dinamika komunikasi menunjukkan adanya kesinambungan yang konsisten antara ekspektasi pesan dengan respon kognitif audiens sasaran. Secara metodologis setiap indikator konstruk diuji melalui parameter reliabilitas komposit yang memenuhi batas keterandalan statistik secara optimal.</w:t>
+        <w:t>Analisis mendalam mengenai dinamika komunikasi menunjukkan adanya kesinambungan yang konsisten antara ekspektasi pesan dengan respon kognitif audiens sasaran. Secara metodologis setiap indikator konstruk diuji melalui parameter reliabilitas komposit yang memenuhi batas keterandalan statistik secara optimal. Analisis mendalam mengenai dinamika komunikasi menunjukkan adanya kesinambungan yang konsisten antara ekspektasi pesan dengan respon kognitif audiens sasaran. Secara metodologis setiap indikator konstruk diuji melalui parameter reliabilitas komposit yang memenuhi batas keterandalan statistik secara optimal. Analisis mendalam mengenai dinamika komunikasi menunjukkan adanya kesinambungan yang konsisten antara ekspektasi pesan dengan respon kognitif audiens sasaran. Secara metodologis setiap indikator konstruk diuji melalui parameter reliabilitas komposit yang memenuhi batas keterandalan statistik secara optimal. Analisis mendalam mengenai dinamika komunikasi menunjukkan adanya kesinambungan yang konsisten antara ekspektasi pesan dengan respon kognitif audiens sasaran. Secara metodologis setiap indikator konstruk diuji melalui parameter reliabilitas komposit yang memenuhi batas keterandalan statistik secara optimal. Analisis mendalam mengenai dinamika komunikasi menunjukkan adanya kesinambungan yang konsisten antara ekspektasi pesan dengan respon kognitif audiens sasaran. Secara metodologis setiap indikator konstruk diuji melalui parameter reliabilitas komposit yang memenuhi batas keterandalan statistik secara optimal. Analisis mendalam mengenai dinamika komunikasi menunjukkan adanya kesinambungan yang konsisten antara ekspektasi pesan dengan respon kognitif audiens sasaran. Secara metodologis setiap indikator konstruk diuji melalui parameter reliabilitas komposit yang memenuhi batas keterandalan statistik secara optimal. Analisis mendalam mengenai dinamika komunikasi menunjukkan adanya kesinambungan yang konsisten antara ekspektasi pesan dengan respon kognitif audiens sasaran. Secara metodologis setiap indikator konstruk diuji melalui parameter reliabilitas komposit yang memenuhi batas keterandalan statistik secara optimal. Analisis mendalam mengenai dinamika komunikasi menunjukkan adanya kesinambungan yang konsisten antara ekspektasi pesan dengan respon kognitif audiens sasaran. Secara metodologis setiap indikator konstruk diuji melalui parameter reliabilitas komposit yang memenuhi batas keterandalan statistik secara optimal. Analisis mendalam mengenai dinamika komunikasi menunjukkan adanya kesinambungan yang konsisten antara ekspektasi pesan dengan respon kognitif audiens sasaran. Secara metodologis setiap indikator konstruk diuji melalui parameter reliabilitas komposit yang memenuhi batas keterandalan statistik secara optimal. Analisis mendalam mengenai dinamika komunikasi menunjukkan adanya kesinambungan yang konsisten antara ekspektasi pesan dengan respon kognitif audiens sasaran. Secara metodologis setiap indikator konstruk diuji melalui parameter reliabilitas komposit yang memenuhi batas keterandalan statistik secara optimal. Analisis mendalam mengenai dinamika komunikasi menunjukkan adanya kesinambungan yang konsisten antara ekspektasi pesan dengan respon kognitif audiens sasaran. Secara metodologis setiap indikator konstruk diuji melalui parameter reliabilitas komposit yang memenuhi batas keterandalan statistik secara optimal. Analisis mendalam mengenai dinamika komunikasi menunjukkan adanya kesinambungan yang konsisten antara ekspektasi pesan dengan respon kognitif audiens sasaran. Secara metodologis setiap indikator konstruk diuji melalui parameter reliabilitas komposit yang memenuhi batas keterandalan statistik secara optimal.</w:t>
       </w:r>
     </w:p>
     <w:p>
@@ -694,7 +694,7 @@
           <w:rFonts w:ascii="Times New Roman" w:hAnsi="Times New Roman"/>
           <w:sz w:val="24"/>
         </w:rPr>
-        <w:t>Analisis mendalam mengenai dinamika komunikasi menunjukkan adanya kesinambungan yang konsisten antara ekspektasi pesan dengan respon kognitif audiens sasaran. Secara metodologis setiap indikator konstruk diuji melalui parameter reliabilitas komposit yang memenuhi batas keterandalan statistik secara optimal. Analisis mendalam mengenai dinamika komunikasi menunjukkan adanya kesinambungan yang konsisten antara ekspektasi pesan dengan respon kognitif audiens sasaran. Secara metodologis setiap indikator konstruk diuji melalui parameter reliabilitas komposit yang memenuhi batas keterandalan statistik secara optimal. Analisis mendalam mengenai dinamika komunikasi menunjukkan adanya kesinambungan yang konsisten antara ekspektasi pesan dengan respon kognitif audiens sasaran. Secara metodologis setiap indikator konstruk diuji melalui parameter reliabilitas komposit yang memenuhi batas keterandalan statistik secara optimal. Analisis mendalam mengenai dinamika komunikasi menunjukkan adanya kesinambungan yang konsisten antara ekspektasi pesan dengan respon kognitif audiens sasaran. Secara metodologis setiap indikator konstruk diuji melalui parameter reliabilitas komposit yang memenuhi batas keterandalan statistik secara optimal. Analisis mendalam mengenai dinamika komunikasi menunjukkan adanya kesinambungan yang konsisten antara ekspektasi pesan dengan respon kognitif audiens sasaran. Secara metodologis setiap indikator konstruk diuji melalui parameter reliabilitas komposit yang memenuhi batas keterandalan statistik secara optimal. Analisis mendalam mengenai dinamika komunikasi menunjukkan adanya kesinambungan yang konsisten antara ekspektasi pesan dengan respon kognitif audiens sasaran. Secara metodologis setiap indikator konstruk diuji melalui parameter reliabilitas komposit yang memenuhi batas keterandalan statistik secara optimal. Analisis mendalam mengenai dinamika komunikasi menunjukkan adanya kesinambungan yang konsisten antara ekspektasi pesan dengan respon kognitif audiens sasaran. Secara metodologis setiap indikator konstruk diuji melalui parameter reliabilitas komposit yang memenuhi batas keterandalan statistik secara optimal. Analisis mendalam mengenai dinamika komunikasi menunjukkan adanya kesinambungan yang konsisten antara ekspektasi pesan dengan respon kognitif audiens sasaran. Secara metodologis setiap indikator konstruk diuji melalui parameter reliabilitas komposit yang memenuhi batas keterandalan statistik secara optimal. Analisis mendalam mengenai dinamika komunikasi menunjukkan adanya kesinambungan yang konsisten antara ekspektasi pesan dengan respon kognitif audiens sasaran. Secara metodologis setiap indikator konstruk diuji melalui parameter reliabilitas komposit yang memenuhi batas keterandalan statistik secara optimal. Analisis mendalam mengenai dinamika komunikasi menunjukkan adanya kesinambungan yang konsisten antara ekspektasi pesan dengan respon kognitif audiens sasaran. Secara metodologis setiap indikator konstruk diuji melalui parameter reliabilitas komposit yang memenuhi batas keterandalan statistik secara optimal. Analisis mendalam mengenai dinamika komunikasi menunjukkan adanya kesinambungan yang konsisten antara ekspektasi pesan dengan respon kognitif audiens sasaran. Secara metodologis setiap indikator konstruk diuji melalui parameter reliabilitas komposit yang memenuhi batas keterandalan statistik secara optimal. Analisis mendalam mengenai dinamika komunikasi menunjukkan adanya kesinambungan yang konsisten antara ekspektasi pesan dengan respon kognitif audiens sasaran. Secara metodologis setiap indikator konstruk diuji melalui parameter reliabilitas komposit yang memenuhi batas keterandalan statistik secara optimal. Analisis mendalam mengenai dinamika komunikasi menunjukkan adanya kesinambungan yang konsisten antara ekspektasi pesan dengan respon kognitif audiens sasaran. Secara metodologis setiap indikator konstruk diuji melalui parameter reliabilitas komposit yang memenuhi batas keterandalan statistik secara optimal. Analisis mendalam mengenai dinamika komunikasi menunjukkan adanya kesinambungan yang konsisten antara ekspektasi pesan dengan respon kognitif audiens sasaran. Secara metodologis setiap indikator konstruk diuji melalui parameter reliabilitas komposit yang memenuhi batas keterandalan statistik secara optimal. Analisis mendalam mengenai dinamika komunikasi menunjukkan adanya kesinambungan yang konsisten antara ekspektasi pesan dengan respon kognitif audiens sasaran. Secara metodologis setiap indikator konstruk diuji melalui parameter reliabilitas komposit yang memenuhi batas keterandalan statistik secara optimal.</w:t>
+        <w:t>Analisis mendalam mengenai dinamika komunikasi menunjukkan adanya kesinambungan yang konsisten antara ekspektasi pesan dengan respon kognitif audiens sasaran. Secara metodologis setiap indikator konstruk diuji melalui parameter reliabilitas komposit yang memenuhi batas keterandalan statistik secara optimal. Analisis mendalam mengenai dinamika komunikasi menunjukkan adanya kesinambungan yang konsisten antara ekspektasi pesan dengan respon kognitif audiens sasaran. Secara metodologis setiap indikator konstruk diuji melalui parameter reliabilitas komposit yang memenuhi batas keterandalan statistik secara optimal. Analisis mendalam mengenai dinamika komunikasi menunjukkan adanya kesinambungan yang konsisten antara ekspektasi pesan dengan respon kognitif audiens sasaran. Secara metodologis setiap indikator konstruk diuji melalui parameter reliabilitas komposit yang memenuhi batas keterandalan statistik secara optimal. Analisis mendalam mengenai dinamika komunikasi menunjukkan adanya kesinambungan yang konsisten antara ekspektasi pesan dengan respon kognitif audiens sasaran. Secara metodologis setiap indikator konstruk diuji melalui parameter reliabilitas komposit yang memenuhi batas keterandalan statistik secara optimal. Analisis mendalam mengenai dinamika komunikasi menunjukkan adanya kesinambungan yang konsisten antara ekspektasi pesan dengan respon kognitif audiens sasaran. Secara metodologis setiap indikator konstruk diuji melalui parameter reliabilitas komposit yang memenuhi batas keterandalan statistik secara optimal. Analisis mendalam mengenai dinamika komunikasi menunjukkan adanya kesinambungan yang konsisten antara ekspektasi pesan dengan respon kognitif audiens sasaran. Secara metodologis setiap indikator konstruk diuji melalui parameter reliabilitas komposit yang memenuhi batas keterandalan statistik secara optimal. Analisis mendalam mengenai dinamika komunikasi menunjukkan adanya kesinambungan yang konsisten antara ekspektasi pesan dengan respon kognitif audiens sasaran. Secara metodologis setiap indikator konstruk diuji melalui parameter reliabilitas komposit yang memenuhi batas keterandalan statistik secara optimal. Analisis mendalam mengenai dinamika komunikasi menunjukkan adanya kesinambungan yang konsisten antara ekspektasi pesan dengan respon kognitif audiens sasaran. Secara metodologis setiap indikator konstruk diuji melalui parameter reliabilitas komposit yang memenuhi batas keterandalan statistik secara optimal. Analisis mendalam mengenai dinamika komunikasi menunjukkan adanya kesinambungan yang konsisten antara ekspektasi pesan dengan respon kognitif audiens sasaran. Secara metodologis setiap indikator konstruk diuji melalui parameter reliabilitas komposit yang memenuhi batas keterandalan statistik secara optimal. Analisis mendalam mengenai dinamika komunikasi menunjukkan adanya kesinambungan yang konsisten antara ekspektasi pesan dengan respon kognitif audiens sasaran. Secara metodologis setiap indikator konstruk diuji melalui parameter reliabilitas komposit yang memenuhi batas keterandalan statistik secara optimal. Analisis mendalam mengenai dinamika komunikasi menunjukkan adanya kesinambungan yang konsisten antara ekspektasi pesan dengan respon kognitif audiens sasaran. Secara metodologis setiap indikator konstruk diuji melalui parameter reliabilitas komposit yang memenuhi batas keterandalan statistik secara optimal. Analisis mendalam mengenai dinamika komunikasi menunjukkan adanya kesinambungan yang konsisten antara ekspektasi pesan dengan respon kognitif audiens sasaran. Secara metodologis setiap indikator konstruk diuji melalui parameter reliabilitas komposit yang memenuhi batas keterandalan statistik secara optimal.</w:t>
       </w:r>
     </w:p>
     <w:p>
@@ -707,7 +707,7 @@
           <w:rFonts w:ascii="Times New Roman" w:hAnsi="Times New Roman"/>
           <w:sz w:val="24"/>
         </w:rPr>
-        <w:t>Analisis mendalam mengenai dinamika komunikasi menunjukkan adanya kesinambungan yang konsisten antara ekspektasi pesan dengan respon kognitif audiens sasaran. Secara metodologis setiap indikator konstruk diuji melalui parameter reliabilitas komposit yang memenuhi batas keterandalan statistik secara optimal. Analisis mendalam mengenai dinamika komunikasi menunjukkan adanya kesinambungan yang konsisten antara ekspektasi pesan dengan respon kognitif audiens sasaran. Secara metodologis setiap indikator konstruk diuji melalui parameter reliabilitas komposit yang memenuhi batas keterandalan statistik secara optimal. Analisis mendalam mengenai dinamika komunikasi menunjukkan adanya kesinambungan yang konsisten antara ekspektasi pesan dengan respon kognitif audiens sasaran. Secara metodologis setiap indikator konstruk diuji melalui parameter reliabilitas komposit yang memenuhi batas keterandalan statistik secara optimal. Analisis mendalam mengenai dinamika komunikasi menunjukkan adanya kesinambungan yang konsisten antara ekspektasi pesan dengan respon kognitif audiens sasaran. Secara metodologis setiap indikator konstruk diuji melalui parameter reliabilitas komposit yang memenuhi batas keterandalan statistik secara optimal. Analisis mendalam mengenai dinamika komunikasi menunjukkan adanya kesinambungan yang konsisten antara ekspektasi pesan dengan respon kognitif audiens sasaran. Secara metodologis setiap indikator konstruk diuji melalui parameter reliabilitas komposit yang memenuhi batas keterandalan statistik secara optimal. Analisis mendalam mengenai dinamika komunikasi menunjukkan adanya kesinambungan yang konsisten antara ekspektasi pesan dengan respon kognitif audiens sasaran. Secara metodologis setiap indikator konstruk diuji melalui parameter reliabilitas komposit yang memenuhi batas keterandalan statistik secara optimal. Analisis mendalam mengenai dinamika komunikasi menunjukkan adanya kesinambungan yang konsisten antara ekspektasi pesan dengan respon kognitif audiens sasaran. Secara metodologis setiap indikator konstruk diuji melalui parameter reliabilitas komposit yang memenuhi batas keterandalan statistik secara optimal. Analisis mendalam mengenai dinamika komunikasi menunjukkan adanya kesinambungan yang konsisten antara ekspektasi pesan dengan respon kognitif audiens sasaran. Secara metodologis setiap indikator konstruk diuji melalui parameter reliabilitas komposit yang memenuhi batas keterandalan statistik secara optimal. Analisis mendalam mengenai dinamika komunikasi menunjukkan adanya kesinambungan yang konsisten antara ekspektasi pesan dengan respon kognitif audiens sasaran. Secara metodologis setiap indikator konstruk diuji melalui parameter reliabilitas komposit yang memenuhi batas keterandalan statistik secara optimal. Analisis mendalam mengenai dinamika komunikasi menunjukkan adanya kesinambungan yang konsisten antara ekspektasi pesan dengan respon kognitif audiens sasaran. Secara metodologis setiap indikator konstruk diuji melalui parameter reliabilitas komposit yang memenuhi batas keterandalan statistik secara optimal. Analisis mendalam mengenai dinamika komunikasi menunjukkan adanya kesinambungan yang konsisten antara ekspektasi pesan dengan respon kognitif audiens sasaran. Secara metodologis setiap indikator konstruk diuji melalui parameter reliabilitas komposit yang memenuhi batas keterandalan statistik secara optimal. Analisis mendalam mengenai dinamika komunikasi menunjukkan adanya kesinambungan yang konsisten antara ekspektasi pesan dengan respon kognitif audiens sasaran. Secara metodologis setiap indikator konstruk diuji melalui parameter reliabilitas komposit yang memenuhi batas keterandalan statistik secara optimal. Analisis mendalam mengenai dinamika komunikasi menunjukkan adanya kesinambungan yang konsisten antara ekspektasi pesan dengan respon kognitif audiens sasaran. Secara metodologis setiap indikator konstruk diuji melalui parameter reliabilitas komposit yang memenuhi batas keterandalan statistik secara optimal. Analisis mendalam mengenai dinamika komunikasi menunjukkan adanya kesinambungan yang konsisten antara ekspektasi pesan dengan respon kognitif audiens sasaran. Secara metodologis setiap indikator konstruk diuji melalui parameter reliabilitas komposit yang memenuhi batas keterandalan statistik secara optimal. Analisis mendalam mengenai dinamika komunikasi menunjukkan adanya kesinambungan yang konsisten antara ekspektasi pesan dengan respon kognitif audiens sasaran. Secara metodologis setiap indikator konstruk diuji melalui parameter reliabilitas komposit yang memenuhi batas keterandalan statistik secara optimal.</w:t>
+        <w:t>Analisis mendalam mengenai dinamika komunikasi menunjukkan adanya kesinambungan yang konsisten antara ekspektasi pesan dengan respon kognitif audiens sasaran. Secara metodologis setiap indikator konstruk diuji melalui parameter reliabilitas komposit yang memenuhi batas keterandalan statistik secara optimal. Analisis mendalam mengenai dinamika komunikasi menunjukkan adanya kesinambungan yang konsisten antara ekspektasi pesan dengan respon kognitif audiens sasaran. Secara metodologis setiap indikator konstruk diuji melalui parameter reliabilitas komposit yang memenuhi batas keterandalan statistik secara optimal. Analisis mendalam mengenai dinamika komunikasi menunjukkan adanya kesinambungan yang konsisten antara ekspektasi pesan dengan respon kognitif audiens sasaran. Secara metodologis setiap indikator konstruk diuji melalui parameter reliabilitas komposit yang memenuhi batas keterandalan statistik secara optimal. Analisis mendalam mengenai dinamika komunikasi menunjukkan adanya kesinambungan yang konsisten antara ekspektasi pesan dengan respon kognitif audiens sasaran. Secara metodologis setiap indikator konstruk diuji melalui parameter reliabilitas komposit yang memenuhi batas keterandalan statistik secara optimal. Analisis mendalam mengenai dinamika komunikasi menunjukkan adanya kesinambungan yang konsisten antara ekspektasi pesan dengan respon kognitif audiens sasaran. Secara metodologis setiap indikator konstruk diuji melalui parameter reliabilitas komposit yang memenuhi batas keterandalan statistik secara optimal. Analisis mendalam mengenai dinamika komunikasi menunjukkan adanya kesinambungan yang konsisten antara ekspektasi pesan dengan respon kognitif audiens sasaran. Secara metodologis setiap indikator konstruk diuji melalui parameter reliabilitas komposit yang memenuhi batas keterandalan statistik secara optimal. Analisis mendalam mengenai dinamika komunikasi menunjukkan adanya kesinambungan yang konsisten antara ekspektasi pesan dengan respon kognitif audiens sasaran. Secara metodologis setiap indikator konstruk diuji melalui parameter reliabilitas komposit yang memenuhi batas keterandalan statistik secara optimal. Analisis mendalam mengenai dinamika komunikasi menunjukkan adanya kesinambungan yang konsisten antara ekspektasi pesan dengan respon kognitif audiens sasaran. Secara metodologis setiap indikator konstruk diuji melalui parameter reliabilitas komposit yang memenuhi batas keterandalan statistik secara optimal. Analisis mendalam mengenai dinamika komunikasi menunjukkan adanya kesinambungan yang konsisten antara ekspektasi pesan dengan respon kognitif audiens sasaran. Secara metodologis setiap indikator konstruk diuji melalui parameter reliabilitas komposit yang memenuhi batas keterandalan statistik secara optimal. Analisis mendalam mengenai dinamika komunikasi menunjukkan adanya kesinambungan yang konsisten antara ekspektasi pesan dengan respon kognitif audiens sasaran. Secara metodologis setiap indikator konstruk diuji melalui parameter reliabilitas komposit yang memenuhi batas keterandalan statistik secara optimal. Analisis mendalam mengenai dinamika komunikasi menunjukkan adanya kesinambungan yang konsisten antara ekspektasi pesan dengan respon kognitif audiens sasaran. Secara metodologis setiap indikator konstruk diuji melalui parameter reliabilitas komposit yang memenuhi batas keterandalan statistik secara optimal. Analisis mendalam mengenai dinamika komunikasi menunjukkan adanya kesinambungan yang konsisten antara ekspektasi pesan dengan respon kognitif audiens sasaran. Secara metodologis setiap indikator konstruk diuji melalui parameter reliabilitas komposit yang memenuhi batas keterandalan statistik secara optimal.</w:t>
       </w:r>
     </w:p>
     <w:p>
@@ -720,7 +720,7 @@
           <w:rFonts w:ascii="Times New Roman" w:hAnsi="Times New Roman"/>
           <w:sz w:val="24"/>
         </w:rPr>
-        <w:t>Analisis mendalam mengenai dinamika komunikasi menunjukkan adanya kesinambungan yang konsisten antara ekspektasi pesan dengan respon kognitif audiens sasaran. Secara metodologis setiap indikator konstruk diuji melalui parameter reliabilitas komposit yang memenuhi batas keterandalan statistik secara optimal. Analisis mendalam mengenai dinamika komunikasi menunjukkan adanya kesinambungan yang konsisten antara ekspektasi pesan dengan respon kognitif audiens sasaran. Secara metodologis setiap indikator konstruk diuji melalui parameter reliabilitas komposit yang memenuhi batas keterandalan statistik secara optimal. Analisis mendalam mengenai dinamika komunikasi menunjukkan adanya kesinambungan yang konsisten antara ekspektasi pesan dengan respon kognitif audiens sasaran. Secara metodologis setiap indikator konstruk diuji melalui parameter reliabilitas komposit yang memenuhi batas keterandalan statistik secara optimal. Analisis mendalam mengenai dinamika komunikasi menunjukkan adanya kesinambungan yang konsisten antara ekspektasi pesan dengan respon kognitif audiens sasaran. Secara metodologis setiap indikator konstruk diuji melalui parameter reliabilitas komposit yang memenuhi batas keterandalan statistik secara optimal. Analisis mendalam mengenai dinamika komunikasi menunjukkan adanya kesinambungan yang konsisten antara ekspektasi pesan dengan respon kognitif audiens sasaran. Secara metodologis setiap indikator konstruk diuji melalui parameter reliabilitas komposit yang memenuhi batas keterandalan statistik secara optimal. Analisis mendalam mengenai dinamika komunikasi menunjukkan adanya kesinambungan yang konsisten antara ekspektasi pesan dengan respon kognitif audiens sasaran. Secara metodologis setiap indikator konstruk diuji melalui parameter reliabilitas komposit yang memenuhi batas keterandalan statistik secara optimal. Analisis mendalam mengenai dinamika komunikasi menunjukkan adanya kesinambungan yang konsisten antara ekspektasi pesan dengan respon kognitif audiens sasaran. Secara metodologis setiap indikator konstruk diuji melalui parameter reliabilitas komposit yang memenuhi batas keterandalan statistik secara optimal. Analisis mendalam mengenai dinamika komunikasi menunjukkan adanya kesinambungan yang konsisten antara ekspektasi pesan dengan respon kognitif audiens sasaran. Secara metodologis setiap indikator konstruk diuji melalui parameter reliabilitas komposit yang memenuhi batas keterandalan statistik secara optimal. Analisis mendalam mengenai dinamika komunikasi menunjukkan adanya kesinambungan yang konsisten antara ekspektasi pesan dengan respon kognitif audiens sasaran. Secara metodologis setiap indikator konstruk diuji melalui parameter reliabilitas komposit yang memenuhi batas keterandalan statistik secara optimal. Analisis mendalam mengenai dinamika komunikasi menunjukkan adanya kesinambungan yang konsisten antara ekspektasi pesan dengan respon kognitif audiens sasaran. Secara metodologis setiap indikator konstruk diuji melalui parameter reliabilitas komposit yang memenuhi batas keterandalan statistik secara optimal. Analisis mendalam mengenai dinamika komunikasi menunjukkan adanya kesinambungan yang konsisten antara ekspektasi pesan dengan respon kognitif audiens sasaran. Secara metodologis setiap indikator konstruk diuji melalui parameter reliabilitas komposit yang memenuhi batas keterandalan statistik secara optimal. Analisis mendalam mengenai dinamika komunikasi menunjukkan adanya kesinambungan yang konsisten antara ekspektasi pesan dengan respon kognitif audiens sasaran. Secara metodologis setiap indikator konstruk diuji melalui parameter reliabilitas komposit yang memenuhi batas keterandalan statistik secara optimal. Analisis mendalam mengenai dinamika komunikasi menunjukkan adanya kesinambungan yang konsisten antara ekspektasi pesan dengan respon kognitif audiens sasaran. Secara metodologis setiap indikator konstruk diuji melalui parameter reliabilitas komposit yang memenuhi batas keterandalan statistik secara optimal. Analisis mendalam mengenai dinamika komunikasi menunjukkan adanya kesinambungan yang konsisten antara ekspektasi pesan dengan respon kognitif audiens sasaran. Secara metodologis setiap indikator konstruk diuji melalui parameter reliabilitas komposit yang memenuhi batas keterandalan statistik secara optimal. Analisis mendalam mengenai dinamika komunikasi menunjukkan adanya kesinambungan yang konsisten antara ekspektasi pesan dengan respon kognitif audiens sasaran. Secara metodologis setiap indikator konstruk diuji melalui parameter reliabilitas komposit yang memenuhi batas keterandalan statistik secara optimal.</w:t>
+        <w:t>Analisis mendalam mengenai dinamika komunikasi menunjukkan adanya kesinambungan yang konsisten antara ekspektasi pesan dengan respon kognitif audiens sasaran. Secara metodologis setiap indikator konstruk diuji melalui parameter reliabilitas komposit yang memenuhi batas keterandalan statistik secara optimal. Analisis mendalam mengenai dinamika komunikasi menunjukkan adanya kesinambungan yang konsisten antara ekspektasi pesan dengan respon kognitif audiens sasaran. Secara metodologis setiap indikator konstruk diuji melalui parameter reliabilitas komposit yang memenuhi batas keterandalan statistik secara optimal. Analisis mendalam mengenai dinamika komunikasi menunjukkan adanya kesinambungan yang konsisten antara ekspektasi pesan dengan respon kognitif audiens sasaran. Secara metodologis setiap indikator konstruk diuji melalui parameter reliabilitas komposit yang memenuhi batas keterandalan statistik secara optimal. Analisis mendalam mengenai dinamika komunikasi menunjukkan adanya kesinambungan yang konsisten antara ekspektasi pesan dengan respon kognitif audiens sasaran. Secara metodologis setiap indikator konstruk diuji melalui parameter reliabilitas komposit yang memenuhi batas keterandalan statistik secara optimal. Analisis mendalam mengenai dinamika komunikasi menunjukkan adanya kesinambungan yang konsisten antara ekspektasi pesan dengan respon kognitif audiens sasaran. Secara metodologis setiap indikator konstruk diuji melalui parameter reliabilitas komposit yang memenuhi batas keterandalan statistik secara optimal. Analisis mendalam mengenai dinamika komunikasi menunjukkan adanya kesinambungan yang konsisten antara ekspektasi pesan dengan respon kognitif audiens sasaran. Secara metodologis setiap indikator konstruk diuji melalui parameter reliabilitas komposit yang memenuhi batas keterandalan statistik secara optimal. Analisis mendalam mengenai dinamika komunikasi menunjukkan adanya kesinambungan yang konsisten antara ekspektasi pesan dengan respon kognitif audiens sasaran. Secara metodologis setiap indikator konstruk diuji melalui parameter reliabilitas komposit yang memenuhi batas keterandalan statistik secara optimal. Analisis mendalam mengenai dinamika komunikasi menunjukkan adanya kesinambungan yang konsisten antara ekspektasi pesan dengan respon kognitif audiens sasaran. Secara metodologis setiap indikator konstruk diuji melalui parameter reliabilitas komposit yang memenuhi batas keterandalan statistik secara optimal. Analisis mendalam mengenai dinamika komunikasi menunjukkan adanya kesinambungan yang konsisten antara ekspektasi pesan dengan respon kognitif audiens sasaran. Secara metodologis setiap indikator konstruk diuji melalui parameter reliabilitas komposit yang memenuhi batas keterandalan statistik secara optimal. Analisis mendalam mengenai dinamika komunikasi menunjukkan adanya kesinambungan yang konsisten antara ekspektasi pesan dengan respon kognitif audiens sasaran. Secara metodologis setiap indikator konstruk diuji melalui parameter reliabilitas komposit yang memenuhi batas keterandalan statistik secara optimal. Analisis mendalam mengenai dinamika komunikasi menunjukkan adanya kesinambungan yang konsisten antara ekspektasi pesan dengan respon kognitif audiens sasaran. Secara metodologis setiap indikator konstruk diuji melalui parameter reliabilitas komposit yang memenuhi batas keterandalan statistik secara optimal. Analisis mendalam mengenai dinamika komunikasi menunjukkan adanya kesinambungan yang konsisten antara ekspektasi pesan dengan respon kognitif audiens sasaran. Secara metodologis setiap indikator konstruk diuji melalui parameter reliabilitas komposit yang memenuhi batas keterandalan statistik secara optimal.</w:t>
       </w:r>
     </w:p>
     <w:p>
@@ -733,7 +733,7 @@
           <w:rFonts w:ascii="Times New Roman" w:hAnsi="Times New Roman"/>
           <w:sz w:val="24"/>
         </w:rPr>
-        <w:t>Analisis mendalam mengenai dinamika komunikasi menunjukkan adanya kesinambungan yang konsisten antara ekspektasi pesan dengan respon kognitif audiens sasaran. Secara metodologis setiap indikator konstruk diuji melalui parameter reliabilitas komposit yang memenuhi batas keterandalan statistik secara optimal. Analisis mendalam mengenai dinamika komunikasi menunjukkan adanya kesinambungan yang konsisten antara ekspektasi pesan dengan respon kognitif audiens sasaran. Secara metodologis setiap indikator konstruk diuji melalui parameter reliabilitas komposit yang memenuhi batas keterandalan statistik secara optimal. Analisis mendalam mengenai dinamika komunikasi menunjukkan adanya kesinambungan yang konsisten antara ekspektasi pesan dengan respon kognitif audiens sasaran. Secara metodologis setiap indikator konstruk diuji melalui parameter reliabilitas komposit yang memenuhi batas keterandalan statistik secara optimal. Analisis mendalam mengenai dinamika komunikasi menunjukkan adanya kesinambungan yang konsisten antara ekspektasi pesan dengan respon kognitif audiens sasaran. Secara metodologis setiap indikator konstruk diuji melalui parameter reliabilitas komposit yang memenuhi batas keterandalan statistik secara optimal. Analisis mendalam mengenai dinamika komunikasi menunjukkan adanya kesinambungan yang konsisten antara ekspektasi pesan dengan respon kognitif audiens sasaran. Secara metodologis setiap indikator konstruk diuji melalui parameter reliabilitas komposit yang memenuhi batas keterandalan statistik secara optimal. Analisis mendalam mengenai dinamika komunikasi menunjukkan adanya kesinambungan yang konsisten antara ekspektasi pesan dengan respon kognitif audiens sasaran. Secara metodologis setiap indikator konstruk diuji melalui parameter reliabilitas komposit yang memenuhi batas keterandalan statistik secara optimal. Analisis mendalam mengenai dinamika komunikasi menunjukkan adanya kesinambungan yang konsisten antara ekspektasi pesan dengan respon kognitif audiens sasaran. Secara metodologis setiap indikator konstruk diuji melalui parameter reliabilitas komposit yang memenuhi batas keterandalan statistik secara optimal. Analisis mendalam mengenai dinamika komunikasi menunjukkan adanya kesinambungan yang konsisten antara ekspektasi pesan dengan respon kognitif audiens sasaran. Secara metodologis setiap indikator konstruk diuji melalui parameter reliabilitas komposit yang memenuhi batas keterandalan statistik secara optimal. Analisis mendalam mengenai dinamika komunikasi menunjukkan adanya kesinambungan yang konsisten antara ekspektasi pesan dengan respon kognitif audiens sasaran. Secara metodologis setiap indikator konstruk diuji melalui parameter reliabilitas komposit yang memenuhi batas keterandalan statistik secara optimal. Analisis mendalam mengenai dinamika komunikasi menunjukkan adanya kesinambungan yang konsisten antara ekspektasi pesan dengan respon kognitif audiens sasaran. Secara metodologis setiap indikator konstruk diuji melalui parameter reliabilitas komposit yang memenuhi batas keterandalan statistik secara optimal. Analisis mendalam mengenai dinamika komunikasi menunjukkan adanya kesinambungan yang konsisten antara ekspektasi pesan dengan respon kognitif audiens sasaran. Secara metodologis setiap indikator konstruk diuji melalui parameter reliabilitas komposit yang memenuhi batas keterandalan statistik secara optimal. Analisis mendalam mengenai dinamika komunikasi menunjukkan adanya kesinambungan yang konsisten antara ekspektasi pesan dengan respon kognitif audiens sasaran. Secara metodologis setiap indikator konstruk diuji melalui parameter reliabilitas komposit yang memenuhi batas keterandalan statistik secara optimal. Analisis mendalam mengenai dinamika komunikasi menunjukkan adanya kesinambungan yang konsisten antara ekspektasi pesan dengan respon kognitif audiens sasaran. Secara metodologis setiap indikator konstruk diuji melalui parameter reliabilitas komposit yang memenuhi batas keterandalan statistik secara optimal. Analisis mendalam mengenai dinamika komunikasi menunjukkan adanya kesinambungan yang konsisten antara ekspektasi pesan dengan respon kognitif audiens sasaran. Secara metodologis setiap indikator konstruk diuji melalui parameter reliabilitas komposit yang memenuhi batas keterandalan statistik secara optimal. Analisis mendalam mengenai dinamika komunikasi menunjukkan adanya kesinambungan yang konsisten antara ekspektasi pesan dengan respon kognitif audiens sasaran. Secara metodologis setiap indikator konstruk diuji melalui parameter reliabilitas komposit yang memenuhi batas keterandalan statistik secara optimal.</w:t>
+        <w:t>Analisis mendalam mengenai dinamika komunikasi menunjukkan adanya kesinambungan yang konsisten antara ekspektasi pesan dengan respon kognitif audiens sasaran. Secara metodologis setiap indikator konstruk diuji melalui parameter reliabilitas komposit yang memenuhi batas keterandalan statistik secara optimal. Analisis mendalam mengenai dinamika komunikasi menunjukkan adanya kesinambungan yang konsisten antara ekspektasi pesan dengan respon kognitif audiens sasaran. Secara metodologis setiap indikator konstruk diuji melalui parameter reliabilitas komposit yang memenuhi batas keterandalan statistik secara optimal. Analisis mendalam mengenai dinamika komunikasi menunjukkan adanya kesinambungan yang konsisten antara ekspektasi pesan dengan respon kognitif audiens sasaran. Secara metodologis setiap indikator konstruk diuji melalui parameter reliabilitas komposit yang memenuhi batas keterandalan statistik secara optimal. Analisis mendalam mengenai dinamika komunikasi menunjukkan adanya kesinambungan yang konsisten antara ekspektasi pesan dengan respon kognitif audiens sasaran. Secara metodologis setiap indikator konstruk diuji melalui parameter reliabilitas komposit yang memenuhi batas keterandalan statistik secara optimal. Analisis mendalam mengenai dinamika komunikasi menunjukkan adanya kesinambungan yang konsisten antara ekspektasi pesan dengan respon kognitif audiens sasaran. Secara metodologis setiap indikator konstruk diuji melalui parameter reliabilitas komposit yang memenuhi batas keterandalan statistik secara optimal. Analisis mendalam mengenai dinamika komunikasi menunjukkan adanya kesinambungan yang konsisten antara ekspektasi pesan dengan respon kognitif audiens sasaran. Secara metodologis setiap indikator konstruk diuji melalui parameter reliabilitas komposit yang memenuhi batas keterandalan statistik secara optimal. Analisis mendalam mengenai dinamika komunikasi menunjukkan adanya kesinambungan yang konsisten antara ekspektasi pesan dengan respon kognitif audiens sasaran. Secara metodologis setiap indikator konstruk diuji melalui parameter reliabilitas komposit yang memenuhi batas keterandalan statistik secara optimal. Analisis mendalam mengenai dinamika komunikasi menunjukkan adanya kesinambungan yang konsisten antara ekspektasi pesan dengan respon kognitif audiens sasaran. Secara metodologis setiap indikator konstruk diuji melalui parameter reliabilitas komposit yang memenuhi batas keterandalan statistik secara optimal. Analisis mendalam mengenai dinamika komunikasi menunjukkan adanya kesinambungan yang konsisten antara ekspektasi pesan dengan respon kognitif audiens sasaran. Secara metodologis setiap indikator konstruk diuji melalui parameter reliabilitas komposit yang memenuhi batas keterandalan statistik secara optimal. Analisis mendalam mengenai dinamika komunikasi menunjukkan adanya kesinambungan yang konsisten antara ekspektasi pesan dengan respon kognitif audiens sasaran. Secara metodologis setiap indikator konstruk diuji melalui parameter reliabilitas komposit yang memenuhi batas keterandalan statistik secara optimal. Analisis mendalam mengenai dinamika komunikasi menunjukkan adanya kesinambungan yang konsisten antara ekspektasi pesan dengan respon kognitif audiens sasaran. Secara metodologis setiap indikator konstruk diuji melalui parameter reliabilitas komposit yang memenuhi batas keterandalan statistik secara optimal. Analisis mendalam mengenai dinamika komunikasi menunjukkan adanya kesinambungan yang konsisten antara ekspektasi pesan dengan respon kognitif audiens sasaran. Secara metodologis setiap indikator konstruk diuji melalui parameter reliabilitas komposit yang memenuhi batas keterandalan statistik secara optimal.</w:t>
       </w:r>
     </w:p>
     <w:p>
@@ -746,7 +746,7 @@
           <w:rFonts w:ascii="Times New Roman" w:hAnsi="Times New Roman"/>
           <w:sz w:val="24"/>
         </w:rPr>
-        <w:t>Analisis mendalam mengenai dinamika komunikasi menunjukkan adanya kesinambungan yang konsisten antara ekspektasi pesan dengan respon kognitif audiens sasaran. Secara metodologis setiap indikator konstruk diuji melalui parameter reliabilitas komposit yang memenuhi batas keterandalan statistik secara optimal. Analisis mendalam mengenai dinamika komunikasi menunjukkan adanya kesinambungan yang konsisten antara ekspektasi pesan dengan respon kognitif audiens sasaran. Secara metodologis setiap indikator konstruk diuji melalui parameter reliabilitas komposit yang memenuhi batas keterandalan statistik secara optimal. Analisis mendalam mengenai dinamika komunikasi menunjukkan adanya kesinambungan yang konsisten antara ekspektasi pesan dengan respon kognitif audiens sasaran. Secara metodologis setiap indikator konstruk diuji melalui parameter reliabilitas komposit yang memenuhi batas keterandalan statistik secara optimal. Analisis mendalam mengenai dinamika komunikasi menunjukkan adanya kesinambungan yang konsisten antara ekspektasi pesan dengan respon kognitif audiens sasaran. Secara metodologis setiap indikator konstruk diuji melalui parameter reliabilitas komposit yang memenuhi batas keterandalan statistik secara optimal. Analisis mendalam mengenai dinamika komunikasi menunjukkan adanya kesinambungan yang konsisten antara ekspektasi pesan dengan respon kognitif audiens sasaran. Secara metodologis setiap indikator konstruk diuji melalui parameter reliabilitas komposit yang memenuhi batas keterandalan statistik secara optimal. Analisis mendalam mengenai dinamika komunikasi menunjukkan adanya kesinambungan yang konsisten antara ekspektasi pesan dengan respon kognitif audiens sasaran. Secara metodologis setiap indikator konstruk diuji melalui parameter reliabilitas komposit yang memenuhi batas keterandalan statistik secara optimal. Analisis mendalam mengenai dinamika komunikasi menunjukkan adanya kesinambungan yang konsisten antara ekspektasi pesan dengan respon kognitif audiens sasaran. Secara metodologis setiap indikator konstruk diuji melalui parameter reliabilitas komposit yang memenuhi batas keterandalan statistik secara optimal. Analisis mendalam mengenai dinamika komunikasi menunjukkan adanya kesinambungan yang konsisten antara ekspektasi pesan dengan respon kognitif audiens sasaran. Secara metodologis setiap indikator konstruk diuji melalui parameter reliabilitas komposit yang memenuhi batas keterandalan statistik secara optimal. Analisis mendalam mengenai dinamika komunikasi menunjukkan adanya kesinambungan yang konsisten antara ekspektasi pesan dengan respon kognitif audiens sasaran. Secara metodologis setiap indikator konstruk diuji melalui parameter reliabilitas komposit yang memenuhi batas keterandalan statistik secara optimal. Analisis mendalam mengenai dinamika komunikasi menunjukkan adanya kesinambungan yang konsisten antara ekspektasi pesan dengan respon kognitif audiens sasaran. Secara metodologis setiap indikator konstruk diuji melalui parameter reliabilitas komposit yang memenuhi batas keterandalan statistik secara optimal. Analisis mendalam mengenai dinamika komunikasi menunjukkan adanya kesinambungan yang konsisten antara ekspektasi pesan dengan respon kognitif audiens sasaran. Secara metodologis setiap indikator konstruk diuji melalui parameter reliabilitas komposit yang memenuhi batas keterandalan statistik secara optimal. Analisis mendalam mengenai dinamika komunikasi menunjukkan adanya kesinambungan yang konsisten antara ekspektasi pesan dengan respon kognitif audiens sasaran. Secara metodologis setiap indikator konstruk diuji melalui parameter reliabilitas komposit yang memenuhi batas keterandalan statistik secara optimal. Analisis mendalam mengenai dinamika komunikasi menunjukkan adanya kesinambungan yang konsisten antara ekspektasi pesan dengan respon kognitif audiens sasaran. Secara metodologis setiap indikator konstruk diuji melalui parameter reliabilitas komposit yang memenuhi batas keterandalan statistik secara optimal. Analisis mendalam mengenai dinamika komunikasi menunjukkan adanya kesinambungan yang konsisten antara ekspektasi pesan dengan respon kognitif audiens sasaran. Secara metodologis setiap indikator konstruk diuji melalui parameter reliabilitas komposit yang memenuhi batas keterandalan statistik secara optimal. Analisis mendalam mengenai dinamika komunikasi menunjukkan adanya kesinambungan yang konsisten antara ekspektasi pesan dengan respon kognitif audiens sasaran. Secara metodologis setiap indikator konstruk diuji melalui parameter reliabilitas komposit yang memenuhi batas keterandalan statistik secara optimal.</w:t>
+        <w:t>Analisis mendalam mengenai dinamika komunikasi menunjukkan adanya kesinambungan yang konsisten antara ekspektasi pesan dengan respon kognitif audiens sasaran. Secara metodologis setiap indikator konstruk diuji melalui parameter reliabilitas komposit yang memenuhi batas keterandalan statistik secara optimal. Analisis mendalam mengenai dinamika komunikasi menunjukkan adanya kesinambungan yang konsisten antara ekspektasi pesan dengan respon kognitif audiens sasaran. Secara metodologis setiap indikator konstruk diuji melalui parameter reliabilitas komposit yang memenuhi batas keterandalan statistik secara optimal. Analisis mendalam mengenai dinamika komunikasi menunjukkan adanya kesinambungan yang konsisten antara ekspektasi pesan dengan respon kognitif audiens sasaran. Secara metodologis setiap indikator konstruk diuji melalui parameter reliabilitas komposit yang memenuhi batas keterandalan statistik secara optimal. Analisis mendalam mengenai dinamika komunikasi menunjukkan adanya kesinambungan yang konsisten antara ekspektasi pesan dengan respon kognitif audiens sasaran. Secara metodologis setiap indikator konstruk diuji melalui parameter reliabilitas komposit yang memenuhi batas keterandalan statistik secara optimal. Analisis mendalam mengenai dinamika komunikasi menunjukkan adanya kesinambungan yang konsisten antara ekspektasi pesan dengan respon kognitif audiens sasaran. Secara metodologis setiap indikator konstruk diuji melalui parameter reliabilitas komposit yang memenuhi batas keterandalan statistik secara optimal. Analisis mendalam mengenai dinamika komunikasi menunjukkan adanya kesinambungan yang konsisten antara ekspektasi pesan dengan respon kognitif audiens sasaran. Secara metodologis setiap indikator konstruk diuji melalui parameter reliabilitas komposit yang memenuhi batas keterandalan statistik secara optimal. Analisis mendalam mengenai dinamika komunikasi menunjukkan adanya kesinambungan yang konsisten antara ekspektasi pesan dengan respon kognitif audiens sasaran. Secara metodologis setiap indikator konstruk diuji melalui parameter reliabilitas komposit yang memenuhi batas keterandalan statistik secara optimal. Analisis mendalam mengenai dinamika komunikasi menunjukkan adanya kesinambungan yang konsisten antara ekspektasi pesan dengan respon kognitif audiens sasaran. Secara metodologis setiap indikator konstruk diuji melalui parameter reliabilitas komposit yang memenuhi batas keterandalan statistik secara optimal. Analisis mendalam mengenai dinamika komunikasi menunjukkan adanya kesinambungan yang konsisten antara ekspektasi pesan dengan respon kognitif audiens sasaran. Secara metodologis setiap indikator konstruk diuji melalui parameter reliabilitas komposit yang memenuhi batas keterandalan statistik secara optimal. Analisis mendalam mengenai dinamika komunikasi menunjukkan adanya kesinambungan yang konsisten antara ekspektasi pesan dengan respon kognitif audiens sasaran. Secara metodologis setiap indikator konstruk diuji melalui parameter reliabilitas komposit yang memenuhi batas keterandalan statistik secara optimal. Analisis mendalam mengenai dinamika komunikasi menunjukkan adanya kesinambungan yang konsisten antara ekspektasi pesan dengan respon kognitif audiens sasaran. Secara metodologis setiap indikator konstruk diuji melalui parameter reliabilitas komposit yang memenuhi batas keterandalan statistik secara optimal. Analisis mendalam mengenai dinamika komunikasi menunjukkan adanya kesinambungan yang konsisten antara ekspektasi pesan dengan respon kognitif audiens sasaran. Secara metodologis setiap indikator konstruk diuji melalui parameter reliabilitas komposit yang memenuhi batas keterandalan statistik secara optimal.</w:t>
       </w:r>
     </w:p>
     <w:p>
@@ -759,7 +759,7 @@
           <w:rFonts w:ascii="Times New Roman" w:hAnsi="Times New Roman"/>
           <w:sz w:val="24"/>
         </w:rPr>
-        <w:t>Analisis mendalam mengenai dinamika komunikasi menunjukkan adanya kesinambungan yang konsisten antara ekspektasi pesan dengan respon kognitif audiens sasaran. Secara metodologis setiap indikator konstruk diuji melalui parameter reliabilitas komposit yang memenuhi batas keterandalan statistik secara optimal. Analisis mendalam mengenai dinamika komunikasi menunjukkan adanya kesinambungan yang konsisten antara ekspektasi pesan dengan respon kognitif audiens sasaran. Secara metodologis setiap indikator konstruk diuji melalui parameter reliabilitas komposit yang memenuhi batas keterandalan statistik secara optimal. Analisis mendalam mengenai dinamika komunikasi menunjukkan adanya kesinambungan yang konsisten antara ekspektasi pesan dengan respon kognitif audiens sasaran. Secara metodologis setiap indikator konstruk diuji melalui parameter reliabilitas komposit yang memenuhi batas keterandalan statistik secara optimal. Analisis mendalam mengenai dinamika komunikasi menunjukkan adanya kesinambungan yang konsisten antara ekspektasi pesan dengan respon kognitif audiens sasaran. Secara metodologis setiap indikator konstruk diuji melalui parameter reliabilitas komposit yang memenuhi batas keterandalan statistik secara optimal. Analisis mendalam mengenai dinamika komunikasi menunjukkan adanya kesinambungan yang konsisten antara ekspektasi pesan dengan respon kognitif audiens sasaran. Secara metodologis setiap indikator konstruk diuji melalui parameter reliabilitas komposit yang memenuhi batas keterandalan statistik secara optimal. Analisis mendalam mengenai dinamika komunikasi menunjukkan adanya kesinambungan yang konsisten antara ekspektasi pesan dengan respon kognitif audiens sasaran. Secara metodologis setiap indikator konstruk diuji melalui parameter reliabilitas komposit yang memenuhi batas keterandalan statistik secara optimal. Analisis mendalam mengenai dinamika komunikasi menunjukkan adanya kesinambungan yang konsisten antara ekspektasi pesan dengan respon kognitif audiens sasaran. Secara metodologis setiap indikator konstruk diuji melalui parameter reliabilitas komposit yang memenuhi batas keterandalan statistik secara optimal. Analisis mendalam mengenai dinamika komunikasi menunjukkan adanya kesinambungan yang konsisten antara ekspektasi pesan dengan respon kognitif audiens sasaran. Secara metodologis setiap indikator konstruk diuji melalui parameter reliabilitas komposit yang memenuhi batas keterandalan statistik secara optimal. Analisis mendalam mengenai dinamika komunikasi menunjukkan adanya kesinambungan yang konsisten antara ekspektasi pesan dengan respon kognitif audiens sasaran. Secara metodologis setiap indikator konstruk diuji melalui parameter reliabilitas komposit yang memenuhi batas keterandalan statistik secara optimal. Analisis mendalam mengenai dinamika komunikasi menunjukkan adanya kesinambungan yang konsisten antara ekspektasi pesan dengan respon kognitif audiens sasaran. Secara metodologis setiap indikator konstruk diuji melalui parameter reliabilitas komposit yang memenuhi batas keterandalan statistik secara optimal. Analisis mendalam mengenai dinamika komunikasi menunjukkan adanya kesinambungan yang konsisten antara ekspektasi pesan dengan respon kognitif audiens sasaran. Secara metodologis setiap indikator konstruk diuji melalui parameter reliabilitas komposit yang memenuhi batas keterandalan statistik secara optimal. Analisis mendalam mengenai dinamika komunikasi menunjukkan adanya kesinambungan yang konsisten antara ekspektasi pesan dengan respon kognitif audiens sasaran. Secara metodologis setiap indikator konstruk diuji melalui parameter reliabilitas komposit yang memenuhi batas keterandalan statistik secara optimal. Analisis mendalam mengenai dinamika komunikasi menunjukkan adanya kesinambungan yang konsisten antara ekspektasi pesan dengan respon kognitif audiens sasaran. Secara metodologis setiap indikator konstruk diuji melalui parameter reliabilitas komposit yang memenuhi batas keterandalan statistik secara optimal. Analisis mendalam mengenai dinamika komunikasi menunjukkan adanya kesinambungan yang konsisten antara ekspektasi pesan dengan respon kognitif audiens sasaran. Secara metodologis setiap indikator konstruk diuji melalui parameter reliabilitas komposit yang memenuhi batas keterandalan statistik secara optimal. Analisis mendalam mengenai dinamika komunikasi menunjukkan adanya kesinambungan yang konsisten antara ekspektasi pesan dengan respon kognitif audiens sasaran. Secara metodologis setiap indikator konstruk diuji melalui parameter reliabilitas komposit yang memenuhi batas keterandalan statistik secara optimal.</w:t>
+        <w:t>Analisis mendalam mengenai dinamika komunikasi menunjukkan adanya kesinambungan yang konsisten antara ekspektasi pesan dengan respon kognitif audiens sasaran. Secara metodologis setiap indikator konstruk diuji melalui parameter reliabilitas komposit yang memenuhi batas keterandalan statistik secara optimal. Analisis mendalam mengenai dinamika komunikasi menunjukkan adanya kesinambungan yang konsisten antara ekspektasi pesan dengan respon kognitif audiens sasaran. Secara metodologis setiap indikator konstruk diuji melalui parameter reliabilitas komposit yang memenuhi batas keterandalan statistik secara optimal. Analisis mendalam mengenai dinamika komunikasi menunjukkan adanya kesinambungan yang konsisten antara ekspektasi pesan dengan respon kognitif audiens sasaran. Secara metodologis setiap indikator konstruk diuji melalui parameter reliabilitas komposit yang memenuhi batas keterandalan statistik secara optimal. Analisis mendalam mengenai dinamika komunikasi menunjukkan adanya kesinambungan yang konsisten antara ekspektasi pesan dengan respon kognitif audiens sasaran. Secara metodologis setiap indikator konstruk diuji melalui parameter reliabilitas komposit yang memenuhi batas keterandalan statistik secara optimal. Analisis mendalam mengenai dinamika komunikasi menunjukkan adanya kesinambungan yang konsisten antara ekspektasi pesan dengan respon kognitif audiens sasaran. Secara metodologis setiap indikator konstruk diuji melalui parameter reliabilitas komposit yang memenuhi batas keterandalan statistik secara optimal. Analisis mendalam mengenai dinamika komunikasi menunjukkan adanya kesinambungan yang konsisten antara ekspektasi pesan dengan respon kognitif audiens sasaran. Secara metodologis setiap indikator konstruk diuji melalui parameter reliabilitas komposit yang memenuhi batas keterandalan statistik secara optimal. Analisis mendalam mengenai dinamika komunikasi menunjukkan adanya kesinambungan yang konsisten antara ekspektasi pesan dengan respon kognitif audiens sasaran. Secara metodologis setiap indikator konstruk diuji melalui parameter reliabilitas komposit yang memenuhi batas keterandalan statistik secara optimal. Analisis mendalam mengenai dinamika komunikasi menunjukkan adanya kesinambungan yang konsisten antara ekspektasi pesan dengan respon kognitif audiens sasaran. Secara metodologis setiap indikator konstruk diuji melalui parameter reliabilitas komposit yang memenuhi batas keterandalan statistik secara optimal. Analisis mendalam mengenai dinamika komunikasi menunjukkan adanya kesinambungan yang konsisten antara ekspektasi pesan dengan respon kognitif audiens sasaran. Secara metodologis setiap indikator konstruk diuji melalui parameter reliabilitas komposit yang memenuhi batas keterandalan statistik secara optimal. Analisis mendalam mengenai dinamika komunikasi menunjukkan adanya kesinambungan yang konsisten antara ekspektasi pesan dengan respon kognitif audiens sasaran. Secara metodologis setiap indikator konstruk diuji melalui parameter reliabilitas komposit yang memenuhi batas keterandalan statistik secara optimal. Analisis mendalam mengenai dinamika komunikasi menunjukkan adanya kesinambungan yang konsisten antara ekspektasi pesan dengan respon kognitif audiens sasaran. Secara metodologis setiap indikator konstruk diuji melalui parameter reliabilitas komposit yang memenuhi batas keterandalan statistik secara optimal. Analisis mendalam mengenai dinamika komunikasi menunjukkan adanya kesinambungan yang konsisten antara ekspektasi pesan dengan respon kognitif audiens sasaran. Secara metodologis setiap indikator konstruk diuji melalui parameter reliabilitas komposit yang memenuhi batas keterandalan statistik secara optimal.</w:t>
       </w:r>
     </w:p>
     <w:p>
@@ -772,7 +772,7 @@
           <w:rFonts w:ascii="Times New Roman" w:hAnsi="Times New Roman"/>
           <w:sz w:val="24"/>
         </w:rPr>
-        <w:t>Analisis mendalam mengenai dinamika komunikasi menunjukkan adanya kesinambungan yang konsisten antara ekspektasi pesan dengan respon kognitif audiens sasaran. Secara metodologis setiap indikator konstruk diuji melalui parameter reliabilitas komposit yang memenuhi batas keterandalan statistik secara optimal. Analisis mendalam mengenai dinamika komunikasi menunjukkan adanya kesinambungan yang konsisten antara ekspektasi pesan dengan respon kognitif audiens sasaran. Secara metodologis setiap indikator konstruk diuji melalui parameter reliabilitas komposit yang memenuhi batas keterandalan statistik secara optimal. Analisis mendalam mengenai dinamika komunikasi menunjukkan adanya kesinambungan yang konsisten antara ekspektasi pesan dengan respon kognitif audiens sasaran. Secara metodologis setiap indikator konstruk diuji melalui parameter reliabilitas komposit yang memenuhi batas keterandalan statistik secara optimal. Analisis mendalam mengenai dinamika komunikasi menunjukkan adanya kesinambungan yang konsisten antara ekspektasi pesan dengan respon kognitif audiens sasaran. Secara metodologis setiap indikator konstruk diuji melalui parameter reliabilitas komposit yang memenuhi batas keterandalan statistik secara optimal. Analisis mendalam mengenai dinamika komunikasi menunjukkan adanya kesinambungan yang konsisten antara ekspektasi pesan dengan respon kognitif audiens sasaran. Secara metodologis setiap indikator konstruk diuji melalui parameter reliabilitas komposit yang memenuhi batas keterandalan statistik secara optimal. Analisis mendalam mengenai dinamika komunikasi menunjukkan adanya kesinambungan yang konsisten antara ekspektasi pesan dengan respon kognitif audiens sasaran. Secara metodologis setiap indikator konstruk diuji melalui parameter reliabilitas komposit yang memenuhi batas keterandalan statistik secara optimal. Analisis mendalam mengenai dinamika komunikasi menunjukkan adanya kesinambungan yang konsisten antara ekspektasi pesan dengan respon kognitif audiens sasaran. Secara metodologis setiap indikator konstruk diuji melalui parameter reliabilitas komposit yang memenuhi batas keterandalan statistik secara optimal. Analisis mendalam mengenai dinamika komunikasi menunjukkan adanya kesinambungan yang konsisten antara ekspektasi pesan dengan respon kognitif audiens sasaran. Secara metodologis setiap indikator konstruk diuji melalui parameter reliabilitas komposit yang memenuhi batas keterandalan statistik secara optimal. Analisis mendalam mengenai dinamika komunikasi menunjukkan adanya kesinambungan yang konsisten antara ekspektasi pesan dengan respon kognitif audiens sasaran. Secara metodologis setiap indikator konstruk diuji melalui parameter reliabilitas komposit yang memenuhi batas keterandalan statistik secara optimal. Analisis mendalam mengenai dinamika komunikasi menunjukkan adanya kesinambungan yang konsisten antara ekspektasi pesan dengan respon kognitif audiens sasaran. Secara metodologis setiap indikator konstruk diuji melalui parameter reliabilitas komposit yang memenuhi batas keterandalan statistik secara optimal. Analisis mendalam mengenai dinamika komunikasi menunjukkan adanya kesinambungan yang konsisten antara ekspektasi pesan dengan respon kognitif audiens sasaran. Secara metodologis setiap indikator konstruk diuji melalui parameter reliabilitas komposit yang memenuhi batas keterandalan statistik secara optimal. Analisis mendalam mengenai dinamika komunikasi menunjukkan adanya kesinambungan yang konsisten antara ekspektasi pesan dengan respon kognitif audiens sasaran. Secara metodologis setiap indikator konstruk diuji melalui parameter reliabilitas komposit yang memenuhi batas keterandalan statistik secara optimal. Analisis mendalam mengenai dinamika komunikasi menunjukkan adanya kesinambungan yang konsisten antara ekspektasi pesan dengan respon kognitif audiens sasaran. Secara metodologis setiap indikator konstruk diuji melalui parameter reliabilitas komposit yang memenuhi batas keterandalan statistik secara optimal. Analisis mendalam mengenai dinamika komunikasi menunjukkan adanya kesinambungan yang konsisten antara ekspektasi pesan dengan respon kognitif audiens sasaran. Secara metodologis setiap indikator konstruk diuji melalui parameter reliabilitas komposit yang memenuhi batas keterandalan statistik secara optimal. Analisis mendalam mengenai dinamika komunikasi menunjukkan adanya kesinambungan yang konsisten antara ekspektasi pesan dengan respon kognitif audiens sasaran. Secara metodologis setiap indikator konstruk diuji melalui parameter reliabilitas komposit yang memenuhi batas keterandalan statistik secara optimal.</w:t>
+        <w:t>Analisis mendalam mengenai dinamika komunikasi menunjukkan adanya kesinambungan yang konsisten antara ekspektasi pesan dengan respon kognitif audiens sasaran. Secara metodologis setiap indikator konstruk diuji melalui parameter reliabilitas komposit yang memenuhi batas keterandalan statistik secara optimal. Analisis mendalam mengenai dinamika komunikasi menunjukkan adanya kesinambungan yang konsisten antara ekspektasi pesan dengan respon kognitif audiens sasaran. Secara metodologis setiap indikator konstruk diuji melalui parameter reliabilitas komposit yang memenuhi batas keterandalan statistik secara optimal. Analisis mendalam mengenai dinamika komunikasi menunjukkan adanya kesinambungan yang konsisten antara ekspektasi pesan dengan respon kognitif audiens sasaran. Secara metodologis setiap indikator konstruk diuji melalui parameter reliabilitas komposit yang memenuhi batas keterandalan statistik secara optimal. Analisis mendalam mengenai dinamika komunikasi menunjukkan adanya kesinambungan yang konsisten antara ekspektasi pesan dengan respon kognitif audiens sasaran. Secara metodologis setiap indikator konstruk diuji melalui parameter reliabilitas komposit yang memenuhi batas keterandalan statistik secara optimal. Analisis mendalam mengenai dinamika komunikasi menunjukkan adanya kesinambungan yang konsisten antara ekspektasi pesan dengan respon kognitif audiens sasaran. Secara metodologis setiap indikator konstruk diuji melalui parameter reliabilitas komposit yang memenuhi batas keterandalan statistik secara optimal. Analisis mendalam mengenai dinamika komunikasi menunjukkan adanya kesinambungan yang konsisten antara ekspektasi pesan dengan respon kognitif audiens sasaran. Secara metodologis setiap indikator konstruk diuji melalui parameter reliabilitas komposit yang memenuhi batas keterandalan statistik secara optimal. Analisis mendalam mengenai dinamika komunikasi menunjukkan adanya kesinambungan yang konsisten antara ekspektasi pesan dengan respon kognitif audiens sasaran. Secara metodologis setiap indikator konstruk diuji melalui parameter reliabilitas komposit yang memenuhi batas keterandalan statistik secara optimal. Analisis mendalam mengenai dinamika komunikasi menunjukkan adanya kesinambungan yang konsisten antara ekspektasi pesan dengan respon kognitif audiens sasaran. Secara metodologis setiap indikator konstruk diuji melalui parameter reliabilitas komposit yang memenuhi batas keterandalan statistik secara optimal. Analisis mendalam mengenai dinamika komunikasi menunjukkan adanya kesinambungan yang konsisten antara ekspektasi pesan dengan respon kognitif audiens sasaran. Secara metodologis setiap indikator konstruk diuji melalui parameter reliabilitas komposit yang memenuhi batas keterandalan statistik secara optimal. Analisis mendalam mengenai dinamika komunikasi menunjukkan adanya kesinambungan yang konsisten antara ekspektasi pesan dengan respon kognitif audiens sasaran. Secara metodologis setiap indikator konstruk diuji melalui parameter reliabilitas komposit yang memenuhi batas keterandalan statistik secara optimal. Analisis mendalam mengenai dinamika komunikasi menunjukkan adanya kesinambungan yang konsisten antara ekspektasi pesan dengan respon kognitif audiens sasaran. Secara metodologis setiap indikator konstruk diuji melalui parameter reliabilitas komposit yang memenuhi batas keterandalan statistik secara optimal. Analisis mendalam mengenai dinamika komunikasi menunjukkan adanya kesinambungan yang konsisten antara ekspektasi pesan dengan respon kognitif audiens sasaran. Secara metodologis setiap indikator konstruk diuji melalui parameter reliabilitas komposit yang memenuhi batas keterandalan statistik secara optimal.</w:t>
       </w:r>
     </w:p>
     <w:p>
@@ -785,7 +785,7 @@
           <w:rFonts w:ascii="Times New Roman" w:hAnsi="Times New Roman"/>
           <w:sz w:val="24"/>
         </w:rPr>
-        <w:t>Analisis mendalam mengenai dinamika komunikasi menunjukkan adanya kesinambungan yang konsisten antara ekspektasi pesan dengan respon kognitif audiens sasaran. Secara metodologis setiap indikator konstruk diuji melalui parameter reliabilitas komposit yang memenuhi batas keterandalan statistik secara optimal. Analisis mendalam mengenai dinamika komunikasi menunjukkan adanya kesinambungan yang konsisten antara ekspektasi pesan dengan respon kognitif audiens sasaran. Secara metodologis setiap indikator konstruk diuji melalui parameter reliabilitas komposit yang memenuhi batas keterandalan statistik secara optimal. Analisis mendalam mengenai dinamika komunikasi menunjukkan adanya kesinambungan yang konsisten antara ekspektasi pesan dengan respon kognitif audiens sasaran. Secara metodologis setiap indikator konstruk diuji melalui parameter reliabilitas komposit yang memenuhi batas keterandalan statistik secara optimal. Analisis mendalam mengenai dinamika komunikasi menunjukkan adanya kesinambungan yang konsisten antara ekspektasi pesan dengan respon kognitif audiens sasaran. Secara metodologis setiap indikator konstruk diuji melalui parameter reliabilitas komposit yang memenuhi batas keterandalan statistik secara optimal. Analisis mendalam mengenai dinamika komunikasi menunjukkan adanya kesinambungan yang konsisten antara ekspektasi pesan dengan respon kognitif audiens sasaran. Secara metodologis setiap indikator konstruk diuji melalui parameter reliabilitas komposit yang memenuhi batas keterandalan statistik secara optimal. Analisis mendalam mengenai dinamika komunikasi menunjukkan adanya kesinambungan yang konsisten antara ekspektasi pesan dengan respon kognitif audiens sasaran. Secara metodologis setiap indikator konstruk diuji melalui parameter reliabilitas komposit yang memenuhi batas keterandalan statistik secara optimal. Analisis mendalam mengenai dinamika komunikasi menunjukkan adanya kesinambungan yang konsisten antara ekspektasi pesan dengan respon kognitif audiens sasaran. Secara metodologis setiap indikator konstruk diuji melalui parameter reliabilitas komposit yang memenuhi batas keterandalan statistik secara optimal. Analisis mendalam mengenai dinamika komunikasi menunjukkan adanya kesinambungan yang konsisten antara ekspektasi pesan dengan respon kognitif audiens sasaran. Secara metodologis setiap indikator konstruk diuji melalui parameter reliabilitas komposit yang memenuhi batas keterandalan statistik secara optimal. Analisis mendalam mengenai dinamika komunikasi menunjukkan adanya kesinambungan yang konsisten antara ekspektasi pesan dengan respon kognitif audiens sasaran. Secara metodologis setiap indikator konstruk diuji melalui parameter reliabilitas komposit yang memenuhi batas keterandalan statistik secara optimal. Analisis mendalam mengenai dinamika komunikasi menunjukkan adanya kesinambungan yang konsisten antara ekspektasi pesan dengan respon kognitif audiens sasaran. Secara metodologis setiap indikator konstruk diuji melalui parameter reliabilitas komposit yang memenuhi batas keterandalan statistik secara optimal. Analisis mendalam mengenai dinamika komunikasi menunjukkan adanya kesinambungan yang konsisten antara ekspektasi pesan dengan respon kognitif audiens sasaran. Secara metodologis setiap indikator konstruk diuji melalui parameter reliabilitas komposit yang memenuhi batas keterandalan statistik secara optimal. Analisis mendalam mengenai dinamika komunikasi menunjukkan adanya kesinambungan yang konsisten antara ekspektasi pesan dengan respon kognitif audiens sasaran. Secara metodologis setiap indikator konstruk diuji melalui parameter reliabilitas komposit yang memenuhi batas keterandalan statistik secara optimal. Analisis mendalam mengenai dinamika komunikasi menunjukkan adanya kesinambungan yang konsisten antara ekspektasi pesan dengan respon kognitif audiens sasaran. Secara metodologis setiap indikator konstruk diuji melalui parameter reliabilitas komposit yang memenuhi batas keterandalan statistik secara optimal. Analisis mendalam mengenai dinamika komunikasi menunjukkan adanya kesinambungan yang konsisten antara ekspektasi pesan dengan respon kognitif audiens sasaran. Secara metodologis setiap indikator konstruk diuji melalui parameter reliabilitas komposit yang memenuhi batas keterandalan statistik secara optimal. Analisis mendalam mengenai dinamika komunikasi menunjukkan adanya kesinambungan yang konsisten antara ekspektasi pesan dengan respon kognitif audiens sasaran. Secara metodologis setiap indikator konstruk diuji melalui parameter reliabilitas komposit yang memenuhi batas keterandalan statistik secara optimal.</w:t>
+        <w:t>Analisis mendalam mengenai dinamika komunikasi menunjukkan adanya kesinambungan yang konsisten antara ekspektasi pesan dengan respon kognitif audiens sasaran. Secara metodologis setiap indikator konstruk diuji melalui parameter reliabilitas komposit yang memenuhi batas keterandalan statistik secara optimal. Analisis mendalam mengenai dinamika komunikasi menunjukkan adanya kesinambungan yang konsisten antara ekspektasi pesan dengan respon kognitif audiens sasaran. Secara metodologis setiap indikator konstruk diuji melalui parameter reliabilitas komposit yang memenuhi batas keterandalan statistik secara optimal. Analisis mendalam mengenai dinamika komunikasi menunjukkan adanya kesinambungan yang konsisten antara ekspektasi pesan dengan respon kognitif audiens sasaran. Secara metodologis setiap indikator konstruk diuji melalui parameter reliabilitas komposit yang memenuhi batas keterandalan statistik secara optimal. Analisis mendalam mengenai dinamika komunikasi menunjukkan adanya kesinambungan yang konsisten antara ekspektasi pesan dengan respon kognitif audiens sasaran. Secara metodologis setiap indikator konstruk diuji melalui parameter reliabilitas komposit yang memenuhi batas keterandalan statistik secara optimal. Analisis mendalam mengenai dinamika komunikasi menunjukkan adanya kesinambungan yang konsisten antara ekspektasi pesan dengan respon kognitif audiens sasaran. Secara metodologis setiap indikator konstruk diuji melalui parameter reliabilitas komposit yang memenuhi batas keterandalan statistik secara optimal. Analisis mendalam mengenai dinamika komunikasi menunjukkan adanya kesinambungan yang konsisten antara ekspektasi pesan dengan respon kognitif audiens sasaran. Secara metodologis setiap indikator konstruk diuji melalui parameter reliabilitas komposit yang memenuhi batas keterandalan statistik secara optimal. Analisis mendalam mengenai dinamika komunikasi menunjukkan adanya kesinambungan yang konsisten antara ekspektasi pesan dengan respon kognitif audiens sasaran. Secara metodologis setiap indikator konstruk diuji melalui parameter reliabilitas komposit yang memenuhi batas keterandalan statistik secara optimal. Analisis mendalam mengenai dinamika komunikasi menunjukkan adanya kesinambungan yang konsisten antara ekspektasi pesan dengan respon kognitif audiens sasaran. Secara metodologis setiap indikator konstruk diuji melalui parameter reliabilitas komposit yang memenuhi batas keterandalan statistik secara optimal. Analisis mendalam mengenai dinamika komunikasi menunjukkan adanya kesinambungan yang konsisten antara ekspektasi pesan dengan respon kognitif audiens sasaran. Secara metodologis setiap indikator konstruk diuji melalui parameter reliabilitas komposit yang memenuhi batas keterandalan statistik secara optimal. Analisis mendalam mengenai dinamika komunikasi menunjukkan adanya kesinambungan yang konsisten antara ekspektasi pesan dengan respon kognitif audiens sasaran. Secara metodologis setiap indikator konstruk diuji melalui parameter reliabilitas komposit yang memenuhi batas keterandalan statistik secara optimal. Analisis mendalam mengenai dinamika komunikasi menunjukkan adanya kesinambungan yang konsisten antara ekspektasi pesan dengan respon kognitif audiens sasaran. Secara metodologis setiap indikator konstruk diuji melalui parameter reliabilitas komposit yang memenuhi batas keterandalan statistik secara optimal. Analisis mendalam mengenai dinamika komunikasi menunjukkan adanya kesinambungan yang konsisten antara ekspektasi pesan dengan respon kognitif audiens sasaran. Secara metodologis setiap indikator konstruk diuji melalui parameter reliabilitas komposit yang memenuhi batas keterandalan statistik secara optimal.</w:t>
       </w:r>
     </w:p>
     <w:p>
@@ -798,7 +798,7 @@
           <w:rFonts w:ascii="Times New Roman" w:hAnsi="Times New Roman"/>
           <w:sz w:val="24"/>
         </w:rPr>
-        <w:t>Analisis mendalam mengenai dinamika komunikasi menunjukkan adanya kesinambungan yang konsisten antara ekspektasi pesan dengan respon kognitif audiens sasaran. Secara metodologis setiap indikator konstruk diuji melalui parameter reliabilitas komposit yang memenuhi batas keterandalan statistik secara optimal. Analisis mendalam mengenai dinamika komunikasi menunjukkan adanya kesinambungan yang konsisten antara ekspektasi pesan dengan respon kognitif audiens sasaran. Secara metodologis setiap indikator konstruk diuji melalui parameter reliabilitas komposit yang memenuhi batas keterandalan statistik secara optimal. Analisis mendalam mengenai dinamika komunikasi menunjukkan adanya kesinambungan yang konsisten antara ekspektasi pesan dengan respon kognitif audiens sasaran. Secara metodologis setiap indikator konstruk diuji melalui parameter reliabilitas komposit yang memenuhi batas keterandalan statistik secara optimal. Analisis mendalam mengenai dinamika komunikasi menunjukkan adanya kesinambungan yang konsisten antara ekspektasi pesan dengan respon kognitif audiens sasaran. Secara metodologis setiap indikator konstruk diuji melalui parameter reliabilitas komposit yang memenuhi batas keterandalan statistik secara optimal. Analisis mendalam mengenai dinamika komunikasi menunjukkan adanya kesinambungan yang konsisten antara ekspektasi pesan dengan respon kognitif audiens sasaran. Secara metodologis setiap indikator konstruk diuji melalui parameter reliabilitas komposit yang memenuhi batas keterandalan statistik secara optimal. Analisis mendalam mengenai dinamika komunikasi menunjukkan adanya kesinambungan yang konsisten antara ekspektasi pesan dengan respon kognitif audiens sasaran. Secara metodologis setiap indikator konstruk diuji melalui parameter reliabilitas komposit yang memenuhi batas keterandalan statistik secara optimal. Analisis mendalam mengenai dinamika komunikasi menunjukkan adanya kesinambungan yang konsisten antara ekspektasi pesan dengan respon kognitif audiens sasaran. Secara metodologis setiap indikator konstruk diuji melalui parameter reliabilitas komposit yang memenuhi batas keterandalan statistik secara optimal. Analisis mendalam mengenai dinamika komunikasi menunjukkan adanya kesinambungan yang konsisten antara ekspektasi pesan dengan respon kognitif audiens sasaran. Secara metodologis setiap indikator konstruk diuji melalui parameter reliabilitas komposit yang memenuhi batas keterandalan statistik secara optimal. Analisis mendalam mengenai dinamika komunikasi menunjukkan adanya kesinambungan yang konsisten antara ekspektasi pesan dengan respon kognitif audiens sasaran. Secara metodologis setiap indikator konstruk diuji melalui parameter reliabilitas komposit yang memenuhi batas keterandalan statistik secara optimal. Analisis mendalam mengenai dinamika komunikasi menunjukkan adanya kesinambungan yang konsisten antara ekspektasi pesan dengan respon kognitif audiens sasaran. Secara metodologis setiap indikator konstruk diuji melalui parameter reliabilitas komposit yang memenuhi batas keterandalan statistik secara optimal. Analisis mendalam mengenai dinamika komunikasi menunjukkan adanya kesinambungan yang konsisten antara ekspektasi pesan dengan respon kognitif audiens sasaran. Secara metodologis setiap indikator konstruk diuji melalui parameter reliabilitas komposit yang memenuhi batas keterandalan statistik secara optimal. Analisis mendalam mengenai dinamika komunikasi menunjukkan adanya kesinambungan yang konsisten antara ekspektasi pesan dengan respon kognitif audiens sasaran. Secara metodologis setiap indikator konstruk diuji melalui parameter reliabilitas komposit yang memenuhi batas keterandalan statistik secara optimal. Analisis mendalam mengenai dinamika komunikasi menunjukkan adanya kesinambungan yang konsisten antara ekspektasi pesan dengan respon kognitif audiens sasaran. Secara metodologis setiap indikator konstruk diuji melalui parameter reliabilitas komposit yang memenuhi batas keterandalan statistik secara optimal. Analisis mendalam mengenai dinamika komunikasi menunjukkan adanya kesinambungan yang konsisten antara ekspektasi pesan dengan respon kognitif audiens sasaran. Secara metodologis setiap indikator konstruk diuji melalui parameter reliabilitas komposit yang memenuhi batas keterandalan statistik secara optimal. Analisis mendalam mengenai dinamika komunikasi menunjukkan adanya kesinambungan yang konsisten antara ekspektasi pesan dengan respon kognitif audiens sasaran. Secara metodologis setiap indikator konstruk diuji melalui parameter reliabilitas komposit yang memenuhi batas keterandalan statistik secara optimal.</w:t>
+        <w:t>Analisis mendalam mengenai dinamika komunikasi menunjukkan adanya kesinambungan yang konsisten antara ekspektasi pesan dengan respon kognitif audiens sasaran. Secara metodologis setiap indikator konstruk diuji melalui parameter reliabilitas komposit yang memenuhi batas keterandalan statistik secara optimal. Analisis mendalam mengenai dinamika komunikasi menunjukkan adanya kesinambungan yang konsisten antara ekspektasi pesan dengan respon kognitif audiens sasaran. Secara metodologis setiap indikator konstruk diuji melalui parameter reliabilitas komposit yang memenuhi batas keterandalan statistik secara optimal. Analisis mendalam mengenai dinamika komunikasi menunjukkan adanya kesinambungan yang konsisten antara ekspektasi pesan dengan respon kognitif audiens sasaran. Secara metodologis setiap indikator konstruk diuji melalui parameter reliabilitas komposit yang memenuhi batas keterandalan statistik secara optimal. Analisis mendalam mengenai dinamika komunikasi menunjukkan adanya kesinambungan yang konsisten antara ekspektasi pesan dengan respon kognitif audiens sasaran. Secara metodologis setiap indikator konstruk diuji melalui parameter reliabilitas komposit yang memenuhi batas keterandalan statistik secara optimal. Analisis mendalam mengenai dinamika komunikasi menunjukkan adanya kesinambungan yang konsisten antara ekspektasi pesan dengan respon kognitif audiens sasaran. Secara metodologis setiap indikator konstruk diuji melalui parameter reliabilitas komposit yang memenuhi batas keterandalan statistik secara optimal. Analisis mendalam mengenai dinamika komunikasi menunjukkan adanya kesinambungan yang konsisten antara ekspektasi pesan dengan respon kognitif audiens sasaran. Secara metodologis setiap indikator konstruk diuji melalui parameter reliabilitas komposit yang memenuhi batas keterandalan statistik secara optimal. Analisis mendalam mengenai dinamika komunikasi menunjukkan adanya kesinambungan yang konsisten antara ekspektasi pesan dengan respon kognitif audiens sasaran. Secara metodologis setiap indikator konstruk diuji melalui parameter reliabilitas komposit yang memenuhi batas keterandalan statistik secara optimal. Analisis mendalam mengenai dinamika komunikasi menunjukkan adanya kesinambungan yang konsisten antara ekspektasi pesan dengan respon kognitif audiens sasaran. Secara metodologis setiap indikator konstruk diuji melalui parameter reliabilitas komposit yang memenuhi batas keterandalan statistik secara optimal. Analisis mendalam mengenai dinamika komunikasi menunjukkan adanya kesinambungan yang konsisten antara ekspektasi pesan dengan respon kognitif audiens sasaran. Secara metodologis setiap indikator konstruk diuji melalui parameter reliabilitas komposit yang memenuhi batas keterandalan statistik secara optimal. Analisis mendalam mengenai dinamika komunikasi menunjukkan adanya kesinambungan yang konsisten antara ekspektasi pesan dengan respon kognitif audiens sasaran. Secara metodologis setiap indikator konstruk diuji melalui parameter reliabilitas komposit yang memenuhi batas keterandalan statistik secara optimal. Analisis mendalam mengenai dinamika komunikasi menunjukkan adanya kesinambungan yang konsisten antara ekspektasi pesan dengan respon kognitif audiens sasaran. Secara metodologis setiap indikator konstruk diuji melalui parameter reliabilitas komposit yang memenuhi batas keterandalan statistik secara optimal. Analisis mendalam mengenai dinamika komunikasi menunjukkan adanya kesinambungan yang konsisten antara ekspektasi pesan dengan respon kognitif audiens sasaran. Secara metodologis setiap indikator konstruk diuji melalui parameter reliabilitas komposit yang memenuhi batas keterandalan statistik secara optimal.</w:t>
       </w:r>
     </w:p>
     <w:p>
@@ -811,7 +811,7 @@
           <w:rFonts w:ascii="Times New Roman" w:hAnsi="Times New Roman"/>
           <w:sz w:val="24"/>
         </w:rPr>
-        <w:t>Analisis mendalam mengenai dinamika komunikasi menunjukkan adanya kesinambungan yang konsisten antara ekspektasi pesan dengan respon kognitif audiens sasaran. Secara metodologis setiap indikator konstruk diuji melalui parameter reliabilitas komposit yang memenuhi batas keterandalan statistik secara optimal. Analisis mendalam mengenai dinamika komunikasi menunjukkan adanya kesinambungan yang konsisten antara ekspektasi pesan dengan respon kognitif audiens sasaran. Secara metodologis setiap indikator konstruk diuji melalui parameter reliabilitas komposit yang memenuhi batas keterandalan statistik secara optimal. Analisis mendalam mengenai dinamika komunikasi menunjukkan adanya kesinambungan yang konsisten antara ekspektasi pesan dengan respon kognitif audiens sasaran. Secara metodologis setiap indikator konstruk diuji melalui parameter reliabilitas komposit yang memenuhi batas keterandalan statistik secara optimal. Analisis mendalam mengenai dinamika komunikasi menunjukkan adanya kesinambungan yang konsisten antara ekspektasi pesan dengan respon kognitif audiens sasaran. Secara metodologis setiap indikator konstruk diuji melalui parameter reliabilitas komposit yang memenuhi batas keterandalan statistik secara optimal. Analisis mendalam mengenai dinamika komunikasi menunjukkan adanya kesinambungan yang konsisten antara ekspektasi pesan dengan respon kognitif audiens sasaran. Secara metodologis setiap indikator konstruk diuji melalui parameter reliabilitas komposit yang memenuhi batas keterandalan statistik secara optimal. Analisis mendalam mengenai dinamika komunikasi menunjukkan adanya kesinambungan yang konsisten antara ekspektasi pesan dengan respon kognitif audiens sasaran. Secara metodologis setiap indikator konstruk diuji melalui parameter reliabilitas komposit yang memenuhi batas keterandalan statistik secara optimal. Analisis mendalam mengenai dinamika komunikasi menunjukkan adanya kesinambungan yang konsisten antara ekspektasi pesan dengan respon kognitif audiens sasaran. Secara metodologis setiap indikator konstruk diuji melalui parameter reliabilitas komposit yang memenuhi batas keterandalan statistik secara optimal. Analisis mendalam mengenai dinamika komunikasi menunjukkan adanya kesinambungan yang konsisten antara ekspektasi pesan dengan respon kognitif audiens sasaran. Secara metodologis setiap indikator konstruk diuji melalui parameter reliabilitas komposit yang memenuhi batas keterandalan statistik secara optimal. Analisis mendalam mengenai dinamika komunikasi menunjukkan adanya kesinambungan yang konsisten antara ekspektasi pesan dengan respon kognitif audiens sasaran. Secara metodologis setiap indikator konstruk diuji melalui parameter reliabilitas komposit yang memenuhi batas keterandalan statistik secara optimal. Analisis mendalam mengenai dinamika komunikasi menunjukkan adanya kesinambungan yang konsisten antara ekspektasi pesan dengan respon kognitif audiens sasaran. Secara metodologis setiap indikator konstruk diuji melalui parameter reliabilitas komposit yang memenuhi batas keterandalan statistik secara optimal. Analisis mendalam mengenai dinamika komunikasi menunjukkan adanya kesinambungan yang konsisten antara ekspektasi pesan dengan respon kognitif audiens sasaran. Secara metodologis setiap indikator konstruk diuji melalui parameter reliabilitas komposit yang memenuhi batas keterandalan statistik secara optimal. Analisis mendalam mengenai dinamika komunikasi menunjukkan adanya kesinambungan yang konsisten antara ekspektasi pesan dengan respon kognitif audiens sasaran. Secara metodologis setiap indikator konstruk diuji melalui parameter reliabilitas komposit yang memenuhi batas keterandalan statistik secara optimal. Analisis mendalam mengenai dinamika komunikasi menunjukkan adanya kesinambungan yang konsisten antara ekspektasi pesan dengan respon kognitif audiens sasaran. Secara metodologis setiap indikator konstruk diuji melalui parameter reliabilitas komposit yang memenuhi batas keterandalan statistik secara optimal. Analisis mendalam mengenai dinamika komunikasi menunjukkan adanya kesinambungan yang konsisten antara ekspektasi pesan dengan respon kognitif audiens sasaran. Secara metodologis setiap indikator konstruk diuji melalui parameter reliabilitas komposit yang memenuhi batas keterandalan statistik secara optimal. Analisis mendalam mengenai dinamika komunikasi menunjukkan adanya kesinambungan yang konsisten antara ekspektasi pesan dengan respon kognitif audiens sasaran. Secara metodologis setiap indikator konstruk diuji melalui parameter reliabilitas komposit yang memenuhi batas keterandalan statistik secara optimal.</w:t>
+        <w:t>Analisis mendalam mengenai dinamika komunikasi menunjukkan adanya kesinambungan yang konsisten antara ekspektasi pesan dengan respon kognitif audiens sasaran. Secara metodologis setiap indikator konstruk diuji melalui parameter reliabilitas komposit yang memenuhi batas keterandalan statistik secara optimal. Analisis mendalam mengenai dinamika komunikasi menunjukkan adanya kesinambungan yang konsisten antara ekspektasi pesan dengan respon kognitif audiens sasaran. Secara metodologis setiap indikator konstruk diuji melalui parameter reliabilitas komposit yang memenuhi batas keterandalan statistik secara optimal. Analisis mendalam mengenai dinamika komunikasi menunjukkan adanya kesinambungan yang konsisten antara ekspektasi pesan dengan respon kognitif audiens sasaran. Secara metodologis setiap indikator konstruk diuji melalui parameter reliabilitas komposit yang memenuhi batas keterandalan statistik secara optimal. Analisis mendalam mengenai dinamika komunikasi menunjukkan adanya kesinambungan yang konsisten antara ekspektasi pesan dengan respon kognitif audiens sasaran. Secara metodologis setiap indikator konstruk diuji melalui parameter reliabilitas komposit yang memenuhi batas keterandalan statistik secara optimal. Analisis mendalam mengenai dinamika komunikasi menunjukkan adanya kesinambungan yang konsisten antara ekspektasi pesan dengan respon kognitif audiens sasaran. Secara metodologis setiap indikator konstruk diuji melalui parameter reliabilitas komposit yang memenuhi batas keterandalan statistik secara optimal. Analisis mendalam mengenai dinamika komunikasi menunjukkan adanya kesinambungan yang konsisten antara ekspektasi pesan dengan respon kognitif audiens sasaran. Secara metodologis setiap indikator konstruk diuji melalui parameter reliabilitas komposit yang memenuhi batas keterandalan statistik secara optimal. Analisis mendalam mengenai dinamika komunikasi menunjukkan adanya kesinambungan yang konsisten antara ekspektasi pesan dengan respon kognitif audiens sasaran. Secara metodologis setiap indikator konstruk diuji melalui parameter reliabilitas komposit yang memenuhi batas keterandalan statistik secara optimal. Analisis mendalam mengenai dinamika komunikasi menunjukkan adanya kesinambungan yang konsisten antara ekspektasi pesan dengan respon kognitif audiens sasaran. Secara metodologis setiap indikator konstruk diuji melalui parameter reliabilitas komposit yang memenuhi batas keterandalan statistik secara optimal. Analisis mendalam mengenai dinamika komunikasi menunjukkan adanya kesinambungan yang konsisten antara ekspektasi pesan dengan respon kognitif audiens sasaran. Secara metodologis setiap indikator konstruk diuji melalui parameter reliabilitas komposit yang memenuhi batas keterandalan statistik secara optimal. Analisis mendalam mengenai dinamika komunikasi menunjukkan adanya kesinambungan yang konsisten antara ekspektasi pesan dengan respon kognitif audiens sasaran. Secara metodologis setiap indikator konstruk diuji melalui parameter reliabilitas komposit yang memenuhi batas keterandalan statistik secara optimal. Analisis mendalam mengenai dinamika komunikasi menunjukkan adanya kesinambungan yang konsisten antara ekspektasi pesan dengan respon kognitif audiens sasaran. Secara metodologis setiap indikator konstruk diuji melalui parameter reliabilitas komposit yang memenuhi batas keterandalan statistik secara optimal. Analisis mendalam mengenai dinamika komunikasi menunjukkan adanya kesinambungan yang konsisten antara ekspektasi pesan dengan respon kognitif audiens sasaran. Secara metodologis setiap indikator konstruk diuji melalui parameter reliabilitas komposit yang memenuhi batas keterandalan statistik secara optimal.</w:t>
       </w:r>
     </w:p>
     <w:p>
@@ -824,7 +824,7 @@
           <w:rFonts w:ascii="Times New Roman" w:hAnsi="Times New Roman"/>
           <w:sz w:val="24"/>
         </w:rPr>
-        <w:t>Analisis mendalam mengenai dinamika komunikasi menunjukkan adanya kesinambungan yang konsisten antara ekspektasi pesan dengan respon kognitif audiens sasaran. Secara metodologis setiap indikator konstruk diuji melalui parameter reliabilitas komposit yang memenuhi batas keterandalan statistik secara optimal. Analisis mendalam mengenai dinamika komunikasi menunjukkan adanya kesinambungan yang konsisten antara ekspektasi pesan dengan respon kognitif audiens sasaran. Secara metodologis setiap indikator konstruk diuji melalui parameter reliabilitas komposit yang memenuhi batas keterandalan statistik secara optimal. Analisis mendalam mengenai dinamika komunikasi menunjukkan adanya kesinambungan yang konsisten antara ekspektasi pesan dengan respon kognitif audiens sasaran. Secara metodologis setiap indikator konstruk diuji melalui parameter reliabilitas komposit yang memenuhi batas keterandalan statistik secara optimal. Analisis mendalam mengenai dinamika komunikasi menunjukkan adanya kesinambungan yang konsisten antara ekspektasi pesan dengan respon kognitif audiens sasaran. Secara metodologis setiap indikator konstruk diuji melalui parameter reliabilitas komposit yang memenuhi batas keterandalan statistik secara optimal. Analisis mendalam mengenai dinamika komunikasi menunjukkan adanya kesinambungan yang konsisten antara ekspektasi pesan dengan respon kognitif audiens sasaran. Secara metodologis setiap indikator konstruk diuji melalui parameter reliabilitas komposit yang memenuhi batas keterandalan statistik secara optimal. Analisis mendalam mengenai dinamika komunikasi menunjukkan adanya kesinambungan yang konsisten antara ekspektasi pesan dengan respon kognitif audiens sasaran. Secara metodologis setiap indikator konstruk diuji melalui parameter reliabilitas komposit yang memenuhi batas keterandalan statistik secara optimal. Analisis mendalam mengenai dinamika komunikasi menunjukkan adanya kesinambungan yang konsisten antara ekspektasi pesan dengan respon kognitif audiens sasaran. Secara metodologis setiap indikator konstruk diuji melalui parameter reliabilitas komposit yang memenuhi batas keterandalan statistik secara optimal. Analisis mendalam mengenai dinamika komunikasi menunjukkan adanya kesinambungan yang konsisten antara ekspektasi pesan dengan respon kognitif audiens sasaran. Secara metodologis setiap indikator konstruk diuji melalui parameter reliabilitas komposit yang memenuhi batas keterandalan statistik secara optimal. Analisis mendalam mengenai dinamika komunikasi menunjukkan adanya kesinambungan yang konsisten antara ekspektasi pesan dengan respon kognitif audiens sasaran. Secara metodologis setiap indikator konstruk diuji melalui parameter reliabilitas komposit yang memenuhi batas keterandalan statistik secara optimal. Analisis mendalam mengenai dinamika komunikasi menunjukkan adanya kesinambungan yang konsisten antara ekspektasi pesan dengan respon kognitif audiens sasaran. Secara metodologis setiap indikator konstruk diuji melalui parameter reliabilitas komposit yang memenuhi batas keterandalan statistik secara optimal. Analisis mendalam mengenai dinamika komunikasi menunjukkan adanya kesinambungan yang konsisten antara ekspektasi pesan dengan respon kognitif audiens sasaran. Secara metodologis setiap indikator konstruk diuji melalui parameter reliabilitas komposit yang memenuhi batas keterandalan statistik secara optimal. Analisis mendalam mengenai dinamika komunikasi menunjukkan adanya kesinambungan yang konsisten antara ekspektasi pesan dengan respon kognitif audiens sasaran. Secara metodologis setiap indikator konstruk diuji melalui parameter reliabilitas komposit yang memenuhi batas keterandalan statistik secara optimal. Analisis mendalam mengenai dinamika komunikasi menunjukkan adanya kesinambungan yang konsisten antara ekspektasi pesan dengan respon kognitif audiens sasaran. Secara metodologis setiap indikator konstruk diuji melalui parameter reliabilitas komposit yang memenuhi batas keterandalan statistik secara optimal. Analisis mendalam mengenai dinamika komunikasi menunjukkan adanya kesinambungan yang konsisten antara ekspektasi pesan dengan respon kognitif audiens sasaran. Secara metodologis setiap indikator konstruk diuji melalui parameter reliabilitas komposit yang memenuhi batas keterandalan statistik secara optimal. Analisis mendalam mengenai dinamika komunikasi menunjukkan adanya kesinambungan yang konsisten antara ekspektasi pesan dengan respon kognitif audiens sasaran. Secara metodologis setiap indikator konstruk diuji melalui parameter reliabilitas komposit yang memenuhi batas keterandalan statistik secara optimal.</w:t>
+        <w:t>Analisis mendalam mengenai dinamika komunikasi menunjukkan adanya kesinambungan yang konsisten antara ekspektasi pesan dengan respon kognitif audiens sasaran. Secara metodologis setiap indikator konstruk diuji melalui parameter reliabilitas komposit yang memenuhi batas keterandalan statistik secara optimal. Analisis mendalam mengenai dinamika komunikasi menunjukkan adanya kesinambungan yang konsisten antara ekspektasi pesan dengan respon kognitif audiens sasaran. Secara metodologis setiap indikator konstruk diuji melalui parameter reliabilitas komposit yang memenuhi batas keterandalan statistik secara optimal. Analisis mendalam mengenai dinamika komunikasi menunjukkan adanya kesinambungan yang konsisten antara ekspektasi pesan dengan respon kognitif audiens sasaran. Secara metodologis setiap indikator konstruk diuji melalui parameter reliabilitas komposit yang memenuhi batas keterandalan statistik secara optimal. Analisis mendalam mengenai dinamika komunikasi menunjukkan adanya kesinambungan yang konsisten antara ekspektasi pesan dengan respon kognitif audiens sasaran. Secara metodologis setiap indikator konstruk diuji melalui parameter reliabilitas komposit yang memenuhi batas keterandalan statistik secara optimal. Analisis mendalam mengenai dinamika komunikasi menunjukkan adanya kesinambungan yang konsisten antara ekspektasi pesan dengan respon kognitif audiens sasaran. Secara metodologis setiap indikator konstruk diuji melalui parameter reliabilitas komposit yang memenuhi batas keterandalan statistik secara optimal. Analisis mendalam mengenai dinamika komunikasi menunjukkan adanya kesinambungan yang konsisten antara ekspektasi pesan dengan respon kognitif audiens sasaran. Secara metodologis setiap indikator konstruk diuji melalui parameter reliabilitas komposit yang memenuhi batas keterandalan statistik secara optimal. Analisis mendalam mengenai dinamika komunikasi menunjukkan adanya kesinambungan yang konsisten antara ekspektasi pesan dengan respon kognitif audiens sasaran. Secara metodologis setiap indikator konstruk diuji melalui parameter reliabilitas komposit yang memenuhi batas keterandalan statistik secara optimal. Analisis mendalam mengenai dinamika komunikasi menunjukkan adanya kesinambungan yang konsisten antara ekspektasi pesan dengan respon kognitif audiens sasaran. Secara metodologis setiap indikator konstruk diuji melalui parameter reliabilitas komposit yang memenuhi batas keterandalan statistik secara optimal. Analisis mendalam mengenai dinamika komunikasi menunjukkan adanya kesinambungan yang konsisten antara ekspektasi pesan dengan respon kognitif audiens sasaran. Secara metodologis setiap indikator konstruk diuji melalui parameter reliabilitas komposit yang memenuhi batas keterandalan statistik secara optimal. Analisis mendalam mengenai dinamika komunikasi menunjukkan adanya kesinambungan yang konsisten antara ekspektasi pesan dengan respon kognitif audiens sasaran. Secara metodologis setiap indikator konstruk diuji melalui parameter reliabilitas komposit yang memenuhi batas keterandalan statistik secara optimal. Analisis mendalam mengenai dinamika komunikasi menunjukkan adanya kesinambungan yang konsisten antara ekspektasi pesan dengan respon kognitif audiens sasaran. Secara metodologis setiap indikator konstruk diuji melalui parameter reliabilitas komposit yang memenuhi batas keterandalan statistik secara optimal. Analisis mendalam mengenai dinamika komunikasi menunjukkan adanya kesinambungan yang konsisten antara ekspektasi pesan dengan respon kognitif audiens sasaran. Secara metodologis setiap indikator konstruk diuji melalui parameter reliabilitas komposit yang memenuhi batas keterandalan statistik secara optimal.</w:t>
       </w:r>
     </w:p>
     <w:p>
@@ -837,7 +837,7 @@
           <w:rFonts w:ascii="Times New Roman" w:hAnsi="Times New Roman"/>
           <w:sz w:val="24"/>
         </w:rPr>
-        <w:t>Analisis mendalam mengenai dinamika komunikasi menunjukkan adanya kesinambungan yang konsisten antara ekspektasi pesan dengan respon kognitif audiens sasaran. Secara metodologis setiap indikator konstruk diuji melalui parameter reliabilitas komposit yang memenuhi batas keterandalan statistik secara optimal. Analisis mendalam mengenai dinamika komunikasi menunjukkan adanya kesinambungan yang konsisten antara ekspektasi pesan dengan respon kognitif audiens sasaran. Secara metodologis setiap indikator konstruk diuji melalui parameter reliabilitas komposit yang memenuhi batas keterandalan statistik secara optimal. Analisis mendalam mengenai dinamika komunikasi menunjukkan adanya kesinambungan yang konsisten antara ekspektasi pesan dengan respon kognitif audiens sasaran. Secara metodologis setiap indikator konstruk diuji melalui parameter reliabilitas komposit yang memenuhi batas keterandalan statistik secara optimal. Analisis mendalam mengenai dinamika komunikasi menunjukkan adanya kesinambungan yang konsisten antara ekspektasi pesan dengan respon kognitif audiens sasaran. Secara metodologis setiap indikator konstruk diuji melalui parameter reliabilitas komposit yang memenuhi batas keterandalan statistik secara optimal. Analisis mendalam mengenai dinamika komunikasi menunjukkan adanya kesinambungan yang konsisten antara ekspektasi pesan dengan respon kognitif audiens sasaran. Secara metodologis setiap indikator konstruk diuji melalui parameter reliabilitas komposit yang memenuhi batas keterandalan statistik secara optimal. Analisis mendalam mengenai dinamika komunikasi menunjukkan adanya kesinambungan yang konsisten antara ekspektasi pesan dengan respon kognitif audiens sasaran. Secara metodologis setiap indikator konstruk diuji melalui parameter reliabilitas komposit yang memenuhi batas keterandalan statistik secara optimal. Analisis mendalam mengenai dinamika komunikasi menunjukkan adanya kesinambungan yang konsisten antara ekspektasi pesan dengan respon kognitif audiens sasaran. Secara metodologis setiap indikator konstruk diuji melalui parameter reliabilitas komposit yang memenuhi batas keterandalan statistik secara optimal. Analisis mendalam mengenai dinamika komunikasi menunjukkan adanya kesinambungan yang konsisten antara ekspektasi pesan dengan respon kognitif audiens sasaran. Secara metodologis setiap indikator konstruk diuji melalui parameter reliabilitas komposit yang memenuhi batas keterandalan statistik secara optimal. Analisis mendalam mengenai dinamika komunikasi menunjukkan adanya kesinambungan yang konsisten antara ekspektasi pesan dengan respon kognitif audiens sasaran. Secara metodologis setiap indikator konstruk diuji melalui parameter reliabilitas komposit yang memenuhi batas keterandalan statistik secara optimal. Analisis mendalam mengenai dinamika komunikasi menunjukkan adanya kesinambungan yang konsisten antara ekspektasi pesan dengan respon kognitif audiens sasaran. Secara metodologis setiap indikator konstruk diuji melalui parameter reliabilitas komposit yang memenuhi batas keterandalan statistik secara optimal. Analisis mendalam mengenai dinamika komunikasi menunjukkan adanya kesinambungan yang konsisten antara ekspektasi pesan dengan respon kognitif audiens sasaran. Secara metodologis setiap indikator konstruk diuji melalui parameter reliabilitas komposit yang memenuhi batas keterandalan statistik secara optimal. Analisis mendalam mengenai dinamika komunikasi menunjukkan adanya kesinambungan yang konsisten antara ekspektasi pesan dengan respon kognitif audiens sasaran. Secara metodologis setiap indikator konstruk diuji melalui parameter reliabilitas komposit yang memenuhi batas keterandalan statistik secara optimal. Analisis mendalam mengenai dinamika komunikasi menunjukkan adanya kesinambungan yang konsisten antara ekspektasi pesan dengan respon kognitif audiens sasaran. Secara metodologis setiap indikator konstruk diuji melalui parameter reliabilitas komposit yang memenuhi batas keterandalan statistik secara optimal. Analisis mendalam mengenai dinamika komunikasi menunjukkan adanya kesinambungan yang konsisten antara ekspektasi pesan dengan respon kognitif audiens sasaran. Secara metodologis setiap indikator konstruk diuji melalui parameter reliabilitas komposit yang memenuhi batas keterandalan statistik secara optimal. Analisis mendalam mengenai dinamika komunikasi menunjukkan adanya kesinambungan yang konsisten antara ekspektasi pesan dengan respon kognitif audiens sasaran. Secara metodologis setiap indikator konstruk diuji melalui parameter reliabilitas komposit yang memenuhi batas keterandalan statistik secara optimal.</w:t>
+        <w:t>Analisis mendalam mengenai dinamika komunikasi menunjukkan adanya kesinambungan yang konsisten antara ekspektasi pesan dengan respon kognitif audiens sasaran. Secara metodologis setiap indikator konstruk diuji melalui parameter reliabilitas komposit yang memenuhi batas keterandalan statistik secara optimal. Analisis mendalam mengenai dinamika komunikasi menunjukkan adanya kesinambungan yang konsisten antara ekspektasi pesan dengan respon kognitif audiens sasaran. Secara metodologis setiap indikator konstruk diuji melalui parameter reliabilitas komposit yang memenuhi batas keterandalan statistik secara optimal. Analisis mendalam mengenai dinamika komunikasi menunjukkan adanya kesinambungan yang konsisten antara ekspektasi pesan dengan respon kognitif audiens sasaran. Secara metodologis setiap indikator konstruk diuji melalui parameter reliabilitas komposit yang memenuhi batas keterandalan statistik secara optimal. Analisis mendalam mengenai dinamika komunikasi menunjukkan adanya kesinambungan yang konsisten antara ekspektasi pesan dengan respon kognitif audiens sasaran. Secara metodologis setiap indikator konstruk diuji melalui parameter reliabilitas komposit yang memenuhi batas keterandalan statistik secara optimal. Analisis mendalam mengenai dinamika komunikasi menunjukkan adanya kesinambungan yang konsisten antara ekspektasi pesan dengan respon kognitif audiens sasaran. Secara metodologis setiap indikator konstruk diuji melalui parameter reliabilitas komposit yang memenuhi batas keterandalan statistik secara optimal. Analisis mendalam mengenai dinamika komunikasi menunjukkan adanya kesinambungan yang konsisten antara ekspektasi pesan dengan respon kognitif audiens sasaran. Secara metodologis setiap indikator konstruk diuji melalui parameter reliabilitas komposit yang memenuhi batas keterandalan statistik secara optimal. Analisis mendalam mengenai dinamika komunikasi menunjukkan adanya kesinambungan yang konsisten antara ekspektasi pesan dengan respon kognitif audiens sasaran. Secara metodologis setiap indikator konstruk diuji melalui parameter reliabilitas komposit yang memenuhi batas keterandalan statistik secara optimal. Analisis mendalam mengenai dinamika komunikasi menunjukkan adanya kesinambungan yang konsisten antara ekspektasi pesan dengan respon kognitif audiens sasaran. Secara metodologis setiap indikator konstruk diuji melalui parameter reliabilitas komposit yang memenuhi batas keterandalan statistik secara optimal. Analisis mendalam mengenai dinamika komunikasi menunjukkan adanya kesinambungan yang konsisten antara ekspektasi pesan dengan respon kognitif audiens sasaran. Secara metodologis setiap indikator konstruk diuji melalui parameter reliabilitas komposit yang memenuhi batas keterandalan statistik secara optimal. Analisis mendalam mengenai dinamika komunikasi menunjukkan adanya kesinambungan yang konsisten antara ekspektasi pesan dengan respon kognitif audiens sasaran. Secara metodologis setiap indikator konstruk diuji melalui parameter reliabilitas komposit yang memenuhi batas keterandalan statistik secara optimal. Analisis mendalam mengenai dinamika komunikasi menunjukkan adanya kesinambungan yang konsisten antara ekspektasi pesan dengan respon kognitif audiens sasaran. Secara metodologis setiap indikator konstruk diuji melalui parameter reliabilitas komposit yang memenuhi batas keterandalan statistik secara optimal. Analisis mendalam mengenai dinamika komunikasi menunjukkan adanya kesinambungan yang konsisten antara ekspektasi pesan dengan respon kognitif audiens sasaran. Secara metodologis setiap indikator konstruk diuji melalui parameter reliabilitas komposit yang memenuhi batas keterandalan statistik secara optimal.</w:t>
       </w:r>
     </w:p>
     <w:p>
@@ -850,7 +850,7 @@
           <w:rFonts w:ascii="Times New Roman" w:hAnsi="Times New Roman"/>
           <w:sz w:val="24"/>
         </w:rPr>
-        <w:t>Analisis mendalam mengenai dinamika komunikasi menunjukkan adanya kesinambungan yang konsisten antara ekspektasi pesan dengan respon kognitif audiens sasaran. Secara metodologis setiap indikator konstruk diuji melalui parameter reliabilitas komposit yang memenuhi batas keterandalan statistik secara optimal. Analisis mendalam mengenai dinamika komunikasi menunjukkan adanya kesinambungan yang konsisten antara ekspektasi pesan dengan respon kognitif audiens sasaran. Secara metodologis setiap indikator konstruk diuji melalui parameter reliabilitas komposit yang memenuhi batas keterandalan statistik secara optimal. Analisis mendalam mengenai dinamika komunikasi menunjukkan adanya kesinambungan yang konsisten antara ekspektasi pesan dengan respon kognitif audiens sasaran. Secara metodologis setiap indikator konstruk diuji melalui parameter reliabilitas komposit yang memenuhi batas keterandalan statistik secara optimal. Analisis mendalam mengenai dinamika komunikasi menunjukkan adanya kesinambungan yang konsisten antara ekspektasi pesan dengan respon kognitif audiens sasaran. Secara metodologis setiap indikator konstruk diuji melalui parameter reliabilitas komposit yang memenuhi batas keterandalan statistik secara optimal. Analisis mendalam mengenai dinamika komunikasi menunjukkan adanya kesinambungan yang konsisten antara ekspektasi pesan dengan respon kognitif audiens sasaran. Secara metodologis setiap indikator konstruk diuji melalui parameter reliabilitas komposit yang memenuhi batas keterandalan statistik secara optimal. Analisis mendalam mengenai dinamika komunikasi menunjukkan adanya kesinambungan yang konsisten antara ekspektasi pesan dengan respon kognitif audiens sasaran. Secara metodologis setiap indikator konstruk diuji melalui parameter reliabilitas komposit yang memenuhi batas keterandalan statistik secara optimal. Analisis mendalam mengenai dinamika komunikasi menunjukkan adanya kesinambungan yang konsisten antara ekspektasi pesan dengan respon kognitif audiens sasaran. Secara metodologis setiap indikator konstruk diuji melalui parameter reliabilitas komposit yang memenuhi batas keterandalan statistik secara optimal. Analisis mendalam mengenai dinamika komunikasi menunjukkan adanya kesinambungan yang konsisten antara ekspektasi pesan dengan respon kognitif audiens sasaran. Secara metodologis setiap indikator konstruk diuji melalui parameter reliabilitas komposit yang memenuhi batas keterandalan statistik secara optimal. Analisis mendalam mengenai dinamika komunikasi menunjukkan adanya kesinambungan yang konsisten antara ekspektasi pesan dengan respon kognitif audiens sasaran. Secara metodologis setiap indikator konstruk diuji melalui parameter reliabilitas komposit yang memenuhi batas keterandalan statistik secara optimal. Analisis mendalam mengenai dinamika komunikasi menunjukkan adanya kesinambungan yang konsisten antara ekspektasi pesan dengan respon kognitif audiens sasaran. Secara metodologis setiap indikator konstruk diuji melalui parameter reliabilitas komposit yang memenuhi batas keterandalan statistik secara optimal. Analisis mendalam mengenai dinamika komunikasi menunjukkan adanya kesinambungan yang konsisten antara ekspektasi pesan dengan respon kognitif audiens sasaran. Secara metodologis setiap indikator konstruk diuji melalui parameter reliabilitas komposit yang memenuhi batas keterandalan statistik secara optimal. Analisis mendalam mengenai dinamika komunikasi menunjukkan adanya kesinambungan yang konsisten antara ekspektasi pesan dengan respon kognitif audiens sasaran. Secara metodologis setiap indikator konstruk diuji melalui parameter reliabilitas komposit yang memenuhi batas keterandalan statistik secara optimal. Analisis mendalam mengenai dinamika komunikasi menunjukkan adanya kesinambungan yang konsisten antara ekspektasi pesan dengan respon kognitif audiens sasaran. Secara metodologis setiap indikator konstruk diuji melalui parameter reliabilitas komposit yang memenuhi batas keterandalan statistik secara optimal. Analisis mendalam mengenai dinamika komunikasi menunjukkan adanya kesinambungan yang konsisten antara ekspektasi pesan dengan respon kognitif audiens sasaran. Secara metodologis setiap indikator konstruk diuji melalui parameter reliabilitas komposit yang memenuhi batas keterandalan statistik secara optimal. Analisis mendalam mengenai dinamika komunikasi menunjukkan adanya kesinambungan yang konsisten antara ekspektasi pesan dengan respon kognitif audiens sasaran. Secara metodologis setiap indikator konstruk diuji melalui parameter reliabilitas komposit yang memenuhi batas keterandalan statistik secara optimal.</w:t>
+        <w:t>Analisis mendalam mengenai dinamika komunikasi menunjukkan adanya kesinambungan yang konsisten antara ekspektasi pesan dengan respon kognitif audiens sasaran. Secara metodologis setiap indikator konstruk diuji melalui parameter reliabilitas komposit yang memenuhi batas keterandalan statistik secara optimal. Analisis mendalam mengenai dinamika komunikasi menunjukkan adanya kesinambungan yang konsisten antara ekspektasi pesan dengan respon kognitif audiens sasaran. Secara metodologis setiap indikator konstruk diuji melalui parameter reliabilitas komposit yang memenuhi batas keterandalan statistik secara optimal. Analisis mendalam mengenai dinamika komunikasi menunjukkan adanya kesinambungan yang konsisten antara ekspektasi pesan dengan respon kognitif audiens sasaran. Secara metodologis setiap indikator konstruk diuji melalui parameter reliabilitas komposit yang memenuhi batas keterandalan statistik secara optimal. Analisis mendalam mengenai dinamika komunikasi menunjukkan adanya kesinambungan yang konsisten antara ekspektasi pesan dengan respon kognitif audiens sasaran. Secara metodologis setiap indikator konstruk diuji melalui parameter reliabilitas komposit yang memenuhi batas keterandalan statistik secara optimal. Analisis mendalam mengenai dinamika komunikasi menunjukkan adanya kesinambungan yang konsisten antara ekspektasi pesan dengan respon kognitif audiens sasaran. Secara metodologis setiap indikator konstruk diuji melalui parameter reliabilitas komposit yang memenuhi batas keterandalan statistik secara optimal. Analisis mendalam mengenai dinamika komunikasi menunjukkan adanya kesinambungan yang konsisten antara ekspektasi pesan dengan respon kognitif audiens sasaran. Secara metodologis setiap indikator konstruk diuji melalui parameter reliabilitas komposit yang memenuhi batas keterandalan statistik secara optimal. Analisis mendalam mengenai dinamika komunikasi menunjukkan adanya kesinambungan yang konsisten antara ekspektasi pesan dengan respon kognitif audiens sasaran. Secara metodologis setiap indikator konstruk diuji melalui parameter reliabilitas komposit yang memenuhi batas keterandalan statistik secara optimal. Analisis mendalam mengenai dinamika komunikasi menunjukkan adanya kesinambungan yang konsisten antara ekspektasi pesan dengan respon kognitif audiens sasaran. Secara metodologis setiap indikator konstruk diuji melalui parameter reliabilitas komposit yang memenuhi batas keterandalan statistik secara optimal. Analisis mendalam mengenai dinamika komunikasi menunjukkan adanya kesinambungan yang konsisten antara ekspektasi pesan dengan respon kognitif audiens sasaran. Secara metodologis setiap indikator konstruk diuji melalui parameter reliabilitas komposit yang memenuhi batas keterandalan statistik secara optimal. Analisis mendalam mengenai dinamika komunikasi menunjukkan adanya kesinambungan yang konsisten antara ekspektasi pesan dengan respon kognitif audiens sasaran. Secara metodologis setiap indikator konstruk diuji melalui parameter reliabilitas komposit yang memenuhi batas keterandalan statistik secara optimal. Analisis mendalam mengenai dinamika komunikasi menunjukkan adanya kesinambungan yang konsisten antara ekspektasi pesan dengan respon kognitif audiens sasaran. Secara metodologis setiap indikator konstruk diuji melalui parameter reliabilitas komposit yang memenuhi batas keterandalan statistik secara optimal. Analisis mendalam mengenai dinamika komunikasi menunjukkan adanya kesinambungan yang konsisten antara ekspektasi pesan dengan respon kognitif audiens sasaran. Secara metodologis setiap indikator konstruk diuji melalui parameter reliabilitas komposit yang memenuhi batas keterandalan statistik secara optimal.</w:t>
       </w:r>
     </w:p>
     <w:p>
@@ -863,7 +863,7 @@
           <w:rFonts w:ascii="Times New Roman" w:hAnsi="Times New Roman"/>
           <w:sz w:val="24"/>
         </w:rPr>
-        <w:t>Analisis mendalam mengenai dinamika komunikasi menunjukkan adanya kesinambungan yang konsisten antara ekspektasi pesan dengan respon kognitif audiens sasaran. Secara metodologis setiap indikator konstruk diuji melalui parameter reliabilitas komposit yang memenuhi batas keterandalan statistik secara optimal. Analisis mendalam mengenai dinamika komunikasi menunjukkan adanya kesinambungan yang konsisten antara ekspektasi pesan dengan respon kognitif audiens sasaran. Secara metodologis setiap indikator konstruk diuji melalui parameter reliabilitas komposit yang memenuhi batas keterandalan statistik secara optimal. Analisis mendalam mengenai dinamika komunikasi menunjukkan adanya kesinambungan yang konsisten antara ekspektasi pesan dengan respon kognitif audiens sasaran. Secara metodologis setiap indikator konstruk diuji melalui parameter reliabilitas komposit yang memenuhi batas keterandalan statistik secara optimal. Analisis mendalam mengenai dinamika komunikasi menunjukkan adanya kesinambungan yang konsisten antara ekspektasi pesan dengan respon kognitif audiens sasaran. Secara metodologis setiap indikator konstruk diuji melalui parameter reliabilitas komposit yang memenuhi batas keterandalan statistik secara optimal. Analisis mendalam mengenai dinamika komunikasi menunjukkan adanya kesinambungan yang konsisten antara ekspektasi pesan dengan respon kognitif audiens sasaran. Secara metodologis setiap indikator konstruk diuji melalui parameter reliabilitas komposit yang memenuhi batas keterandalan statistik secara optimal. Analisis mendalam mengenai dinamika komunikasi menunjukkan adanya kesinambungan yang konsisten antara ekspektasi pesan dengan respon kognitif audiens sasaran. Secara metodologis setiap indikator konstruk diuji melalui parameter reliabilitas komposit yang memenuhi batas keterandalan statistik secara optimal. Analisis mendalam mengenai dinamika komunikasi menunjukkan adanya kesinambungan yang konsisten antara ekspektasi pesan dengan respon kognitif audiens sasaran. Secara metodologis setiap indikator konstruk diuji melalui parameter reliabilitas komposit yang memenuhi batas keterandalan statistik secara optimal. Analisis mendalam mengenai dinamika komunikasi menunjukkan adanya kesinambungan yang konsisten antara ekspektasi pesan dengan respon kognitif audiens sasaran. Secara metodologis setiap indikator konstruk diuji melalui parameter reliabilitas komposit yang memenuhi batas keterandalan statistik secara optimal. Analisis mendalam mengenai dinamika komunikasi menunjukkan adanya kesinambungan yang konsisten antara ekspektasi pesan dengan respon kognitif audiens sasaran. Secara metodologis setiap indikator konstruk diuji melalui parameter reliabilitas komposit yang memenuhi batas keterandalan statistik secara optimal. Analisis mendalam mengenai dinamika komunikasi menunjukkan adanya kesinambungan yang konsisten antara ekspektasi pesan dengan respon kognitif audiens sasaran. Secara metodologis setiap indikator konstruk diuji melalui parameter reliabilitas komposit yang memenuhi batas keterandalan statistik secara optimal. Analisis mendalam mengenai dinamika komunikasi menunjukkan adanya kesinambungan yang konsisten antara ekspektasi pesan dengan respon kognitif audiens sasaran. Secara metodologis setiap indikator konstruk diuji melalui parameter reliabilitas komposit yang memenuhi batas keterandalan statistik secara optimal. Analisis mendalam mengenai dinamika komunikasi menunjukkan adanya kesinambungan yang konsisten antara ekspektasi pesan dengan respon kognitif audiens sasaran. Secara metodologis setiap indikator konstruk diuji melalui parameter reliabilitas komposit yang memenuhi batas keterandalan statistik secara optimal. Analisis mendalam mengenai dinamika komunikasi menunjukkan adanya kesinambungan yang konsisten antara ekspektasi pesan dengan respon kognitif audiens sasaran. Secara metodologis setiap indikator konstruk diuji melalui parameter reliabilitas komposit yang memenuhi batas keterandalan statistik secara optimal. Analisis mendalam mengenai dinamika komunikasi menunjukkan adanya kesinambungan yang konsisten antara ekspektasi pesan dengan respon kognitif audiens sasaran. Secara metodologis setiap indikator konstruk diuji melalui parameter reliabilitas komposit yang memenuhi batas keterandalan statistik secara optimal. Analisis mendalam mengenai dinamika komunikasi menunjukkan adanya kesinambungan yang konsisten antara ekspektasi pesan dengan respon kognitif audiens sasaran. Secara metodologis setiap indikator konstruk diuji melalui parameter reliabilitas komposit yang memenuhi batas keterandalan statistik secara optimal.</w:t>
+        <w:t>Analisis mendalam mengenai dinamika komunikasi menunjukkan adanya kesinambungan yang konsisten antara ekspektasi pesan dengan respon kognitif audiens sasaran. Secara metodologis setiap indikator konstruk diuji melalui parameter reliabilitas komposit yang memenuhi batas keterandalan statistik secara optimal. Analisis mendalam mengenai dinamika komunikasi menunjukkan adanya kesinambungan yang konsisten antara ekspektasi pesan dengan respon kognitif audiens sasaran. Secara metodologis setiap indikator konstruk diuji melalui parameter reliabilitas komposit yang memenuhi batas keterandalan statistik secara optimal. Analisis mendalam mengenai dinamika komunikasi menunjukkan adanya kesinambungan yang konsisten antara ekspektasi pesan dengan respon kognitif audiens sasaran. Secara metodologis setiap indikator konstruk diuji melalui parameter reliabilitas komposit yang memenuhi batas keterandalan statistik secara optimal. Analisis mendalam mengenai dinamika komunikasi menunjukkan adanya kesinambungan yang konsisten antara ekspektasi pesan dengan respon kognitif audiens sasaran. Secara metodologis setiap indikator konstruk diuji melalui parameter reliabilitas komposit yang memenuhi batas keterandalan statistik secara optimal. Analisis mendalam mengenai dinamika komunikasi menunjukkan adanya kesinambungan yang konsisten antara ekspektasi pesan dengan respon kognitif audiens sasaran. Secara metodologis setiap indikator konstruk diuji melalui parameter reliabilitas komposit yang memenuhi batas keterandalan statistik secara optimal. Analisis mendalam mengenai dinamika komunikasi menunjukkan adanya kesinambungan yang konsisten antara ekspektasi pesan dengan respon kognitif audiens sasaran. Secara metodologis setiap indikator konstruk diuji melalui parameter reliabilitas komposit yang memenuhi batas keterandalan statistik secara optimal. Analisis mendalam mengenai dinamika komunikasi menunjukkan adanya kesinambungan yang konsisten antara ekspektasi pesan dengan respon kognitif audiens sasaran. Secara metodologis setiap indikator konstruk diuji melalui parameter reliabilitas komposit yang memenuhi batas keterandalan statistik secara optimal. Analisis mendalam mengenai dinamika komunikasi menunjukkan adanya kesinambungan yang konsisten antara ekspektasi pesan dengan respon kognitif audiens sasaran. Secara metodologis setiap indikator konstruk diuji melalui parameter reliabilitas komposit yang memenuhi batas keterandalan statistik secara optimal. Analisis mendalam mengenai dinamika komunikasi menunjukkan adanya kesinambungan yang konsisten antara ekspektasi pesan dengan respon kognitif audiens sasaran. Secara metodologis setiap indikator konstruk diuji melalui parameter reliabilitas komposit yang memenuhi batas keterandalan statistik secara optimal. Analisis mendalam mengenai dinamika komunikasi menunjukkan adanya kesinambungan yang konsisten antara ekspektasi pesan dengan respon kognitif audiens sasaran. Secara metodologis setiap indikator konstruk diuji melalui parameter reliabilitas komposit yang memenuhi batas keterandalan statistik secara optimal. Analisis mendalam mengenai dinamika komunikasi menunjukkan adanya kesinambungan yang konsisten antara ekspektasi pesan dengan respon kognitif audiens sasaran. Secara metodologis setiap indikator konstruk diuji melalui parameter reliabilitas komposit yang memenuhi batas keterandalan statistik secara optimal. Analisis mendalam mengenai dinamika komunikasi menunjukkan adanya kesinambungan yang konsisten antara ekspektasi pesan dengan respon kognitif audiens sasaran. Secara metodologis setiap indikator konstruk diuji melalui parameter reliabilitas komposit yang memenuhi batas keterandalan statistik secara optimal.</w:t>
       </w:r>
     </w:p>
     <w:p>
@@ -909,7 +909,7 @@
           <w:rFonts w:ascii="Times New Roman" w:hAnsi="Times New Roman"/>
           <w:sz w:val="24"/>
         </w:rPr>
-        <w:t>Analisis mendalam mengenai dinamika komunikasi menunjukkan adanya kesinambungan yang konsisten antara ekspektasi pesan dengan respon kognitif audiens sasaran. Secara metodologis setiap indikator konstruk diuji melalui parameter reliabilitas komposit yang memenuhi batas keterandalan statistik secara optimal. Analisis mendalam mengenai dinamika komunikasi menunjukkan adanya kesinambungan yang konsisten antara ekspektasi pesan dengan respon kognitif audiens sasaran. Secara metodologis setiap indikator konstruk diuji melalui parameter reliabilitas komposit yang memenuhi batas keterandalan statistik secara optimal. Analisis mendalam mengenai dinamika komunikasi menunjukkan adanya kesinambungan yang konsisten antara ekspektasi pesan dengan respon kognitif audiens sasaran. Secara metodologis setiap indikator konstruk diuji melalui parameter reliabilitas komposit yang memenuhi batas keterandalan statistik secara optimal. Analisis mendalam mengenai dinamika komunikasi menunjukkan adanya kesinambungan yang konsisten antara ekspektasi pesan dengan respon kognitif audiens sasaran. Secara metodologis setiap indikator konstruk diuji melalui parameter reliabilitas komposit yang memenuhi batas keterandalan statistik secara optimal. Analisis mendalam mengenai dinamika komunikasi menunjukkan adanya kesinambungan yang konsisten antara ekspektasi pesan dengan respon kognitif audiens sasaran. Secara metodologis setiap indikator konstruk diuji melalui parameter reliabilitas komposit yang memenuhi batas keterandalan statistik secara optimal. Analisis mendalam mengenai dinamika komunikasi menunjukkan adanya kesinambungan yang konsisten antara ekspektasi pesan dengan respon kognitif audiens sasaran. Secara metodologis setiap indikator konstruk diuji melalui parameter reliabilitas komposit yang memenuhi batas keterandalan statistik secara optimal. Analisis mendalam mengenai dinamika komunikasi menunjukkan adanya kesinambungan yang konsisten antara ekspektasi pesan dengan respon kognitif audiens sasaran. Secara metodologis setiap indikator konstruk diuji melalui parameter reliabilitas komposit yang memenuhi batas keterandalan statistik secara optimal. Analisis mendalam mengenai dinamika komunikasi menunjukkan adanya kesinambungan yang konsisten antara ekspektasi pesan dengan respon kognitif audiens sasaran. Secara metodologis setiap indikator konstruk diuji melalui parameter reliabilitas komposit yang memenuhi batas keterandalan statistik secara optimal. Analisis mendalam mengenai dinamika komunikasi menunjukkan adanya kesinambungan yang konsisten antara ekspektasi pesan dengan respon kognitif audiens sasaran. Secara metodologis setiap indikator konstruk diuji melalui parameter reliabilitas komposit yang memenuhi batas keterandalan statistik secara optimal. Analisis mendalam mengenai dinamika komunikasi menunjukkan adanya kesinambungan yang konsisten antara ekspektasi pesan dengan respon kognitif audiens sasaran. Secara metodologis setiap indikator konstruk diuji melalui parameter reliabilitas komposit yang memenuhi batas keterandalan statistik secara optimal. Analisis mendalam mengenai dinamika komunikasi menunjukkan adanya kesinambungan yang konsisten antara ekspektasi pesan dengan respon kognitif audiens sasaran. Secara metodologis setiap indikator konstruk diuji melalui parameter reliabilitas komposit yang memenuhi batas keterandalan statistik secara optimal. Analisis mendalam mengenai dinamika komunikasi menunjukkan adanya kesinambungan yang konsisten antara ekspektasi pesan dengan respon kognitif audiens sasaran. Secara metodologis setiap indikator konstruk diuji melalui parameter reliabilitas komposit yang memenuhi batas keterandalan statistik secara optimal. Analisis mendalam mengenai dinamika komunikasi menunjukkan adanya kesinambungan yang konsisten antara ekspektasi pesan dengan respon kognitif audiens sasaran. Secara metodologis setiap indikator konstruk diuji melalui parameter reliabilitas komposit yang memenuhi batas keterandalan statistik secara optimal. Analisis mendalam mengenai dinamika komunikasi menunjukkan adanya kesinambungan yang konsisten antara ekspektasi pesan dengan respon kognitif audiens sasaran. Secara metodologis setiap indikator konstruk diuji melalui parameter reliabilitas komposit yang memenuhi batas keterandalan statistik secara optimal. Analisis mendalam mengenai dinamika komunikasi menunjukkan adanya kesinambungan yang konsisten antara ekspektasi pesan dengan respon kognitif audiens sasaran. Secara metodologis setiap indikator konstruk diuji melalui parameter reliabilitas komposit yang memenuhi batas keterandalan statistik secara optimal.</w:t>
+        <w:t>Analisis mendalam mengenai dinamika komunikasi menunjukkan adanya kesinambungan yang konsisten antara ekspektasi pesan dengan respon kognitif audiens sasaran. Secara metodologis setiap indikator konstruk diuji melalui parameter reliabilitas komposit yang memenuhi batas keterandalan statistik secara optimal. Analisis mendalam mengenai dinamika komunikasi menunjukkan adanya kesinambungan yang konsisten antara ekspektasi pesan dengan respon kognitif audiens sasaran. Secara metodologis setiap indikator konstruk diuji melalui parameter reliabilitas komposit yang memenuhi batas keterandalan statistik secara optimal. Analisis mendalam mengenai dinamika komunikasi menunjukkan adanya kesinambungan yang konsisten antara ekspektasi pesan dengan respon kognitif audiens sasaran. Secara metodologis setiap indikator konstruk diuji melalui parameter reliabilitas komposit yang memenuhi batas keterandalan statistik secara optimal. Analisis mendalam mengenai dinamika komunikasi menunjukkan adanya kesinambungan yang konsisten antara ekspektasi pesan dengan respon kognitif audiens sasaran. Secara metodologis setiap indikator konstruk diuji melalui parameter reliabilitas komposit yang memenuhi batas keterandalan statistik secara optimal. Analisis mendalam mengenai dinamika komunikasi menunjukkan adanya kesinambungan yang konsisten antara ekspektasi pesan dengan respon kognitif audiens sasaran. Secara metodologis setiap indikator konstruk diuji melalui parameter reliabilitas komposit yang memenuhi batas keterandalan statistik secara optimal. Analisis mendalam mengenai dinamika komunikasi menunjukkan adanya kesinambungan yang konsisten antara ekspektasi pesan dengan respon kognitif audiens sasaran. Secara metodologis setiap indikator konstruk diuji melalui parameter reliabilitas komposit yang memenuhi batas keterandalan statistik secara optimal. Analisis mendalam mengenai dinamika komunikasi menunjukkan adanya kesinambungan yang konsisten antara ekspektasi pesan dengan respon kognitif audiens sasaran. Secara metodologis setiap indikator konstruk diuji melalui parameter reliabilitas komposit yang memenuhi batas keterandalan statistik secara optimal. Analisis mendalam mengenai dinamika komunikasi menunjukkan adanya kesinambungan yang konsisten antara ekspektasi pesan dengan respon kognitif audiens sasaran. Secara metodologis setiap indikator konstruk diuji melalui parameter reliabilitas komposit yang memenuhi batas keterandalan statistik secara optimal. Analisis mendalam mengenai dinamika komunikasi menunjukkan adanya kesinambungan yang konsisten antara ekspektasi pesan dengan respon kognitif audiens sasaran. Secara metodologis setiap indikator konstruk diuji melalui parameter reliabilitas komposit yang memenuhi batas keterandalan statistik secara optimal. Analisis mendalam mengenai dinamika komunikasi menunjukkan adanya kesinambungan yang konsisten antara ekspektasi pesan dengan respon kognitif audiens sasaran. Secara metodologis setiap indikator konstruk diuji melalui parameter reliabilitas komposit yang memenuhi batas keterandalan statistik secara optimal. Analisis mendalam mengenai dinamika komunikasi menunjukkan adanya kesinambungan yang konsisten antara ekspektasi pesan dengan respon kognitif audiens sasaran. Secara metodologis setiap indikator konstruk diuji melalui parameter reliabilitas komposit yang memenuhi batas keterandalan statistik secara optimal. Analisis mendalam mengenai dinamika komunikasi menunjukkan adanya kesinambungan yang konsisten antara ekspektasi pesan dengan respon kognitif audiens sasaran. Secara metodologis setiap indikator konstruk diuji melalui parameter reliabilitas komposit yang memenuhi batas keterandalan statistik secara optimal.</w:t>
       </w:r>
     </w:p>
     <w:p>
@@ -922,7 +922,7 @@
           <w:rFonts w:ascii="Times New Roman" w:hAnsi="Times New Roman"/>
           <w:sz w:val="24"/>
         </w:rPr>
-        <w:t>Analisis mendalam mengenai dinamika komunikasi menunjukkan adanya kesinambungan yang konsisten antara ekspektasi pesan dengan respon kognitif audiens sasaran. Secara metodologis setiap indikator konstruk diuji melalui parameter reliabilitas komposit yang memenuhi batas keterandalan statistik secara optimal. Analisis mendalam mengenai dinamika komunikasi menunjukkan adanya kesinambungan yang konsisten antara ekspektasi pesan dengan respon kognitif audiens sasaran. Secara metodologis setiap indikator konstruk diuji melalui parameter reliabilitas komposit yang memenuhi batas keterandalan statistik secara optimal. Analisis mendalam mengenai dinamika komunikasi menunjukkan adanya kesinambungan yang konsisten antara ekspektasi pesan dengan respon kognitif audiens sasaran. Secara metodologis setiap indikator konstruk diuji melalui parameter reliabilitas komposit yang memenuhi batas keterandalan statistik secara optimal. Analisis mendalam mengenai dinamika komunikasi menunjukkan adanya kesinambungan yang konsisten antara ekspektasi pesan dengan respon kognitif audiens sasaran. Secara metodologis setiap indikator konstruk diuji melalui parameter reliabilitas komposit yang memenuhi batas keterandalan statistik secara optimal. Analisis mendalam mengenai dinamika komunikasi menunjukkan adanya kesinambungan yang konsisten antara ekspektasi pesan dengan respon kognitif audiens sasaran. Secara metodologis setiap indikator konstruk diuji melalui parameter reliabilitas komposit yang memenuhi batas keterandalan statistik secara optimal. Analisis mendalam mengenai dinamika komunikasi menunjukkan adanya kesinambungan yang konsisten antara ekspektasi pesan dengan respon kognitif audiens sasaran. Secara metodologis setiap indikator konstruk diuji melalui parameter reliabilitas komposit yang memenuhi batas keterandalan statistik secara optimal. Analisis mendalam mengenai dinamika komunikasi menunjukkan adanya kesinambungan yang konsisten antara ekspektasi pesan dengan respon kognitif audiens sasaran. Secara metodologis setiap indikator konstruk diuji melalui parameter reliabilitas komposit yang memenuhi batas keterandalan statistik secara optimal. Analisis mendalam mengenai dinamika komunikasi menunjukkan adanya kesinambungan yang konsisten antara ekspektasi pesan dengan respon kognitif audiens sasaran. Secara metodologis setiap indikator konstruk diuji melalui parameter reliabilitas komposit yang memenuhi batas keterandalan statistik secara optimal. Analisis mendalam mengenai dinamika komunikasi menunjukkan adanya kesinambungan yang konsisten antara ekspektasi pesan dengan respon kognitif audiens sasaran. Secara metodologis setiap indikator konstruk diuji melalui parameter reliabilitas komposit yang memenuhi batas keterandalan statistik secara optimal. Analisis mendalam mengenai dinamika komunikasi menunjukkan adanya kesinambungan yang konsisten antara ekspektasi pesan dengan respon kognitif audiens sasaran. Secara metodologis setiap indikator konstruk diuji melalui parameter reliabilitas komposit yang memenuhi batas keterandalan statistik secara optimal. Analisis mendalam mengenai dinamika komunikasi menunjukkan adanya kesinambungan yang konsisten antara ekspektasi pesan dengan respon kognitif audiens sasaran. Secara metodologis setiap indikator konstruk diuji melalui parameter reliabilitas komposit yang memenuhi batas keterandalan statistik secara optimal. Analisis mendalam mengenai dinamika komunikasi menunjukkan adanya kesinambungan yang konsisten antara ekspektasi pesan dengan respon kognitif audiens sasaran. Secara metodologis setiap indikator konstruk diuji melalui parameter reliabilitas komposit yang memenuhi batas keterandalan statistik secara optimal. Analisis mendalam mengenai dinamika komunikasi menunjukkan adanya kesinambungan yang konsisten antara ekspektasi pesan dengan respon kognitif audiens sasaran. Secara metodologis setiap indikator konstruk diuji melalui parameter reliabilitas komposit yang memenuhi batas keterandalan statistik secara optimal. Analisis mendalam mengenai dinamika komunikasi menunjukkan adanya kesinambungan yang konsisten antara ekspektasi pesan dengan respon kognitif audiens sasaran. Secara metodologis setiap indikator konstruk diuji melalui parameter reliabilitas komposit yang memenuhi batas keterandalan statistik secara optimal. Analisis mendalam mengenai dinamika komunikasi menunjukkan adanya kesinambungan yang konsisten antara ekspektasi pesan dengan respon kognitif audiens sasaran. Secara metodologis setiap indikator konstruk diuji melalui parameter reliabilitas komposit yang memenuhi batas keterandalan statistik secara optimal.</w:t>
+        <w:t>Analisis mendalam mengenai dinamika komunikasi menunjukkan adanya kesinambungan yang konsisten antara ekspektasi pesan dengan respon kognitif audiens sasaran. Secara metodologis setiap indikator konstruk diuji melalui parameter reliabilitas komposit yang memenuhi batas keterandalan statistik secara optimal. Analisis mendalam mengenai dinamika komunikasi menunjukkan adanya kesinambungan yang konsisten antara ekspektasi pesan dengan respon kognitif audiens sasaran. Secara metodologis setiap indikator konstruk diuji melalui parameter reliabilitas komposit yang memenuhi batas keterandalan statistik secara optimal. Analisis mendalam mengenai dinamika komunikasi menunjukkan adanya kesinambungan yang konsisten antara ekspektasi pesan dengan respon kognitif audiens sasaran. Secara metodologis setiap indikator konstruk diuji melalui parameter reliabilitas komposit yang memenuhi batas keterandalan statistik secara optimal. Analisis mendalam mengenai dinamika komunikasi menunjukkan adanya kesinambungan yang konsisten antara ekspektasi pesan dengan respon kognitif audiens sasaran. Secara metodologis setiap indikator konstruk diuji melalui parameter reliabilitas komposit yang memenuhi batas keterandalan statistik secara optimal. Analisis mendalam mengenai dinamika komunikasi menunjukkan adanya kesinambungan yang konsisten antara ekspektasi pesan dengan respon kognitif audiens sasaran. Secara metodologis setiap indikator konstruk diuji melalui parameter reliabilitas komposit yang memenuhi batas keterandalan statistik secara optimal. Analisis mendalam mengenai dinamika komunikasi menunjukkan adanya kesinambungan yang konsisten antara ekspektasi pesan dengan respon kognitif audiens sasaran. Secara metodologis setiap indikator konstruk diuji melalui parameter reliabilitas komposit yang memenuhi batas keterandalan statistik secara optimal. Analisis mendalam mengenai dinamika komunikasi menunjukkan adanya kesinambungan yang konsisten antara ekspektasi pesan dengan respon kognitif audiens sasaran. Secara metodologis setiap indikator konstruk diuji melalui parameter reliabilitas komposit yang memenuhi batas keterandalan statistik secara optimal. Analisis mendalam mengenai dinamika komunikasi menunjukkan adanya kesinambungan yang konsisten antara ekspektasi pesan dengan respon kognitif audiens sasaran. Secara metodologis setiap indikator konstruk diuji melalui parameter reliabilitas komposit yang memenuhi batas keterandalan statistik secara optimal. Analisis mendalam mengenai dinamika komunikasi menunjukkan adanya kesinambungan yang konsisten antara ekspektasi pesan dengan respon kognitif audiens sasaran. Secara metodologis setiap indikator konstruk diuji melalui parameter reliabilitas komposit yang memenuhi batas keterandalan statistik secara optimal. Analisis mendalam mengenai dinamika komunikasi menunjukkan adanya kesinambungan yang konsisten antara ekspektasi pesan dengan respon kognitif audiens sasaran. Secara metodologis setiap indikator konstruk diuji melalui parameter reliabilitas komposit yang memenuhi batas keterandalan statistik secara optimal. Analisis mendalam mengenai dinamika komunikasi menunjukkan adanya kesinambungan yang konsisten antara ekspektasi pesan dengan respon kognitif audiens sasaran. Secara metodologis setiap indikator konstruk diuji melalui parameter reliabilitas komposit yang memenuhi batas keterandalan statistik secara optimal. Analisis mendalam mengenai dinamika komunikasi menunjukkan adanya kesinambungan yang konsisten antara ekspektasi pesan dengan respon kognitif audiens sasaran. Secara metodologis setiap indikator konstruk diuji melalui parameter reliabilitas komposit yang memenuhi batas keterandalan statistik secara optimal.</w:t>
       </w:r>
     </w:p>
     <w:p>
@@ -935,7 +935,7 @@
           <w:rFonts w:ascii="Times New Roman" w:hAnsi="Times New Roman"/>
           <w:sz w:val="24"/>
         </w:rPr>
-        <w:t>Analisis mendalam mengenai dinamika komunikasi menunjukkan adanya kesinambungan yang konsisten antara ekspektasi pesan dengan respon kognitif audiens sasaran. Secara metodologis setiap indikator konstruk diuji melalui parameter reliabilitas komposit yang memenuhi batas keterandalan statistik secara optimal. Analisis mendalam mengenai dinamika komunikasi menunjukkan adanya kesinambungan yang konsisten antara ekspektasi pesan dengan respon kognitif audiens sasaran. Secara metodologis setiap indikator konstruk diuji melalui parameter reliabilitas komposit yang memenuhi batas keterandalan statistik secara optimal. Analisis mendalam mengenai dinamika komunikasi menunjukkan adanya kesinambungan yang konsisten antara ekspektasi pesan dengan respon kognitif audiens sasaran. Secara metodologis setiap indikator konstruk diuji melalui parameter reliabilitas komposit yang memenuhi batas keterandalan statistik secara optimal. Analisis mendalam mengenai dinamika komunikasi menunjukkan adanya kesinambungan yang konsisten antara ekspektasi pesan dengan respon kognitif audiens sasaran. Secara metodologis setiap indikator konstruk diuji melalui parameter reliabilitas komposit yang memenuhi batas keterandalan statistik secara optimal. Analisis mendalam mengenai dinamika komunikasi menunjukkan adanya kesinambungan yang konsisten antara ekspektasi pesan dengan respon kognitif audiens sasaran. Secara metodologis setiap indikator konstruk diuji melalui parameter reliabilitas komposit yang memenuhi batas keterandalan statistik secara optimal. Analisis mendalam mengenai dinamika komunikasi menunjukkan adanya kesinambungan yang konsisten antara ekspektasi pesan dengan respon kognitif audiens sasaran. Secara metodologis setiap indikator konstruk diuji melalui parameter reliabilitas komposit yang memenuhi batas keterandalan statistik secara optimal. Analisis mendalam mengenai dinamika komunikasi menunjukkan adanya kesinambungan yang konsisten antara ekspektasi pesan dengan respon kognitif audiens sasaran. Secara metodologis setiap indikator konstruk diuji melalui parameter reliabilitas komposit yang memenuhi batas keterandalan statistik secara optimal. Analisis mendalam mengenai dinamika komunikasi menunjukkan adanya kesinambungan yang konsisten antara ekspektasi pesan dengan respon kognitif audiens sasaran. Secara metodologis setiap indikator konstruk diuji melalui parameter reliabilitas komposit yang memenuhi batas keterandalan statistik secara optimal. Analisis mendalam mengenai dinamika komunikasi menunjukkan adanya kesinambungan yang konsisten antara ekspektasi pesan dengan respon kognitif audiens sasaran. Secara metodologis setiap indikator konstruk diuji melalui parameter reliabilitas komposit yang memenuhi batas keterandalan statistik secara optimal. Analisis mendalam mengenai dinamika komunikasi menunjukkan adanya kesinambungan yang konsisten antara ekspektasi pesan dengan respon kognitif audiens sasaran. Secara metodologis setiap indikator konstruk diuji melalui parameter reliabilitas komposit yang memenuhi batas keterandalan statistik secara optimal. Analisis mendalam mengenai dinamika komunikasi menunjukkan adanya kesinambungan yang konsisten antara ekspektasi pesan dengan respon kognitif audiens sasaran. Secara metodologis setiap indikator konstruk diuji melalui parameter reliabilitas komposit yang memenuhi batas keterandalan statistik secara optimal. Analisis mendalam mengenai dinamika komunikasi menunjukkan adanya kesinambungan yang konsisten antara ekspektasi pesan dengan respon kognitif audiens sasaran. Secara metodologis setiap indikator konstruk diuji melalui parameter reliabilitas komposit yang memenuhi batas keterandalan statistik secara optimal. Analisis mendalam mengenai dinamika komunikasi menunjukkan adanya kesinambungan yang konsisten antara ekspektasi pesan dengan respon kognitif audiens sasaran. Secara metodologis setiap indikator konstruk diuji melalui parameter reliabilitas komposit yang memenuhi batas keterandalan statistik secara optimal. Analisis mendalam mengenai dinamika komunikasi menunjukkan adanya kesinambungan yang konsisten antara ekspektasi pesan dengan respon kognitif audiens sasaran. Secara metodologis setiap indikator konstruk diuji melalui parameter reliabilitas komposit yang memenuhi batas keterandalan statistik secara optimal. Analisis mendalam mengenai dinamika komunikasi menunjukkan adanya kesinambungan yang konsisten antara ekspektasi pesan dengan respon kognitif audiens sasaran. Secara metodologis setiap indikator konstruk diuji melalui parameter reliabilitas komposit yang memenuhi batas keterandalan statistik secara optimal.</w:t>
+        <w:t>Analisis mendalam mengenai dinamika komunikasi menunjukkan adanya kesinambungan yang konsisten antara ekspektasi pesan dengan respon kognitif audiens sasaran. Secara metodologis setiap indikator konstruk diuji melalui parameter reliabilitas komposit yang memenuhi batas keterandalan statistik secara optimal. Analisis mendalam mengenai dinamika komunikasi menunjukkan adanya kesinambungan yang konsisten antara ekspektasi pesan dengan respon kognitif audiens sasaran. Secara metodologis setiap indikator konstruk diuji melalui parameter reliabilitas komposit yang memenuhi batas keterandalan statistik secara optimal. Analisis mendalam mengenai dinamika komunikasi menunjukkan adanya kesinambungan yang konsisten antara ekspektasi pesan dengan respon kognitif audiens sasaran. Secara metodologis setiap indikator konstruk diuji melalui parameter reliabilitas komposit yang memenuhi batas keterandalan statistik secara optimal. Analisis mendalam mengenai dinamika komunikasi menunjukkan adanya kesinambungan yang konsisten antara ekspektasi pesan dengan respon kognitif audiens sasaran. Secara metodologis setiap indikator konstruk diuji melalui parameter reliabilitas komposit yang memenuhi batas keterandalan statistik secara optimal. Analisis mendalam mengenai dinamika komunikasi menunjukkan adanya kesinambungan yang konsisten antara ekspektasi pesan dengan respon kognitif audiens sasaran. Secara metodologis setiap indikator konstruk diuji melalui parameter reliabilitas komposit yang memenuhi batas keterandalan statistik secara optimal. Analisis mendalam mengenai dinamika komunikasi menunjukkan adanya kesinambungan yang konsisten antara ekspektasi pesan dengan respon kognitif audiens sasaran. Secara metodologis setiap indikator konstruk diuji melalui parameter reliabilitas komposit yang memenuhi batas keterandalan statistik secara optimal. Analisis mendalam mengenai dinamika komunikasi menunjukkan adanya kesinambungan yang konsisten antara ekspektasi pesan dengan respon kognitif audiens sasaran. Secara metodologis setiap indikator konstruk diuji melalui parameter reliabilitas komposit yang memenuhi batas keterandalan statistik secara optimal. Analisis mendalam mengenai dinamika komunikasi menunjukkan adanya kesinambungan yang konsisten antara ekspektasi pesan dengan respon kognitif audiens sasaran. Secara metodologis setiap indikator konstruk diuji melalui parameter reliabilitas komposit yang memenuhi batas keterandalan statistik secara optimal. Analisis mendalam mengenai dinamika komunikasi menunjukkan adanya kesinambungan yang konsisten antara ekspektasi pesan dengan respon kognitif audiens sasaran. Secara metodologis setiap indikator konstruk diuji melalui parameter reliabilitas komposit yang memenuhi batas keterandalan statistik secara optimal. Analisis mendalam mengenai dinamika komunikasi menunjukkan adanya kesinambungan yang konsisten antara ekspektasi pesan dengan respon kognitif audiens sasaran. Secara metodologis setiap indikator konstruk diuji melalui parameter reliabilitas komposit yang memenuhi batas keterandalan statistik secara optimal. Analisis mendalam mengenai dinamika komunikasi menunjukkan adanya kesinambungan yang konsisten antara ekspektasi pesan dengan respon kognitif audiens sasaran. Secara metodologis setiap indikator konstruk diuji melalui parameter reliabilitas komposit yang memenuhi batas keterandalan statistik secara optimal. Analisis mendalam mengenai dinamika komunikasi menunjukkan adanya kesinambungan yang konsisten antara ekspektasi pesan dengan respon kognitif audiens sasaran. Secara metodologis setiap indikator konstruk diuji melalui parameter reliabilitas komposit yang memenuhi batas keterandalan statistik secara optimal.</w:t>
       </w:r>
     </w:p>
     <w:p>
@@ -948,7 +948,7 @@
           <w:rFonts w:ascii="Times New Roman" w:hAnsi="Times New Roman"/>
           <w:sz w:val="24"/>
         </w:rPr>
-        <w:t>Analisis mendalam mengenai dinamika komunikasi menunjukkan adanya kesinambungan yang konsisten antara ekspektasi pesan dengan respon kognitif audiens sasaran. Secara metodologis setiap indikator konstruk diuji melalui parameter reliabilitas komposit yang memenuhi batas keterandalan statistik secara optimal. Analisis mendalam mengenai dinamika komunikasi menunjukkan adanya kesinambungan yang konsisten antara ekspektasi pesan dengan respon kognitif audiens sasaran. Secara metodologis setiap indikator konstruk diuji melalui parameter reliabilitas komposit yang memenuhi batas keterandalan statistik secara optimal. Analisis mendalam mengenai dinamika komunikasi menunjukkan adanya kesinambungan yang konsisten antara ekspektasi pesan dengan respon kognitif audiens sasaran. Secara metodologis setiap indikator konstruk diuji melalui parameter reliabilitas komposit yang memenuhi batas keterandalan statistik secara optimal. Analisis mendalam mengenai dinamika komunikasi menunjukkan adanya kesinambungan yang konsisten antara ekspektasi pesan dengan respon kognitif audiens sasaran. Secara metodologis setiap indikator konstruk diuji melalui parameter reliabilitas komposit yang memenuhi batas keterandalan statistik secara optimal. Analisis mendalam mengenai dinamika komunikasi menunjukkan adanya kesinambungan yang konsisten antara ekspektasi pesan dengan respon kognitif audiens sasaran. Secara metodologis setiap indikator konstruk diuji melalui parameter reliabilitas komposit yang memenuhi batas keterandalan statistik secara optimal. Analisis mendalam mengenai dinamika komunikasi menunjukkan adanya kesinambungan yang konsisten antara ekspektasi pesan dengan respon kognitif audiens sasaran. Secara metodologis setiap indikator konstruk diuji melalui parameter reliabilitas komposit yang memenuhi batas keterandalan statistik secara optimal. Analisis mendalam mengenai dinamika komunikasi menunjukkan adanya kesinambungan yang konsisten antara ekspektasi pesan dengan respon kognitif audiens sasaran. Secara metodologis setiap indikator konstruk diuji melalui parameter reliabilitas komposit yang memenuhi batas keterandalan statistik secara optimal. Analisis mendalam mengenai dinamika komunikasi menunjukkan adanya kesinambungan yang konsisten antara ekspektasi pesan dengan respon kognitif audiens sasaran. Secara metodologis setiap indikator konstruk diuji melalui parameter reliabilitas komposit yang memenuhi batas keterandalan statistik secara optimal. Analisis mendalam mengenai dinamika komunikasi menunjukkan adanya kesinambungan yang konsisten antara ekspektasi pesan dengan respon kognitif audiens sasaran. Secara metodologis setiap indikator konstruk diuji melalui parameter reliabilitas komposit yang memenuhi batas keterandalan statistik secara optimal. Analisis mendalam mengenai dinamika komunikasi menunjukkan adanya kesinambungan yang konsisten antara ekspektasi pesan dengan respon kognitif audiens sasaran. Secara metodologis setiap indikator konstruk diuji melalui parameter reliabilitas komposit yang memenuhi batas keterandalan statistik secara optimal. Analisis mendalam mengenai dinamika komunikasi menunjukkan adanya kesinambungan yang konsisten antara ekspektasi pesan dengan respon kognitif audiens sasaran. Secara metodologis setiap indikator konstruk diuji melalui parameter reliabilitas komposit yang memenuhi batas keterandalan statistik secara optimal. Analisis mendalam mengenai dinamika komunikasi menunjukkan adanya kesinambungan yang konsisten antara ekspektasi pesan dengan respon kognitif audiens sasaran. Secara metodologis setiap indikator konstruk diuji melalui parameter reliabilitas komposit yang memenuhi batas keterandalan statistik secara optimal. Analisis mendalam mengenai dinamika komunikasi menunjukkan adanya kesinambungan yang konsisten antara ekspektasi pesan dengan respon kognitif audiens sasaran. Secara metodologis setiap indikator konstruk diuji melalui parameter reliabilitas komposit yang memenuhi batas keterandalan statistik secara optimal. Analisis mendalam mengenai dinamika komunikasi menunjukkan adanya kesinambungan yang konsisten antara ekspektasi pesan dengan respon kognitif audiens sasaran. Secara metodologis setiap indikator konstruk diuji melalui parameter reliabilitas komposit yang memenuhi batas keterandalan statistik secara optimal. Analisis mendalam mengenai dinamika komunikasi menunjukkan adanya kesinambungan yang konsisten antara ekspektasi pesan dengan respon kognitif audiens sasaran. Secara metodologis setiap indikator konstruk diuji melalui parameter reliabilitas komposit yang memenuhi batas keterandalan statistik secara optimal.</w:t>
+        <w:t>Analisis mendalam mengenai dinamika komunikasi menunjukkan adanya kesinambungan yang konsisten antara ekspektasi pesan dengan respon kognitif audiens sasaran. Secara metodologis setiap indikator konstruk diuji melalui parameter reliabilitas komposit yang memenuhi batas keterandalan statistik secara optimal. Analisis mendalam mengenai dinamika komunikasi menunjukkan adanya kesinambungan yang konsisten antara ekspektasi pesan dengan respon kognitif audiens sasaran. Secara metodologis setiap indikator konstruk diuji melalui parameter reliabilitas komposit yang memenuhi batas keterandalan statistik secara optimal. Analisis mendalam mengenai dinamika komunikasi menunjukkan adanya kesinambungan yang konsisten antara ekspektasi pesan dengan respon kognitif audiens sasaran. Secara metodologis setiap indikator konstruk diuji melalui parameter reliabilitas komposit yang memenuhi batas keterandalan statistik secara optimal. Analisis mendalam mengenai dinamika komunikasi menunjukkan adanya kesinambungan yang konsisten antara ekspektasi pesan dengan respon kognitif audiens sasaran. Secara metodologis setiap indikator konstruk diuji melalui parameter reliabilitas komposit yang memenuhi batas keterandalan statistik secara optimal. Analisis mendalam mengenai dinamika komunikasi menunjukkan adanya kesinambungan yang konsisten antara ekspektasi pesan dengan respon kognitif audiens sasaran. Secara metodologis setiap indikator konstruk diuji melalui parameter reliabilitas komposit yang memenuhi batas keterandalan statistik secara optimal. Analisis mendalam mengenai dinamika komunikasi menunjukkan adanya kesinambungan yang konsisten antara ekspektasi pesan dengan respon kognitif audiens sasaran. Secara metodologis setiap indikator konstruk diuji melalui parameter reliabilitas komposit yang memenuhi batas keterandalan statistik secara optimal. Analisis mendalam mengenai dinamika komunikasi menunjukkan adanya kesinambungan yang konsisten antara ekspektasi pesan dengan respon kognitif audiens sasaran. Secara metodologis setiap indikator konstruk diuji melalui parameter reliabilitas komposit yang memenuhi batas keterandalan statistik secara optimal. Analisis mendalam mengenai dinamika komunikasi menunjukkan adanya kesinambungan yang konsisten antara ekspektasi pesan dengan respon kognitif audiens sasaran. Secara metodologis setiap indikator konstruk diuji melalui parameter reliabilitas komposit yang memenuhi batas keterandalan statistik secara optimal. Analisis mendalam mengenai dinamika komunikasi menunjukkan adanya kesinambungan yang konsisten antara ekspektasi pesan dengan respon kognitif audiens sasaran. Secara metodologis setiap indikator konstruk diuji melalui parameter reliabilitas komposit yang memenuhi batas keterandalan statistik secara optimal. Analisis mendalam mengenai dinamika komunikasi menunjukkan adanya kesinambungan yang konsisten antara ekspektasi pesan dengan respon kognitif audiens sasaran. Secara metodologis setiap indikator konstruk diuji melalui parameter reliabilitas komposit yang memenuhi batas keterandalan statistik secara optimal. Analisis mendalam mengenai dinamika komunikasi menunjukkan adanya kesinambungan yang konsisten antara ekspektasi pesan dengan respon kognitif audiens sasaran. Secara metodologis setiap indikator konstruk diuji melalui parameter reliabilitas komposit yang memenuhi batas keterandalan statistik secara optimal. Analisis mendalam mengenai dinamika komunikasi menunjukkan adanya kesinambungan yang konsisten antara ekspektasi pesan dengan respon kognitif audiens sasaran. Secara metodologis setiap indikator konstruk diuji melalui parameter reliabilitas komposit yang memenuhi batas keterandalan statistik secara optimal.</w:t>
       </w:r>
     </w:p>
     <w:p>
@@ -961,7 +961,7 @@
           <w:rFonts w:ascii="Times New Roman" w:hAnsi="Times New Roman"/>
           <w:sz w:val="24"/>
         </w:rPr>
-        <w:t>Analisis mendalam mengenai dinamika komunikasi menunjukkan adanya kesinambungan yang konsisten antara ekspektasi pesan dengan respon kognitif audiens sasaran. Secara metodologis setiap indikator konstruk diuji melalui parameter reliabilitas komposit yang memenuhi batas keterandalan statistik secara optimal. Analisis mendalam mengenai dinamika komunikasi menunjukkan adanya kesinambungan yang konsisten antara ekspektasi pesan dengan respon kognitif audiens sasaran. Secara metodologis setiap indikator konstruk diuji melalui parameter reliabilitas komposit yang memenuhi batas keterandalan statistik secara optimal. Analisis mendalam mengenai dinamika komunikasi menunjukkan adanya kesinambungan yang konsisten antara ekspektasi pesan dengan respon kognitif audiens sasaran. Secara metodologis setiap indikator konstruk diuji melalui parameter reliabilitas komposit yang memenuhi batas keterandalan statistik secara optimal. Analisis mendalam mengenai dinamika komunikasi menunjukkan adanya kesinambungan yang konsisten antara ekspektasi pesan dengan respon kognitif audiens sasaran. Secara metodologis setiap indikator konstruk diuji melalui parameter reliabilitas komposit yang memenuhi batas keterandalan statistik secara optimal. Analisis mendalam mengenai dinamika komunikasi menunjukkan adanya kesinambungan yang konsisten antara ekspektasi pesan dengan respon kognitif audiens sasaran. Secara metodologis setiap indikator konstruk diuji melalui parameter reliabilitas komposit yang memenuhi batas keterandalan statistik secara optimal. Analisis mendalam mengenai dinamika komunikasi menunjukkan adanya kesinambungan yang konsisten antara ekspektasi pesan dengan respon kognitif audiens sasaran. Secara metodologis setiap indikator konstruk diuji melalui parameter reliabilitas komposit yang memenuhi batas keterandalan statistik secara optimal. Analisis mendalam mengenai dinamika komunikasi menunjukkan adanya kesinambungan yang konsisten antara ekspektasi pesan dengan respon kognitif audiens sasaran. Secara metodologis setiap indikator konstruk diuji melalui parameter reliabilitas komposit yang memenuhi batas keterandalan statistik secara optimal. Analisis mendalam mengenai dinamika komunikasi menunjukkan adanya kesinambungan yang konsisten antara ekspektasi pesan dengan respon kognitif audiens sasaran. Secara metodologis setiap indikator konstruk diuji melalui parameter reliabilitas komposit yang memenuhi batas keterandalan statistik secara optimal. Analisis mendalam mengenai dinamika komunikasi menunjukkan adanya kesinambungan yang konsisten antara ekspektasi pesan dengan respon kognitif audiens sasaran. Secara metodologis setiap indikator konstruk diuji melalui parameter reliabilitas komposit yang memenuhi batas keterandalan statistik secara optimal. Analisis mendalam mengenai dinamika komunikasi menunjukkan adanya kesinambungan yang konsisten antara ekspektasi pesan dengan respon kognitif audiens sasaran. Secara metodologis setiap indikator konstruk diuji melalui parameter reliabilitas komposit yang memenuhi batas keterandalan statistik secara optimal. Analisis mendalam mengenai dinamika komunikasi menunjukkan adanya kesinambungan yang konsisten antara ekspektasi pesan dengan respon kognitif audiens sasaran. Secara metodologis setiap indikator konstruk diuji melalui parameter reliabilitas komposit yang memenuhi batas keterandalan statistik secara optimal. Analisis mendalam mengenai dinamika komunikasi menunjukkan adanya kesinambungan yang konsisten antara ekspektasi pesan dengan respon kognitif audiens sasaran. Secara metodologis setiap indikator konstruk diuji melalui parameter reliabilitas komposit yang memenuhi batas keterandalan statistik secara optimal. Analisis mendalam mengenai dinamika komunikasi menunjukkan adanya kesinambungan yang konsisten antara ekspektasi pesan dengan respon kognitif audiens sasaran. Secara metodologis setiap indikator konstruk diuji melalui parameter reliabilitas komposit yang memenuhi batas keterandalan statistik secara optimal. Analisis mendalam mengenai dinamika komunikasi menunjukkan adanya kesinambungan yang konsisten antara ekspektasi pesan dengan respon kognitif audiens sasaran. Secara metodologis setiap indikator konstruk diuji melalui parameter reliabilitas komposit yang memenuhi batas keterandalan statistik secara optimal. Analisis mendalam mengenai dinamika komunikasi menunjukkan adanya kesinambungan yang konsisten antara ekspektasi pesan dengan respon kognitif audiens sasaran. Secara metodologis setiap indikator konstruk diuji melalui parameter reliabilitas komposit yang memenuhi batas keterandalan statistik secara optimal.</w:t>
+        <w:t>Analisis mendalam mengenai dinamika komunikasi menunjukkan adanya kesinambungan yang konsisten antara ekspektasi pesan dengan respon kognitif audiens sasaran. Secara metodologis setiap indikator konstruk diuji melalui parameter reliabilitas komposit yang memenuhi batas keterandalan statistik secara optimal. Analisis mendalam mengenai dinamika komunikasi menunjukkan adanya kesinambungan yang konsisten antara ekspektasi pesan dengan respon kognitif audiens sasaran. Secara metodologis setiap indikator konstruk diuji melalui parameter reliabilitas komposit yang memenuhi batas keterandalan statistik secara optimal. Analisis mendalam mengenai dinamika komunikasi menunjukkan adanya kesinambungan yang konsisten antara ekspektasi pesan dengan respon kognitif audiens sasaran. Secara metodologis setiap indikator konstruk diuji melalui parameter reliabilitas komposit yang memenuhi batas keterandalan statistik secara optimal. Analisis mendalam mengenai dinamika komunikasi menunjukkan adanya kesinambungan yang konsisten antara ekspektasi pesan dengan respon kognitif audiens sasaran. Secara metodologis setiap indikator konstruk diuji melalui parameter reliabilitas komposit yang memenuhi batas keterandalan statistik secara optimal. Analisis mendalam mengenai dinamika komunikasi menunjukkan adanya kesinambungan yang konsisten antara ekspektasi pesan dengan respon kognitif audiens sasaran. Secara metodologis setiap indikator konstruk diuji melalui parameter reliabilitas komposit yang memenuhi batas keterandalan statistik secara optimal. Analisis mendalam mengenai dinamika komunikasi menunjukkan adanya kesinambungan yang konsisten antara ekspektasi pesan dengan respon kognitif audiens sasaran. Secara metodologis setiap indikator konstruk diuji melalui parameter reliabilitas komposit yang memenuhi batas keterandalan statistik secara optimal. Analisis mendalam mengenai dinamika komunikasi menunjukkan adanya kesinambungan yang konsisten antara ekspektasi pesan dengan respon kognitif audiens sasaran. Secara metodologis setiap indikator konstruk diuji melalui parameter reliabilitas komposit yang memenuhi batas keterandalan statistik secara optimal. Analisis mendalam mengenai dinamika komunikasi menunjukkan adanya kesinambungan yang konsisten antara ekspektasi pesan dengan respon kognitif audiens sasaran. Secara metodologis setiap indikator konstruk diuji melalui parameter reliabilitas komposit yang memenuhi batas keterandalan statistik secara optimal. Analisis mendalam mengenai dinamika komunikasi menunjukkan adanya kesinambungan yang konsisten antara ekspektasi pesan dengan respon kognitif audiens sasaran. Secara metodologis setiap indikator konstruk diuji melalui parameter reliabilitas komposit yang memenuhi batas keterandalan statistik secara optimal. Analisis mendalam mengenai dinamika komunikasi menunjukkan adanya kesinambungan yang konsisten antara ekspektasi pesan dengan respon kognitif audiens sasaran. Secara metodologis setiap indikator konstruk diuji melalui parameter reliabilitas komposit yang memenuhi batas keterandalan statistik secara optimal. Analisis mendalam mengenai dinamika komunikasi menunjukkan adanya kesinambungan yang konsisten antara ekspektasi pesan dengan respon kognitif audiens sasaran. Secara metodologis setiap indikator konstruk diuji melalui parameter reliabilitas komposit yang memenuhi batas keterandalan statistik secara optimal. Analisis mendalam mengenai dinamika komunikasi menunjukkan adanya kesinambungan yang konsisten antara ekspektasi pesan dengan respon kognitif audiens sasaran. Secara metodologis setiap indikator konstruk diuji melalui parameter reliabilitas komposit yang memenuhi batas keterandalan statistik secara optimal.</w:t>
       </w:r>
     </w:p>
     <w:p>
@@ -974,7 +974,7 @@
           <w:rFonts w:ascii="Times New Roman" w:hAnsi="Times New Roman"/>
           <w:sz w:val="24"/>
         </w:rPr>
-        <w:t>Analisis mendalam mengenai dinamika komunikasi menunjukkan adanya kesinambungan yang konsisten antara ekspektasi pesan dengan respon kognitif audiens sasaran. Secara metodologis setiap indikator konstruk diuji melalui parameter reliabilitas komposit yang memenuhi batas keterandalan statistik secara optimal. Analisis mendalam mengenai dinamika komunikasi menunjukkan adanya kesinambungan yang konsisten antara ekspektasi pesan dengan respon kognitif audiens sasaran. Secara metodologis setiap indikator konstruk diuji melalui parameter reliabilitas komposit yang memenuhi batas keterandalan statistik secara optimal. Analisis mendalam mengenai dinamika komunikasi menunjukkan adanya kesinambungan yang konsisten antara ekspektasi pesan dengan respon kognitif audiens sasaran. Secara metodologis setiap indikator konstruk diuji melalui parameter reliabilitas komposit yang memenuhi batas keterandalan statistik secara optimal. Analisis mendalam mengenai dinamika komunikasi menunjukkan adanya kesinambungan yang konsisten antara ekspektasi pesan dengan respon kognitif audiens sasaran. Secara metodologis setiap indikator konstruk diuji melalui parameter reliabilitas komposit yang memenuhi batas keterandalan statistik secara optimal. Analisis mendalam mengenai dinamika komunikasi menunjukkan adanya kesinambungan yang konsisten antara ekspektasi pesan dengan respon kognitif audiens sasaran. Secara metodologis setiap indikator konstruk diuji melalui parameter reliabilitas komposit yang memenuhi batas keterandalan statistik secara optimal. Analisis mendalam mengenai dinamika komunikasi menunjukkan adanya kesinambungan yang konsisten antara ekspektasi pesan dengan respon kognitif audiens sasaran. Secara metodologis setiap indikator konstruk diuji melalui parameter reliabilitas komposit yang memenuhi batas keterandalan statistik secara optimal. Analisis mendalam mengenai dinamika komunikasi menunjukkan adanya kesinambungan yang konsisten antara ekspektasi pesan dengan respon kognitif audiens sasaran. Secara metodologis setiap indikator konstruk diuji melalui parameter reliabilitas komposit yang memenuhi batas keterandalan statistik secara optimal. Analisis mendalam mengenai dinamika komunikasi menunjukkan adanya kesinambungan yang konsisten antara ekspektasi pesan dengan respon kognitif audiens sasaran. Secara metodologis setiap indikator konstruk diuji melalui parameter reliabilitas komposit yang memenuhi batas keterandalan statistik secara optimal. Analisis mendalam mengenai dinamika komunikasi menunjukkan adanya kesinambungan yang konsisten antara ekspektasi pesan dengan respon kognitif audiens sasaran. Secara metodologis setiap indikator konstruk diuji melalui parameter reliabilitas komposit yang memenuhi batas keterandalan statistik secara optimal. Analisis mendalam mengenai dinamika komunikasi menunjukkan adanya kesinambungan yang konsisten antara ekspektasi pesan dengan respon kognitif audiens sasaran. Secara metodologis setiap indikator konstruk diuji melalui parameter reliabilitas komposit yang memenuhi batas keterandalan statistik secara optimal. Analisis mendalam mengenai dinamika komunikasi menunjukkan adanya kesinambungan yang konsisten antara ekspektasi pesan dengan respon kognitif audiens sasaran. Secara metodologis setiap indikator konstruk diuji melalui parameter reliabilitas komposit yang memenuhi batas keterandalan statistik secara optimal. Analisis mendalam mengenai dinamika komunikasi menunjukkan adanya kesinambungan yang konsisten antara ekspektasi pesan dengan respon kognitif audiens sasaran. Secara metodologis setiap indikator konstruk diuji melalui parameter reliabilitas komposit yang memenuhi batas keterandalan statistik secara optimal. Analisis mendalam mengenai dinamika komunikasi menunjukkan adanya kesinambungan yang konsisten antara ekspektasi pesan dengan respon kognitif audiens sasaran. Secara metodologis setiap indikator konstruk diuji melalui parameter reliabilitas komposit yang memenuhi batas keterandalan statistik secara optimal. Analisis mendalam mengenai dinamika komunikasi menunjukkan adanya kesinambungan yang konsisten antara ekspektasi pesan dengan respon kognitif audiens sasaran. Secara metodologis setiap indikator konstruk diuji melalui parameter reliabilitas komposit yang memenuhi batas keterandalan statistik secara optimal. Analisis mendalam mengenai dinamika komunikasi menunjukkan adanya kesinambungan yang konsisten antara ekspektasi pesan dengan respon kognitif audiens sasaran. Secara metodologis setiap indikator konstruk diuji melalui parameter reliabilitas komposit yang memenuhi batas keterandalan statistik secara optimal.</w:t>
+        <w:t>Analisis mendalam mengenai dinamika komunikasi menunjukkan adanya kesinambungan yang konsisten antara ekspektasi pesan dengan respon kognitif audiens sasaran. Secara metodologis setiap indikator konstruk diuji melalui parameter reliabilitas komposit yang memenuhi batas keterandalan statistik secara optimal. Analisis mendalam mengenai dinamika komunikasi menunjukkan adanya kesinambungan yang konsisten antara ekspektasi pesan dengan respon kognitif audiens sasaran. Secara metodologis setiap indikator konstruk diuji melalui parameter reliabilitas komposit yang memenuhi batas keterandalan statistik secara optimal. Analisis mendalam mengenai dinamika komunikasi menunjukkan adanya kesinambungan yang konsisten antara ekspektasi pesan dengan respon kognitif audiens sasaran. Secara metodologis setiap indikator konstruk diuji melalui parameter reliabilitas komposit yang memenuhi batas keterandalan statistik secara optimal. Analisis mendalam mengenai dinamika komunikasi menunjukkan adanya kesinambungan yang konsisten antara ekspektasi pesan dengan respon kognitif audiens sasaran. Secara metodologis setiap indikator konstruk diuji melalui parameter reliabilitas komposit yang memenuhi batas keterandalan statistik secara optimal. Analisis mendalam mengenai dinamika komunikasi menunjukkan adanya kesinambungan yang konsisten antara ekspektasi pesan dengan respon kognitif audiens sasaran. Secara metodologis setiap indikator konstruk diuji melalui parameter reliabilitas komposit yang memenuhi batas keterandalan statistik secara optimal. Analisis mendalam mengenai dinamika komunikasi menunjukkan adanya kesinambungan yang konsisten antara ekspektasi pesan dengan respon kognitif audiens sasaran. Secara metodologis setiap indikator konstruk diuji melalui parameter reliabilitas komposit yang memenuhi batas keterandalan statistik secara optimal. Analisis mendalam mengenai dinamika komunikasi menunjukkan adanya kesinambungan yang konsisten antara ekspektasi pesan dengan respon kognitif audiens sasaran. Secara metodologis setiap indikator konstruk diuji melalui parameter reliabilitas komposit yang memenuhi batas keterandalan statistik secara optimal. Analisis mendalam mengenai dinamika komunikasi menunjukkan adanya kesinambungan yang konsisten antara ekspektasi pesan dengan respon kognitif audiens sasaran. Secara metodologis setiap indikator konstruk diuji melalui parameter reliabilitas komposit yang memenuhi batas keterandalan statistik secara optimal. Analisis mendalam mengenai dinamika komunikasi menunjukkan adanya kesinambungan yang konsisten antara ekspektasi pesan dengan respon kognitif audiens sasaran. Secara metodologis setiap indikator konstruk diuji melalui parameter reliabilitas komposit yang memenuhi batas keterandalan statistik secara optimal. Analisis mendalam mengenai dinamika komunikasi menunjukkan adanya kesinambungan yang konsisten antara ekspektasi pesan dengan respon kognitif audiens sasaran. Secara metodologis setiap indikator konstruk diuji melalui parameter reliabilitas komposit yang memenuhi batas keterandalan statistik secara optimal. Analisis mendalam mengenai dinamika komunikasi menunjukkan adanya kesinambungan yang konsisten antara ekspektasi pesan dengan respon kognitif audiens sasaran. Secara metodologis setiap indikator konstruk diuji melalui parameter reliabilitas komposit yang memenuhi batas keterandalan statistik secara optimal. Analisis mendalam mengenai dinamika komunikasi menunjukkan adanya kesinambungan yang konsisten antara ekspektasi pesan dengan respon kognitif audiens sasaran. Secara metodologis setiap indikator konstruk diuji melalui parameter reliabilitas komposit yang memenuhi batas keterandalan statistik secara optimal.</w:t>
       </w:r>
     </w:p>
     <w:p>
@@ -987,7 +987,7 @@
           <w:rFonts w:ascii="Times New Roman" w:hAnsi="Times New Roman"/>
           <w:sz w:val="24"/>
         </w:rPr>
-        <w:t>Analisis mendalam mengenai dinamika komunikasi menunjukkan adanya kesinambungan yang konsisten antara ekspektasi pesan dengan respon kognitif audiens sasaran. Secara metodologis setiap indikator konstruk diuji melalui parameter reliabilitas komposit yang memenuhi batas keterandalan statistik secara optimal. Analisis mendalam mengenai dinamika komunikasi menunjukkan adanya kesinambungan yang konsisten antara ekspektasi pesan dengan respon kognitif audiens sasaran. Secara metodologis setiap indikator konstruk diuji melalui parameter reliabilitas komposit yang memenuhi batas keterandalan statistik secara optimal. Analisis mendalam mengenai dinamika komunikasi menunjukkan adanya kesinambungan yang konsisten antara ekspektasi pesan dengan respon kognitif audiens sasaran. Secara metodologis setiap indikator konstruk diuji melalui parameter reliabilitas komposit yang memenuhi batas keterandalan statistik secara optimal. Analisis mendalam mengenai dinamika komunikasi menunjukkan adanya kesinambungan yang konsisten antara ekspektasi pesan dengan respon kognitif audiens sasaran. Secara metodologis setiap indikator konstruk diuji melalui parameter reliabilitas komposit yang memenuhi batas keterandalan statistik secara optimal. Analisis mendalam mengenai dinamika komunikasi menunjukkan adanya kesinambungan yang konsisten antara ekspektasi pesan dengan respon kognitif audiens sasaran. Secara metodologis setiap indikator konstruk diuji melalui parameter reliabilitas komposit yang memenuhi batas keterandalan statistik secara optimal. Analisis mendalam mengenai dinamika komunikasi menunjukkan adanya kesinambungan yang konsisten antara ekspektasi pesan dengan respon kognitif audiens sasaran. Secara metodologis setiap indikator konstruk diuji melalui parameter reliabilitas komposit yang memenuhi batas keterandalan statistik secara optimal. Analisis mendalam mengenai dinamika komunikasi menunjukkan adanya kesinambungan yang konsisten antara ekspektasi pesan dengan respon kognitif audiens sasaran. Secara metodologis setiap indikator konstruk diuji melalui parameter reliabilitas komposit yang memenuhi batas keterandalan statistik secara optimal. Analisis mendalam mengenai dinamika komunikasi menunjukkan adanya kesinambungan yang konsisten antara ekspektasi pesan dengan respon kognitif audiens sasaran. Secara metodologis setiap indikator konstruk diuji melalui parameter reliabilitas komposit yang memenuhi batas keterandalan statistik secara optimal. Analisis mendalam mengenai dinamika komunikasi menunjukkan adanya kesinambungan yang konsisten antara ekspektasi pesan dengan respon kognitif audiens sasaran. Secara metodologis setiap indikator konstruk diuji melalui parameter reliabilitas komposit yang memenuhi batas keterandalan statistik secara optimal. Analisis mendalam mengenai dinamika komunikasi menunjukkan adanya kesinambungan yang konsisten antara ekspektasi pesan dengan respon kognitif audiens sasaran. Secara metodologis setiap indikator konstruk diuji melalui parameter reliabilitas komposit yang memenuhi batas keterandalan statistik secara optimal. Analisis mendalam mengenai dinamika komunikasi menunjukkan adanya kesinambungan yang konsisten antara ekspektasi pesan dengan respon kognitif audiens sasaran. Secara metodologis setiap indikator konstruk diuji melalui parameter reliabilitas komposit yang memenuhi batas keterandalan statistik secara optimal. Analisis mendalam mengenai dinamika komunikasi menunjukkan adanya kesinambungan yang konsisten antara ekspektasi pesan dengan respon kognitif audiens sasaran. Secara metodologis setiap indikator konstruk diuji melalui parameter reliabilitas komposit yang memenuhi batas keterandalan statistik secara optimal. Analisis mendalam mengenai dinamika komunikasi menunjukkan adanya kesinambungan yang konsisten antara ekspektasi pesan dengan respon kognitif audiens sasaran. Secara metodologis setiap indikator konstruk diuji melalui parameter reliabilitas komposit yang memenuhi batas keterandalan statistik secara optimal. Analisis mendalam mengenai dinamika komunikasi menunjukkan adanya kesinambungan yang konsisten antara ekspektasi pesan dengan respon kognitif audiens sasaran. Secara metodologis setiap indikator konstruk diuji melalui parameter reliabilitas komposit yang memenuhi batas keterandalan statistik secara optimal. Analisis mendalam mengenai dinamika komunikasi menunjukkan adanya kesinambungan yang konsisten antara ekspektasi pesan dengan respon kognitif audiens sasaran. Secara metodologis setiap indikator konstruk diuji melalui parameter reliabilitas komposit yang memenuhi batas keterandalan statistik secara optimal.</w:t>
+        <w:t>Analisis mendalam mengenai dinamika komunikasi menunjukkan adanya kesinambungan yang konsisten antara ekspektasi pesan dengan respon kognitif audiens sasaran. Secara metodologis setiap indikator konstruk diuji melalui parameter reliabilitas komposit yang memenuhi batas keterandalan statistik secara optimal. Analisis mendalam mengenai dinamika komunikasi menunjukkan adanya kesinambungan yang konsisten antara ekspektasi pesan dengan respon kognitif audiens sasaran. Secara metodologis setiap indikator konstruk diuji melalui parameter reliabilitas komposit yang memenuhi batas keterandalan statistik secara optimal. Analisis mendalam mengenai dinamika komunikasi menunjukkan adanya kesinambungan yang konsisten antara ekspektasi pesan dengan respon kognitif audiens sasaran. Secara metodologis setiap indikator konstruk diuji melalui parameter reliabilitas komposit yang memenuhi batas keterandalan statistik secara optimal. Analisis mendalam mengenai dinamika komunikasi menunjukkan adanya kesinambungan yang konsisten antara ekspektasi pesan dengan respon kognitif audiens sasaran. Secara metodologis setiap indikator konstruk diuji melalui parameter reliabilitas komposit yang memenuhi batas keterandalan statistik secara optimal. Analisis mendalam mengenai dinamika komunikasi menunjukkan adanya kesinambungan yang konsisten antara ekspektasi pesan dengan respon kognitif audiens sasaran. Secara metodologis setiap indikator konstruk diuji melalui parameter reliabilitas komposit yang memenuhi batas keterandalan statistik secara optimal. Analisis mendalam mengenai dinamika komunikasi menunjukkan adanya kesinambungan yang konsisten antara ekspektasi pesan dengan respon kognitif audiens sasaran. Secara metodologis setiap indikator konstruk diuji melalui parameter reliabilitas komposit yang memenuhi batas keterandalan statistik secara optimal. Analisis mendalam mengenai dinamika komunikasi menunjukkan adanya kesinambungan yang konsisten antara ekspektasi pesan dengan respon kognitif audiens sasaran. Secara metodologis setiap indikator konstruk diuji melalui parameter reliabilitas komposit yang memenuhi batas keterandalan statistik secara optimal. Analisis mendalam mengenai dinamika komunikasi menunjukkan adanya kesinambungan yang konsisten antara ekspektasi pesan dengan respon kognitif audiens sasaran. Secara metodologis setiap indikator konstruk diuji melalui parameter reliabilitas komposit yang memenuhi batas keterandalan statistik secara optimal. Analisis mendalam mengenai dinamika komunikasi menunjukkan adanya kesinambungan yang konsisten antara ekspektasi pesan dengan respon kognitif audiens sasaran. Secara metodologis setiap indikator konstruk diuji melalui parameter reliabilitas komposit yang memenuhi batas keterandalan statistik secara optimal. Analisis mendalam mengenai dinamika komunikasi menunjukkan adanya kesinambungan yang konsisten antara ekspektasi pesan dengan respon kognitif audiens sasaran. Secara metodologis setiap indikator konstruk diuji melalui parameter reliabilitas komposit yang memenuhi batas keterandalan statistik secara optimal. Analisis mendalam mengenai dinamika komunikasi menunjukkan adanya kesinambungan yang konsisten antara ekspektasi pesan dengan respon kognitif audiens sasaran. Secara metodologis setiap indikator konstruk diuji melalui parameter reliabilitas komposit yang memenuhi batas keterandalan statistik secara optimal. Analisis mendalam mengenai dinamika komunikasi menunjukkan adanya kesinambungan yang konsisten antara ekspektasi pesan dengan respon kognitif audiens sasaran. Secara metodologis setiap indikator konstruk diuji melalui parameter reliabilitas komposit yang memenuhi batas keterandalan statistik secara optimal.</w:t>
       </w:r>
     </w:p>
     <w:p>
@@ -1000,7 +1000,7 @@
           <w:rFonts w:ascii="Times New Roman" w:hAnsi="Times New Roman"/>
           <w:sz w:val="24"/>
         </w:rPr>
-        <w:t>Analisis mendalam mengenai dinamika komunikasi menunjukkan adanya kesinambungan yang konsisten antara ekspektasi pesan dengan respon kognitif audiens sasaran. Secara metodologis setiap indikator konstruk diuji melalui parameter reliabilitas komposit yang memenuhi batas keterandalan statistik secara optimal. Analisis mendalam mengenai dinamika komunikasi menunjukkan adanya kesinambungan yang konsisten antara ekspektasi pesan dengan respon kognitif audiens sasaran. Secara metodologis setiap indikator konstruk diuji melalui parameter reliabilitas komposit yang memenuhi batas keterandalan statistik secara optimal. Analisis mendalam mengenai dinamika komunikasi menunjukkan adanya kesinambungan yang konsisten antara ekspektasi pesan dengan respon kognitif audiens sasaran. Secara metodologis setiap indikator konstruk diuji melalui parameter reliabilitas komposit yang memenuhi batas keterandalan statistik secara optimal. Analisis mendalam mengenai dinamika komunikasi menunjukkan adanya kesinambungan yang konsisten antara ekspektasi pesan dengan respon kognitif audiens sasaran. Secara metodologis setiap indikator konstruk diuji melalui parameter reliabilitas komposit yang memenuhi batas keterandalan statistik secara optimal. Analisis mendalam mengenai dinamika komunikasi menunjukkan adanya kesinambungan yang konsisten antara ekspektasi pesan dengan respon kognitif audiens sasaran. Secara metodologis setiap indikator konstruk diuji melalui parameter reliabilitas komposit yang memenuhi batas keterandalan statistik secara optimal. Analisis mendalam mengenai dinamika komunikasi menunjukkan adanya kesinambungan yang konsisten antara ekspektasi pesan dengan respon kognitif audiens sasaran. Secara metodologis setiap indikator konstruk diuji melalui parameter reliabilitas komposit yang memenuhi batas keterandalan statistik secara optimal. Analisis mendalam mengenai dinamika komunikasi menunjukkan adanya kesinambungan yang konsisten antara ekspektasi pesan dengan respon kognitif audiens sasaran. Secara metodologis setiap indikator konstruk diuji melalui parameter reliabilitas komposit yang memenuhi batas keterandalan statistik secara optimal. Analisis mendalam mengenai dinamika komunikasi menunjukkan adanya kesinambungan yang konsisten antara ekspektasi pesan dengan respon kognitif audiens sasaran. Secara metodologis setiap indikator konstruk diuji melalui parameter reliabilitas komposit yang memenuhi batas keterandalan statistik secara optimal. Analisis mendalam mengenai dinamika komunikasi menunjukkan adanya kesinambungan yang konsisten antara ekspektasi pesan dengan respon kognitif audiens sasaran. Secara metodologis setiap indikator konstruk diuji melalui parameter reliabilitas komposit yang memenuhi batas keterandalan statistik secara optimal. Analisis mendalam mengenai dinamika komunikasi menunjukkan adanya kesinambungan yang konsisten antara ekspektasi pesan dengan respon kognitif audiens sasaran. Secara metodologis setiap indikator konstruk diuji melalui parameter reliabilitas komposit yang memenuhi batas keterandalan statistik secara optimal. Analisis mendalam mengenai dinamika komunikasi menunjukkan adanya kesinambungan yang konsisten antara ekspektasi pesan dengan respon kognitif audiens sasaran. Secara metodologis setiap indikator konstruk diuji melalui parameter reliabilitas komposit yang memenuhi batas keterandalan statistik secara optimal. Analisis mendalam mengenai dinamika komunikasi menunjukkan adanya kesinambungan yang konsisten antara ekspektasi pesan dengan respon kognitif audiens sasaran. Secara metodologis setiap indikator konstruk diuji melalui parameter reliabilitas komposit yang memenuhi batas keterandalan statistik secara optimal. Analisis mendalam mengenai dinamika komunikasi menunjukkan adanya kesinambungan yang konsisten antara ekspektasi pesan dengan respon kognitif audiens sasaran. Secara metodologis setiap indikator konstruk diuji melalui parameter reliabilitas komposit yang memenuhi batas keterandalan statistik secara optimal. Analisis mendalam mengenai dinamika komunikasi menunjukkan adanya kesinambungan yang konsisten antara ekspektasi pesan dengan respon kognitif audiens sasaran. Secara metodologis setiap indikator konstruk diuji melalui parameter reliabilitas komposit yang memenuhi batas keterandalan statistik secara optimal. Analisis mendalam mengenai dinamika komunikasi menunjukkan adanya kesinambungan yang konsisten antara ekspektasi pesan dengan respon kognitif audiens sasaran. Secara metodologis setiap indikator konstruk diuji melalui parameter reliabilitas komposit yang memenuhi batas keterandalan statistik secara optimal.</w:t>
+        <w:t>Analisis mendalam mengenai dinamika komunikasi menunjukkan adanya kesinambungan yang konsisten antara ekspektasi pesan dengan respon kognitif audiens sasaran. Secara metodologis setiap indikator konstruk diuji melalui parameter reliabilitas komposit yang memenuhi batas keterandalan statistik secara optimal. Analisis mendalam mengenai dinamika komunikasi menunjukkan adanya kesinambungan yang konsisten antara ekspektasi pesan dengan respon kognitif audiens sasaran. Secara metodologis setiap indikator konstruk diuji melalui parameter reliabilitas komposit yang memenuhi batas keterandalan statistik secara optimal. Analisis mendalam mengenai dinamika komunikasi menunjukkan adanya kesinambungan yang konsisten antara ekspektasi pesan dengan respon kognitif audiens sasaran. Secara metodologis setiap indikator konstruk diuji melalui parameter reliabilitas komposit yang memenuhi batas keterandalan statistik secara optimal. Analisis mendalam mengenai dinamika komunikasi menunjukkan adanya kesinambungan yang konsisten antara ekspektasi pesan dengan respon kognitif audiens sasaran. Secara metodologis setiap indikator konstruk diuji melalui parameter reliabilitas komposit yang memenuhi batas keterandalan statistik secara optimal. Analisis mendalam mengenai dinamika komunikasi menunjukkan adanya kesinambungan yang konsisten antara ekspektasi pesan dengan respon kognitif audiens sasaran. Secara metodologis setiap indikator konstruk diuji melalui parameter reliabilitas komposit yang memenuhi batas keterandalan statistik secara optimal. Analisis mendalam mengenai dinamika komunikasi menunjukkan adanya kesinambungan yang konsisten antara ekspektasi pesan dengan respon kognitif audiens sasaran. Secara metodologis setiap indikator konstruk diuji melalui parameter reliabilitas komposit yang memenuhi batas keterandalan statistik secara optimal. Analisis mendalam mengenai dinamika komunikasi menunjukkan adanya kesinambungan yang konsisten antara ekspektasi pesan dengan respon kognitif audiens sasaran. Secara metodologis setiap indikator konstruk diuji melalui parameter reliabilitas komposit yang memenuhi batas keterandalan statistik secara optimal. Analisis mendalam mengenai dinamika komunikasi menunjukkan adanya kesinambungan yang konsisten antara ekspektasi pesan dengan respon kognitif audiens sasaran. Secara metodologis setiap indikator konstruk diuji melalui parameter reliabilitas komposit yang memenuhi batas keterandalan statistik secara optimal. Analisis mendalam mengenai dinamika komunikasi menunjukkan adanya kesinambungan yang konsisten antara ekspektasi pesan dengan respon kognitif audiens sasaran. Secara metodologis setiap indikator konstruk diuji melalui parameter reliabilitas komposit yang memenuhi batas keterandalan statistik secara optimal. Analisis mendalam mengenai dinamika komunikasi menunjukkan adanya kesinambungan yang konsisten antara ekspektasi pesan dengan respon kognitif audiens sasaran. Secara metodologis setiap indikator konstruk diuji melalui parameter reliabilitas komposit yang memenuhi batas keterandalan statistik secara optimal. Analisis mendalam mengenai dinamika komunikasi menunjukkan adanya kesinambungan yang konsisten antara ekspektasi pesan dengan respon kognitif audiens sasaran. Secara metodologis setiap indikator konstruk diuji melalui parameter reliabilitas komposit yang memenuhi batas keterandalan statistik secara optimal. Analisis mendalam mengenai dinamika komunikasi menunjukkan adanya kesinambungan yang konsisten antara ekspektasi pesan dengan respon kognitif audiens sasaran. Secara metodologis setiap indikator konstruk diuji melalui parameter reliabilitas komposit yang memenuhi batas keterandalan statistik secara optimal.</w:t>
       </w:r>
     </w:p>
     <w:p>
@@ -1013,7 +1013,7 @@
           <w:rFonts w:ascii="Times New Roman" w:hAnsi="Times New Roman"/>
           <w:sz w:val="24"/>
         </w:rPr>
-        <w:t>Analisis mendalam mengenai dinamika komunikasi menunjukkan adanya kesinambungan yang konsisten antara ekspektasi pesan dengan respon kognitif audiens sasaran. Secara metodologis setiap indikator konstruk diuji melalui parameter reliabilitas komposit yang memenuhi batas keterandalan statistik secara optimal. Analisis mendalam mengenai dinamika komunikasi menunjukkan adanya kesinambungan yang konsisten antara ekspektasi pesan dengan respon kognitif audiens sasaran. Secara metodologis setiap indikator konstruk diuji melalui parameter reliabilitas komposit yang memenuhi batas keterandalan statistik secara optimal. Analisis mendalam mengenai dinamika komunikasi menunjukkan adanya kesinambungan yang konsisten antara ekspektasi pesan dengan respon kognitif audiens sasaran. Secara metodologis setiap indikator konstruk diuji melalui parameter reliabilitas komposit yang memenuhi batas keterandalan statistik secara optimal. Analisis mendalam mengenai dinamika komunikasi menunjukkan adanya kesinambungan yang konsisten antara ekspektasi pesan dengan respon kognitif audiens sasaran. Secara metodologis setiap indikator konstruk diuji melalui parameter reliabilitas komposit yang memenuhi batas keterandalan statistik secara optimal. Analisis mendalam mengenai dinamika komunikasi menunjukkan adanya kesinambungan yang konsisten antara ekspektasi pesan dengan respon kognitif audiens sasaran. Secara metodologis setiap indikator konstruk diuji melalui parameter reliabilitas komposit yang memenuhi batas keterandalan statistik secara optimal. Analisis mendalam mengenai dinamika komunikasi menunjukkan adanya kesinambungan yang konsisten antara ekspektasi pesan dengan respon kognitif audiens sasaran. Secara metodologis setiap indikator konstruk diuji melalui parameter reliabilitas komposit yang memenuhi batas keterandalan statistik secara optimal. Analisis mendalam mengenai dinamika komunikasi menunjukkan adanya kesinambungan yang konsisten antara ekspektasi pesan dengan respon kognitif audiens sasaran. Secara metodologis setiap indikator konstruk diuji melalui parameter reliabilitas komposit yang memenuhi batas keterandalan statistik secara optimal. Analisis mendalam mengenai dinamika komunikasi menunjukkan adanya kesinambungan yang konsisten antara ekspektasi pesan dengan respon kognitif audiens sasaran. Secara metodologis setiap indikator konstruk diuji melalui parameter reliabilitas komposit yang memenuhi batas keterandalan statistik secara optimal. Analisis mendalam mengenai dinamika komunikasi menunjukkan adanya kesinambungan yang konsisten antara ekspektasi pesan dengan respon kognitif audiens sasaran. Secara metodologis setiap indikator konstruk diuji melalui parameter reliabilitas komposit yang memenuhi batas keterandalan statistik secara optimal. Analisis mendalam mengenai dinamika komunikasi menunjukkan adanya kesinambungan yang konsisten antara ekspektasi pesan dengan respon kognitif audiens sasaran. Secara metodologis setiap indikator konstruk diuji melalui parameter reliabilitas komposit yang memenuhi batas keterandalan statistik secara optimal. Analisis mendalam mengenai dinamika komunikasi menunjukkan adanya kesinambungan yang konsisten antara ekspektasi pesan dengan respon kognitif audiens sasaran. Secara metodologis setiap indikator konstruk diuji melalui parameter reliabilitas komposit yang memenuhi batas keterandalan statistik secara optimal. Analisis mendalam mengenai dinamika komunikasi menunjukkan adanya kesinambungan yang konsisten antara ekspektasi pesan dengan respon kognitif audiens sasaran. Secara metodologis setiap indikator konstruk diuji melalui parameter reliabilitas komposit yang memenuhi batas keterandalan statistik secara optimal. Analisis mendalam mengenai dinamika komunikasi menunjukkan adanya kesinambungan yang konsisten antara ekspektasi pesan dengan respon kognitif audiens sasaran. Secara metodologis setiap indikator konstruk diuji melalui parameter reliabilitas komposit yang memenuhi batas keterandalan statistik secara optimal. Analisis mendalam mengenai dinamika komunikasi menunjukkan adanya kesinambungan yang konsisten antara ekspektasi pesan dengan respon kognitif audiens sasaran. Secara metodologis setiap indikator konstruk diuji melalui parameter reliabilitas komposit yang memenuhi batas keterandalan statistik secara optimal. Analisis mendalam mengenai dinamika komunikasi menunjukkan adanya kesinambungan yang konsisten antara ekspektasi pesan dengan respon kognitif audiens sasaran. Secara metodologis setiap indikator konstruk diuji melalui parameter reliabilitas komposit yang memenuhi batas keterandalan statistik secara optimal.</w:t>
+        <w:t>Analisis mendalam mengenai dinamika komunikasi menunjukkan adanya kesinambungan yang konsisten antara ekspektasi pesan dengan respon kognitif audiens sasaran. Secara metodologis setiap indikator konstruk diuji melalui parameter reliabilitas komposit yang memenuhi batas keterandalan statistik secara optimal. Analisis mendalam mengenai dinamika komunikasi menunjukkan adanya kesinambungan yang konsisten antara ekspektasi pesan dengan respon kognitif audiens sasaran. Secara metodologis setiap indikator konstruk diuji melalui parameter reliabilitas komposit yang memenuhi batas keterandalan statistik secara optimal. Analisis mendalam mengenai dinamika komunikasi menunjukkan adanya kesinambungan yang konsisten antara ekspektasi pesan dengan respon kognitif audiens sasaran. Secara metodologis setiap indikator konstruk diuji melalui parameter reliabilitas komposit yang memenuhi batas keterandalan statistik secara optimal. Analisis mendalam mengenai dinamika komunikasi menunjukkan adanya kesinambungan yang konsisten antara ekspektasi pesan dengan respon kognitif audiens sasaran. Secara metodologis setiap indikator konstruk diuji melalui parameter reliabilitas komposit yang memenuhi batas keterandalan statistik secara optimal. Analisis mendalam mengenai dinamika komunikasi menunjukkan adanya kesinambungan yang konsisten antara ekspektasi pesan dengan respon kognitif audiens sasaran. Secara metodologis setiap indikator konstruk diuji melalui parameter reliabilitas komposit yang memenuhi batas keterandalan statistik secara optimal. Analisis mendalam mengenai dinamika komunikasi menunjukkan adanya kesinambungan yang konsisten antara ekspektasi pesan dengan respon kognitif audiens sasaran. Secara metodologis setiap indikator konstruk diuji melalui parameter reliabilitas komposit yang memenuhi batas keterandalan statistik secara optimal. Analisis mendalam mengenai dinamika komunikasi menunjukkan adanya kesinambungan yang konsisten antara ekspektasi pesan dengan respon kognitif audiens sasaran. Secara metodologis setiap indikator konstruk diuji melalui parameter reliabilitas komposit yang memenuhi batas keterandalan statistik secara optimal. Analisis mendalam mengenai dinamika komunikasi menunjukkan adanya kesinambungan yang konsisten antara ekspektasi pesan dengan respon kognitif audiens sasaran. Secara metodologis setiap indikator konstruk diuji melalui parameter reliabilitas komposit yang memenuhi batas keterandalan statistik secara optimal. Analisis mendalam mengenai dinamika komunikasi menunjukkan adanya kesinambungan yang konsisten antara ekspektasi pesan dengan respon kognitif audiens sasaran. Secara metodologis setiap indikator konstruk diuji melalui parameter reliabilitas komposit yang memenuhi batas keterandalan statistik secara optimal. Analisis mendalam mengenai dinamika komunikasi menunjukkan adanya kesinambungan yang konsisten antara ekspektasi pesan dengan respon kognitif audiens sasaran. Secara metodologis setiap indikator konstruk diuji melalui parameter reliabilitas komposit yang memenuhi batas keterandalan statistik secara optimal. Analisis mendalam mengenai dinamika komunikasi menunjukkan adanya kesinambungan yang konsisten antara ekspektasi pesan dengan respon kognitif audiens sasaran. Secara metodologis setiap indikator konstruk diuji melalui parameter reliabilitas komposit yang memenuhi batas keterandalan statistik secara optimal. Analisis mendalam mengenai dinamika komunikasi menunjukkan adanya kesinambungan yang konsisten antara ekspektasi pesan dengan respon kognitif audiens sasaran. Secara metodologis setiap indikator konstruk diuji melalui parameter reliabilitas komposit yang memenuhi batas keterandalan statistik secara optimal.</w:t>
       </w:r>
     </w:p>
     <w:p>
@@ -1026,7 +1026,7 @@
           <w:rFonts w:ascii="Times New Roman" w:hAnsi="Times New Roman"/>
           <w:sz w:val="24"/>
         </w:rPr>
-        <w:t>Analisis mendalam mengenai dinamika komunikasi menunjukkan adanya kesinambungan yang konsisten antara ekspektasi pesan dengan respon kognitif audiens sasaran. Secara metodologis setiap indikator konstruk diuji melalui parameter reliabilitas komposit yang memenuhi batas keterandalan statistik secara optimal. Analisis mendalam mengenai dinamika komunikasi menunjukkan adanya kesinambungan yang konsisten antara ekspektasi pesan dengan respon kognitif audiens sasaran. Secara metodologis setiap indikator konstruk diuji melalui parameter reliabilitas komposit yang memenuhi batas keterandalan statistik secara optimal. Analisis mendalam mengenai dinamika komunikasi menunjukkan adanya kesinambungan yang konsisten antara ekspektasi pesan dengan respon kognitif audiens sasaran. Secara metodologis setiap indikator konstruk diuji melalui parameter reliabilitas komposit yang memenuhi batas keterandalan statistik secara optimal. Analisis mendalam mengenai dinamika komunikasi menunjukkan adanya kesinambungan yang konsisten antara ekspektasi pesan dengan respon kognitif audiens sasaran. Secara metodologis setiap indikator konstruk diuji melalui parameter reliabilitas komposit yang memenuhi batas keterandalan statistik secara optimal. Analisis mendalam mengenai dinamika komunikasi menunjukkan adanya kesinambungan yang konsisten antara ekspektasi pesan dengan respon kognitif audiens sasaran. Secara metodologis setiap indikator konstruk diuji melalui parameter reliabilitas komposit yang memenuhi batas keterandalan statistik secara optimal. Analisis mendalam mengenai dinamika komunikasi menunjukkan adanya kesinambungan yang konsisten antara ekspektasi pesan dengan respon kognitif audiens sasaran. Secara metodologis setiap indikator konstruk diuji melalui parameter reliabilitas komposit yang memenuhi batas keterandalan statistik secara optimal. Analisis mendalam mengenai dinamika komunikasi menunjukkan adanya kesinambungan yang konsisten antara ekspektasi pesan dengan respon kognitif audiens sasaran. Secara metodologis setiap indikator konstruk diuji melalui parameter reliabilitas komposit yang memenuhi batas keterandalan statistik secara optimal. Analisis mendalam mengenai dinamika komunikasi menunjukkan adanya kesinambungan yang konsisten antara ekspektasi pesan dengan respon kognitif audiens sasaran. Secara metodologis setiap indikator konstruk diuji melalui parameter reliabilitas komposit yang memenuhi batas keterandalan statistik secara optimal. Analisis mendalam mengenai dinamika komunikasi menunjukkan adanya kesinambungan yang konsisten antara ekspektasi pesan dengan respon kognitif audiens sasaran. Secara metodologis setiap indikator konstruk diuji melalui parameter reliabilitas komposit yang memenuhi batas keterandalan statistik secara optimal. Analisis mendalam mengenai dinamika komunikasi menunjukkan adanya kesinambungan yang konsisten antara ekspektasi pesan dengan respon kognitif audiens sasaran. Secara metodologis setiap indikator konstruk diuji melalui parameter reliabilitas komposit yang memenuhi batas keterandalan statistik secara optimal. Analisis mendalam mengenai dinamika komunikasi menunjukkan adanya kesinambungan yang konsisten antara ekspektasi pesan dengan respon kognitif audiens sasaran. Secara metodologis setiap indikator konstruk diuji melalui parameter reliabilitas komposit yang memenuhi batas keterandalan statistik secara optimal. Analisis mendalam mengenai dinamika komunikasi menunjukkan adanya kesinambungan yang konsisten antara ekspektasi pesan dengan respon kognitif audiens sasaran. Secara metodologis setiap indikator konstruk diuji melalui parameter reliabilitas komposit yang memenuhi batas keterandalan statistik secara optimal. Analisis mendalam mengenai dinamika komunikasi menunjukkan adanya kesinambungan yang konsisten antara ekspektasi pesan dengan respon kognitif audiens sasaran. Secara metodologis setiap indikator konstruk diuji melalui parameter reliabilitas komposit yang memenuhi batas keterandalan statistik secara optimal. Analisis mendalam mengenai dinamika komunikasi menunjukkan adanya kesinambungan yang konsisten antara ekspektasi pesan dengan respon kognitif audiens sasaran. Secara metodologis setiap indikator konstruk diuji melalui parameter reliabilitas komposit yang memenuhi batas keterandalan statistik secara optimal. Analisis mendalam mengenai dinamika komunikasi menunjukkan adanya kesinambungan yang konsisten antara ekspektasi pesan dengan respon kognitif audiens sasaran. Secara metodologis setiap indikator konstruk diuji melalui parameter reliabilitas komposit yang memenuhi batas keterandalan statistik secara optimal.</w:t>
+        <w:t>Analisis mendalam mengenai dinamika komunikasi menunjukkan adanya kesinambungan yang konsisten antara ekspektasi pesan dengan respon kognitif audiens sasaran. Secara metodologis setiap indikator konstruk diuji melalui parameter reliabilitas komposit yang memenuhi batas keterandalan statistik secara optimal. Analisis mendalam mengenai dinamika komunikasi menunjukkan adanya kesinambungan yang konsisten antara ekspektasi pesan dengan respon kognitif audiens sasaran. Secara metodologis setiap indikator konstruk diuji melalui parameter reliabilitas komposit yang memenuhi batas keterandalan statistik secara optimal. Analisis mendalam mengenai dinamika komunikasi menunjukkan adanya kesinambungan yang konsisten antara ekspektasi pesan dengan respon kognitif audiens sasaran. Secara metodologis setiap indikator konstruk diuji melalui parameter reliabilitas komposit yang memenuhi batas keterandalan statistik secara optimal. Analisis mendalam mengenai dinamika komunikasi menunjukkan adanya kesinambungan yang konsisten antara ekspektasi pesan dengan respon kognitif audiens sasaran. Secara metodologis setiap indikator konstruk diuji melalui parameter reliabilitas komposit yang memenuhi batas keterandalan statistik secara optimal. Analisis mendalam mengenai dinamika komunikasi menunjukkan adanya kesinambungan yang konsisten antara ekspektasi pesan dengan respon kognitif audiens sasaran. Secara metodologis setiap indikator konstruk diuji melalui parameter reliabilitas komposit yang memenuhi batas keterandalan statistik secara optimal. Analisis mendalam mengenai dinamika komunikasi menunjukkan adanya kesinambungan yang konsisten antara ekspektasi pesan dengan respon kognitif audiens sasaran. Secara metodologis setiap indikator konstruk diuji melalui parameter reliabilitas komposit yang memenuhi batas keterandalan statistik secara optimal. Analisis mendalam mengenai dinamika komunikasi menunjukkan adanya kesinambungan yang konsisten antara ekspektasi pesan dengan respon kognitif audiens sasaran. Secara metodologis setiap indikator konstruk diuji melalui parameter reliabilitas komposit yang memenuhi batas keterandalan statistik secara optimal. Analisis mendalam mengenai dinamika komunikasi menunjukkan adanya kesinambungan yang konsisten antara ekspektasi pesan dengan respon kognitif audiens sasaran. Secara metodologis setiap indikator konstruk diuji melalui parameter reliabilitas komposit yang memenuhi batas keterandalan statistik secara optimal. Analisis mendalam mengenai dinamika komunikasi menunjukkan adanya kesinambungan yang konsisten antara ekspektasi pesan dengan respon kognitif audiens sasaran. Secara metodologis setiap indikator konstruk diuji melalui parameter reliabilitas komposit yang memenuhi batas keterandalan statistik secara optimal. Analisis mendalam mengenai dinamika komunikasi menunjukkan adanya kesinambungan yang konsisten antara ekspektasi pesan dengan respon kognitif audiens sasaran. Secara metodologis setiap indikator konstruk diuji melalui parameter reliabilitas komposit yang memenuhi batas keterandalan statistik secara optimal. Analisis mendalam mengenai dinamika komunikasi menunjukkan adanya kesinambungan yang konsisten antara ekspektasi pesan dengan respon kognitif audiens sasaran. Secara metodologis setiap indikator konstruk diuji melalui parameter reliabilitas komposit yang memenuhi batas keterandalan statistik secara optimal. Analisis mendalam mengenai dinamika komunikasi menunjukkan adanya kesinambungan yang konsisten antara ekspektasi pesan dengan respon kognitif audiens sasaran. Secara metodologis setiap indikator konstruk diuji melalui parameter reliabilitas komposit yang memenuhi batas keterandalan statistik secara optimal.</w:t>
       </w:r>
     </w:p>
     <w:p>
@@ -1039,7 +1039,7 @@
           <w:rFonts w:ascii="Times New Roman" w:hAnsi="Times New Roman"/>
           <w:sz w:val="24"/>
         </w:rPr>
-        <w:t>Analisis mendalam mengenai dinamika komunikasi menunjukkan adanya kesinambungan yang konsisten antara ekspektasi pesan dengan respon kognitif audiens sasaran. Secara metodologis setiap indikator konstruk diuji melalui parameter reliabilitas komposit yang memenuhi batas keterandalan statistik secara optimal. Analisis mendalam mengenai dinamika komunikasi menunjukkan adanya kesinambungan yang konsisten antara ekspektasi pesan dengan respon kognitif audiens sasaran. Secara metodologis setiap indikator konstruk diuji melalui parameter reliabilitas komposit yang memenuhi batas keterandalan statistik secara optimal. Analisis mendalam mengenai dinamika komunikasi menunjukkan adanya kesinambungan yang konsisten antara ekspektasi pesan dengan respon kognitif audiens sasaran. Secara metodologis setiap indikator konstruk diuji melalui parameter reliabilitas komposit yang memenuhi batas keterandalan statistik secara optimal. Analisis mendalam mengenai dinamika komunikasi menunjukkan adanya kesinambungan yang konsisten antara ekspektasi pesan dengan respon kognitif audiens sasaran. Secara metodologis setiap indikator konstruk diuji melalui parameter reliabilitas komposit yang memenuhi batas keterandalan statistik secara optimal. Analisis mendalam mengenai dinamika komunikasi menunjukkan adanya kesinambungan yang konsisten antara ekspektasi pesan dengan respon kognitif audiens sasaran. Secara metodologis setiap indikator konstruk diuji melalui parameter reliabilitas komposit yang memenuhi batas keterandalan statistik secara optimal. Analisis mendalam mengenai dinamika komunikasi menunjukkan adanya kesinambungan yang konsisten antara ekspektasi pesan dengan respon kognitif audiens sasaran. Secara metodologis setiap indikator konstruk diuji melalui parameter reliabilitas komposit yang memenuhi batas keterandalan statistik secara optimal. Analisis mendalam mengenai dinamika komunikasi menunjukkan adanya kesinambungan yang konsisten antara ekspektasi pesan dengan respon kognitif audiens sasaran. Secara metodologis setiap indikator konstruk diuji melalui parameter reliabilitas komposit yang memenuhi batas keterandalan statistik secara optimal. Analisis mendalam mengenai dinamika komunikasi menunjukkan adanya kesinambungan yang konsisten antara ekspektasi pesan dengan respon kognitif audiens sasaran. Secara metodologis setiap indikator konstruk diuji melalui parameter reliabilitas komposit yang memenuhi batas keterandalan statistik secara optimal. Analisis mendalam mengenai dinamika komunikasi menunjukkan adanya kesinambungan yang konsisten antara ekspektasi pesan dengan respon kognitif audiens sasaran. Secara metodologis setiap indikator konstruk diuji melalui parameter reliabilitas komposit yang memenuhi batas keterandalan statistik secara optimal. Analisis mendalam mengenai dinamika komunikasi menunjukkan adanya kesinambungan yang konsisten antara ekspektasi pesan dengan respon kognitif audiens sasaran. Secara metodologis setiap indikator konstruk diuji melalui parameter reliabilitas komposit yang memenuhi batas keterandalan statistik secara optimal. Analisis mendalam mengenai dinamika komunikasi menunjukkan adanya kesinambungan yang konsisten antara ekspektasi pesan dengan respon kognitif audiens sasaran. Secara metodologis setiap indikator konstruk diuji melalui parameter reliabilitas komposit yang memenuhi batas keterandalan statistik secara optimal. Analisis mendalam mengenai dinamika komunikasi menunjukkan adanya kesinambungan yang konsisten antara ekspektasi pesan dengan respon kognitif audiens sasaran. Secara metodologis setiap indikator konstruk diuji melalui parameter reliabilitas komposit yang memenuhi batas keterandalan statistik secara optimal. Analisis mendalam mengenai dinamika komunikasi menunjukkan adanya kesinambungan yang konsisten antara ekspektasi pesan dengan respon kognitif audiens sasaran. Secara metodologis setiap indikator konstruk diuji melalui parameter reliabilitas komposit yang memenuhi batas keterandalan statistik secara optimal. Analisis mendalam mengenai dinamika komunikasi menunjukkan adanya kesinambungan yang konsisten antara ekspektasi pesan dengan respon kognitif audiens sasaran. Secara metodologis setiap indikator konstruk diuji melalui parameter reliabilitas komposit yang memenuhi batas keterandalan statistik secara optimal. Analisis mendalam mengenai dinamika komunikasi menunjukkan adanya kesinambungan yang konsisten antara ekspektasi pesan dengan respon kognitif audiens sasaran. Secara metodologis setiap indikator konstruk diuji melalui parameter reliabilitas komposit yang memenuhi batas keterandalan statistik secara optimal.</w:t>
+        <w:t>Analisis mendalam mengenai dinamika komunikasi menunjukkan adanya kesinambungan yang konsisten antara ekspektasi pesan dengan respon kognitif audiens sasaran. Secara metodologis setiap indikator konstruk diuji melalui parameter reliabilitas komposit yang memenuhi batas keterandalan statistik secara optimal. Analisis mendalam mengenai dinamika komunikasi menunjukkan adanya kesinambungan yang konsisten antara ekspektasi pesan dengan respon kognitif audiens sasaran. Secara metodologis setiap indikator konstruk diuji melalui parameter reliabilitas komposit yang memenuhi batas keterandalan statistik secara optimal. Analisis mendalam mengenai dinamika komunikasi menunjukkan adanya kesinambungan yang konsisten antara ekspektasi pesan dengan respon kognitif audiens sasaran. Secara metodologis setiap indikator konstruk diuji melalui parameter reliabilitas komposit yang memenuhi batas keterandalan statistik secara optimal. Analisis mendalam mengenai dinamika komunikasi menunjukkan adanya kesinambungan yang konsisten antara ekspektasi pesan dengan respon kognitif audiens sasaran. Secara metodologis setiap indikator konstruk diuji melalui parameter reliabilitas komposit yang memenuhi batas keterandalan statistik secara optimal. Analisis mendalam mengenai dinamika komunikasi menunjukkan adanya kesinambungan yang konsisten antara ekspektasi pesan dengan respon kognitif audiens sasaran. Secara metodologis setiap indikator konstruk diuji melalui parameter reliabilitas komposit yang memenuhi batas keterandalan statistik secara optimal. Analisis mendalam mengenai dinamika komunikasi menunjukkan adanya kesinambungan yang konsisten antara ekspektasi pesan dengan respon kognitif audiens sasaran. Secara metodologis setiap indikator konstruk diuji melalui parameter reliabilitas komposit yang memenuhi batas keterandalan statistik secara optimal. Analisis mendalam mengenai dinamika komunikasi menunjukkan adanya kesinambungan yang konsisten antara ekspektasi pesan dengan respon kognitif audiens sasaran. Secara metodologis setiap indikator konstruk diuji melalui parameter reliabilitas komposit yang memenuhi batas keterandalan statistik secara optimal. Analisis mendalam mengenai dinamika komunikasi menunjukkan adanya kesinambungan yang konsisten antara ekspektasi pesan dengan respon kognitif audiens sasaran. Secara metodologis setiap indikator konstruk diuji melalui parameter reliabilitas komposit yang memenuhi batas keterandalan statistik secara optimal. Analisis mendalam mengenai dinamika komunikasi menunjukkan adanya kesinambungan yang konsisten antara ekspektasi pesan dengan respon kognitif audiens sasaran. Secara metodologis setiap indikator konstruk diuji melalui parameter reliabilitas komposit yang memenuhi batas keterandalan statistik secara optimal. Analisis mendalam mengenai dinamika komunikasi menunjukkan adanya kesinambungan yang konsisten antara ekspektasi pesan dengan respon kognitif audiens sasaran. Secara metodologis setiap indikator konstruk diuji melalui parameter reliabilitas komposit yang memenuhi batas keterandalan statistik secara optimal. Analisis mendalam mengenai dinamika komunikasi menunjukkan adanya kesinambungan yang konsisten antara ekspektasi pesan dengan respon kognitif audiens sasaran. Secara metodologis setiap indikator konstruk diuji melalui parameter reliabilitas komposit yang memenuhi batas keterandalan statistik secara optimal. Analisis mendalam mengenai dinamika komunikasi menunjukkan adanya kesinambungan yang konsisten antara ekspektasi pesan dengan respon kognitif audiens sasaran. Secara metodologis setiap indikator konstruk diuji melalui parameter reliabilitas komposit yang memenuhi batas keterandalan statistik secara optimal.</w:t>
       </w:r>
     </w:p>
     <w:p>
@@ -1052,7 +1052,7 @@
           <w:rFonts w:ascii="Times New Roman" w:hAnsi="Times New Roman"/>
           <w:sz w:val="24"/>
         </w:rPr>
-        <w:t>Analisis mendalam mengenai dinamika komunikasi menunjukkan adanya kesinambungan yang konsisten antara ekspektasi pesan dengan respon kognitif audiens sasaran. Secara metodologis setiap indikator konstruk diuji melalui parameter reliabilitas komposit yang memenuhi batas keterandalan statistik secara optimal. Analisis mendalam mengenai dinamika komunikasi menunjukkan adanya kesinambungan yang konsisten antara ekspektasi pesan dengan respon kognitif audiens sasaran. Secara metodologis setiap indikator konstruk diuji melalui parameter reliabilitas komposit yang memenuhi batas keterandalan statistik secara optimal. Analisis mendalam mengenai dinamika komunikasi menunjukkan adanya kesinambungan yang konsisten antara ekspektasi pesan dengan respon kognitif audiens sasaran. Secara metodologis setiap indikator konstruk diuji melalui parameter reliabilitas komposit yang memenuhi batas keterandalan statistik secara optimal. Analisis mendalam mengenai dinamika komunikasi menunjukkan adanya kesinambungan yang konsisten antara ekspektasi pesan dengan respon kognitif audiens sasaran. Secara metodologis setiap indikator konstruk diuji melalui parameter reliabilitas komposit yang memenuhi batas keterandalan statistik secara optimal. Analisis mendalam mengenai dinamika komunikasi menunjukkan adanya kesinambungan yang konsisten antara ekspektasi pesan dengan respon kognitif audiens sasaran. Secara metodologis setiap indikator konstruk diuji melalui parameter reliabilitas komposit yang memenuhi batas keterandalan statistik secara optimal. Analisis mendalam mengenai dinamika komunikasi menunjukkan adanya kesinambungan yang konsisten antara ekspektasi pesan dengan respon kognitif audiens sasaran. Secara metodologis setiap indikator konstruk diuji melalui parameter reliabilitas komposit yang memenuhi batas keterandalan statistik secara optimal. Analisis mendalam mengenai dinamika komunikasi menunjukkan adanya kesinambungan yang konsisten antara ekspektasi pesan dengan respon kognitif audiens sasaran. Secara metodologis setiap indikator konstruk diuji melalui parameter reliabilitas komposit yang memenuhi batas keterandalan statistik secara optimal. Analisis mendalam mengenai dinamika komunikasi menunjukkan adanya kesinambungan yang konsisten antara ekspektasi pesan dengan respon kognitif audiens sasaran. Secara metodologis setiap indikator konstruk diuji melalui parameter reliabilitas komposit yang memenuhi batas keterandalan statistik secara optimal. Analisis mendalam mengenai dinamika komunikasi menunjukkan adanya kesinambungan yang konsisten antara ekspektasi pesan dengan respon kognitif audiens sasaran. Secara metodologis setiap indikator konstruk diuji melalui parameter reliabilitas komposit yang memenuhi batas keterandalan statistik secara optimal. Analisis mendalam mengenai dinamika komunikasi menunjukkan adanya kesinambungan yang konsisten antara ekspektasi pesan dengan respon kognitif audiens sasaran. Secara metodologis setiap indikator konstruk diuji melalui parameter reliabilitas komposit yang memenuhi batas keterandalan statistik secara optimal. Analisis mendalam mengenai dinamika komunikasi menunjukkan adanya kesinambungan yang konsisten antara ekspektasi pesan dengan respon kognitif audiens sasaran. Secara metodologis setiap indikator konstruk diuji melalui parameter reliabilitas komposit yang memenuhi batas keterandalan statistik secara optimal. Analisis mendalam mengenai dinamika komunikasi menunjukkan adanya kesinambungan yang konsisten antara ekspektasi pesan dengan respon kognitif audiens sasaran. Secara metodologis setiap indikator konstruk diuji melalui parameter reliabilitas komposit yang memenuhi batas keterandalan statistik secara optimal. Analisis mendalam mengenai dinamika komunikasi menunjukkan adanya kesinambungan yang konsisten antara ekspektasi pesan dengan respon kognitif audiens sasaran. Secara metodologis setiap indikator konstruk diuji melalui parameter reliabilitas komposit yang memenuhi batas keterandalan statistik secara optimal. Analisis mendalam mengenai dinamika komunikasi menunjukkan adanya kesinambungan yang konsisten antara ekspektasi pesan dengan respon kognitif audiens sasaran. Secara metodologis setiap indikator konstruk diuji melalui parameter reliabilitas komposit yang memenuhi batas keterandalan statistik secara optimal. Analisis mendalam mengenai dinamika komunikasi menunjukkan adanya kesinambungan yang konsisten antara ekspektasi pesan dengan respon kognitif audiens sasaran. Secara metodologis setiap indikator konstruk diuji melalui parameter reliabilitas komposit yang memenuhi batas keterandalan statistik secara optimal.</w:t>
+        <w:t>Analisis mendalam mengenai dinamika komunikasi menunjukkan adanya kesinambungan yang konsisten antara ekspektasi pesan dengan respon kognitif audiens sasaran. Secara metodologis setiap indikator konstruk diuji melalui parameter reliabilitas komposit yang memenuhi batas keterandalan statistik secara optimal. Analisis mendalam mengenai dinamika komunikasi menunjukkan adanya kesinambungan yang konsisten antara ekspektasi pesan dengan respon kognitif audiens sasaran. Secara metodologis setiap indikator konstruk diuji melalui parameter reliabilitas komposit yang memenuhi batas keterandalan statistik secara optimal. Analisis mendalam mengenai dinamika komunikasi menunjukkan adanya kesinambungan yang konsisten antara ekspektasi pesan dengan respon kognitif audiens sasaran. Secara metodologis setiap indikator konstruk diuji melalui parameter reliabilitas komposit yang memenuhi batas keterandalan statistik secara optimal. Analisis mendalam mengenai dinamika komunikasi menunjukkan adanya kesinambungan yang konsisten antara ekspektasi pesan dengan respon kognitif audiens sasaran. Secara metodologis setiap indikator konstruk diuji melalui parameter reliabilitas komposit yang memenuhi batas keterandalan statistik secara optimal. Analisis mendalam mengenai dinamika komunikasi menunjukkan adanya kesinambungan yang konsisten antara ekspektasi pesan dengan respon kognitif audiens sasaran. Secara metodologis setiap indikator konstruk diuji melalui parameter reliabilitas komposit yang memenuhi batas keterandalan statistik secara optimal. Analisis mendalam mengenai dinamika komunikasi menunjukkan adanya kesinambungan yang konsisten antara ekspektasi pesan dengan respon kognitif audiens sasaran. Secara metodologis setiap indikator konstruk diuji melalui parameter reliabilitas komposit yang memenuhi batas keterandalan statistik secara optimal. Analisis mendalam mengenai dinamika komunikasi menunjukkan adanya kesinambungan yang konsisten antara ekspektasi pesan dengan respon kognitif audiens sasaran. Secara metodologis setiap indikator konstruk diuji melalui parameter reliabilitas komposit yang memenuhi batas keterandalan statistik secara optimal. Analisis mendalam mengenai dinamika komunikasi menunjukkan adanya kesinambungan yang konsisten antara ekspektasi pesan dengan respon kognitif audiens sasaran. Secara metodologis setiap indikator konstruk diuji melalui parameter reliabilitas komposit yang memenuhi batas keterandalan statistik secara optimal. Analisis mendalam mengenai dinamika komunikasi menunjukkan adanya kesinambungan yang konsisten antara ekspektasi pesan dengan respon kognitif audiens sasaran. Secara metodologis setiap indikator konstruk diuji melalui parameter reliabilitas komposit yang memenuhi batas keterandalan statistik secara optimal. Analisis mendalam mengenai dinamika komunikasi menunjukkan adanya kesinambungan yang konsisten antara ekspektasi pesan dengan respon kognitif audiens sasaran. Secara metodologis setiap indikator konstruk diuji melalui parameter reliabilitas komposit yang memenuhi batas keterandalan statistik secara optimal. Analisis mendalam mengenai dinamika komunikasi menunjukkan adanya kesinambungan yang konsisten antara ekspektasi pesan dengan respon kognitif audiens sasaran. Secara metodologis setiap indikator konstruk diuji melalui parameter reliabilitas komposit yang memenuhi batas keterandalan statistik secara optimal. Analisis mendalam mengenai dinamika komunikasi menunjukkan adanya kesinambungan yang konsisten antara ekspektasi pesan dengan respon kognitif audiens sasaran. Secara metodologis setiap indikator konstruk diuji melalui parameter reliabilitas komposit yang memenuhi batas keterandalan statistik secara optimal.</w:t>
       </w:r>
     </w:p>
     <w:p>
@@ -1065,7 +1065,7 @@
           <w:rFonts w:ascii="Times New Roman" w:hAnsi="Times New Roman"/>
           <w:sz w:val="24"/>
         </w:rPr>
-        <w:t>Analisis mendalam mengenai dinamika komunikasi menunjukkan adanya kesinambungan yang konsisten antara ekspektasi pesan dengan respon kognitif audiens sasaran. Secara metodologis setiap indikator konstruk diuji melalui parameter reliabilitas komposit yang memenuhi batas keterandalan statistik secara optimal. Analisis mendalam mengenai dinamika komunikasi menunjukkan adanya kesinambungan yang konsisten antara ekspektasi pesan dengan respon kognitif audiens sasaran. Secara metodologis setiap indikator konstruk diuji melalui parameter reliabilitas komposit yang memenuhi batas keterandalan statistik secara optimal. Analisis mendalam mengenai dinamika komunikasi menunjukkan adanya kesinambungan yang konsisten antara ekspektasi pesan dengan respon kognitif audiens sasaran. Secara metodologis setiap indikator konstruk diuji melalui parameter reliabilitas komposit yang memenuhi batas keterandalan statistik secara optimal. Analisis mendalam mengenai dinamika komunikasi menunjukkan adanya kesinambungan yang konsisten antara ekspektasi pesan dengan respon kognitif audiens sasaran. Secara metodologis setiap indikator konstruk diuji melalui parameter reliabilitas komposit yang memenuhi batas keterandalan statistik secara optimal. Analisis mendalam mengenai dinamika komunikasi menunjukkan adanya kesinambungan yang konsisten antara ekspektasi pesan dengan respon kognitif audiens sasaran. Secara metodologis setiap indikator konstruk diuji melalui parameter reliabilitas komposit yang memenuhi batas keterandalan statistik secara optimal. Analisis mendalam mengenai dinamika komunikasi menunjukkan adanya kesinambungan yang konsisten antara ekspektasi pesan dengan respon kognitif audiens sasaran. Secara metodologis setiap indikator konstruk diuji melalui parameter reliabilitas komposit yang memenuhi batas keterandalan statistik secara optimal. Analisis mendalam mengenai dinamika komunikasi menunjukkan adanya kesinambungan yang konsisten antara ekspektasi pesan dengan respon kognitif audiens sasaran. Secara metodologis setiap indikator konstruk diuji melalui parameter reliabilitas komposit yang memenuhi batas keterandalan statistik secara optimal. Analisis mendalam mengenai dinamika komunikasi menunjukkan adanya kesinambungan yang konsisten antara ekspektasi pesan dengan respon kognitif audiens sasaran. Secara metodologis setiap indikator konstruk diuji melalui parameter reliabilitas komposit yang memenuhi batas keterandalan statistik secara optimal. Analisis mendalam mengenai dinamika komunikasi menunjukkan adanya kesinambungan yang konsisten antara ekspektasi pesan dengan respon kognitif audiens sasaran. Secara metodologis setiap indikator konstruk diuji melalui parameter reliabilitas komposit yang memenuhi batas keterandalan statistik secara optimal. Analisis mendalam mengenai dinamika komunikasi menunjukkan adanya kesinambungan yang konsisten antara ekspektasi pesan dengan respon kognitif audiens sasaran. Secara metodologis setiap indikator konstruk diuji melalui parameter reliabilitas komposit yang memenuhi batas keterandalan statistik secara optimal. Analisis mendalam mengenai dinamika komunikasi menunjukkan adanya kesinambungan yang konsisten antara ekspektasi pesan dengan respon kognitif audiens sasaran. Secara metodologis setiap indikator konstruk diuji melalui parameter reliabilitas komposit yang memenuhi batas keterandalan statistik secara optimal. Analisis mendalam mengenai dinamika komunikasi menunjukkan adanya kesinambungan yang konsisten antara ekspektasi pesan dengan respon kognitif audiens sasaran. Secara metodologis setiap indikator konstruk diuji melalui parameter reliabilitas komposit yang memenuhi batas keterandalan statistik secara optimal. Analisis mendalam mengenai dinamika komunikasi menunjukkan adanya kesinambungan yang konsisten antara ekspektasi pesan dengan respon kognitif audiens sasaran. Secara metodologis setiap indikator konstruk diuji melalui parameter reliabilitas komposit yang memenuhi batas keterandalan statistik secara optimal. Analisis mendalam mengenai dinamika komunikasi menunjukkan adanya kesinambungan yang konsisten antara ekspektasi pesan dengan respon kognitif audiens sasaran. Secara metodologis setiap indikator konstruk diuji melalui parameter reliabilitas komposit yang memenuhi batas keterandalan statistik secara optimal. Analisis mendalam mengenai dinamika komunikasi menunjukkan adanya kesinambungan yang konsisten antara ekspektasi pesan dengan respon kognitif audiens sasaran. Secara metodologis setiap indikator konstruk diuji melalui parameter reliabilitas komposit yang memenuhi batas keterandalan statistik secara optimal.</w:t>
+        <w:t>Analisis mendalam mengenai dinamika komunikasi menunjukkan adanya kesinambungan yang konsisten antara ekspektasi pesan dengan respon kognitif audiens sasaran. Secara metodologis setiap indikator konstruk diuji melalui parameter reliabilitas komposit yang memenuhi batas keterandalan statistik secara optimal. Analisis mendalam mengenai dinamika komunikasi menunjukkan adanya kesinambungan yang konsisten antara ekspektasi pesan dengan respon kognitif audiens sasaran. Secara metodologis setiap indikator konstruk diuji melalui parameter reliabilitas komposit yang memenuhi batas keterandalan statistik secara optimal. Analisis mendalam mengenai dinamika komunikasi menunjukkan adanya kesinambungan yang konsisten antara ekspektasi pesan dengan respon kognitif audiens sasaran. Secara metodologis setiap indikator konstruk diuji melalui parameter reliabilitas komposit yang memenuhi batas keterandalan statistik secara optimal. Analisis mendalam mengenai dinamika komunikasi menunjukkan adanya kesinambungan yang konsisten antara ekspektasi pesan dengan respon kognitif audiens sasaran. Secara metodologis setiap indikator konstruk diuji melalui parameter reliabilitas komposit yang memenuhi batas keterandalan statistik secara optimal. Analisis mendalam mengenai dinamika komunikasi menunjukkan adanya kesinambungan yang konsisten antara ekspektasi pesan dengan respon kognitif audiens sasaran. Secara metodologis setiap indikator konstruk diuji melalui parameter reliabilitas komposit yang memenuhi batas keterandalan statistik secara optimal. Analisis mendalam mengenai dinamika komunikasi menunjukkan adanya kesinambungan yang konsisten antara ekspektasi pesan dengan respon kognitif audiens sasaran. Secara metodologis setiap indikator konstruk diuji melalui parameter reliabilitas komposit yang memenuhi batas keterandalan statistik secara optimal. Analisis mendalam mengenai dinamika komunikasi menunjukkan adanya kesinambungan yang konsisten antara ekspektasi pesan dengan respon kognitif audiens sasaran. Secara metodologis setiap indikator konstruk diuji melalui parameter reliabilitas komposit yang memenuhi batas keterandalan statistik secara optimal. Analisis mendalam mengenai dinamika komunikasi menunjukkan adanya kesinambungan yang konsisten antara ekspektasi pesan dengan respon kognitif audiens sasaran. Secara metodologis setiap indikator konstruk diuji melalui parameter reliabilitas komposit yang memenuhi batas keterandalan statistik secara optimal. Analisis mendalam mengenai dinamika komunikasi menunjukkan adanya kesinambungan yang konsisten antara ekspektasi pesan dengan respon kognitif audiens sasaran. Secara metodologis setiap indikator konstruk diuji melalui parameter reliabilitas komposit yang memenuhi batas keterandalan statistik secara optimal. Analisis mendalam mengenai dinamika komunikasi menunjukkan adanya kesinambungan yang konsisten antara ekspektasi pesan dengan respon kognitif audiens sasaran. Secara metodologis setiap indikator konstruk diuji melalui parameter reliabilitas komposit yang memenuhi batas keterandalan statistik secara optimal. Analisis mendalam mengenai dinamika komunikasi menunjukkan adanya kesinambungan yang konsisten antara ekspektasi pesan dengan respon kognitif audiens sasaran. Secara metodologis setiap indikator konstruk diuji melalui parameter reliabilitas komposit yang memenuhi batas keterandalan statistik secara optimal. Analisis mendalam mengenai dinamika komunikasi menunjukkan adanya kesinambungan yang konsisten antara ekspektasi pesan dengan respon kognitif audiens sasaran. Secara metodologis setiap indikator konstruk diuji melalui parameter reliabilitas komposit yang memenuhi batas keterandalan statistik secara optimal.</w:t>
       </w:r>
     </w:p>
     <w:p>
@@ -1078,7 +1078,7 @@
           <w:rFonts w:ascii="Times New Roman" w:hAnsi="Times New Roman"/>
           <w:sz w:val="24"/>
         </w:rPr>
-        <w:t>Analisis mendalam mengenai dinamika komunikasi menunjukkan adanya kesinambungan yang konsisten antara ekspektasi pesan dengan respon kognitif audiens sasaran. Secara metodologis setiap indikator konstruk diuji melalui parameter reliabilitas komposit yang memenuhi batas keterandalan statistik secara optimal. Analisis mendalam mengenai dinamika komunikasi menunjukkan adanya kesinambungan yang konsisten antara ekspektasi pesan dengan respon kognitif audiens sasaran. Secara metodologis setiap indikator konstruk diuji melalui parameter reliabilitas komposit yang memenuhi batas keterandalan statistik secara optimal. Analisis mendalam mengenai dinamika komunikasi menunjukkan adanya kesinambungan yang konsisten antara ekspektasi pesan dengan respon kognitif audiens sasaran. Secara metodologis setiap indikator konstruk diuji melalui parameter reliabilitas komposit yang memenuhi batas keterandalan statistik secara optimal. Analisis mendalam mengenai dinamika komunikasi menunjukkan adanya kesinambungan yang konsisten antara ekspektasi pesan dengan respon kognitif audiens sasaran. Secara metodologis setiap indikator konstruk diuji melalui parameter reliabilitas komposit yang memenuhi batas keterandalan statistik secara optimal. Analisis mendalam mengenai dinamika komunikasi menunjukkan adanya kesinambungan yang konsisten antara ekspektasi pesan dengan respon kognitif audiens sasaran. Secara metodologis setiap indikator konstruk diuji melalui parameter reliabilitas komposit yang memenuhi batas keterandalan statistik secara optimal. Analisis mendalam mengenai dinamika komunikasi menunjukkan adanya kesinambungan yang konsisten antara ekspektasi pesan dengan respon kognitif audiens sasaran. Secara metodologis setiap indikator konstruk diuji melalui parameter reliabilitas komposit yang memenuhi batas keterandalan statistik secara optimal. Analisis mendalam mengenai dinamika komunikasi menunjukkan adanya kesinambungan yang konsisten antara ekspektasi pesan dengan respon kognitif audiens sasaran. Secara metodologis setiap indikator konstruk diuji melalui parameter reliabilitas komposit yang memenuhi batas keterandalan statistik secara optimal. Analisis mendalam mengenai dinamika komunikasi menunjukkan adanya kesinambungan yang konsisten antara ekspektasi pesan dengan respon kognitif audiens sasaran. Secara metodologis setiap indikator konstruk diuji melalui parameter reliabilitas komposit yang memenuhi batas keterandalan statistik secara optimal. Analisis mendalam mengenai dinamika komunikasi menunjukkan adanya kesinambungan yang konsisten antara ekspektasi pesan dengan respon kognitif audiens sasaran. Secara metodologis setiap indikator konstruk diuji melalui parameter reliabilitas komposit yang memenuhi batas keterandalan statistik secara optimal. Analisis mendalam mengenai dinamika komunikasi menunjukkan adanya kesinambungan yang konsisten antara ekspektasi pesan dengan respon kognitif audiens sasaran. Secara metodologis setiap indikator konstruk diuji melalui parameter reliabilitas komposit yang memenuhi batas keterandalan statistik secara optimal. Analisis mendalam mengenai dinamika komunikasi menunjukkan adanya kesinambungan yang konsisten antara ekspektasi pesan dengan respon kognitif audiens sasaran. Secara metodologis setiap indikator konstruk diuji melalui parameter reliabilitas komposit yang memenuhi batas keterandalan statistik secara optimal. Analisis mendalam mengenai dinamika komunikasi menunjukkan adanya kesinambungan yang konsisten antara ekspektasi pesan dengan respon kognitif audiens sasaran. Secara metodologis setiap indikator konstruk diuji melalui parameter reliabilitas komposit yang memenuhi batas keterandalan statistik secara optimal. Analisis mendalam mengenai dinamika komunikasi menunjukkan adanya kesinambungan yang konsisten antara ekspektasi pesan dengan respon kognitif audiens sasaran. Secara metodologis setiap indikator konstruk diuji melalui parameter reliabilitas komposit yang memenuhi batas keterandalan statistik secara optimal. Analisis mendalam mengenai dinamika komunikasi menunjukkan adanya kesinambungan yang konsisten antara ekspektasi pesan dengan respon kognitif audiens sasaran. Secara metodologis setiap indikator konstruk diuji melalui parameter reliabilitas komposit yang memenuhi batas keterandalan statistik secara optimal. Analisis mendalam mengenai dinamika komunikasi menunjukkan adanya kesinambungan yang konsisten antara ekspektasi pesan dengan respon kognitif audiens sasaran. Secara metodologis setiap indikator konstruk diuji melalui parameter reliabilitas komposit yang memenuhi batas keterandalan statistik secara optimal.</w:t>
+        <w:t>Analisis mendalam mengenai dinamika komunikasi menunjukkan adanya kesinambungan yang konsisten antara ekspektasi pesan dengan respon kognitif audiens sasaran. Secara metodologis setiap indikator konstruk diuji melalui parameter reliabilitas komposit yang memenuhi batas keterandalan statistik secara optimal. Analisis mendalam mengenai dinamika komunikasi menunjukkan adanya kesinambungan yang konsisten antara ekspektasi pesan dengan respon kognitif audiens sasaran. Secara metodologis setiap indikator konstruk diuji melalui parameter reliabilitas komposit yang memenuhi batas keterandalan statistik secara optimal. Analisis mendalam mengenai dinamika komunikasi menunjukkan adanya kesinambungan yang konsisten antara ekspektasi pesan dengan respon kognitif audiens sasaran. Secara metodologis setiap indikator konstruk diuji melalui parameter reliabilitas komposit yang memenuhi batas keterandalan statistik secara optimal. Analisis mendalam mengenai dinamika komunikasi menunjukkan adanya kesinambungan yang konsisten antara ekspektasi pesan dengan respon kognitif audiens sasaran. Secara metodologis setiap indikator konstruk diuji melalui parameter reliabilitas komposit yang memenuhi batas keterandalan statistik secara optimal. Analisis mendalam mengenai dinamika komunikasi menunjukkan adanya kesinambungan yang konsisten antara ekspektasi pesan dengan respon kognitif audiens sasaran. Secara metodologis setiap indikator konstruk diuji melalui parameter reliabilitas komposit yang memenuhi batas keterandalan statistik secara optimal. Analisis mendalam mengenai dinamika komunikasi menunjukkan adanya kesinambungan yang konsisten antara ekspektasi pesan dengan respon kognitif audiens sasaran. Secara metodologis setiap indikator konstruk diuji melalui parameter reliabilitas komposit yang memenuhi batas keterandalan statistik secara optimal. Analisis mendalam mengenai dinamika komunikasi menunjukkan adanya kesinambungan yang konsisten antara ekspektasi pesan dengan respon kognitif audiens sasaran. Secara metodologis setiap indikator konstruk diuji melalui parameter reliabilitas komposit yang memenuhi batas keterandalan statistik secara optimal. Analisis mendalam mengenai dinamika komunikasi menunjukkan adanya kesinambungan yang konsisten antara ekspektasi pesan dengan respon kognitif audiens sasaran. Secara metodologis setiap indikator konstruk diuji melalui parameter reliabilitas komposit yang memenuhi batas keterandalan statistik secara optimal. Analisis mendalam mengenai dinamika komunikasi menunjukkan adanya kesinambungan yang konsisten antara ekspektasi pesan dengan respon kognitif audiens sasaran. Secara metodologis setiap indikator konstruk diuji melalui parameter reliabilitas komposit yang memenuhi batas keterandalan statistik secara optimal. Analisis mendalam mengenai dinamika komunikasi menunjukkan adanya kesinambungan yang konsisten antara ekspektasi pesan dengan respon kognitif audiens sasaran. Secara metodologis setiap indikator konstruk diuji melalui parameter reliabilitas komposit yang memenuhi batas keterandalan statistik secara optimal. Analisis mendalam mengenai dinamika komunikasi menunjukkan adanya kesinambungan yang konsisten antara ekspektasi pesan dengan respon kognitif audiens sasaran. Secara metodologis setiap indikator konstruk diuji melalui parameter reliabilitas komposit yang memenuhi batas keterandalan statistik secara optimal. Analisis mendalam mengenai dinamika komunikasi menunjukkan adanya kesinambungan yang konsisten antara ekspektasi pesan dengan respon kognitif audiens sasaran. Secara metodologis setiap indikator konstruk diuji melalui parameter reliabilitas komposit yang memenuhi batas keterandalan statistik secara optimal.</w:t>
       </w:r>
     </w:p>
     <w:p>
@@ -1091,7 +1091,7 @@
           <w:rFonts w:ascii="Times New Roman" w:hAnsi="Times New Roman"/>
           <w:sz w:val="24"/>
         </w:rPr>
-        <w:t>Analisis mendalam mengenai dinamika komunikasi menunjukkan adanya kesinambungan yang konsisten antara ekspektasi pesan dengan respon kognitif audiens sasaran. Secara metodologis setiap indikator konstruk diuji melalui parameter reliabilitas komposit yang memenuhi batas keterandalan statistik secara optimal. Analisis mendalam mengenai dinamika komunikasi menunjukkan adanya kesinambungan yang konsisten antara ekspektasi pesan dengan respon kognitif audiens sasaran. Secara metodologis setiap indikator konstruk diuji melalui parameter reliabilitas komposit yang memenuhi batas keterandalan statistik secara optimal. Analisis mendalam mengenai dinamika komunikasi menunjukkan adanya kesinambungan yang konsisten antara ekspektasi pesan dengan respon kognitif audiens sasaran. Secara metodologis setiap indikator konstruk diuji melalui parameter reliabilitas komposit yang memenuhi batas keterandalan statistik secara optimal. Analisis mendalam mengenai dinamika komunikasi menunjukkan adanya kesinambungan yang konsisten antara ekspektasi pesan dengan respon kognitif audiens sasaran. Secara metodologis setiap indikator konstruk diuji melalui parameter reliabilitas komposit yang memenuhi batas keterandalan statistik secara optimal. Analisis mendalam mengenai dinamika komunikasi menunjukkan adanya kesinambungan yang konsisten antara ekspektasi pesan dengan respon kognitif audiens sasaran. Secara metodologis setiap indikator konstruk diuji melalui parameter reliabilitas komposit yang memenuhi batas keterandalan statistik secara optimal. Analisis mendalam mengenai dinamika komunikasi menunjukkan adanya kesinambungan yang konsisten antara ekspektasi pesan dengan respon kognitif audiens sasaran. Secara metodologis setiap indikator konstruk diuji melalui parameter reliabilitas komposit yang memenuhi batas keterandalan statistik secara optimal. Analisis mendalam mengenai dinamika komunikasi menunjukkan adanya kesinambungan yang konsisten antara ekspektasi pesan dengan respon kognitif audiens sasaran. Secara metodologis setiap indikator konstruk diuji melalui parameter reliabilitas komposit yang memenuhi batas keterandalan statistik secara optimal. Analisis mendalam mengenai dinamika komunikasi menunjukkan adanya kesinambungan yang konsisten antara ekspektasi pesan dengan respon kognitif audiens sasaran. Secara metodologis setiap indikator konstruk diuji melalui parameter reliabilitas komposit yang memenuhi batas keterandalan statistik secara optimal. Analisis mendalam mengenai dinamika komunikasi menunjukkan adanya kesinambungan yang konsisten antara ekspektasi pesan dengan respon kognitif audiens sasaran. Secara metodologis setiap indikator konstruk diuji melalui parameter reliabilitas komposit yang memenuhi batas keterandalan statistik secara optimal. Analisis mendalam mengenai dinamika komunikasi menunjukkan adanya kesinambungan yang konsisten antara ekspektasi pesan dengan respon kognitif audiens sasaran. Secara metodologis setiap indikator konstruk diuji melalui parameter reliabilitas komposit yang memenuhi batas keterandalan statistik secara optimal. Analisis mendalam mengenai dinamika komunikasi menunjukkan adanya kesinambungan yang konsisten antara ekspektasi pesan dengan respon kognitif audiens sasaran. Secara metodologis setiap indikator konstruk diuji melalui parameter reliabilitas komposit yang memenuhi batas keterandalan statistik secara optimal. Analisis mendalam mengenai dinamika komunikasi menunjukkan adanya kesinambungan yang konsisten antara ekspektasi pesan dengan respon kognitif audiens sasaran. Secara metodologis setiap indikator konstruk diuji melalui parameter reliabilitas komposit yang memenuhi batas keterandalan statistik secara optimal. Analisis mendalam mengenai dinamika komunikasi menunjukkan adanya kesinambungan yang konsisten antara ekspektasi pesan dengan respon kognitif audiens sasaran. Secara metodologis setiap indikator konstruk diuji melalui parameter reliabilitas komposit yang memenuhi batas keterandalan statistik secara optimal. Analisis mendalam mengenai dinamika komunikasi menunjukkan adanya kesinambungan yang konsisten antara ekspektasi pesan dengan respon kognitif audiens sasaran. Secara metodologis setiap indikator konstruk diuji melalui parameter reliabilitas komposit yang memenuhi batas keterandalan statistik secara optimal. Analisis mendalam mengenai dinamika komunikasi menunjukkan adanya kesinambungan yang konsisten antara ekspektasi pesan dengan respon kognitif audiens sasaran. Secara metodologis setiap indikator konstruk diuji melalui parameter reliabilitas komposit yang memenuhi batas keterandalan statistik secara optimal.</w:t>
+        <w:t>Analisis mendalam mengenai dinamika komunikasi menunjukkan adanya kesinambungan yang konsisten antara ekspektasi pesan dengan respon kognitif audiens sasaran. Secara metodologis setiap indikator konstruk diuji melalui parameter reliabilitas komposit yang memenuhi batas keterandalan statistik secara optimal. Analisis mendalam mengenai dinamika komunikasi menunjukkan adanya kesinambungan yang konsisten antara ekspektasi pesan dengan respon kognitif audiens sasaran. Secara metodologis setiap indikator konstruk diuji melalui parameter reliabilitas komposit yang memenuhi batas keterandalan statistik secara optimal. Analisis mendalam mengenai dinamika komunikasi menunjukkan adanya kesinambungan yang konsisten antara ekspektasi pesan dengan respon kognitif audiens sasaran. Secara metodologis setiap indikator konstruk diuji melalui parameter reliabilitas komposit yang memenuhi batas keterandalan statistik secara optimal. Analisis mendalam mengenai dinamika komunikasi menunjukkan adanya kesinambungan yang konsisten antara ekspektasi pesan dengan respon kognitif audiens sasaran. Secara metodologis setiap indikator konstruk diuji melalui parameter reliabilitas komposit yang memenuhi batas keterandalan statistik secara optimal. Analisis mendalam mengenai dinamika komunikasi menunjukkan adanya kesinambungan yang konsisten antara ekspektasi pesan dengan respon kognitif audiens sasaran. Secara metodologis setiap indikator konstruk diuji melalui parameter reliabilitas komposit yang memenuhi batas keterandalan statistik secara optimal. Analisis mendalam mengenai dinamika komunikasi menunjukkan adanya kesinambungan yang konsisten antara ekspektasi pesan dengan respon kognitif audiens sasaran. Secara metodologis setiap indikator konstruk diuji melalui parameter reliabilitas komposit yang memenuhi batas keterandalan statistik secara optimal. Analisis mendalam mengenai dinamika komunikasi menunjukkan adanya kesinambungan yang konsisten antara ekspektasi pesan dengan respon kognitif audiens sasaran. Secara metodologis setiap indikator konstruk diuji melalui parameter reliabilitas komposit yang memenuhi batas keterandalan statistik secara optimal. Analisis mendalam mengenai dinamika komunikasi menunjukkan adanya kesinambungan yang konsisten antara ekspektasi pesan dengan respon kognitif audiens sasaran. Secara metodologis setiap indikator konstruk diuji melalui parameter reliabilitas komposit yang memenuhi batas keterandalan statistik secara optimal. Analisis mendalam mengenai dinamika komunikasi menunjukkan adanya kesinambungan yang konsisten antara ekspektasi pesan dengan respon kognitif audiens sasaran. Secara metodologis setiap indikator konstruk diuji melalui parameter reliabilitas komposit yang memenuhi batas keterandalan statistik secara optimal. Analisis mendalam mengenai dinamika komunikasi menunjukkan adanya kesinambungan yang konsisten antara ekspektasi pesan dengan respon kognitif audiens sasaran. Secara metodologis setiap indikator konstruk diuji melalui parameter reliabilitas komposit yang memenuhi batas keterandalan statistik secara optimal. Analisis mendalam mengenai dinamika komunikasi menunjukkan adanya kesinambungan yang konsisten antara ekspektasi pesan dengan respon kognitif audiens sasaran. Secara metodologis setiap indikator konstruk diuji melalui parameter reliabilitas komposit yang memenuhi batas keterandalan statistik secara optimal. Analisis mendalam mengenai dinamika komunikasi menunjukkan adanya kesinambungan yang konsisten antara ekspektasi pesan dengan respon kognitif audiens sasaran. Secara metodologis setiap indikator konstruk diuji melalui parameter reliabilitas komposit yang memenuhi batas keterandalan statistik secara optimal.</w:t>
       </w:r>
     </w:p>
     <w:p>
@@ -1104,7 +1104,7 @@
           <w:rFonts w:ascii="Times New Roman" w:hAnsi="Times New Roman"/>
           <w:sz w:val="24"/>
         </w:rPr>
-        <w:t>Analisis mendalam mengenai dinamika komunikasi menunjukkan adanya kesinambungan yang konsisten antara ekspektasi pesan dengan respon kognitif audiens sasaran. Secara metodologis setiap indikator konstruk diuji melalui parameter reliabilitas komposit yang memenuhi batas keterandalan statistik secara optimal. Analisis mendalam mengenai dinamika komunikasi menunjukkan adanya kesinambungan yang konsisten antara ekspektasi pesan dengan respon kognitif audiens sasaran. Secara metodologis setiap indikator konstruk diuji melalui parameter reliabilitas komposit yang memenuhi batas keterandalan statistik secara optimal. Analisis mendalam mengenai dinamika komunikasi menunjukkan adanya kesinambungan yang konsisten antara ekspektasi pesan dengan respon kognitif audiens sasaran. Secara metodologis setiap indikator konstruk diuji melalui parameter reliabilitas komposit yang memenuhi batas keterandalan statistik secara optimal. Analisis mendalam mengenai dinamika komunikasi menunjukkan adanya kesinambungan yang konsisten antara ekspektasi pesan dengan respon kognitif audiens sasaran. Secara metodologis setiap indikator konstruk diuji melalui parameter reliabilitas komposit yang memenuhi batas keterandalan statistik secara optimal. Analisis mendalam mengenai dinamika komunikasi menunjukkan adanya kesinambungan yang konsisten antara ekspektasi pesan dengan respon kognitif audiens sasaran. Secara metodologis setiap indikator konstruk diuji melalui parameter reliabilitas komposit yang memenuhi batas keterandalan statistik secara optimal. Analisis mendalam mengenai dinamika komunikasi menunjukkan adanya kesinambungan yang konsisten antara ekspektasi pesan dengan respon kognitif audiens sasaran. Secara metodologis setiap indikator konstruk diuji melalui parameter reliabilitas komposit yang memenuhi batas keterandalan statistik secara optimal. Analisis mendalam mengenai dinamika komunikasi menunjukkan adanya kesinambungan yang konsisten antara ekspektasi pesan dengan respon kognitif audiens sasaran. Secara metodologis setiap indikator konstruk diuji melalui parameter reliabilitas komposit yang memenuhi batas keterandalan statistik secara optimal. Analisis mendalam mengenai dinamika komunikasi menunjukkan adanya kesinambungan yang konsisten antara ekspektasi pesan dengan respon kognitif audiens sasaran. Secara metodologis setiap indikator konstruk diuji melalui parameter reliabilitas komposit yang memenuhi batas keterandalan statistik secara optimal. Analisis mendalam mengenai dinamika komunikasi menunjukkan adanya kesinambungan yang konsisten antara ekspektasi pesan dengan respon kognitif audiens sasaran. Secara metodologis setiap indikator konstruk diuji melalui parameter reliabilitas komposit yang memenuhi batas keterandalan statistik secara optimal. Analisis mendalam mengenai dinamika komunikasi menunjukkan adanya kesinambungan yang konsisten antara ekspektasi pesan dengan respon kognitif audiens sasaran. Secara metodologis setiap indikator konstruk diuji melalui parameter reliabilitas komposit yang memenuhi batas keterandalan statistik secara optimal. Analisis mendalam mengenai dinamika komunikasi menunjukkan adanya kesinambungan yang konsisten antara ekspektasi pesan dengan respon kognitif audiens sasaran. Secara metodologis setiap indikator konstruk diuji melalui parameter reliabilitas komposit yang memenuhi batas keterandalan statistik secara optimal. Analisis mendalam mengenai dinamika komunikasi menunjukkan adanya kesinambungan yang konsisten antara ekspektasi pesan dengan respon kognitif audiens sasaran. Secara metodologis setiap indikator konstruk diuji melalui parameter reliabilitas komposit yang memenuhi batas keterandalan statistik secara optimal. Analisis mendalam mengenai dinamika komunikasi menunjukkan adanya kesinambungan yang konsisten antara ekspektasi pesan dengan respon kognitif audiens sasaran. Secara metodologis setiap indikator konstruk diuji melalui parameter reliabilitas komposit yang memenuhi batas keterandalan statistik secara optimal. Analisis mendalam mengenai dinamika komunikasi menunjukkan adanya kesinambungan yang konsisten antara ekspektasi pesan dengan respon kognitif audiens sasaran. Secara metodologis setiap indikator konstruk diuji melalui parameter reliabilitas komposit yang memenuhi batas keterandalan statistik secara optimal. Analisis mendalam mengenai dinamika komunikasi menunjukkan adanya kesinambungan yang konsisten antara ekspektasi pesan dengan respon kognitif audiens sasaran. Secara metodologis setiap indikator konstruk diuji melalui parameter reliabilitas komposit yang memenuhi batas keterandalan statistik secara optimal.</w:t>
+        <w:t>Analisis mendalam mengenai dinamika komunikasi menunjukkan adanya kesinambungan yang konsisten antara ekspektasi pesan dengan respon kognitif audiens sasaran. Secara metodologis setiap indikator konstruk diuji melalui parameter reliabilitas komposit yang memenuhi batas keterandalan statistik secara optimal. Analisis mendalam mengenai dinamika komunikasi menunjukkan adanya kesinambungan yang konsisten antara ekspektasi pesan dengan respon kognitif audiens sasaran. Secara metodologis setiap indikator konstruk diuji melalui parameter reliabilitas komposit yang memenuhi batas keterandalan statistik secara optimal. Analisis mendalam mengenai dinamika komunikasi menunjukkan adanya kesinambungan yang konsisten antara ekspektasi pesan dengan respon kognitif audiens sasaran. Secara metodologis setiap indikator konstruk diuji melalui parameter reliabilitas komposit yang memenuhi batas keterandalan statistik secara optimal. Analisis mendalam mengenai dinamika komunikasi menunjukkan adanya kesinambungan yang konsisten antara ekspektasi pesan dengan respon kognitif audiens sasaran. Secara metodologis setiap indikator konstruk diuji melalui parameter reliabilitas komposit yang memenuhi batas keterandalan statistik secara optimal. Analisis mendalam mengenai dinamika komunikasi menunjukkan adanya kesinambungan yang konsisten antara ekspektasi pesan dengan respon kognitif audiens sasaran. Secara metodologis setiap indikator konstruk diuji melalui parameter reliabilitas komposit yang memenuhi batas keterandalan statistik secara optimal. Analisis mendalam mengenai dinamika komunikasi menunjukkan adanya kesinambungan yang konsisten antara ekspektasi pesan dengan respon kognitif audiens sasaran. Secara metodologis setiap indikator konstruk diuji melalui parameter reliabilitas komposit yang memenuhi batas keterandalan statistik secara optimal. Analisis mendalam mengenai dinamika komunikasi menunjukkan adanya kesinambungan yang konsisten antara ekspektasi pesan dengan respon kognitif audiens sasaran. Secara metodologis setiap indikator konstruk diuji melalui parameter reliabilitas komposit yang memenuhi batas keterandalan statistik secara optimal. Analisis mendalam mengenai dinamika komunikasi menunjukkan adanya kesinambungan yang konsisten antara ekspektasi pesan dengan respon kognitif audiens sasaran. Secara metodologis setiap indikator konstruk diuji melalui parameter reliabilitas komposit yang memenuhi batas keterandalan statistik secara optimal. Analisis mendalam mengenai dinamika komunikasi menunjukkan adanya kesinambungan yang konsisten antara ekspektasi pesan dengan respon kognitif audiens sasaran. Secara metodologis setiap indikator konstruk diuji melalui parameter reliabilitas komposit yang memenuhi batas keterandalan statistik secara optimal. Analisis mendalam mengenai dinamika komunikasi menunjukkan adanya kesinambungan yang konsisten antara ekspektasi pesan dengan respon kognitif audiens sasaran. Secara metodologis setiap indikator konstruk diuji melalui parameter reliabilitas komposit yang memenuhi batas keterandalan statistik secara optimal. Analisis mendalam mengenai dinamika komunikasi menunjukkan adanya kesinambungan yang konsisten antara ekspektasi pesan dengan respon kognitif audiens sasaran. Secara metodologis setiap indikator konstruk diuji melalui parameter reliabilitas komposit yang memenuhi batas keterandalan statistik secara optimal. Analisis mendalam mengenai dinamika komunikasi menunjukkan adanya kesinambungan yang konsisten antara ekspektasi pesan dengan respon kognitif audiens sasaran. Secara metodologis setiap indikator konstruk diuji melalui parameter reliabilitas komposit yang memenuhi batas keterandalan statistik secara optimal.</w:t>
       </w:r>
     </w:p>
     <w:p>
@@ -1117,7 +1117,7 @@
           <w:rFonts w:ascii="Times New Roman" w:hAnsi="Times New Roman"/>
           <w:sz w:val="24"/>
         </w:rPr>
-        <w:t>Analisis mendalam mengenai dinamika komunikasi menunjukkan adanya kesinambungan yang konsisten antara ekspektasi pesan dengan respon kognitif audiens sasaran. Secara metodologis setiap indikator konstruk diuji melalui parameter reliabilitas komposit yang memenuhi batas keterandalan statistik secara optimal. Analisis mendalam mengenai dinamika komunikasi menunjukkan adanya kesinambungan yang konsisten antara ekspektasi pesan dengan respon kognitif audiens sasaran. Secara metodologis setiap indikator konstruk diuji melalui parameter reliabilitas komposit yang memenuhi batas keterandalan statistik secara optimal. Analisis mendalam mengenai dinamika komunikasi menunjukkan adanya kesinambungan yang konsisten antara ekspektasi pesan dengan respon kognitif audiens sasaran. Secara metodologis setiap indikator konstruk diuji melalui parameter reliabilitas komposit yang memenuhi batas keterandalan statistik secara optimal. Analisis mendalam mengenai dinamika komunikasi menunjukkan adanya kesinambungan yang konsisten antara ekspektasi pesan dengan respon kognitif audiens sasaran. Secara metodologis setiap indikator konstruk diuji melalui parameter reliabilitas komposit yang memenuhi batas keterandalan statistik secara optimal. Analisis mendalam mengenai dinamika komunikasi menunjukkan adanya kesinambungan yang konsisten antara ekspektasi pesan dengan respon kognitif audiens sasaran. Secara metodologis setiap indikator konstruk diuji melalui parameter reliabilitas komposit yang memenuhi batas keterandalan statistik secara optimal. Analisis mendalam mengenai dinamika komunikasi menunjukkan adanya kesinambungan yang konsisten antara ekspektasi pesan dengan respon kognitif audiens sasaran. Secara metodologis setiap indikator konstruk diuji melalui parameter reliabilitas komposit yang memenuhi batas keterandalan statistik secara optimal. Analisis mendalam mengenai dinamika komunikasi menunjukkan adanya kesinambungan yang konsisten antara ekspektasi pesan dengan respon kognitif audiens sasaran. Secara metodologis setiap indikator konstruk diuji melalui parameter reliabilitas komposit yang memenuhi batas keterandalan statistik secara optimal. Analisis mendalam mengenai dinamika komunikasi menunjukkan adanya kesinambungan yang konsisten antara ekspektasi pesan dengan respon kognitif audiens sasaran. Secara metodologis setiap indikator konstruk diuji melalui parameter reliabilitas komposit yang memenuhi batas keterandalan statistik secara optimal. Analisis mendalam mengenai dinamika komunikasi menunjukkan adanya kesinambungan yang konsisten antara ekspektasi pesan dengan respon kognitif audiens sasaran. Secara metodologis setiap indikator konstruk diuji melalui parameter reliabilitas komposit yang memenuhi batas keterandalan statistik secara optimal. Analisis mendalam mengenai dinamika komunikasi menunjukkan adanya kesinambungan yang konsisten antara ekspektasi pesan dengan respon kognitif audiens sasaran. Secara metodologis setiap indikator konstruk diuji melalui parameter reliabilitas komposit yang memenuhi batas keterandalan statistik secara optimal. Analisis mendalam mengenai dinamika komunikasi menunjukkan adanya kesinambungan yang konsisten antara ekspektasi pesan dengan respon kognitif audiens sasaran. Secara metodologis setiap indikator konstruk diuji melalui parameter reliabilitas komposit yang memenuhi batas keterandalan statistik secara optimal. Analisis mendalam mengenai dinamika komunikasi menunjukkan adanya kesinambungan yang konsisten antara ekspektasi pesan dengan respon kognitif audiens sasaran. Secara metodologis setiap indikator konstruk diuji melalui parameter reliabilitas komposit yang memenuhi batas keterandalan statistik secara optimal. Analisis mendalam mengenai dinamika komunikasi menunjukkan adanya kesinambungan yang konsisten antara ekspektasi pesan dengan respon kognitif audiens sasaran. Secara metodologis setiap indikator konstruk diuji melalui parameter reliabilitas komposit yang memenuhi batas keterandalan statistik secara optimal. Analisis mendalam mengenai dinamika komunikasi menunjukkan adanya kesinambungan yang konsisten antara ekspektasi pesan dengan respon kognitif audiens sasaran. Secara metodologis setiap indikator konstruk diuji melalui parameter reliabilitas komposit yang memenuhi batas keterandalan statistik secara optimal. Analisis mendalam mengenai dinamika komunikasi menunjukkan adanya kesinambungan yang konsisten antara ekspektasi pesan dengan respon kognitif audiens sasaran. Secara metodologis setiap indikator konstruk diuji melalui parameter reliabilitas komposit yang memenuhi batas keterandalan statistik secara optimal.</w:t>
+        <w:t>Analisis mendalam mengenai dinamika komunikasi menunjukkan adanya kesinambungan yang konsisten antara ekspektasi pesan dengan respon kognitif audiens sasaran. Secara metodologis setiap indikator konstruk diuji melalui parameter reliabilitas komposit yang memenuhi batas keterandalan statistik secara optimal. Analisis mendalam mengenai dinamika komunikasi menunjukkan adanya kesinambungan yang konsisten antara ekspektasi pesan dengan respon kognitif audiens sasaran. Secara metodologis setiap indikator konstruk diuji melalui parameter reliabilitas komposit yang memenuhi batas keterandalan statistik secara optimal. Analisis mendalam mengenai dinamika komunikasi menunjukkan adanya kesinambungan yang konsisten antara ekspektasi pesan dengan respon kognitif audiens sasaran. Secara metodologis setiap indikator konstruk diuji melalui parameter reliabilitas komposit yang memenuhi batas keterandalan statistik secara optimal. Analisis mendalam mengenai dinamika komunikasi menunjukkan adanya kesinambungan yang konsisten antara ekspektasi pesan dengan respon kognitif audiens sasaran. Secara metodologis setiap indikator konstruk diuji melalui parameter reliabilitas komposit yang memenuhi batas keterandalan statistik secara optimal. Analisis mendalam mengenai dinamika komunikasi menunjukkan adanya kesinambungan yang konsisten antara ekspektasi pesan dengan respon kognitif audiens sasaran. Secara metodologis setiap indikator konstruk diuji melalui parameter reliabilitas komposit yang memenuhi batas keterandalan statistik secara optimal. Analisis mendalam mengenai dinamika komunikasi menunjukkan adanya kesinambungan yang konsisten antara ekspektasi pesan dengan respon kognitif audiens sasaran. Secara metodologis setiap indikator konstruk diuji melalui parameter reliabilitas komposit yang memenuhi batas keterandalan statistik secara optimal. Analisis mendalam mengenai dinamika komunikasi menunjukkan adanya kesinambungan yang konsisten antara ekspektasi pesan dengan respon kognitif audiens sasaran. Secara metodologis setiap indikator konstruk diuji melalui parameter reliabilitas komposit yang memenuhi batas keterandalan statistik secara optimal. Analisis mendalam mengenai dinamika komunikasi menunjukkan adanya kesinambungan yang konsisten antara ekspektasi pesan dengan respon kognitif audiens sasaran. Secara metodologis setiap indikator konstruk diuji melalui parameter reliabilitas komposit yang memenuhi batas keterandalan statistik secara optimal. Analisis mendalam mengenai dinamika komunikasi menunjukkan adanya kesinambungan yang konsisten antara ekspektasi pesan dengan respon kognitif audiens sasaran. Secara metodologis setiap indikator konstruk diuji melalui parameter reliabilitas komposit yang memenuhi batas keterandalan statistik secara optimal. Analisis mendalam mengenai dinamika komunikasi menunjukkan adanya kesinambungan yang konsisten antara ekspektasi pesan dengan respon kognitif audiens sasaran. Secara metodologis setiap indikator konstruk diuji melalui parameter reliabilitas komposit yang memenuhi batas keterandalan statistik secara optimal. Analisis mendalam mengenai dinamika komunikasi menunjukkan adanya kesinambungan yang konsisten antara ekspektasi pesan dengan respon kognitif audiens sasaran. Secara metodologis setiap indikator konstruk diuji melalui parameter reliabilitas komposit yang memenuhi batas keterandalan statistik secara optimal. Analisis mendalam mengenai dinamika komunikasi menunjukkan adanya kesinambungan yang konsisten antara ekspektasi pesan dengan respon kognitif audiens sasaran. Secara metodologis setiap indikator konstruk diuji melalui parameter reliabilitas komposit yang memenuhi batas keterandalan statistik secara optimal.</w:t>
       </w:r>
     </w:p>
     <w:p>
@@ -1130,7 +1130,7 @@
           <w:rFonts w:ascii="Times New Roman" w:hAnsi="Times New Roman"/>
           <w:sz w:val="24"/>
         </w:rPr>
-        <w:t>Analisis mendalam mengenai dinamika komunikasi menunjukkan adanya kesinambungan yang konsisten antara ekspektasi pesan dengan respon kognitif audiens sasaran. Secara metodologis setiap indikator konstruk diuji melalui parameter reliabilitas komposit yang memenuhi batas keterandalan statistik secara optimal. Analisis mendalam mengenai dinamika komunikasi menunjukkan adanya kesinambungan yang konsisten antara ekspektasi pesan dengan respon kognitif audiens sasaran. Secara metodologis setiap indikator konstruk diuji melalui parameter reliabilitas komposit yang memenuhi batas keterandalan statistik secara optimal. Analisis mendalam mengenai dinamika komunikasi menunjukkan adanya kesinambungan yang konsisten antara ekspektasi pesan dengan respon kognitif audiens sasaran. Secara metodologis setiap indikator konstruk diuji melalui parameter reliabilitas komposit yang memenuhi batas keterandalan statistik secara optimal. Analisis mendalam mengenai dinamika komunikasi menunjukkan adanya kesinambungan yang konsisten antara ekspektasi pesan dengan respon kognitif audiens sasaran. Secara metodologis setiap indikator konstruk diuji melalui parameter reliabilitas komposit yang memenuhi batas keterandalan statistik secara optimal. Analisis mendalam mengenai dinamika komunikasi menunjukkan adanya kesinambungan yang konsisten antara ekspektasi pesan dengan respon kognitif audiens sasaran. Secara metodologis setiap indikator konstruk diuji melalui parameter reliabilitas komposit yang memenuhi batas keterandalan statistik secara optimal. Analisis mendalam mengenai dinamika komunikasi menunjukkan adanya kesinambungan yang konsisten antara ekspektasi pesan dengan respon kognitif audiens sasaran. Secara metodologis setiap indikator konstruk diuji melalui parameter reliabilitas komposit yang memenuhi batas keterandalan statistik secara optimal. Analisis mendalam mengenai dinamika komunikasi menunjukkan adanya kesinambungan yang konsisten antara ekspektasi pesan dengan respon kognitif audiens sasaran. Secara metodologis setiap indikator konstruk diuji melalui parameter reliabilitas komposit yang memenuhi batas keterandalan statistik secara optimal. Analisis mendalam mengenai dinamika komunikasi menunjukkan adanya kesinambungan yang konsisten antara ekspektasi pesan dengan respon kognitif audiens sasaran. Secara metodologis setiap indikator konstruk diuji melalui parameter reliabilitas komposit yang memenuhi batas keterandalan statistik secara optimal. Analisis mendalam mengenai dinamika komunikasi menunjukkan adanya kesinambungan yang konsisten antara ekspektasi pesan dengan respon kognitif audiens sasaran. Secara metodologis setiap indikator konstruk diuji melalui parameter reliabilitas komposit yang memenuhi batas keterandalan statistik secara optimal. Analisis mendalam mengenai dinamika komunikasi menunjukkan adanya kesinambungan yang konsisten antara ekspektasi pesan dengan respon kognitif audiens sasaran. Secara metodologis setiap indikator konstruk diuji melalui parameter reliabilitas komposit yang memenuhi batas keterandalan statistik secara optimal. Analisis mendalam mengenai dinamika komunikasi menunjukkan adanya kesinambungan yang konsisten antara ekspektasi pesan dengan respon kognitif audiens sasaran. Secara metodologis setiap indikator konstruk diuji melalui parameter reliabilitas komposit yang memenuhi batas keterandalan statistik secara optimal. Analisis mendalam mengenai dinamika komunikasi menunjukkan adanya kesinambungan yang konsisten antara ekspektasi pesan dengan respon kognitif audiens sasaran. Secara metodologis setiap indikator konstruk diuji melalui parameter reliabilitas komposit yang memenuhi batas keterandalan statistik secara optimal. Analisis mendalam mengenai dinamika komunikasi menunjukkan adanya kesinambungan yang konsisten antara ekspektasi pesan dengan respon kognitif audiens sasaran. Secara metodologis setiap indikator konstruk diuji melalui parameter reliabilitas komposit yang memenuhi batas keterandalan statistik secara optimal. Analisis mendalam mengenai dinamika komunikasi menunjukkan adanya kesinambungan yang konsisten antara ekspektasi pesan dengan respon kognitif audiens sasaran. Secara metodologis setiap indikator konstruk diuji melalui parameter reliabilitas komposit yang memenuhi batas keterandalan statistik secara optimal. Analisis mendalam mengenai dinamika komunikasi menunjukkan adanya kesinambungan yang konsisten antara ekspektasi pesan dengan respon kognitif audiens sasaran. Secara metodologis setiap indikator konstruk diuji melalui parameter reliabilitas komposit yang memenuhi batas keterandalan statistik secara optimal.</w:t>
+        <w:t>Analisis mendalam mengenai dinamika komunikasi menunjukkan adanya kesinambungan yang konsisten antara ekspektasi pesan dengan respon kognitif audiens sasaran. Secara metodologis setiap indikator konstruk diuji melalui parameter reliabilitas komposit yang memenuhi batas keterandalan statistik secara optimal. Analisis mendalam mengenai dinamika komunikasi menunjukkan adanya kesinambungan yang konsisten antara ekspektasi pesan dengan respon kognitif audiens sasaran. Secara metodologis setiap indikator konstruk diuji melalui parameter reliabilitas komposit yang memenuhi batas keterandalan statistik secara optimal. Analisis mendalam mengenai dinamika komunikasi menunjukkan adanya kesinambungan yang konsisten antara ekspektasi pesan dengan respon kognitif audiens sasaran. Secara metodologis setiap indikator konstruk diuji melalui parameter reliabilitas komposit yang memenuhi batas keterandalan statistik secara optimal. Analisis mendalam mengenai dinamika komunikasi menunjukkan adanya kesinambungan yang konsisten antara ekspektasi pesan dengan respon kognitif audiens sasaran. Secara metodologis setiap indikator konstruk diuji melalui parameter reliabilitas komposit yang memenuhi batas keterandalan statistik secara optimal. Analisis mendalam mengenai dinamika komunikasi menunjukkan adanya kesinambungan yang konsisten antara ekspektasi pesan dengan respon kognitif audiens sasaran. Secara metodologis setiap indikator konstruk diuji melalui parameter reliabilitas komposit yang memenuhi batas keterandalan statistik secara optimal. Analisis mendalam mengenai dinamika komunikasi menunjukkan adanya kesinambungan yang konsisten antara ekspektasi pesan dengan respon kognitif audiens sasaran. Secara metodologis setiap indikator konstruk diuji melalui parameter reliabilitas komposit yang memenuhi batas keterandalan statistik secara optimal. Analisis mendalam mengenai dinamika komunikasi menunjukkan adanya kesinambungan yang konsisten antara ekspektasi pesan dengan respon kognitif audiens sasaran. Secara metodologis setiap indikator konstruk diuji melalui parameter reliabilitas komposit yang memenuhi batas keterandalan statistik secara optimal. Analisis mendalam mengenai dinamika komunikasi menunjukkan adanya kesinambungan yang konsisten antara ekspektasi pesan dengan respon kognitif audiens sasaran. Secara metodologis setiap indikator konstruk diuji melalui parameter reliabilitas komposit yang memenuhi batas keterandalan statistik secara optimal. Analisis mendalam mengenai dinamika komunikasi menunjukkan adanya kesinambungan yang konsisten antara ekspektasi pesan dengan respon kognitif audiens sasaran. Secara metodologis setiap indikator konstruk diuji melalui parameter reliabilitas komposit yang memenuhi batas keterandalan statistik secara optimal. Analisis mendalam mengenai dinamika komunikasi menunjukkan adanya kesinambungan yang konsisten antara ekspektasi pesan dengan respon kognitif audiens sasaran. Secara metodologis setiap indikator konstruk diuji melalui parameter reliabilitas komposit yang memenuhi batas keterandalan statistik secara optimal. Analisis mendalam mengenai dinamika komunikasi menunjukkan adanya kesinambungan yang konsisten antara ekspektasi pesan dengan respon kognitif audiens sasaran. Secara metodologis setiap indikator konstruk diuji melalui parameter reliabilitas komposit yang memenuhi batas keterandalan statistik secara optimal. Analisis mendalam mengenai dinamika komunikasi menunjukkan adanya kesinambungan yang konsisten antara ekspektasi pesan dengan respon kognitif audiens sasaran. Secara metodologis setiap indikator konstruk diuji melalui parameter reliabilitas komposit yang memenuhi batas keterandalan statistik secara optimal.</w:t>
       </w:r>
     </w:p>
     <w:p>
@@ -1143,7 +1143,7 @@
           <w:rFonts w:ascii="Times New Roman" w:hAnsi="Times New Roman"/>
           <w:sz w:val="24"/>
         </w:rPr>
-        <w:t>Analisis mendalam mengenai dinamika komunikasi menunjukkan adanya kesinambungan yang konsisten antara ekspektasi pesan dengan respon kognitif audiens sasaran. Secara metodologis setiap indikator konstruk diuji melalui parameter reliabilitas komposit yang memenuhi batas keterandalan statistik secara optimal. Analisis mendalam mengenai dinamika komunikasi menunjukkan adanya kesinambungan yang konsisten antara ekspektasi pesan dengan respon kognitif audiens sasaran. Secara metodologis setiap indikator konstruk diuji melalui parameter reliabilitas komposit yang memenuhi batas keterandalan statistik secara optimal. Analisis mendalam mengenai dinamika komunikasi menunjukkan adanya kesinambungan yang konsisten antara ekspektasi pesan dengan respon kognitif audiens sasaran. Secara metodologis setiap indikator konstruk diuji melalui parameter reliabilitas komposit yang memenuhi batas keterandalan statistik secara optimal. Analisis mendalam mengenai dinamika komunikasi menunjukkan adanya kesinambungan yang konsisten antara ekspektasi pesan dengan respon kognitif audiens sasaran. Secara metodologis setiap indikator konstruk diuji melalui parameter reliabilitas komposit yang memenuhi batas keterandalan statistik secara optimal. Analisis mendalam mengenai dinamika komunikasi menunjukkan adanya kesinambungan yang konsisten antara ekspektasi pesan dengan respon kognitif audiens sasaran. Secara metodologis setiap indikator konstruk diuji melalui parameter reliabilitas komposit yang memenuhi batas keterandalan statistik secara optimal. Analisis mendalam mengenai dinamika komunikasi menunjukkan adanya kesinambungan yang konsisten antara ekspektasi pesan dengan respon kognitif audiens sasaran. Secara metodologis setiap indikator konstruk diuji melalui parameter reliabilitas komposit yang memenuhi batas keterandalan statistik secara optimal. Analisis mendalam mengenai dinamika komunikasi menunjukkan adanya kesinambungan yang konsisten antara ekspektasi pesan dengan respon kognitif audiens sasaran. Secara metodologis setiap indikator konstruk diuji melalui parameter reliabilitas komposit yang memenuhi batas keterandalan statistik secara optimal. Analisis mendalam mengenai dinamika komunikasi menunjukkan adanya kesinambungan yang konsisten antara ekspektasi pesan dengan respon kognitif audiens sasaran. Secara metodologis setiap indikator konstruk diuji melalui parameter reliabilitas komposit yang memenuhi batas keterandalan statistik secara optimal. Analisis mendalam mengenai dinamika komunikasi menunjukkan adanya kesinambungan yang konsisten antara ekspektasi pesan dengan respon kognitif audiens sasaran. Secara metodologis setiap indikator konstruk diuji melalui parameter reliabilitas komposit yang memenuhi batas keterandalan statistik secara optimal. Analisis mendalam mengenai dinamika komunikasi menunjukkan adanya kesinambungan yang konsisten antara ekspektasi pesan dengan respon kognitif audiens sasaran. Secara metodologis setiap indikator konstruk diuji melalui parameter reliabilitas komposit yang memenuhi batas keterandalan statistik secara optimal. Analisis mendalam mengenai dinamika komunikasi menunjukkan adanya kesinambungan yang konsisten antara ekspektasi pesan dengan respon kognitif audiens sasaran. Secara metodologis setiap indikator konstruk diuji melalui parameter reliabilitas komposit yang memenuhi batas keterandalan statistik secara optimal. Analisis mendalam mengenai dinamika komunikasi menunjukkan adanya kesinambungan yang konsisten antara ekspektasi pesan dengan respon kognitif audiens sasaran. Secara metodologis setiap indikator konstruk diuji melalui parameter reliabilitas komposit yang memenuhi batas keterandalan statistik secara optimal. Analisis mendalam mengenai dinamika komunikasi menunjukkan adanya kesinambungan yang konsisten antara ekspektasi pesan dengan respon kognitif audiens sasaran. Secara metodologis setiap indikator konstruk diuji melalui parameter reliabilitas komposit yang memenuhi batas keterandalan statistik secara optimal. Analisis mendalam mengenai dinamika komunikasi menunjukkan adanya kesinambungan yang konsisten antara ekspektasi pesan dengan respon kognitif audiens sasaran. Secara metodologis setiap indikator konstruk diuji melalui parameter reliabilitas komposit yang memenuhi batas keterandalan statistik secara optimal. Analisis mendalam mengenai dinamika komunikasi menunjukkan adanya kesinambungan yang konsisten antara ekspektasi pesan dengan respon kognitif audiens sasaran. Secara metodologis setiap indikator konstruk diuji melalui parameter reliabilitas komposit yang memenuhi batas keterandalan statistik secara optimal.</w:t>
+        <w:t>Analisis mendalam mengenai dinamika komunikasi menunjukkan adanya kesinambungan yang konsisten antara ekspektasi pesan dengan respon kognitif audiens sasaran. Secara metodologis setiap indikator konstruk diuji melalui parameter reliabilitas komposit yang memenuhi batas keterandalan statistik secara optimal. Analisis mendalam mengenai dinamika komunikasi menunjukkan adanya kesinambungan yang konsisten antara ekspektasi pesan dengan respon kognitif audiens sasaran. Secara metodologis setiap indikator konstruk diuji melalui parameter reliabilitas komposit yang memenuhi batas keterandalan statistik secara optimal. Analisis mendalam mengenai dinamika komunikasi menunjukkan adanya kesinambungan yang konsisten antara ekspektasi pesan dengan respon kognitif audiens sasaran. Secara metodologis setiap indikator konstruk diuji melalui parameter reliabilitas komposit yang memenuhi batas keterandalan statistik secara optimal. Analisis mendalam mengenai dinamika komunikasi menunjukkan adanya kesinambungan yang konsisten antara ekspektasi pesan dengan respon kognitif audiens sasaran. Secara metodologis setiap indikator konstruk diuji melalui parameter reliabilitas komposit yang memenuhi batas keterandalan statistik secara optimal. Analisis mendalam mengenai dinamika komunikasi menunjukkan adanya kesinambungan yang konsisten antara ekspektasi pesan dengan respon kognitif audiens sasaran. Secara metodologis setiap indikator konstruk diuji melalui parameter reliabilitas komposit yang memenuhi batas keterandalan statistik secara optimal. Analisis mendalam mengenai dinamika komunikasi menunjukkan adanya kesinambungan yang konsisten antara ekspektasi pesan dengan respon kognitif audiens sasaran. Secara metodologis setiap indikator konstruk diuji melalui parameter reliabilitas komposit yang memenuhi batas keterandalan statistik secara optimal. Analisis mendalam mengenai dinamika komunikasi menunjukkan adanya kesinambungan yang konsisten antara ekspektasi pesan dengan respon kognitif audiens sasaran. Secara metodologis setiap indikator konstruk diuji melalui parameter reliabilitas komposit yang memenuhi batas keterandalan statistik secara optimal. Analisis mendalam mengenai dinamika komunikasi menunjukkan adanya kesinambungan yang konsisten antara ekspektasi pesan dengan respon kognitif audiens sasaran. Secara metodologis setiap indikator konstruk diuji melalui parameter reliabilitas komposit yang memenuhi batas keterandalan statistik secara optimal. Analisis mendalam mengenai dinamika komunikasi menunjukkan adanya kesinambungan yang konsisten antara ekspektasi pesan dengan respon kognitif audiens sasaran. Secara metodologis setiap indikator konstruk diuji melalui parameter reliabilitas komposit yang memenuhi batas keterandalan statistik secara optimal. Analisis mendalam mengenai dinamika komunikasi menunjukkan adanya kesinambungan yang konsisten antara ekspektasi pesan dengan respon kognitif audiens sasaran. Secara metodologis setiap indikator konstruk diuji melalui parameter reliabilitas komposit yang memenuhi batas keterandalan statistik secara optimal. Analisis mendalam mengenai dinamika komunikasi menunjukkan adanya kesinambungan yang konsisten antara ekspektasi pesan dengan respon kognitif audiens sasaran. Secara metodologis setiap indikator konstruk diuji melalui parameter reliabilitas komposit yang memenuhi batas keterandalan statistik secara optimal. Analisis mendalam mengenai dinamika komunikasi menunjukkan adanya kesinambungan yang konsisten antara ekspektasi pesan dengan respon kognitif audiens sasaran. Secara metodologis setiap indikator konstruk diuji melalui parameter reliabilitas komposit yang memenuhi batas keterandalan statistik secara optimal.</w:t>
       </w:r>
     </w:p>
     <w:p>
@@ -1156,7 +1156,7 @@
           <w:rFonts w:ascii="Times New Roman" w:hAnsi="Times New Roman"/>
           <w:sz w:val="24"/>
         </w:rPr>
-        <w:t>Analisis mendalam mengenai dinamika komunikasi menunjukkan adanya kesinambungan yang konsisten antara ekspektasi pesan dengan respon kognitif audiens sasaran. Secara metodologis setiap indikator konstruk diuji melalui parameter reliabilitas komposit yang memenuhi batas keterandalan statistik secara optimal. Analisis mendalam mengenai dinamika komunikasi menunjukkan adanya kesinambungan yang konsisten antara ekspektasi pesan dengan respon kognitif audiens sasaran. Secara metodologis setiap indikator konstruk diuji melalui parameter reliabilitas komposit yang memenuhi batas keterandalan statistik secara optimal. Analisis mendalam mengenai dinamika komunikasi menunjukkan adanya kesinambungan yang konsisten antara ekspektasi pesan dengan respon kognitif audiens sasaran. Secara metodologis setiap indikator konstruk diuji melalui parameter reliabilitas komposit yang memenuhi batas keterandalan statistik secara optimal. Analisis mendalam mengenai dinamika komunikasi menunjukkan adanya kesinambungan yang konsisten antara ekspektasi pesan dengan respon kognitif audiens sasaran. Secara metodologis setiap indikator konstruk diuji melalui parameter reliabilitas komposit yang memenuhi batas keterandalan statistik secara optimal. Analisis mendalam mengenai dinamika komunikasi menunjukkan adanya kesinambungan yang konsisten antara ekspektasi pesan dengan respon kognitif audiens sasaran. Secara metodologis setiap indikator konstruk diuji melalui parameter reliabilitas komposit yang memenuhi batas keterandalan statistik secara optimal. Analisis mendalam mengenai dinamika komunikasi menunjukkan adanya kesinambungan yang konsisten antara ekspektasi pesan dengan respon kognitif audiens sasaran. Secara metodologis setiap indikator konstruk diuji melalui parameter reliabilitas komposit yang memenuhi batas keterandalan statistik secara optimal. Analisis mendalam mengenai dinamika komunikasi menunjukkan adanya kesinambungan yang konsisten antara ekspektasi pesan dengan respon kognitif audiens sasaran. Secara metodologis setiap indikator konstruk diuji melalui parameter reliabilitas komposit yang memenuhi batas keterandalan statistik secara optimal. Analisis mendalam mengenai dinamika komunikasi menunjukkan adanya kesinambungan yang konsisten antara ekspektasi pesan dengan respon kognitif audiens sasaran. Secara metodologis setiap indikator konstruk diuji melalui parameter reliabilitas komposit yang memenuhi batas keterandalan statistik secara optimal. Analisis mendalam mengenai dinamika komunikasi menunjukkan adanya kesinambungan yang konsisten antara ekspektasi pesan dengan respon kognitif audiens sasaran. Secara metodologis setiap indikator konstruk diuji melalui parameter reliabilitas komposit yang memenuhi batas keterandalan statistik secara optimal. Analisis mendalam mengenai dinamika komunikasi menunjukkan adanya kesinambungan yang konsisten antara ekspektasi pesan dengan respon kognitif audiens sasaran. Secara metodologis setiap indikator konstruk diuji melalui parameter reliabilitas komposit yang memenuhi batas keterandalan statistik secara optimal. Analisis mendalam mengenai dinamika komunikasi menunjukkan adanya kesinambungan yang konsisten antara ekspektasi pesan dengan respon kognitif audiens sasaran. Secara metodologis setiap indikator konstruk diuji melalui parameter reliabilitas komposit yang memenuhi batas keterandalan statistik secara optimal. Analisis mendalam mengenai dinamika komunikasi menunjukkan adanya kesinambungan yang konsisten antara ekspektasi pesan dengan respon kognitif audiens sasaran. Secara metodologis setiap indikator konstruk diuji melalui parameter reliabilitas komposit yang memenuhi batas keterandalan statistik secara optimal. Analisis mendalam mengenai dinamika komunikasi menunjukkan adanya kesinambungan yang konsisten antara ekspektasi pesan dengan respon kognitif audiens sasaran. Secara metodologis setiap indikator konstruk diuji melalui parameter reliabilitas komposit yang memenuhi batas keterandalan statistik secara optimal. Analisis mendalam mengenai dinamika komunikasi menunjukkan adanya kesinambungan yang konsisten antara ekspektasi pesan dengan respon kognitif audiens sasaran. Secara metodologis setiap indikator konstruk diuji melalui parameter reliabilitas komposit yang memenuhi batas keterandalan statistik secara optimal. Analisis mendalam mengenai dinamika komunikasi menunjukkan adanya kesinambungan yang konsisten antara ekspektasi pesan dengan respon kognitif audiens sasaran. Secara metodologis setiap indikator konstruk diuji melalui parameter reliabilitas komposit yang memenuhi batas keterandalan statistik secara optimal.</w:t>
+        <w:t>Analisis mendalam mengenai dinamika komunikasi menunjukkan adanya kesinambungan yang konsisten antara ekspektasi pesan dengan respon kognitif audiens sasaran. Secara metodologis setiap indikator konstruk diuji melalui parameter reliabilitas komposit yang memenuhi batas keterandalan statistik secara optimal. Analisis mendalam mengenai dinamika komunikasi menunjukkan adanya kesinambungan yang konsisten antara ekspektasi pesan dengan respon kognitif audiens sasaran. Secara metodologis setiap indikator konstruk diuji melalui parameter reliabilitas komposit yang memenuhi batas keterandalan statistik secara optimal. Analisis mendalam mengenai dinamika komunikasi menunjukkan adanya kesinambungan yang konsisten antara ekspektasi pesan dengan respon kognitif audiens sasaran. Secara metodologis setiap indikator konstruk diuji melalui parameter reliabilitas komposit yang memenuhi batas keterandalan statistik secara optimal. Analisis mendalam mengenai dinamika komunikasi menunjukkan adanya kesinambungan yang konsisten antara ekspektasi pesan dengan respon kognitif audiens sasaran. Secara metodologis setiap indikator konstruk diuji melalui parameter reliabilitas komposit yang memenuhi batas keterandalan statistik secara optimal. Analisis mendalam mengenai dinamika komunikasi menunjukkan adanya kesinambungan yang konsisten antara ekspektasi pesan dengan respon kognitif audiens sasaran. Secara metodologis setiap indikator konstruk diuji melalui parameter reliabilitas komposit yang memenuhi batas keterandalan statistik secara optimal. Analisis mendalam mengenai dinamika komunikasi menunjukkan adanya kesinambungan yang konsisten antara ekspektasi pesan dengan respon kognitif audiens sasaran. Secara metodologis setiap indikator konstruk diuji melalui parameter reliabilitas komposit yang memenuhi batas keterandalan statistik secara optimal. Analisis mendalam mengenai dinamika komunikasi menunjukkan adanya kesinambungan yang konsisten antara ekspektasi pesan dengan respon kognitif audiens sasaran. Secara metodologis setiap indikator konstruk diuji melalui parameter reliabilitas komposit yang memenuhi batas keterandalan statistik secara optimal. Analisis mendalam mengenai dinamika komunikasi menunjukkan adanya kesinambungan yang konsisten antara ekspektasi pesan dengan respon kognitif audiens sasaran. Secara metodologis setiap indikator konstruk diuji melalui parameter reliabilitas komposit yang memenuhi batas keterandalan statistik secara optimal. Analisis mendalam mengenai dinamika komunikasi menunjukkan adanya kesinambungan yang konsisten antara ekspektasi pesan dengan respon kognitif audiens sasaran. Secara metodologis setiap indikator konstruk diuji melalui parameter reliabilitas komposit yang memenuhi batas keterandalan statistik secara optimal. Analisis mendalam mengenai dinamika komunikasi menunjukkan adanya kesinambungan yang konsisten antara ekspektasi pesan dengan respon kognitif audiens sasaran. Secara metodologis setiap indikator konstruk diuji melalui parameter reliabilitas komposit yang memenuhi batas keterandalan statistik secara optimal. Analisis mendalam mengenai dinamika komunikasi menunjukkan adanya kesinambungan yang konsisten antara ekspektasi pesan dengan respon kognitif audiens sasaran. Secara metodologis setiap indikator konstruk diuji melalui parameter reliabilitas komposit yang memenuhi batas keterandalan statistik secara optimal. Analisis mendalam mengenai dinamika komunikasi menunjukkan adanya kesinambungan yang konsisten antara ekspektasi pesan dengan respon kognitif audiens sasaran. Secara metodologis setiap indikator konstruk diuji melalui parameter reliabilitas komposit yang memenuhi batas keterandalan statistik secara optimal.</w:t>
       </w:r>
     </w:p>
     <w:p>
@@ -1169,7 +1169,7 @@
           <w:rFonts w:ascii="Times New Roman" w:hAnsi="Times New Roman"/>
           <w:sz w:val="24"/>
         </w:rPr>
-        <w:t>Analisis mendalam mengenai dinamika komunikasi menunjukkan adanya kesinambungan yang konsisten antara ekspektasi pesan dengan respon kognitif audiens sasaran. Secara metodologis setiap indikator konstruk diuji melalui parameter reliabilitas komposit yang memenuhi batas keterandalan statistik secara optimal. Analisis mendalam mengenai dinamika komunikasi menunjukkan adanya kesinambungan yang konsisten antara ekspektasi pesan dengan respon kognitif audiens sasaran. Secara metodologis setiap indikator konstruk diuji melalui parameter reliabilitas komposit yang memenuhi batas keterandalan statistik secara optimal. Analisis mendalam mengenai dinamika komunikasi menunjukkan adanya kesinambungan yang konsisten antara ekspektasi pesan dengan respon kognitif audiens sasaran. Secara metodologis setiap indikator konstruk diuji melalui parameter reliabilitas komposit yang memenuhi batas keterandalan statistik secara optimal. Analisis mendalam mengenai dinamika komunikasi menunjukkan adanya kesinambungan yang konsisten antara ekspektasi pesan dengan respon kognitif audiens sasaran. Secara metodologis setiap indikator konstruk diuji melalui parameter reliabilitas komposit yang memenuhi batas keterandalan statistik secara optimal. Analisis mendalam mengenai dinamika komunikasi menunjukkan adanya kesinambungan yang konsisten antara ekspektasi pesan dengan respon kognitif audiens sasaran. Secara metodologis setiap indikator konstruk diuji melalui parameter reliabilitas komposit yang memenuhi batas keterandalan statistik secara optimal. Analisis mendalam mengenai dinamika komunikasi menunjukkan adanya kesinambungan yang konsisten antara ekspektasi pesan dengan respon kognitif audiens sasaran. Secara metodologis setiap indikator konstruk diuji melalui parameter reliabilitas komposit yang memenuhi batas keterandalan statistik secara optimal. Analisis mendalam mengenai dinamika komunikasi menunjukkan adanya kesinambungan yang konsisten antara ekspektasi pesan dengan respon kognitif audiens sasaran. Secara metodologis setiap indikator konstruk diuji melalui parameter reliabilitas komposit yang memenuhi batas keterandalan statistik secara optimal. Analisis mendalam mengenai dinamika komunikasi menunjukkan adanya kesinambungan yang konsisten antara ekspektasi pesan dengan respon kognitif audiens sasaran. Secara metodologis setiap indikator konstruk diuji melalui parameter reliabilitas komposit yang memenuhi batas keterandalan statistik secara optimal. Analisis mendalam mengenai dinamika komunikasi menunjukkan adanya kesinambungan yang konsisten antara ekspektasi pesan dengan respon kognitif audiens sasaran. Secara metodologis setiap indikator konstruk diuji melalui parameter reliabilitas komposit yang memenuhi batas keterandalan statistik secara optimal. Analisis mendalam mengenai dinamika komunikasi menunjukkan adanya kesinambungan yang konsisten antara ekspektasi pesan dengan respon kognitif audiens sasaran. Secara metodologis setiap indikator konstruk diuji melalui parameter reliabilitas komposit yang memenuhi batas keterandalan statistik secara optimal. Analisis mendalam mengenai dinamika komunikasi menunjukkan adanya kesinambungan yang konsisten antara ekspektasi pesan dengan respon kognitif audiens sasaran. Secara metodologis setiap indikator konstruk diuji melalui parameter reliabilitas komposit yang memenuhi batas keterandalan statistik secara optimal. Analisis mendalam mengenai dinamika komunikasi menunjukkan adanya kesinambungan yang konsisten antara ekspektasi pesan dengan respon kognitif audiens sasaran. Secara metodologis setiap indikator konstruk diuji melalui parameter reliabilitas komposit yang memenuhi batas keterandalan statistik secara optimal. Analisis mendalam mengenai dinamika komunikasi menunjukkan adanya kesinambungan yang konsisten antara ekspektasi pesan dengan respon kognitif audiens sasaran. Secara metodologis setiap indikator konstruk diuji melalui parameter reliabilitas komposit yang memenuhi batas keterandalan statistik secara optimal. Analisis mendalam mengenai dinamika komunikasi menunjukkan adanya kesinambungan yang konsisten antara ekspektasi pesan dengan respon kognitif audiens sasaran. Secara metodologis setiap indikator konstruk diuji melalui parameter reliabilitas komposit yang memenuhi batas keterandalan statistik secara optimal. Analisis mendalam mengenai dinamika komunikasi menunjukkan adanya kesinambungan yang konsisten antara ekspektasi pesan dengan respon kognitif audiens sasaran. Secara metodologis setiap indikator konstruk diuji melalui parameter reliabilitas komposit yang memenuhi batas keterandalan statistik secara optimal.</w:t>
+        <w:t>Analisis mendalam mengenai dinamika komunikasi menunjukkan adanya kesinambungan yang konsisten antara ekspektasi pesan dengan respon kognitif audiens sasaran. Secara metodologis setiap indikator konstruk diuji melalui parameter reliabilitas komposit yang memenuhi batas keterandalan statistik secara optimal. Analisis mendalam mengenai dinamika komunikasi menunjukkan adanya kesinambungan yang konsisten antara ekspektasi pesan dengan respon kognitif audiens sasaran. Secara metodologis setiap indikator konstruk diuji melalui parameter reliabilitas komposit yang memenuhi batas keterandalan statistik secara optimal. Analisis mendalam mengenai dinamika komunikasi menunjukkan adanya kesinambungan yang konsisten antara ekspektasi pesan dengan respon kognitif audiens sasaran. Secara metodologis setiap indikator konstruk diuji melalui parameter reliabilitas komposit yang memenuhi batas keterandalan statistik secara optimal. Analisis mendalam mengenai dinamika komunikasi menunjukkan adanya kesinambungan yang konsisten antara ekspektasi pesan dengan respon kognitif audiens sasaran. Secara metodologis setiap indikator konstruk diuji melalui parameter reliabilitas komposit yang memenuhi batas keterandalan statistik secara optimal. Analisis mendalam mengenai dinamika komunikasi menunjukkan adanya kesinambungan yang konsisten antara ekspektasi pesan dengan respon kognitif audiens sasaran. Secara metodologis setiap indikator konstruk diuji melalui parameter reliabilitas komposit yang memenuhi batas keterandalan statistik secara optimal. Analisis mendalam mengenai dinamika komunikasi menunjukkan adanya kesinambungan yang konsisten antara ekspektasi pesan dengan respon kognitif audiens sasaran. Secara metodologis setiap indikator konstruk diuji melalui parameter reliabilitas komposit yang memenuhi batas keterandalan statistik secara optimal. Analisis mendalam mengenai dinamika komunikasi menunjukkan adanya kesinambungan yang konsisten antara ekspektasi pesan dengan respon kognitif audiens sasaran. Secara metodologis setiap indikator konstruk diuji melalui parameter reliabilitas komposit yang memenuhi batas keterandalan statistik secara optimal. Analisis mendalam mengenai dinamika komunikasi menunjukkan adanya kesinambungan yang konsisten antara ekspektasi pesan dengan respon kognitif audiens sasaran. Secara metodologis setiap indikator konstruk diuji melalui parameter reliabilitas komposit yang memenuhi batas keterandalan statistik secara optimal. Analisis mendalam mengenai dinamika komunikasi menunjukkan adanya kesinambungan yang konsisten antara ekspektasi pesan dengan respon kognitif audiens sasaran. Secara metodologis setiap indikator konstruk diuji melalui parameter reliabilitas komposit yang memenuhi batas keterandalan statistik secara optimal. Analisis mendalam mengenai dinamika komunikasi menunjukkan adanya kesinambungan yang konsisten antara ekspektasi pesan dengan respon kognitif audiens sasaran. Secara metodologis setiap indikator konstruk diuji melalui parameter reliabilitas komposit yang memenuhi batas keterandalan statistik secara optimal. Analisis mendalam mengenai dinamika komunikasi menunjukkan adanya kesinambungan yang konsisten antara ekspektasi pesan dengan respon kognitif audiens sasaran. Secara metodologis setiap indikator konstruk diuji melalui parameter reliabilitas komposit yang memenuhi batas keterandalan statistik secara optimal. Analisis mendalam mengenai dinamika komunikasi menunjukkan adanya kesinambungan yang konsisten antara ekspektasi pesan dengan respon kognitif audiens sasaran. Secara metodologis setiap indikator konstruk diuji melalui parameter reliabilitas komposit yang memenuhi batas keterandalan statistik secara optimal.</w:t>
       </w:r>
     </w:p>
     <w:p>
@@ -1182,7 +1182,7 @@
           <w:rFonts w:ascii="Times New Roman" w:hAnsi="Times New Roman"/>
           <w:sz w:val="24"/>
         </w:rPr>
-        <w:t>Analisis mendalam mengenai dinamika komunikasi menunjukkan adanya kesinambungan yang konsisten antara ekspektasi pesan dengan respon kognitif audiens sasaran. Secara metodologis setiap indikator konstruk diuji melalui parameter reliabilitas komposit yang memenuhi batas keterandalan statistik secara optimal. Analisis mendalam mengenai dinamika komunikasi menunjukkan adanya kesinambungan yang konsisten antara ekspektasi pesan dengan respon kognitif audiens sasaran. Secara metodologis setiap indikator konstruk diuji melalui parameter reliabilitas komposit yang memenuhi batas keterandalan statistik secara optimal. Analisis mendalam mengenai dinamika komunikasi menunjukkan adanya kesinambungan yang konsisten antara ekspektasi pesan dengan respon kognitif audiens sasaran. Secara metodologis setiap indikator konstruk diuji melalui parameter reliabilitas komposit yang memenuhi batas keterandalan statistik secara optimal. Analisis mendalam mengenai dinamika komunikasi menunjukkan adanya kesinambungan yang konsisten antara ekspektasi pesan dengan respon kognitif audiens sasaran. Secara metodologis setiap indikator konstruk diuji melalui parameter reliabilitas komposit yang memenuhi batas keterandalan statistik secara optimal. Analisis mendalam mengenai dinamika komunikasi menunjukkan adanya kesinambungan yang konsisten antara ekspektasi pesan dengan respon kognitif audiens sasaran. Secara metodologis setiap indikator konstruk diuji melalui parameter reliabilitas komposit yang memenuhi batas keterandalan statistik secara optimal. Analisis mendalam mengenai dinamika komunikasi menunjukkan adanya kesinambungan yang konsisten antara ekspektasi pesan dengan respon kognitif audiens sasaran. Secara metodologis setiap indikator konstruk diuji melalui parameter reliabilitas komposit yang memenuhi batas keterandalan statistik secara optimal. Analisis mendalam mengenai dinamika komunikasi menunjukkan adanya kesinambungan yang konsisten antara ekspektasi pesan dengan respon kognitif audiens sasaran. Secara metodologis setiap indikator konstruk diuji melalui parameter reliabilitas komposit yang memenuhi batas keterandalan statistik secara optimal. Analisis mendalam mengenai dinamika komunikasi menunjukkan adanya kesinambungan yang konsisten antara ekspektasi pesan dengan respon kognitif audiens sasaran. Secara metodologis setiap indikator konstruk diuji melalui parameter reliabilitas komposit yang memenuhi batas keterandalan statistik secara optimal. Analisis mendalam mengenai dinamika komunikasi menunjukkan adanya kesinambungan yang konsisten antara ekspektasi pesan dengan respon kognitif audiens sasaran. Secara metodologis setiap indikator konstruk diuji melalui parameter reliabilitas komposit yang memenuhi batas keterandalan statistik secara optimal. Analisis mendalam mengenai dinamika komunikasi menunjukkan adanya kesinambungan yang konsisten antara ekspektasi pesan dengan respon kognitif audiens sasaran. Secara metodologis setiap indikator konstruk diuji melalui parameter reliabilitas komposit yang memenuhi batas keterandalan statistik secara optimal. Analisis mendalam mengenai dinamika komunikasi menunjukkan adanya kesinambungan yang konsisten antara ekspektasi pesan dengan respon kognitif audiens sasaran. Secara metodologis setiap indikator konstruk diuji melalui parameter reliabilitas komposit yang memenuhi batas keterandalan statistik secara optimal. Analisis mendalam mengenai dinamika komunikasi menunjukkan adanya kesinambungan yang konsisten antara ekspektasi pesan dengan respon kognitif audiens sasaran. Secara metodologis setiap indikator konstruk diuji melalui parameter reliabilitas komposit yang memenuhi batas keterandalan statistik secara optimal. Analisis mendalam mengenai dinamika komunikasi menunjukkan adanya kesinambungan yang konsisten antara ekspektasi pesan dengan respon kognitif audiens sasaran. Secara metodologis setiap indikator konstruk diuji melalui parameter reliabilitas komposit yang memenuhi batas keterandalan statistik secara optimal. Analisis mendalam mengenai dinamika komunikasi menunjukkan adanya kesinambungan yang konsisten antara ekspektasi pesan dengan respon kognitif audiens sasaran. Secara metodologis setiap indikator konstruk diuji melalui parameter reliabilitas komposit yang memenuhi batas keterandalan statistik secara optimal. Analisis mendalam mengenai dinamika komunikasi menunjukkan adanya kesinambungan yang konsisten antara ekspektasi pesan dengan respon kognitif audiens sasaran. Secara metodologis setiap indikator konstruk diuji melalui parameter reliabilitas komposit yang memenuhi batas keterandalan statistik secara optimal.</w:t>
+        <w:t>Analisis mendalam mengenai dinamika komunikasi menunjukkan adanya kesinambungan yang konsisten antara ekspektasi pesan dengan respon kognitif audiens sasaran. Secara metodologis setiap indikator konstruk diuji melalui parameter reliabilitas komposit yang memenuhi batas keterandalan statistik secara optimal. Analisis mendalam mengenai dinamika komunikasi menunjukkan adanya kesinambungan yang konsisten antara ekspektasi pesan dengan respon kognitif audiens sasaran. Secara metodologis setiap indikator konstruk diuji melalui parameter reliabilitas komposit yang memenuhi batas keterandalan statistik secara optimal. Analisis mendalam mengenai dinamika komunikasi menunjukkan adanya kesinambungan yang konsisten antara ekspektasi pesan dengan respon kognitif audiens sasaran. Secara metodologis setiap indikator konstruk diuji melalui parameter reliabilitas komposit yang memenuhi batas keterandalan statistik secara optimal. Analisis mendalam mengenai dinamika komunikasi menunjukkan adanya kesinambungan yang konsisten antara ekspektasi pesan dengan respon kognitif audiens sasaran. Secara metodologis setiap indikator konstruk diuji melalui parameter reliabilitas komposit yang memenuhi batas keterandalan statistik secara optimal. Analisis mendalam mengenai dinamika komunikasi menunjukkan adanya kesinambungan yang konsisten antara ekspektasi pesan dengan respon kognitif audiens sasaran. Secara metodologis setiap indikator konstruk diuji melalui parameter reliabilitas komposit yang memenuhi batas keterandalan statistik secara optimal. Analisis mendalam mengenai dinamika komunikasi menunjukkan adanya kesinambungan yang konsisten antara ekspektasi pesan dengan respon kognitif audiens sasaran. Secara metodologis setiap indikator konstruk diuji melalui parameter reliabilitas komposit yang memenuhi batas keterandalan statistik secara optimal. Analisis mendalam mengenai dinamika komunikasi menunjukkan adanya kesinambungan yang konsisten antara ekspektasi pesan dengan respon kognitif audiens sasaran. Secara metodologis setiap indikator konstruk diuji melalui parameter reliabilitas komposit yang memenuhi batas keterandalan statistik secara optimal. Analisis mendalam mengenai dinamika komunikasi menunjukkan adanya kesinambungan yang konsisten antara ekspektasi pesan dengan respon kognitif audiens sasaran. Secara metodologis setiap indikator konstruk diuji melalui parameter reliabilitas komposit yang memenuhi batas keterandalan statistik secara optimal. Analisis mendalam mengenai dinamika komunikasi menunjukkan adanya kesinambungan yang konsisten antara ekspektasi pesan dengan respon kognitif audiens sasaran. Secara metodologis setiap indikator konstruk diuji melalui parameter reliabilitas komposit yang memenuhi batas keterandalan statistik secara optimal. Analisis mendalam mengenai dinamika komunikasi menunjukkan adanya kesinambungan yang konsisten antara ekspektasi pesan dengan respon kognitif audiens sasaran. Secara metodologis setiap indikator konstruk diuji melalui parameter reliabilitas komposit yang memenuhi batas keterandalan statistik secara optimal. Analisis mendalam mengenai dinamika komunikasi menunjukkan adanya kesinambungan yang konsisten antara ekspektasi pesan dengan respon kognitif audiens sasaran. Secara metodologis setiap indikator konstruk diuji melalui parameter reliabilitas komposit yang memenuhi batas keterandalan statistik secara optimal. Analisis mendalam mengenai dinamika komunikasi menunjukkan adanya kesinambungan yang konsisten antara ekspektasi pesan dengan respon kognitif audiens sasaran. Secara metodologis setiap indikator konstruk diuji melalui parameter reliabilitas komposit yang memenuhi batas keterandalan statistik secara optimal.</w:t>
       </w:r>
     </w:p>
     <w:p>
@@ -1195,7 +1195,7 @@
           <w:rFonts w:ascii="Times New Roman" w:hAnsi="Times New Roman"/>
           <w:sz w:val="24"/>
         </w:rPr>
-        <w:t>Analisis mendalam mengenai dinamika komunikasi menunjukkan adanya kesinambungan yang konsisten antara ekspektasi pesan dengan respon kognitif audiens sasaran. Secara metodologis setiap indikator konstruk diuji melalui parameter reliabilitas komposit yang memenuhi batas keterandalan statistik secara optimal. Analisis mendalam mengenai dinamika komunikasi menunjukkan adanya kesinambungan yang konsisten antara ekspektasi pesan dengan respon kognitif audiens sasaran. Secara metodologis setiap indikator konstruk diuji melalui parameter reliabilitas komposit yang memenuhi batas keterandalan statistik secara optimal. Analisis mendalam mengenai dinamika komunikasi menunjukkan adanya kesinambungan yang konsisten antara ekspektasi pesan dengan respon kognitif audiens sasaran. Secara metodologis setiap indikator konstruk diuji melalui parameter reliabilitas komposit yang memenuhi batas keterandalan statistik secara optimal. Analisis mendalam mengenai dinamika komunikasi menunjukkan adanya kesinambungan yang konsisten antara ekspektasi pesan dengan respon kognitif audiens sasaran. Secara metodologis setiap indikator konstruk diuji melalui parameter reliabilitas komposit yang memenuhi batas keterandalan statistik secara optimal. Analisis mendalam mengenai dinamika komunikasi menunjukkan adanya kesinambungan yang konsisten antara ekspektasi pesan dengan respon kognitif audiens sasaran. Secara metodologis setiap indikator konstruk diuji melalui parameter reliabilitas komposit yang memenuhi batas keterandalan statistik secara optimal. Analisis mendalam mengenai dinamika komunikasi menunjukkan adanya kesinambungan yang konsisten antara ekspektasi pesan dengan respon kognitif audiens sasaran. Secara metodologis setiap indikator konstruk diuji melalui parameter reliabilitas komposit yang memenuhi batas keterandalan statistik secara optimal. Analisis mendalam mengenai dinamika komunikasi menunjukkan adanya kesinambungan yang konsisten antara ekspektasi pesan dengan respon kognitif audiens sasaran. Secara metodologis setiap indikator konstruk diuji melalui parameter reliabilitas komposit yang memenuhi batas keterandalan statistik secara optimal. Analisis mendalam mengenai dinamika komunikasi menunjukkan adanya kesinambungan yang konsisten antara ekspektasi pesan dengan respon kognitif audiens sasaran. Secara metodologis setiap indikator konstruk diuji melalui parameter reliabilitas komposit yang memenuhi batas keterandalan statistik secara optimal. Analisis mendalam mengenai dinamika komunikasi menunjukkan adanya kesinambungan yang konsisten antara ekspektasi pesan dengan respon kognitif audiens sasaran. Secara metodologis setiap indikator konstruk diuji melalui parameter reliabilitas komposit yang memenuhi batas keterandalan statistik secara optimal. Analisis mendalam mengenai dinamika komunikasi menunjukkan adanya kesinambungan yang konsisten antara ekspektasi pesan dengan respon kognitif audiens sasaran. Secara metodologis setiap indikator konstruk diuji melalui parameter reliabilitas komposit yang memenuhi batas keterandalan statistik secara optimal. Analisis mendalam mengenai dinamika komunikasi menunjukkan adanya kesinambungan yang konsisten antara ekspektasi pesan dengan respon kognitif audiens sasaran. Secara metodologis setiap indikator konstruk diuji melalui parameter reliabilitas komposit yang memenuhi batas keterandalan statistik secara optimal. Analisis mendalam mengenai dinamika komunikasi menunjukkan adanya kesinambungan yang konsisten antara ekspektasi pesan dengan respon kognitif audiens sasaran. Secara metodologis setiap indikator konstruk diuji melalui parameter reliabilitas komposit yang memenuhi batas keterandalan statistik secara optimal. Analisis mendalam mengenai dinamika komunikasi menunjukkan adanya kesinambungan yang konsisten antara ekspektasi pesan dengan respon kognitif audiens sasaran. Secara metodologis setiap indikator konstruk diuji melalui parameter reliabilitas komposit yang memenuhi batas keterandalan statistik secara optimal. Analisis mendalam mengenai dinamika komunikasi menunjukkan adanya kesinambungan yang konsisten antara ekspektasi pesan dengan respon kognitif audiens sasaran. Secara metodologis setiap indikator konstruk diuji melalui parameter reliabilitas komposit yang memenuhi batas keterandalan statistik secara optimal. Analisis mendalam mengenai dinamika komunikasi menunjukkan adanya kesinambungan yang konsisten antara ekspektasi pesan dengan respon kognitif audiens sasaran. Secara metodologis setiap indikator konstruk diuji melalui parameter reliabilitas komposit yang memenuhi batas keterandalan statistik secara optimal.</w:t>
+        <w:t>Analisis mendalam mengenai dinamika komunikasi menunjukkan adanya kesinambungan yang konsisten antara ekspektasi pesan dengan respon kognitif audiens sasaran. Secara metodologis setiap indikator konstruk diuji melalui parameter reliabilitas komposit yang memenuhi batas keterandalan statistik secara optimal. Analisis mendalam mengenai dinamika komunikasi menunjukkan adanya kesinambungan yang konsisten antara ekspektasi pesan dengan respon kognitif audiens sasaran. Secara metodologis setiap indikator konstruk diuji melalui parameter reliabilitas komposit yang memenuhi batas keterandalan statistik secara optimal. Analisis mendalam mengenai dinamika komunikasi menunjukkan adanya kesinambungan yang konsisten antara ekspektasi pesan dengan respon kognitif audiens sasaran. Secara metodologis setiap indikator konstruk diuji melalui parameter reliabilitas komposit yang memenuhi batas keterandalan statistik secara optimal. Analisis mendalam mengenai dinamika komunikasi menunjukkan adanya kesinambungan yang konsisten antara ekspektasi pesan dengan respon kognitif audiens sasaran. Secara metodologis setiap indikator konstruk diuji melalui parameter reliabilitas komposit yang memenuhi batas keterandalan statistik secara optimal. Analisis mendalam mengenai dinamika komunikasi menunjukkan adanya kesinambungan yang konsisten antara ekspektasi pesan dengan respon kognitif audiens sasaran. Secara metodologis setiap indikator konstruk diuji melalui parameter reliabilitas komposit yang memenuhi batas keterandalan statistik secara optimal. Analisis mendalam mengenai dinamika komunikasi menunjukkan adanya kesinambungan yang konsisten antara ekspektasi pesan dengan respon kognitif audiens sasaran. Secara metodologis setiap indikator konstruk diuji melalui parameter reliabilitas komposit yang memenuhi batas keterandalan statistik secara optimal. Analisis mendalam mengenai dinamika komunikasi menunjukkan adanya kesinambungan yang konsisten antara ekspektasi pesan dengan respon kognitif audiens sasaran. Secara metodologis setiap indikator konstruk diuji melalui parameter reliabilitas komposit yang memenuhi batas keterandalan statistik secara optimal. Analisis mendalam mengenai dinamika komunikasi menunjukkan adanya kesinambungan yang konsisten antara ekspektasi pesan dengan respon kognitif audiens sasaran. Secara metodologis setiap indikator konstruk diuji melalui parameter reliabilitas komposit yang memenuhi batas keterandalan statistik secara optimal. Analisis mendalam mengenai dinamika komunikasi menunjukkan adanya kesinambungan yang konsisten antara ekspektasi pesan dengan respon kognitif audiens sasaran. Secara metodologis setiap indikator konstruk diuji melalui parameter reliabilitas komposit yang memenuhi batas keterandalan statistik secara optimal. Analisis mendalam mengenai dinamika komunikasi menunjukkan adanya kesinambungan yang konsisten antara ekspektasi pesan dengan respon kognitif audiens sasaran. Secara metodologis setiap indikator konstruk diuji melalui parameter reliabilitas komposit yang memenuhi batas keterandalan statistik secara optimal. Analisis mendalam mengenai dinamika komunikasi menunjukkan adanya kesinambungan yang konsisten antara ekspektasi pesan dengan respon kognitif audiens sasaran. Secara metodologis setiap indikator konstruk diuji melalui parameter reliabilitas komposit yang memenuhi batas keterandalan statistik secara optimal. Analisis mendalam mengenai dinamika komunikasi menunjukkan adanya kesinambungan yang konsisten antara ekspektasi pesan dengan respon kognitif audiens sasaran. Secara metodologis setiap indikator konstruk diuji melalui parameter reliabilitas komposit yang memenuhi batas keterandalan statistik secara optimal.</w:t>
       </w:r>
     </w:p>
     <w:p>
@@ -1208,7 +1208,7 @@
           <w:rFonts w:ascii="Times New Roman" w:hAnsi="Times New Roman"/>
           <w:sz w:val="24"/>
         </w:rPr>
-        <w:t>Analisis mendalam mengenai dinamika komunikasi menunjukkan adanya kesinambungan yang konsisten antara ekspektasi pesan dengan respon kognitif audiens sasaran. Secara metodologis setiap indikator konstruk diuji melalui parameter reliabilitas komposit yang memenuhi batas keterandalan statistik secara optimal. Analisis mendalam mengenai dinamika komunikasi menunjukkan adanya kesinambungan yang konsisten antara ekspektasi pesan dengan respon kognitif audiens sasaran. Secara metodologis setiap indikator konstruk diuji melalui parameter reliabilitas komposit yang memenuhi batas keterandalan statistik secara optimal. Analisis mendalam mengenai dinamika komunikasi menunjukkan adanya kesinambungan yang konsisten antara ekspektasi pesan dengan respon kognitif audiens sasaran. Secara metodologis setiap indikator konstruk diuji melalui parameter reliabilitas komposit yang memenuhi batas keterandalan statistik secara optimal. Analisis mendalam mengenai dinamika komunikasi menunjukkan adanya kesinambungan yang konsisten antara ekspektasi pesan dengan respon kognitif audiens sasaran. Secara metodologis setiap indikator konstruk diuji melalui parameter reliabilitas komposit yang memenuhi batas keterandalan statistik secara optimal. Analisis mendalam mengenai dinamika komunikasi menunjukkan adanya kesinambungan yang konsisten antara ekspektasi pesan dengan respon kognitif audiens sasaran. Secara metodologis setiap indikator konstruk diuji melalui parameter reliabilitas komposit yang memenuhi batas keterandalan statistik secara optimal. Analisis mendalam mengenai dinamika komunikasi menunjukkan adanya kesinambungan yang konsisten antara ekspektasi pesan dengan respon kognitif audiens sasaran. Secara metodologis setiap indikator konstruk diuji melalui parameter reliabilitas komposit yang memenuhi batas keterandalan statistik secara optimal. Analisis mendalam mengenai dinamika komunikasi menunjukkan adanya kesinambungan yang konsisten antara ekspektasi pesan dengan respon kognitif audiens sasaran. Secara metodologis setiap indikator konstruk diuji melalui parameter reliabilitas komposit yang memenuhi batas keterandalan statistik secara optimal. Analisis mendalam mengenai dinamika komunikasi menunjukkan adanya kesinambungan yang konsisten antara ekspektasi pesan dengan respon kognitif audiens sasaran. Secara metodologis setiap indikator konstruk diuji melalui parameter reliabilitas komposit yang memenuhi batas keterandalan statistik secara optimal. Analisis mendalam mengenai dinamika komunikasi menunjukkan adanya kesinambungan yang konsisten antara ekspektasi pesan dengan respon kognitif audiens sasaran. Secara metodologis setiap indikator konstruk diuji melalui parameter reliabilitas komposit yang memenuhi batas keterandalan statistik secara optimal. Analisis mendalam mengenai dinamika komunikasi menunjukkan adanya kesinambungan yang konsisten antara ekspektasi pesan dengan respon kognitif audiens sasaran. Secara metodologis setiap indikator konstruk diuji melalui parameter reliabilitas komposit yang memenuhi batas keterandalan statistik secara optimal. Analisis mendalam mengenai dinamika komunikasi menunjukkan adanya kesinambungan yang konsisten antara ekspektasi pesan dengan respon kognitif audiens sasaran. Secara metodologis setiap indikator konstruk diuji melalui parameter reliabilitas komposit yang memenuhi batas keterandalan statistik secara optimal. Analisis mendalam mengenai dinamika komunikasi menunjukkan adanya kesinambungan yang konsisten antara ekspektasi pesan dengan respon kognitif audiens sasaran. Secara metodologis setiap indikator konstruk diuji melalui parameter reliabilitas komposit yang memenuhi batas keterandalan statistik secara optimal. Analisis mendalam mengenai dinamika komunikasi menunjukkan adanya kesinambungan yang konsisten antara ekspektasi pesan dengan respon kognitif audiens sasaran. Secara metodologis setiap indikator konstruk diuji melalui parameter reliabilitas komposit yang memenuhi batas keterandalan statistik secara optimal. Analisis mendalam mengenai dinamika komunikasi menunjukkan adanya kesinambungan yang konsisten antara ekspektasi pesan dengan respon kognitif audiens sasaran. Secara metodologis setiap indikator konstruk diuji melalui parameter reliabilitas komposit yang memenuhi batas keterandalan statistik secara optimal. Analisis mendalam mengenai dinamika komunikasi menunjukkan adanya kesinambungan yang konsisten antara ekspektasi pesan dengan respon kognitif audiens sasaran. Secara metodologis setiap indikator konstruk diuji melalui parameter reliabilitas komposit yang memenuhi batas keterandalan statistik secara optimal.</w:t>
+        <w:t>Analisis mendalam mengenai dinamika komunikasi menunjukkan adanya kesinambungan yang konsisten antara ekspektasi pesan dengan respon kognitif audiens sasaran. Secara metodologis setiap indikator konstruk diuji melalui parameter reliabilitas komposit yang memenuhi batas keterandalan statistik secara optimal. Analisis mendalam mengenai dinamika komunikasi menunjukkan adanya kesinambungan yang konsisten antara ekspektasi pesan dengan respon kognitif audiens sasaran. Secara metodologis setiap indikator konstruk diuji melalui parameter reliabilitas komposit yang memenuhi batas keterandalan statistik secara optimal. Analisis mendalam mengenai dinamika komunikasi menunjukkan adanya kesinambungan yang konsisten antara ekspektasi pesan dengan respon kognitif audiens sasaran. Secara metodologis setiap indikator konstruk diuji melalui parameter reliabilitas komposit yang memenuhi batas keterandalan statistik secara optimal. Analisis mendalam mengenai dinamika komunikasi menunjukkan adanya kesinambungan yang konsisten antara ekspektasi pesan dengan respon kognitif audiens sasaran. Secara metodologis setiap indikator konstruk diuji melalui parameter reliabilitas komposit yang memenuhi batas keterandalan statistik secara optimal. Analisis mendalam mengenai dinamika komunikasi menunjukkan adanya kesinambungan yang konsisten antara ekspektasi pesan dengan respon kognitif audiens sasaran. Secara metodologis setiap indikator konstruk diuji melalui parameter reliabilitas komposit yang memenuhi batas keterandalan statistik secara optimal. Analisis mendalam mengenai dinamika komunikasi menunjukkan adanya kesinambungan yang konsisten antara ekspektasi pesan dengan respon kognitif audiens sasaran. Secara metodologis setiap indikator konstruk diuji melalui parameter reliabilitas komposit yang memenuhi batas keterandalan statistik secara optimal. Analisis mendalam mengenai dinamika komunikasi menunjukkan adanya kesinambungan yang konsisten antara ekspektasi pesan dengan respon kognitif audiens sasaran. Secara metodologis setiap indikator konstruk diuji melalui parameter reliabilitas komposit yang memenuhi batas keterandalan statistik secara optimal. Analisis mendalam mengenai dinamika komunikasi menunjukkan adanya kesinambungan yang konsisten antara ekspektasi pesan dengan respon kognitif audiens sasaran. Secara metodologis setiap indikator konstruk diuji melalui parameter reliabilitas komposit yang memenuhi batas keterandalan statistik secara optimal. Analisis mendalam mengenai dinamika komunikasi menunjukkan adanya kesinambungan yang konsisten antara ekspektasi pesan dengan respon kognitif audiens sasaran. Secara metodologis setiap indikator konstruk diuji melalui parameter reliabilitas komposit yang memenuhi batas keterandalan statistik secara optimal. Analisis mendalam mengenai dinamika komunikasi menunjukkan adanya kesinambungan yang konsisten antara ekspektasi pesan dengan respon kognitif audiens sasaran. Secara metodologis setiap indikator konstruk diuji melalui parameter reliabilitas komposit yang memenuhi batas keterandalan statistik secara optimal. Analisis mendalam mengenai dinamika komunikasi menunjukkan adanya kesinambungan yang konsisten antara ekspektasi pesan dengan respon kognitif audiens sasaran. Secara metodologis setiap indikator konstruk diuji melalui parameter reliabilitas komposit yang memenuhi batas keterandalan statistik secara optimal. Analisis mendalam mengenai dinamika komunikasi menunjukkan adanya kesinambungan yang konsisten antara ekspektasi pesan dengan respon kognitif audiens sasaran. Secara metodologis setiap indikator konstruk diuji melalui parameter reliabilitas komposit yang memenuhi batas keterandalan statistik secara optimal.</w:t>
       </w:r>
     </w:p>
     <w:p>
@@ -1221,7 +1221,7 @@
           <w:rFonts w:ascii="Times New Roman" w:hAnsi="Times New Roman"/>
           <w:sz w:val="24"/>
         </w:rPr>
-        <w:t>Analisis mendalam mengenai dinamika komunikasi menunjukkan adanya kesinambungan yang konsisten antara ekspektasi pesan dengan respon kognitif audiens sasaran. Secara metodologis setiap indikator konstruk diuji melalui parameter reliabilitas komposit yang memenuhi batas keterandalan statistik secara optimal. Analisis mendalam mengenai dinamika komunikasi menunjukkan adanya kesinambungan yang konsisten antara ekspektasi pesan dengan respon kognitif audiens sasaran. Secara metodologis setiap indikator konstruk diuji melalui parameter reliabilitas komposit yang memenuhi batas keterandalan statistik secara optimal. Analisis mendalam mengenai dinamika komunikasi menunjukkan adanya kesinambungan yang konsisten antara ekspektasi pesan dengan respon kognitif audiens sasaran. Secara metodologis setiap indikator konstruk diuji melalui parameter reliabilitas komposit yang memenuhi batas keterandalan statistik secara optimal. Analisis mendalam mengenai dinamika komunikasi menunjukkan adanya kesinambungan yang konsisten antara ekspektasi pesan dengan respon kognitif audiens sasaran. Secara metodologis setiap indikator konstruk diuji melalui parameter reliabilitas komposit yang memenuhi batas keterandalan statistik secara optimal. Analisis mendalam mengenai dinamika komunikasi menunjukkan adanya kesinambungan yang konsisten antara ekspektasi pesan dengan respon kognitif audiens sasaran. Secara metodologis setiap indikator konstruk diuji melalui parameter reliabilitas komposit yang memenuhi batas keterandalan statistik secara optimal. Analisis mendalam mengenai dinamika komunikasi menunjukkan adanya kesinambungan yang konsisten antara ekspektasi pesan dengan respon kognitif audiens sasaran. Secara metodologis setiap indikator konstruk diuji melalui parameter reliabilitas komposit yang memenuhi batas keterandalan statistik secara optimal. Analisis mendalam mengenai dinamika komunikasi menunjukkan adanya kesinambungan yang konsisten antara ekspektasi pesan dengan respon kognitif audiens sasaran. Secara metodologis setiap indikator konstruk diuji melalui parameter reliabilitas komposit yang memenuhi batas keterandalan statistik secara optimal. Analisis mendalam mengenai dinamika komunikasi menunjukkan adanya kesinambungan yang konsisten antara ekspektasi pesan dengan respon kognitif audiens sasaran. Secara metodologis setiap indikator konstruk diuji melalui parameter reliabilitas komposit yang memenuhi batas keterandalan statistik secara optimal. Analisis mendalam mengenai dinamika komunikasi menunjukkan adanya kesinambungan yang konsisten antara ekspektasi pesan dengan respon kognitif audiens sasaran. Secara metodologis setiap indikator konstruk diuji melalui parameter reliabilitas komposit yang memenuhi batas keterandalan statistik secara optimal. Analisis mendalam mengenai dinamika komunikasi menunjukkan adanya kesinambungan yang konsisten antara ekspektasi pesan dengan respon kognitif audiens sasaran. Secara metodologis setiap indikator konstruk diuji melalui parameter reliabilitas komposit yang memenuhi batas keterandalan statistik secara optimal. Analisis mendalam mengenai dinamika komunikasi menunjukkan adanya kesinambungan yang konsisten antara ekspektasi pesan dengan respon kognitif audiens sasaran. Secara metodologis setiap indikator konstruk diuji melalui parameter reliabilitas komposit yang memenuhi batas keterandalan statistik secara optimal. Analisis mendalam mengenai dinamika komunikasi menunjukkan adanya kesinambungan yang konsisten antara ekspektasi pesan dengan respon kognitif audiens sasaran. Secara metodologis setiap indikator konstruk diuji melalui parameter reliabilitas komposit yang memenuhi batas keterandalan statistik secara optimal. Analisis mendalam mengenai dinamika komunikasi menunjukkan adanya kesinambungan yang konsisten antara ekspektasi pesan dengan respon kognitif audiens sasaran. Secara metodologis setiap indikator konstruk diuji melalui parameter reliabilitas komposit yang memenuhi batas keterandalan statistik secara optimal. Analisis mendalam mengenai dinamika komunikasi menunjukkan adanya kesinambungan yang konsisten antara ekspektasi pesan dengan respon kognitif audiens sasaran. Secara metodologis setiap indikator konstruk diuji melalui parameter reliabilitas komposit yang memenuhi batas keterandalan statistik secara optimal. Analisis mendalam mengenai dinamika komunikasi menunjukkan adanya kesinambungan yang konsisten antara ekspektasi pesan dengan respon kognitif audiens sasaran. Secara metodologis setiap indikator konstruk diuji melalui parameter reliabilitas komposit yang memenuhi batas keterandalan statistik secara optimal.</w:t>
+        <w:t>Analisis mendalam mengenai dinamika komunikasi menunjukkan adanya kesinambungan yang konsisten antara ekspektasi pesan dengan respon kognitif audiens sasaran. Secara metodologis setiap indikator konstruk diuji melalui parameter reliabilitas komposit yang memenuhi batas keterandalan statistik secara optimal. Analisis mendalam mengenai dinamika komunikasi menunjukkan adanya kesinambungan yang konsisten antara ekspektasi pesan dengan respon kognitif audiens sasaran. Secara metodologis setiap indikator konstruk diuji melalui parameter reliabilitas komposit yang memenuhi batas keterandalan statistik secara optimal. Analisis mendalam mengenai dinamika komunikasi menunjukkan adanya kesinambungan yang konsisten antara ekspektasi pesan dengan respon kognitif audiens sasaran. Secara metodologis setiap indikator konstruk diuji melalui parameter reliabilitas komposit yang memenuhi batas keterandalan statistik secara optimal. Analisis mendalam mengenai dinamika komunikasi menunjukkan adanya kesinambungan yang konsisten antara ekspektasi pesan dengan respon kognitif audiens sasaran. Secara metodologis setiap indikator konstruk diuji melalui parameter reliabilitas komposit yang memenuhi batas keterandalan statistik secara optimal. Analisis mendalam mengenai dinamika komunikasi menunjukkan adanya kesinambungan yang konsisten antara ekspektasi pesan dengan respon kognitif audiens sasaran. Secara metodologis setiap indikator konstruk diuji melalui parameter reliabilitas komposit yang memenuhi batas keterandalan statistik secara optimal. Analisis mendalam mengenai dinamika komunikasi menunjukkan adanya kesinambungan yang konsisten antara ekspektasi pesan dengan respon kognitif audiens sasaran. Secara metodologis setiap indikator konstruk diuji melalui parameter reliabilitas komposit yang memenuhi batas keterandalan statistik secara optimal. Analisis mendalam mengenai dinamika komunikasi menunjukkan adanya kesinambungan yang konsisten antara ekspektasi pesan dengan respon kognitif audiens sasaran. Secara metodologis setiap indikator konstruk diuji melalui parameter reliabilitas komposit yang memenuhi batas keterandalan statistik secara optimal. Analisis mendalam mengenai dinamika komunikasi menunjukkan adanya kesinambungan yang konsisten antara ekspektasi pesan dengan respon kognitif audiens sasaran. Secara metodologis setiap indikator konstruk diuji melalui parameter reliabilitas komposit yang memenuhi batas keterandalan statistik secara optimal. Analisis mendalam mengenai dinamika komunikasi menunjukkan adanya kesinambungan yang konsisten antara ekspektasi pesan dengan respon kognitif audiens sasaran. Secara metodologis setiap indikator konstruk diuji melalui parameter reliabilitas komposit yang memenuhi batas keterandalan statistik secara optimal. Analisis mendalam mengenai dinamika komunikasi menunjukkan adanya kesinambungan yang konsisten antara ekspektasi pesan dengan respon kognitif audiens sasaran. Secara metodologis setiap indikator konstruk diuji melalui parameter reliabilitas komposit yang memenuhi batas keterandalan statistik secara optimal. Analisis mendalam mengenai dinamika komunikasi menunjukkan adanya kesinambungan yang konsisten antara ekspektasi pesan dengan respon kognitif audiens sasaran. Secara metodologis setiap indikator konstruk diuji melalui parameter reliabilitas komposit yang memenuhi batas keterandalan statistik secara optimal. Analisis mendalam mengenai dinamika komunikasi menunjukkan adanya kesinambungan yang konsisten antara ekspektasi pesan dengan respon kognitif audiens sasaran. Secara metodologis setiap indikator konstruk diuji melalui parameter reliabilitas komposit yang memenuhi batas keterandalan statistik secara optimal.</w:t>
       </w:r>
     </w:p>
     <w:p>
@@ -1234,7 +1234,7 @@
           <w:rFonts w:ascii="Times New Roman" w:hAnsi="Times New Roman"/>
           <w:sz w:val="24"/>
         </w:rPr>
-        <w:t>Analisis mendalam mengenai dinamika komunikasi menunjukkan adanya kesinambungan yang konsisten antara ekspektasi pesan dengan respon kognitif audiens sasaran. Secara metodologis setiap indikator konstruk diuji melalui parameter reliabilitas komposit yang memenuhi batas keterandalan statistik secara optimal. Analisis mendalam mengenai dinamika komunikasi menunjukkan adanya kesinambungan yang konsisten antara ekspektasi pesan dengan respon kognitif audiens sasaran. Secara metodologis setiap indikator konstruk diuji melalui parameter reliabilitas komposit yang memenuhi batas keterandalan statistik secara optimal. Analisis mendalam mengenai dinamika komunikasi menunjukkan adanya kesinambungan yang konsisten antara ekspektasi pesan dengan respon kognitif audiens sasaran. Secara metodologis setiap indikator konstruk diuji melalui parameter reliabilitas komposit yang memenuhi batas keterandalan statistik secara optimal. Analisis mendalam mengenai dinamika komunikasi menunjukkan adanya kesinambungan yang konsisten antara ekspektasi pesan dengan respon kognitif audiens sasaran. Secara metodologis setiap indikator konstruk diuji melalui parameter reliabilitas komposit yang memenuhi batas keterandalan statistik secara optimal. Analisis mendalam mengenai dinamika komunikasi menunjukkan adanya kesinambungan yang konsisten antara ekspektasi pesan dengan respon kognitif audiens sasaran. Secara metodologis setiap indikator konstruk diuji melalui parameter reliabilitas komposit yang memenuhi batas keterandalan statistik secara optimal. Analisis mendalam mengenai dinamika komunikasi menunjukkan adanya kesinambungan yang konsisten antara ekspektasi pesan dengan respon kognitif audiens sasaran. Secara metodologis setiap indikator konstruk diuji melalui parameter reliabilitas komposit yang memenuhi batas keterandalan statistik secara optimal. Analisis mendalam mengenai dinamika komunikasi menunjukkan adanya kesinambungan yang konsisten antara ekspektasi pesan dengan respon kognitif audiens sasaran. Secara metodologis setiap indikator konstruk diuji melalui parameter reliabilitas komposit yang memenuhi batas keterandalan statistik secara optimal. Analisis mendalam mengenai dinamika komunikasi menunjukkan adanya kesinambungan yang konsisten antara ekspektasi pesan dengan respon kognitif audiens sasaran. Secara metodologis setiap indikator konstruk diuji melalui parameter reliabilitas komposit yang memenuhi batas keterandalan statistik secara optimal. Analisis mendalam mengenai dinamika komunikasi menunjukkan adanya kesinambungan yang konsisten antara ekspektasi pesan dengan respon kognitif audiens sasaran. Secara metodologis setiap indikator konstruk diuji melalui parameter reliabilitas komposit yang memenuhi batas keterandalan statistik secara optimal. Analisis mendalam mengenai dinamika komunikasi menunjukkan adanya kesinambungan yang konsisten antara ekspektasi pesan dengan respon kognitif audiens sasaran. Secara metodologis setiap indikator konstruk diuji melalui parameter reliabilitas komposit yang memenuhi batas keterandalan statistik secara optimal. Analisis mendalam mengenai dinamika komunikasi menunjukkan adanya kesinambungan yang konsisten antara ekspektasi pesan dengan respon kognitif audiens sasaran. Secara metodologis setiap indikator konstruk diuji melalui parameter reliabilitas komposit yang memenuhi batas keterandalan statistik secara optimal. Analisis mendalam mengenai dinamika komunikasi menunjukkan adanya kesinambungan yang konsisten antara ekspektasi pesan dengan respon kognitif audiens sasaran. Secara metodologis setiap indikator konstruk diuji melalui parameter reliabilitas komposit yang memenuhi batas keterandalan statistik secara optimal. Analisis mendalam mengenai dinamika komunikasi menunjukkan adanya kesinambungan yang konsisten antara ekspektasi pesan dengan respon kognitif audiens sasaran. Secara metodologis setiap indikator konstruk diuji melalui parameter reliabilitas komposit yang memenuhi batas keterandalan statistik secara optimal. Analisis mendalam mengenai dinamika komunikasi menunjukkan adanya kesinambungan yang konsisten antara ekspektasi pesan dengan respon kognitif audiens sasaran. Secara metodologis setiap indikator konstruk diuji melalui parameter reliabilitas komposit yang memenuhi batas keterandalan statistik secara optimal. Analisis mendalam mengenai dinamika komunikasi menunjukkan adanya kesinambungan yang konsisten antara ekspektasi pesan dengan respon kognitif audiens sasaran. Secara metodologis setiap indikator konstruk diuji melalui parameter reliabilitas komposit yang memenuhi batas keterandalan statistik secara optimal.</w:t>
+        <w:t>Analisis mendalam mengenai dinamika komunikasi menunjukkan adanya kesinambungan yang konsisten antara ekspektasi pesan dengan respon kognitif audiens sasaran. Secara metodologis setiap indikator konstruk diuji melalui parameter reliabilitas komposit yang memenuhi batas keterandalan statistik secara optimal. Analisis mendalam mengenai dinamika komunikasi menunjukkan adanya kesinambungan yang konsisten antara ekspektasi pesan dengan respon kognitif audiens sasaran. Secara metodologis setiap indikator konstruk diuji melalui parameter reliabilitas komposit yang memenuhi batas keterandalan statistik secara optimal. Analisis mendalam mengenai dinamika komunikasi menunjukkan adanya kesinambungan yang konsisten antara ekspektasi pesan dengan respon kognitif audiens sasaran. Secara metodologis setiap indikator konstruk diuji melalui parameter reliabilitas komposit yang memenuhi batas keterandalan statistik secara optimal. Analisis mendalam mengenai dinamika komunikasi menunjukkan adanya kesinambungan yang konsisten antara ekspektasi pesan dengan respon kognitif audiens sasaran. Secara metodologis setiap indikator konstruk diuji melalui parameter reliabilitas komposit yang memenuhi batas keterandalan statistik secara optimal. Analisis mendalam mengenai dinamika komunikasi menunjukkan adanya kesinambungan yang konsisten antara ekspektasi pesan dengan respon kognitif audiens sasaran. Secara metodologis setiap indikator konstruk diuji melalui parameter reliabilitas komposit yang memenuhi batas keterandalan statistik secara optimal. Analisis mendalam mengenai dinamika komunikasi menunjukkan adanya kesinambungan yang konsisten antara ekspektasi pesan dengan respon kognitif audiens sasaran. Secara metodologis setiap indikator konstruk diuji melalui parameter reliabilitas komposit yang memenuhi batas keterandalan statistik secara optimal. Analisis mendalam mengenai dinamika komunikasi menunjukkan adanya kesinambungan yang konsisten antara ekspektasi pesan dengan respon kognitif audiens sasaran. Secara metodologis setiap indikator konstruk diuji melalui parameter reliabilitas komposit yang memenuhi batas keterandalan statistik secara optimal. Analisis mendalam mengenai dinamika komunikasi menunjukkan adanya kesinambungan yang konsisten antara ekspektasi pesan dengan respon kognitif audiens sasaran. Secara metodologis setiap indikator konstruk diuji melalui parameter reliabilitas komposit yang memenuhi batas keterandalan statistik secara optimal. Analisis mendalam mengenai dinamika komunikasi menunjukkan adanya kesinambungan yang konsisten antara ekspektasi pesan dengan respon kognitif audiens sasaran. Secara metodologis setiap indikator konstruk diuji melalui parameter reliabilitas komposit yang memenuhi batas keterandalan statistik secara optimal. Analisis mendalam mengenai dinamika komunikasi menunjukkan adanya kesinambungan yang konsisten antara ekspektasi pesan dengan respon kognitif audiens sasaran. Secara metodologis setiap indikator konstruk diuji melalui parameter reliabilitas komposit yang memenuhi batas keterandalan statistik secara optimal. Analisis mendalam mengenai dinamika komunikasi menunjukkan adanya kesinambungan yang konsisten antara ekspektasi pesan dengan respon kognitif audiens sasaran. Secara metodologis setiap indikator konstruk diuji melalui parameter reliabilitas komposit yang memenuhi batas keterandalan statistik secara optimal. Analisis mendalam mengenai dinamika komunikasi menunjukkan adanya kesinambungan yang konsisten antara ekspektasi pesan dengan respon kognitif audiens sasaran. Secara metodologis setiap indikator konstruk diuji melalui parameter reliabilitas komposit yang memenuhi batas keterandalan statistik secara optimal.</w:t>
       </w:r>
     </w:p>
     <w:p>
@@ -1247,7 +1247,7 @@
           <w:rFonts w:ascii="Times New Roman" w:hAnsi="Times New Roman"/>
           <w:sz w:val="24"/>
         </w:rPr>
-        <w:t>Analisis mendalam mengenai dinamika komunikasi menunjukkan adanya kesinambungan yang konsisten antara ekspektasi pesan dengan respon kognitif audiens sasaran. Secara metodologis setiap indikator konstruk diuji melalui parameter reliabilitas komposit yang memenuhi batas keterandalan statistik secara optimal. Analisis mendalam mengenai dinamika komunikasi menunjukkan adanya kesinambungan yang konsisten antara ekspektasi pesan dengan respon kognitif audiens sasaran. Secara metodologis setiap indikator konstruk diuji melalui parameter reliabilitas komposit yang memenuhi batas keterandalan statistik secara optimal. Analisis mendalam mengenai dinamika komunikasi menunjukkan adanya kesinambungan yang konsisten antara ekspektasi pesan dengan respon kognitif audiens sasaran. Secara metodologis setiap indikator konstruk diuji melalui parameter reliabilitas komposit yang memenuhi batas keterandalan statistik secara optimal. Analisis mendalam mengenai dinamika komunikasi menunjukkan adanya kesinambungan yang konsisten antara ekspektasi pesan dengan respon kognitif audiens sasaran. Secara metodologis setiap indikator konstruk diuji melalui parameter reliabilitas komposit yang memenuhi batas keterandalan statistik secara optimal. Analisis mendalam mengenai dinamika komunikasi menunjukkan adanya kesinambungan yang konsisten antara ekspektasi pesan dengan respon kognitif audiens sasaran. Secara metodologis setiap indikator konstruk diuji melalui parameter reliabilitas komposit yang memenuhi batas keterandalan statistik secara optimal. Analisis mendalam mengenai dinamika komunikasi menunjukkan adanya kesinambungan yang konsisten antara ekspektasi pesan dengan respon kognitif audiens sasaran. Secara metodologis setiap indikator konstruk diuji melalui parameter reliabilitas komposit yang memenuhi batas keterandalan statistik secara optimal. Analisis mendalam mengenai dinamika komunikasi menunjukkan adanya kesinambungan yang konsisten antara ekspektasi pesan dengan respon kognitif audiens sasaran. Secara metodologis setiap indikator konstruk diuji melalui parameter reliabilitas komposit yang memenuhi batas keterandalan statistik secara optimal. Analisis mendalam mengenai dinamika komunikasi menunjukkan adanya kesinambungan yang konsisten antara ekspektasi pesan dengan respon kognitif audiens sasaran. Secara metodologis setiap indikator konstruk diuji melalui parameter reliabilitas komposit yang memenuhi batas keterandalan statistik secara optimal. Analisis mendalam mengenai dinamika komunikasi menunjukkan adanya kesinambungan yang konsisten antara ekspektasi pesan dengan respon kognitif audiens sasaran. Secara metodologis setiap indikator konstruk diuji melalui parameter reliabilitas komposit yang memenuhi batas keterandalan statistik secara optimal. Analisis mendalam mengenai dinamika komunikasi menunjukkan adanya kesinambungan yang konsisten antara ekspektasi pesan dengan respon kognitif audiens sasaran. Secara metodologis setiap indikator konstruk diuji melalui parameter reliabilitas komposit yang memenuhi batas keterandalan statistik secara optimal. Analisis mendalam mengenai dinamika komunikasi menunjukkan adanya kesinambungan yang konsisten antara ekspektasi pesan dengan respon kognitif audiens sasaran. Secara metodologis setiap indikator konstruk diuji melalui parameter reliabilitas komposit yang memenuhi batas keterandalan statistik secara optimal. Analisis mendalam mengenai dinamika komunikasi menunjukkan adanya kesinambungan yang konsisten antara ekspektasi pesan dengan respon kognitif audiens sasaran. Secara metodologis setiap indikator konstruk diuji melalui parameter reliabilitas komposit yang memenuhi batas keterandalan statistik secara optimal. Analisis mendalam mengenai dinamika komunikasi menunjukkan adanya kesinambungan yang konsisten antara ekspektasi pesan dengan respon kognitif audiens sasaran. Secara metodologis setiap indikator konstruk diuji melalui parameter reliabilitas komposit yang memenuhi batas keterandalan statistik secara optimal. Analisis mendalam mengenai dinamika komunikasi menunjukkan adanya kesinambungan yang konsisten antara ekspektasi pesan dengan respon kognitif audiens sasaran. Secara metodologis setiap indikator konstruk diuji melalui parameter reliabilitas komposit yang memenuhi batas keterandalan statistik secara optimal. Analisis mendalam mengenai dinamika komunikasi menunjukkan adanya kesinambungan yang konsisten antara ekspektasi pesan dengan respon kognitif audiens sasaran. Secara metodologis setiap indikator konstruk diuji melalui parameter reliabilitas komposit yang memenuhi batas keterandalan statistik secara optimal.</w:t>
+        <w:t>Analisis mendalam mengenai dinamika komunikasi menunjukkan adanya kesinambungan yang konsisten antara ekspektasi pesan dengan respon kognitif audiens sasaran. Secara metodologis setiap indikator konstruk diuji melalui parameter reliabilitas komposit yang memenuhi batas keterandalan statistik secara optimal. Analisis mendalam mengenai dinamika komunikasi menunjukkan adanya kesinambungan yang konsisten antara ekspektasi pesan dengan respon kognitif audiens sasaran. Secara metodologis setiap indikator konstruk diuji melalui parameter reliabilitas komposit yang memenuhi batas keterandalan statistik secara optimal. Analisis mendalam mengenai dinamika komunikasi menunjukkan adanya kesinambungan yang konsisten antara ekspektasi pesan dengan respon kognitif audiens sasaran. Secara metodologis setiap indikator konstruk diuji melalui parameter reliabilitas komposit yang memenuhi batas keterandalan statistik secara optimal. Analisis mendalam mengenai dinamika komunikasi menunjukkan adanya kesinambungan yang konsisten antara ekspektasi pesan dengan respon kognitif audiens sasaran. Secara metodologis setiap indikator konstruk diuji melalui parameter reliabilitas komposit yang memenuhi batas keterandalan statistik secara optimal. Analisis mendalam mengenai dinamika komunikasi menunjukkan adanya kesinambungan yang konsisten antara ekspektasi pesan dengan respon kognitif audiens sasaran. Secara metodologis setiap indikator konstruk diuji melalui parameter reliabilitas komposit yang memenuhi batas keterandalan statistik secara optimal. Analisis mendalam mengenai dinamika komunikasi menunjukkan adanya kesinambungan yang konsisten antara ekspektasi pesan dengan respon kognitif audiens sasaran. Secara metodologis setiap indikator konstruk diuji melalui parameter reliabilitas komposit yang memenuhi batas keterandalan statistik secara optimal. Analisis mendalam mengenai dinamika komunikasi menunjukkan adanya kesinambungan yang konsisten antara ekspektasi pesan dengan respon kognitif audiens sasaran. Secara metodologis setiap indikator konstruk diuji melalui parameter reliabilitas komposit yang memenuhi batas keterandalan statistik secara optimal. Analisis mendalam mengenai dinamika komunikasi menunjukkan adanya kesinambungan yang konsisten antara ekspektasi pesan dengan respon kognitif audiens sasaran. Secara metodologis setiap indikator konstruk diuji melalui parameter reliabilitas komposit yang memenuhi batas keterandalan statistik secara optimal. Analisis mendalam mengenai dinamika komunikasi menunjukkan adanya kesinambungan yang konsisten antara ekspektasi pesan dengan respon kognitif audiens sasaran. Secara metodologis setiap indikator konstruk diuji melalui parameter reliabilitas komposit yang memenuhi batas keterandalan statistik secara optimal. Analisis mendalam mengenai dinamika komunikasi menunjukkan adanya kesinambungan yang konsisten antara ekspektasi pesan dengan respon kognitif audiens sasaran. Secara metodologis setiap indikator konstruk diuji melalui parameter reliabilitas komposit yang memenuhi batas keterandalan statistik secara optimal. Analisis mendalam mengenai dinamika komunikasi menunjukkan adanya kesinambungan yang konsisten antara ekspektasi pesan dengan respon kognitif audiens sasaran. Secara metodologis setiap indikator konstruk diuji melalui parameter reliabilitas komposit yang memenuhi batas keterandalan statistik secara optimal. Analisis mendalam mengenai dinamika komunikasi menunjukkan adanya kesinambungan yang konsisten antara ekspektasi pesan dengan respon kognitif audiens sasaran. Secara metodologis setiap indikator konstruk diuji melalui parameter reliabilitas komposit yang memenuhi batas keterandalan statistik secara optimal.</w:t>
       </w:r>
     </w:p>
     <w:p>
@@ -1260,7 +1260,7 @@
           <w:rFonts w:ascii="Times New Roman" w:hAnsi="Times New Roman"/>
           <w:sz w:val="24"/>
         </w:rPr>
-        <w:t>Analisis mendalam mengenai dinamika komunikasi menunjukkan adanya kesinambungan yang konsisten antara ekspektasi pesan dengan respon kognitif audiens sasaran. Secara metodologis setiap indikator konstruk diuji melalui parameter reliabilitas komposit yang memenuhi batas keterandalan statistik secara optimal. Analisis mendalam mengenai dinamika komunikasi menunjukkan adanya kesinambungan yang konsisten antara ekspektasi pesan dengan respon kognitif audiens sasaran. Secara metodologis setiap indikator konstruk diuji melalui parameter reliabilitas komposit yang memenuhi batas keterandalan statistik secara optimal. Analisis mendalam mengenai dinamika komunikasi menunjukkan adanya kesinambungan yang konsisten antara ekspektasi pesan dengan respon kognitif audiens sasaran. Secara metodologis setiap indikator konstruk diuji melalui parameter reliabilitas komposit yang memenuhi batas keterandalan statistik secara optimal. Analisis mendalam mengenai dinamika komunikasi menunjukkan adanya kesinambungan yang konsisten antara ekspektasi pesan dengan respon kognitif audiens sasaran. Secara metodologis setiap indikator konstruk diuji melalui parameter reliabilitas komposit yang memenuhi batas keterandalan statistik secara optimal. Analisis mendalam mengenai dinamika komunikasi menunjukkan adanya kesinambungan yang konsisten antara ekspektasi pesan dengan respon kognitif audiens sasaran. Secara metodologis setiap indikator konstruk diuji melalui parameter reliabilitas komposit yang memenuhi batas keterandalan statistik secara optimal. Analisis mendalam mengenai dinamika komunikasi menunjukkan adanya kesinambungan yang konsisten antara ekspektasi pesan dengan respon kognitif audiens sasaran. Secara metodologis setiap indikator konstruk diuji melalui parameter reliabilitas komposit yang memenuhi batas keterandalan statistik secara optimal. Analisis mendalam mengenai dinamika komunikasi menunjukkan adanya kesinambungan yang konsisten antara ekspektasi pesan dengan respon kognitif audiens sasaran. Secara metodologis setiap indikator konstruk diuji melalui parameter reliabilitas komposit yang memenuhi batas keterandalan statistik secara optimal. Analisis mendalam mengenai dinamika komunikasi menunjukkan adanya kesinambungan yang konsisten antara ekspektasi pesan dengan respon kognitif audiens sasaran. Secara metodologis setiap indikator konstruk diuji melalui parameter reliabilitas komposit yang memenuhi batas keterandalan statistik secara optimal. Analisis mendalam mengenai dinamika komunikasi menunjukkan adanya kesinambungan yang konsisten antara ekspektasi pesan dengan respon kognitif audiens sasaran. Secara metodologis setiap indikator konstruk diuji melalui parameter reliabilitas komposit yang memenuhi batas keterandalan statistik secara optimal. Analisis mendalam mengenai dinamika komunikasi menunjukkan adanya kesinambungan yang konsisten antara ekspektasi pesan dengan respon kognitif audiens sasaran. Secara metodologis setiap indikator konstruk diuji melalui parameter reliabilitas komposit yang memenuhi batas keterandalan statistik secara optimal. Analisis mendalam mengenai dinamika komunikasi menunjukkan adanya kesinambungan yang konsisten antara ekspektasi pesan dengan respon kognitif audiens sasaran. Secara metodologis setiap indikator konstruk diuji melalui parameter reliabilitas komposit yang memenuhi batas keterandalan statistik secara optimal. Analisis mendalam mengenai dinamika komunikasi menunjukkan adanya kesinambungan yang konsisten antara ekspektasi pesan dengan respon kognitif audiens sasaran. Secara metodologis setiap indikator konstruk diuji melalui parameter reliabilitas komposit yang memenuhi batas keterandalan statistik secara optimal. Analisis mendalam mengenai dinamika komunikasi menunjukkan adanya kesinambungan yang konsisten antara ekspektasi pesan dengan respon kognitif audiens sasaran. Secara metodologis setiap indikator konstruk diuji melalui parameter reliabilitas komposit yang memenuhi batas keterandalan statistik secara optimal. Analisis mendalam mengenai dinamika komunikasi menunjukkan adanya kesinambungan yang konsisten antara ekspektasi pesan dengan respon kognitif audiens sasaran. Secara metodologis setiap indikator konstruk diuji melalui parameter reliabilitas komposit yang memenuhi batas keterandalan statistik secara optimal. Analisis mendalam mengenai dinamika komunikasi menunjukkan adanya kesinambungan yang konsisten antara ekspektasi pesan dengan respon kognitif audiens sasaran. Secara metodologis setiap indikator konstruk diuji melalui parameter reliabilitas komposit yang memenuhi batas keterandalan statistik secara optimal.</w:t>
+        <w:t>Analisis mendalam mengenai dinamika komunikasi menunjukkan adanya kesinambungan yang konsisten antara ekspektasi pesan dengan respon kognitif audiens sasaran. Secara metodologis setiap indikator konstruk diuji melalui parameter reliabilitas komposit yang memenuhi batas keterandalan statistik secara optimal. Analisis mendalam mengenai dinamika komunikasi menunjukkan adanya kesinambungan yang konsisten antara ekspektasi pesan dengan respon kognitif audiens sasaran. Secara metodologis setiap indikator konstruk diuji melalui parameter reliabilitas komposit yang memenuhi batas keterandalan statistik secara optimal. Analisis mendalam mengenai dinamika komunikasi menunjukkan adanya kesinambungan yang konsisten antara ekspektasi pesan dengan respon kognitif audiens sasaran. Secara metodologis setiap indikator konstruk diuji melalui parameter reliabilitas komposit yang memenuhi batas keterandalan statistik secara optimal. Analisis mendalam mengenai dinamika komunikasi menunjukkan adanya kesinambungan yang konsisten antara ekspektasi pesan dengan respon kognitif audiens sasaran. Secara metodologis setiap indikator konstruk diuji melalui parameter reliabilitas komposit yang memenuhi batas keterandalan statistik secara optimal. Analisis mendalam mengenai dinamika komunikasi menunjukkan adanya kesinambungan yang konsisten antara ekspektasi pesan dengan respon kognitif audiens sasaran. Secara metodologis setiap indikator konstruk diuji melalui parameter reliabilitas komposit yang memenuhi batas keterandalan statistik secara optimal. Analisis mendalam mengenai dinamika komunikasi menunjukkan adanya kesinambungan yang konsisten antara ekspektasi pesan dengan respon kognitif audiens sasaran. Secara metodologis setiap indikator konstruk diuji melalui parameter reliabilitas komposit yang memenuhi batas keterandalan statistik secara optimal. Analisis mendalam mengenai dinamika komunikasi menunjukkan adanya kesinambungan yang konsisten antara ekspektasi pesan dengan respon kognitif audiens sasaran. Secara metodologis setiap indikator konstruk diuji melalui parameter reliabilitas komposit yang memenuhi batas keterandalan statistik secara optimal. Analisis mendalam mengenai dinamika komunikasi menunjukkan adanya kesinambungan yang konsisten antara ekspektasi pesan dengan respon kognitif audiens sasaran. Secara metodologis setiap indikator konstruk diuji melalui parameter reliabilitas komposit yang memenuhi batas keterandalan statistik secara optimal. Analisis mendalam mengenai dinamika komunikasi menunjukkan adanya kesinambungan yang konsisten antara ekspektasi pesan dengan respon kognitif audiens sasaran. Secara metodologis setiap indikator konstruk diuji melalui parameter reliabilitas komposit yang memenuhi batas keterandalan statistik secara optimal. Analisis mendalam mengenai dinamika komunikasi menunjukkan adanya kesinambungan yang konsisten antara ekspektasi pesan dengan respon kognitif audiens sasaran. Secara metodologis setiap indikator konstruk diuji melalui parameter reliabilitas komposit yang memenuhi batas keterandalan statistik secara optimal. Analisis mendalam mengenai dinamika komunikasi menunjukkan adanya kesinambungan yang konsisten antara ekspektasi pesan dengan respon kognitif audiens sasaran. Secara metodologis setiap indikator konstruk diuji melalui parameter reliabilitas komposit yang memenuhi batas keterandalan statistik secara optimal. Analisis mendalam mengenai dinamika komunikasi menunjukkan adanya kesinambungan yang konsisten antara ekspektasi pesan dengan respon kognitif audiens sasaran. Secara metodologis setiap indikator konstruk diuji melalui parameter reliabilitas komposit yang memenuhi batas keterandalan statistik secara optimal.</w:t>
       </w:r>
     </w:p>
     <w:p>
@@ -1273,7 +1273,7 @@
           <w:rFonts w:ascii="Times New Roman" w:hAnsi="Times New Roman"/>
           <w:sz w:val="24"/>
         </w:rPr>
-        <w:t>Analisis mendalam mengenai dinamika komunikasi menunjukkan adanya kesinambungan yang konsisten antara ekspektasi pesan dengan respon kognitif audiens sasaran. Secara metodologis setiap indikator konstruk diuji melalui parameter reliabilitas komposit yang memenuhi batas keterandalan statistik secara optimal. Analisis mendalam mengenai dinamika komunikasi menunjukkan adanya kesinambungan yang konsisten antara ekspektasi pesan dengan respon kognitif audiens sasaran. Secara metodologis setiap indikator konstruk diuji melalui parameter reliabilitas komposit yang memenuhi batas keterandalan statistik secara optimal. Analisis mendalam mengenai dinamika komunikasi menunjukkan adanya kesinambungan yang konsisten antara ekspektasi pesan dengan respon kognitif audiens sasaran. Secara metodologis setiap indikator konstruk diuji melalui parameter reliabilitas komposit yang memenuhi batas keterandalan statistik secara optimal. Analisis mendalam mengenai dinamika komunikasi menunjukkan adanya kesinambungan yang konsisten antara ekspektasi pesan dengan respon kognitif audiens sasaran. Secara metodologis setiap indikator konstruk diuji melalui parameter reliabilitas komposit yang memenuhi batas keterandalan statistik secara optimal. Analisis mendalam mengenai dinamika komunikasi menunjukkan adanya kesinambungan yang konsisten antara ekspektasi pesan dengan respon kognitif audiens sasaran. Secara metodologis setiap indikator konstruk diuji melalui parameter reliabilitas komposit yang memenuhi batas keterandalan statistik secara optimal. Analisis mendalam mengenai dinamika komunikasi menunjukkan adanya kesinambungan yang konsisten antara ekspektasi pesan dengan respon kognitif audiens sasaran. Secara metodologis setiap indikator konstruk diuji melalui parameter reliabilitas komposit yang memenuhi batas keterandalan statistik secara optimal. Analisis mendalam mengenai dinamika komunikasi menunjukkan adanya kesinambungan yang konsisten antara ekspektasi pesan dengan respon kognitif audiens sasaran. Secara metodologis setiap indikator konstruk diuji melalui parameter reliabilitas komposit yang memenuhi batas keterandalan statistik secara optimal. Analisis mendalam mengenai dinamika komunikasi menunjukkan adanya kesinambungan yang konsisten antara ekspektasi pesan dengan respon kognitif audiens sasaran. Secara metodologis setiap indikator konstruk diuji melalui parameter reliabilitas komposit yang memenuhi batas keterandalan statistik secara optimal. Analisis mendalam mengenai dinamika komunikasi menunjukkan adanya kesinambungan yang konsisten antara ekspektasi pesan dengan respon kognitif audiens sasaran. Secara metodologis setiap indikator konstruk diuji melalui parameter reliabilitas komposit yang memenuhi batas keterandalan statistik secara optimal. Analisis mendalam mengenai dinamika komunikasi menunjukkan adanya kesinambungan yang konsisten antara ekspektasi pesan dengan respon kognitif audiens sasaran. Secara metodologis setiap indikator konstruk diuji melalui parameter reliabilitas komposit yang memenuhi batas keterandalan statistik secara optimal. Analisis mendalam mengenai dinamika komunikasi menunjukkan adanya kesinambungan yang konsisten antara ekspektasi pesan dengan respon kognitif audiens sasaran. Secara metodologis setiap indikator konstruk diuji melalui parameter reliabilitas komposit yang memenuhi batas keterandalan statistik secara optimal. Analisis mendalam mengenai dinamika komunikasi menunjukkan adanya kesinambungan yang konsisten antara ekspektasi pesan dengan respon kognitif audiens sasaran. Secara metodologis setiap indikator konstruk diuji melalui parameter reliabilitas komposit yang memenuhi batas keterandalan statistik secara optimal. Analisis mendalam mengenai dinamika komunikasi menunjukkan adanya kesinambungan yang konsisten antara ekspektasi pesan dengan respon kognitif audiens sasaran. Secara metodologis setiap indikator konstruk diuji melalui parameter reliabilitas komposit yang memenuhi batas keterandalan statistik secara optimal. Analisis mendalam mengenai dinamika komunikasi menunjukkan adanya kesinambungan yang konsisten antara ekspektasi pesan dengan respon kognitif audiens sasaran. Secara metodologis setiap indikator konstruk diuji melalui parameter reliabilitas komposit yang memenuhi batas keterandalan statistik secara optimal. Analisis mendalam mengenai dinamika komunikasi menunjukkan adanya kesinambungan yang konsisten antara ekspektasi pesan dengan respon kognitif audiens sasaran. Secara metodologis setiap indikator konstruk diuji melalui parameter reliabilitas komposit yang memenuhi batas keterandalan statistik secara optimal.</w:t>
+        <w:t>Analisis mendalam mengenai dinamika komunikasi menunjukkan adanya kesinambungan yang konsisten antara ekspektasi pesan dengan respon kognitif audiens sasaran. Secara metodologis setiap indikator konstruk diuji melalui parameter reliabilitas komposit yang memenuhi batas keterandalan statistik secara optimal. Analisis mendalam mengenai dinamika komunikasi menunjukkan adanya kesinambungan yang konsisten antara ekspektasi pesan dengan respon kognitif audiens sasaran. Secara metodologis setiap indikator konstruk diuji melalui parameter reliabilitas komposit yang memenuhi batas keterandalan statistik secara optimal. Analisis mendalam mengenai dinamika komunikasi menunjukkan adanya kesinambungan yang konsisten antara ekspektasi pesan dengan respon kognitif audiens sasaran. Secara metodologis setiap indikator konstruk diuji melalui parameter reliabilitas komposit yang memenuhi batas keterandalan statistik secara optimal. Analisis mendalam mengenai dinamika komunikasi menunjukkan adanya kesinambungan yang konsisten antara ekspektasi pesan dengan respon kognitif audiens sasaran. Secara metodologis setiap indikator konstruk diuji melalui parameter reliabilitas komposit yang memenuhi batas keterandalan statistik secara optimal. Analisis mendalam mengenai dinamika komunikasi menunjukkan adanya kesinambungan yang konsisten antara ekspektasi pesan dengan respon kognitif audiens sasaran. Secara metodologis setiap indikator konstruk diuji melalui parameter reliabilitas komposit yang memenuhi batas keterandalan statistik secara optimal. Analisis mendalam mengenai dinamika komunikasi menunjukkan adanya kesinambungan yang konsisten antara ekspektasi pesan dengan respon kognitif audiens sasaran. Secara metodologis setiap indikator konstruk diuji melalui parameter reliabilitas komposit yang memenuhi batas keterandalan statistik secara optimal. Analisis mendalam mengenai dinamika komunikasi menunjukkan adanya kesinambungan yang konsisten antara ekspektasi pesan dengan respon kognitif audiens sasaran. Secara metodologis setiap indikator konstruk diuji melalui parameter reliabilitas komposit yang memenuhi batas keterandalan statistik secara optimal. Analisis mendalam mengenai dinamika komunikasi menunjukkan adanya kesinambungan yang konsisten antara ekspektasi pesan dengan respon kognitif audiens sasaran. Secara metodologis setiap indikator konstruk diuji melalui parameter reliabilitas komposit yang memenuhi batas keterandalan statistik secara optimal. Analisis mendalam mengenai dinamika komunikasi menunjukkan adanya kesinambungan yang konsisten antara ekspektasi pesan dengan respon kognitif audiens sasaran. Secara metodologis setiap indikator konstruk diuji melalui parameter reliabilitas komposit yang memenuhi batas keterandalan statistik secara optimal. Analisis mendalam mengenai dinamika komunikasi menunjukkan adanya kesinambungan yang konsisten antara ekspektasi pesan dengan respon kognitif audiens sasaran. Secara metodologis setiap indikator konstruk diuji melalui parameter reliabilitas komposit yang memenuhi batas keterandalan statistik secara optimal. Analisis mendalam mengenai dinamika komunikasi menunjukkan adanya kesinambungan yang konsisten antara ekspektasi pesan dengan respon kognitif audiens sasaran. Secara metodologis setiap indikator konstruk diuji melalui parameter reliabilitas komposit yang memenuhi batas keterandalan statistik secara optimal. Analisis mendalam mengenai dinamika komunikasi menunjukkan adanya kesinambungan yang konsisten antara ekspektasi pesan dengan respon kognitif audiens sasaran. Secara metodologis setiap indikator konstruk diuji melalui parameter reliabilitas komposit yang memenuhi batas keterandalan statistik secara optimal.</w:t>
       </w:r>
     </w:p>
     <w:p>
@@ -1286,7 +1286,7 @@
           <w:rFonts w:ascii="Times New Roman" w:hAnsi="Times New Roman"/>
           <w:sz w:val="24"/>
         </w:rPr>
-        <w:t>Analisis mendalam mengenai dinamika komunikasi menunjukkan adanya kesinambungan yang konsisten antara ekspektasi pesan dengan respon kognitif audiens sasaran. Secara metodologis setiap indikator konstruk diuji melalui parameter reliabilitas komposit yang memenuhi batas keterandalan statistik secara optimal. Analisis mendalam mengenai dinamika komunikasi menunjukkan adanya kesinambungan yang konsisten antara ekspektasi pesan dengan respon kognitif audiens sasaran. Secara metodologis setiap indikator konstruk diuji melalui parameter reliabilitas komposit yang memenuhi batas keterandalan statistik secara optimal. Analisis mendalam mengenai dinamika komunikasi menunjukkan adanya kesinambungan yang konsisten antara ekspektasi pesan dengan respon kognitif audiens sasaran. Secara metodologis setiap indikator konstruk diuji melalui parameter reliabilitas komposit yang memenuhi batas keterandalan statistik secara optimal. Analisis mendalam mengenai dinamika komunikasi menunjukkan adanya kesinambungan yang konsisten antara ekspektasi pesan dengan respon kognitif audiens sasaran. Secara metodologis setiap indikator konstruk diuji melalui parameter reliabilitas komposit yang memenuhi batas keterandalan statistik secara optimal. Analisis mendalam mengenai dinamika komunikasi menunjukkan adanya kesinambungan yang konsisten antara ekspektasi pesan dengan respon kognitif audiens sasaran. Secara metodologis setiap indikator konstruk diuji melalui parameter reliabilitas komposit yang memenuhi batas keterandalan statistik secara optimal. Analisis mendalam mengenai dinamika komunikasi menunjukkan adanya kesinambungan yang konsisten antara ekspektasi pesan dengan respon kognitif audiens sasaran. Secara metodologis setiap indikator konstruk diuji melalui parameter reliabilitas komposit yang memenuhi batas keterandalan statistik secara optimal. Analisis mendalam mengenai dinamika komunikasi menunjukkan adanya kesinambungan yang konsisten antara ekspektasi pesan dengan respon kognitif audiens sasaran. Secara metodologis setiap indikator konstruk diuji melalui parameter reliabilitas komposit yang memenuhi batas keterandalan statistik secara optimal. Analisis mendalam mengenai dinamika komunikasi menunjukkan adanya kesinambungan yang konsisten antara ekspektasi pesan dengan respon kognitif audiens sasaran. Secara metodologis setiap indikator konstruk diuji melalui parameter reliabilitas komposit yang memenuhi batas keterandalan statistik secara optimal. Analisis mendalam mengenai dinamika komunikasi menunjukkan adanya kesinambungan yang konsisten antara ekspektasi pesan dengan respon kognitif audiens sasaran. Secara metodologis setiap indikator konstruk diuji melalui parameter reliabilitas komposit yang memenuhi batas keterandalan statistik secara optimal. Analisis mendalam mengenai dinamika komunikasi menunjukkan adanya kesinambungan yang konsisten antara ekspektasi pesan dengan respon kognitif audiens sasaran. Secara metodologis setiap indikator konstruk diuji melalui parameter reliabilitas komposit yang memenuhi batas keterandalan statistik secara optimal. Analisis mendalam mengenai dinamika komunikasi menunjukkan adanya kesinambungan yang konsisten antara ekspektasi pesan dengan respon kognitif audiens sasaran. Secara metodologis setiap indikator konstruk diuji melalui parameter reliabilitas komposit yang memenuhi batas keterandalan statistik secara optimal. Analisis mendalam mengenai dinamika komunikasi menunjukkan adanya kesinambungan yang konsisten antara ekspektasi pesan dengan respon kognitif audiens sasaran. Secara metodologis setiap indikator konstruk diuji melalui parameter reliabilitas komposit yang memenuhi batas keterandalan statistik secara optimal. Analisis mendalam mengenai dinamika komunikasi menunjukkan adanya kesinambungan yang konsisten antara ekspektasi pesan dengan respon kognitif audiens sasaran. Secara metodologis setiap indikator konstruk diuji melalui parameter reliabilitas komposit yang memenuhi batas keterandalan statistik secara optimal. Analisis mendalam mengenai dinamika komunikasi menunjukkan adanya kesinambungan yang konsisten antara ekspektasi pesan dengan respon kognitif audiens sasaran. Secara metodologis setiap indikator konstruk diuji melalui parameter reliabilitas komposit yang memenuhi batas keterandalan statistik secara optimal. Analisis mendalam mengenai dinamika komunikasi menunjukkan adanya kesinambungan yang konsisten antara ekspektasi pesan dengan respon kognitif audiens sasaran. Secara metodologis setiap indikator konstruk diuji melalui parameter reliabilitas komposit yang memenuhi batas keterandalan statistik secara optimal.</w:t>
+        <w:t>Analisis mendalam mengenai dinamika komunikasi menunjukkan adanya kesinambungan yang konsisten antara ekspektasi pesan dengan respon kognitif audiens sasaran. Secara metodologis setiap indikator konstruk diuji melalui parameter reliabilitas komposit yang memenuhi batas keterandalan statistik secara optimal. Analisis mendalam mengenai dinamika komunikasi menunjukkan adanya kesinambungan yang konsisten antara ekspektasi pesan dengan respon kognitif audiens sasaran. Secara metodologis setiap indikator konstruk diuji melalui parameter reliabilitas komposit yang memenuhi batas keterandalan statistik secara optimal. Analisis mendalam mengenai dinamika komunikasi menunjukkan adanya kesinambungan yang konsisten antara ekspektasi pesan dengan respon kognitif audiens sasaran. Secara metodologis setiap indikator konstruk diuji melalui parameter reliabilitas komposit yang memenuhi batas keterandalan statistik secara optimal. Analisis mendalam mengenai dinamika komunikasi menunjukkan adanya kesinambungan yang konsisten antara ekspektasi pesan dengan respon kognitif audiens sasaran. Secara metodologis setiap indikator konstruk diuji melalui parameter reliabilitas komposit yang memenuhi batas keterandalan statistik secara optimal. Analisis mendalam mengenai dinamika komunikasi menunjukkan adanya kesinambungan yang konsisten antara ekspektasi pesan dengan respon kognitif audiens sasaran. Secara metodologis setiap indikator konstruk diuji melalui parameter reliabilitas komposit yang memenuhi batas keterandalan statistik secara optimal. Analisis mendalam mengenai dinamika komunikasi menunjukkan adanya kesinambungan yang konsisten antara ekspektasi pesan dengan respon kognitif audiens sasaran. Secara metodologis setiap indikator konstruk diuji melalui parameter reliabilitas komposit yang memenuhi batas keterandalan statistik secara optimal. Analisis mendalam mengenai dinamika komunikasi menunjukkan adanya kesinambungan yang konsisten antara ekspektasi pesan dengan respon kognitif audiens sasaran. Secara metodologis setiap indikator konstruk diuji melalui parameter reliabilitas komposit yang memenuhi batas keterandalan statistik secara optimal. Analisis mendalam mengenai dinamika komunikasi menunjukkan adanya kesinambungan yang konsisten antara ekspektasi pesan dengan respon kognitif audiens sasaran. Secara metodologis setiap indikator konstruk diuji melalui parameter reliabilitas komposit yang memenuhi batas keterandalan statistik secara optimal. Analisis mendalam mengenai dinamika komunikasi menunjukkan adanya kesinambungan yang konsisten antara ekspektasi pesan dengan respon kognitif audiens sasaran. Secara metodologis setiap indikator konstruk diuji melalui parameter reliabilitas komposit yang memenuhi batas keterandalan statistik secara optimal. Analisis mendalam mengenai dinamika komunikasi menunjukkan adanya kesinambungan yang konsisten antara ekspektasi pesan dengan respon kognitif audiens sasaran. Secara metodologis setiap indikator konstruk diuji melalui parameter reliabilitas komposit yang memenuhi batas keterandalan statistik secara optimal. Analisis mendalam mengenai dinamika komunikasi menunjukkan adanya kesinambungan yang konsisten antara ekspektasi pesan dengan respon kognitif audiens sasaran. Secara metodologis setiap indikator konstruk diuji melalui parameter reliabilitas komposit yang memenuhi batas keterandalan statistik secara optimal. Analisis mendalam mengenai dinamika komunikasi menunjukkan adanya kesinambungan yang konsisten antara ekspektasi pesan dengan respon kognitif audiens sasaran. Secara metodologis setiap indikator konstruk diuji melalui parameter reliabilitas komposit yang memenuhi batas keterandalan statistik secara optimal.</w:t>
       </w:r>
     </w:p>
     <w:p>
@@ -1299,7 +1299,7 @@
           <w:rFonts w:ascii="Times New Roman" w:hAnsi="Times New Roman"/>
           <w:sz w:val="24"/>
         </w:rPr>
-        <w:t>Analisis mendalam mengenai dinamika komunikasi menunjukkan adanya kesinambungan yang konsisten antara ekspektasi pesan dengan respon kognitif audiens sasaran. Secara metodologis setiap indikator konstruk diuji melalui parameter reliabilitas komposit yang memenuhi batas keterandalan statistik secara optimal. Analisis mendalam mengenai dinamika komunikasi menunjukkan adanya kesinambungan yang konsisten antara ekspektasi pesan dengan respon kognitif audiens sasaran. Secara metodologis setiap indikator konstruk diuji melalui parameter reliabilitas komposit yang memenuhi batas keterandalan statistik secara optimal. Analisis mendalam mengenai dinamika komunikasi menunjukkan adanya kesinambungan yang konsisten antara ekspektasi pesan dengan respon kognitif audiens sasaran. Secara metodologis setiap indikator konstruk diuji melalui parameter reliabilitas komposit yang memenuhi batas keterandalan statistik secara optimal. Analisis mendalam mengenai dinamika komunikasi menunjukkan adanya kesinambungan yang konsisten antara ekspektasi pesan dengan respon kognitif audiens sasaran. Secara metodologis setiap indikator konstruk diuji melalui parameter reliabilitas komposit yang memenuhi batas keterandalan statistik secara optimal. Analisis mendalam mengenai dinamika komunikasi menunjukkan adanya kesinambungan yang konsisten antara ekspektasi pesan dengan respon kognitif audiens sasaran. Secara metodologis setiap indikator konstruk diuji melalui parameter reliabilitas komposit yang memenuhi batas keterandalan statistik secara optimal. Analisis mendalam mengenai dinamika komunikasi menunjukkan adanya kesinambungan yang konsisten antara ekspektasi pesan dengan respon kognitif audiens sasaran. Secara metodologis setiap indikator konstruk diuji melalui parameter reliabilitas komposit yang memenuhi batas keterandalan statistik secara optimal. Analisis mendalam mengenai dinamika komunikasi menunjukkan adanya kesinambungan yang konsisten antara ekspektasi pesan dengan respon kognitif audiens sasaran. Secara metodologis setiap indikator konstruk diuji melalui parameter reliabilitas komposit yang memenuhi batas keterandalan statistik secara optimal. Analisis mendalam mengenai dinamika komunikasi menunjukkan adanya kesinambungan yang konsisten antara ekspektasi pesan dengan respon kognitif audiens sasaran. Secara metodologis setiap indikator konstruk diuji melalui parameter reliabilitas komposit yang memenuhi batas keterandalan statistik secara optimal. Analisis mendalam mengenai dinamika komunikasi menunjukkan adanya kesinambungan yang konsisten antara ekspektasi pesan dengan respon kognitif audiens sasaran. Secara metodologis setiap indikator konstruk diuji melalui parameter reliabilitas komposit yang memenuhi batas keterandalan statistik secara optimal. Analisis mendalam mengenai dinamika komunikasi menunjukkan adanya kesinambungan yang konsisten antara ekspektasi pesan dengan respon kognitif audiens sasaran. Secara metodologis setiap indikator konstruk diuji melalui parameter reliabilitas komposit yang memenuhi batas keterandalan statistik secara optimal. Analisis mendalam mengenai dinamika komunikasi menunjukkan adanya kesinambungan yang konsisten antara ekspektasi pesan dengan respon kognitif audiens sasaran. Secara metodologis setiap indikator konstruk diuji melalui parameter reliabilitas komposit yang memenuhi batas keterandalan statistik secara optimal. Analisis mendalam mengenai dinamika komunikasi menunjukkan adanya kesinambungan yang konsisten antara ekspektasi pesan dengan respon kognitif audiens sasaran. Secara metodologis setiap indikator konstruk diuji melalui parameter reliabilitas komposit yang memenuhi batas keterandalan statistik secara optimal. Analisis mendalam mengenai dinamika komunikasi menunjukkan adanya kesinambungan yang konsisten antara ekspektasi pesan dengan respon kognitif audiens sasaran. Secara metodologis setiap indikator konstruk diuji melalui parameter reliabilitas komposit yang memenuhi batas keterandalan statistik secara optimal. Analisis mendalam mengenai dinamika komunikasi menunjukkan adanya kesinambungan yang konsisten antara ekspektasi pesan dengan respon kognitif audiens sasaran. Secara metodologis setiap indikator konstruk diuji melalui parameter reliabilitas komposit yang memenuhi batas keterandalan statistik secara optimal. Analisis mendalam mengenai dinamika komunikasi menunjukkan adanya kesinambungan yang konsisten antara ekspektasi pesan dengan respon kognitif audiens sasaran. Secara metodologis setiap indikator konstruk diuji melalui parameter reliabilitas komposit yang memenuhi batas keterandalan statistik secara optimal.</w:t>
+        <w:t>Analisis mendalam mengenai dinamika komunikasi menunjukkan adanya kesinambungan yang konsisten antara ekspektasi pesan dengan respon kognitif audiens sasaran. Secara metodologis setiap indikator konstruk diuji melalui parameter reliabilitas komposit yang memenuhi batas keterandalan statistik secara optimal. Analisis mendalam mengenai dinamika komunikasi menunjukkan adanya kesinambungan yang konsisten antara ekspektasi pesan dengan respon kognitif audiens sasaran. Secara metodologis setiap indikator konstruk diuji melalui parameter reliabilitas komposit yang memenuhi batas keterandalan statistik secara optimal. Analisis mendalam mengenai dinamika komunikasi menunjukkan adanya kesinambungan yang konsisten antara ekspektasi pesan dengan respon kognitif audiens sasaran. Secara metodologis setiap indikator konstruk diuji melalui parameter reliabilitas komposit yang memenuhi batas keterandalan statistik secara optimal. Analisis mendalam mengenai dinamika komunikasi menunjukkan adanya kesinambungan yang konsisten antara ekspektasi pesan dengan respon kognitif audiens sasaran. Secara metodologis setiap indikator konstruk diuji melalui parameter reliabilitas komposit yang memenuhi batas keterandalan statistik secara optimal. Analisis mendalam mengenai dinamika komunikasi menunjukkan adanya kesinambungan yang konsisten antara ekspektasi pesan dengan respon kognitif audiens sasaran. Secara metodologis setiap indikator konstruk diuji melalui parameter reliabilitas komposit yang memenuhi batas keterandalan statistik secara optimal. Analisis mendalam mengenai dinamika komunikasi menunjukkan adanya kesinambungan yang konsisten antara ekspektasi pesan dengan respon kognitif audiens sasaran. Secara metodologis setiap indikator konstruk diuji melalui parameter reliabilitas komposit yang memenuhi batas keterandalan statistik secara optimal. Analisis mendalam mengenai dinamika komunikasi menunjukkan adanya kesinambungan yang konsisten antara ekspektasi pesan dengan respon kognitif audiens sasaran. Secara metodologis setiap indikator konstruk diuji melalui parameter reliabilitas komposit yang memenuhi batas keterandalan statistik secara optimal. Analisis mendalam mengenai dinamika komunikasi menunjukkan adanya kesinambungan yang konsisten antara ekspektasi pesan dengan respon kognitif audiens sasaran. Secara metodologis setiap indikator konstruk diuji melalui parameter reliabilitas komposit yang memenuhi batas keterandalan statistik secara optimal. Analisis mendalam mengenai dinamika komunikasi menunjukkan adanya kesinambungan yang konsisten antara ekspektasi pesan dengan respon kognitif audiens sasaran. Secara metodologis setiap indikator konstruk diuji melalui parameter reliabilitas komposit yang memenuhi batas keterandalan statistik secara optimal. Analisis mendalam mengenai dinamika komunikasi menunjukkan adanya kesinambungan yang konsisten antara ekspektasi pesan dengan respon kognitif audiens sasaran. Secara metodologis setiap indikator konstruk diuji melalui parameter reliabilitas komposit yang memenuhi batas keterandalan statistik secara optimal. Analisis mendalam mengenai dinamika komunikasi menunjukkan adanya kesinambungan yang konsisten antara ekspektasi pesan dengan respon kognitif audiens sasaran. Secara metodologis setiap indikator konstruk diuji melalui parameter reliabilitas komposit yang memenuhi batas keterandalan statistik secara optimal. Analisis mendalam mengenai dinamika komunikasi menunjukkan adanya kesinambungan yang konsisten antara ekspektasi pesan dengan respon kognitif audiens sasaran. Secara metodologis setiap indikator konstruk diuji melalui parameter reliabilitas komposit yang memenuhi batas keterandalan statistik secara optimal.</w:t>
       </w:r>
     </w:p>
     <w:p>
@@ -1312,7 +1312,7 @@
           <w:rFonts w:ascii="Times New Roman" w:hAnsi="Times New Roman"/>
           <w:sz w:val="24"/>
         </w:rPr>
-        <w:t>Analisis mendalam mengenai dinamika komunikasi menunjukkan adanya kesinambungan yang konsisten antara ekspektasi pesan dengan respon kognitif audiens sasaran. Secara metodologis setiap indikator konstruk diuji melalui parameter reliabilitas komposit yang memenuhi batas keterandalan statistik secara optimal. Analisis mendalam mengenai dinamika komunikasi menunjukkan adanya kesinambungan yang konsisten antara ekspektasi pesan dengan respon kognitif audiens sasaran. Secara metodologis setiap indikator konstruk diuji melalui parameter reliabilitas komposit yang memenuhi batas keterandalan statistik secara optimal. Analisis mendalam mengenai dinamika komunikasi menunjukkan adanya kesinambungan yang konsisten antara ekspektasi pesan dengan respon kognitif audiens sasaran. Secara metodologis setiap indikator konstruk diuji melalui parameter reliabilitas komposit yang memenuhi batas keterandalan statistik secara optimal. Analisis mendalam mengenai dinamika komunikasi menunjukkan adanya kesinambungan yang konsisten antara ekspektasi pesan dengan respon kognitif audiens sasaran. Secara metodologis setiap indikator konstruk diuji melalui parameter reliabilitas komposit yang memenuhi batas keterandalan statistik secara optimal. Analisis mendalam mengenai dinamika komunikasi menunjukkan adanya kesinambungan yang konsisten antara ekspektasi pesan dengan respon kognitif audiens sasaran. Secara metodologis setiap indikator konstruk diuji melalui parameter reliabilitas komposit yang memenuhi batas keterandalan statistik secara optimal. Analisis mendalam mengenai dinamika komunikasi menunjukkan adanya kesinambungan yang konsisten antara ekspektasi pesan dengan respon kognitif audiens sasaran. Secara metodologis setiap indikator konstruk diuji melalui parameter reliabilitas komposit yang memenuhi batas keterandalan statistik secara optimal. Analisis mendalam mengenai dinamika komunikasi menunjukkan adanya kesinambungan yang konsisten antara ekspektasi pesan dengan respon kognitif audiens sasaran. Secara metodologis setiap indikator konstruk diuji melalui parameter reliabilitas komposit yang memenuhi batas keterandalan statistik secara optimal. Analisis mendalam mengenai dinamika komunikasi menunjukkan adanya kesinambungan yang konsisten antara ekspektasi pesan dengan respon kognitif audiens sasaran. Secara metodologis setiap indikator konstruk diuji melalui parameter reliabilitas komposit yang memenuhi batas keterandalan statistik secara optimal. Analisis mendalam mengenai dinamika komunikasi menunjukkan adanya kesinambungan yang konsisten antara ekspektasi pesan dengan respon kognitif audiens sasaran. Secara metodologis setiap indikator konstruk diuji melalui parameter reliabilitas komposit yang memenuhi batas keterandalan statistik secara optimal. Analisis mendalam mengenai dinamika komunikasi menunjukkan adanya kesinambungan yang konsisten antara ekspektasi pesan dengan respon kognitif audiens sasaran. Secara metodologis setiap indikator konstruk diuji melalui parameter reliabilitas komposit yang memenuhi batas keterandalan statistik secara optimal. Analisis mendalam mengenai dinamika komunikasi menunjukkan adanya kesinambungan yang konsisten antara ekspektasi pesan dengan respon kognitif audiens sasaran. Secara metodologis setiap indikator konstruk diuji melalui parameter reliabilitas komposit yang memenuhi batas keterandalan statistik secara optimal. Analisis mendalam mengenai dinamika komunikasi menunjukkan adanya kesinambungan yang konsisten antara ekspektasi pesan dengan respon kognitif audiens sasaran. Secara metodologis setiap indikator konstruk diuji melalui parameter reliabilitas komposit yang memenuhi batas keterandalan statistik secara optimal. Analisis mendalam mengenai dinamika komunikasi menunjukkan adanya kesinambungan yang konsisten antara ekspektasi pesan dengan respon kognitif audiens sasaran. Secara metodologis setiap indikator konstruk diuji melalui parameter reliabilitas komposit yang memenuhi batas keterandalan statistik secara optimal. Analisis mendalam mengenai dinamika komunikasi menunjukkan adanya kesinambungan yang konsisten antara ekspektasi pesan dengan respon kognitif audiens sasaran. Secara metodologis setiap indikator konstruk diuji melalui parameter reliabilitas komposit yang memenuhi batas keterandalan statistik secara optimal. Analisis mendalam mengenai dinamika komunikasi menunjukkan adanya kesinambungan yang konsisten antara ekspektasi pesan dengan respon kognitif audiens sasaran. Secara metodologis setiap indikator konstruk diuji melalui parameter reliabilitas komposit yang memenuhi batas keterandalan statistik secara optimal.</w:t>
+        <w:t>Analisis mendalam mengenai dinamika komunikasi menunjukkan adanya kesinambungan yang konsisten antara ekspektasi pesan dengan respon kognitif audiens sasaran. Secara metodologis setiap indikator konstruk diuji melalui parameter reliabilitas komposit yang memenuhi batas keterandalan statistik secara optimal. Analisis mendalam mengenai dinamika komunikasi menunjukkan adanya kesinambungan yang konsisten antara ekspektasi pesan dengan respon kognitif audiens sasaran. Secara metodologis setiap indikator konstruk diuji melalui parameter reliabilitas komposit yang memenuhi batas keterandalan statistik secara optimal. Analisis mendalam mengenai dinamika komunikasi menunjukkan adanya kesinambungan yang konsisten antara ekspektasi pesan dengan respon kognitif audiens sasaran. Secara metodologis setiap indikator konstruk diuji melalui parameter reliabilitas komposit yang memenuhi batas keterandalan statistik secara optimal. Analisis mendalam mengenai dinamika komunikasi menunjukkan adanya kesinambungan yang konsisten antara ekspektasi pesan dengan respon kognitif audiens sasaran. Secara metodologis setiap indikator konstruk diuji melalui parameter reliabilitas komposit yang memenuhi batas keterandalan statistik secara optimal. Analisis mendalam mengenai dinamika komunikasi menunjukkan adanya kesinambungan yang konsisten antara ekspektasi pesan dengan respon kognitif audiens sasaran. Secara metodologis setiap indikator konstruk diuji melalui parameter reliabilitas komposit yang memenuhi batas keterandalan statistik secara optimal. Analisis mendalam mengenai dinamika komunikasi menunjukkan adanya kesinambungan yang konsisten antara ekspektasi pesan dengan respon kognitif audiens sasaran. Secara metodologis setiap indikator konstruk diuji melalui parameter reliabilitas komposit yang memenuhi batas keterandalan statistik secara optimal. Analisis mendalam mengenai dinamika komunikasi menunjukkan adanya kesinambungan yang konsisten antara ekspektasi pesan dengan respon kognitif audiens sasaran. Secara metodologis setiap indikator konstruk diuji melalui parameter reliabilitas komposit yang memenuhi batas keterandalan statistik secara optimal. Analisis mendalam mengenai dinamika komunikasi menunjukkan adanya kesinambungan yang konsisten antara ekspektasi pesan dengan respon kognitif audiens sasaran. Secara metodologis setiap indikator konstruk diuji melalui parameter reliabilitas komposit yang memenuhi batas keterandalan statistik secara optimal. Analisis mendalam mengenai dinamika komunikasi menunjukkan adanya kesinambungan yang konsisten antara ekspektasi pesan dengan respon kognitif audiens sasaran. Secara metodologis setiap indikator konstruk diuji melalui parameter reliabilitas komposit yang memenuhi batas keterandalan statistik secara optimal. Analisis mendalam mengenai dinamika komunikasi menunjukkan adanya kesinambungan yang konsisten antara ekspektasi pesan dengan respon kognitif audiens sasaran. Secara metodologis setiap indikator konstruk diuji melalui parameter reliabilitas komposit yang memenuhi batas keterandalan statistik secara optimal. Analisis mendalam mengenai dinamika komunikasi menunjukkan adanya kesinambungan yang konsisten antara ekspektasi pesan dengan respon kognitif audiens sasaran. Secara metodologis setiap indikator konstruk diuji melalui parameter reliabilitas komposit yang memenuhi batas keterandalan statistik secara optimal. Analisis mendalam mengenai dinamika komunikasi menunjukkan adanya kesinambungan yang konsisten antara ekspektasi pesan dengan respon kognitif audiens sasaran. Secara metodologis setiap indikator konstruk diuji melalui parameter reliabilitas komposit yang memenuhi batas keterandalan statistik secara optimal.</w:t>
       </w:r>
     </w:p>
     <w:p>
@@ -1325,7 +1325,7 @@
           <w:rFonts w:ascii="Times New Roman" w:hAnsi="Times New Roman"/>
           <w:sz w:val="24"/>
         </w:rPr>
-        <w:t>Analisis mendalam mengenai dinamika komunikasi menunjukkan adanya kesinambungan yang konsisten antara ekspektasi pesan dengan respon kognitif audiens sasaran. Secara metodologis setiap indikator konstruk diuji melalui parameter reliabilitas komposit yang memenuhi batas keterandalan statistik secara optimal. Analisis mendalam mengenai dinamika komunikasi menunjukkan adanya kesinambungan yang konsisten antara ekspektasi pesan dengan respon kognitif audiens sasaran. Secara metodologis setiap indikator konstruk diuji melalui parameter reliabilitas komposit yang memenuhi batas keterandalan statistik secara optimal. Analisis mendalam mengenai dinamika komunikasi menunjukkan adanya kesinambungan yang konsisten antara ekspektasi pesan dengan respon kognitif audiens sasaran. Secara metodologis setiap indikator konstruk diuji melalui parameter reliabilitas komposit yang memenuhi batas keterandalan statistik secara optimal. Analisis mendalam mengenai dinamika komunikasi menunjukkan adanya kesinambungan yang konsisten antara ekspektasi pesan dengan respon kognitif audiens sasaran. Secara metodologis setiap indikator konstruk diuji melalui parameter reliabilitas komposit yang memenuhi batas keterandalan statistik secara optimal. Analisis mendalam mengenai dinamika komunikasi menunjukkan adanya kesinambungan yang konsisten antara ekspektasi pesan dengan respon kognitif audiens sasaran. Secara metodologis setiap indikator konstruk diuji melalui parameter reliabilitas komposit yang memenuhi batas keterandalan statistik secara optimal. Analisis mendalam mengenai dinamika komunikasi menunjukkan adanya kesinambungan yang konsisten antara ekspektasi pesan dengan respon kognitif audiens sasaran. Secara metodologis setiap indikator konstruk diuji melalui parameter reliabilitas komposit yang memenuhi batas keterandalan statistik secara optimal. Analisis mendalam mengenai dinamika komunikasi menunjukkan adanya kesinambungan yang konsisten antara ekspektasi pesan dengan respon kognitif audiens sasaran. Secara metodologis setiap indikator konstruk diuji melalui parameter reliabilitas komposit yang memenuhi batas keterandalan statistik secara optimal. Analisis mendalam mengenai dinamika komunikasi menunjukkan adanya kesinambungan yang konsisten antara ekspektasi pesan dengan respon kognitif audiens sasaran. Secara metodologis setiap indikator konstruk diuji melalui parameter reliabilitas komposit yang memenuhi batas keterandalan statistik secara optimal. Analisis mendalam mengenai dinamika komunikasi menunjukkan adanya kesinambungan yang konsisten antara ekspektasi pesan dengan respon kognitif audiens sasaran. Secara metodologis setiap indikator konstruk diuji melalui parameter reliabilitas komposit yang memenuhi batas keterandalan statistik secara optimal. Analisis mendalam mengenai dinamika komunikasi menunjukkan adanya kesinambungan yang konsisten antara ekspektasi pesan dengan respon kognitif audiens sasaran. Secara metodologis setiap indikator konstruk diuji melalui parameter reliabilitas komposit yang memenuhi batas keterandalan statistik secara optimal. Analisis mendalam mengenai dinamika komunikasi menunjukkan adanya kesinambungan yang konsisten antara ekspektasi pesan dengan respon kognitif audiens sasaran. Secara metodologis setiap indikator konstruk diuji melalui parameter reliabilitas komposit yang memenuhi batas keterandalan statistik secara optimal. Analisis mendalam mengenai dinamika komunikasi menunjukkan adanya kesinambungan yang konsisten antara ekspektasi pesan dengan respon kognitif audiens sasaran. Secara metodologis setiap indikator konstruk diuji melalui parameter reliabilitas komposit yang memenuhi batas keterandalan statistik secara optimal. Analisis mendalam mengenai dinamika komunikasi menunjukkan adanya kesinambungan yang konsisten antara ekspektasi pesan dengan respon kognitif audiens sasaran. Secara metodologis setiap indikator konstruk diuji melalui parameter reliabilitas komposit yang memenuhi batas keterandalan statistik secara optimal. Analisis mendalam mengenai dinamika komunikasi menunjukkan adanya kesinambungan yang konsisten antara ekspektasi pesan dengan respon kognitif audiens sasaran. Secara metodologis setiap indikator konstruk diuji melalui parameter reliabilitas komposit yang memenuhi batas keterandalan statistik secara optimal. Analisis mendalam mengenai dinamika komunikasi menunjukkan adanya kesinambungan yang konsisten antara ekspektasi pesan dengan respon kognitif audiens sasaran. Secara metodologis setiap indikator konstruk diuji melalui parameter reliabilitas komposit yang memenuhi batas keterandalan statistik secara optimal.</w:t>
+        <w:t>Analisis mendalam mengenai dinamika komunikasi menunjukkan adanya kesinambungan yang konsisten antara ekspektasi pesan dengan respon kognitif audiens sasaran. Secara metodologis setiap indikator konstruk diuji melalui parameter reliabilitas komposit yang memenuhi batas keterandalan statistik secara optimal. Analisis mendalam mengenai dinamika komunikasi menunjukkan adanya kesinambungan yang konsisten antara ekspektasi pesan dengan respon kognitif audiens sasaran. Secara metodologis setiap indikator konstruk diuji melalui parameter reliabilitas komposit yang memenuhi batas keterandalan statistik secara optimal. Analisis mendalam mengenai dinamika komunikasi menunjukkan adanya kesinambungan yang konsisten antara ekspektasi pesan dengan respon kognitif audiens sasaran. Secara metodologis setiap indikator konstruk diuji melalui parameter reliabilitas komposit yang memenuhi batas keterandalan statistik secara optimal. Analisis mendalam mengenai dinamika komunikasi menunjukkan adanya kesinambungan yang konsisten antara ekspektasi pesan dengan respon kognitif audiens sasaran. Secara metodologis setiap indikator konstruk diuji melalui parameter reliabilitas komposit yang memenuhi batas keterandalan statistik secara optimal. Analisis mendalam mengenai dinamika komunikasi menunjukkan adanya kesinambungan yang konsisten antara ekspektasi pesan dengan respon kognitif audiens sasaran. Secara metodologis setiap indikator konstruk diuji melalui parameter reliabilitas komposit yang memenuhi batas keterandalan statistik secara optimal. Analisis mendalam mengenai dinamika komunikasi menunjukkan adanya kesinambungan yang konsisten antara ekspektasi pesan dengan respon kognitif audiens sasaran. Secara metodologis setiap indikator konstruk diuji melalui parameter reliabilitas komposit yang memenuhi batas keterandalan statistik secara optimal. Analisis mendalam mengenai dinamika komunikasi menunjukkan adanya kesinambungan yang konsisten antara ekspektasi pesan dengan respon kognitif audiens sasaran. Secara metodologis setiap indikator konstruk diuji melalui parameter reliabilitas komposit yang memenuhi batas keterandalan statistik secara optimal. Analisis mendalam mengenai dinamika komunikasi menunjukkan adanya kesinambungan yang konsisten antara ekspektasi pesan dengan respon kognitif audiens sasaran. Secara metodologis setiap indikator konstruk diuji melalui parameter reliabilitas komposit yang memenuhi batas keterandalan statistik secara optimal. Analisis mendalam mengenai dinamika komunikasi menunjukkan adanya kesinambungan yang konsisten antara ekspektasi pesan dengan respon kognitif audiens sasaran. Secara metodologis setiap indikator konstruk diuji melalui parameter reliabilitas komposit yang memenuhi batas keterandalan statistik secara optimal. Analisis mendalam mengenai dinamika komunikasi menunjukkan adanya kesinambungan yang konsisten antara ekspektasi pesan dengan respon kognitif audiens sasaran. Secara metodologis setiap indikator konstruk diuji melalui parameter reliabilitas komposit yang memenuhi batas keterandalan statistik secara optimal. Analisis mendalam mengenai dinamika komunikasi menunjukkan adanya kesinambungan yang konsisten antara ekspektasi pesan dengan respon kognitif audiens sasaran. Secara metodologis setiap indikator konstruk diuji melalui parameter reliabilitas komposit yang memenuhi batas keterandalan statistik secara optimal. Analisis mendalam mengenai dinamika komunikasi menunjukkan adanya kesinambungan yang konsisten antara ekspektasi pesan dengan respon kognitif audiens sasaran. Secara metodologis setiap indikator konstruk diuji melalui parameter reliabilitas komposit yang memenuhi batas keterandalan statistik secara optimal.</w:t>
       </w:r>
     </w:p>
     <w:p>
@@ -1338,7 +1338,7 @@
           <w:rFonts w:ascii="Times New Roman" w:hAnsi="Times New Roman"/>
           <w:sz w:val="24"/>
         </w:rPr>
-        <w:t>Analisis mendalam mengenai dinamika komunikasi menunjukkan adanya kesinambungan yang konsisten antara ekspektasi pesan dengan respon kognitif audiens sasaran. Secara metodologis setiap indikator konstruk diuji melalui parameter reliabilitas komposit yang memenuhi batas keterandalan statistik secara optimal. Analisis mendalam mengenai dinamika komunikasi menunjukkan adanya kesinambungan yang konsisten antara ekspektasi pesan dengan respon kognitif audiens sasaran. Secara metodologis setiap indikator konstruk diuji melalui parameter reliabilitas komposit yang memenuhi batas keterandalan statistik secara optimal. Analisis mendalam mengenai dinamika komunikasi menunjukkan adanya kesinambungan yang konsisten antara ekspektasi pesan dengan respon kognitif audiens sasaran. Secara metodologis setiap indikator konstruk diuji melalui parameter reliabilitas komposit yang memenuhi batas keterandalan statistik secara optimal. Analisis mendalam mengenai dinamika komunikasi menunjukkan adanya kesinambungan yang konsisten antara ekspektasi pesan dengan respon kognitif audiens sasaran. Secara metodologis setiap indikator konstruk diuji melalui parameter reliabilitas komposit yang memenuhi batas keterandalan statistik secara optimal. Analisis mendalam mengenai dinamika komunikasi menunjukkan adanya kesinambungan yang konsisten antara ekspektasi pesan dengan respon kognitif audiens sasaran. Secara metodologis setiap indikator konstruk diuji melalui parameter reliabilitas komposit yang memenuhi batas keterandalan statistik secara optimal. Analisis mendalam mengenai dinamika komunikasi menunjukkan adanya kesinambungan yang konsisten antara ekspektasi pesan dengan respon kognitif audiens sasaran. Secara metodologis setiap indikator konstruk diuji melalui parameter reliabilitas komposit yang memenuhi batas keterandalan statistik secara optimal. Analisis mendalam mengenai dinamika komunikasi menunjukkan adanya kesinambungan yang konsisten antara ekspektasi pesan dengan respon kognitif audiens sasaran. Secara metodologis setiap indikator konstruk diuji melalui parameter reliabilitas komposit yang memenuhi batas keterandalan statistik secara optimal. Analisis mendalam mengenai dinamika komunikasi menunjukkan adanya kesinambungan yang konsisten antara ekspektasi pesan dengan respon kognitif audiens sasaran. Secara metodologis setiap indikator konstruk diuji melalui parameter reliabilitas komposit yang memenuhi batas keterandalan statistik secara optimal. Analisis mendalam mengenai dinamika komunikasi menunjukkan adanya kesinambungan yang konsisten antara ekspektasi pesan dengan respon kognitif audiens sasaran. Secara metodologis setiap indikator konstruk diuji melalui parameter reliabilitas komposit yang memenuhi batas keterandalan statistik secara optimal. Analisis mendalam mengenai dinamika komunikasi menunjukkan adanya kesinambungan yang konsisten antara ekspektasi pesan dengan respon kognitif audiens sasaran. Secara metodologis setiap indikator konstruk diuji melalui parameter reliabilitas komposit yang memenuhi batas keterandalan statistik secara optimal. Analisis mendalam mengenai dinamika komunikasi menunjukkan adanya kesinambungan yang konsisten antara ekspektasi pesan dengan respon kognitif audiens sasaran. Secara metodologis setiap indikator konstruk diuji melalui parameter reliabilitas komposit yang memenuhi batas keterandalan statistik secara optimal. Analisis mendalam mengenai dinamika komunikasi menunjukkan adanya kesinambungan yang konsisten antara ekspektasi pesan dengan respon kognitif audiens sasaran. Secara metodologis setiap indikator konstruk diuji melalui parameter reliabilitas komposit yang memenuhi batas keterandalan statistik secara optimal. Analisis mendalam mengenai dinamika komunikasi menunjukkan adanya kesinambungan yang konsisten antara ekspektasi pesan dengan respon kognitif audiens sasaran. Secara metodologis setiap indikator konstruk diuji melalui parameter reliabilitas komposit yang memenuhi batas keterandalan statistik secara optimal. Analisis mendalam mengenai dinamika komunikasi menunjukkan adanya kesinambungan yang konsisten antara ekspektasi pesan dengan respon kognitif audiens sasaran. Secara metodologis setiap indikator konstruk diuji melalui parameter reliabilitas komposit yang memenuhi batas keterandalan statistik secara optimal. Analisis mendalam mengenai dinamika komunikasi menunjukkan adanya kesinambungan yang konsisten antara ekspektasi pesan dengan respon kognitif audiens sasaran. Secara metodologis setiap indikator konstruk diuji melalui parameter reliabilitas komposit yang memenuhi batas keterandalan statistik secara optimal.</w:t>
+        <w:t>Analisis mendalam mengenai dinamika komunikasi menunjukkan adanya kesinambungan yang konsisten antara ekspektasi pesan dengan respon kognitif audiens sasaran. Secara metodologis setiap indikator konstruk diuji melalui parameter reliabilitas komposit yang memenuhi batas keterandalan statistik secara optimal. Analisis mendalam mengenai dinamika komunikasi menunjukkan adanya kesinambungan yang konsisten antara ekspektasi pesan dengan respon kognitif audiens sasaran. Secara metodologis setiap indikator konstruk diuji melalui parameter reliabilitas komposit yang memenuhi batas keterandalan statistik secara optimal. Analisis mendalam mengenai dinamika komunikasi menunjukkan adanya kesinambungan yang konsisten antara ekspektasi pesan dengan respon kognitif audiens sasaran. Secara metodologis setiap indikator konstruk diuji melalui parameter reliabilitas komposit yang memenuhi batas keterandalan statistik secara optimal. Analisis mendalam mengenai dinamika komunikasi menunjukkan adanya kesinambungan yang konsisten antara ekspektasi pesan dengan respon kognitif audiens sasaran. Secara metodologis setiap indikator konstruk diuji melalui parameter reliabilitas komposit yang memenuhi batas keterandalan statistik secara optimal. Analisis mendalam mengenai dinamika komunikasi menunjukkan adanya kesinambungan yang konsisten antara ekspektasi pesan dengan respon kognitif audiens sasaran. Secara metodologis setiap indikator konstruk diuji melalui parameter reliabilitas komposit yang memenuhi batas keterandalan statistik secara optimal. Analisis mendalam mengenai dinamika komunikasi menunjukkan adanya kesinambungan yang konsisten antara ekspektasi pesan dengan respon kognitif audiens sasaran. Secara metodologis setiap indikator konstruk diuji melalui parameter reliabilitas komposit yang memenuhi batas keterandalan statistik secara optimal. Analisis mendalam mengenai dinamika komunikasi menunjukkan adanya kesinambungan yang konsisten antara ekspektasi pesan dengan respon kognitif audiens sasaran. Secara metodologis setiap indikator konstruk diuji melalui parameter reliabilitas komposit yang memenuhi batas keterandalan statistik secara optimal. Analisis mendalam mengenai dinamika komunikasi menunjukkan adanya kesinambungan yang konsisten antara ekspektasi pesan dengan respon kognitif audiens sasaran. Secara metodologis setiap indikator konstruk diuji melalui parameter reliabilitas komposit yang memenuhi batas keterandalan statistik secara optimal. Analisis mendalam mengenai dinamika komunikasi menunjukkan adanya kesinambungan yang konsisten antara ekspektasi pesan dengan respon kognitif audiens sasaran. Secara metodologis setiap indikator konstruk diuji melalui parameter reliabilitas komposit yang memenuhi batas keterandalan statistik secara optimal. Analisis mendalam mengenai dinamika komunikasi menunjukkan adanya kesinambungan yang konsisten antara ekspektasi pesan dengan respon kognitif audiens sasaran. Secara metodologis setiap indikator konstruk diuji melalui parameter reliabilitas komposit yang memenuhi batas keterandalan statistik secara optimal. Analisis mendalam mengenai dinamika komunikasi menunjukkan adanya kesinambungan yang konsisten antara ekspektasi pesan dengan respon kognitif audiens sasaran. Secara metodologis setiap indikator konstruk diuji melalui parameter reliabilitas komposit yang memenuhi batas keterandalan statistik secara optimal. Analisis mendalam mengenai dinamika komunikasi menunjukkan adanya kesinambungan yang konsisten antara ekspektasi pesan dengan respon kognitif audiens sasaran. Secara metodologis setiap indikator konstruk diuji melalui parameter reliabilitas komposit yang memenuhi batas keterandalan statistik secara optimal.</w:t>
       </w:r>
     </w:p>
     <w:p>
@@ -1351,7 +1351,7 @@
           <w:rFonts w:ascii="Times New Roman" w:hAnsi="Times New Roman"/>
           <w:sz w:val="24"/>
         </w:rPr>
-        <w:t>Analisis mendalam mengenai dinamika komunikasi menunjukkan adanya kesinambungan yang konsisten antara ekspektasi pesan dengan respon kognitif audiens sasaran. Secara metodologis setiap indikator konstruk diuji melalui parameter reliabilitas komposit yang memenuhi batas keterandalan statistik secara optimal. Analisis mendalam mengenai dinamika komunikasi menunjukkan adanya kesinambungan yang konsisten antara ekspektasi pesan dengan respon kognitif audiens sasaran. Secara metodologis setiap indikator konstruk diuji melalui parameter reliabilitas komposit yang memenuhi batas keterandalan statistik secara optimal. Analisis mendalam mengenai dinamika komunikasi menunjukkan adanya kesinambungan yang konsisten antara ekspektasi pesan dengan respon kognitif audiens sasaran. Secara metodologis setiap indikator konstruk diuji melalui parameter reliabilitas komposit yang memenuhi batas keterandalan statistik secara optimal. Analisis mendalam mengenai dinamika komunikasi menunjukkan adanya kesinambungan yang konsisten antara ekspektasi pesan dengan respon kognitif audiens sasaran. Secara metodologis setiap indikator konstruk diuji melalui parameter reliabilitas komposit yang memenuhi batas keterandalan statistik secara optimal. Analisis mendalam mengenai dinamika komunikasi menunjukkan adanya kesinambungan yang konsisten antara ekspektasi pesan dengan respon kognitif audiens sasaran. Secara metodologis setiap indikator konstruk diuji melalui parameter reliabilitas komposit yang memenuhi batas keterandalan statistik secara optimal. Analisis mendalam mengenai dinamika komunikasi menunjukkan adanya kesinambungan yang konsisten antara ekspektasi pesan dengan respon kognitif audiens sasaran. Secara metodologis setiap indikator konstruk diuji melalui parameter reliabilitas komposit yang memenuhi batas keterandalan statistik secara optimal. Analisis mendalam mengenai dinamika komunikasi menunjukkan adanya kesinambungan yang konsisten antara ekspektasi pesan dengan respon kognitif audiens sasaran. Secara metodologis setiap indikator konstruk diuji melalui parameter reliabilitas komposit yang memenuhi batas keterandalan statistik secara optimal. Analisis mendalam mengenai dinamika komunikasi menunjukkan adanya kesinambungan yang konsisten antara ekspektasi pesan dengan respon kognitif audiens sasaran. Secara metodologis setiap indikator konstruk diuji melalui parameter reliabilitas komposit yang memenuhi batas keterandalan statistik secara optimal. Analisis mendalam mengenai dinamika komunikasi menunjukkan adanya kesinambungan yang konsisten antara ekspektasi pesan dengan respon kognitif audiens sasaran. Secara metodologis setiap indikator konstruk diuji melalui parameter reliabilitas komposit yang memenuhi batas keterandalan statistik secara optimal. Analisis mendalam mengenai dinamika komunikasi menunjukkan adanya kesinambungan yang konsisten antara ekspektasi pesan dengan respon kognitif audiens sasaran. Secara metodologis setiap indikator konstruk diuji melalui parameter reliabilitas komposit yang memenuhi batas keterandalan statistik secara optimal. Analisis mendalam mengenai dinamika komunikasi menunjukkan adanya kesinambungan yang konsisten antara ekspektasi pesan dengan respon kognitif audiens sasaran. Secara metodologis setiap indikator konstruk diuji melalui parameter reliabilitas komposit yang memenuhi batas keterandalan statistik secara optimal. Analisis mendalam mengenai dinamika komunikasi menunjukkan adanya kesinambungan yang konsisten antara ekspektasi pesan dengan respon kognitif audiens sasaran. Secara metodologis setiap indikator konstruk diuji melalui parameter reliabilitas komposit yang memenuhi batas keterandalan statistik secara optimal. Analisis mendalam mengenai dinamika komunikasi menunjukkan adanya kesinambungan yang konsisten antara ekspektasi pesan dengan respon kognitif audiens sasaran. Secara metodologis setiap indikator konstruk diuji melalui parameter reliabilitas komposit yang memenuhi batas keterandalan statistik secara optimal. Analisis mendalam mengenai dinamika komunikasi menunjukkan adanya kesinambungan yang konsisten antara ekspektasi pesan dengan respon kognitif audiens sasaran. Secara metodologis setiap indikator konstruk diuji melalui parameter reliabilitas komposit yang memenuhi batas keterandalan statistik secara optimal. Analisis mendalam mengenai dinamika komunikasi menunjukkan adanya kesinambungan yang konsisten antara ekspektasi pesan dengan respon kognitif audiens sasaran. Secara metodologis setiap indikator konstruk diuji melalui parameter reliabilitas komposit yang memenuhi batas keterandalan statistik secara optimal.</w:t>
+        <w:t>Analisis mendalam mengenai dinamika komunikasi menunjukkan adanya kesinambungan yang konsisten antara ekspektasi pesan dengan respon kognitif audiens sasaran. Secara metodologis setiap indikator konstruk diuji melalui parameter reliabilitas komposit yang memenuhi batas keterandalan statistik secara optimal. Analisis mendalam mengenai dinamika komunikasi menunjukkan adanya kesinambungan yang konsisten antara ekspektasi pesan dengan respon kognitif audiens sasaran. Secara metodologis setiap indikator konstruk diuji melalui parameter reliabilitas komposit yang memenuhi batas keterandalan statistik secara optimal. Analisis mendalam mengenai dinamika komunikasi menunjukkan adanya kesinambungan yang konsisten antara ekspektasi pesan dengan respon kognitif audiens sasaran. Secara metodologis setiap indikator konstruk diuji melalui parameter reliabilitas komposit yang memenuhi batas keterandalan statistik secara optimal. Analisis mendalam mengenai dinamika komunikasi menunjukkan adanya kesinambungan yang konsisten antara ekspektasi pesan dengan respon kognitif audiens sasaran. Secara metodologis setiap indikator konstruk diuji melalui parameter reliabilitas komposit yang memenuhi batas keterandalan statistik secara optimal. Analisis mendalam mengenai dinamika komunikasi menunjukkan adanya kesinambungan yang konsisten antara ekspektasi pesan dengan respon kognitif audiens sasaran. Secara metodologis setiap indikator konstruk diuji melalui parameter reliabilitas komposit yang memenuhi batas keterandalan statistik secara optimal. Analisis mendalam mengenai dinamika komunikasi menunjukkan adanya kesinambungan yang konsisten antara ekspektasi pesan dengan respon kognitif audiens sasaran. Secara metodologis setiap indikator konstruk diuji melalui parameter reliabilitas komposit yang memenuhi batas keterandalan statistik secara optimal. Analisis mendalam mengenai dinamika komunikasi menunjukkan adanya kesinambungan yang konsisten antara ekspektasi pesan dengan respon kognitif audiens sasaran. Secara metodologis setiap indikator konstruk diuji melalui parameter reliabilitas komposit yang memenuhi batas keterandalan statistik secara optimal. Analisis mendalam mengenai dinamika komunikasi menunjukkan adanya kesinambungan yang konsisten antara ekspektasi pesan dengan respon kognitif audiens sasaran. Secara metodologis setiap indikator konstruk diuji melalui parameter reliabilitas komposit yang memenuhi batas keterandalan statistik secara optimal. Analisis mendalam mengenai dinamika komunikasi menunjukkan adanya kesinambungan yang konsisten antara ekspektasi pesan dengan respon kognitif audiens sasaran. Secara metodologis setiap indikator konstruk diuji melalui parameter reliabilitas komposit yang memenuhi batas keterandalan statistik secara optimal. Analisis mendalam mengenai dinamika komunikasi menunjukkan adanya kesinambungan yang konsisten antara ekspektasi pesan dengan respon kognitif audiens sasaran. Secara metodologis setiap indikator konstruk diuji melalui parameter reliabilitas komposit yang memenuhi batas keterandalan statistik secara optimal. Analisis mendalam mengenai dinamika komunikasi menunjukkan adanya kesinambungan yang konsisten antara ekspektasi pesan dengan respon kognitif audiens sasaran. Secara metodologis setiap indikator konstruk diuji melalui parameter reliabilitas komposit yang memenuhi batas keterandalan statistik secara optimal. Analisis mendalam mengenai dinamika komunikasi menunjukkan adanya kesinambungan yang konsisten antara ekspektasi pesan dengan respon kognitif audiens sasaran. Secara metodologis setiap indikator konstruk diuji melalui parameter reliabilitas komposit yang memenuhi batas keterandalan statistik secara optimal.</w:t>
       </w:r>
     </w:p>
     <w:p>
@@ -1385,7 +1385,7 @@
           <w:rFonts w:ascii="Times New Roman" w:hAnsi="Times New Roman"/>
           <w:sz w:val="24"/>
         </w:rPr>
-        <w:t>Analisis mendalam mengenai dinamika komunikasi menunjukkan adanya kesinambungan yang konsisten antara ekspektasi pesan dengan respon kognitif audiens sasaran. Secara metodologis setiap indikator konstruk diuji melalui parameter reliabilitas komposit yang memenuhi batas keterandalan statistik secara optimal. Analisis mendalam mengenai dinamika komunikasi menunjukkan adanya kesinambungan yang konsisten antara ekspektasi pesan dengan respon kognitif audiens sasaran. Secara metodologis setiap indikator konstruk diuji melalui parameter reliabilitas komposit yang memenuhi batas keterandalan statistik secara optimal. Analisis mendalam mengenai dinamika komunikasi menunjukkan adanya kesinambungan yang konsisten antara ekspektasi pesan dengan respon kognitif audiens sasaran. Secara metodologis setiap indikator konstruk diuji melalui parameter reliabilitas komposit yang memenuhi batas keterandalan statistik secara optimal. Analisis mendalam mengenai dinamika komunikasi menunjukkan adanya kesinambungan yang konsisten antara ekspektasi pesan dengan respon kognitif audiens sasaran. Secara metodologis setiap indikator konstruk diuji melalui parameter reliabilitas komposit yang memenuhi batas keterandalan statistik secara optimal. Analisis mendalam mengenai dinamika komunikasi menunjukkan adanya kesinambungan yang konsisten antara ekspektasi pesan dengan respon kognitif audiens sasaran. Secara metodologis setiap indikator konstruk diuji melalui parameter reliabilitas komposit yang memenuhi batas keterandalan statistik secara optimal. Analisis mendalam mengenai dinamika komunikasi menunjukkan adanya kesinambungan yang konsisten antara ekspektasi pesan dengan respon kognitif audiens sasaran. Secara metodologis setiap indikator konstruk diuji melalui parameter reliabilitas komposit yang memenuhi batas keterandalan statistik secara optimal. Analisis mendalam mengenai dinamika komunikasi menunjukkan adanya kesinambungan yang konsisten antara ekspektasi pesan dengan respon kognitif audiens sasaran. Secara metodologis setiap indikator konstruk diuji melalui parameter reliabilitas komposit yang memenuhi batas keterandalan statistik secara optimal. Analisis mendalam mengenai dinamika komunikasi menunjukkan adanya kesinambungan yang konsisten antara ekspektasi pesan dengan respon kognitif audiens sasaran. Secara metodologis setiap indikator konstruk diuji melalui parameter reliabilitas komposit yang memenuhi batas keterandalan statistik secara optimal. Analisis mendalam mengenai dinamika komunikasi menunjukkan adanya kesinambungan yang konsisten antara ekspektasi pesan dengan respon kognitif audiens sasaran. Secara metodologis setiap indikator konstruk diuji melalui parameter reliabilitas komposit yang memenuhi batas keterandalan statistik secara optimal. Analisis mendalam mengenai dinamika komunikasi menunjukkan adanya kesinambungan yang konsisten antara ekspektasi pesan dengan respon kognitif audiens sasaran. Secara metodologis setiap indikator konstruk diuji melalui parameter reliabilitas komposit yang memenuhi batas keterandalan statistik secara optimal. Analisis mendalam mengenai dinamika komunikasi menunjukkan adanya kesinambungan yang konsisten antara ekspektasi pesan dengan respon kognitif audiens sasaran. Secara metodologis setiap indikator konstruk diuji melalui parameter reliabilitas komposit yang memenuhi batas keterandalan statistik secara optimal. Analisis mendalam mengenai dinamika komunikasi menunjukkan adanya kesinambungan yang konsisten antara ekspektasi pesan dengan respon kognitif audiens sasaran. Secara metodologis setiap indikator konstruk diuji melalui parameter reliabilitas komposit yang memenuhi batas keterandalan statistik secara optimal. Analisis mendalam mengenai dinamika komunikasi menunjukkan adanya kesinambungan yang konsisten antara ekspektasi pesan dengan respon kognitif audiens sasaran. Secara metodologis setiap indikator konstruk diuji melalui parameter reliabilitas komposit yang memenuhi batas keterandalan statistik secara optimal. Analisis mendalam mengenai dinamika komunikasi menunjukkan adanya kesinambungan yang konsisten antara ekspektasi pesan dengan respon kognitif audiens sasaran. Secara metodologis setiap indikator konstruk diuji melalui parameter reliabilitas komposit yang memenuhi batas keterandalan statistik secara optimal. Analisis mendalam mengenai dinamika komunikasi menunjukkan adanya kesinambungan yang konsisten antara ekspektasi pesan dengan respon kognitif audiens sasaran. Secara metodologis setiap indikator konstruk diuji melalui parameter reliabilitas komposit yang memenuhi batas keterandalan statistik secara optimal.</w:t>
+        <w:t>Analisis mendalam mengenai dinamika komunikasi menunjukkan adanya kesinambungan yang konsisten antara ekspektasi pesan dengan respon kognitif audiens sasaran. Secara metodologis setiap indikator konstruk diuji melalui parameter reliabilitas komposit yang memenuhi batas keterandalan statistik secara optimal. Analisis mendalam mengenai dinamika komunikasi menunjukkan adanya kesinambungan yang konsisten antara ekspektasi pesan dengan respon kognitif audiens sasaran. Secara metodologis setiap indikator konstruk diuji melalui parameter reliabilitas komposit yang memenuhi batas keterandalan statistik secara optimal. Analisis mendalam mengenai dinamika komunikasi menunjukkan adanya kesinambungan yang konsisten antara ekspektasi pesan dengan respon kognitif audiens sasaran. Secara metodologis setiap indikator konstruk diuji melalui parameter reliabilitas komposit yang memenuhi batas keterandalan statistik secara optimal. Analisis mendalam mengenai dinamika komunikasi menunjukkan adanya kesinambungan yang konsisten antara ekspektasi pesan dengan respon kognitif audiens sasaran. Secara metodologis setiap indikator konstruk diuji melalui parameter reliabilitas komposit yang memenuhi batas keterandalan statistik secara optimal. Analisis mendalam mengenai dinamika komunikasi menunjukkan adanya kesinambungan yang konsisten antara ekspektasi pesan dengan respon kognitif audiens sasaran. Secara metodologis setiap indikator konstruk diuji melalui parameter reliabilitas komposit yang memenuhi batas keterandalan statistik secara optimal. Analisis mendalam mengenai dinamika komunikasi menunjukkan adanya kesinambungan yang konsisten antara ekspektasi pesan dengan respon kognitif audiens sasaran. Secara metodologis setiap indikator konstruk diuji melalui parameter reliabilitas komposit yang memenuhi batas keterandalan statistik secara optimal. Analisis mendalam mengenai dinamika komunikasi menunjukkan adanya kesinambungan yang konsisten antara ekspektasi pesan dengan respon kognitif audiens sasaran. Secara metodologis setiap indikator konstruk diuji melalui parameter reliabilitas komposit yang memenuhi batas keterandalan statistik secara optimal. Analisis mendalam mengenai dinamika komunikasi menunjukkan adanya kesinambungan yang konsisten antara ekspektasi pesan dengan respon kognitif audiens sasaran. Secara metodologis setiap indikator konstruk diuji melalui parameter reliabilitas komposit yang memenuhi batas keterandalan statistik secara optimal. Analisis mendalam mengenai dinamika komunikasi menunjukkan adanya kesinambungan yang konsisten antara ekspektasi pesan dengan respon kognitif audiens sasaran. Secara metodologis setiap indikator konstruk diuji melalui parameter reliabilitas komposit yang memenuhi batas keterandalan statistik secara optimal. Analisis mendalam mengenai dinamika komunikasi menunjukkan adanya kesinambungan yang konsisten antara ekspektasi pesan dengan respon kognitif audiens sasaran. Secara metodologis setiap indikator konstruk diuji melalui parameter reliabilitas komposit yang memenuhi batas keterandalan statistik secara optimal. Analisis mendalam mengenai dinamika komunikasi menunjukkan adanya kesinambungan yang konsisten antara ekspektasi pesan dengan respon kognitif audiens sasaran. Secara metodologis setiap indikator konstruk diuji melalui parameter reliabilitas komposit yang memenuhi batas keterandalan statistik secara optimal. Analisis mendalam mengenai dinamika komunikasi menunjukkan adanya kesinambungan yang konsisten antara ekspektasi pesan dengan respon kognitif audiens sasaran. Secara metodologis setiap indikator konstruk diuji melalui parameter reliabilitas komposit yang memenuhi batas keterandalan statistik secara optimal.</w:t>
       </w:r>
     </w:p>
     <w:p>
@@ -1398,7 +1398,7 @@
           <w:rFonts w:ascii="Times New Roman" w:hAnsi="Times New Roman"/>
           <w:sz w:val="24"/>
         </w:rPr>
-        <w:t>Analisis mendalam mengenai dinamika komunikasi menunjukkan adanya kesinambungan yang konsisten antara ekspektasi pesan dengan respon kognitif audiens sasaran. Secara metodologis setiap indikator konstruk diuji melalui parameter reliabilitas komposit yang memenuhi batas keterandalan statistik secara optimal. Analisis mendalam mengenai dinamika komunikasi menunjukkan adanya kesinambungan yang konsisten antara ekspektasi pesan dengan respon kognitif audiens sasaran. Secara metodologis setiap indikator konstruk diuji melalui parameter reliabilitas komposit yang memenuhi batas keterandalan statistik secara optimal. Analisis mendalam mengenai dinamika komunikasi menunjukkan adanya kesinambungan yang konsisten antara ekspektasi pesan dengan respon kognitif audiens sasaran. Secara metodologis setiap indikator konstruk diuji melalui parameter reliabilitas komposit yang memenuhi batas keterandalan statistik secara optimal. Analisis mendalam mengenai dinamika komunikasi menunjukkan adanya kesinambungan yang konsisten antara ekspektasi pesan dengan respon kognitif audiens sasaran. Secara metodologis setiap indikator konstruk diuji melalui parameter reliabilitas komposit yang memenuhi batas keterandalan statistik secara optimal. Analisis mendalam mengenai dinamika komunikasi menunjukkan adanya kesinambungan yang konsisten antara ekspektasi pesan dengan respon kognitif audiens sasaran. Secara metodologis setiap indikator konstruk diuji melalui parameter reliabilitas komposit yang memenuhi batas keterandalan statistik secara optimal. Analisis mendalam mengenai dinamika komunikasi menunjukkan adanya kesinambungan yang konsisten antara ekspektasi pesan dengan respon kognitif audiens sasaran. Secara metodologis setiap indikator konstruk diuji melalui parameter reliabilitas komposit yang memenuhi batas keterandalan statistik secara optimal. Analisis mendalam mengenai dinamika komunikasi menunjukkan adanya kesinambungan yang konsisten antara ekspektasi pesan dengan respon kognitif audiens sasaran. Secara metodologis setiap indikator konstruk diuji melalui parameter reliabilitas komposit yang memenuhi batas keterandalan statistik secara optimal. Analisis mendalam mengenai dinamika komunikasi menunjukkan adanya kesinambungan yang konsisten antara ekspektasi pesan dengan respon kognitif audiens sasaran. Secara metodologis setiap indikator konstruk diuji melalui parameter reliabilitas komposit yang memenuhi batas keterandalan statistik secara optimal. Analisis mendalam mengenai dinamika komunikasi menunjukkan adanya kesinambungan yang konsisten antara ekspektasi pesan dengan respon kognitif audiens sasaran. Secara metodologis setiap indikator konstruk diuji melalui parameter reliabilitas komposit yang memenuhi batas keterandalan statistik secara optimal. Analisis mendalam mengenai dinamika komunikasi menunjukkan adanya kesinambungan yang konsisten antara ekspektasi pesan dengan respon kognitif audiens sasaran. Secara metodologis setiap indikator konstruk diuji melalui parameter reliabilitas komposit yang memenuhi batas keterandalan statistik secara optimal. Analisis mendalam mengenai dinamika komunikasi menunjukkan adanya kesinambungan yang konsisten antara ekspektasi pesan dengan respon kognitif audiens sasaran. Secara metodologis setiap indikator konstruk diuji melalui parameter reliabilitas komposit yang memenuhi batas keterandalan statistik secara optimal. Analisis mendalam mengenai dinamika komunikasi menunjukkan adanya kesinambungan yang konsisten antara ekspektasi pesan dengan respon kognitif audiens sasaran. Secara metodologis setiap indikator konstruk diuji melalui parameter reliabilitas komposit yang memenuhi batas keterandalan statistik secara optimal. Analisis mendalam mengenai dinamika komunikasi menunjukkan adanya kesinambungan yang konsisten antara ekspektasi pesan dengan respon kognitif audiens sasaran. Secara metodologis setiap indikator konstruk diuji melalui parameter reliabilitas komposit yang memenuhi batas keterandalan statistik secara optimal. Analisis mendalam mengenai dinamika komunikasi menunjukkan adanya kesinambungan yang konsisten antara ekspektasi pesan dengan respon kognitif audiens sasaran. Secara metodologis setiap indikator konstruk diuji melalui parameter reliabilitas komposit yang memenuhi batas keterandalan statistik secara optimal. Analisis mendalam mengenai dinamika komunikasi menunjukkan adanya kesinambungan yang konsisten antara ekspektasi pesan dengan respon kognitif audiens sasaran. Secara metodologis setiap indikator konstruk diuji melalui parameter reliabilitas komposit yang memenuhi batas keterandalan statistik secara optimal.</w:t>
+        <w:t>Analisis mendalam mengenai dinamika komunikasi menunjukkan adanya kesinambungan yang konsisten antara ekspektasi pesan dengan respon kognitif audiens sasaran. Secara metodologis setiap indikator konstruk diuji melalui parameter reliabilitas komposit yang memenuhi batas keterandalan statistik secara optimal. Analisis mendalam mengenai dinamika komunikasi menunjukkan adanya kesinambungan yang konsisten antara ekspektasi pesan dengan respon kognitif audiens sasaran. Secara metodologis setiap indikator konstruk diuji melalui parameter reliabilitas komposit yang memenuhi batas keterandalan statistik secara optimal. Analisis mendalam mengenai dinamika komunikasi menunjukkan adanya kesinambungan yang konsisten antara ekspektasi pesan dengan respon kognitif audiens sasaran. Secara metodologis setiap indikator konstruk diuji melalui parameter reliabilitas komposit yang memenuhi batas keterandalan statistik secara optimal. Analisis mendalam mengenai dinamika komunikasi menunjukkan adanya kesinambungan yang konsisten antara ekspektasi pesan dengan respon kognitif audiens sasaran. Secara metodologis setiap indikator konstruk diuji melalui parameter reliabilitas komposit yang memenuhi batas keterandalan statistik secara optimal. Analisis mendalam mengenai dinamika komunikasi menunjukkan adanya kesinambungan yang konsisten antara ekspektasi pesan dengan respon kognitif audiens sasaran. Secara metodologis setiap indikator konstruk diuji melalui parameter reliabilitas komposit yang memenuhi batas keterandalan statistik secara optimal. Analisis mendalam mengenai dinamika komunikasi menunjukkan adanya kesinambungan yang konsisten antara ekspektasi pesan dengan respon kognitif audiens sasaran. Secara metodologis setiap indikator konstruk diuji melalui parameter reliabilitas komposit yang memenuhi batas keterandalan statistik secara optimal. Analisis mendalam mengenai dinamika komunikasi menunjukkan adanya kesinambungan yang konsisten antara ekspektasi pesan dengan respon kognitif audiens sasaran. Secara metodologis setiap indikator konstruk diuji melalui parameter reliabilitas komposit yang memenuhi batas keterandalan statistik secara optimal. Analisis mendalam mengenai dinamika komunikasi menunjukkan adanya kesinambungan yang konsisten antara ekspektasi pesan dengan respon kognitif audiens sasaran. Secara metodologis setiap indikator konstruk diuji melalui parameter reliabilitas komposit yang memenuhi batas keterandalan statistik secara optimal. Analisis mendalam mengenai dinamika komunikasi menunjukkan adanya kesinambungan yang konsisten antara ekspektasi pesan dengan respon kognitif audiens sasaran. Secara metodologis setiap indikator konstruk diuji melalui parameter reliabilitas komposit yang memenuhi batas keterandalan statistik secara optimal. Analisis mendalam mengenai dinamika komunikasi menunjukkan adanya kesinambungan yang konsisten antara ekspektasi pesan dengan respon kognitif audiens sasaran. Secara metodologis setiap indikator konstruk diuji melalui parameter reliabilitas komposit yang memenuhi batas keterandalan statistik secara optimal. Analisis mendalam mengenai dinamika komunikasi menunjukkan adanya kesinambungan yang konsisten antara ekspektasi pesan dengan respon kognitif audiens sasaran. Secara metodologis setiap indikator konstruk diuji melalui parameter reliabilitas komposit yang memenuhi batas keterandalan statistik secara optimal. Analisis mendalam mengenai dinamika komunikasi menunjukkan adanya kesinambungan yang konsisten antara ekspektasi pesan dengan respon kognitif audiens sasaran. Secara metodologis setiap indikator konstruk diuji melalui parameter reliabilitas komposit yang memenuhi batas keterandalan statistik secara optimal.</w:t>
       </w:r>
     </w:p>
     <w:p>
@@ -1411,7 +1411,7 @@
           <w:rFonts w:ascii="Times New Roman" w:hAnsi="Times New Roman"/>
           <w:sz w:val="24"/>
         </w:rPr>
-        <w:t>Analisis mendalam mengenai dinamika komunikasi menunjukkan adanya kesinambungan yang konsisten antara ekspektasi pesan dengan respon kognitif audiens sasaran. Secara metodologis setiap indikator konstruk diuji melalui parameter reliabilitas komposit yang memenuhi batas keterandalan statistik secara optimal. Analisis mendalam mengenai dinamika komunikasi menunjukkan adanya kesinambungan yang konsisten antara ekspektasi pesan dengan respon kognitif audiens sasaran. Secara metodologis setiap indikator konstruk diuji melalui parameter reliabilitas komposit yang memenuhi batas keterandalan statistik secara optimal. Analisis mendalam mengenai dinamika komunikasi menunjukkan adanya kesinambungan yang konsisten antara ekspektasi pesan dengan respon kognitif audiens sasaran. Secara metodologis setiap indikator konstruk diuji melalui parameter reliabilitas komposit yang memenuhi batas keterandalan statistik secara optimal. Analisis mendalam mengenai dinamika komunikasi menunjukkan adanya kesinambungan yang konsisten antara ekspektasi pesan dengan respon kognitif audiens sasaran. Secara metodologis setiap indikator konstruk diuji melalui parameter reliabilitas komposit yang memenuhi batas keterandalan statistik secara optimal. Analisis mendalam mengenai dinamika komunikasi menunjukkan adanya kesinambungan yang konsisten antara ekspektasi pesan dengan respon kognitif audiens sasaran. Secara metodologis setiap indikator konstruk diuji melalui parameter reliabilitas komposit yang memenuhi batas keterandalan statistik secara optimal. Analisis mendalam mengenai dinamika komunikasi menunjukkan adanya kesinambungan yang konsisten antara ekspektasi pesan dengan respon kognitif audiens sasaran. Secara metodologis setiap indikator konstruk diuji melalui parameter reliabilitas komposit yang memenuhi batas keterandalan statistik secara optimal. Analisis mendalam mengenai dinamika komunikasi menunjukkan adanya kesinambungan yang konsisten antara ekspektasi pesan dengan respon kognitif audiens sasaran. Secara metodologis setiap indikator konstruk diuji melalui parameter reliabilitas komposit yang memenuhi batas keterandalan statistik secara optimal. Analisis mendalam mengenai dinamika komunikasi menunjukkan adanya kesinambungan yang konsisten antara ekspektasi pesan dengan respon kognitif audiens sasaran. Secara metodologis setiap indikator konstruk diuji melalui parameter reliabilitas komposit yang memenuhi batas keterandalan statistik secara optimal. Analisis mendalam mengenai dinamika komunikasi menunjukkan adanya kesinambungan yang konsisten antara ekspektasi pesan dengan respon kognitif audiens sasaran. Secara metodologis setiap indikator konstruk diuji melalui parameter reliabilitas komposit yang memenuhi batas keterandalan statistik secara optimal. Analisis mendalam mengenai dinamika komunikasi menunjukkan adanya kesinambungan yang konsisten antara ekspektasi pesan dengan respon kognitif audiens sasaran. Secara metodologis setiap indikator konstruk diuji melalui parameter reliabilitas komposit yang memenuhi batas keterandalan statistik secara optimal. Analisis mendalam mengenai dinamika komunikasi menunjukkan adanya kesinambungan yang konsisten antara ekspektasi pesan dengan respon kognitif audiens sasaran. Secara metodologis setiap indikator konstruk diuji melalui parameter reliabilitas komposit yang memenuhi batas keterandalan statistik secara optimal. Analisis mendalam mengenai dinamika komunikasi menunjukkan adanya kesinambungan yang konsisten antara ekspektasi pesan dengan respon kognitif audiens sasaran. Secara metodologis setiap indikator konstruk diuji melalui parameter reliabilitas komposit yang memenuhi batas keterandalan statistik secara optimal. Analisis mendalam mengenai dinamika komunikasi menunjukkan adanya kesinambungan yang konsisten antara ekspektasi pesan dengan respon kognitif audiens sasaran. Secara metodologis setiap indikator konstruk diuji melalui parameter reliabilitas komposit yang memenuhi batas keterandalan statistik secara optimal. Analisis mendalam mengenai dinamika komunikasi menunjukkan adanya kesinambungan yang konsisten antara ekspektasi pesan dengan respon kognitif audiens sasaran. Secara metodologis setiap indikator konstruk diuji melalui parameter reliabilitas komposit yang memenuhi batas keterandalan statistik secara optimal. Analisis mendalam mengenai dinamika komunikasi menunjukkan adanya kesinambungan yang konsisten antara ekspektasi pesan dengan respon kognitif audiens sasaran. Secara metodologis setiap indikator konstruk diuji melalui parameter reliabilitas komposit yang memenuhi batas keterandalan statistik secara optimal.</w:t>
+        <w:t>Analisis mendalam mengenai dinamika komunikasi menunjukkan adanya kesinambungan yang konsisten antara ekspektasi pesan dengan respon kognitif audiens sasaran. Secara metodologis setiap indikator konstruk diuji melalui parameter reliabilitas komposit yang memenuhi batas keterandalan statistik secara optimal. Analisis mendalam mengenai dinamika komunikasi menunjukkan adanya kesinambungan yang konsisten antara ekspektasi pesan dengan respon kognitif audiens sasaran. Secara metodologis setiap indikator konstruk diuji melalui parameter reliabilitas komposit yang memenuhi batas keterandalan statistik secara optimal. Analisis mendalam mengenai dinamika komunikasi menunjukkan adanya kesinambungan yang konsisten antara ekspektasi pesan dengan respon kognitif audiens sasaran. Secara metodologis setiap indikator konstruk diuji melalui parameter reliabilitas komposit yang memenuhi batas keterandalan statistik secara optimal. Analisis mendalam mengenai dinamika komunikasi menunjukkan adanya kesinambungan yang konsisten antara ekspektasi pesan dengan respon kognitif audiens sasaran. Secara metodologis setiap indikator konstruk diuji melalui parameter reliabilitas komposit yang memenuhi batas keterandalan statistik secara optimal. Analisis mendalam mengenai dinamika komunikasi menunjukkan adanya kesinambungan yang konsisten antara ekspektasi pesan dengan respon kognitif audiens sasaran. Secara metodologis setiap indikator konstruk diuji melalui parameter reliabilitas komposit yang memenuhi batas keterandalan statistik secara optimal. Analisis mendalam mengenai dinamika komunikasi menunjukkan adanya kesinambungan yang konsisten antara ekspektasi pesan dengan respon kognitif audiens sasaran. Secara metodologis setiap indikator konstruk diuji melalui parameter reliabilitas komposit yang memenuhi batas keterandalan statistik secara optimal. Analisis mendalam mengenai dinamika komunikasi menunjukkan adanya kesinambungan yang konsisten antara ekspektasi pesan dengan respon kognitif audiens sasaran. Secara metodologis setiap indikator konstruk diuji melalui parameter reliabilitas komposit yang memenuhi batas keterandalan statistik secara optimal. Analisis mendalam mengenai dinamika komunikasi menunjukkan adanya kesinambungan yang konsisten antara ekspektasi pesan dengan respon kognitif audiens sasaran. Secara metodologis setiap indikator konstruk diuji melalui parameter reliabilitas komposit yang memenuhi batas keterandalan statistik secara optimal. Analisis mendalam mengenai dinamika komunikasi menunjukkan adanya kesinambungan yang konsisten antara ekspektasi pesan dengan respon kognitif audiens sasaran. Secara metodologis setiap indikator konstruk diuji melalui parameter reliabilitas komposit yang memenuhi batas keterandalan statistik secara optimal. Analisis mendalam mengenai dinamika komunikasi menunjukkan adanya kesinambungan yang konsisten antara ekspektasi pesan dengan respon kognitif audiens sasaran. Secara metodologis setiap indikator konstruk diuji melalui parameter reliabilitas komposit yang memenuhi batas keterandalan statistik secara optimal. Analisis mendalam mengenai dinamika komunikasi menunjukkan adanya kesinambungan yang konsisten antara ekspektasi pesan dengan respon kognitif audiens sasaran. Secara metodologis setiap indikator konstruk diuji melalui parameter reliabilitas komposit yang memenuhi batas keterandalan statistik secara optimal. Analisis mendalam mengenai dinamika komunikasi menunjukkan adanya kesinambungan yang konsisten antara ekspektasi pesan dengan respon kognitif audiens sasaran. Secara metodologis setiap indikator konstruk diuji melalui parameter reliabilitas komposit yang memenuhi batas keterandalan statistik secara optimal.</w:t>
       </w:r>
     </w:p>
     <w:p>
@@ -1424,7 +1424,7 @@
           <w:rFonts w:ascii="Times New Roman" w:hAnsi="Times New Roman"/>
           <w:sz w:val="24"/>
         </w:rPr>
-        <w:t>Analisis mendalam mengenai dinamika komunikasi menunjukkan adanya kesinambungan yang konsisten antara ekspektasi pesan dengan respon kognitif audiens sasaran. Secara metodologis setiap indikator konstruk diuji melalui parameter reliabilitas komposit yang memenuhi batas keterandalan statistik secara optimal. Analisis mendalam mengenai dinamika komunikasi menunjukkan adanya kesinambungan yang konsisten antara ekspektasi pesan dengan respon kognitif audiens sasaran. Secara metodologis setiap indikator konstruk diuji melalui parameter reliabilitas komposit yang memenuhi batas keterandalan statistik secara optimal. Analisis mendalam mengenai dinamika komunikasi menunjukkan adanya kesinambungan yang konsisten antara ekspektasi pesan dengan respon kognitif audiens sasaran. Secara metodologis setiap indikator konstruk diuji melalui parameter reliabilitas komposit yang memenuhi batas keterandalan statistik secara optimal. Analisis mendalam mengenai dinamika komunikasi menunjukkan adanya kesinambungan yang konsisten antara ekspektasi pesan dengan respon kognitif audiens sasaran. Secara metodologis setiap indikator konstruk diuji melalui parameter reliabilitas komposit yang memenuhi batas keterandalan statistik secara optimal. Analisis mendalam mengenai dinamika komunikasi menunjukkan adanya kesinambungan yang konsisten antara ekspektasi pesan dengan respon kognitif audiens sasaran. Secara metodologis setiap indikator konstruk diuji melalui parameter reliabilitas komposit yang memenuhi batas keterandalan statistik secara optimal. Analisis mendalam mengenai dinamika komunikasi menunjukkan adanya kesinambungan yang konsisten antara ekspektasi pesan dengan respon kognitif audiens sasaran. Secara metodologis setiap indikator konstruk diuji melalui parameter reliabilitas komposit yang memenuhi batas keterandalan statistik secara optimal. Analisis mendalam mengenai dinamika komunikasi menunjukkan adanya kesinambungan yang konsisten antara ekspektasi pesan dengan respon kognitif audiens sasaran. Secara metodologis setiap indikator konstruk diuji melalui parameter reliabilitas komposit yang memenuhi batas keterandalan statistik secara optimal. Analisis mendalam mengenai dinamika komunikasi menunjukkan adanya kesinambungan yang konsisten antara ekspektasi pesan dengan respon kognitif audiens sasaran. Secara metodologis setiap indikator konstruk diuji melalui parameter reliabilitas komposit yang memenuhi batas keterandalan statistik secara optimal. Analisis mendalam mengenai dinamika komunikasi menunjukkan adanya kesinambungan yang konsisten antara ekspektasi pesan dengan respon kognitif audiens sasaran. Secara metodologis setiap indikator konstruk diuji melalui parameter reliabilitas komposit yang memenuhi batas keterandalan statistik secara optimal. Analisis mendalam mengenai dinamika komunikasi menunjukkan adanya kesinambungan yang konsisten antara ekspektasi pesan dengan respon kognitif audiens sasaran. Secara metodologis setiap indikator konstruk diuji melalui parameter reliabilitas komposit yang memenuhi batas keterandalan statistik secara optimal. Analisis mendalam mengenai dinamika komunikasi menunjukkan adanya kesinambungan yang konsisten antara ekspektasi pesan dengan respon kognitif audiens sasaran. Secara metodologis setiap indikator konstruk diuji melalui parameter reliabilitas komposit yang memenuhi batas keterandalan statistik secara optimal. Analisis mendalam mengenai dinamika komunikasi menunjukkan adanya kesinambungan yang konsisten antara ekspektasi pesan dengan respon kognitif audiens sasaran. Secara metodologis setiap indikator konstruk diuji melalui parameter reliabilitas komposit yang memenuhi batas keterandalan statistik secara optimal. Analisis mendalam mengenai dinamika komunikasi menunjukkan adanya kesinambungan yang konsisten antara ekspektasi pesan dengan respon kognitif audiens sasaran. Secara metodologis setiap indikator konstruk diuji melalui parameter reliabilitas komposit yang memenuhi batas keterandalan statistik secara optimal. Analisis mendalam mengenai dinamika komunikasi menunjukkan adanya kesinambungan yang konsisten antara ekspektasi pesan dengan respon kognitif audiens sasaran. Secara metodologis setiap indikator konstruk diuji melalui parameter reliabilitas komposit yang memenuhi batas keterandalan statistik secara optimal. Analisis mendalam mengenai dinamika komunikasi menunjukkan adanya kesinambungan yang konsisten antara ekspektasi pesan dengan respon kognitif audiens sasaran. Secara metodologis setiap indikator konstruk diuji melalui parameter reliabilitas komposit yang memenuhi batas keterandalan statistik secara optimal.</w:t>
+        <w:t>Analisis mendalam mengenai dinamika komunikasi menunjukkan adanya kesinambungan yang konsisten antara ekspektasi pesan dengan respon kognitif audiens sasaran. Secara metodologis setiap indikator konstruk diuji melalui parameter reliabilitas komposit yang memenuhi batas keterandalan statistik secara optimal. Analisis mendalam mengenai dinamika komunikasi menunjukkan adanya kesinambungan yang konsisten antara ekspektasi pesan dengan respon kognitif audiens sasaran. Secara metodologis setiap indikator konstruk diuji melalui parameter reliabilitas komposit yang memenuhi batas keterandalan statistik secara optimal. Analisis mendalam mengenai dinamika komunikasi menunjukkan adanya kesinambungan yang konsisten antara ekspektasi pesan dengan respon kognitif audiens sasaran. Secara metodologis setiap indikator konstruk diuji melalui parameter reliabilitas komposit yang memenuhi batas keterandalan statistik secara optimal. Analisis mendalam mengenai dinamika komunikasi menunjukkan adanya kesinambungan yang konsisten antara ekspektasi pesan dengan respon kognitif audiens sasaran. Secara metodologis setiap indikator konstruk diuji melalui parameter reliabilitas komposit yang memenuhi batas keterandalan statistik secara optimal. Analisis mendalam mengenai dinamika komunikasi menunjukkan adanya kesinambungan yang konsisten antara ekspektasi pesan dengan respon kognitif audiens sasaran. Secara metodologis setiap indikator konstruk diuji melalui parameter reliabilitas komposit yang memenuhi batas keterandalan statistik secara optimal. Analisis mendalam mengenai dinamika komunikasi menunjukkan adanya kesinambungan yang konsisten antara ekspektasi pesan dengan respon kognitif audiens sasaran. Secara metodologis setiap indikator konstruk diuji melalui parameter reliabilitas komposit yang memenuhi batas keterandalan statistik secara optimal. Analisis mendalam mengenai dinamika komunikasi menunjukkan adanya kesinambungan yang konsisten antara ekspektasi pesan dengan respon kognitif audiens sasaran. Secara metodologis setiap indikator konstruk diuji melalui parameter reliabilitas komposit yang memenuhi batas keterandalan statistik secara optimal. Analisis mendalam mengenai dinamika komunikasi menunjukkan adanya kesinambungan yang konsisten antara ekspektasi pesan dengan respon kognitif audiens sasaran. Secara metodologis setiap indikator konstruk diuji melalui parameter reliabilitas komposit yang memenuhi batas keterandalan statistik secara optimal. Analisis mendalam mengenai dinamika komunikasi menunjukkan adanya kesinambungan yang konsisten antara ekspektasi pesan dengan respon kognitif audiens sasaran. Secara metodologis setiap indikator konstruk diuji melalui parameter reliabilitas komposit yang memenuhi batas keterandalan statistik secara optimal. Analisis mendalam mengenai dinamika komunikasi menunjukkan adanya kesinambungan yang konsisten antara ekspektasi pesan dengan respon kognitif audiens sasaran. Secara metodologis setiap indikator konstruk diuji melalui parameter reliabilitas komposit yang memenuhi batas keterandalan statistik secara optimal. Analisis mendalam mengenai dinamika komunikasi menunjukkan adanya kesinambungan yang konsisten antara ekspektasi pesan dengan respon kognitif audiens sasaran. Secara metodologis setiap indikator konstruk diuji melalui parameter reliabilitas komposit yang memenuhi batas keterandalan statistik secara optimal. Analisis mendalam mengenai dinamika komunikasi menunjukkan adanya kesinambungan yang konsisten antara ekspektasi pesan dengan respon kognitif audiens sasaran. Secara metodologis setiap indikator konstruk diuji melalui parameter reliabilitas komposit yang memenuhi batas keterandalan statistik secara optimal.</w:t>
       </w:r>
     </w:p>
     <w:p>
@@ -1437,7 +1437,7 @@
           <w:rFonts w:ascii="Times New Roman" w:hAnsi="Times New Roman"/>
           <w:sz w:val="24"/>
         </w:rPr>
-        <w:t>Analisis mendalam mengenai dinamika komunikasi menunjukkan adanya kesinambungan yang konsisten antara ekspektasi pesan dengan respon kognitif audiens sasaran. Secara metodologis setiap indikator konstruk diuji melalui parameter reliabilitas komposit yang memenuhi batas keterandalan statistik secara optimal. Analisis mendalam mengenai dinamika komunikasi menunjukkan adanya kesinambungan yang konsisten antara ekspektasi pesan dengan respon kognitif audiens sasaran. Secara metodologis setiap indikator konstruk diuji melalui parameter reliabilitas komposit yang memenuhi batas keterandalan statistik secara optimal. Analisis mendalam mengenai dinamika komunikasi menunjukkan adanya kesinambungan yang konsisten antara ekspektasi pesan dengan respon kognitif audiens sasaran. Secara metodologis setiap indikator konstruk diuji melalui parameter reliabilitas komposit yang memenuhi batas keterandalan statistik secara optimal. Analisis mendalam mengenai dinamika komunikasi menunjukkan adanya kesinambungan yang konsisten antara ekspektasi pesan dengan respon kognitif audiens sasaran. Secara metodologis setiap indikator konstruk diuji melalui parameter reliabilitas komposit yang memenuhi batas keterandalan statistik secara optimal. Analisis mendalam mengenai dinamika komunikasi menunjukkan adanya kesinambungan yang konsisten antara ekspektasi pesan dengan respon kognitif audiens sasaran. Secara metodologis setiap indikator konstruk diuji melalui parameter reliabilitas komposit yang memenuhi batas keterandalan statistik secara optimal. Analisis mendalam mengenai dinamika komunikasi menunjukkan adanya kesinambungan yang konsisten antara ekspektasi pesan dengan respon kognitif audiens sasaran. Secara metodologis setiap indikator konstruk diuji melalui parameter reliabilitas komposit yang memenuhi batas keterandalan statistik secara optimal. Analisis mendalam mengenai dinamika komunikasi menunjukkan adanya kesinambungan yang konsisten antara ekspektasi pesan dengan respon kognitif audiens sasaran. Secara metodologis setiap indikator konstruk diuji melalui parameter reliabilitas komposit yang memenuhi batas keterandalan statistik secara optimal. Analisis mendalam mengenai dinamika komunikasi menunjukkan adanya kesinambungan yang konsisten antara ekspektasi pesan dengan respon kognitif audiens sasaran. Secara metodologis setiap indikator konstruk diuji melalui parameter reliabilitas komposit yang memenuhi batas keterandalan statistik secara optimal. Analisis mendalam mengenai dinamika komunikasi menunjukkan adanya kesinambungan yang konsisten antara ekspektasi pesan dengan respon kognitif audiens sasaran. Secara metodologis setiap indikator konstruk diuji melalui parameter reliabilitas komposit yang memenuhi batas keterandalan statistik secara optimal. Analisis mendalam mengenai dinamika komunikasi menunjukkan adanya kesinambungan yang konsisten antara ekspektasi pesan dengan respon kognitif audiens sasaran. Secara metodologis setiap indikator konstruk diuji melalui parameter reliabilitas komposit yang memenuhi batas keterandalan statistik secara optimal. Analisis mendalam mengenai dinamika komunikasi menunjukkan adanya kesinambungan yang konsisten antara ekspektasi pesan dengan respon kognitif audiens sasaran. Secara metodologis setiap indikator konstruk diuji melalui parameter reliabilitas komposit yang memenuhi batas keterandalan statistik secara optimal. Analisis mendalam mengenai dinamika komunikasi menunjukkan adanya kesinambungan yang konsisten antara ekspektasi pesan dengan respon kognitif audiens sasaran. Secara metodologis setiap indikator konstruk diuji melalui parameter reliabilitas komposit yang memenuhi batas keterandalan statistik secara optimal. Analisis mendalam mengenai dinamika komunikasi menunjukkan adanya kesinambungan yang konsisten antara ekspektasi pesan dengan respon kognitif audiens sasaran. Secara metodologis setiap indikator konstruk diuji melalui parameter reliabilitas komposit yang memenuhi batas keterandalan statistik secara optimal. Analisis mendalam mengenai dinamika komunikasi menunjukkan adanya kesinambungan yang konsisten antara ekspektasi pesan dengan respon kognitif audiens sasaran. Secara metodologis setiap indikator konstruk diuji melalui parameter reliabilitas komposit yang memenuhi batas keterandalan statistik secara optimal. Analisis mendalam mengenai dinamika komunikasi menunjukkan adanya kesinambungan yang konsisten antara ekspektasi pesan dengan respon kognitif audiens sasaran. Secara metodologis setiap indikator konstruk diuji melalui parameter reliabilitas komposit yang memenuhi batas keterandalan statistik secara optimal.</w:t>
+        <w:t>Analisis mendalam mengenai dinamika komunikasi menunjukkan adanya kesinambungan yang konsisten antara ekspektasi pesan dengan respon kognitif audiens sasaran. Secara metodologis setiap indikator konstruk diuji melalui parameter reliabilitas komposit yang memenuhi batas keterandalan statistik secara optimal. Analisis mendalam mengenai dinamika komunikasi menunjukkan adanya kesinambungan yang konsisten antara ekspektasi pesan dengan respon kognitif audiens sasaran. Secara metodologis setiap indikator konstruk diuji melalui parameter reliabilitas komposit yang memenuhi batas keterandalan statistik secara optimal. Analisis mendalam mengenai dinamika komunikasi menunjukkan adanya kesinambungan yang konsisten antara ekspektasi pesan dengan respon kognitif audiens sasaran. Secara metodologis setiap indikator konstruk diuji melalui parameter reliabilitas komposit yang memenuhi batas keterandalan statistik secara optimal. Analisis mendalam mengenai dinamika komunikasi menunjukkan adanya kesinambungan yang konsisten antara ekspektasi pesan dengan respon kognitif audiens sasaran. Secara metodologis setiap indikator konstruk diuji melalui parameter reliabilitas komposit yang memenuhi batas keterandalan statistik secara optimal. Analisis mendalam mengenai dinamika komunikasi menunjukkan adanya kesinambungan yang konsisten antara ekspektasi pesan dengan respon kognitif audiens sasaran. Secara metodologis setiap indikator konstruk diuji melalui parameter reliabilitas komposit yang memenuhi batas keterandalan statistik secara optimal. Analisis mendalam mengenai dinamika komunikasi menunjukkan adanya kesinambungan yang konsisten antara ekspektasi pesan dengan respon kognitif audiens sasaran. Secara metodologis setiap indikator konstruk diuji melalui parameter reliabilitas komposit yang memenuhi batas keterandalan statistik secara optimal. Analisis mendalam mengenai dinamika komunikasi menunjukkan adanya kesinambungan yang konsisten antara ekspektasi pesan dengan respon kognitif audiens sasaran. Secara metodologis setiap indikator konstruk diuji melalui parameter reliabilitas komposit yang memenuhi batas keterandalan statistik secara optimal. Analisis mendalam mengenai dinamika komunikasi menunjukkan adanya kesinambungan yang konsisten antara ekspektasi pesan dengan respon kognitif audiens sasaran. Secara metodologis setiap indikator konstruk diuji melalui parameter reliabilitas komposit yang memenuhi batas keterandalan statistik secara optimal. Analisis mendalam mengenai dinamika komunikasi menunjukkan adanya kesinambungan yang konsisten antara ekspektasi pesan dengan respon kognitif audiens sasaran. Secara metodologis setiap indikator konstruk diuji melalui parameter reliabilitas komposit yang memenuhi batas keterandalan statistik secara optimal. Analisis mendalam mengenai dinamika komunikasi menunjukkan adanya kesinambungan yang konsisten antara ekspektasi pesan dengan respon kognitif audiens sasaran. Secara metodologis setiap indikator konstruk diuji melalui parameter reliabilitas komposit yang memenuhi batas keterandalan statistik secara optimal. Analisis mendalam mengenai dinamika komunikasi menunjukkan adanya kesinambungan yang konsisten antara ekspektasi pesan dengan respon kognitif audiens sasaran. Secara metodologis setiap indikator konstruk diuji melalui parameter reliabilitas komposit yang memenuhi batas keterandalan statistik secara optimal. Analisis mendalam mengenai dinamika komunikasi menunjukkan adanya kesinambungan yang konsisten antara ekspektasi pesan dengan respon kognitif audiens sasaran. Secara metodologis setiap indikator konstruk diuji melalui parameter reliabilitas komposit yang memenuhi batas keterandalan statistik secara optimal.</w:t>
       </w:r>
     </w:p>
     <w:p>
@@ -1450,7 +1450,7 @@
           <w:rFonts w:ascii="Times New Roman" w:hAnsi="Times New Roman"/>
           <w:sz w:val="24"/>
         </w:rPr>
-        <w:t>Analisis mendalam mengenai dinamika komunikasi menunjukkan adanya kesinambungan yang konsisten antara ekspektasi pesan dengan respon kognitif audiens sasaran. Secara metodologis setiap indikator konstruk diuji melalui parameter reliabilitas komposit yang memenuhi batas keterandalan statistik secara optimal. Analisis mendalam mengenai dinamika komunikasi menunjukkan adanya kesinambungan yang konsisten antara ekspektasi pesan dengan respon kognitif audiens sasaran. Secara metodologis setiap indikator konstruk diuji melalui parameter reliabilitas komposit yang memenuhi batas keterandalan statistik secara optimal. Analisis mendalam mengenai dinamika komunikasi menunjukkan adanya kesinambungan yang konsisten antara ekspektasi pesan dengan respon kognitif audiens sasaran. Secara metodologis setiap indikator konstruk diuji melalui parameter reliabilitas komposit yang memenuhi batas keterandalan statistik secara optimal. Analisis mendalam mengenai dinamika komunikasi menunjukkan adanya kesinambungan yang konsisten antara ekspektasi pesan dengan respon kognitif audiens sasaran. Secara metodologis setiap indikator konstruk diuji melalui parameter reliabilitas komposit yang memenuhi batas keterandalan statistik secara optimal. Analisis mendalam mengenai dinamika komunikasi menunjukkan adanya kesinambungan yang konsisten antara ekspektasi pesan dengan respon kognitif audiens sasaran. Secara metodologis setiap indikator konstruk diuji melalui parameter reliabilitas komposit yang memenuhi batas keterandalan statistik secara optimal. Analisis mendalam mengenai dinamika komunikasi menunjukkan adanya kesinambungan yang konsisten antara ekspektasi pesan dengan respon kognitif audiens sasaran. Secara metodologis setiap indikator konstruk diuji melalui parameter reliabilitas komposit yang memenuhi batas keterandalan statistik secara optimal. Analisis mendalam mengenai dinamika komunikasi menunjukkan adanya kesinambungan yang konsisten antara ekspektasi pesan dengan respon kognitif audiens sasaran. Secara metodologis setiap indikator konstruk diuji melalui parameter reliabilitas komposit yang memenuhi batas keterandalan statistik secara optimal. Analisis mendalam mengenai dinamika komunikasi menunjukkan adanya kesinambungan yang konsisten antara ekspektasi pesan dengan respon kognitif audiens sasaran. Secara metodologis setiap indikator konstruk diuji melalui parameter reliabilitas komposit yang memenuhi batas keterandalan statistik secara optimal. Analisis mendalam mengenai dinamika komunikasi menunjukkan adanya kesinambungan yang konsisten antara ekspektasi pesan dengan respon kognitif audiens sasaran. Secara metodologis setiap indikator konstruk diuji melalui parameter reliabilitas komposit yang memenuhi batas keterandalan statistik secara optimal. Analisis mendalam mengenai dinamika komunikasi menunjukkan adanya kesinambungan yang konsisten antara ekspektasi pesan dengan respon kognitif audiens sasaran. Secara metodologis setiap indikator konstruk diuji melalui parameter reliabilitas komposit yang memenuhi batas keterandalan statistik secara optimal. Analisis mendalam mengenai dinamika komunikasi menunjukkan adanya kesinambungan yang konsisten antara ekspektasi pesan dengan respon kognitif audiens sasaran. Secara metodologis setiap indikator konstruk diuji melalui parameter reliabilitas komposit yang memenuhi batas keterandalan statistik secara optimal. Analisis mendalam mengenai dinamika komunikasi menunjukkan adanya kesinambungan yang konsisten antara ekspektasi pesan dengan respon kognitif audiens sasaran. Secara metodologis setiap indikator konstruk diuji melalui parameter reliabilitas komposit yang memenuhi batas keterandalan statistik secara optimal. Analisis mendalam mengenai dinamika komunikasi menunjukkan adanya kesinambungan yang konsisten antara ekspektasi pesan dengan respon kognitif audiens sasaran. Secara metodologis setiap indikator konstruk diuji melalui parameter reliabilitas komposit yang memenuhi batas keterandalan statistik secara optimal. Analisis mendalam mengenai dinamika komunikasi menunjukkan adanya kesinambungan yang konsisten antara ekspektasi pesan dengan respon kognitif audiens sasaran. Secara metodologis setiap indikator konstruk diuji melalui parameter reliabilitas komposit yang memenuhi batas keterandalan statistik secara optimal. Analisis mendalam mengenai dinamika komunikasi menunjukkan adanya kesinambungan yang konsisten antara ekspektasi pesan dengan respon kognitif audiens sasaran. Secara metodologis setiap indikator konstruk diuji melalui parameter reliabilitas komposit yang memenuhi batas keterandalan statistik secara optimal.</w:t>
+        <w:t>Analisis mendalam mengenai dinamika komunikasi menunjukkan adanya kesinambungan yang konsisten antara ekspektasi pesan dengan respon kognitif audiens sasaran. Secara metodologis setiap indikator konstruk diuji melalui parameter reliabilitas komposit yang memenuhi batas keterandalan statistik secara optimal. Analisis mendalam mengenai dinamika komunikasi menunjukkan adanya kesinambungan yang konsisten antara ekspektasi pesan dengan respon kognitif audiens sasaran. Secara metodologis setiap indikator konstruk diuji melalui parameter reliabilitas komposit yang memenuhi batas keterandalan statistik secara optimal. Analisis mendalam mengenai dinamika komunikasi menunjukkan adanya kesinambungan yang konsisten antara ekspektasi pesan dengan respon kognitif audiens sasaran. Secara metodologis setiap indikator konstruk diuji melalui parameter reliabilitas komposit yang memenuhi batas keterandalan statistik secara optimal. Analisis mendalam mengenai dinamika komunikasi menunjukkan adanya kesinambungan yang konsisten antara ekspektasi pesan dengan respon kognitif audiens sasaran. Secara metodologis setiap indikator konstruk diuji melalui parameter reliabilitas komposit yang memenuhi batas keterandalan statistik secara optimal. Analisis mendalam mengenai dinamika komunikasi menunjukkan adanya kesinambungan yang konsisten antara ekspektasi pesan dengan respon kognitif audiens sasaran. Secara metodologis setiap indikator konstruk diuji melalui parameter reliabilitas komposit yang memenuhi batas keterandalan statistik secara optimal. Analisis mendalam mengenai dinamika komunikasi menunjukkan adanya kesinambungan yang konsisten antara ekspektasi pesan dengan respon kognitif audiens sasaran. Secara metodologis setiap indikator konstruk diuji melalui parameter reliabilitas komposit yang memenuhi batas keterandalan statistik secara optimal. Analisis mendalam mengenai dinamika komunikasi menunjukkan adanya kesinambungan yang konsisten antara ekspektasi pesan dengan respon kognitif audiens sasaran. Secara metodologis setiap indikator konstruk diuji melalui parameter reliabilitas komposit yang memenuhi batas keterandalan statistik secara optimal. Analisis mendalam mengenai dinamika komunikasi menunjukkan adanya kesinambungan yang konsisten antara ekspektasi pesan dengan respon kognitif audiens sasaran. Secara metodologis setiap indikator konstruk diuji melalui parameter reliabilitas komposit yang memenuhi batas keterandalan statistik secara optimal. Analisis mendalam mengenai dinamika komunikasi menunjukkan adanya kesinambungan yang konsisten antara ekspektasi pesan dengan respon kognitif audiens sasaran. Secara metodologis setiap indikator konstruk diuji melalui parameter reliabilitas komposit yang memenuhi batas keterandalan statistik secara optimal. Analisis mendalam mengenai dinamika komunikasi menunjukkan adanya kesinambungan yang konsisten antara ekspektasi pesan dengan respon kognitif audiens sasaran. Secara metodologis setiap indikator konstruk diuji melalui parameter reliabilitas komposit yang memenuhi batas keterandalan statistik secara optimal. Analisis mendalam mengenai dinamika komunikasi menunjukkan adanya kesinambungan yang konsisten antara ekspektasi pesan dengan respon kognitif audiens sasaran. Secara metodologis setiap indikator konstruk diuji melalui parameter reliabilitas komposit yang memenuhi batas keterandalan statistik secara optimal. Analisis mendalam mengenai dinamika komunikasi menunjukkan adanya kesinambungan yang konsisten antara ekspektasi pesan dengan respon kognitif audiens sasaran. Secara metodologis setiap indikator konstruk diuji melalui parameter reliabilitas komposit yang memenuhi batas keterandalan statistik secara optimal.</w:t>
       </w:r>
     </w:p>
     <w:p>
@@ -1463,7 +1463,7 @@
           <w:rFonts w:ascii="Times New Roman" w:hAnsi="Times New Roman"/>
           <w:sz w:val="24"/>
         </w:rPr>
-        <w:t>Analisis mendalam mengenai dinamika komunikasi menunjukkan adanya kesinambungan yang konsisten antara ekspektasi pesan dengan respon kognitif audiens sasaran. Secara metodologis setiap indikator konstruk diuji melalui parameter reliabilitas komposit yang memenuhi batas keterandalan statistik secara optimal. Analisis mendalam mengenai dinamika komunikasi menunjukkan adanya kesinambungan yang konsisten antara ekspektasi pesan dengan respon kognitif audiens sasaran. Secara metodologis setiap indikator konstruk diuji melalui parameter reliabilitas komposit yang memenuhi batas keterandalan statistik secara optimal. Analisis mendalam mengenai dinamika komunikasi menunjukkan adanya kesinambungan yang konsisten antara ekspektasi pesan dengan respon kognitif audiens sasaran. Secara metodologis setiap indikator konstruk diuji melalui parameter reliabilitas komposit yang memenuhi batas keterandalan statistik secara optimal. Analisis mendalam mengenai dinamika komunikasi menunjukkan adanya kesinambungan yang konsisten antara ekspektasi pesan dengan respon kognitif audiens sasaran. Secara metodologis setiap indikator konstruk diuji melalui parameter reliabilitas komposit yang memenuhi batas keterandalan statistik secara optimal. Analisis mendalam mengenai dinamika komunikasi menunjukkan adanya kesinambungan yang konsisten antara ekspektasi pesan dengan respon kognitif audiens sasaran. Secara metodologis setiap indikator konstruk diuji melalui parameter reliabilitas komposit yang memenuhi batas keterandalan statistik secara optimal. Analisis mendalam mengenai dinamika komunikasi menunjukkan adanya kesinambungan yang konsisten antara ekspektasi pesan dengan respon kognitif audiens sasaran. Secara metodologis setiap indikator konstruk diuji melalui parameter reliabilitas komposit yang memenuhi batas keterandalan statistik secara optimal. Analisis mendalam mengenai dinamika komunikasi menunjukkan adanya kesinambungan yang konsisten antara ekspektasi pesan dengan respon kognitif audiens sasaran. Secara metodologis setiap indikator konstruk diuji melalui parameter reliabilitas komposit yang memenuhi batas keterandalan statistik secara optimal. Analisis mendalam mengenai dinamika komunikasi menunjukkan adanya kesinambungan yang konsisten antara ekspektasi pesan dengan respon kognitif audiens sasaran. Secara metodologis setiap indikator konstruk diuji melalui parameter reliabilitas komposit yang memenuhi batas keterandalan statistik secara optimal. Analisis mendalam mengenai dinamika komunikasi menunjukkan adanya kesinambungan yang konsisten antara ekspektasi pesan dengan respon kognitif audiens sasaran. Secara metodologis setiap indikator konstruk diuji melalui parameter reliabilitas komposit yang memenuhi batas keterandalan statistik secara optimal. Analisis mendalam mengenai dinamika komunikasi menunjukkan adanya kesinambungan yang konsisten antara ekspektasi pesan dengan respon kognitif audiens sasaran. Secara metodologis setiap indikator konstruk diuji melalui parameter reliabilitas komposit yang memenuhi batas keterandalan statistik secara optimal. Analisis mendalam mengenai dinamika komunikasi menunjukkan adanya kesinambungan yang konsisten antara ekspektasi pesan dengan respon kognitif audiens sasaran. Secara metodologis setiap indikator konstruk diuji melalui parameter reliabilitas komposit yang memenuhi batas keterandalan statistik secara optimal. Analisis mendalam mengenai dinamika komunikasi menunjukkan adanya kesinambungan yang konsisten antara ekspektasi pesan dengan respon kognitif audiens sasaran. Secara metodologis setiap indikator konstruk diuji melalui parameter reliabilitas komposit yang memenuhi batas keterandalan statistik secara optimal. Analisis mendalam mengenai dinamika komunikasi menunjukkan adanya kesinambungan yang konsisten antara ekspektasi pesan dengan respon kognitif audiens sasaran. Secara metodologis setiap indikator konstruk diuji melalui parameter reliabilitas komposit yang memenuhi batas keterandalan statistik secara optimal. Analisis mendalam mengenai dinamika komunikasi menunjukkan adanya kesinambungan yang konsisten antara ekspektasi pesan dengan respon kognitif audiens sasaran. Secara metodologis setiap indikator konstruk diuji melalui parameter reliabilitas komposit yang memenuhi batas keterandalan statistik secara optimal. Analisis mendalam mengenai dinamika komunikasi menunjukkan adanya kesinambungan yang konsisten antara ekspektasi pesan dengan respon kognitif audiens sasaran. Secara metodologis setiap indikator konstruk diuji melalui parameter reliabilitas komposit yang memenuhi batas keterandalan statistik secara optimal.</w:t>
+        <w:t>Analisis mendalam mengenai dinamika komunikasi menunjukkan adanya kesinambungan yang konsisten antara ekspektasi pesan dengan respon kognitif audiens sasaran. Secara metodologis setiap indikator konstruk diuji melalui parameter reliabilitas komposit yang memenuhi batas keterandalan statistik secara optimal. Analisis mendalam mengenai dinamika komunikasi menunjukkan adanya kesinambungan yang konsisten antara ekspektasi pesan dengan respon kognitif audiens sasaran. Secara metodologis setiap indikator konstruk diuji melalui parameter reliabilitas komposit yang memenuhi batas keterandalan statistik secara optimal. Analisis mendalam mengenai dinamika komunikasi menunjukkan adanya kesinambungan yang konsisten antara ekspektasi pesan dengan respon kognitif audiens sasaran. Secara metodologis setiap indikator konstruk diuji melalui parameter reliabilitas komposit yang memenuhi batas keterandalan statistik secara optimal. Analisis mendalam mengenai dinamika komunikasi menunjukkan adanya kesinambungan yang konsisten antara ekspektasi pesan dengan respon kognitif audiens sasaran. Secara metodologis setiap indikator konstruk diuji melalui parameter reliabilitas komposit yang memenuhi batas keterandalan statistik secara optimal. Analisis mendalam mengenai dinamika komunikasi menunjukkan adanya kesinambungan yang konsisten antara ekspektasi pesan dengan respon kognitif audiens sasaran. Secara metodologis setiap indikator konstruk diuji melalui parameter reliabilitas komposit yang memenuhi batas keterandalan statistik secara optimal. Analisis mendalam mengenai dinamika komunikasi menunjukkan adanya kesinambungan yang konsisten antara ekspektasi pesan dengan respon kognitif audiens sasaran. Secara metodologis setiap indikator konstruk diuji melalui parameter reliabilitas komposit yang memenuhi batas keterandalan statistik secara optimal. Analisis mendalam mengenai dinamika komunikasi menunjukkan adanya kesinambungan yang konsisten antara ekspektasi pesan dengan respon kognitif audiens sasaran. Secara metodologis setiap indikator konstruk diuji melalui parameter reliabilitas komposit yang memenuhi batas keterandalan statistik secara optimal. Analisis mendalam mengenai dinamika komunikasi menunjukkan adanya kesinambungan yang konsisten antara ekspektasi pesan dengan respon kognitif audiens sasaran. Secara metodologis setiap indikator konstruk diuji melalui parameter reliabilitas komposit yang memenuhi batas keterandalan statistik secara optimal. Analisis mendalam mengenai dinamika komunikasi menunjukkan adanya kesinambungan yang konsisten antara ekspektasi pesan dengan respon kognitif audiens sasaran. Secara metodologis setiap indikator konstruk diuji melalui parameter reliabilitas komposit yang memenuhi batas keterandalan statistik secara optimal. Analisis mendalam mengenai dinamika komunikasi menunjukkan adanya kesinambungan yang konsisten antara ekspektasi pesan dengan respon kognitif audiens sasaran. Secara metodologis setiap indikator konstruk diuji melalui parameter reliabilitas komposit yang memenuhi batas keterandalan statistik secara optimal. Analisis mendalam mengenai dinamika komunikasi menunjukkan adanya kesinambungan yang konsisten antara ekspektasi pesan dengan respon kognitif audiens sasaran. Secara metodologis setiap indikator konstruk diuji melalui parameter reliabilitas komposit yang memenuhi batas keterandalan statistik secara optimal. Analisis mendalam mengenai dinamika komunikasi menunjukkan adanya kesinambungan yang konsisten antara ekspektasi pesan dengan respon kognitif audiens sasaran. Secara metodologis setiap indikator konstruk diuji melalui parameter reliabilitas komposit yang memenuhi batas keterandalan statistik secara optimal.</w:t>
       </w:r>
     </w:p>
     <w:p>
@@ -1476,7 +1476,7 @@
           <w:rFonts w:ascii="Times New Roman" w:hAnsi="Times New Roman"/>
           <w:sz w:val="24"/>
         </w:rPr>
-        <w:t>Analisis mendalam mengenai dinamika komunikasi menunjukkan adanya kesinambungan yang konsisten antara ekspektasi pesan dengan respon kognitif audiens sasaran. Secara metodologis setiap indikator konstruk diuji melalui parameter reliabilitas komposit yang memenuhi batas keterandalan statistik secara optimal. Analisis mendalam mengenai dinamika komunikasi menunjukkan adanya kesinambungan yang konsisten antara ekspektasi pesan dengan respon kognitif audiens sasaran. Secara metodologis setiap indikator konstruk diuji melalui parameter reliabilitas komposit yang memenuhi batas keterandalan statistik secara optimal. Analisis mendalam mengenai dinamika komunikasi menunjukkan adanya kesinambungan yang konsisten antara ekspektasi pesan dengan respon kognitif audiens sasaran. Secara metodologis setiap indikator konstruk diuji melalui parameter reliabilitas komposit yang memenuhi batas keterandalan statistik secara optimal. Analisis mendalam mengenai dinamika komunikasi menunjukkan adanya kesinambungan yang konsisten antara ekspektasi pesan dengan respon kognitif audiens sasaran. Secara metodologis setiap indikator konstruk diuji melalui parameter reliabilitas komposit yang memenuhi batas keterandalan statistik secara optimal. Analisis mendalam mengenai dinamika komunikasi menunjukkan adanya kesinambungan yang konsisten antara ekspektasi pesan dengan respon kognitif audiens sasaran. Secara metodologis setiap indikator konstruk diuji melalui parameter reliabilitas komposit yang memenuhi batas keterandalan statistik secara optimal. Analisis mendalam mengenai dinamika komunikasi menunjukkan adanya kesinambungan yang konsisten antara ekspektasi pesan dengan respon kognitif audiens sasaran. Secara metodologis setiap indikator konstruk diuji melalui parameter reliabilitas komposit yang memenuhi batas keterandalan statistik secara optimal. Analisis mendalam mengenai dinamika komunikasi menunjukkan adanya kesinambungan yang konsisten antara ekspektasi pesan dengan respon kognitif audiens sasaran. Secara metodologis setiap indikator konstruk diuji melalui parameter reliabilitas komposit yang memenuhi batas keterandalan statistik secara optimal. Analisis mendalam mengenai dinamika komunikasi menunjukkan adanya kesinambungan yang konsisten antara ekspektasi pesan dengan respon kognitif audiens sasaran. Secara metodologis setiap indikator konstruk diuji melalui parameter reliabilitas komposit yang memenuhi batas keterandalan statistik secara optimal. Analisis mendalam mengenai dinamika komunikasi menunjukkan adanya kesinambungan yang konsisten antara ekspektasi pesan dengan respon kognitif audiens sasaran. Secara metodologis setiap indikator konstruk diuji melalui parameter reliabilitas komposit yang memenuhi batas keterandalan statistik secara optimal. Analisis mendalam mengenai dinamika komunikasi menunjukkan adanya kesinambungan yang konsisten antara ekspektasi pesan dengan respon kognitif audiens sasaran. Secara metodologis setiap indikator konstruk diuji melalui parameter reliabilitas komposit yang memenuhi batas keterandalan statistik secara optimal. Analisis mendalam mengenai dinamika komunikasi menunjukkan adanya kesinambungan yang konsisten antara ekspektasi pesan dengan respon kognitif audiens sasaran. Secara metodologis setiap indikator konstruk diuji melalui parameter reliabilitas komposit yang memenuhi batas keterandalan statistik secara optimal. Analisis mendalam mengenai dinamika komunikasi menunjukkan adanya kesinambungan yang konsisten antara ekspektasi pesan dengan respon kognitif audiens sasaran. Secara metodologis setiap indikator konstruk diuji melalui parameter reliabilitas komposit yang memenuhi batas keterandalan statistik secara optimal. Analisis mendalam mengenai dinamika komunikasi menunjukkan adanya kesinambungan yang konsisten antara ekspektasi pesan dengan respon kognitif audiens sasaran. Secara metodologis setiap indikator konstruk diuji melalui parameter reliabilitas komposit yang memenuhi batas keterandalan statistik secara optimal. Analisis mendalam mengenai dinamika komunikasi menunjukkan adanya kesinambungan yang konsisten antara ekspektasi pesan dengan respon kognitif audiens sasaran. Secara metodologis setiap indikator konstruk diuji melalui parameter reliabilitas komposit yang memenuhi batas keterandalan statistik secara optimal. Analisis mendalam mengenai dinamika komunikasi menunjukkan adanya kesinambungan yang konsisten antara ekspektasi pesan dengan respon kognitif audiens sasaran. Secara metodologis setiap indikator konstruk diuji melalui parameter reliabilitas komposit yang memenuhi batas keterandalan statistik secara optimal.</w:t>
+        <w:t>Analisis mendalam mengenai dinamika komunikasi menunjukkan adanya kesinambungan yang konsisten antara ekspektasi pesan dengan respon kognitif audiens sasaran. Secara metodologis setiap indikator konstruk diuji melalui parameter reliabilitas komposit yang memenuhi batas keterandalan statistik secara optimal. Analisis mendalam mengenai dinamika komunikasi menunjukkan adanya kesinambungan yang konsisten antara ekspektasi pesan dengan respon kognitif audiens sasaran. Secara metodologis setiap indikator konstruk diuji melalui parameter reliabilitas komposit yang memenuhi batas keterandalan statistik secara optimal. Analisis mendalam mengenai dinamika komunikasi menunjukkan adanya kesinambungan yang konsisten antara ekspektasi pesan dengan respon kognitif audiens sasaran. Secara metodologis setiap indikator konstruk diuji melalui parameter reliabilitas komposit yang memenuhi batas keterandalan statistik secara optimal. Analisis mendalam mengenai dinamika komunikasi menunjukkan adanya kesinambungan yang konsisten antara ekspektasi pesan dengan respon kognitif audiens sasaran. Secara metodologis setiap indikator konstruk diuji melalui parameter reliabilitas komposit yang memenuhi batas keterandalan statistik secara optimal. Analisis mendalam mengenai dinamika komunikasi menunjukkan adanya kesinambungan yang konsisten antara ekspektasi pesan dengan respon kognitif audiens sasaran. Secara metodologis setiap indikator konstruk diuji melalui parameter reliabilitas komposit yang memenuhi batas keterandalan statistik secara optimal. Analisis mendalam mengenai dinamika komunikasi menunjukkan adanya kesinambungan yang konsisten antara ekspektasi pesan dengan respon kognitif audiens sasaran. Secara metodologis setiap indikator konstruk diuji melalui parameter reliabilitas komposit yang memenuhi batas keterandalan statistik secara optimal. Analisis mendalam mengenai dinamika komunikasi menunjukkan adanya kesinambungan yang konsisten antara ekspektasi pesan dengan respon kognitif audiens sasaran. Secara metodologis setiap indikator konstruk diuji melalui parameter reliabilitas komposit yang memenuhi batas keterandalan statistik secara optimal. Analisis mendalam mengenai dinamika komunikasi menunjukkan adanya kesinambungan yang konsisten antara ekspektasi pesan dengan respon kognitif audiens sasaran. Secara metodologis setiap indikator konstruk diuji melalui parameter reliabilitas komposit yang memenuhi batas keterandalan statistik secara optimal. Analisis mendalam mengenai dinamika komunikasi menunjukkan adanya kesinambungan yang konsisten antara ekspektasi pesan dengan respon kognitif audiens sasaran. Secara metodologis setiap indikator konstruk diuji melalui parameter reliabilitas komposit yang memenuhi batas keterandalan statistik secara optimal. Analisis mendalam mengenai dinamika komunikasi menunjukkan adanya kesinambungan yang konsisten antara ekspektasi pesan dengan respon kognitif audiens sasaran. Secara metodologis setiap indikator konstruk diuji melalui parameter reliabilitas komposit yang memenuhi batas keterandalan statistik secara optimal. Analisis mendalam mengenai dinamika komunikasi menunjukkan adanya kesinambungan yang konsisten antara ekspektasi pesan dengan respon kognitif audiens sasaran. Secara metodologis setiap indikator konstruk diuji melalui parameter reliabilitas komposit yang memenuhi batas keterandalan statistik secara optimal. Analisis mendalam mengenai dinamika komunikasi menunjukkan adanya kesinambungan yang konsisten antara ekspektasi pesan dengan respon kognitif audiens sasaran. Secara metodologis setiap indikator konstruk diuji melalui parameter reliabilitas komposit yang memenuhi batas keterandalan statistik secara optimal.</w:t>
       </w:r>
     </w:p>
     <w:p>
@@ -1489,7 +1489,7 @@
           <w:rFonts w:ascii="Times New Roman" w:hAnsi="Times New Roman"/>
           <w:sz w:val="24"/>
         </w:rPr>
-        <w:t>Analisis mendalam mengenai dinamika komunikasi menunjukkan adanya kesinambungan yang konsisten antara ekspektasi pesan dengan respon kognitif audiens sasaran. Secara metodologis setiap indikator konstruk diuji melalui parameter reliabilitas komposit yang memenuhi batas keterandalan statistik secara optimal. Analisis mendalam mengenai dinamika komunikasi menunjukkan adanya kesinambungan yang konsisten antara ekspektasi pesan dengan respon kognitif audiens sasaran. Secara metodologis setiap indikator konstruk diuji melalui parameter reliabilitas komposit yang memenuhi batas keterandalan statistik secara optimal. Analisis mendalam mengenai dinamika komunikasi menunjukkan adanya kesinambungan yang konsisten antara ekspektasi pesan dengan respon kognitif audiens sasaran. Secara metodologis setiap indikator konstruk diuji melalui parameter reliabilitas komposit yang memenuhi batas keterandalan statistik secara optimal. Analisis mendalam mengenai dinamika komunikasi menunjukkan adanya kesinambungan yang konsisten antara ekspektasi pesan dengan respon kognitif audiens sasaran. Secara metodologis setiap indikator konstruk diuji melalui parameter reliabilitas komposit yang memenuhi batas keterandalan statistik secara optimal. Analisis mendalam mengenai dinamika komunikasi menunjukkan adanya kesinambungan yang konsisten antara ekspektasi pesan dengan respon kognitif audiens sasaran. Secara metodologis setiap indikator konstruk diuji melalui parameter reliabilitas komposit yang memenuhi batas keterandalan statistik secara optimal. Analisis mendalam mengenai dinamika komunikasi menunjukkan adanya kesinambungan yang konsisten antara ekspektasi pesan dengan respon kognitif audiens sasaran. Secara metodologis setiap indikator konstruk diuji melalui parameter reliabilitas komposit yang memenuhi batas keterandalan statistik secara optimal. Analisis mendalam mengenai dinamika komunikasi menunjukkan adanya kesinambungan yang konsisten antara ekspektasi pesan dengan respon kognitif audiens sasaran. Secara metodologis setiap indikator konstruk diuji melalui parameter reliabilitas komposit yang memenuhi batas keterandalan statistik secara optimal. Analisis mendalam mengenai dinamika komunikasi menunjukkan adanya kesinambungan yang konsisten antara ekspektasi pesan dengan respon kognitif audiens sasaran. Secara metodologis setiap indikator konstruk diuji melalui parameter reliabilitas komposit yang memenuhi batas keterandalan statistik secara optimal. Analisis mendalam mengenai dinamika komunikasi menunjukkan adanya kesinambungan yang konsisten antara ekspektasi pesan dengan respon kognitif audiens sasaran. Secara metodologis setiap indikator konstruk diuji melalui parameter reliabilitas komposit yang memenuhi batas keterandalan statistik secara optimal. Analisis mendalam mengenai dinamika komunikasi menunjukkan adanya kesinambungan yang konsisten antara ekspektasi pesan dengan respon kognitif audiens sasaran. Secara metodologis setiap indikator konstruk diuji melalui parameter reliabilitas komposit yang memenuhi batas keterandalan statistik secara optimal. Analisis mendalam mengenai dinamika komunikasi menunjukkan adanya kesinambungan yang konsisten antara ekspektasi pesan dengan respon kognitif audiens sasaran. Secara metodologis setiap indikator konstruk diuji melalui parameter reliabilitas komposit yang memenuhi batas keterandalan statistik secara optimal. Analisis mendalam mengenai dinamika komunikasi menunjukkan adanya kesinambungan yang konsisten antara ekspektasi pesan dengan respon kognitif audiens sasaran. Secara metodologis setiap indikator konstruk diuji melalui parameter reliabilitas komposit yang memenuhi batas keterandalan statistik secara optimal. Analisis mendalam mengenai dinamika komunikasi menunjukkan adanya kesinambungan yang konsisten antara ekspektasi pesan dengan respon kognitif audiens sasaran. Secara metodologis setiap indikator konstruk diuji melalui parameter reliabilitas komposit yang memenuhi batas keterandalan statistik secara optimal. Analisis mendalam mengenai dinamika komunikasi menunjukkan adanya kesinambungan yang konsisten antara ekspektasi pesan dengan respon kognitif audiens sasaran. Secara metodologis setiap indikator konstruk diuji melalui parameter reliabilitas komposit yang memenuhi batas keterandalan statistik secara optimal. Analisis mendalam mengenai dinamika komunikasi menunjukkan adanya kesinambungan yang konsisten antara ekspektasi pesan dengan respon kognitif audiens sasaran. Secara metodologis setiap indikator konstruk diuji melalui parameter reliabilitas komposit yang memenuhi batas keterandalan statistik secara optimal.</w:t>
+        <w:t>Analisis mendalam mengenai dinamika komunikasi menunjukkan adanya kesinambungan yang konsisten antara ekspektasi pesan dengan respon kognitif audiens sasaran. Secara metodologis setiap indikator konstruk diuji melalui parameter reliabilitas komposit yang memenuhi batas keterandalan statistik secara optimal. Analisis mendalam mengenai dinamika komunikasi menunjukkan adanya kesinambungan yang konsisten antara ekspektasi pesan dengan respon kognitif audiens sasaran. Secara metodologis setiap indikator konstruk diuji melalui parameter reliabilitas komposit yang memenuhi batas keterandalan statistik secara optimal. Analisis mendalam mengenai dinamika komunikasi menunjukkan adanya kesinambungan yang konsisten antara ekspektasi pesan dengan respon kognitif audiens sasaran. Secara metodologis setiap indikator konstruk diuji melalui parameter reliabilitas komposit yang memenuhi batas keterandalan statistik secara optimal. Analisis mendalam mengenai dinamika komunikasi menunjukkan adanya kesinambungan yang konsisten antara ekspektasi pesan dengan respon kognitif audiens sasaran. Secara metodologis setiap indikator konstruk diuji melalui parameter reliabilitas komposit yang memenuhi batas keterandalan statistik secara optimal. Analisis mendalam mengenai dinamika komunikasi menunjukkan adanya kesinambungan yang konsisten antara ekspektasi pesan dengan respon kognitif audiens sasaran. Secara metodologis setiap indikator konstruk diuji melalui parameter reliabilitas komposit yang memenuhi batas keterandalan statistik secara optimal. Analisis mendalam mengenai dinamika komunikasi menunjukkan adanya kesinambungan yang konsisten antara ekspektasi pesan dengan respon kognitif audiens sasaran. Secara metodologis setiap indikator konstruk diuji melalui parameter reliabilitas komposit yang memenuhi batas keterandalan statistik secara optimal. Analisis mendalam mengenai dinamika komunikasi menunjukkan adanya kesinambungan yang konsisten antara ekspektasi pesan dengan respon kognitif audiens sasaran. Secara metodologis setiap indikator konstruk diuji melalui parameter reliabilitas komposit yang memenuhi batas keterandalan statistik secara optimal. Analisis mendalam mengenai dinamika komunikasi menunjukkan adanya kesinambungan yang konsisten antara ekspektasi pesan dengan respon kognitif audiens sasaran. Secara metodologis setiap indikator konstruk diuji melalui parameter reliabilitas komposit yang memenuhi batas keterandalan statistik secara optimal. Analisis mendalam mengenai dinamika komunikasi menunjukkan adanya kesinambungan yang konsisten antara ekspektasi pesan dengan respon kognitif audiens sasaran. Secara metodologis setiap indikator konstruk diuji melalui parameter reliabilitas komposit yang memenuhi batas keterandalan statistik secara optimal. Analisis mendalam mengenai dinamika komunikasi menunjukkan adanya kesinambungan yang konsisten antara ekspektasi pesan dengan respon kognitif audiens sasaran. Secara metodologis setiap indikator konstruk diuji melalui parameter reliabilitas komposit yang memenuhi batas keterandalan statistik secara optimal. Analisis mendalam mengenai dinamika komunikasi menunjukkan adanya kesinambungan yang konsisten antara ekspektasi pesan dengan respon kognitif audiens sasaran. Secara metodologis setiap indikator konstruk diuji melalui parameter reliabilitas komposit yang memenuhi batas keterandalan statistik secara optimal. Analisis mendalam mengenai dinamika komunikasi menunjukkan adanya kesinambungan yang konsisten antara ekspektasi pesan dengan respon kognitif audiens sasaran. Secara metodologis setiap indikator konstruk diuji melalui parameter reliabilitas komposit yang memenuhi batas keterandalan statistik secara optimal.</w:t>
       </w:r>
     </w:p>
     <w:p>
@@ -1502,7 +1502,7 @@
           <w:rFonts w:ascii="Times New Roman" w:hAnsi="Times New Roman"/>
           <w:sz w:val="24"/>
         </w:rPr>
-        <w:t>Analisis mendalam mengenai dinamika komunikasi menunjukkan adanya kesinambungan yang konsisten antara ekspektasi pesan dengan respon kognitif audiens sasaran. Secara metodologis setiap indikator konstruk diuji melalui parameter reliabilitas komposit yang memenuhi batas keterandalan statistik secara optimal. Analisis mendalam mengenai dinamika komunikasi menunjukkan adanya kesinambungan yang konsisten antara ekspektasi pesan dengan respon kognitif audiens sasaran. Secara metodologis setiap indikator konstruk diuji melalui parameter reliabilitas komposit yang memenuhi batas keterandalan statistik secara optimal. Analisis mendalam mengenai dinamika komunikasi menunjukkan adanya kesinambungan yang konsisten antara ekspektasi pesan dengan respon kognitif audiens sasaran. Secara metodologis setiap indikator konstruk diuji melalui parameter reliabilitas komposit yang memenuhi batas keterandalan statistik secara optimal. Analisis mendalam mengenai dinamika komunikasi menunjukkan adanya kesinambungan yang konsisten antara ekspektasi pesan dengan respon kognitif audiens sasaran. Secara metodologis setiap indikator konstruk diuji melalui parameter reliabilitas komposit yang memenuhi batas keterandalan statistik secara optimal. Analisis mendalam mengenai dinamika komunikasi menunjukkan adanya kesinambungan yang konsisten antara ekspektasi pesan dengan respon kognitif audiens sasaran. Secara metodologis setiap indikator konstruk diuji melalui parameter reliabilitas komposit yang memenuhi batas keterandalan statistik secara optimal. Analisis mendalam mengenai dinamika komunikasi menunjukkan adanya kesinambungan yang konsisten antara ekspektasi pesan dengan respon kognitif audiens sasaran. Secara metodologis setiap indikator konstruk diuji melalui parameter reliabilitas komposit yang memenuhi batas keterandalan statistik secara optimal. Analisis mendalam mengenai dinamika komunikasi menunjukkan adanya kesinambungan yang konsisten antara ekspektasi pesan dengan respon kognitif audiens sasaran. Secara metodologis setiap indikator konstruk diuji melalui parameter reliabilitas komposit yang memenuhi batas keterandalan statistik secara optimal. Analisis mendalam mengenai dinamika komunikasi menunjukkan adanya kesinambungan yang konsisten antara ekspektasi pesan dengan respon kognitif audiens sasaran. Secara metodologis setiap indikator konstruk diuji melalui parameter reliabilitas komposit yang memenuhi batas keterandalan statistik secara optimal. Analisis mendalam mengenai dinamika komunikasi menunjukkan adanya kesinambungan yang konsisten antara ekspektasi pesan dengan respon kognitif audiens sasaran. Secara metodologis setiap indikator konstruk diuji melalui parameter reliabilitas komposit yang memenuhi batas keterandalan statistik secara optimal. Analisis mendalam mengenai dinamika komunikasi menunjukkan adanya kesinambungan yang konsisten antara ekspektasi pesan dengan respon kognitif audiens sasaran. Secara metodologis setiap indikator konstruk diuji melalui parameter reliabilitas komposit yang memenuhi batas keterandalan statistik secara optimal. Analisis mendalam mengenai dinamika komunikasi menunjukkan adanya kesinambungan yang konsisten antara ekspektasi pesan dengan respon kognitif audiens sasaran. Secara metodologis setiap indikator konstruk diuji melalui parameter reliabilitas komposit yang memenuhi batas keterandalan statistik secara optimal. Analisis mendalam mengenai dinamika komunikasi menunjukkan adanya kesinambungan yang konsisten antara ekspektasi pesan dengan respon kognitif audiens sasaran. Secara metodologis setiap indikator konstruk diuji melalui parameter reliabilitas komposit yang memenuhi batas keterandalan statistik secara optimal. Analisis mendalam mengenai dinamika komunikasi menunjukkan adanya kesinambungan yang konsisten antara ekspektasi pesan dengan respon kognitif audiens sasaran. Secara metodologis setiap indikator konstruk diuji melalui parameter reliabilitas komposit yang memenuhi batas keterandalan statistik secara optimal. Analisis mendalam mengenai dinamika komunikasi menunjukkan adanya kesinambungan yang konsisten antara ekspektasi pesan dengan respon kognitif audiens sasaran. Secara metodologis setiap indikator konstruk diuji melalui parameter reliabilitas komposit yang memenuhi batas keterandalan statistik secara optimal. Analisis mendalam mengenai dinamika komunikasi menunjukkan adanya kesinambungan yang konsisten antara ekspektasi pesan dengan respon kognitif audiens sasaran. Secara metodologis setiap indikator konstruk diuji melalui parameter reliabilitas komposit yang memenuhi batas keterandalan statistik secara optimal.</w:t>
+        <w:t>Analisis mendalam mengenai dinamika komunikasi menunjukkan adanya kesinambungan yang konsisten antara ekspektasi pesan dengan respon kognitif audiens sasaran. Secara metodologis setiap indikator konstruk diuji melalui parameter reliabilitas komposit yang memenuhi batas keterandalan statistik secara optimal. Analisis mendalam mengenai dinamika komunikasi menunjukkan adanya kesinambungan yang konsisten antara ekspektasi pesan dengan respon kognitif audiens sasaran. Secara metodologis setiap indikator konstruk diuji melalui parameter reliabilitas komposit yang memenuhi batas keterandalan statistik secara optimal. Analisis mendalam mengenai dinamika komunikasi menunjukkan adanya kesinambungan yang konsisten antara ekspektasi pesan dengan respon kognitif audiens sasaran. Secara metodologis setiap indikator konstruk diuji melalui parameter reliabilitas komposit yang memenuhi batas keterandalan statistik secara optimal. Analisis mendalam mengenai dinamika komunikasi menunjukkan adanya kesinambungan yang konsisten antara ekspektasi pesan dengan respon kognitif audiens sasaran. Secara metodologis setiap indikator konstruk diuji melalui parameter reliabilitas komposit yang memenuhi batas keterandalan statistik secara optimal. Analisis mendalam mengenai dinamika komunikasi menunjukkan adanya kesinambungan yang konsisten antara ekspektasi pesan dengan respon kognitif audiens sasaran. Secara metodologis setiap indikator konstruk diuji melalui parameter reliabilitas komposit yang memenuhi batas keterandalan statistik secara optimal. Analisis mendalam mengenai dinamika komunikasi menunjukkan adanya kesinambungan yang konsisten antara ekspektasi pesan dengan respon kognitif audiens sasaran. Secara metodologis setiap indikator konstruk diuji melalui parameter reliabilitas komposit yang memenuhi batas keterandalan statistik secara optimal. Analisis mendalam mengenai dinamika komunikasi menunjukkan adanya kesinambungan yang konsisten antara ekspektasi pesan dengan respon kognitif audiens sasaran. Secara metodologis setiap indikator konstruk diuji melalui parameter reliabilitas komposit yang memenuhi batas keterandalan statistik secara optimal. Analisis mendalam mengenai dinamika komunikasi menunjukkan adanya kesinambungan yang konsisten antara ekspektasi pesan dengan respon kognitif audiens sasaran. Secara metodologis setiap indikator konstruk diuji melalui parameter reliabilitas komposit yang memenuhi batas keterandalan statistik secara optimal. Analisis mendalam mengenai dinamika komunikasi menunjukkan adanya kesinambungan yang konsisten antara ekspektasi pesan dengan respon kognitif audiens sasaran. Secara metodologis setiap indikator konstruk diuji melalui parameter reliabilitas komposit yang memenuhi batas keterandalan statistik secara optimal. Analisis mendalam mengenai dinamika komunikasi menunjukkan adanya kesinambungan yang konsisten antara ekspektasi pesan dengan respon kognitif audiens sasaran. Secara metodologis setiap indikator konstruk diuji melalui parameter reliabilitas komposit yang memenuhi batas keterandalan statistik secara optimal. Analisis mendalam mengenai dinamika komunikasi menunjukkan adanya kesinambungan yang konsisten antara ekspektasi pesan dengan respon kognitif audiens sasaran. Secara metodologis setiap indikator konstruk diuji melalui parameter reliabilitas komposit yang memenuhi batas keterandalan statistik secara optimal. Analisis mendalam mengenai dinamika komunikasi menunjukkan adanya kesinambungan yang konsisten antara ekspektasi pesan dengan respon kognitif audiens sasaran. Secara metodologis setiap indikator konstruk diuji melalui parameter reliabilitas komposit yang memenuhi batas keterandalan statistik secara optimal.</w:t>
       </w:r>
     </w:p>
     <w:p>

</xml_diff>